<commit_message>
update paper with alex's graph
</commit_message>
<xml_diff>
--- a/paper/gdoc.docx
+++ b/paper/gdoc.docx
@@ -697,7 +697,7 @@
         <w:rPr>
           <w:rtl w:val="0"/>
         </w:rPr>
-        <w:t xml:space="preserve">However, the key question is not whether a document contains the word “rationality,” but rather what the term means in specific context. In other words, our aim is to move beyond keyword retrieval and recover the different meanings and intellectual settings in which “rationality” is invoked. A direct way to begin is co-occurrence analysis: examining the words that most often appear immediately before or after “rational” or “rationality.” Such co-occurrences indicate the conceptual frames and debates in which the term is embedded. Figure @fig-co-occurence reports, by decade, the five words most frequently adjacent to “rational” and “rationality,” showing how associations shift over time. Before the 1940s, the picture was heterogeneous, with links to philosophy, psychology, and general notions of reasoning. From the 1940s onward, the rise of choice theory places rationality at the center of economic modeling as a device for describing and formalizing behavior. By the 1970s—and especially the 1980s—the framework was both extended and contested, with the advent of rational expectations on one side and bounded rationality on the other.</w:t>
+        <w:t xml:space="preserve">However, the key question is not whether a document contains the word “rationality,” but rather what the term means in specific context. In other words, our aim is to move beyond keyword retrieval and recover the different meanings and intellectual settings in which “rationality” is invoked. A direct way to begin is co-occurrence analysis: examining the words that most often appear immediately before or after “rational” or “rationality.” Such co-occurrences indicate the conceptual frames and debates in which the term is embedded. @fig-co-occurence reports, by decade, the five words most frequently adjacent to “rational” and “rationality,” showing how associations shift over time. Before the 1940s, the picture was heterogeneous, with links to philosophy, psychology, and general notions of reasoning. From the 1940s onward, the rise of choice theory places rationality at the center of economic modeling as a device for describing and formalizing behavior. By the 1970s—and especially the 1980s—the framework was both extended and contested, with the advent of rational expectations on one side and bounded rationality on the other.</w:t>
       </w:r>
     </w:p>
     <w:p>
@@ -1180,7 +1180,7 @@
         <w:rPr>
           <w:rtl w:val="0"/>
         </w:rPr>
-        <w:t xml:space="preserve">Figure @fig-rationality-paper-citations plots citation patterns for four seminal references on bounded rationality across all economics journals and the top five. The selection is partly arbitrary but standard in the literature: @simonBehavioral1955 and </w:t>
+        <w:t xml:space="preserve">@fig-rationality-paper-citations plots citation patterns for four seminal references on bounded rationality across all economics journals and the top five. The selection is partly arbitrary but standard in the literature: @simonBehavioral1955 and </w:t>
       </w:r>
       <w:commentRangeStart w:id="3"/>
       <w:r>
@@ -1431,7 +1431,7 @@
         <w:rPr>
           <w:rtl w:val="0"/>
         </w:rPr>
-        <w:t xml:space="preserve">Equally important, such indicators should be openly shared with other scholars to ensure transparency and replicability of the analysis. To put these principles into practice, we built an open-source dashboard—available here: [https://01991571-69e4-c794-6467-f1ca83d7c257.share.connect.posit.cloud/](https://01991571-69e4-c794-6467-f1ca83d7c257.share.connect.posit.cloud/)—which compiles the indicators we relied on to interpret clusters and communities.</w:t>
+        <w:t xml:space="preserve">Equally important, such indicators should be openly shared with other scholars to ensure transparency and replicability of the analysis. To put these principles into practice, we built an open-source dashboard—available here: [https://0199205a-7b17-ab11-595d-8f12aae160dd.share.connect.posit.cloud)—which compiles the indicators we relied on to interpret clusters and communities.</w:t>
       </w:r>
       <w:r>
         <w:rPr>

</xml_diff>

<commit_message>
Small modifications on the paper
</commit_message>
<xml_diff>
--- a/paper/gdoc.docx
+++ b/paper/gdoc.docx
@@ -1978,80 +1978,6 @@
           <w:rtl w:val="0"/>
         </w:rPr>
         <w:t xml:space="preserve">Conclusion</w:t>
-      </w:r>
-    </w:p>
-    <w:p>
-      <w:pPr>
-        <w:rPr/>
-        <w:sectPr>
-          <w:type w:val="continuous"/>
-          <w:pgSz w:h="16834" w:w="11909" w:orient="portrait"/>
-          <w:pgMar w:bottom="1440" w:top="1440" w:left="1440" w:right="1440" w:header="720" w:footer="720"/>
-        </w:sectPr>
-      </w:pPr>
-      <w:r>
-        <w:rPr>
-          <w:rtl w:val="0"/>
-        </w:rPr>
-      </w:r>
-    </w:p>
-    <w:p>
-      <w:pPr>
-        <w:pStyle w:val="Heading1"/>
-        <w:rPr/>
-        <w:sectPr>
-          <w:type w:val="nextPage"/>
-          <w:pgSz w:h="16834" w:w="11909" w:orient="portrait"/>
-          <w:pgMar w:bottom="1440" w:top="1440" w:left="1440" w:right="1440" w:header="720" w:footer="720"/>
-        </w:sectPr>
-      </w:pPr>
-      <w:bookmarkStart w:colFirst="0" w:colLast="0" w:name="_onjpzy4tgm8y" w:id="12"/>
-      <w:bookmarkEnd w:id="12"/>
-      <w:r>
-        <w:rPr>
-          <w:rtl w:val="0"/>
-        </w:rPr>
-      </w:r>
-    </w:p>
-    <w:p>
-      <w:pPr>
-        <w:pStyle w:val="Heading1"/>
-        <w:rPr>
-          <w:b w:val="1"/>
-        </w:rPr>
-      </w:pPr>
-      <w:bookmarkStart w:colFirst="0" w:colLast="0" w:name="_f79ah1or0yun" w:id="13"/>
-      <w:bookmarkEnd w:id="13"/>
-      <w:r>
-        <w:rPr>
-          <w:rtl w:val="0"/>
-        </w:rPr>
-      </w:r>
-    </w:p>
-    <w:p>
-      <w:pPr>
-        <w:ind w:left="0" w:firstLine="0"/>
-        <w:rPr/>
-        <w:sectPr>
-          <w:type w:val="continuous"/>
-          <w:pgSz w:h="16834" w:w="11909" w:orient="portrait"/>
-          <w:pgMar w:bottom="1440" w:top="1440" w:left="1440" w:right="1440" w:header="720" w:footer="720"/>
-        </w:sectPr>
-      </w:pPr>
-      <w:r>
-        <w:rPr>
-          <w:rtl w:val="0"/>
-        </w:rPr>
-      </w:r>
-    </w:p>
-    <w:p>
-      <w:pPr>
-        <w:rPr/>
-      </w:pPr>
-      <w:r>
-        <w:rPr>
-          <w:rtl w:val="0"/>
-        </w:rPr>
       </w:r>
     </w:p>
     <w:p>

</xml_diff>

<commit_message>
Minor corrections on text (repetitive paragraph)
</commit_message>
<xml_diff>
--- a/paper/gdoc.docx
+++ b/paper/gdoc.docx
@@ -304,7 +304,7 @@
         <w:rPr>
           <w:rtl w:val="0"/>
         </w:rPr>
-        <w:t xml:space="preserve">Over the same period, expected-utility theory faced mounting challenges from paradoxes associated with Maurice Allais and Daniel Ellsberg, prompting historical and analytical reassessments [@moscatiEllsberg2024; @zappiaRationality2018; @zappiaLeonard2021]. These critiques fed into Daniel Kahneman and Amos Tversky’s Prospect Theory [@kahnemanProspect1979] and the rise of behavioral economics [@heukelomBehavioral2014], while “bounded rationality” attracted renewed attention after the 1980s [@sentRationality2018].</w:t>
+        <w:t xml:space="preserve">Over the same period, expected-utility theory faced mounting challenges from paradoxes associated with Maurice Allais and Daniel Ellsberg, prompting historical and analytical reassessments [@moscatiEllsberg2024; @zappiaRationality2018; @zappiaLeonard2021]. These critiques fed into Daniel Kahneman and Amos Tversky’s Prospect Theory [@kahnemanProspect1979] and the rise of behavioral economics [@heukelomBehavioral2014; @trucForty2022], while “bounded rationality” attracted renewed attention after the 1980s [@sentRationality2018].</w:t>
       </w:r>
     </w:p>
     <w:p>
@@ -347,7 +347,7 @@
         <w:rPr>
           <w:rtl w:val="0"/>
         </w:rPr>
-        <w:t xml:space="preserve">The history of rationality is also one of new alliances with engineering. Work by Holt, Modigliani, Simon, and Muth helped import control theory into economics [@kleinCold2015], while new classical macroeconomics—Lucas, Prescott, and Sargent—introduced elements of “information engineering” inspired by information theory [@boumansEngineering2020]. Finally, this history intersects with the “applied turn” in economics: challenges to expected-utility theory coincided with rising experimental methods that became central to behavioral economics [@backhouseAge2017; @heukelomBehavioral2014].</w:t>
+        <w:t xml:space="preserve">The history of rationality is also one of new alliances with engineering. Work by Holt, Modigliani, Simon, and Muth helped import control theory into economics [@kleinCold2015], while new classical macroeconomics—Lucas, Prescott, and Sargent—introduced elements of “information engineering” inspired by information theory [@boumansEngineering2020]. Finally, this history intersects with the “applied turn” in economics: challenges to expected-utility theory coincided with rising experimental methods that became central to behavioral economics [@backhouseAge2017; @heukelomBehavioral2014; @trucForty2022].</w:t>
       </w:r>
     </w:p>
     <w:p>
@@ -1114,17 +1114,12 @@
         </w:rPr>
         <w:t xml:space="preserve">Citation data does not require sophisticated analysis to be relevant, and can be easily incorporated into the everyday toolset of historians of economics. Simply counting citations can be used to proxy engagement and better understand the impact of a particular author or publication. There are clear reasons to incorporate citation studies into historical research. Beyond tracking diffusion, highly cited papers are more visible and attract more engagement (Matthew effect). Recent work also suggests that citations shape reading behavior and perceived quality: highly cited papers are more likely to be read closely and to be seen as substantial intellectual influences </w:t>
       </w:r>
-      <w:commentRangeStart w:id="1"/>
       <w:r>
         <w:rPr>
           <w:rtl w:val="0"/>
         </w:rPr>
         <w:t xml:space="preserve">[@teplitskiyHow2022]</w:t>
       </w:r>
-      <w:commentRangeEnd w:id="1"/>
-      <w:r>
-        <w:commentReference w:id="1"/>
-      </w:r>
       <w:r>
         <w:rPr>
           <w:rtl w:val="0"/>
@@ -1140,18 +1135,13 @@
         <w:rPr>
           <w:rtl w:val="0"/>
         </w:rPr>
-        <w:t xml:space="preserve">Historians routinely discuss scientific influence, and recognition using proxies such as major grants, prizes, and honors. For example, </w:t>
-      </w:r>
-      <w:commentRangeStart w:id="2"/>
-      <w:r>
-        <w:rPr>
-          <w:rtl w:val="0"/>
-        </w:rPr>
-        <w:t xml:space="preserve">Sent’s narrative</w:t>
-      </w:r>
-      <w:commentRangeEnd w:id="2"/>
-      <w:r>
-        <w:commentReference w:id="2"/>
+        <w:t xml:space="preserve">Historians routinely discuss scientific influence, and recognition using proxies such as major grants, prizes, and honors. For example, @sentBehavioral2004’s</w:t>
+      </w:r>
+      <w:r>
+        <w:rPr>
+          <w:rtl w:val="0"/>
+        </w:rPr>
+        <w:t xml:space="preserve"> narrative</w:t>
       </w:r>
       <w:r>
         <w:rPr>
@@ -1180,35 +1170,13 @@
         <w:rPr>
           <w:rtl w:val="0"/>
         </w:rPr>
-        <w:t xml:space="preserve">@fig-rationality-paper-citations plots citation patterns for four seminal references on bounded rationality across all economics journals and the top five. The selection is partly arbitrary but standard in the literature: @simonBehavioral1955 and </w:t>
-      </w:r>
-      <w:commentRangeStart w:id="3"/>
-      <w:r>
-        <w:rPr>
-          <w:rtl w:val="0"/>
-        </w:rPr>
-        <w:t xml:space="preserve">Allais (1953)</w:t>
-      </w:r>
-      <w:commentRangeEnd w:id="3"/>
-      <w:r>
-        <w:commentReference w:id="3"/>
-      </w:r>
-      <w:r>
-        <w:rPr>
-          <w:rtl w:val="0"/>
-        </w:rPr>
-        <w:t xml:space="preserve"> are early critiques of neoclassical rational choice with both empirical and normative implications, while @a</w:t>
-      </w:r>
-      <w:commentRangeStart w:id="4"/>
+        <w:t xml:space="preserve">@fig-rationality-paper-citations plots citation patterns for four seminal references on bounded rationality across all economics journals and the top five. The selection is partly arbitrary but standard in the literature: @simonBehavioral1955 and @allaisComportement1953 are early critiques of neoclassical rational choice with both empirical and normative implications, while @a</w:t>
+      </w:r>
       <w:r>
         <w:rPr>
           <w:rtl w:val="0"/>
         </w:rPr>
         <w:t xml:space="preserve">kerlofMarket1970</w:t>
-      </w:r>
-      <w:commentRangeEnd w:id="4"/>
-      <w:r>
-        <w:commentReference w:id="4"/>
       </w:r>
       <w:r>
         <w:rPr>
@@ -1242,7 +1210,7 @@
         <w:rPr>
           <w:rtl w:val="0"/>
         </w:rPr>
-        <w:t xml:space="preserve">The patterns align with several claims in the literature. First, the influence of “new” behavioral economics overwhelms that of “old” behavioral economics, in both the top five and the full set indexed in Web of Science. Whereas @simonBehavioral1955 and Allais (1953) never exceed about 0.20% of all economics-article citations over the period, @kahnemanProspect1979 reached at least 1% by the late 2010s and continues to rise. The contrast reflects both the scale of influence and the speed of acceptance: citations to the two “new” behavioral papers grow rapidly and steadily after publication, whereas Simon and Allais peak around the time of their Nobels or only much later in the 2010s. As argued by Offer and Söderberg, many laureates receive a “Nobel premium,” a modest post-prize citation bump. Simon and Allais fit this pattern, but for Kahneman and Tversky the effect is extreme: after the Nobel, their declining trend reverses and climbs throughout the sample. [@offerNobel2016]</w:t>
+        <w:t xml:space="preserve">The influence of “new” behavioral economics overwhelms that of “old” behavioral economics, in both the top five and the full set of economics publications indexed in Web of Science. Whereas @simonBehavioral1955 and Allais (1953) are never cited by more than 0.20% of all economics-article, @kahnemanProspect1979 reached at least 1% by the late 2010s and continues to rise. The contrast is both in scale of influence and speed of acceptance: citations to the two “new” behavioral papers grow rapidly and steadily right after publication, whereas Simon and Allais peak around the time of their Nobels or only much later in the 2010s wit the emergence of “new” behavioral economics. As argued by @offerNobel2016, many laureates receive a “Nobel premium,” a modest post-prize citation bump. Simon and Allais fit this pattern, but for Kahneman and Tversky the effect is extreme: after the Nobel, their declining trend reverses and climbs throughout the sample. [@offerNobel2016]</w:t>
       </w:r>
     </w:p>
     <w:p>
@@ -1282,22 +1250,17 @@
         </w:rPr>
         <w:t xml:space="preserve"> of citations, </w:t>
       </w:r>
-      <w:commentRangeStart w:id="5"/>
       <w:r>
         <w:rPr>
           <w:rtl w:val="0"/>
         </w:rPr>
         <w:t xml:space="preserve">distinguishing positive from negative uses or functional roles in the text</w:t>
       </w:r>
-      <w:commentRangeEnd w:id="5"/>
-      <w:r>
-        <w:commentReference w:id="5"/>
-      </w:r>
-      <w:r>
-        <w:rPr>
-          <w:rtl w:val="0"/>
-        </w:rPr>
-        <w:t xml:space="preserve">. Beyond simple counts, networked uses of citations help map relations among authors and publications. A prominent example is bibliographic coupling, widely used in the history of economics. It maps a corpus by the proximity of reference lists: texts are nodes, and the more references they share, the closer they appear in a two-dimensional layout. The premise is that shared references proxy intellectual proximity. Such maps delineate fields and disciplines and can reveal their internal structure, including possible core–periphery patterns.</w:t>
+      <w:r>
+        <w:rPr>
+          <w:rtl w:val="0"/>
+        </w:rPr>
+        <w:t xml:space="preserve"> [@budiUnderstanding2023]. Another way to use citations is to transform citation data into relational data. A prominent example is bibliographic coupling, widely used in the history of economics. It maps relationship between articles by using the similarity of reference lists: articles are nodes, and the more references two article share, the closer they appear in a two-dimensional layout. The premise is that shared references proxy intellectual proximity. These maps help delineate the frontiers of disciplines, fields or sub-specialities and expose their internal organization, including hierarchical and/or core-periphery structures.</w:t>
       </w:r>
     </w:p>
     <w:p>
@@ -1373,31 +1336,31 @@
         </w:rPr>
         <w:t xml:space="preserve">Second, quantitative methods do not yield objective, ready-made outputs. In our case, they produce statistical groupings—bibliometric communities and textual clusters—that require qualitative interpretation. This is a classic strategy to reduce a large and complex set of texts to a manageable number of simple categories. But these clusters are constructed on the basis of statistical commonalities, whose actual conceptual meaning can only be characterized through qualitative assessment. </w:t>
       </w:r>
-      <w:commentRangeStart w:id="6"/>
-      <w:commentRangeStart w:id="7"/>
-      <w:commentRangeStart w:id="8"/>
-      <w:commentRangeStart w:id="9"/>
+      <w:commentRangeStart w:id="1"/>
+      <w:commentRangeStart w:id="2"/>
+      <w:commentRangeStart w:id="3"/>
+      <w:commentRangeStart w:id="4"/>
       <w:r>
         <w:rPr>
           <w:rtl w:val="0"/>
         </w:rPr>
         <w:t xml:space="preserve">More importantly, a good qualitative knowledge of the corpus and of intellectual debates at stake are indispensable to make sense of raw results. Thus, whether in the collection of data or their analysis, quantitative methods require a constant back-and-forth with qualitative reasoning. </w:t>
       </w:r>
-      <w:commentRangeEnd w:id="6"/>
-      <w:r>
-        <w:commentReference w:id="6"/>
-      </w:r>
-      <w:commentRangeEnd w:id="7"/>
-      <w:r>
-        <w:commentReference w:id="7"/>
-      </w:r>
-      <w:commentRangeEnd w:id="8"/>
-      <w:r>
-        <w:commentReference w:id="8"/>
-      </w:r>
-      <w:commentRangeEnd w:id="9"/>
-      <w:r>
-        <w:commentReference w:id="9"/>
+      <w:commentRangeEnd w:id="1"/>
+      <w:r>
+        <w:commentReference w:id="1"/>
+      </w:r>
+      <w:commentRangeEnd w:id="2"/>
+      <w:r>
+        <w:commentReference w:id="2"/>
+      </w:r>
+      <w:commentRangeEnd w:id="3"/>
+      <w:r>
+        <w:commentReference w:id="3"/>
+      </w:r>
+      <w:commentRangeEnd w:id="4"/>
+      <w:r>
+        <w:commentReference w:id="4"/>
       </w:r>
       <w:r>
         <w:rPr>
@@ -1673,16 +1636,16 @@
         </w:rPr>
         <w:t xml:space="preserve"> expectations emerged in the 1970s (textual clusters 67 and 72). </w:t>
       </w:r>
-      <w:commentRangeStart w:id="10"/>
+      <w:commentRangeStart w:id="5"/>
       <w:r>
         <w:rPr>
           <w:rtl w:val="0"/>
         </w:rPr>
         <w:t xml:space="preserve">The first gathers articles that debate the hypothesis itself, including many critiques of its theoretical and empirical relevance in the 1970s–1980s. Others examine the implications of adopting the hypothesis across domains. </w:t>
       </w:r>
-      <w:commentRangeEnd w:id="10"/>
-      <w:r>
-        <w:commentReference w:id="10"/>
+      <w:commentRangeEnd w:id="5"/>
+      <w:r>
+        <w:commentReference w:id="5"/>
       </w:r>
       <w:r>
         <w:rPr>
@@ -1780,17 +1743,6 @@
           <w:rtl w:val="0"/>
         </w:rPr>
         <w:t xml:space="preserve">After the mid-1970s, several independent communities began to adopt rational expectations. A first trajectory appears in 1976–1983: two finance-oriented communities (“Asset Pricing and Consumption” and “cl_319”) partially merged into “Rational Expectations and Market Information.” At its core was imperfect information, with @rothschildEquilibrium1976 as a key node. Another central contribution was @grossmanImpossibility1980, which drew on Lucas’s imperfect-information framework [@lucasExpectations1972] and combined rational expectations with noisy signals to question market efficiency [see @delceyEfficient2023]. A second community emerged in 1979–1986 with “Game Theory and Information,” where rational expectations became more prominent. Here @kydlandRules1977 and @barroPositive1983 on time inconsistency sit alongside @krepsSequential1982 on sequential equilibria and @seltenReexamination1975 on equilibrium refinements. In the early 1980s this community split, yielding “Monetary Policy and Inflation,” which leverages game-theoretic models to deal with credibility and reputation in policy design.</w:t>
-      </w:r>
-    </w:p>
-    <w:p>
-      <w:pPr>
-        <w:rPr/>
-      </w:pPr>
-      <w:r>
-        <w:rPr>
-          <w:rtl w:val="0"/>
-        </w:rPr>
-        <w:t xml:space="preserve">Thus, beyond the well-known debates on business cycles and inflation, there was a community, not totally focused on macroeconomics issues, that existed in parallel in the 1970s. After the mid-1970s, we also find several trajectories of independent communities that start to employ more and more rational expectations. A first example appears in 1976-1983: two communities on finance topics (“Asset Pricing and Consumption” and “cl_319) partially merged to form “Rational Expectations and Market Information”. At the heart of the community was the concept of imperfect information (Rothschild and Stiglitz, 1976, being an important node). A central paper was Grossman and Stigliz (1980), taking inspiration from Lucas (1973) and the combination of rational expectations and noisy signals to criticize Fama and the possibility of efficient markets (see Delcey and Sergi, 2023). Similarly, a new cluster emerged in 1979-1986, “Game Theory and Information”, aggregating papers in game theory, now recurring more significantly to the concept of rational expectations. In this cluster, Kydland and Prescott (1977) or Barro and Gordon (1983) on rational expectations and time-inconcistency problems were major references, in parallel to Kreps and Wilson (1980) sequential equilibria model, or Selten’s (1975) refinement of Nash equilibrium. In the early 1980s, this community would split, with a new community emerging, “Monetary Policy and Inflation”, leveraging game theory to discuss how monetary policy can manage inflation, making concepts like credibility or reputation central.</w:t>
       </w:r>
     </w:p>
     <w:p>
@@ -1921,36 +1873,49 @@
         <w:rPr>
           <w:rtl w:val="0"/>
         </w:rPr>
-        <w:t xml:space="preserve">From 1979–1986, a more specific “Behavioral Decision Theory” community forms around Kahneman and Tversky’s contributions. It persists through the end of our period and, as with rational expectations, spins off several autonomous communities; after the 2000s, behavioral economics becomes a dominant venue for research on rationality. By contrast, Simon’s articles fades as a bibliometric anchor: “bounded” and “procedural” rationality are regularly invoked, as the textual analysis highlighted, but no later community clearly bears his heritage.</w:t>
-      </w:r>
-    </w:p>
-    <w:p>
-      <w:pPr>
-        <w:spacing w:after="240" w:before="0" w:lineRule="auto"/>
-        <w:rPr/>
-      </w:pPr>
-      <w:commentRangeStart w:id="11"/>
-      <w:r>
-        <w:rPr>
-          <w:rtl w:val="0"/>
-        </w:rPr>
-        <w:t xml:space="preserve">While it is often argued that the rise of “new” behavioral economics overshadowed earlier “old” behavioral work, citations to @simonBehavioral1955 have been higher since the ascent of the new program. This resurgence admits at least three interpretations. A more positive reading is that the “new” program helped revive abandoned research directions and moved toward reconciliation with earlier strands. A more critical view sees intellectual appropriation, in which classic references are reframed to fit the new agenda, renewing interest through a presentist lens. A third interpretation is that the citation increase reflects a growing backlash against the “new” program from the standpoint of “old” behavioral economics.</w:t>
-      </w:r>
-    </w:p>
-    <w:p>
-      <w:pPr>
-        <w:spacing w:after="240" w:before="240" w:lineRule="auto"/>
-        <w:rPr/>
-      </w:pPr>
-      <w:r>
-        <w:rPr>
-          <w:rtl w:val="0"/>
-        </w:rPr>
-        <w:t xml:space="preserve">Citation counts cannot adjudicate between these readings, but they can guide qualitative inquiry and motivate further quantitative work. As shown above for Simon’s trajectory in the 1960s–1970s, this can involve tracking the authors and communities citing these works, and combining text with citation data to test whether references to Simon function as surface signals within the “new” program or as anchors for critique from “old” behavioral economists.</w:t>
-      </w:r>
-      <w:commentRangeEnd w:id="11"/>
-      <w:r>
-        <w:commentReference w:id="11"/>
+        <w:t xml:space="preserve">From 1979–1986, a more specific “Behavioral Decision Theory” community forms around Kahneman and Tversky’s contributions. It persists through the end of our period and, as with rational expectations, spins off several autonomous communities. In addition to the main Kahneman and Tversky’s cluster, we find four other clusters about pro-social behavior, behavioral intertemporal decision, behavioral game theory, and behavioral finance. After the 2000s, behavioral economics becomes a dominant venue for research on rationality with five behavioral economics clusters culminating to around 30% of the network. By contrast, Simon’s articles fades as a bibliometric anchor: “bounded” and “procedural” rationality are regularly invoked, as the textual analysis highlighted, but no later community clearly bears his heritage.</w:t>
+      </w:r>
+    </w:p>
+    <w:p>
+      <w:pPr>
+        <w:spacing w:before="0" w:lineRule="auto"/>
+        <w:rPr/>
+      </w:pPr>
+      <w:r>
+        <w:rPr>
+          <w:rtl w:val="0"/>
+        </w:rPr>
+        <w:t xml:space="preserve">T</w:t>
+      </w:r>
+      <w:r>
+        <w:rPr>
+          <w:rtl w:val="0"/>
+        </w:rPr>
+        <w:t xml:space="preserve">t is often argued that the rise of “new” behavioral economics overshadowed earlier “old” behavioral works, and our quantitative studies delineates the specific chronology and magnitude of the different attempts at stirring a behavioral shift in economics. However, </w:t>
+      </w:r>
+      <w:r>
+        <w:rPr>
+          <w:rtl w:val="0"/>
+        </w:rPr>
+        <w:t xml:space="preserve">as made clear by @fig-rationality-paper-citations, i</w:t>
+      </w:r>
+      <w:r>
+        <w:rPr>
+          <w:rtl w:val="0"/>
+        </w:rPr>
+        <w:t xml:space="preserve">t is not just a linear story of a shift from one program to the other. Citations to @simonBehavioral1955 have never been higher than since the ascent of the new behavioral economics. This resurgence admits at least three interpretations. A more favorable reading is that the “new” program helped revive abandoned research directions and moved toward reconciliation with earlier strands (something promoted by </w:t>
+      </w:r>
+      <w:r>
+        <w:rPr>
+          <w:rtl w:val="0"/>
+        </w:rPr>
+        <w:t xml:space="preserve">@sentRationality2008 or more recently by @earlPrinciples2022)</w:t>
+      </w:r>
+      <w:r>
+        <w:rPr>
+          <w:rtl w:val="0"/>
+        </w:rPr>
+        <w:t xml:space="preserve">. A more unfavorable view sees intellectual appropriation, in which classic references are reframed to fit the new agenda, renewing interest but with a biased and presentist lens [@monginAllais2019]. A third more critical interpretation is that the citation increase reflects a growing backlash against the “new” program from the standpoint of “old” behavioral economics. Preliminary evidence supports the second interpretation. This is suggested by the sparse and unstructured citations patterns to “old” behavioral economics and the fact that discussions of rationality are increasingly framed by “new” behavioral and experimental concepts. While a definitive conclusion is beyond the scope of this paper, our study provides a roadmap for future quantitative and qualitative research needed to further the understanding of the relationship between “old” and “new” behavioral economics.</w:t>
       </w:r>
       <w:r>
         <w:rPr>
@@ -2001,7 +1966,7 @@
 
 <file path=word/comments.xml><?xml version="1.0" encoding="utf-8"?>
 <w:comments xmlns:mc="http://schemas.openxmlformats.org/markup-compatibility/2006" xmlns:o="urn:schemas-microsoft-com:office:office" xmlns:r="http://schemas.openxmlformats.org/officeDocument/2006/relationships" xmlns:m="http://schemas.openxmlformats.org/officeDocument/2006/math" xmlns:v="urn:schemas-microsoft-com:vml" xmlns:wp="http://schemas.openxmlformats.org/drawingml/2006/wordprocessingDrawing" xmlns:w10="urn:schemas-microsoft-com:office:word" xmlns:w="http://schemas.openxmlformats.org/wordprocessingml/2006/main" xmlns:wne="http://schemas.microsoft.com/office/word/2006/wordml" xmlns:sl="http://schemas.openxmlformats.org/schemaLibrary/2006/main" xmlns:a="http://schemas.openxmlformats.org/drawingml/2006/main" xmlns:pic="http://schemas.openxmlformats.org/drawingml/2006/picture" xmlns:c="http://schemas.openxmlformats.org/drawingml/2006/chart" xmlns:lc="http://schemas.openxmlformats.org/drawingml/2006/lockedCanvas" xmlns:dgm="http://schemas.openxmlformats.org/drawingml/2006/diagram" xmlns:wps="http://schemas.microsoft.com/office/word/2010/wordprocessingShape" xmlns:wpg="http://schemas.microsoft.com/office/word/2010/wordprocessingGroup" xmlns:w14="http://schemas.microsoft.com/office/word/2010/wordml" xmlns:w15="http://schemas.microsoft.com/office/word/2012/wordml" xmlns:w16="http://schemas.microsoft.com/office/word/2018/wordml" xmlns:w16cex="http://schemas.microsoft.com/office/word/2018/wordml/cex" xmlns:w16cid="http://schemas.microsoft.com/office/word/2016/wordml/cid" xmlns="http://schemas.microsoft.com/office/tasks/2019/documenttasks" xmlns:cr="http://schemas.microsoft.com/office/comments/2020/reactions">
-  <w:comment w:author="Aurélien Goutsmedt" w:id="11" w:date="2025-09-05T20:57:24Z">
+  <w:comment w:author="Aurélien Goutsmedt" w:id="1" w:date="2025-08-24T13:41:21Z">
     <w:p>
       <w:pPr>
         <w:keepNext w:val="0"/>
@@ -2048,11 +2013,11 @@
           <w:vertAlign w:val="baseline"/>
           <w:rtl w:val="0"/>
         </w:rPr>
-        <w:t xml:space="preserve">@alexandre.truc77@gmail.com A voir si tu veux raffiner. Ou si tu veux essayer de creuser un peu via nos données.</w:t>
+        <w:t xml:space="preserve">Develop here, notably on the types of indicators we develop, and how it works concretely. Example with one cluster?</w:t>
       </w:r>
     </w:p>
   </w:comment>
-  <w:comment w:author="Aurélien Goutsmedt" w:id="6" w:date="2025-08-24T13:41:21Z">
+  <w:comment w:author="Truc Alexandre" w:id="2" w:date="2025-09-03T13:52:22Z">
     <w:p>
       <w:pPr>
         <w:keepNext w:val="0"/>
@@ -2099,11 +2064,9 @@
           <w:vertAlign w:val="baseline"/>
           <w:rtl w:val="0"/>
         </w:rPr>
-        <w:t xml:space="preserve">Develop here, notably on the types of indicators we develop, and how it works concretely. Example with one cluster?</w:t>
-      </w:r>
-    </w:p>
-  </w:comment>
-  <w:comment w:author="Truc Alexandre" w:id="7" w:date="2025-09-03T13:52:22Z">
+        <w:t xml:space="preserve">The weak version of that is how to interpret a cluster. Some suggestions of example:</w:t>
+      </w:r>
+    </w:p>
     <w:p>
       <w:pPr>
         <w:keepNext w:val="0"/>
@@ -2150,7 +2113,7 @@
           <w:vertAlign w:val="baseline"/>
           <w:rtl w:val="0"/>
         </w:rPr>
-        <w:t xml:space="preserve">The weak version of that is how to interpret a cluster. Some suggestions of example:</w:t>
+        <w:t xml:space="preserve">- Behavioral Finance: Fama is cited but its obvious negative citations for specialists</w:t>
       </w:r>
     </w:p>
     <w:p>
@@ -2199,7 +2162,7 @@
           <w:vertAlign w:val="baseline"/>
           <w:rtl w:val="0"/>
         </w:rPr>
-        <w:t xml:space="preserve">- Behavioral Finance: Fama is cited but its obvious negative citations for specialists</w:t>
+        <w:t xml:space="preserve">- Behavioral Finance or Game theory: structural cluster but there is a shift towards neoclassical to more behavioral</w:t>
       </w:r>
     </w:p>
     <w:p>
@@ -2248,9 +2211,11 @@
           <w:vertAlign w:val="baseline"/>
           <w:rtl w:val="0"/>
         </w:rPr>
-        <w:t xml:space="preserve">- Behavioral Finance or Game theory: structural cluster but there is a shift towards neoclassical to more behavioral</w:t>
-      </w:r>
-    </w:p>
+        <w:t xml:space="preserve">- Tri-partite behavioral economics: an obvious behavioral economics clusters (around KT) but actually multiple other clusters about a famous tri-partite specialization within the field between risk/time/social preferences + finance</w:t>
+      </w:r>
+    </w:p>
+  </w:comment>
+  <w:comment w:author="Truc Alexandre" w:id="3" w:date="2025-09-03T13:55:17Z">
     <w:p>
       <w:pPr>
         <w:keepNext w:val="0"/>
@@ -2297,11 +2262,9 @@
           <w:vertAlign w:val="baseline"/>
           <w:rtl w:val="0"/>
         </w:rPr>
-        <w:t xml:space="preserve">- Tri-partite behavioral economics: an obvious behavioral economics clusters (around KT) but actually multiple other clusters about a famous tri-partite specialization within the field between risk/time/social preferences + finance</w:t>
-      </w:r>
-    </w:p>
-  </w:comment>
-  <w:comment w:author="Truc Alexandre" w:id="8" w:date="2025-09-03T13:55:17Z">
+        <w:t xml:space="preserve">The stronger version of that is how to interpret the results:</w:t>
+      </w:r>
+    </w:p>
     <w:p>
       <w:pPr>
         <w:keepNext w:val="0"/>
@@ -2348,7 +2311,7 @@
           <w:vertAlign w:val="baseline"/>
           <w:rtl w:val="0"/>
         </w:rPr>
-        <w:t xml:space="preserve">The stronger version of that is how to interpret the results:</w:t>
+        <w:t xml:space="preserve">- I give an example in the basic citation study</w:t>
       </w:r>
     </w:p>
     <w:p>
@@ -2397,9 +2360,11 @@
           <w:vertAlign w:val="baseline"/>
           <w:rtl w:val="0"/>
         </w:rPr>
-        <w:t xml:space="preserve">- I give an example in the basic citation study</w:t>
-      </w:r>
-    </w:p>
+        <w:t xml:space="preserve">- Another possible example is to explain that big clusters can be low-influence/low-citation =&gt; network analysis is always situated, it requires different tools to understand how these clusters are integrated in the overall economics</w:t>
+      </w:r>
+    </w:p>
+  </w:comment>
+  <w:comment w:author="Aurélien Goutsmedt" w:id="4" w:date="2025-09-03T16:59:03Z">
     <w:p>
       <w:pPr>
         <w:keepNext w:val="0"/>
@@ -2446,11 +2411,11 @@
           <w:vertAlign w:val="baseline"/>
           <w:rtl w:val="0"/>
         </w:rPr>
-        <w:t xml:space="preserve">- Another possible example is to explain that big clusters can be low-influence/low-citation =&gt; network analysis is always situated, it requires different tools to understand how these clusters are integrated in the overall economics</w:t>
+        <w:t xml:space="preserve">My point was just about the indicators we use: top authors, top references, etc... And this guide us toward such or such paper to check content</w:t>
       </w:r>
     </w:p>
   </w:comment>
-  <w:comment w:author="Aurélien Goutsmedt" w:id="9" w:date="2025-09-03T16:59:03Z">
+  <w:comment w:author="Aurélien Goutsmedt" w:id="5" w:date="2025-09-05T19:52:28Z">
     <w:p>
       <w:pPr>
         <w:keepNext w:val="0"/>
@@ -2497,317 +2462,11 @@
           <w:vertAlign w:val="baseline"/>
           <w:rtl w:val="0"/>
         </w:rPr>
-        <w:t xml:space="preserve">My point was just about the indicators we use: top authors, top references, etc... And this guide us toward such or such paper to check content</w:t>
-      </w:r>
-    </w:p>
-  </w:comment>
-  <w:comment w:author="Aurélien Goutsmedt" w:id="10" w:date="2025-09-05T19:52:28Z">
-    <w:p>
-      <w:pPr>
-        <w:keepNext w:val="0"/>
-        <w:keepLines w:val="0"/>
-        <w:pageBreakBefore w:val="0"/>
-        <w:widowControl w:val="0"/>
-        <w:pBdr>
-          <w:top w:space="0" w:sz="0" w:val="nil"/>
-          <w:left w:space="0" w:sz="0" w:val="nil"/>
-          <w:bottom w:space="0" w:sz="0" w:val="nil"/>
-          <w:right w:space="0" w:sz="0" w:val="nil"/>
-          <w:between w:space="0" w:sz="0" w:val="nil"/>
-        </w:pBdr>
-        <w:shd w:fill="auto" w:val="clear"/>
-        <w:spacing w:after="0" w:before="0" w:line="240" w:lineRule="auto"/>
-        <w:ind w:left="0" w:right="0" w:firstLine="0"/>
-        <w:jc w:val="left"/>
-        <w:rPr>
-          <w:rFonts w:ascii="Arial" w:cs="Arial" w:eastAsia="Arial" w:hAnsi="Arial"/>
-          <w:b w:val="0"/>
-          <w:i w:val="0"/>
-          <w:smallCaps w:val="0"/>
-          <w:strike w:val="0"/>
-          <w:color w:val="000000"/>
-          <w:sz w:val="22"/>
-          <w:szCs w:val="22"/>
-          <w:u w:val="none"/>
-          <w:shd w:fill="auto" w:val="clear"/>
-          <w:vertAlign w:val="baseline"/>
-        </w:rPr>
-      </w:pPr>
-      <w:r>
-        <w:rPr>
-          <w:rFonts w:ascii="Arial" w:cs="Arial" w:eastAsia="Arial" w:hAnsi="Arial"/>
-          <w:b w:val="0"/>
-          <w:i w:val="0"/>
-          <w:smallCaps w:val="0"/>
-          <w:strike w:val="0"/>
-          <w:color w:val="000000"/>
-          <w:sz w:val="22"/>
-          <w:szCs w:val="22"/>
-          <w:u w:val="none"/>
-          <w:shd w:fill="auto" w:val="clear"/>
-          <w:vertAlign w:val="baseline"/>
-          <w:rtl w:val="0"/>
-        </w:rPr>
         <w:t xml:space="preserve">ref</w:t>
-      </w:r>
-    </w:p>
-  </w:comment>
-  <w:comment w:author="Aurélien Goutsmedt" w:id="5" w:date="2025-09-06T11:40:02Z">
-    <w:p>
-      <w:pPr>
-        <w:keepNext w:val="0"/>
-        <w:keepLines w:val="0"/>
-        <w:pageBreakBefore w:val="0"/>
-        <w:widowControl w:val="0"/>
-        <w:pBdr>
-          <w:top w:space="0" w:sz="0" w:val="nil"/>
-          <w:left w:space="0" w:sz="0" w:val="nil"/>
-          <w:bottom w:space="0" w:sz="0" w:val="nil"/>
-          <w:right w:space="0" w:sz="0" w:val="nil"/>
-          <w:between w:space="0" w:sz="0" w:val="nil"/>
-        </w:pBdr>
-        <w:shd w:fill="auto" w:val="clear"/>
-        <w:spacing w:after="0" w:before="0" w:line="240" w:lineRule="auto"/>
-        <w:ind w:left="0" w:right="0" w:firstLine="0"/>
-        <w:jc w:val="left"/>
-        <w:rPr>
-          <w:rFonts w:ascii="Arial" w:cs="Arial" w:eastAsia="Arial" w:hAnsi="Arial"/>
-          <w:b w:val="0"/>
-          <w:i w:val="0"/>
-          <w:smallCaps w:val="0"/>
-          <w:strike w:val="0"/>
-          <w:color w:val="000000"/>
-          <w:sz w:val="22"/>
-          <w:szCs w:val="22"/>
-          <w:u w:val="none"/>
-          <w:shd w:fill="auto" w:val="clear"/>
-          <w:vertAlign w:val="baseline"/>
-        </w:rPr>
-      </w:pPr>
-      <w:r>
-        <w:rPr>
-          <w:rFonts w:ascii="Arial" w:cs="Arial" w:eastAsia="Arial" w:hAnsi="Arial"/>
-          <w:b w:val="0"/>
-          <w:i w:val="0"/>
-          <w:smallCaps w:val="0"/>
-          <w:strike w:val="0"/>
-          <w:color w:val="000000"/>
-          <w:sz w:val="22"/>
-          <w:szCs w:val="22"/>
-          <w:u w:val="none"/>
-          <w:shd w:fill="auto" w:val="clear"/>
-          <w:vertAlign w:val="baseline"/>
-          <w:rtl w:val="0"/>
-        </w:rPr>
-        <w:t xml:space="preserve">ref</w:t>
-      </w:r>
-    </w:p>
-  </w:comment>
-  <w:comment w:author="Aurélien Goutsmedt" w:id="1" w:date="2025-09-06T11:02:26Z">
-    <w:p>
-      <w:pPr>
-        <w:keepNext w:val="0"/>
-        <w:keepLines w:val="0"/>
-        <w:pageBreakBefore w:val="0"/>
-        <w:widowControl w:val="0"/>
-        <w:pBdr>
-          <w:top w:space="0" w:sz="0" w:val="nil"/>
-          <w:left w:space="0" w:sz="0" w:val="nil"/>
-          <w:bottom w:space="0" w:sz="0" w:val="nil"/>
-          <w:right w:space="0" w:sz="0" w:val="nil"/>
-          <w:between w:space="0" w:sz="0" w:val="nil"/>
-        </w:pBdr>
-        <w:shd w:fill="auto" w:val="clear"/>
-        <w:spacing w:after="0" w:before="0" w:line="240" w:lineRule="auto"/>
-        <w:ind w:left="0" w:right="0" w:firstLine="0"/>
-        <w:jc w:val="left"/>
-        <w:rPr>
-          <w:rFonts w:ascii="Arial" w:cs="Arial" w:eastAsia="Arial" w:hAnsi="Arial"/>
-          <w:b w:val="0"/>
-          <w:i w:val="0"/>
-          <w:smallCaps w:val="0"/>
-          <w:strike w:val="0"/>
-          <w:color w:val="000000"/>
-          <w:sz w:val="22"/>
-          <w:szCs w:val="22"/>
-          <w:u w:val="none"/>
-          <w:shd w:fill="auto" w:val="clear"/>
-          <w:vertAlign w:val="baseline"/>
-        </w:rPr>
-      </w:pPr>
-      <w:r>
-        <w:rPr>
-          <w:rFonts w:ascii="Arial" w:cs="Arial" w:eastAsia="Arial" w:hAnsi="Arial"/>
-          <w:b w:val="0"/>
-          <w:i w:val="0"/>
-          <w:smallCaps w:val="0"/>
-          <w:strike w:val="0"/>
-          <w:color w:val="000000"/>
-          <w:sz w:val="22"/>
-          <w:szCs w:val="22"/>
-          <w:u w:val="none"/>
-          <w:shd w:fill="auto" w:val="clear"/>
-          <w:vertAlign w:val="baseline"/>
-          <w:rtl w:val="0"/>
-        </w:rPr>
-        <w:t xml:space="preserve">ref</w:t>
-      </w:r>
-    </w:p>
-  </w:comment>
-  <w:comment w:author="Aurélien Goutsmedt" w:id="2" w:date="2025-09-06T11:04:34Z">
-    <w:p>
-      <w:pPr>
-        <w:keepNext w:val="0"/>
-        <w:keepLines w:val="0"/>
-        <w:pageBreakBefore w:val="0"/>
-        <w:widowControl w:val="0"/>
-        <w:pBdr>
-          <w:top w:space="0" w:sz="0" w:val="nil"/>
-          <w:left w:space="0" w:sz="0" w:val="nil"/>
-          <w:bottom w:space="0" w:sz="0" w:val="nil"/>
-          <w:right w:space="0" w:sz="0" w:val="nil"/>
-          <w:between w:space="0" w:sz="0" w:val="nil"/>
-        </w:pBdr>
-        <w:shd w:fill="auto" w:val="clear"/>
-        <w:spacing w:after="0" w:before="0" w:line="240" w:lineRule="auto"/>
-        <w:ind w:left="0" w:right="0" w:firstLine="0"/>
-        <w:jc w:val="left"/>
-        <w:rPr>
-          <w:rFonts w:ascii="Arial" w:cs="Arial" w:eastAsia="Arial" w:hAnsi="Arial"/>
-          <w:b w:val="0"/>
-          <w:i w:val="0"/>
-          <w:smallCaps w:val="0"/>
-          <w:strike w:val="0"/>
-          <w:color w:val="000000"/>
-          <w:sz w:val="22"/>
-          <w:szCs w:val="22"/>
-          <w:u w:val="none"/>
-          <w:shd w:fill="auto" w:val="clear"/>
-          <w:vertAlign w:val="baseline"/>
-        </w:rPr>
-      </w:pPr>
-      <w:r>
-        <w:rPr>
-          <w:rFonts w:ascii="Arial" w:cs="Arial" w:eastAsia="Arial" w:hAnsi="Arial"/>
-          <w:b w:val="0"/>
-          <w:i w:val="0"/>
-          <w:smallCaps w:val="0"/>
-          <w:strike w:val="0"/>
-          <w:color w:val="000000"/>
-          <w:sz w:val="22"/>
-          <w:szCs w:val="22"/>
-          <w:u w:val="none"/>
-          <w:shd w:fill="auto" w:val="clear"/>
-          <w:vertAlign w:val="baseline"/>
-          <w:rtl w:val="0"/>
-        </w:rPr>
-        <w:t xml:space="preserve">Ref</w:t>
       </w:r>
     </w:p>
   </w:comment>
   <w:comment w:author="Aurélien Goutsmedt" w:id="0" w:date="2025-09-06T10:30:03Z">
-    <w:p>
-      <w:pPr>
-        <w:keepNext w:val="0"/>
-        <w:keepLines w:val="0"/>
-        <w:pageBreakBefore w:val="0"/>
-        <w:widowControl w:val="0"/>
-        <w:pBdr>
-          <w:top w:space="0" w:sz="0" w:val="nil"/>
-          <w:left w:space="0" w:sz="0" w:val="nil"/>
-          <w:bottom w:space="0" w:sz="0" w:val="nil"/>
-          <w:right w:space="0" w:sz="0" w:val="nil"/>
-          <w:between w:space="0" w:sz="0" w:val="nil"/>
-        </w:pBdr>
-        <w:shd w:fill="auto" w:val="clear"/>
-        <w:spacing w:after="0" w:before="0" w:line="240" w:lineRule="auto"/>
-        <w:ind w:left="0" w:right="0" w:firstLine="0"/>
-        <w:jc w:val="left"/>
-        <w:rPr>
-          <w:rFonts w:ascii="Arial" w:cs="Arial" w:eastAsia="Arial" w:hAnsi="Arial"/>
-          <w:b w:val="0"/>
-          <w:i w:val="0"/>
-          <w:smallCaps w:val="0"/>
-          <w:strike w:val="0"/>
-          <w:color w:val="000000"/>
-          <w:sz w:val="22"/>
-          <w:szCs w:val="22"/>
-          <w:u w:val="none"/>
-          <w:shd w:fill="auto" w:val="clear"/>
-          <w:vertAlign w:val="baseline"/>
-        </w:rPr>
-      </w:pPr>
-      <w:r>
-        <w:rPr>
-          <w:rFonts w:ascii="Arial" w:cs="Arial" w:eastAsia="Arial" w:hAnsi="Arial"/>
-          <w:b w:val="0"/>
-          <w:i w:val="0"/>
-          <w:smallCaps w:val="0"/>
-          <w:strike w:val="0"/>
-          <w:color w:val="000000"/>
-          <w:sz w:val="22"/>
-          <w:szCs w:val="22"/>
-          <w:u w:val="none"/>
-          <w:shd w:fill="auto" w:val="clear"/>
-          <w:vertAlign w:val="baseline"/>
-          <w:rtl w:val="0"/>
-        </w:rPr>
-        <w:t xml:space="preserve">ref</w:t>
-      </w:r>
-    </w:p>
-  </w:comment>
-  <w:comment w:author="Aurélien Goutsmedt" w:id="4" w:date="2025-09-06T11:10:30Z">
-    <w:p>
-      <w:pPr>
-        <w:keepNext w:val="0"/>
-        <w:keepLines w:val="0"/>
-        <w:pageBreakBefore w:val="0"/>
-        <w:widowControl w:val="0"/>
-        <w:pBdr>
-          <w:top w:space="0" w:sz="0" w:val="nil"/>
-          <w:left w:space="0" w:sz="0" w:val="nil"/>
-          <w:bottom w:space="0" w:sz="0" w:val="nil"/>
-          <w:right w:space="0" w:sz="0" w:val="nil"/>
-          <w:between w:space="0" w:sz="0" w:val="nil"/>
-        </w:pBdr>
-        <w:shd w:fill="auto" w:val="clear"/>
-        <w:spacing w:after="0" w:before="0" w:line="240" w:lineRule="auto"/>
-        <w:ind w:left="0" w:right="0" w:firstLine="0"/>
-        <w:jc w:val="left"/>
-        <w:rPr>
-          <w:rFonts w:ascii="Arial" w:cs="Arial" w:eastAsia="Arial" w:hAnsi="Arial"/>
-          <w:b w:val="0"/>
-          <w:i w:val="0"/>
-          <w:smallCaps w:val="0"/>
-          <w:strike w:val="0"/>
-          <w:color w:val="000000"/>
-          <w:sz w:val="22"/>
-          <w:szCs w:val="22"/>
-          <w:u w:val="none"/>
-          <w:shd w:fill="auto" w:val="clear"/>
-          <w:vertAlign w:val="baseline"/>
-        </w:rPr>
-      </w:pPr>
-      <w:r>
-        <w:rPr>
-          <w:rFonts w:ascii="Arial" w:cs="Arial" w:eastAsia="Arial" w:hAnsi="Arial"/>
-          <w:b w:val="0"/>
-          <w:i w:val="0"/>
-          <w:smallCaps w:val="0"/>
-          <w:strike w:val="0"/>
-          <w:color w:val="000000"/>
-          <w:sz w:val="22"/>
-          <w:szCs w:val="22"/>
-          <w:u w:val="none"/>
-          <w:shd w:fill="auto" w:val="clear"/>
-          <w:vertAlign w:val="baseline"/>
-          <w:rtl w:val="0"/>
-        </w:rPr>
-        <w:t xml:space="preserve">ref</w:t>
-      </w:r>
-    </w:p>
-  </w:comment>
-  <w:comment w:author="Aurélien Goutsmedt" w:id="3" w:date="2025-09-06T11:10:32Z">
     <w:p>
       <w:pPr>
         <w:keepNext w:val="0"/>

</xml_diff>

<commit_message>
Correcting typos on my FIRST NAME
</commit_message>
<xml_diff>
--- a/paper/gdoc.docx
+++ b/paper/gdoc.docx
@@ -1135,7 +1135,7 @@
         <w:rPr>
           <w:rtl w:val="0"/>
         </w:rPr>
-        <w:t xml:space="preserve">Historians routinely discuss scientific influence, and recognition using proxies such as major grants, prizes, and honors. For example, @sentBehavioral2004’s</w:t>
+        <w:t xml:space="preserve">Historians routinely discuss scientific influence, and recognition using proxies such as major grants, prizes, and honors. For example, @sent_behavioral_2004</w:t>
       </w:r>
       <w:r>
         <w:rPr>
@@ -1170,7 +1170,7 @@
         <w:rPr>
           <w:rtl w:val="0"/>
         </w:rPr>
-        <w:t xml:space="preserve">@fig-rationality-paper-citations plots citation patterns for four seminal references on bounded rationality across all economics journals and the top five. The selection is partly arbitrary but standard in the literature: @simonBehavioral1955 and @allaisComportement1953 are early critiques of neoclassical rational choice with both empirical and normative implications, while @a</w:t>
+        <w:t xml:space="preserve">@fig-rationality-paper-citations plots citation patterns for four seminal references on bounded rationality across all economics journals and the top five. The selection is partly arbitrary but standard in the literature: @simonBehavioral1955 and @allaisComportementHommeRationnel1953 are early critiques of neoclassical rational choice with both empirical and normative implications, while @a</w:t>
       </w:r>
       <w:r>
         <w:rPr>
@@ -1210,7 +1210,7 @@
         <w:rPr>
           <w:rtl w:val="0"/>
         </w:rPr>
-        <w:t xml:space="preserve">The influence of “new” behavioral economics overwhelms that of “old” behavioral economics, in both the top five and the full set of economics publications indexed in Web of Science. Whereas @simonBehavioral1955 and Allais (1953) are never cited by more than 0.20% of all economics-article, @kahnemanProspect1979 reached at least 1% by the late 2010s and continues to rise. The contrast is both in scale of influence and speed of acceptance: citations to the two “new” behavioral papers grow rapidly and steadily right after publication, whereas Simon and Allais peak around the time of their Nobels or only much later in the 2010s wit the emergence of “new” behavioral economics. As argued by @offerNobel2016, many laureates receive a “Nobel premium,” a modest post-prize citation bump. Simon and Allais fit this pattern, but for Kahneman and Tversky the effect is extreme: after the Nobel, their declining trend reverses and climbs throughout the sample. [@offerNobel2016]</w:t>
+        <w:t xml:space="preserve">The influence of “new” behavioral economics overwhelms that of “old” behavioral economics, in both the top five and the full set of economics publications indexed in Web of Science. Whereas @simonBehavioral1955 and @allaisComportementHommeRationnel1953 are never cited by more than 0.20% of all economics-article, @kahnemanProspect1979 reached at least 1% by the late 2010s and continues to rise. The contrast is both in scale of influence and speed of acceptance: citations to the two “new” behavioral papers grow rapidly and steadily right after publication, whereas Simon and Allais peak around the time of their Nobels or only much later in the 2010s wit the emergence of “new” behavioral economics. As argued by @offerNobel2016, many laureates receive a “Nobel premium,” a modest post-prize citation bump. Simon and Allais fit this pattern, but for Kahneman and Tversky the effect is extreme: after the Nobel, their declining trend reverses and climbs throughout the sample. [@offerNobel2016]</w:t>
       </w:r>
     </w:p>
     <w:p>
@@ -1915,7 +1915,24 @@
         <w:rPr>
           <w:rtl w:val="0"/>
         </w:rPr>
-        <w:t xml:space="preserve">. A more unfavorable view sees intellectual appropriation, in which classic references are reframed to fit the new agenda, renewing interest but with a biased and presentist lens [@monginAllais2019]. A third more critical interpretation is that the citation increase reflects a growing backlash against the “new” program from the standpoint of “old” behavioral economics. Preliminary evidence supports the second interpretation. This is suggested by the sparse and unstructured citations patterns to “old” behavioral economics and the fact that discussions of rationality are increasingly framed by “new” behavioral and experimental concepts. While a definitive conclusion is beyond the scope of this paper, our study provides a roadmap for future quantitative and qualitative research needed to further the understanding of the relationship between “old” and “new” behavioral economics.</w:t>
+        <w:t xml:space="preserve">. A more unfavorable view sees intellectual appropriation, in which classic references are reframed to fit the new agenda, renewing interest but with a biased and presentist lens [@</w:t>
+      </w:r>
+      <w:commentRangeStart w:id="6"/>
+      <w:r>
+        <w:rPr>
+          <w:rtl w:val="0"/>
+        </w:rPr>
+        <w:t xml:space="preserve">monginAllais2019</w:t>
+      </w:r>
+      <w:commentRangeEnd w:id="6"/>
+      <w:r>
+        <w:commentReference w:id="6"/>
+      </w:r>
+      <w:r>
+        <w:rPr>
+          <w:rtl w:val="0"/>
+        </w:rPr>
+        <w:t xml:space="preserve">]. A third more critical interpretation is that the citation increase reflects a growing backlash against the “new” program from the standpoint of “old” behavioral economics. Preliminary evidence supports the second interpretation. This is suggested by the sparse and unstructured citations patterns to “old” behavioral economics and the fact that discussions of rationality are increasingly framed by “new” behavioral and experimental concepts. While a definitive conclusion is beyond the scope of this paper, our study provides a roadmap for future quantitative and qualitative research needed to further the understanding of the relationship between “old” and “new” behavioral economics.</w:t>
       </w:r>
       <w:r>
         <w:rPr>
@@ -1966,6 +1983,57 @@
 
 <file path=word/comments.xml><?xml version="1.0" encoding="utf-8"?>
 <w:comments xmlns:mc="http://schemas.openxmlformats.org/markup-compatibility/2006" xmlns:o="urn:schemas-microsoft-com:office:office" xmlns:r="http://schemas.openxmlformats.org/officeDocument/2006/relationships" xmlns:m="http://schemas.openxmlformats.org/officeDocument/2006/math" xmlns:v="urn:schemas-microsoft-com:vml" xmlns:wp="http://schemas.openxmlformats.org/drawingml/2006/wordprocessingDrawing" xmlns:w10="urn:schemas-microsoft-com:office:word" xmlns:w="http://schemas.openxmlformats.org/wordprocessingml/2006/main" xmlns:wne="http://schemas.microsoft.com/office/word/2006/wordml" xmlns:sl="http://schemas.openxmlformats.org/schemaLibrary/2006/main" xmlns:a="http://schemas.openxmlformats.org/drawingml/2006/main" xmlns:pic="http://schemas.openxmlformats.org/drawingml/2006/picture" xmlns:c="http://schemas.openxmlformats.org/drawingml/2006/chart" xmlns:lc="http://schemas.openxmlformats.org/drawingml/2006/lockedCanvas" xmlns:dgm="http://schemas.openxmlformats.org/drawingml/2006/diagram" xmlns:wps="http://schemas.microsoft.com/office/word/2010/wordprocessingShape" xmlns:wpg="http://schemas.microsoft.com/office/word/2010/wordprocessingGroup" xmlns:w14="http://schemas.microsoft.com/office/word/2010/wordml" xmlns:w15="http://schemas.microsoft.com/office/word/2012/wordml" xmlns:w16="http://schemas.microsoft.com/office/word/2018/wordml" xmlns:w16cex="http://schemas.microsoft.com/office/word/2018/wordml/cex" xmlns:w16cid="http://schemas.microsoft.com/office/word/2016/wordml/cid" xmlns="http://schemas.microsoft.com/office/tasks/2019/documenttasks" xmlns:cr="http://schemas.microsoft.com/office/comments/2020/reactions">
+  <w:comment w:author="Aurélien Goutsmedt" w:id="6" w:date="2025-09-08T12:07:57Z">
+    <w:p>
+      <w:pPr>
+        <w:keepNext w:val="0"/>
+        <w:keepLines w:val="0"/>
+        <w:pageBreakBefore w:val="0"/>
+        <w:widowControl w:val="0"/>
+        <w:pBdr>
+          <w:top w:space="0" w:sz="0" w:val="nil"/>
+          <w:left w:space="0" w:sz="0" w:val="nil"/>
+          <w:bottom w:space="0" w:sz="0" w:val="nil"/>
+          <w:right w:space="0" w:sz="0" w:val="nil"/>
+          <w:between w:space="0" w:sz="0" w:val="nil"/>
+        </w:pBdr>
+        <w:shd w:fill="auto" w:val="clear"/>
+        <w:spacing w:after="0" w:before="0" w:line="240" w:lineRule="auto"/>
+        <w:ind w:left="0" w:right="0" w:firstLine="0"/>
+        <w:jc w:val="left"/>
+        <w:rPr>
+          <w:rFonts w:ascii="Arial" w:cs="Arial" w:eastAsia="Arial" w:hAnsi="Arial"/>
+          <w:b w:val="0"/>
+          <w:i w:val="0"/>
+          <w:smallCaps w:val="0"/>
+          <w:strike w:val="0"/>
+          <w:color w:val="000000"/>
+          <w:sz w:val="22"/>
+          <w:szCs w:val="22"/>
+          <w:u w:val="none"/>
+          <w:shd w:fill="auto" w:val="clear"/>
+          <w:vertAlign w:val="baseline"/>
+        </w:rPr>
+      </w:pPr>
+      <w:r>
+        <w:rPr>
+          <w:rFonts w:ascii="Arial" w:cs="Arial" w:eastAsia="Arial" w:hAnsi="Arial"/>
+          <w:b w:val="0"/>
+          <w:i w:val="0"/>
+          <w:smallCaps w:val="0"/>
+          <w:strike w:val="0"/>
+          <w:color w:val="000000"/>
+          <w:sz w:val="22"/>
+          <w:szCs w:val="22"/>
+          <w:u w:val="none"/>
+          <w:shd w:fill="auto" w:val="clear"/>
+          <w:vertAlign w:val="baseline"/>
+          <w:rtl w:val="0"/>
+        </w:rPr>
+        <w:t xml:space="preserve">@alexandre.truc77@gmail.com @thomdelcey@gmail.com Ref pas sur Zotero</w:t>
+      </w:r>
+    </w:p>
+  </w:comment>
   <w:comment w:author="Aurélien Goutsmedt" w:id="1" w:date="2025-08-24T13:41:21Z">
     <w:p>
       <w:pPr>

</xml_diff>

<commit_message>
new update of paper
</commit_message>
<xml_diff>
--- a/paper/gdoc.docx
+++ b/paper/gdoc.docx
@@ -199,7 +199,7 @@
         <w:rPr>
           <w:rtl w:val="0"/>
         </w:rPr>
-        <w:t xml:space="preserve">.. Some of these databases, such as </w:t>
+        <w:t xml:space="preserve">. Some of these databases, such as </w:t>
       </w:r>
       <w:r>
         <w:rPr>
@@ -238,7 +238,7 @@
         <w:rPr>
           <w:rtl w:val="0"/>
         </w:rPr>
-        <w:t xml:space="preserve">Each database has its own strengths and weaknesses. While at a very general level Web of Science, OpenAlex, or Scopus have similar coverage [@martinGoogle2021; @culbertReference2025], some studies might suffer from choosing a less appropriate database regarding the research questions. For instance, Scopus has a lower coverage of the top 5 economics journals before the 1990s and while being openaccess, OpenAlex has been less curated than the products of private publishers. Whatever the provider, less successful or now-defunct journals are also more likely to have incomplete or discontinuous digital coverage, impeding their inclusion for historical analyses. Additionally, databases are oriented toward English-speaking contributions; these databases may thus be deficient for a research project targeting another or multiple languages.</w:t>
+        <w:t xml:space="preserve">Each database has its own strengths and weaknesses. While at a very general level Web of Science, OpenAlex, or Scopus have similar coverage [@martin-martinGoogleScholarMicrosoft2021; @culbertReference2025], some studies might suffer from choosing a less appropriate database regarding the research questions. For instance, Scopus has a lower coverage of the top 5 economics journals before the 1990s and while being openaccess, OpenAlex has been less curated than the products of private publishers. Whatever the provider, less successful or now-defunct journals are also more likely to have incomplete or discontinuous digital coverage, impeding their inclusion for historical analyses. Additionally, databases are oriented toward English-speaking contributions; these databases may thus be deficient for a research project targeting another or multiple languages.</w:t>
       </w:r>
       <w:r>
         <w:rPr>
@@ -257,35 +257,47 @@
       <w:pPr>
         <w:rPr/>
       </w:pPr>
-      <w:commentRangeStart w:id="0"/>
-      <w:r>
-        <w:rPr>
-          <w:rtl w:val="0"/>
-        </w:rPr>
-        <w:t xml:space="preserve">Even when citations and full texts are available, the amount and quality of information that can be reliably encoded remain limited. Citation data are notoriously difficult to structure because both the notion of what constitutes a reference and the conventions for recording it have changed over time. As a result, an article may extensively cite a document—such as a working paper or a report—that does not follow standard bibliographic formats and thus never appears in citation databases. Full texts face similar limitations: mathematical expressions and empirical material, such as tables, are often poorly captured or inconsistently encoded by providers. These shortcomings restrict what can be studied by  a quantitative analysis.</w:t>
-      </w:r>
-      <w:commentRangeEnd w:id="0"/>
-      <w:r>
-        <w:commentReference w:id="0"/>
-      </w:r>
-      <w:r>
-        <w:rPr>
-          <w:rtl w:val="0"/>
-        </w:rPr>
-        <w:t xml:space="preserve"> </w:t>
-      </w:r>
-    </w:p>
-    <w:p>
-      <w:pPr>
-        <w:rPr/>
-      </w:pPr>
+      <w:r>
+        <w:rPr>
+          <w:rtl w:val="0"/>
+        </w:rPr>
+        <w:t xml:space="preserve">Even when citations and full texts are available, the amount and quality of information that can be reliably encoded remain limited. </w:t>
+      </w:r>
+      <w:r>
+        <w:rPr>
+          <w:rtl w:val="0"/>
+        </w:rPr>
+        <w:t xml:space="preserve">Citation data are notoriously difficult to structure, because both the very notion of what constitutes a reference and the conventions governing its recording have changed over time—for instance, from references embedded in footnotes to the development of standardized bibliographies and the author–date system [@graftonFootnote1999]. </w:t>
+      </w:r>
+      <w:r>
+        <w:rPr>
+          <w:rtl w:val="0"/>
+        </w:rPr>
+        <w:t xml:space="preserve">Full texts face similar limitations: mathematical expressions and empirical material, such as tables, are often poorly captured or inconsistently encoded by providers. These shortcomings restrict what can be studied by  quantitative tools.</w:t>
+      </w:r>
+      <w:r>
+        <w:rPr>
+          <w:rtl w:val="0"/>
+        </w:rPr>
+      </w:r>
+    </w:p>
+    <w:p>
+      <w:pPr>
+        <w:rPr/>
+      </w:pPr>
+      <w:r>
+        <w:rPr>
+          <w:rtl w:val="0"/>
+        </w:rPr>
+        <w:t xml:space="preserve">A first important point is, therefore, that data availability shapes what can be asked and so answered.</w:t>
+      </w:r>
       <w:r>
         <w:rPr>
           <w:b w:val="1"/>
           <w:bCs w:val="1"/>
           <w:rtl w:val="0"/>
         </w:rPr>
-        <w:t xml:space="preserve">A first important point is, therefore, that data availability shapes what we are able to ask and so to answer. </w:t>
+        <w:t xml:space="preserve"> </w:t>
       </w:r>
       <w:r>
         <w:rPr>
@@ -315,19 +327,53 @@
         <w:rPr>
           <w:rtl w:val="0"/>
         </w:rPr>
-        <w:t xml:space="preserve">It is of course possible to build handmade datasets from scratch, but,  in the case of textual and citation data, such tasks remain time-consuming beyond small-scale study. </w:t>
-      </w:r>
-      <w:r>
-        <w:rPr>
-          <w:rtl w:val="0"/>
-        </w:rPr>
-        <w:t xml:space="preserve">More commonly, it is often necessary to combine information from existing databases to fulfill a particular goal. </w:t>
-      </w:r>
-      <w:r>
-        <w:rPr>
-          <w:rtl w:val="0"/>
-        </w:rPr>
-        <w:t xml:space="preserve">For example, even for a medium-scale study of the publications of the European Economic Review [@goutsmedtIndependent2023]—few thousands documents—required to combine three heterogenous databases: Econlit (for JEL codes classification) Web of Science and Scopus (for missing coverage of Web of Science).</w:t>
+        <w:t xml:space="preserve">It is of course possible to build handmade datasets from scratch, but, in the case of textual and citation data, such tasks remain time-consuming beyond small-scale study. </w:t>
+      </w:r>
+      <w:r>
+        <w:rPr>
+          <w:rtl w:val="0"/>
+        </w:rPr>
+        <w:t xml:space="preserve">More commonly, it is often necessary to combine information from different databases to fulfill a specific goal. </w:t>
+      </w:r>
+      <w:r>
+        <w:rPr>
+          <w:rtl w:val="0"/>
+        </w:rPr>
+        <w:t xml:space="preserve">For example, a medium-scale study of the publications of the European Economic Review [@goutsmedtIndependent2023]—few thousands documents—required to combine three heterogenous databases: Econlit (for JEL codes classification) Web of Science, and Scopus (due to imperfect coverage of Web of Science).</w:t>
+      </w:r>
+      <w:r>
+        <w:rPr>
+          <w:rtl w:val="0"/>
+        </w:rPr>
+      </w:r>
+    </w:p>
+    <w:p>
+      <w:pPr>
+        <w:rPr/>
+      </w:pPr>
+      <w:r>
+        <w:rPr>
+          <w:rtl w:val="0"/>
+        </w:rPr>
+        <w:t xml:space="preserve">For our study of rationality, the first step was to identify the best sources. </w:t>
+      </w:r>
+      <w:r>
+        <w:rPr>
+          <w:rtl w:val="0"/>
+        </w:rPr>
+        <w:t xml:space="preserve">For citation data, the Web of Science (WoS) provides the most reliable and consistent coverage for our period and has been widely used in the history of economics.</w:t>
+      </w:r>
+      <w:r>
+        <w:rPr>
+          <w:rtl w:val="0"/>
+        </w:rPr>
+        <w:t xml:space="preserve"> As for full text, we relied on three providers. First, JSTOR’s full-text collection offers high-quality scans of most leading economics journals. </w:t>
+      </w:r>
+      <w:r>
+        <w:rPr>
+          <w:rtl w:val="0"/>
+        </w:rPr>
+        <w:t xml:space="preserve">Second, we used Scopus to identify peer-reviewed economics journals not included in JSTOR and to compile a complementary list of articles; for these, we retrieved full texts first through the Elsevier Full-Text API, when available. Third, remaining full texts were obtained through the ISTEX project, which provides access to a substantial corpus of documents for researchers affiliated with French universities.</w:t>
       </w:r>
       <w:r>
         <w:rPr>
@@ -349,53 +395,13 @@
         <w:rPr>
           <w:rtl w:val="0"/>
         </w:rPr>
-        <w:t xml:space="preserve">For our study of rationality, the first step was to identify the best sources. </w:t>
-      </w:r>
-      <w:r>
-        <w:rPr>
-          <w:rtl w:val="0"/>
-        </w:rPr>
-        <w:t xml:space="preserve">For citation data, the Web of Science provides the most reliable and consistent coverage for our period and has been widely used in the history of economics.</w:t>
-      </w:r>
-      <w:r>
-        <w:rPr>
-          <w:rtl w:val="0"/>
-        </w:rPr>
-        <w:t xml:space="preserve"> As for full text, we relied on three providers. First, JSTOR’s full-text collection offers high-quality scans of most leading economics journals. </w:t>
-      </w:r>
-      <w:r>
-        <w:rPr>
-          <w:rtl w:val="0"/>
-        </w:rPr>
-        <w:t xml:space="preserve">Second, we used Scopus to identify peer-reviewed economics journals not included in JSTOR and collect a new list of articles. We retrieved full texts first through the Elsevier Full-Text API, when available. Finally, remaining full texts were obtained through the ISTEX project, which provides access to a substantial corpus of documents for researchers affiliated with French universities.</w:t>
-      </w:r>
-      <w:r>
-        <w:rPr>
-          <w:vertAlign w:val="superscript"/>
-        </w:rPr>
-        <w:footnoteReference w:customMarkFollows="0" w:id="4"/>
-      </w:r>
-      <w:r>
-        <w:rPr>
-          <w:rtl w:val="0"/>
-        </w:rPr>
-      </w:r>
-    </w:p>
-    <w:p>
-      <w:pPr>
-        <w:rPr/>
-      </w:pPr>
-      <w:r>
-        <w:rPr>
-          <w:rtl w:val="0"/>
-        </w:rPr>
         <w:t xml:space="preserve">The </w:t>
       </w:r>
       <w:r>
         <w:rPr>
           <w:rtl w:val="0"/>
         </w:rPr>
-        <w:t xml:space="preserve">@fig-distribution shows the distribution of this corpus. It can be already noted that our corpus disproportionately represents Anglo-Saxon journals, which are also those most systematically digitized and preserved.  Not only do we tend to overlook other traditions of research, but this also raises a serious issue of presentism: the fact that retrospective data on these journals are easily accessible today does not imply that they were equally central in earlier ones, nor that articles were the dominant vehicle for the diffusion of ideas. </w:t>
+        <w:t xml:space="preserve">@fig-distribution shows the distribution of this corpus. It can be already noted that our corpus disproportionately represents Anglo-Saxon journals, which are also those most systematically digitized and preserved. Not only do we tend to overlook other traditions of research, but this also raises a serious issue of presentism: the fact that retrospective data on these journals are easily accessible today does not imply that they were equally central in earlier ones, nor that articles were the dominant vehicle for the diffusion of ideas. </w:t>
       </w:r>
       <w:r>
         <w:rPr>
@@ -417,7 +423,7 @@
         <w:rPr>
           <w:rtl w:val="0"/>
         </w:rPr>
-        <w:t xml:space="preserve">Once access to full text is secured, another crucial step is to transform them into a usable database. While Web of Science citations are already delivered in a relatively structured form, full texts require substantial processing. In most cases, data are not given but result from a process that involves cleaning, categorizing, and selectively removing or reformatting information from </w:t>
+        <w:t xml:space="preserve">Once access to full text is secured, another crucial step is to transform them into a usable database. While WoS citations are already delivered in a relatively structured form, full texts require substantial processing. In most cases, data are not given but result from a process that involves cleaning, categorizing, and selectively removing or reformatting information from </w:t>
       </w:r>
       <w:r>
         <w:rPr>
@@ -429,13 +435,13 @@
         <w:rPr>
           <w:rtl w:val="0"/>
         </w:rPr>
-        <w:t xml:space="preserve"> in order to produce a dataset suitable for computational analysis. This challenge is particularly true in the history of economics, where the primary sources are the texts themselves—often unstructured and interspersed with various layers of metadata, such as section headings, footnotes, bibliographic references, or editorial annotations</w:t>
-      </w:r>
-      <w:r>
-        <w:rPr>
-          <w:rtl w:val="0"/>
-        </w:rPr>
-        <w:t xml:space="preserve">.  This requires making important choices well before the actual stage of analysis.</w:t>
+        <w:t xml:space="preserve"> in order to produce a dataset suitable for computational analysis. This challenge is particularly true in the history of economics, where the primary sources are the texts themselves—often unstructured and interspersed with various layers of textual content, such as section headings, footnotes, bibliographic references, or editorial annotations</w:t>
+      </w:r>
+      <w:r>
+        <w:rPr>
+          <w:rtl w:val="0"/>
+        </w:rPr>
+        <w:t xml:space="preserve">. This requires making important choices well before the actual stage of analysis.</w:t>
       </w:r>
     </w:p>
     <w:p>
@@ -456,24 +462,24 @@
         <w:rPr>
           <w:vertAlign w:val="superscript"/>
         </w:rPr>
+        <w:footnoteReference w:customMarkFollows="0" w:id="4"/>
+      </w:r>
+      <w:r>
+        <w:rPr>
+          <w:rtl w:val="0"/>
+        </w:rPr>
+        <w:t xml:space="preserve"> We also restrain our analysis to research articles and filter out book reviews, comments, editorial reports or obituaries.</w:t>
+      </w:r>
+      <w:r>
+        <w:rPr>
+          <w:vertAlign w:val="superscript"/>
+        </w:rPr>
         <w:footnoteReference w:customMarkFollows="0" w:id="5"/>
       </w:r>
       <w:r>
         <w:rPr>
           <w:rtl w:val="0"/>
         </w:rPr>
-        <w:t xml:space="preserve"> We also restrain our analysis to research articles and filter out book reviews, comments, editorial reports or obituaries.</w:t>
-      </w:r>
-      <w:r>
-        <w:rPr>
-          <w:vertAlign w:val="superscript"/>
-        </w:rPr>
-        <w:footnoteReference w:customMarkFollows="0" w:id="6"/>
-      </w:r>
-      <w:r>
-        <w:rPr>
-          <w:rtl w:val="0"/>
-        </w:rPr>
         <w:t xml:space="preserve"> While such materials can illuminate how rationality was debated, they are not primary sites for articulating new ideas within the discipline. Moreover, textual data are by nature voluminous, and filtering improves tractability for large-scale computation.</w:t>
       </w:r>
       <w:r>
@@ -486,7 +492,7 @@
         <w:rPr>
           <w:rtl w:val="0"/>
         </w:rPr>
-        <w:t xml:space="preserve">We also focus on natural-language text and remove other information that is poorly OCR-processed and often unusable, such as mathematical formulas and empirical tables. </w:t>
+        <w:t xml:space="preserve">We also focus on natural-language text and remove other information that is poorly OCR-processed and often unusable, such as mathematical formulas and data tables. </w:t>
       </w:r>
       <w:r>
         <w:rPr>
@@ -508,18 +514,18 @@
         <w:rPr>
           <w:rtl w:val="0"/>
         </w:rPr>
-        <w:t xml:space="preserve"> Manipulating, cleaning, and structuring raw sources is a fundamental and often generative stage of research. As @lemercierQuantitative2019[62] reminds us, collecting and categorizing sources is also “a moment to reflect on the sources and the purpose of the research.” Direct engagement with raw data can prompt the reevaluation of initial hypotheses and the emergence of new questions. In our case, preparing full‐text documents raises basic design choices about inputs and, by extension, what counts as a relevant economic text. Should we include book reviews, editorials, working papers, or conference proceedings? How should we define an “economics journal”—restrict it to core outlets or extend it to interdisciplinary venues where economics appears regularly? Even within a single article, boundaries are ambiguous: should abstracts, footnotes, appendices, or acknowledgments be analyzed or excluded? Each decision may carry historiographical implications. It shapes the corpus and, ultimately, the history of rationality our methods can reveal. There is rarely a single definitive and uncontestable choice, but rather a series of trade-offs that should be made explicit and required to engage with some of the material available. </w:t>
-      </w:r>
-    </w:p>
-    <w:p>
-      <w:pPr>
-        <w:rPr/>
-      </w:pPr>
-      <w:r>
-        <w:rPr>
-          <w:rtl w:val="0"/>
-        </w:rPr>
-        <w:t xml:space="preserve">To give a specific example, it is only after a first batch of exploratory analysis that we notice that some important economics journals were missing in JSTOR. If it was obvious from preliminary results that the emergence of behavioral economics impacted how economists discussed rationality, from our own expertise on the matter, we observed that some journals like the</w:t>
+        <w:t xml:space="preserve"> Manipulating, cleaning, and structuring raw sources is a fundamental and often generative stage of research. As @lemercierQuantitative2019[62] reminds us, collecting and categorizing sources is also “a moment to reflect on the sources and the purpose of the research.” Direct engagement with raw data can prompt the reevaluation of initial hypotheses and the emergence of new questions. In our case, preparing full‐text documents raises choices about what counts as a relevant economic text. Should we include book reviews, working papers, or conference proceedings? How should we define an “economics journal”—restrict it to core outlets or extend it to interdisciplinary venues where economics appears regularly? Even within a single article, boundaries are ambiguous: should abstracts, footnotes, or appendices be analyzed or excluded? Each decision may carry historiographical implications. It shapes the corpus and, ultimately, the history of rationality our methods can reveal. There are rarely definitive and uncontestable choices, but rather a series of trade-offs that should be made explicit and required to engage with some of the material available. </w:t>
+      </w:r>
+    </w:p>
+    <w:p>
+      <w:pPr>
+        <w:rPr/>
+      </w:pPr>
+      <w:r>
+        <w:rPr>
+          <w:rtl w:val="0"/>
+        </w:rPr>
+        <w:t xml:space="preserve">To give an illustration, it is only after a first batch of exploratory analysis that we notice that some important economics journals were missing in JSTOR. If it was obvious from preliminary results that the emergence of behavioral economics impacted how economists discussed rationality, from our own expertise on the matter, we observed that some journals like the</w:t>
       </w:r>
       <w:r>
         <w:rPr>
@@ -622,13 +628,13 @@
         <w:rPr>
           <w:rtl w:val="0"/>
         </w:rPr>
-        <w:t xml:space="preserve"> may refer either to James Tobin’s [-@tobinInflation1972] AEA presidential lecture or to Milton Friedman’s [-@friedman1977] Nobel lecture. Consequently, we had to supplement title information with additional metadata, including the journal name—which required standardizing journal titles across databases—as well as the publication year, volume, issue, and page range. Differences in journal coverage and in data storage practices (particularly title formatting) mean that it is generally impossible to achieve a complete match between databases. In our case, approximately one-quarter of the full-text documents could not be matched to WoS records, which prevents us, when relevant, from analyzing their citation data.</w:t>
+        <w:t xml:space="preserve"> may refer either to James Tobin’s [-@tobinInflation1972] AEA presidential lecture or to Milton Friedman’s [-@friedman1977] Nobel lecture. Consequently, we had to supplement title information with additional metadata, including the journal name—which required standardizing journal titles across databases—as well as the publication year, volume, issue, and page range. Differences in journal coverage and in data storage practices (particularly title formatting) mean that it is generally impossible to achieve a complete match between databases. In our case, approximately one-quarter of the full-text documents after 1945 could not be matched to WoS records, which prevents us from analyzing their citation data.</w:t>
       </w:r>
       <w:r>
         <w:rPr>
           <w:vertAlign w:val="superscript"/>
         </w:rPr>
-        <w:footnoteReference w:customMarkFollows="0" w:id="7"/>
+        <w:footnoteReference w:customMarkFollows="0" w:id="6"/>
       </w:r>
       <w:r>
         <w:rPr>
@@ -700,7 +706,7 @@
         <w:rPr>
           <w:rtl w:val="0"/>
         </w:rPr>
-        <w:t xml:space="preserve">The first challenge was thus to define the extent of our corpus a priori, i.e. to delineate economics as an object of study. Some research objects are relatively easier to delineate, and the transition from a database to a well-defined corpus is therefore straightforward. For example, writing the history of a particular journal [@edwardsFifty2020; @DelceyFama2025] or of one or several individuals [@trucDisciplinary2025] entails comparatively definitional or boundary challenges. In contrast, most objects studied by historians lack clear definitions or boundaries. While some large-scale studies focus on the discipline as a whole [@claveauMacrodynamics2016; @trucInterdisciplinarityEconomics2023; @ambrosinoWhat2018], such work still requires an operational definition of what are documents in “economics.” This definitional issue becomes even more pronounced when the object of study is a specific “field” (Cherrier, this issue) </w:t>
+        <w:t xml:space="preserve">The first challenge was thus to define the extent of our corpus a priori, i.e. to delineate economics as an object of study. Some research objects are relatively easier to delineate, and the transition from a database to a well-defined corpus is therefore straightforward. For example, writing the history of a particular journal [@edwardsFifty2020; @charlesRevue2025] or of one or several individuals [@trucDisciplinary2025; @delceyDissemination2025] entails comparatively definitional or boundary challenges. While some large-scale studies focus on the discipline as a whole [@claveauMacrodynamics2016; @trucInterdisciplinarityEconomics2023; @ambrosinoWhat2018], such work still requires an operational definition of what are documents in “economics.” This definitional issue becomes even more pronounced when the object of study is a specific “field” (Cherrier, this issue) </w:t>
       </w:r>
       <w:r>
         <w:rPr>
@@ -723,176 +729,597 @@
         <w:rPr>
           <w:rtl w:val="0"/>
         </w:rPr>
-        <w:t xml:space="preserve">Quantitative contributions force the researcher to settle on a narrow but operational definition of the object under study.</w:t>
-      </w:r>
-      <w:r>
+        <w:t xml:space="preserve">Non-quantitative </w:t>
+      </w:r>
+      <w:r>
+        <w:rPr>
+          <w:rtl w:val="0"/>
+        </w:rPr>
+        <w:t xml:space="preserve">historical methods tend to address large objects by focusing on their “core” rather than their boundaries:</w:t>
+      </w:r>
+      <w:r>
+        <w:rPr>
+          <w:rtl w:val="0"/>
+        </w:rPr>
+        <w:t xml:space="preserve"> historians of economics typically reconstruct the history of materials that are unambiguously part of the object under study, thus making a narrow definition often unnecessary</w:t>
+      </w:r>
+      <w:r>
+        <w:rPr>
+          <w:rtl w:val="0"/>
+        </w:rPr>
+        <w:t xml:space="preserve">. Quantitative approaches, however, require a well-defined corpus and consequently oblige researchers to impose simple, clear-cut boundaries on complex and ambivalent categories such as “economics”. Defining the relevant historical materials therefore requires the adoption of specific conventions to approximate the object under study [@desrosieresPolitics2011]. Defining a corpus constitutes a quantification convention—one that must always be assessed instrumentally, not as an absolute definition but as an operational hypothesis serving a specific research question. </w:t>
+      </w:r>
+    </w:p>
+    <w:p>
+      <w:pPr>
+        <w:ind w:right="0"/>
+        <w:rPr/>
+      </w:pPr>
+      <w:r>
+        <w:rPr>
+          <w:rtl w:val="0"/>
+        </w:rPr>
+        <w:t xml:space="preserve">Many proxies have been used in the history and philosophy of economics to define disciplines and sub-disciplines. For instance, [@goutsmedtIndependent2023] used the JEL codes to select macroeconomic documents in a corpus of well-established economics journals, while [@trucForty2022] and </w:t>
+      </w:r>
+      <w:r>
+        <w:rPr>
+          <w:rtl w:val="0"/>
+        </w:rPr>
+        <w:t xml:space="preserve">[@jullienHistory2024] </w:t>
+      </w:r>
+      <w:r>
+        <w:rPr>
+          <w:rtl w:val="0"/>
+        </w:rPr>
+        <w:t xml:space="preserve">relied respectively on citations data and </w:t>
+      </w:r>
+      <w:r>
+        <w:rPr>
+          <w:rtl w:val="0"/>
+        </w:rPr>
+        <w:t xml:space="preserve">institutional affiliations </w:t>
+      </w:r>
+      <w:r>
+        <w:rPr>
+          <w:rtl w:val="0"/>
+        </w:rPr>
+        <w:t xml:space="preserve">to identify the boundaries of behavioral economics. To choose a particular proxy, it is important to understand how it relates to the object under study. Both JEL codes and journal classifications—like JSTOR or Scopus classifications—can structure a corpus in ways that reflect their own histories, and researchers must therefore consider how these proxies shape the boundaries of their material. For example, while the JEL codes for neuroeconomics emerged around the same time as the first publications in the field, the JEL codes for behavioral economics appeared more than two decades after the earliest contributions [@trucNeuroeconomics2023]. A thorough knowledge of the history of the object studied is thus crucial for evaluating the adequacy and representativeness of the resulting corpus.</w:t>
+      </w:r>
+    </w:p>
+    <w:p>
+      <w:pPr>
+        <w:ind w:right="0"/>
+        <w:rPr/>
+      </w:pPr>
+      <w:r>
+        <w:rPr>
+          <w:rtl w:val="0"/>
+        </w:rPr>
+        <w:t xml:space="preserve">In our case, we first define economic documents by building the corpus from peer-review journals. This convention has both advantages and limitations. </w:t>
+      </w:r>
+      <w:r>
+        <w:rPr>
+          <w:rtl w:val="0"/>
+        </w:rPr>
+        <w:t xml:space="preserve">On the one hand, this approach is unambiguous, as it relies on agreeing upon a predefined list of journals, rather than, for instance, determining at the document level which individual articles qualify as economics. Moreover, journals constitute one of the main legitimate institutional markers of a discipline, alongside training programs and professional associations. On the other hand, focusing on journals means excluding other publication outlets, such as books or working pa</w:t>
+      </w:r>
+      <w:r>
+        <w:rPr>
+          <w:rtl w:val="0"/>
+        </w:rPr>
+        <w:t xml:space="preserve">pers.</w:t>
+      </w:r>
+      <w:r>
+        <w:rPr>
+          <w:vertAlign w:val="superscript"/>
+        </w:rPr>
+        <w:footnoteReference w:customMarkFollows="0" w:id="7"/>
+      </w:r>
+      <w:r>
+        <w:rPr>
+          <w:rtl w:val="0"/>
+        </w:rPr>
+        <w:t xml:space="preserve"> In addition, it struggles to capture interdisciplinarity, whether in the form of interdisciplinary journals or of economists publishing in other disciplinary journals. Finally, this strategy requires the use of arbitrary criteria to decide which journals to include and which to exclude—particularly for journals at the margins of “economics”, either because of their interdisciplinary orientation or because of uncertainty regarding their peer-review standards or academic practices. </w:t>
+      </w:r>
+      <w:r>
+        <w:rPr>
+          <w:rtl w:val="0"/>
+        </w:rPr>
+        <w:t xml:space="preserve">We eventually settled on a carefully curated list of 329 journals identified as economics journals in JSTOR and Scopus, but excluding journals that are not entirely academic, insufficiently focused on economics, or only founded within the last twenty years.</w:t>
+      </w:r>
+      <w:r>
+        <w:rPr>
+          <w:vertAlign w:val="superscript"/>
+        </w:rPr>
+        <w:footnoteReference w:customMarkFollows="0" w:id="8"/>
+      </w:r>
+      <w:r>
+        <w:rPr>
+          <w:rtl w:val="0"/>
+        </w:rPr>
+        <w:t xml:space="preserve"> We were able to retrieve 289538 articles published in these journals from 1900 to 2009. </w:t>
+      </w:r>
+      <w:r>
+        <w:rPr>
+          <w:rtl w:val="0"/>
+        </w:rPr>
+      </w:r>
+    </w:p>
+    <w:p>
+      <w:pPr>
+        <w:ind w:right="0"/>
+        <w:rPr/>
+      </w:pPr>
+      <w:r>
+        <w:rPr>
+          <w:rtl w:val="0"/>
+        </w:rPr>
+        <w:t xml:space="preserve">The</w:t>
+      </w:r>
+      <w:r>
+        <w:rPr>
+          <w:rtl w:val="0"/>
+        </w:rPr>
+        <w:t xml:space="preserve"> second challenge was to restrain our corpus to documents engaging with the issue of rationality. One of the most straightforward proxies are keywords [@trucNeuroeconomics2023]. Based on a predefined list of target terms (often called a “dictionary”), this approach restricts a corpus to documents that mention these terms with at least a given frequency. In addition to its relative simplicity, it works well for specific and unambiguous terms, like “stagflation” [@goutsmedtStagflation2021] or “Agent-Based Models” [@bacciniDoes2025]. But this approach may display several limitations when it is not the case. Indeed, it focuses on spotting occurrences of a term rather than a general idea. Just think about the various ways rationality could be discussed in the history of economics: beyond the term “rationality”, economists employ various expressions that refer to close ideas such as maximising profits or expected utility, the </w:t>
+      </w:r>
+      <w:r>
+        <w:rPr>
+          <w:i w:val="1"/>
+          <w:iCs w:val="1"/>
+          <w:rtl w:val="0"/>
+        </w:rPr>
+        <w:t xml:space="preserve">homo oeconomicus</w:t>
+      </w:r>
+      <w:r>
+        <w:rPr>
+          <w:rtl w:val="0"/>
+        </w:rPr>
+        <w:t xml:space="preserve">, or the transitivity and completeness of preferences. </w:t>
+      </w:r>
+    </w:p>
+    <w:p>
+      <w:pPr>
+        <w:ind w:right="0"/>
+        <w:rPr/>
+      </w:pPr>
+      <w:r>
+        <w:rPr>
+          <w:rtl w:val="0"/>
+        </w:rPr>
+        <w:t xml:space="preserve">Going beyond simply searching for occurrences of “rationality” and “rational,” we could have constructed an extensive dictionary of terms associated with the concept of rationality. This task requires substantial knowledge of the history of economics and of debates surrounding rationality, and thus presupposes that researchers possess adequate historical and conceptual background. Despite this, it remains difficult to prevent the dictionary-building process from introducing biases—for instance, by omitting concepts that are historically relevant but salient only during specific periods (such as “hedonism”), or by creating a disproportionate dictionary, with many terms related, for instance, to decision theory but few pertaining to macroeconomics or public economics. Consequently, this approach also constrains the potential for discovery: by setting the boundaries of the dictionary in advance, researchers may unintentionally exclude terms or themes of which they were unaware, and thus remain unaware of them throughout the analysis.</w:t>
+      </w:r>
+    </w:p>
+    <w:p>
+      <w:pPr>
+        <w:ind w:right="0"/>
+        <w:rPr/>
+      </w:pPr>
+      <w:r>
+        <w:rPr>
+          <w:rtl w:val="0"/>
+        </w:rPr>
+        <w:t xml:space="preserve">To overcome this issue, we use a Large Language Model (LLM) to identify documents—and in particular specific sentences within documents—that deal with rationality in our corpus of economic articles.</w:t>
+      </w:r>
+      <w:r>
+        <w:rPr>
+          <w:vertAlign w:val="superscript"/>
+        </w:rPr>
+        <w:footnoteReference w:customMarkFollows="0" w:id="9"/>
+      </w:r>
+      <w:r>
+        <w:rPr>
+          <w:rtl w:val="0"/>
+        </w:rPr>
+        <w:t xml:space="preserve"> LLMs are trained on extremely large collections of text to learn patterns in language. In simple terms, they learn to predict missing words in a sentence or to determine whether two sentences follow each other. Through this training, the model develops billions of internal parameters that capture regularities in vocabulary, grammar, and meaning.</w:t>
+      </w:r>
+      <w:r>
+        <w:rPr>
+          <w:rtl w:val="0"/>
+        </w:rPr>
+        <w:t xml:space="preserve"> </w:t>
+      </w:r>
+      <w:r>
+        <w:rPr>
+          <w:rtl w:val="0"/>
+        </w:rPr>
+        <w:t xml:space="preserve">When we input text into such a model, it translates sentences into vectors that summarize their context and meaning. This enables us to compare sentences not by the exact words they use but by their underlying ideas. For example, the same term—such as “model”—may carry different meanings depending on the surrounding context (</w:t>
+      </w:r>
+      <w:r>
+        <w:rPr>
+          <w:i w:val="1"/>
+          <w:iCs w:val="1"/>
+          <w:rtl w:val="0"/>
+        </w:rPr>
+        <w:t xml:space="preserve">fashion model </w:t>
+      </w:r>
+      <w:r>
+        <w:rPr>
+          <w:rtl w:val="0"/>
+        </w:rPr>
+        <w:t xml:space="preserve">vs </w:t>
+      </w:r>
+      <w:r>
+        <w:rPr>
+          <w:i w:val="1"/>
+          <w:iCs w:val="1"/>
+          <w:rtl w:val="0"/>
+        </w:rPr>
+        <w:t xml:space="preserve">scientific model)</w:t>
+      </w:r>
+      <w:r>
+        <w:rPr>
+          <w:rtl w:val="0"/>
+        </w:rPr>
+        <w:t xml:space="preserve"> and a LLM </w:t>
+      </w:r>
+      <w:r>
+        <w:rPr>
+          <w:rtl w:val="0"/>
+        </w:rPr>
+        <w:t xml:space="preserve">can detect these variations. By converting words and sentences into vectors that reflect their semantic usage, LLMs make it possible to treat ideas and conceptual shifts as measurable objects, thereby opening new possibilities for the quantitative study of economic thought.</w:t>
+      </w:r>
+    </w:p>
+    <w:p>
+      <w:pPr>
+        <w:ind w:right="0"/>
+        <w:rPr/>
+      </w:pPr>
+      <w:r>
+        <w:rPr>
+          <w:rtl w:val="0"/>
+        </w:rPr>
+        <w:t xml:space="preserve">We rely on Sentence-BERT [@reimersSentenceBERT2019], an LLM designed specifically to produce sentence embeddings, that is, numerical vectors that represent the meaning of a sentence. The model assigns one vector to each sentence, which allows for straightforward semantic comparison: sentences that express similar ideas end up with vectors that are mathematically close to each other. Using Sentence-BERT, we vectorized more than 61 million sentences published between 1900 and 2009 from our database. Starting from sentences including “rationality” and “rational”, we then searched for the sentences most similar to these anchor sentences. Thus, if sentence A explicitly uses the word “rationality,” and its vector is close to that of sentence B—which never mentions the term—sentence B likely discusses a related idea.</w:t>
+      </w:r>
+    </w:p>
+    <w:p>
+      <w:pPr>
+        <w:rPr/>
+      </w:pPr>
+      <w:r>
+        <w:rPr>
+          <w:rtl w:val="0"/>
+        </w:rPr>
+        <w:t xml:space="preserve">Our approach does not simply consist of finding sentences that are close to the words “rationality” and “rational” over a 110-year period, though. Because our project is historical, it is crucial to consider how LLMs themselves handle historical language. LLMs are trained on billions of texts, but the overwhelming majority of these texts are recent.</w:t>
+      </w:r>
+      <w:r>
+        <w:rPr>
+          <w:vertAlign w:val="superscript"/>
+        </w:rPr>
+        <w:footnoteReference w:customMarkFollows="0" w:id="10"/>
+      </w:r>
+      <w:r>
+        <w:rPr>
+          <w:rtl w:val="0"/>
+        </w:rPr>
+        <w:t xml:space="preserve"> As a result, they tend to offer a “presentist,” numerical view of language. For example, current models struggle to reproduce writing styles from earlier periods and cannot reliably infer the publication date of a text [@underwoodCan2025]. Sentence-BERT is subject to the same limitations, and the sentence embeddings it produces inevitably reflect this bias. Besides, as illustrated by @</w:t>
+      </w:r>
+      <w:r>
+        <w:rPr>
+          <w:rtl w:val="0"/>
+        </w:rPr>
+        <w:t xml:space="preserve">fig-distribution</w:t>
+      </w:r>
+      <w:r>
+        <w:rPr>
+          <w:rtl w:val="0"/>
+        </w:rPr>
+        <w:t xml:space="preserve">, our corpus is exponential according to years and most sentences come from recent articles. Taken together, these effects make it very likely that the sentences the model identifies as closest to “rationality” will predominantly come from recent articles. To limit this presentist effect, we adapted the way we compare sentences over time. Instead of comparing a sentence from, say, 1910 directly to a “representative vector” of </w:t>
+      </w:r>
+      <w:r>
+        <w:rPr>
+          <w:rtl w:val="0"/>
+        </w:rPr>
+        <w:t xml:space="preserve">all</w:t>
+      </w:r>
+      <w:r>
+        <w:rPr>
+          <w:rtl w:val="0"/>
+        </w:rPr>
+        <w:t xml:space="preserve"> sentences in our corpus that contain the words “rationality” or “rational,” we constructed a series of representative vectors. For each year, we build a moving average vector, with a five-year symmetric window, of all the sentences mentioning “rationality” or “rational”. Concretely, for the year 1910, we averaged the vectors of all sentences containing “rationality” or “rational” from 1905 to 1915. This produces a period-specific reference point that reflects how these terms were used </w:t>
+      </w:r>
+      <w:r>
+        <w:rPr>
+          <w:rtl w:val="0"/>
+        </w:rPr>
+        <w:t xml:space="preserve">at that particular moment in time</w:t>
+      </w:r>
+      <w:r>
+        <w:rPr>
+          <w:rtl w:val="0"/>
+        </w:rPr>
+        <w:t xml:space="preserve">. A sentence from 1910 is therefore judged similar not to the general, and likely modern-day meaning of rationality, but to the way the concept was expressed during its own historical period. This helps ensure that our analysis is sensitive to historical changes in language. </w:t>
+      </w:r>
+      <w:r>
+        <w:rPr>
+          <w:rtl w:val="0"/>
+        </w:rPr>
+        <w:t xml:space="preserve">Since each document is a set of sentences, we also identify the documents—and the authors—that discuss rationality most intensively or frequently. @tbl-illustrative_sentences and @tbl-illustrative_documents illustrate respectively the closest sentence and documents from our representative vectors in 1910. </w:t>
+      </w:r>
+      <w:r>
+        <w:rPr>
+          <w:rtl w:val="0"/>
+        </w:rPr>
+      </w:r>
+    </w:p>
+    <w:p>
+      <w:pPr>
+        <w:pStyle w:val="Heading1"/>
         <w:rPr>
           <w:b w:val="1"/>
           <w:bCs w:val="1"/>
-          <w:rtl w:val="0"/>
-        </w:rPr>
-        <w:t xml:space="preserve"> </w:t>
-      </w:r>
-      <w:r>
-        <w:rPr>
-          <w:rtl w:val="0"/>
-        </w:rPr>
-        <w:t xml:space="preserve">Non-quantitative </w:t>
-      </w:r>
-      <w:r>
-        <w:rPr>
-          <w:rtl w:val="0"/>
-        </w:rPr>
-        <w:t xml:space="preserve">historical methods, by contrast, tend to address large objects by focusing on their “core” rather than their boundaries:</w:t>
-      </w:r>
-      <w:r>
-        <w:rPr>
-          <w:rtl w:val="0"/>
-        </w:rPr>
-        <w:t xml:space="preserve"> historians of economics typically reconstruct the history of materials that are unambiguously part of the object under study, thus making a narrow definition often unnecessary</w:t>
-      </w:r>
-      <w:r>
-        <w:rPr>
-          <w:rtl w:val="0"/>
-        </w:rPr>
-        <w:t xml:space="preserve">. Quantitative approaches, however, require a well-defined corpus and consequently oblige researchers to impose simple, clear-cut boundaries on complex and ambivalent categories such as “economics”. Defining the relevant historical materials therefore requires the adoption of specific conventions to approximate the object under study [@desrosieresPolitics2011]. Therefore, defining a corpus constitutes a quantification convention—one that must always be assessed instrumentally, not as an absolute definition but as an operational hypothesis serving a specific research question. </w:t>
-      </w:r>
-    </w:p>
-    <w:p>
-      <w:pPr>
-        <w:ind w:right="0"/>
-        <w:rPr/>
-      </w:pPr>
-      <w:r>
-        <w:rPr>
-          <w:rtl w:val="0"/>
-        </w:rPr>
-        <w:t xml:space="preserve">Many proxies have been used in the history and philosophy of economics to define disciplines and sub-disciplines. For instance, [@goutsmedtIndependent2023] used the JEL codes to select macroeconomic documents in a corpus of well-established economics journals, while [@trucForty2022] and </w:t>
-      </w:r>
-      <w:r>
-        <w:rPr>
-          <w:rtl w:val="0"/>
-        </w:rPr>
-        <w:t xml:space="preserve">[@jullienHistory2024] </w:t>
-      </w:r>
-      <w:r>
-        <w:rPr>
-          <w:rtl w:val="0"/>
-        </w:rPr>
-        <w:t xml:space="preserve">relied respectively on citations data and </w:t>
-      </w:r>
-      <w:r>
-        <w:rPr>
-          <w:rtl w:val="0"/>
-        </w:rPr>
-        <w:t xml:space="preserve">institutional affiliations </w:t>
-      </w:r>
-      <w:r>
-        <w:rPr>
-          <w:rtl w:val="0"/>
-        </w:rPr>
-        <w:t xml:space="preserve">to identify the boundaries of behavioral economics.</w:t>
+        </w:rPr>
+      </w:pPr>
+      <w:bookmarkStart w:colFirst="0" w:colLast="0" w:name="_2jyqfu2efpff" w:id="4"/>
+      <w:bookmarkEnd w:id="4"/>
+      <w:r>
+        <w:rPr>
+          <w:b w:val="1"/>
+          <w:bCs w:val="1"/>
+          <w:rtl w:val="0"/>
+        </w:rPr>
+        <w:t xml:space="preserve">Exploring the corpus </w:t>
+      </w:r>
+    </w:p>
+    <w:p>
+      <w:pPr>
+        <w:pStyle w:val="Heading1"/>
+        <w:ind w:firstLine="720"/>
+        <w:rPr>
+          <w:sz w:val="32"/>
+          <w:szCs w:val="32"/>
+        </w:rPr>
+      </w:pPr>
+      <w:bookmarkStart w:colFirst="0" w:colLast="0" w:name="_57osrl8kii9f" w:id="5"/>
+      <w:bookmarkEnd w:id="5"/>
+      <w:r>
+        <w:rPr>
+          <w:sz w:val="32"/>
+          <w:szCs w:val="32"/>
+          <w:rtl w:val="0"/>
+        </w:rPr>
+        <w:t xml:space="preserve">Simple </w:t>
+      </w:r>
+      <w:r>
+        <w:rPr>
+          <w:sz w:val="32"/>
+          <w:szCs w:val="32"/>
+          <w:rtl w:val="0"/>
+        </w:rPr>
+        <w:t xml:space="preserve">exploration</w:t>
+      </w:r>
+    </w:p>
+    <w:p>
+      <w:pPr>
+        <w:rPr/>
+      </w:pPr>
+      <w:r>
+        <w:rPr>
+          <w:rtl w:val="0"/>
+        </w:rPr>
+        <w:t xml:space="preserve">Before returning to our specific corpus on rationality and diving into more advanced LLM-based analyses, we first step back and examine simpler quantitative methods applied to our broader set of economics articles. Indeed, quantitative approaches come in many forms and levels of complexity. In fact, quantification does not need to be sophisticated to be useful. </w:t>
+      </w:r>
+      <w:r>
+        <w:rPr>
+          <w:rtl w:val="0"/>
+        </w:rPr>
+        <w:t xml:space="preserve">Simple indicators may not always provide the clearest  answers to research questions, but they can play an important exploratory role: helping researchers refine their questions, identify anomalies, or detect unexpected patterns.</w:t>
+      </w:r>
+    </w:p>
+    <w:p>
+      <w:pPr>
+        <w:rPr/>
+      </w:pPr>
+      <w:r>
+        <w:rPr>
+          <w:rtl w:val="0"/>
+        </w:rPr>
+        <w:t xml:space="preserve">For</w:t>
+      </w:r>
+      <w:r>
+        <w:rPr>
+          <w:rtl w:val="0"/>
+        </w:rPr>
+        <w:t xml:space="preserve"> textual data, one of the most straightforward indicators is term frequency, that is counting how often particular words or expressions appear. </w:t>
+      </w:r>
+      <w:r>
+        <w:rPr>
+          <w:rtl w:val="0"/>
+        </w:rPr>
+        <w:t xml:space="preserve">This metric has been used repeatedly in the literature, especially to track the emergence or decline of fields within economics. In well-delimited domains, term frequency can serve as a reliable proxy for intellectual dynamics. For instance, @trucNeuroeconomics2023 shows that counting occurrences of highly specific neuroeconomics terms—such as “striatum” or “prefrontal”—closely approximates more advanced quantitative measures, and thus provides a simple but meaningful signal of activity in the field.</w:t>
+      </w:r>
+    </w:p>
+    <w:p>
+      <w:pPr>
+        <w:rPr/>
+      </w:pPr>
+      <w:r>
+        <w:rPr>
+          <w:rtl w:val="0"/>
+        </w:rPr>
+        <w:t xml:space="preserve">@fig-relative-frequency shows the relative frequency (with respect to the total number of words published each year) of “rational” and “rationality” in our corpus. The figure reveals a steady postwar increase of the use of both terms, likely reflecting the progressive consolidation of rational choice theory in economics. We observe a marked surge after the 1970s, with a pronounced peak for “rational” in the 1980s, and a smaller peak for “rationality” in the 1990s. The rise of “rational expectations” in macroeconomics and the emergence of behavioral economics following the publication of @kahnemanProspect1979 likely contributed to this pattern. </w:t>
+      </w:r>
+      <w:r>
+        <w:rPr>
+          <w:rtl w:val="0"/>
+        </w:rPr>
+        <w:t xml:space="preserve">Of course, we cannot easily infer the precise drivers of these trends from such simple metrics. However, the clear upward movement signals an important moment in the evolution of rationality within economics—at least in terms of textual intensity—thereby motivating more targeted forms of investigation.</w:t>
+      </w:r>
+      <w:r>
+        <w:rPr>
+          <w:rtl w:val="0"/>
+        </w:rPr>
+      </w:r>
+    </w:p>
+    <w:p>
+      <w:pPr>
+        <w:rPr/>
+      </w:pPr>
+      <w:r>
+        <w:rPr>
+          <w:rtl w:val="0"/>
+        </w:rPr>
+        <w:t xml:space="preserve">While our usage of a large language model will shed light on the context surrounding this rise, such context can also be approximated with simpler, more straightforward measures. Co-occurrence analysis helps recover the different intellectual settings in which rationality is invoked. @fig-co-occurence reports, by decade, the five words most frequently adjacent to “rational” or “rationality,” showing how these associations shift over time. Before the 1930s, the picture was heterogeneous. The notion was tied to the marginalist idea of “calculation,” but it referred not only to individual behavior but also to “systems” or “organizations.” The discussion was explicitly methodological, as indicated by the prominence of terms such as “method,” “explanation,” “law,” and “foundation.” From the 1940s onward, the rise of choice theory places rationality at the center of economic modeling as a device for describing and formalizing behavior. This is mostly visible with the rise of multiple common bi-grams (i.e., combination of two words) that remain stable from the 1930s through the 1980s such as “economic rationality”, “rational choice”, “rational behavior”. By the 1970s—and especially the 1980s—the framework was both extended and contested. First, the most common bi-gram by far becomes “rational expectations” signalling the emergence of a new predominant concept extending rationality. In the 1980s, “rational expectations” appeared 15 more times than the other most common bi-grams. Second, while the concept “bounded rationality” was developed by Herbert Simon initially in the 1950s, the concept only became prevalent during the 1990s with the bi-gram becoming the fourth most common one. </w:t>
+      </w:r>
+    </w:p>
+    <w:p>
+      <w:pPr>
+        <w:rPr/>
+      </w:pPr>
+      <w:r>
+        <w:rPr>
+          <w:rtl w:val="0"/>
+        </w:rPr>
+        <w:t xml:space="preserve">Beyond textual data, citation data also constitute a </w:t>
+      </w:r>
+      <w:r>
+        <w:rPr>
+          <w:rtl w:val="0"/>
+        </w:rPr>
+        <w:t xml:space="preserve">useful</w:t>
+      </w:r>
+      <w:r>
+        <w:rPr>
+          <w:rtl w:val="0"/>
+        </w:rPr>
+        <w:t xml:space="preserve"> source of information for corpus exploration. The evolution of an idea depends not only on how it is formulated by its authors, but also on how it is appropriated, and reinterpreted by readers. A substantial literature in citation theory examines how citations function as a scientific practice and how they should be interpreted. As emphasized in this literature [see, e.g., @TahamtanCore1979], citations may reflect a wide range of motivations—from a genuine desire to acknowledge intellectual debt to more strategic uses aimed at persuading readers or satisfying referees. Nevertheless, citations at the very least signal a relationship that can help trace the lineage and diffusion of ideas, even when the reasons behind the citation are not purely intellectual.</w:t>
+      </w:r>
+    </w:p>
+    <w:p>
+      <w:pPr>
+        <w:rPr/>
+      </w:pPr>
+      <w:r>
+        <w:rPr>
+          <w:rtl w:val="0"/>
+        </w:rPr>
+        <w:t xml:space="preserve">Counting the citations of specific documents offers a first, simple approach to assessing the impact of an author or a particular publication. There are clear reasons to incorporate citation studies into historical research. Beyond tracing diffusion, highly cited papers tend to be more visible and attract greater engagement—</w:t>
+      </w:r>
+      <w:r>
+        <w:rPr>
+          <w:rtl w:val="0"/>
+        </w:rPr>
+        <w:t xml:space="preserve">a dynamic that reflects the well-known Matthew effect [@mertonMatthew1968].</w:t>
+      </w:r>
+      <w:r>
+        <w:rPr>
+          <w:rtl w:val="0"/>
+        </w:rPr>
+        <w:t xml:space="preserve"> Recent work also shows that citations influence reading behavior and perceptions of quality: highly cited papers are more likely to be read thoroughly and treated as significant intellectual contributions [@teplitskiyHow2022].</w:t>
+      </w:r>
+      <w:r>
+        <w:rPr>
+          <w:rtl w:val="0"/>
+        </w:rPr>
+      </w:r>
+    </w:p>
+    <w:p>
+      <w:pPr>
+        <w:rPr/>
+      </w:pPr>
+      <w:r>
+        <w:rPr>
+          <w:rtl w:val="0"/>
+        </w:rPr>
+        <w:t xml:space="preserve">Historians routinely discuss scientific influence and recognition using proxies such as major grants, prizes, and honors. For example, Sent’s [-@sent_behavioral_2004] narrative of the transition from the dominance of rational choice, through the limited success of “old” behavioral economics (e.g., Simon, George Katona), to the emergence of “new” behavioral economics is organized around such milestones. In this sense, citations serve as a complementary proxy alongside these traditional indicators. For instance, although both Simon and Kahneman received the Nobel Prize, Kahneman ultimately exerted a broader influence on the discipline—something that is reflected in citation patterns. In a large qualitative–quantitative study of the Nobel Prize, @offerNobel2016 distinguished several trajectories among laureates: those who peak at the prize and subsequently decline, “innovators with staying power,” “still rising” winners honored before their citation peak, and late winners recognized long after their peak.</w:t>
+      </w:r>
+    </w:p>
+    <w:p>
+      <w:pPr>
+        <w:rPr/>
+      </w:pPr>
+      <w:r>
+        <w:rPr>
+          <w:rtl w:val="0"/>
+        </w:rPr>
+        <w:t xml:space="preserve">@fig-rationality-paper-citations plots citation patterns across all WoS economics journals and across the top five journals for four seminal references that critiqued the standard approach to rationality in economics. @simonBehavioral1955 and @allaisComportementHommeRationnel1953 represent early critiques of neoclassical rational choice, while @akerlofMarket1970 and @kahnemanProspect1979 are foundational contributions to what economists now refer to as “new” behavioral economics.</w:t>
+      </w:r>
+    </w:p>
+    <w:p>
+      <w:pPr>
+        <w:rPr/>
+      </w:pPr>
+      <w:r>
+        <w:rPr>
+          <w:rtl w:val="0"/>
+        </w:rPr>
+        <w:t xml:space="preserve">The influence of “new” behavioral economics clearly exceeds that of the earlier tradition, both in the top five journals and in the broader set of economics journals indexed in Web of Science. Whereas @simonBehavioral1955 and @allaisComportementHommeRationnel1953 are cited by no more than 0.2% of all economics articles, @kahnemanProspect1979 surpasses 1% by the late 2010s and continues to rise. The contrast lies not only in the scale of influence but also in the speed and timing of acceptance: citations to the two “new” behavioral papers grow rapidly and steadily from the moment of publication, while Simon and Allais reach their modest peaks only around the time of their Nobel Prizes—or even later in the 2000s, with the renewed attention generated by “new” behavioral economics. As argued by @offerNobel2016, many laureates experience a “Nobel premium,” a modest increase in citations following the award. Simon and Allais conform to this pattern, but Kahneman and Tversky represent an exceptional case: after the Nobel, their previously declining citation trajectory reverses and climbs sharply throughout the period studied [@offerNobel2016].</w:t>
+      </w:r>
+      <w:r>
+        <w:rPr>
+          <w:rtl w:val="0"/>
+        </w:rPr>
+      </w:r>
+    </w:p>
+    <w:p>
+      <w:pPr>
+        <w:pStyle w:val="Heading2"/>
+        <w:ind w:firstLine="720"/>
+        <w:rPr/>
+      </w:pPr>
+      <w:bookmarkStart w:colFirst="0" w:colLast="0" w:name="_wt87pqtw3bme" w:id="6"/>
+      <w:bookmarkEnd w:id="6"/>
+      <w:r>
+        <w:rPr>
+          <w:rtl w:val="0"/>
+        </w:rPr>
+        <w:t xml:space="preserve">More a</w:t>
+      </w:r>
+      <w:r>
+        <w:rPr>
+          <w:rtl w:val="0"/>
+        </w:rPr>
+        <w:t xml:space="preserve">dvanced </w:t>
+      </w:r>
+      <w:r>
+        <w:rPr>
+          <w:rtl w:val="0"/>
+        </w:rPr>
+        <w:t xml:space="preserve">exploration</w:t>
+      </w:r>
+    </w:p>
+    <w:p>
+      <w:pPr>
+        <w:rPr/>
+      </w:pPr>
+      <w:r>
+        <w:rPr>
+          <w:rtl w:val="0"/>
+        </w:rPr>
+        <w:t xml:space="preserve">Citation counts are a blunt tool and cannot answer many questions of interest to historians of economics: Who cites these works? Are they cited together? In what intellectual contexts do they appear? Moreover, focusing on a small set of references introduces a degree of arbitrariness into the analysis. Likewise, simply counting the words that appear next to “rationality” tells us little about whether these words are used jointly within the same argument or whether they belong to distinct topics and contexts that mobilize the concept differently. It also overlooks the much broader vocabulary related to rationality (e.g., profit maximization, expected utility, social choice).</w:t>
+      </w:r>
+    </w:p>
+    <w:p>
+      <w:pPr>
+        <w:rPr/>
+      </w:pPr>
+      <w:r>
+        <w:rPr>
+          <w:rtl w:val="0"/>
+        </w:rPr>
+        <w:t xml:space="preserve">Most recent quantitative studies in the history of economics rely on what can be grouped under the label of “unsupervised methods.” These approaches apply algorithms to a corpus—whether full texts or citation data—to generate classifications and assign categories that are not predetermined by the researcher but that emerge from statistical patterns in the  data itself, which gives the approach its “unsupervised” character.</w:t>
       </w:r>
       <w:r>
         <w:rPr>
           <w:vertAlign w:val="superscript"/>
         </w:rPr>
-        <w:footnoteReference w:customMarkFollows="0" w:id="8"/>
-      </w:r>
-      <w:r>
-        <w:rPr>
-          <w:rtl w:val="0"/>
-        </w:rPr>
-        <w:t xml:space="preserve"> To choose a particular proxy, it is important to understand how it relates to the object under study. Both JEL codes and journal classifications—like JSTOR or Scopus classifications—can structure a corpus in ways that reflect their own histories, and researchers must therefore consider how these proxies shape the boundaries of their material. For example, while the JEL codes for neuroeconomics emerged around the same time as the first publications in the field, the JEL codes for behavioral economics appeared more than two decades after the earliest contributions [@trucNeuroeconomics2023]. Understanding the historical development of such proxies is thus essential for interpreting the nature of the corpus they produce. More generally, a thorough knowledge of the history of the object being studied is crucial for evaluating the adequacy and representativeness of the resulting corpus.</w:t>
-      </w:r>
-    </w:p>
-    <w:p>
-      <w:pPr>
-        <w:ind w:right="0"/>
-        <w:rPr/>
-      </w:pPr>
-      <w:r>
-        <w:rPr>
-          <w:rtl w:val="0"/>
-        </w:rPr>
-        <w:t xml:space="preserve">In our case, we first define economic documents by building the corpus from peer-review journals. This convention has both advantages and limitations. </w:t>
-      </w:r>
-      <w:r>
-        <w:rPr>
-          <w:rtl w:val="0"/>
-        </w:rPr>
-        <w:t xml:space="preserve">On the one hand, this approach is unambiguous, as it relies on agreeing upon a predefined list of journals, rather than, for instance, determining at the document level which individual articles qualify as economics. Moreover, journals constitute one of the main legitimate institutional markers of a discipline, alongside training programs and professional associations. On the other hand, focusing on journals means excluding other publication outlets, such as books or working pa</w:t>
-      </w:r>
-      <w:r>
-        <w:rPr>
-          <w:rtl w:val="0"/>
-        </w:rPr>
-        <w:t xml:space="preserve">pers.</w:t>
-      </w:r>
-      <w:r>
-        <w:rPr>
-          <w:vertAlign w:val="superscript"/>
-        </w:rPr>
-        <w:footnoteReference w:customMarkFollows="0" w:id="9"/>
-      </w:r>
-      <w:r>
-        <w:rPr>
-          <w:rtl w:val="0"/>
-        </w:rPr>
-        <w:t xml:space="preserve"> In addition, it struggles to capture interdisciplinarity, whether in the form of interdisciplinary journals or of economists publishing in other disciplinary journals. Finally, this strategy requires the use of arbitrary criteria to decide which journals to include and which to exclude—particularly for journals at the margins of “economics”, either because of their interdisciplinary orientation or because of uncertainty regarding their peer-review standards or academic practices.</w:t>
-      </w:r>
-      <w:r>
-        <w:rPr>
-          <w:vertAlign w:val="superscript"/>
-        </w:rPr>
-        <w:footnoteReference w:customMarkFollows="0" w:id="10"/>
-      </w:r>
-      <w:r>
-        <w:rPr>
-          <w:rtl w:val="0"/>
-        </w:rPr>
-        <w:t xml:space="preserve"> </w:t>
-      </w:r>
-      <w:r>
-        <w:rPr>
-          <w:rtl w:val="0"/>
-        </w:rPr>
-        <w:t xml:space="preserve">We eventually settled on a carefully curated list of 329 journals identified as economics journals in JSTOR and Scopus, but excluding journals that are not entirely academic, insufficiently focused on economics, or only founded within the last twenty years.</w:t>
-      </w:r>
-      <w:r>
-        <w:rPr>
-          <w:vertAlign w:val="superscript"/>
-        </w:rPr>
         <w:footnoteReference w:customMarkFollows="0" w:id="11"/>
       </w:r>
       <w:r>
         <w:rPr>
           <w:rtl w:val="0"/>
         </w:rPr>
-        <w:t xml:space="preserve"> We were able to retrieve 289538 articles published in these journals from 1900 to 2009. </w:t>
-      </w:r>
-      <w:r>
-        <w:rPr>
-          <w:rtl w:val="0"/>
-        </w:rPr>
-      </w:r>
-    </w:p>
-    <w:p>
-      <w:pPr>
-        <w:ind w:right="0"/>
-        <w:rPr/>
-      </w:pPr>
-      <w:r>
-        <w:rPr>
-          <w:rtl w:val="0"/>
-        </w:rPr>
-        <w:t xml:space="preserve">The</w:t>
-      </w:r>
-      <w:r>
-        <w:rPr>
-          <w:rtl w:val="0"/>
-        </w:rPr>
-        <w:t xml:space="preserve"> second challenge was to restrain our corpus to documents engaging with the issue of rationality. One of the most straightforward proxies are keywords [@trucNeuroeconomics2023]. Based on a predefined list of target terms (often called a “dictionary”), this approach restricts a corpus to documents that mention these terms with at least a given frequency. In addition to its relative simplicity, it works well for specific and unambiguous terms, like “stagflation” and “Great Inflation” [@goutsmedtStagflation2021] or “Agent-Based Models” [@bacciniDoes2025]. But this approach may display several limitations when it is not the case. Indeed, it focuses on spotting occurrences of a term rather than a general idea. Just think about the various ways rationality could be discussed in the history of economics: beyond the term of “rationality” itself, economists employ various expressions that refer to close ideas such as maximising profits or expected utility, the </w:t>
+        <w:t xml:space="preserve"> Assigning such categories imposes a form of internal organization on large and otherwise unwieldy bodies of material, enabling an accelerated or “distant reading” [@morettiDistant2013]. The typical output of these methods is a map of a discipline or research area, showing how different entities—topics, articles, authors—relate to one another.  </w:t>
+      </w:r>
+    </w:p>
+    <w:p>
+      <w:pPr>
+        <w:rPr/>
+      </w:pPr>
+      <w:r>
+        <w:rPr>
+          <w:rtl w:val="0"/>
+        </w:rPr>
+        <w:t xml:space="preserve">The counterpart of unsupervised methods are supervised methods—such as regressions—which estimate predefined relationships in the data. In contrast, unsupervised methods are particularly well suited to exploratory analysis. In this research context, analysts often lack precise knowledge of the corpus and its various intellectual contexts. While supervised methods require clearly specified hypotheses and well-defined variables, unsupervised approaches allow researchers to let a </w:t>
       </w:r>
       <w:r>
         <w:rPr>
@@ -900,61 +1327,58 @@
           <w:iCs w:val="1"/>
           <w:rtl w:val="0"/>
         </w:rPr>
-        <w:t xml:space="preserve">homo oeconomicus</w:t>
-      </w:r>
-      <w:r>
-        <w:rPr>
-          <w:rtl w:val="0"/>
-        </w:rPr>
-        <w:t xml:space="preserve">, or the transitivity or completeness of preferences. </w:t>
-      </w:r>
-    </w:p>
-    <w:p>
-      <w:pPr>
-        <w:ind w:right="0"/>
-        <w:rPr/>
-      </w:pPr>
-      <w:r>
-        <w:rPr>
-          <w:rtl w:val="0"/>
-        </w:rPr>
-        <w:t xml:space="preserve">Going beyond simply searching for occurrences of “rationality” and “rational,” we could have constructed an extensive dictionary of terms associated with the concept of rationality. This task requires substantial knowledge of the history of economics and of debates surrounding rationality, and thus presupposes that researchers possess adequate historical and conceptual background. Despite this, it remains difficult to prevent the dictionary-building process from introducing biases—for instance, by omitting concepts that are historically relevant but salient only during specific periods (such as “hedonism”), or by creating a disproportionate dictionary, with many terms related, for instance, to decision theory but few pertaining to macroeconomics or public economics. Consequently, this approach also constrains the potential for discovery: by setting the boundaries of the dictionary in advance, researchers may unintentionally exclude terms or themes of which they were unaware, and thus remain unaware of them throughout the analysis.</w:t>
-      </w:r>
-    </w:p>
-    <w:p>
-      <w:pPr>
-        <w:ind w:right="0"/>
-        <w:rPr/>
-      </w:pPr>
-      <w:r>
-        <w:rPr>
-          <w:rtl w:val="0"/>
-        </w:rPr>
-        <w:t xml:space="preserve">To overcome this issue, we use a Large Language Model (LLM) to identify documents—and in particular specific sentences within documents—that deal with rationality in our corpus of economic articles.</w:t>
-      </w:r>
-      <w:r>
-        <w:rPr>
-          <w:vertAlign w:val="superscript"/>
-        </w:rPr>
-        <w:footnoteReference w:customMarkFollows="0" w:id="12"/>
-      </w:r>
-      <w:r>
-        <w:rPr>
-          <w:rtl w:val="0"/>
-        </w:rPr>
-        <w:t xml:space="preserve"> LLMs are algorithms trained on extremely large collections of text to learn patterns in language. In simple terms, they learn to predict missing words in a sentence or to determine whether two sentences follow each other. Through this training, the model develops billions of internal parameters that capture regularities in vocabulary, grammar, and meaning.</w:t>
-      </w:r>
-      <w:r>
-        <w:rPr>
-          <w:rtl w:val="0"/>
-        </w:rPr>
-        <w:t xml:space="preserve"> </w:t>
-      </w:r>
-      <w:r>
-        <w:rPr>
-          <w:rtl w:val="0"/>
-        </w:rPr>
-        <w:t xml:space="preserve">When we input text into such a model, it translates sentences into vectors that summarize their context and meaning. This enables us to compare sentences not by the exact words they use but by their underlying ideas. For example, the same term—such as “model”—may carry different meanings depending on the surrounding context (</w:t>
+        <w:t xml:space="preserve">chosen </w:t>
+      </w:r>
+      <w:r>
+        <w:rPr>
+          <w:rtl w:val="0"/>
+        </w:rPr>
+        <w:t xml:space="preserve">structure of the material emerge. This is especially true for large-scale and long-run analysis, where labelled data become harder to obtain and increase the risk of imposing categories that are inadequate or anachronistic relative to the historical context. That does not mean, however, that an unsupervised algorithm can be applied blindly to historical questions: a substantial part of our effort has consisted in adapting the method to our historical data, especially to accommodate the growth of the corpus over time.</w:t>
+      </w:r>
+      <w:r>
+        <w:rPr>
+          <w:rtl w:val="0"/>
+        </w:rPr>
+      </w:r>
+    </w:p>
+    <w:p>
+      <w:pPr>
+        <w:rPr/>
+      </w:pPr>
+      <w:r>
+        <w:rPr>
+          <w:rtl w:val="0"/>
+        </w:rPr>
+        <w:t xml:space="preserve">In this paper, for citation data, we use a method commonly employed in the history of economic thought: bibliographic coupling [ref]. We begin with a corpus composed of the 10% of articles whose average embeddings are most similar to our annual representative vectors for “rationality” and “rational.” In this network, articles are represented as nodes, and connections between them depend on the number of shared references in their bibliographies. The more references two articles share, the stronger their link—and the closer they appear in a two-dimensional network visualization. The underlying premise is that shared references serve as a proxy for intellectual proximity. These maps help delineate the boundaries of disciplines, fields, or sub-specialties and reveal their internal organization, including hierarchies and core–periphery structures.</w:t>
+      </w:r>
+    </w:p>
+    <w:p>
+      <w:pPr>
+        <w:rPr/>
+      </w:pPr>
+      <w:r>
+        <w:rPr>
+          <w:rtl w:val="0"/>
+        </w:rPr>
+        <w:t xml:space="preserve">However, citation practices tend to favor more recent works, which makes it unhelpful for historians to construct a single citation network spanning an entire century. Following a method that has proven effective in the field [three papers], we therefore split our corpus into overlapping eight-year windows, beginning in 1960 (1960–1967; 1961–1968; … ; 2002–2009), and built a series of 43 separate networks. Using community-detection algorithms [@traag…], we identify groups of documents that share a substantial fraction of references and therefore have a similar intellectual background; we refer to these groups as “bibliographic communities.” Our next step is to identify communities that persist over time. When two communities from consecutive networks share many of the same articles, we treat them as instances of the same underlying group—an “intertemporal bibliographic community.” In this way, our bibliographic communities bring together documents from different </w:t>
+      </w:r>
+      <w:r>
+        <w:rPr>
+          <w:rtl w:val="0"/>
+        </w:rPr>
+        <w:t xml:space="preserve">periods of</w:t>
+      </w:r>
+      <w:r>
+        <w:rPr>
+          <w:rtl w:val="0"/>
+        </w:rPr>
+        <w:t xml:space="preserve"> time but that are likely to engage with rationality in similar ways, based on their shared citation patterns. </w:t>
+      </w:r>
+      <w:r>
+        <w:rPr>
+          <w:rtl w:val="0"/>
+        </w:rPr>
+        <w:t xml:space="preserve">This method allows us both to </w:t>
       </w:r>
       <w:r>
         <w:rPr>
@@ -962,13 +1386,13 @@
           <w:iCs w:val="1"/>
           <w:rtl w:val="0"/>
         </w:rPr>
-        <w:t xml:space="preserve">fashion model </w:t>
-      </w:r>
-      <w:r>
-        <w:rPr>
-          <w:rtl w:val="0"/>
-        </w:rPr>
-        <w:t xml:space="preserve">vs </w:t>
+        <w:t xml:space="preserve">zoom in</w:t>
+      </w:r>
+      <w:r>
+        <w:rPr>
+          <w:rtl w:val="0"/>
+        </w:rPr>
+        <w:t xml:space="preserve"> on specific communities at a given period and to </w:t>
       </w:r>
       <w:r>
         <w:rPr>
@@ -976,387 +1400,136 @@
           <w:iCs w:val="1"/>
           <w:rtl w:val="0"/>
         </w:rPr>
-        <w:t xml:space="preserve">scientific model)</w:t>
-      </w:r>
-      <w:r>
-        <w:rPr>
-          <w:rtl w:val="0"/>
-        </w:rPr>
-        <w:t xml:space="preserve"> and a LLM </w:t>
-      </w:r>
-      <w:r>
-        <w:rPr>
-          <w:rtl w:val="0"/>
-        </w:rPr>
-        <w:t xml:space="preserve">can detect these variations. By converting words and sentences into vectors that reflect their semantic usage, LLMs make it possible to treat ideas and conceptual shifts as measurable objects, thereby opening new possibilities for the quantitative study of economic thought.</w:t>
-      </w:r>
-    </w:p>
-    <w:p>
-      <w:pPr>
-        <w:ind w:right="0"/>
-        <w:rPr/>
-      </w:pPr>
-      <w:r>
-        <w:rPr>
-          <w:rtl w:val="0"/>
-        </w:rPr>
-        <w:t xml:space="preserve">We rely on Sentence-BERT [@reimersSentenceBERT2019], an LLM designed specifically to produce sentence embeddings, that is, numerical vectors that represent the meaning of a sentence. The model assigns one vector to each sentence, which allows for straightforward semantic comparison: sentences that express similar ideas end up with vectors that are mathematically close to each other. Using Sentence-BERT, we vectorized more than 61 million sentences published between 1900 and 2009 from our database. Starting from sentences including “rationality” and “rational”, we then searched for the sentences most similar to these anchor sentences. Thus, if sentence A explicitly uses the word “rationality,” and its vector is close to that of sentence B—which never mentions the term—sentence B likely discusses a related idea.</w:t>
-      </w:r>
-    </w:p>
-    <w:p>
-      <w:pPr>
-        <w:rPr/>
-      </w:pPr>
-      <w:r>
-        <w:rPr>
-          <w:rtl w:val="0"/>
-        </w:rPr>
-        <w:t xml:space="preserve">Our approach does not simply consist of finding sentences that are close to the words “rationality” and “rational” over a 110-year period, though. Because our project is historical, it is crucial to consider how LLMs themselves handle historical language. LLMs are trained on billions of texts, but the overwhelming majority of these texts are recent.</w:t>
+        <w:t xml:space="preserve">zoom out </w:t>
+      </w:r>
+      <w:r>
+        <w:rPr>
+          <w:rtl w:val="0"/>
+        </w:rPr>
+        <w:t xml:space="preserve">by reconstructing</w:t>
+      </w:r>
+      <w:r>
+        <w:rPr>
+          <w:rtl w:val="0"/>
+        </w:rPr>
+        <w:t xml:space="preserve"> the broader picture of a dynamic intellectual field.</w:t>
+      </w:r>
+      <w:r>
+        <w:rPr>
+          <w:rtl w:val="0"/>
+        </w:rPr>
+      </w:r>
+    </w:p>
+    <w:p>
+      <w:pPr>
+        <w:rPr/>
+      </w:pPr>
+      <w:r>
+        <w:rPr>
+          <w:rtl w:val="0"/>
+        </w:rPr>
+        <w:t xml:space="preserve">For textual data, historians of economics frequently rely on topic modeling [Ref]. Topic modeling identifies the latent themes in a corpus by learning distributions of words associated with each topic. Each document is then represented by a mixture of these topics—often with one or two dominating—while each topic can be described through its most representative words and expressions. While topic modeling is a convenient tool for historical analysis, our research question pushed us toward a more targeted approach.</w:t>
+      </w:r>
+    </w:p>
+    <w:p>
+      <w:pPr>
+        <w:rPr/>
+      </w:pPr>
+      <w:r>
+        <w:rPr>
+          <w:rtl w:val="0"/>
+        </w:rPr>
+        <w:t xml:space="preserve">Because we focus on one large and historically fluid concept, we draw on the literature on semantic drift [ref] and take inspiration from @ref. Rather than starting with full documents, </w:t>
+      </w:r>
+      <w:r>
+        <w:rPr>
+          <w:rtl w:val="0"/>
+        </w:rPr>
+        <w:t xml:space="preserve">we filter each year’s corpus to retain only the </w:t>
+      </w:r>
+      <w:r>
+        <w:rPr>
+          <w:rtl w:val="0"/>
+        </w:rPr>
+        <w:t xml:space="preserve"> top 1% of sentences that are most similar to our annual representative vectors of “rationality” and “rational.” In other words, we extract the sentences most likely to engage with the concept of rationality in any form.</w:t>
       </w:r>
       <w:r>
         <w:rPr>
           <w:vertAlign w:val="superscript"/>
         </w:rPr>
+        <w:footnoteReference w:customMarkFollows="0" w:id="12"/>
+      </w:r>
+      <w:r>
+        <w:rPr>
+          <w:rtl w:val="0"/>
+        </w:rPr>
+        <w:t xml:space="preserve"> As with bibliographic coupling, we want a method that groups together sentences that employ similar meanings of rationality. We therefore cluster the sentence embeddings using the HDBSCAN algorithm, a widely used unsupervised method for clustering LLM-generated vectors. </w:t>
+      </w:r>
+    </w:p>
+    <w:p>
+      <w:pPr>
+        <w:rPr/>
+      </w:pPr>
+      <w:r>
+        <w:rPr>
+          <w:rtl w:val="0"/>
+        </w:rPr>
+        <w:t xml:space="preserve">Again, historical perspective matters. Because the distribution of identified sentences is strongly present-biased (@fig-distribution), clustering all sentences at once would risk over-representing recent periods. We therefore perform clustering separately for each decade from 1900 onward (merging the first two decades due to fewer sentences).</w:t>
+      </w:r>
+      <w:r>
+        <w:rPr>
+          <w:vertAlign w:val="superscript"/>
+        </w:rPr>
         <w:footnoteReference w:customMarkFollows="0" w:id="13"/>
       </w:r>
       <w:r>
         <w:rPr>
           <w:rtl w:val="0"/>
         </w:rPr>
-        <w:t xml:space="preserve"> As a result, they tend to offer a “presentist,” numerical view of language. For example, current models struggle to reproduce writing styles from earlier periods and cannot reliably infer the publication date of a text [@underwoodCan2025]. Sentence-BERT is subject to the same limitations, and the sentence embeddings it produces inevitably reflect this bias. Besides, as illustrated by @</w:t>
-      </w:r>
-      <w:r>
-        <w:rPr>
-          <w:rtl w:val="0"/>
-        </w:rPr>
-        <w:t xml:space="preserve">fig-distribution</w:t>
-      </w:r>
-      <w:r>
-        <w:rPr>
-          <w:rtl w:val="0"/>
-        </w:rPr>
-        <w:t xml:space="preserve">, our corpus is exponential according to years and most sentences come from recent articles. Taken together, these effects make it very likely that the sentences the model identifies as closest to “rationality” will predominantly come from recent articles. To limit this presentist effect, we adapted the way we compare sentences over time. Instead of comparing a sentence from, say, 1910 directly to </w:t>
-      </w:r>
-      <w:r>
-        <w:rPr>
-          <w:rtl w:val="0"/>
-        </w:rPr>
-        <w:t xml:space="preserve">all</w:t>
-      </w:r>
-      <w:r>
-        <w:rPr>
-          <w:rtl w:val="0"/>
-        </w:rPr>
-        <w:t xml:space="preserve"> sentences in our corpus that contain the words “rationality” or “rational,” we constructed a “representative vector” that is a moving average vector with a five-year symmetric window. Concretely, for the year 1910, we averaged the vectors of all sentences containing “rationality” or “rational” from 1905 to 1915. This produces a period-specific reference point that reflects how these terms were used </w:t>
-      </w:r>
-      <w:r>
-        <w:rPr>
-          <w:rtl w:val="0"/>
-        </w:rPr>
-        <w:t xml:space="preserve">at that particular moment in time</w:t>
-      </w:r>
-      <w:r>
-        <w:rPr>
-          <w:rtl w:val="0"/>
-        </w:rPr>
-        <w:t xml:space="preserve">. A sentence from 1910 is therefore judged similar not to the general, and likely modern-day meaning of rationality, but to the way the concept was expressed during its own historical period. This helps ensure that our analysis is sensitive to historical changes in language. </w:t>
-      </w:r>
-      <w:r>
-        <w:rPr>
-          <w:rtl w:val="0"/>
-        </w:rPr>
-        <w:t xml:space="preserve">Since each document is a set of sentences, we also identify the documents—and the authors—that discuss rationality most intensively or frequently. @tbl-illustrative_sentences and @tbl-illustrative_documents illustrate respectively the closest sentence and documents from our representative vectors in 1910. </w:t>
-      </w:r>
-      <w:r>
-        <w:rPr>
-          <w:rtl w:val="0"/>
-        </w:rPr>
-      </w:r>
-    </w:p>
-    <w:p>
-      <w:pPr>
-        <w:pStyle w:val="Heading1"/>
+        <w:t xml:space="preserve"> As in our bibliographic approach, we then seek to form larger groups over time, allowing us to “zoom in” and “zoom out” depending on what we are searching for. Using the cosine similarity between clusters across decades, we merge the closest ones into 17 “intertemporal semantic clusters.”</w:t>
+      </w:r>
+      <w:r>
+        <w:rPr>
+          <w:vertAlign w:val="superscript"/>
+        </w:rPr>
+        <w:footnoteReference w:customMarkFollows="0" w:id="14"/>
+      </w:r>
+      <w:r>
+        <w:rPr>
+          <w:rtl w:val="0"/>
+        </w:rPr>
+        <w:t xml:space="preserve"> </w:t>
+      </w:r>
+    </w:p>
+    <w:p>
+      <w:pPr>
+        <w:rPr/>
+      </w:pPr>
+      <w:r>
+        <w:rPr>
+          <w:rtl w:val="0"/>
+        </w:rPr>
+        <w:t xml:space="preserve">With both methods, we thus obtain a list of “intertemporal bibliographic communities” and “intertemporal semantic clusters.” These allow us to identify subgroups within our corpus across multiple dimensions: different subfields of economics (e.g., behavioral economics, macroeconomics), different conceptions of rationality (e.g., bounded rationality, rational expectations), or even, more heuristically, different methodological traditions (e.g., experimental work, econometrics).  </w:t>
+      </w:r>
+      <w:r>
+        <w:rPr>
+          <w:rtl w:val="0"/>
+        </w:rPr>
+        <w:t xml:space="preserve">Both approaches have clear strengths and limitations. Some are largely inherited from their respective sources. In our case, citation data cannot be meaningfully exploited before the 1960s, while our OCR full texts handle formulas and tables poorly, making economic models—an essential component of our story—less visible in the semantic analysis than through citations. Choosing between the two therefore depends directly on the specific historical questions one aims to address. </w:t>
+      </w:r>
+    </w:p>
+    <w:p>
+      <w:pPr>
         <w:rPr>
           <w:b w:val="1"/>
           <w:bCs w:val="1"/>
         </w:rPr>
       </w:pPr>
-      <w:bookmarkStart w:colFirst="0" w:colLast="0" w:name="_2jyqfu2efpff" w:id="4"/>
-      <w:bookmarkEnd w:id="4"/>
-      <w:r>
-        <w:rPr>
-          <w:b w:val="1"/>
-          <w:bCs w:val="1"/>
-          <w:rtl w:val="0"/>
-        </w:rPr>
-        <w:t xml:space="preserve">Exploring the corpus </w:t>
-      </w:r>
-    </w:p>
-    <w:p>
-      <w:pPr>
-        <w:pStyle w:val="Heading1"/>
-        <w:ind w:firstLine="720"/>
-        <w:rPr>
-          <w:sz w:val="32"/>
-          <w:szCs w:val="32"/>
-        </w:rPr>
-      </w:pPr>
-      <w:bookmarkStart w:colFirst="0" w:colLast="0" w:name="_57osrl8kii9f" w:id="5"/>
-      <w:bookmarkEnd w:id="5"/>
-      <w:r>
-        <w:rPr>
-          <w:sz w:val="32"/>
-          <w:szCs w:val="32"/>
-          <w:rtl w:val="0"/>
-        </w:rPr>
-        <w:t xml:space="preserve">Simple </w:t>
-      </w:r>
-      <w:r>
-        <w:rPr>
-          <w:sz w:val="32"/>
-          <w:szCs w:val="32"/>
-          <w:rtl w:val="0"/>
-        </w:rPr>
-        <w:t xml:space="preserve">exploration</w:t>
-      </w:r>
-    </w:p>
-    <w:p>
-      <w:pPr>
-        <w:rPr/>
-      </w:pPr>
-      <w:r>
-        <w:rPr>
-          <w:rtl w:val="0"/>
-        </w:rPr>
-        <w:t xml:space="preserve">Before returning to our specific corpus on rationality and diving into more advanced LLM-based analyses, we first step back and examine simpler quantitative methods applied to our broader set of economics articles. Indeed, quantitative approaches come in many forms and levels of complexity. In fact, quantification does not need to be sophisticated to be useful. </w:t>
-      </w:r>
-      <w:r>
-        <w:rPr>
-          <w:rtl w:val="0"/>
-        </w:rPr>
-        <w:t xml:space="preserve">Simple indicators may not always provide the clearest  answers to research questions, but they can play an important exploratory role: helping researchers refine their questions, identify anomalies, or detect unexpected patterns.</w:t>
-      </w:r>
-    </w:p>
-    <w:p>
-      <w:pPr>
-        <w:rPr/>
-      </w:pPr>
-      <w:r>
-        <w:rPr>
-          <w:rtl w:val="0"/>
-        </w:rPr>
-        <w:t xml:space="preserve">For</w:t>
-      </w:r>
-      <w:r>
-        <w:rPr>
-          <w:rtl w:val="0"/>
-        </w:rPr>
-        <w:t xml:space="preserve"> textual data, one of the most straightforward indicators is term frequency, that is counting how often particular words or expressions appear. </w:t>
-      </w:r>
-      <w:r>
-        <w:rPr>
-          <w:rtl w:val="0"/>
-        </w:rPr>
-        <w:t xml:space="preserve">This metric has been used repeatedly in the literature, especially to track the emergence or decline of fields within economics. In well-delimited domains, term frequency can serve as a reliable proxy for intellectual dynamics. For instance, @trucNeuroeconomics2023 shows that counting occurrences of highly specific neuroeconomics terms—such as “striatum” or “prefrontal”—closely approximates more advanced quantitative measures, and thus provides a simple but meaningful signal of activity in the field.</w:t>
-      </w:r>
-    </w:p>
-    <w:p>
-      <w:pPr>
-        <w:rPr/>
-      </w:pPr>
-      <w:r>
-        <w:rPr>
-          <w:rtl w:val="0"/>
-        </w:rPr>
-        <w:t xml:space="preserve">@fig-relative-frequency shows the relative frequency (with respect to the total number of words published each year) of “rational” and “rationality” in our corpus. The figure reveals a steady postwar increase of the use of both terms, likely reflecting the progressive consolidation of rational choice theory in economics. We observe a marked surge after the 1970s, with a pronounced peak for “rational” in the 1980s, and a smaller peak for “rationality” in the 1990s. The rise of “rational expectations” in macroeconomics and the emergence of behavioral economics following the publication of @kahnemanProspect1979 likely contributed to this pattern. </w:t>
-      </w:r>
-      <w:r>
-        <w:rPr>
-          <w:rtl w:val="0"/>
-        </w:rPr>
-        <w:t xml:space="preserve">Of course, we cannot easily infer the precise drivers of these trends from such simple metrics. However, the clear upward movement signals an important moment in the evolution of rationality within economics—at least in terms of textual intensity—thereby motivating more targeted forms of investigation.</w:t>
-      </w:r>
-      <w:r>
-        <w:rPr>
-          <w:rtl w:val="0"/>
-        </w:rPr>
-      </w:r>
-    </w:p>
-    <w:p>
-      <w:pPr>
-        <w:rPr/>
-      </w:pPr>
-      <w:r>
-        <w:rPr>
-          <w:rtl w:val="0"/>
-        </w:rPr>
-        <w:t xml:space="preserve">While our usage of a large language model will shed light on the context surrounding this rise, such context can also be approximated with simpler, more straightforward measures. Co-occurrence analysis helps recover the different intellectual settings in which rationality is invoked. @fig-co-occurence reports, by decade, the five words most frequently adjacent to “rational” or “rationality,” showing how these associations shift over time. Before the 1930s, the picture was heterogeneous. The notion was tied to the marginalist idea of “calculation,” but it referred not only to individual behavior but also to “systems” or “organizations.” The discussion was explicitly methodological, as indicated by the prominence of terms such as “method,” “explanation,” “law,” and “foundation.” From the 1940s onward, the rise of choice theory places rationality at the center of economic modeling as a device for describing and formalizing behavior. This is mostly visible with the rise of multiple common bi-grams (i.e., combination of two words) that remain stable from the 1930s through the 1980s such as “economic rationality”, “rational choice”, “rational behavior”. By the 1970s—and especially the 1980s—the framework was both extended and contested. First, the most common bi-gram by far becomes “rational expectations” signalling the emergence of a new predominant concept extending rationality. In the 1980s, “rational expectations” appeared 15 more times than the other most common bi-grams. Second, while the concept “bounded rationality” was developed by Herbert Simon initially in the 1950s, the concept only became prevalent during the 1990s with the bi-gram becoming the fourth most common one. </w:t>
-      </w:r>
-    </w:p>
-    <w:p>
-      <w:pPr>
-        <w:rPr/>
-      </w:pPr>
-      <w:r>
-        <w:rPr>
-          <w:rtl w:val="0"/>
-        </w:rPr>
-        <w:t xml:space="preserve">Beyond textual data, citation data also constitute a </w:t>
-      </w:r>
-      <w:r>
-        <w:rPr>
-          <w:rtl w:val="0"/>
-        </w:rPr>
-        <w:t xml:space="preserve">useful</w:t>
-      </w:r>
-      <w:r>
-        <w:rPr>
-          <w:rtl w:val="0"/>
-        </w:rPr>
-        <w:t xml:space="preserve"> source of information for corpus exploration. The evolution of an idea depends not only on how it is formulated by its authors, but also on how it is appropriated, and reinterpreted by readers. A substantial literature in citation theory examines how citations function as a scientific practice and how they should be interpreted. As emphasized in this literature [see, e.g., @TahamtanCore1979], citations may reflect a wide range of motivations—from a genuine desire to acknowledge intellectual debt to more strategic uses aimed at persuading readers or satisfying referees. Nevertheless, citations at the very least signal a relationship that can help trace the lineage and diffusion of ideas, even when the reasons behind the citation are not purely intellectual.</w:t>
-      </w:r>
-    </w:p>
-    <w:p>
-      <w:pPr>
-        <w:rPr/>
-      </w:pPr>
-      <w:r>
-        <w:rPr>
-          <w:rtl w:val="0"/>
-        </w:rPr>
-        <w:t xml:space="preserve">Counting the citations of specific documents offers a first, simple approach to assessing the impact of an author or a particular publication. There are clear reasons to incorporate citation studies into historical research. Beyond tracing diffusion, highly cited papers tend to be more visible and attract greater engagement—</w:t>
-      </w:r>
-      <w:commentRangeStart w:id="1"/>
-      <w:r>
-        <w:rPr>
-          <w:rtl w:val="0"/>
-        </w:rPr>
-        <w:t xml:space="preserve">a dynamic that reflects the well-known Matthew effect.</w:t>
-      </w:r>
-      <w:commentRangeEnd w:id="1"/>
-      <w:r>
-        <w:commentReference w:id="1"/>
-      </w:r>
-      <w:r>
-        <w:rPr>
-          <w:rtl w:val="0"/>
-        </w:rPr>
-        <w:t xml:space="preserve"> Recent work also shows that citations influence reading behavior and perceptions of quality: highly cited papers are more likely to be read thoroughly and treated as significant intellectual contributions [@teplitskiyHow2022].</w:t>
-      </w:r>
-      <w:r>
-        <w:rPr>
-          <w:rtl w:val="0"/>
-        </w:rPr>
-      </w:r>
-    </w:p>
-    <w:p>
-      <w:pPr>
-        <w:rPr/>
-      </w:pPr>
-      <w:r>
-        <w:rPr>
-          <w:rtl w:val="0"/>
-        </w:rPr>
-        <w:t xml:space="preserve">Historians routinely discuss scientific influence and recognition using proxies such as major grants, prizes, and honors. For example, Sent’s [-@sent_behavioral_2004] narrative of the transition from the dominance of rational choice, through the limited success of “old” behavioral economics (e.g., Simon, George Katona), to the emergence of “new” behavioral economics is organized around such milestones. In this sense, citations serve as a complementary proxy alongside these traditional indicators. For instance, although both Simon and Kahneman received the Nobel Prize, Kahneman ultimately exerted a broader influence on the discipline—something that is reflected in citation patterns. In a large qualitative–quantitative study of the Nobel Prize, @offerNobel2016 distinguished several trajectories among laureates: those who peak at the prize and subsequently decline, “innovators with staying power,” “still rising” winners honored before their citation peak, and late winners recognized long after their peak.</w:t>
-      </w:r>
-    </w:p>
-    <w:p>
-      <w:pPr>
-        <w:rPr/>
-      </w:pPr>
-      <w:r>
-        <w:rPr>
-          <w:rtl w:val="0"/>
-        </w:rPr>
-        <w:t xml:space="preserve">@fig-rationality-paper-citations plots citation patterns across all WoS economics journals and across the top five journals for four seminal references that critiqued the standard approach to rationality in economics. @simonBehavioral1955 and @allaisComportementHommeRationnel1953 represent early critiques of neoclassical rational choice, while @akerlofMarket1970 and @kahnemanProspect1979 are foundational contributions to what economists now refer to as “new” behavioral economics.</w:t>
-      </w:r>
-    </w:p>
-    <w:p>
-      <w:pPr>
-        <w:rPr/>
-      </w:pPr>
-      <w:r>
-        <w:rPr>
-          <w:rtl w:val="0"/>
-        </w:rPr>
-        <w:t xml:space="preserve">The influence of “new” behavioral economics clearly exceeds that of the earlier tradition, both in the top five journals and in the broader set of economics journals indexed in Web of Science. Whereas @simonBehavioral1955 and @allaisComportementHommeRationnel1953 are cited by no more than 0.2% of all economics articles, @kahnemanProspect1979 surpasses 1% by the late 2010s and continues to rise. The contrast lies not only in the scale of influence but also in the speed and timing of acceptance: citations to the two “new” behavioral papers grow rapidly and steadily from the moment of publication, while Simon and Allais reach their modest peaks only around the time of their Nobel Prizes—or even later in the 2000s, with the renewed attention generated by “new” behavioral economics. As argued by @offerNobel2016, many laureates experience a “Nobel premium,” a modest increase in citations following the award. Simon and Allais conform to this pattern, but Kahneman and Tversky represent an exceptional case: after the Nobel, their previously declining citation trajectory reverses and climbs sharply throughout the period studied [@offerNobel2016].</w:t>
-      </w:r>
-      <w:r>
-        <w:rPr>
-          <w:rtl w:val="0"/>
-        </w:rPr>
-      </w:r>
-    </w:p>
-    <w:p>
-      <w:pPr>
-        <w:pStyle w:val="Heading2"/>
-        <w:ind w:firstLine="720"/>
-        <w:rPr/>
-      </w:pPr>
-      <w:bookmarkStart w:colFirst="0" w:colLast="0" w:name="_wt87pqtw3bme" w:id="6"/>
-      <w:bookmarkEnd w:id="6"/>
-      <w:r>
-        <w:rPr>
-          <w:rtl w:val="0"/>
-        </w:rPr>
-        <w:t xml:space="preserve">More a</w:t>
-      </w:r>
-      <w:r>
-        <w:rPr>
-          <w:rtl w:val="0"/>
-        </w:rPr>
-        <w:t xml:space="preserve">dvanced </w:t>
-      </w:r>
-      <w:r>
-        <w:rPr>
-          <w:rtl w:val="0"/>
-        </w:rPr>
-        <w:t xml:space="preserve">exploration</w:t>
-      </w:r>
-    </w:p>
-    <w:p>
-      <w:pPr>
-        <w:rPr/>
-      </w:pPr>
-      <w:r>
-        <w:rPr>
-          <w:rtl w:val="0"/>
-        </w:rPr>
-        <w:t xml:space="preserve">Citation counts are a blunt tool and cannot answer many questions of interest to historians of economics: Who cites these works? Are they cited together? In what intellectual contexts do they appear? Moreover, focusing on a small set of references introduces a degree of arbitrariness into the analysis. Likewise, simply counting the words that appear next to “rationality” tells us little about whether these words are used jointly within the same argument or whether they belong to distinct topics and contexts that mobilize the concept differently. It also overlooks the much broader vocabulary related to rationality (e.g., profit maximization, expected utility, social choice).</w:t>
-      </w:r>
-    </w:p>
-    <w:p>
-      <w:pPr>
-        <w:rPr/>
-      </w:pPr>
-      <w:r>
-        <w:rPr>
-          <w:rtl w:val="0"/>
-        </w:rPr>
-        <w:t xml:space="preserve">Most recent quantitative studies in the history of economics rely on what can be grouped under the label of “unsupervised methods.” These approaches apply algorithms to a corpus—whether full texts or citation data—to generate classifications and assign categories that are not predetermined by the researcher but that emerge from statistical patterns in the  data itself, which gives the approach its “unsupervised” character.</w:t>
-      </w:r>
-      <w:r>
-        <w:rPr>
-          <w:vertAlign w:val="superscript"/>
-        </w:rPr>
-        <w:footnoteReference w:customMarkFollows="0" w:id="14"/>
-      </w:r>
-      <w:r>
-        <w:rPr>
-          <w:rtl w:val="0"/>
-        </w:rPr>
-        <w:t xml:space="preserve"> Assigning such categories imposes a form of internal organization on large and otherwise unwieldy bodies of material, enabling an accelerated or “distant reading” [@morettiDistant2013]. The typical output of these methods is a map of a discipline or research area, showing how different entities—topics, articles, authors—relate to one another.  </w:t>
-      </w:r>
-    </w:p>
-    <w:p>
-      <w:pPr>
-        <w:rPr/>
-      </w:pPr>
-      <w:r>
-        <w:rPr>
-          <w:rtl w:val="0"/>
-        </w:rPr>
-        <w:t xml:space="preserve">The counterpart of unsupervised methods are supervised methods—such as regressions—which estimate predefined relationships in the data. In contrast, unsupervised methods are particularly well suited to exploratory analysis. In this research context, analysts often lack precise knowledge of the corpus and its various intellectual contexts. While supervised methods require clearly specified hypotheses and well-defined variables, unsupervised approaches allow researchers to let a </w:t>
+      <w:r>
+        <w:rPr>
+          <w:rtl w:val="0"/>
+        </w:rPr>
+        <w:t xml:space="preserve">Ideally, relying on </w:t>
       </w:r>
       <w:r>
         <w:rPr>
@@ -1364,235 +1537,25 @@
           <w:iCs w:val="1"/>
           <w:rtl w:val="0"/>
         </w:rPr>
-        <w:t xml:space="preserve">chosen </w:t>
-      </w:r>
-      <w:r>
-        <w:rPr>
-          <w:rtl w:val="0"/>
-        </w:rPr>
-        <w:t xml:space="preserve">structure of the material emerge. This is especially true for large-scale and long-run analysis, where labelled data become harder to obtain and increase the risk of imposing categories that are inadequate or anachronistic relative to the historical context. That does not mean, however, that an unsupervised algorithm can be applied blindly to historical questions: a substantial part of our effort has consisted in adapting the method to our historical data, especially to accommodate the growth of the corpus over time.</w:t>
-      </w:r>
-      <w:r>
-        <w:rPr>
-          <w:rtl w:val="0"/>
-        </w:rPr>
-      </w:r>
-    </w:p>
-    <w:p>
-      <w:pPr>
-        <w:rPr/>
-      </w:pPr>
-      <w:r>
-        <w:rPr>
-          <w:rtl w:val="0"/>
-        </w:rPr>
-        <w:t xml:space="preserve">In this paper, for citation data, we use a method commonly employed in the history of economic thought: bibliographic coupling [ref]. We begin with a corpus composed of the 10% of articles whose average embeddings are most similar to our annual representative vectors for “rationality” and “rational.” In this network, articles are represented as nodes, and connections between them depend on the number of shared references in their bibliographies. The more references two articles share, the stronger their link—and the closer they appear in a two-dimensional network visualization. The underlying premise is that shared references serve as a proxy for intellectual proximity. These maps help delineate the boundaries of disciplines, fields, or sub-specialties and reveal their internal organization, including hierarchies and core–periphery structures.</w:t>
-      </w:r>
-    </w:p>
-    <w:p>
-      <w:pPr>
-        <w:rPr/>
-      </w:pPr>
-      <w:r>
-        <w:rPr>
-          <w:rtl w:val="0"/>
-        </w:rPr>
-        <w:t xml:space="preserve">However, citation practices tend to favor more recent works, which makes it unhelpful for historians to construct a single citation network spanning an entire century. Following a method that has proven effective in the field [three papers], we therefore split our corpus into overlapping eight-year windows, beginning in 1960 (1960–1967; 1961–1968; … ; 2002–2009), and built a series of 43 separate networks. Using community-detection algorithms [@traag…], we identify groups of documents that share a substantial fraction of references and therefore have a similar intellectual background; we refer to these groups as “bibliographic communities.” Our next step is to identify communities that persist over time. When two communities from consecutive networks share many of the same articles, we treat them as instances of the same underlying group—an “intertemporal bibliographic community.” In this way, our bibliographic communities bring together documents from different </w:t>
-      </w:r>
-      <w:r>
-        <w:rPr>
-          <w:rtl w:val="0"/>
-        </w:rPr>
-        <w:t xml:space="preserve">periods of</w:t>
-      </w:r>
-      <w:r>
-        <w:rPr>
-          <w:rtl w:val="0"/>
-        </w:rPr>
-        <w:t xml:space="preserve"> time but that are likely to engage with rationality in similar ways, based on their shared citation patterns. </w:t>
-      </w:r>
-      <w:r>
-        <w:rPr>
-          <w:rtl w:val="0"/>
-        </w:rPr>
-        <w:t xml:space="preserve">This method allows us both to </w:t>
-      </w:r>
-      <w:r>
-        <w:rPr>
-          <w:i w:val="1"/>
-          <w:iCs w:val="1"/>
-          <w:rtl w:val="0"/>
-        </w:rPr>
-        <w:t xml:space="preserve">zoom in</w:t>
-      </w:r>
-      <w:r>
-        <w:rPr>
-          <w:rtl w:val="0"/>
-        </w:rPr>
-        <w:t xml:space="preserve"> on specific communities at a given period and to </w:t>
-      </w:r>
-      <w:r>
-        <w:rPr>
-          <w:i w:val="1"/>
-          <w:iCs w:val="1"/>
-          <w:rtl w:val="0"/>
-        </w:rPr>
-        <w:t xml:space="preserve">zoom out </w:t>
-      </w:r>
-      <w:r>
-        <w:rPr>
-          <w:rtl w:val="0"/>
-        </w:rPr>
-        <w:t xml:space="preserve">by reconstructing</w:t>
-      </w:r>
-      <w:r>
-        <w:rPr>
-          <w:rtl w:val="0"/>
-        </w:rPr>
-        <w:t xml:space="preserve"> the broader picture of a dynamic intellectual field.</w:t>
-      </w:r>
-      <w:r>
-        <w:rPr>
-          <w:rtl w:val="0"/>
-        </w:rPr>
-      </w:r>
-    </w:p>
-    <w:p>
-      <w:pPr>
-        <w:rPr/>
-      </w:pPr>
-      <w:r>
-        <w:rPr>
-          <w:rtl w:val="0"/>
-        </w:rPr>
-        <w:t xml:space="preserve">For textual data, historians of economics frequently rely on topic modeling [Ref]. Topic modeling identifies the latent themes in a corpus by learning distributions of words associated with each topic. Each document is then represented by a mixture of these topics—often with one or two dominating—while each topic can be described through its most representative words and expressions. While topic modeling is a convenient tool for historical analysis, our research question pushed us toward a more targeted approach.</w:t>
-      </w:r>
-    </w:p>
-    <w:p>
-      <w:pPr>
-        <w:rPr/>
-      </w:pPr>
-      <w:r>
-        <w:rPr>
-          <w:rtl w:val="0"/>
-        </w:rPr>
-        <w:t xml:space="preserve">Because we focus on one large and historically fluid concept, we draw on the literature on semantic drift [ref] and take inspiration from @ref. Rather than starting with full documents, </w:t>
-      </w:r>
-      <w:r>
-        <w:rPr>
-          <w:rtl w:val="0"/>
-        </w:rPr>
-        <w:t xml:space="preserve">we filter each year’s corpus to retain only the </w:t>
-      </w:r>
-      <w:r>
-        <w:rPr>
-          <w:rtl w:val="0"/>
-        </w:rPr>
-        <w:t xml:space="preserve"> top 1% of sentences that are most similar to our annual representative vectors of “rationality” and “rational.” In other words, we extract the sentences most likely to engage with the concept of rationality in any form.</w:t>
+        <w:t xml:space="preserve">both</w:t>
+      </w:r>
+      <w:r>
+        <w:rPr>
+          <w:rtl w:val="0"/>
+        </w:rPr>
+        <w:t xml:space="preserve"> methods serves complementary purposes. </w:t>
+      </w:r>
+      <w:r>
+        <w:rPr>
+          <w:rtl w:val="0"/>
+        </w:rPr>
+        <w:t xml:space="preserve">First, comparing the results of different unsupervised computational approaches—such as LLM-based embeddings and bibliometric analysis—acts as a form of robustness check.</w:t>
       </w:r>
       <w:r>
         <w:rPr>
           <w:vertAlign w:val="superscript"/>
         </w:rPr>
         <w:footnoteReference w:customMarkFollows="0" w:id="15"/>
-      </w:r>
-      <w:r>
-        <w:rPr>
-          <w:rtl w:val="0"/>
-        </w:rPr>
-        <w:t xml:space="preserve"> As with bibliographic coupling, we want a method that groups together sentences that employ similar meanings of rationality. We therefore cluster the sentence embeddings using the HDBSCAN algorithm, a widely used unsupervised method for clustering LLM-generated vectors. </w:t>
-      </w:r>
-    </w:p>
-    <w:p>
-      <w:pPr>
-        <w:rPr/>
-      </w:pPr>
-      <w:r>
-        <w:rPr>
-          <w:rtl w:val="0"/>
-        </w:rPr>
-        <w:t xml:space="preserve">Again, historical perspective matters. Because the distribution of identified sentences is strongly present-biased (@fig-distribution), clustering all sentences at once would risk over-representing recent periods. We therefore perform clustering separately for each decade from 1900 onward (merging the first two decades due to fewer sentences).</w:t>
-      </w:r>
-      <w:r>
-        <w:rPr>
-          <w:vertAlign w:val="superscript"/>
-        </w:rPr>
-        <w:footnoteReference w:customMarkFollows="0" w:id="16"/>
-      </w:r>
-      <w:r>
-        <w:rPr>
-          <w:rtl w:val="0"/>
-        </w:rPr>
-        <w:t xml:space="preserve"> As in our bibliographic approach, we then seek to form larger groups over time, allowing us to “zoom in” and “zoom out” depending on what we are searching for. Using the cosine similarity between clusters across decades, we merge the closest ones into 17 “intertemporal semantic clusters.”</w:t>
-      </w:r>
-      <w:r>
-        <w:rPr>
-          <w:vertAlign w:val="superscript"/>
-        </w:rPr>
-        <w:footnoteReference w:customMarkFollows="0" w:id="17"/>
-      </w:r>
-      <w:r>
-        <w:rPr>
-          <w:rtl w:val="0"/>
-        </w:rPr>
-        <w:t xml:space="preserve"> </w:t>
-      </w:r>
-    </w:p>
-    <w:p>
-      <w:pPr>
-        <w:rPr/>
-      </w:pPr>
-      <w:r>
-        <w:rPr>
-          <w:rtl w:val="0"/>
-        </w:rPr>
-        <w:t xml:space="preserve">With both methods, we thus obtain a list of “intertemporal bibliographic communities” and “intertemporal semantic clusters.” These allow us to identify subgroups within our corpus across multiple dimensions: different subfields of economics (e.g., behavioral economics, macroeconomics), different conceptions of rationality (e.g., bounded rationality, rational expectations), or even, more heuristically, different methodological traditions (e.g., experimental work, econometrics).  </w:t>
-      </w:r>
-      <w:r>
-        <w:rPr>
-          <w:rtl w:val="0"/>
-        </w:rPr>
-        <w:t xml:space="preserve">Both approaches have clear strengths and limitations. Some are largely inherited from their respective sources. In our case, citation data cannot be meaningfully exploited before the 1960s, while our OCR full texts handle formulas and tables poorly, making economic models—an essential component of our story—less visible in the semantic analysis than through citations. Choosing between the two therefore depends directly on the specific historical questions one aims to address. </w:t>
-      </w:r>
-    </w:p>
-    <w:p>
-      <w:pPr>
-        <w:rPr>
-          <w:b w:val="1"/>
-          <w:bCs w:val="1"/>
-        </w:rPr>
-      </w:pPr>
-      <w:r>
-        <w:rPr>
-          <w:rtl w:val="0"/>
-        </w:rPr>
-        <w:t xml:space="preserve">Ideally, relying on </w:t>
-      </w:r>
-      <w:r>
-        <w:rPr>
-          <w:i w:val="1"/>
-          <w:iCs w:val="1"/>
-          <w:rtl w:val="0"/>
-        </w:rPr>
-        <w:t xml:space="preserve">both</w:t>
-      </w:r>
-      <w:r>
-        <w:rPr>
-          <w:rtl w:val="0"/>
-        </w:rPr>
-        <w:t xml:space="preserve"> methods serves complementary purposes. </w:t>
-      </w:r>
-      <w:r>
-        <w:rPr>
-          <w:rtl w:val="0"/>
-        </w:rPr>
-        <w:t xml:space="preserve">First, comparing the results of different unsupervised computational approaches—such as LLM-based embeddings and bibliometric analysis—acts as a form of robustness check.</w:t>
-      </w:r>
-      <w:r>
-        <w:rPr>
-          <w:vertAlign w:val="superscript"/>
-        </w:rPr>
-        <w:footnoteReference w:customMarkFollows="0" w:id="18"/>
       </w:r>
       <w:r>
         <w:rPr>
@@ -1899,21 +1862,21 @@
         </w:rPr>
         <w:t xml:space="preserve">n relation to semantic cluster 11, we observe, for instance, the emergence of a </w:t>
       </w:r>
-      <w:commentRangeStart w:id="2"/>
-      <w:commentRangeStart w:id="3"/>
+      <w:commentRangeStart w:id="0"/>
+      <w:commentRangeStart w:id="1"/>
       <w:r>
         <w:rPr>
           <w:rtl w:val="0"/>
         </w:rPr>
         <w:t xml:space="preserve">“Behavioral Economics and Choice Theory”</w:t>
       </w:r>
-      <w:commentRangeEnd w:id="2"/>
-      <w:r>
-        <w:commentReference w:id="2"/>
-      </w:r>
-      <w:commentRangeEnd w:id="3"/>
-      <w:r>
-        <w:commentReference w:id="3"/>
+      <w:commentRangeEnd w:id="0"/>
+      <w:r>
+        <w:commentReference w:id="0"/>
+      </w:r>
+      <w:commentRangeEnd w:id="1"/>
+      <w:r>
+        <w:commentReference w:id="1"/>
       </w:r>
       <w:r>
         <w:rPr>
@@ -1977,19 +1940,46 @@
         <w:rPr>
           <w:rtl w:val="0"/>
         </w:rPr>
+        <w:t xml:space="preserve">Throughout much of the period—but especially before the 1940s—sentences captured by our representative vectors refer sometimes less to the rationality of economic agents than to the rational character of economists’ arguments, understood in terms of coherence or sound reasoning. This pattern reflects the logic of our semantic approach: LLMs tend to associate explicit mentions of rationality with broader discussions of reasoning and coherence, even when the connection to later, behavior-centered notions of rationality remains indirect. We retain this ambivalence deliberately since it reveals both historical transformation and the interpretative challenges inherent to large-scale analysis. </w:t>
+      </w:r>
+      <w:r>
+        <w:rPr>
+          <w:rtl w:val="0"/>
+        </w:rPr>
+      </w:r>
+    </w:p>
+    <w:p>
+      <w:pPr>
+        <w:rPr/>
+      </w:pPr>
+      <w:r>
+        <w:rPr>
+          <w:rtl w:val="0"/>
+        </w:rPr>
         <w:t xml:space="preserve">Our goal is also to show how we navigate the results and triangulate the indicators in order to produce coherent historical narratives. While we rely on the secondary literature, the articles we foreground are only those identified by our indicators as some of the most significant for understanding the semantic clusters or bibliometric communities.</w:t>
       </w:r>
       <w:r>
         <w:rPr>
           <w:vertAlign w:val="superscript"/>
         </w:rPr>
-        <w:footnoteReference w:customMarkFollows="0" w:id="19"/>
+        <w:footnoteReference w:customMarkFollows="0" w:id="16"/>
       </w:r>
       <w:r>
         <w:rPr>
           <w:rtl w:val="0"/>
         </w:rPr>
         <w:t xml:space="preserve"> </w:t>
+      </w:r>
+      <w:r>
+        <w:rPr>
+          <w:rtl w:val="0"/>
+        </w:rPr>
+        <w:t xml:space="preserve">We provide two complementary discussions: a macro-level perspective that highlights broad patterns in the evolution of rationality, and a micro-level analysis that focuses on the emergence of a specific topic—behavioral economics.</w:t>
+      </w:r>
+      <w:r>
+        <w:rPr>
+          <w:rtl w:val="0"/>
+        </w:rPr>
       </w:r>
     </w:p>
     <w:p>
@@ -2004,35 +1994,97 @@
         <w:rPr>
           <w:rtl w:val="0"/>
         </w:rPr>
-        <w:t xml:space="preserve">Through the Telescope: Broad Patterns on the History of Rationality</w:t>
-      </w:r>
-      <w:r>
-        <w:rPr>
-          <w:rtl w:val="0"/>
-        </w:rPr>
-      </w:r>
-    </w:p>
-    <w:p>
-      <w:pPr>
-        <w:spacing w:after="240" w:before="240" w:lineRule="auto"/>
-        <w:rPr/>
-      </w:pPr>
-      <w:r>
-        <w:rPr>
-          <w:rtl w:val="0"/>
-        </w:rPr>
-        <w:t xml:space="preserve">In a first step, we zoom out to obtain a broad, encompassing view of the overall patterns revealed by our results.</w:t>
-      </w:r>
-    </w:p>
-    <w:p>
-      <w:pPr>
-        <w:rPr/>
-      </w:pPr>
-      <w:r>
-        <w:rPr>
-          <w:rtl w:val="0"/>
-        </w:rPr>
-        <w:t xml:space="preserve">When our quantitative inquiry begins in 1900, the concept of rationality had already gained prominence, in line with the rise of scientific and abstract reasoning in the late nineteenth century. The scope of rational behavior was closely tied to debates on the proper domain of economic analysis [@giocoliModeling2003]. A well-known illustration is John Stuart Mill’s </w:t>
+        <w:t xml:space="preserve">Through the Telescope: Broad Patterns on the History of Rationality {#telescope}</w:t>
+      </w:r>
+      <w:r>
+        <w:rPr>
+          <w:rtl w:val="0"/>
+        </w:rPr>
+      </w:r>
+    </w:p>
+    <w:p>
+      <w:pPr>
+        <w:rPr/>
+      </w:pPr>
+      <w:r>
+        <w:rPr>
+          <w:rtl w:val="0"/>
+        </w:rPr>
+        <w:t xml:space="preserve">When our quantitative inquiry </w:t>
+      </w:r>
+      <w:r>
+        <w:rPr>
+          <w:rtl w:val="0"/>
+        </w:rPr>
+        <w:t xml:space="preserve">begins</w:t>
+      </w:r>
+      <w:r>
+        <w:rPr>
+          <w:rtl w:val="0"/>
+        </w:rPr>
+        <w:t xml:space="preserve"> in 1900, the concept of rationality had already gained prominence, in line with the rise of scientific and abstract reasoning in the late nineteenth century. The scope of rational behavior was closely tied to debates on the proper domain of economic analysis [@giocoliModeling2003]. </w:t>
+      </w:r>
+    </w:p>
+    <w:p>
+      <w:pPr>
+        <w:rPr/>
+      </w:pPr>
+      <w:r>
+        <w:rPr>
+          <w:rtl w:val="0"/>
+        </w:rPr>
+        <w:t xml:space="preserve">With the marginalists, the economic agent was increasingly defined by calculative capacity. Jevons, for instance, portrayed the agent as a “calculating machine” balancing pleasures and pains, a view later formalized as utility maximization [@maasMechanical1999]. </w:t>
+      </w:r>
+    </w:p>
+    <w:p>
+      <w:pPr>
+        <w:rPr/>
+      </w:pPr>
+      <w:r>
+        <w:rPr>
+          <w:rtl w:val="0"/>
+        </w:rPr>
+        <w:t xml:space="preserve">In our first two decades, cluster 14 represents discussion centred on utility and brings together insights on marginal utility from, among others, Sidney. J. Chapman, Arthur Pigou, Francis Y. Edgeworth, and John M. Clark.</w:t>
+      </w:r>
+      <w:r>
+        <w:rPr>
+          <w:rtl w:val="0"/>
+        </w:rPr>
+        <w:t xml:space="preserve"> Cluster 4 also captures discussions about utility: economic theory is debated through the history of economic thought. Arguments about utility were framed as interpretations, critiques, or extensions of classical authors—most notably Mill, Ricardo or Malthus. Yet, if anything, marginal utility theory appears mostly under severe criticism in this period, especially from institutionalist economists such as Thorstein Veblen, Wesley Mitchell, John Maurice Clark, and Rexford Tugwell.</w:t>
+      </w:r>
+      <w:r>
+        <w:rPr>
+          <w:vertAlign w:val="superscript"/>
+        </w:rPr>
+        <w:footnoteReference w:customMarkFollows="0" w:id="17"/>
+      </w:r>
+      <w:r>
+        <w:rPr>
+          <w:rtl w:val="0"/>
+        </w:rPr>
+      </w:r>
+    </w:p>
+    <w:p>
+      <w:pPr>
+        <w:rPr/>
+      </w:pPr>
+      <w:r>
+        <w:rPr>
+          <w:rtl w:val="0"/>
+        </w:rPr>
+        <w:t xml:space="preserve">The criticism was directed along two main lines. First, as @giocoliModeling2003[48–50] points out, institutionalist economists rejected the “unfounded psychological underpinnings of neoclassical economics” and sought to replace them with sounder foundations [see also @yonayStruggle2001, 101-106]. They proposed instead to renew the economic method by drawing on psychology and its emerging “behaviorist” approach [@rutherfordInstitutional2001, 175–176]. Semantic cluster 9—concerned throughout the period with general methodological issues in economics—captures a significant share of sentences from 1900–1920 that articulate such institutionalist critiques. For instance, @veblenLimitations1909[622–624] attacked the “marginal-utility school” for relying on the simplistic depiction of human behavior implied by the “hedonistic calculus.” Institutionalists were energized by new developments in psychology. In his review of the literature on “Human Behavior and Economics,” Mitchell emphasized the growing interest of economists in psychological matters, which stemmed from “a somewhat tardy recognition that hedonism is unsound psychology, and that the economics of both Ricardo and Jevons originally rested on hedonistic preconceptions” [@mitchellHuman1914, 1]. For economics, the crucial issue was thus to choose “between providing a sounder psychological basis for our analysis, and holding that its psychological basis does not concern the economist” (2).</w:t>
+      </w:r>
+      <w:r>
+        <w:rPr>
+          <w:vertAlign w:val="superscript"/>
+        </w:rPr>
+        <w:footnoteReference w:customMarkFollows="0" w:id="18"/>
+      </w:r>
+      <w:r>
+        <w:rPr>
+          <w:rtl w:val="0"/>
+        </w:rPr>
+        <w:t xml:space="preserve"> Such criticism did not falter in the 1920s. In cluster 11—centered at the time on rationalisation and human reason—@tugwellHuman1922[317] encouraged economists to move beyond the “rigid classical </w:t>
       </w:r>
       <w:r>
         <w:rPr>
@@ -2040,69 +2092,24 @@
           <w:iCs w:val="1"/>
           <w:rtl w:val="0"/>
         </w:rPr>
-        <w:t xml:space="preserve">Essays on Some Unsettled Questions of Political Economy</w:t>
-      </w:r>
-      <w:r>
-        <w:rPr>
-          <w:rtl w:val="0"/>
-        </w:rPr>
-        <w:t xml:space="preserve">:</w:t>
-      </w:r>
-    </w:p>
-    <w:p>
-      <w:pPr>
-        <w:rPr/>
-      </w:pPr>
-      <w:r>
-        <w:rPr>
-          <w:rtl w:val="0"/>
-        </w:rPr>
-        <w:t xml:space="preserve">&gt; What is now commonly understood by the term "Political Economy" is not the science of speculative politics, but a branch of that science. It does not treat of the whole of man's nature as modified by the social state, nor of the whole conduct of man in society. It is concerned with him solely as a being who desires to possess wealth, and who is capable of judging of the comparative efficacy of means for obtaining that end. [@millEssays1844]</w:t>
-      </w:r>
-    </w:p>
-    <w:p>
-      <w:pPr>
-        <w:rPr/>
-      </w:pPr>
-      <w:r>
-        <w:rPr>
-          <w:rtl w:val="0"/>
-        </w:rPr>
-        <w:t xml:space="preserve">With the marginalists, the economic agent was increasingly defined by calculative capacity. Jevons portrayed the agent as a “calculating machine” balancing pleasures and pains, a view later formalized as utility maximization [@maasMechanical1999]. In our first two decades, we can indeed identify the beginning of a cluster dealing with utility (cluster 14, which disappears in the 1960s). Yet, if anything, marginal utility theory appears under severe criticism in this period, especially from institutionalist economists such as Thorstein Veblen, Wesley Mitchell, John Maurice Clark, and Rexford Tugwell.</w:t>
-      </w:r>
-      <w:r>
-        <w:rPr>
-          <w:vertAlign w:val="superscript"/>
-        </w:rPr>
-        <w:footnoteReference w:customMarkFollows="0" w:id="20"/>
-      </w:r>
-      <w:r>
-        <w:rPr>
-          <w:rtl w:val="0"/>
-        </w:rPr>
-      </w:r>
-    </w:p>
-    <w:p>
-      <w:pPr>
-        <w:rPr/>
-      </w:pPr>
-      <w:r>
-        <w:rPr>
-          <w:rtl w:val="0"/>
-        </w:rPr>
-        <w:t xml:space="preserve">The criticism was directed along two main lines. First, as @giocoliModeling2003[48–50] points out, institutionalist economists rejected the “unfounded psychological underpinnings of neoclassical economics” and sought to replace them with sounder foundations [see also @yonayStruggle2001, 101-106]. They proposed instead to renew economic method by drawing on psychology and its emerging “behaviorist” approach [@rutherfordInstitutional2001, 175–176]. Semantic cluster 9—concerned throughout the period with general methodological issues in economics—captures a significant share of sentences from 1900–1920 that articulate such institutionalist critiques. For instance, @veblenLimitations1909[622–624] attacked the “marginal-utility school” for relying on the simplistic depiction of human behavior implied by the “hedonistic calculus.” Institutionalists were energized by new developments in psychology. In his review of the literature on “Human Behavior and Economics,” Mitchell emphasized the growing interest of economists in psychological matters, which stemmed from “a somewhat tardy recognition that hedonism is unsound psychology, and that the economics of both Ricardo and Jevons originally rested on hedonistic preconceptions” [@mitchellHuman1914, 1]. For economics, the crucial issue was thus to choose “between providing a sounder psychological basis for our analysis, and holding that its psychological basis does not concern the economist” (2).</w:t>
-      </w:r>
-      <w:r>
-        <w:rPr>
-          <w:vertAlign w:val="superscript"/>
-        </w:rPr>
-        <w:footnoteReference w:customMarkFollows="0" w:id="21"/>
-      </w:r>
-      <w:r>
-        <w:rPr>
-          <w:rtl w:val="0"/>
-        </w:rPr>
-        <w:t xml:space="preserve"> Such criticism did not falter in the 1920s. In cluster 11—centered at the time on rationalisation and human reason—@tugwellHuman1922[317] encouraged economists to move beyond the “rigid classical </w:t>
+        <w:t xml:space="preserve">homo economicus</w:t>
+      </w:r>
+      <w:r>
+        <w:rPr>
+          <w:rtl w:val="0"/>
+        </w:rPr>
+        <w:t xml:space="preserve">” and noted that “psychologists have already pretty well revolutionized the scientific definition of human nature.”</w:t>
+      </w:r>
+    </w:p>
+    <w:p>
+      <w:pPr>
+        <w:rPr/>
+      </w:pPr>
+      <w:r>
+        <w:rPr>
+          <w:rtl w:val="0"/>
+        </w:rPr>
+        <w:t xml:space="preserve">Second, for institutionalist economists, institutions were indispensable for understanding economic behavior, and different institutions implied different behaviors; there was no single, context-independent </w:t>
       </w:r>
       <w:r>
         <w:rPr>
@@ -2110,24 +2117,98 @@
           <w:iCs w:val="1"/>
           <w:rtl w:val="0"/>
         </w:rPr>
-        <w:t xml:space="preserve">homo economicus</w:t>
-      </w:r>
-      <w:r>
-        <w:rPr>
-          <w:rtl w:val="0"/>
-        </w:rPr>
-        <w:t xml:space="preserve">” and noted that “psychologists have already pretty well revolutionized the scientific definition of human nature.”</w:t>
-      </w:r>
-    </w:p>
-    <w:p>
-      <w:pPr>
-        <w:rPr/>
-      </w:pPr>
-      <w:r>
-        <w:rPr>
-          <w:rtl w:val="0"/>
-        </w:rPr>
-        <w:t xml:space="preserve">Second, for institutionalist economists, institutions were indispensable for understanding economic behavior, and different institutions implied different behaviors; there was no single, context-independent </w:t>
+        <w:t xml:space="preserve">homo oeconomicus</w:t>
+      </w:r>
+      <w:r>
+        <w:rPr>
+          <w:rtl w:val="0"/>
+        </w:rPr>
+        <w:t xml:space="preserve">. In cluster 9, @veblenLimitations1909[620] again argued against the “statical character” of marginal-utility theory, which offered “no theory of a movement of any kind,” being occupied solely with “the adjustment of values to a given situation.” Similarly, E. H. @downeyFutility1910[253], in the cluster 14, claimed that “Marginal-utility economics has nothing to say of the genesis, growth, or current working of economic institutions” [see also @rutherfordInstitutionalist2013, 141]. Its “deliverances,” he argued, were therefore “futile for the problem of social betterment,” since such “betterment” concerned the adjustment of institutions to changing circumstances and ideals. In the early twentieth century, economic behavior, according to institutionalists, had to be understood through the prism of the “pecuniary institutions” that shaped it. For instance, Charles Cooley [@cooleyProgress1915] underlined that “pecuniary valuation,” or economic valuation, is only possible because of the institutions that make such valuation possible [see also @rutherfordInstitutionalist2013, 58–59]. Figure @fig-co-occurence shows well the importance of “pecuniary” as a neighbor to “rational” and “rationality” in the first twenty years of the twentieth century.</w:t>
+      </w:r>
+    </w:p>
+    <w:p>
+      <w:pPr>
+        <w:rPr/>
+      </w:pPr>
+      <w:r>
+        <w:rPr>
+          <w:rtl w:val="0"/>
+        </w:rPr>
+        <w:t xml:space="preserve">The centrality of institutionalist economists—as well as the prominence of U.S. journals in our corpus—is visible in the scope of the semantic clusters in the first periods: sentences related to rationality, in addition to the clusters already mentioned, were grouped into themes related to the railway industry (semantic cluster 8), progressive taxation (cluster 17), tariffs and commercial policy in the United States (cluster 8 again and part of cluster 2), or agriculture (cluster 13). </w:t>
+      </w:r>
+      <w:r>
+        <w:rPr>
+          <w:rtl w:val="0"/>
+        </w:rPr>
+        <w:t xml:space="preserve">In line with institutionalism, most of these economists examined these themes through the laws and rules governing economic activity, focusing on how institutions structure the behaviour and interests of collective actors rather than on abstract individual assumptions. In these clusters, “rationality” is rarely mentioned explicitly, even if we find discussions on the behavior of “business men” (cluster 12), “workmen” (cluster 8) or “owners of land” and “farmers” (cluster 13). </w:t>
+      </w:r>
+      <w:r>
+        <w:rPr>
+          <w:rtl w:val="0"/>
+        </w:rPr>
+        <w:t xml:space="preserve">  These clusters gradually decline in importance, and most of them disappear in the postwar period. Indeed, the period from 1930 to 1959 displays substantial transformations in the structure of debates concerning rationality.</w:t>
+      </w:r>
+    </w:p>
+    <w:p>
+      <w:pPr>
+        <w:rPr/>
+      </w:pPr>
+      <w:r>
+        <w:rPr>
+          <w:rtl w:val="0"/>
+        </w:rPr>
+        <w:t xml:space="preserve">The most obvious transformations are those described by @giocoliModeling2003 as “the escape from psychology” and, more generally, the shift from a “system-of-forces”—“economic processes generated by market and non-market forces”—to a “system-of-relations,” in which the aim becomes to establish the existence and properties of equilibria through the “validation and mutual consistency of given formal conditions” [@giocoliModeling2003, 4–5]. “Rationality” was progressively distinguished from “reason” or “intelligence” and recast as a formal, axiomatic notion—“rigid rules that determine unique solutions” [@ericksonHow2013; see also @klaesConceptual2005].</w:t>
+      </w:r>
+    </w:p>
+    <w:p>
+      <w:pPr>
+        <w:rPr/>
+      </w:pPr>
+      <w:r>
+        <w:rPr>
+          <w:rtl w:val="0"/>
+        </w:rPr>
+        <w:t xml:space="preserve">While cluster 14 (on utility) constituted only a tiny share of sentences between 1900 and 1919, and was absent in the 1920s, it gains importance in the 1930s to the 1950s (though still representing less than 5% of all sentences). During this period, the heart of the debate concerned the measurability of utility and the opposition between “cardinal” and “ordinal” utility. In the 1930s, the debate still bore on the psychological dimension of utility measurement. In 1933, John Hicks and Roy Allen [-@hicksReconsideration1934] coauthored an article on demand analysis that eliminated marginal utility by appealing to the concept of the marginal rate of substitution—the slope of the indifference curve [see @moscatiMeasuring2019, 98–100]. Already in 1932, Allen had made this project explicit: by starting from “preferential discrimination,” or individuals’ preferences over different bundles of goods, it becomes unnecessary to “make any assumption about the existence of ‘total utility’ or about the measurability of ‘utility’; the hedonistic hypothesis has been rendered superfluous” [@allenFoundations1932, 207]. In other words, “Subjective and psychological concepts have been discarded from pure economic theory” (ibid.).</w:t>
+      </w:r>
+    </w:p>
+    <w:p>
+      <w:pPr>
+        <w:rPr/>
+      </w:pPr>
+      <w:r>
+        <w:rPr>
+          <w:rtl w:val="0"/>
+        </w:rPr>
+        <w:t xml:space="preserve">Yet this position was not uncontested. Indeed, </w:t>
+      </w:r>
+      <w:r>
+        <w:rPr>
+          <w:rtl w:val="0"/>
+        </w:rPr>
+        <w:t xml:space="preserve">in these debates, terms such as “introspection,” “satisfaction(s),” and “pleasure” recur frequently in the cluster during the 1930s and 1940s [see for instance </w:t>
+      </w:r>
+      <w:r>
+        <w:rPr>
+          <w:rtl w:val="0"/>
+        </w:rPr>
+        <w:t xml:space="preserve">@armstrongDeterminateness1939]</w:t>
+      </w:r>
+      <w:r>
+        <w:rPr>
+          <w:rtl w:val="0"/>
+        </w:rPr>
+        <w:t xml:space="preserve">. But they disappear from the top identifying words in the 1950s. During this period, debates on ordinal versus cardinal utility continued—with a renewed defense of the cardinalist position and ongoing disputes about the very meaning of “measuring utility” [@moscatiMeasuring2019, chapter 10]—yet these discussions had largely emancipated themselves from psychological or behaviorist considerations. These debates are also associated with a new cluster (cluster 5), which appears in the 1940s and grows substantially (to nearly 8% of all sentences) in the 1950s. This cluster concerns the formalization of agents’ preferences and choices. Here, we encounter what would become the standard vocabulary of decision theory: “individual orderings,” “preferences,” “decisions,” “transitive,” etc., and @vonneumannTheory1944, @friedmanUtility1948, and @savageFoundations1954 appear as the most cited references in the core articles of the cluster.  To complete this panorama, a game-theory cluster emerges in the 1950s, which ultimately comes to represent nearly 15% of all sentences after 1990.</w:t>
+      </w:r>
+    </w:p>
+    <w:p>
+      <w:pPr>
+        <w:rPr/>
+      </w:pPr>
+      <w:r>
+        <w:rPr>
+          <w:rtl w:val="0"/>
+        </w:rPr>
+        <w:t xml:space="preserve">Transformations in the conception of rationality are also visible through clusters that remain thematically stable over time, yet reflect profound shifts in the discipline’s methodology and the growing centrality of rational choice theory</w:t>
       </w:r>
       <w:r>
         <w:rPr>
@@ -2135,57 +2216,48 @@
           <w:iCs w:val="1"/>
           <w:rtl w:val="0"/>
         </w:rPr>
-        <w:t xml:space="preserve">homo oeconomicus</w:t>
-      </w:r>
-      <w:r>
-        <w:rPr>
-          <w:rtl w:val="0"/>
-        </w:rPr>
-        <w:t xml:space="preserve">. In cluster 9, @veblenLimitations1909[620] again argued against the “statical character” of marginal-utility theory, which offered “no theory of a movement of any kind,” being occupied solely with “the adjustment of values to a given situation.” Similarly, E. H. @downeyFutility1910[253], in the cluster 14, claimed that “Marginal-utility economics has nothing to say of the genesis, growth, or current working of economic institutions” [see also @rutherfordInstitutionalist2013, 141]. Its “deliverances,” he argued, were therefore “futile for the problem of social betterment,” since such “betterment” concerned the adjustment of institutions to changing circumstances and ideals. In the early twentieth century, economic behavior, according to institutionalists, had to be understood through the prism of the “pecuniary institutions” that shaped it. For instance, Charles Cooley [@cooleyProgress1915] underlined that “pecuniary valuation,” or economic valuation, is only possible because of the institutions that make such valuation possible [see also @rutherfordInstitutionalist2013, 58–59]. Figure @fig-co-occurence shows well the importance of “pecuniary” as a neighbor to “rational” and “rationality” in the first twenty years of the twentieth century.</w:t>
-      </w:r>
-    </w:p>
-    <w:p>
-      <w:pPr>
-        <w:rPr/>
-      </w:pPr>
-      <w:r>
-        <w:rPr>
-          <w:rtl w:val="0"/>
-        </w:rPr>
-        <w:t xml:space="preserve">The centrality of institutionalist economists—as well as the prominence of U.S. journals in our corpus—is visible in the scope of the semantic clusters in the first periods: sentences related to rationality, in addition to the clusters already mentioned, were grouped into themes related to the railway industry (semantic cluster 8), progressive taxation (cluster 17), tariffs and commercial policy in the United States (cluster 8 again or part of cluster 2), and agricultural issues (cluster 13). These clusters gradually decline in importance, and most of them disappear in the postwar period. Indeed, the period from 1930 to 1959 displays substantial transformations in the structure of debates concerning rationality.</w:t>
-      </w:r>
-    </w:p>
-    <w:p>
-      <w:pPr>
-        <w:rPr/>
-      </w:pPr>
-      <w:r>
-        <w:rPr>
-          <w:rtl w:val="0"/>
-        </w:rPr>
-        <w:t xml:space="preserve">The most obvious transformations are those described by @giocoliModeling2003 as “the escape from psychology” and, more generally, the shift from a “system-of-forces”—“economic processes generated by market and non-market forces”—to a “system-of-relations,” in which the aim becomes to establish the existence and properties of equilibria through the “validation and mutual consistency of given formal conditions” [@giocoliModeling2003, 4–5]. “Rationality” was progressively distinguished from “reason” or “intelligence” and recast as a formal, axiomatic notion—“rigid rules that determine unique solutions” [@ericksonHow2013; see also @klaesConceptual2005].</w:t>
-      </w:r>
-    </w:p>
-    <w:p>
-      <w:pPr>
-        <w:rPr/>
-      </w:pPr>
-      <w:r>
-        <w:rPr>
-          <w:rtl w:val="0"/>
-        </w:rPr>
-        <w:t xml:space="preserve">While cluster 14 (on utility) constituted only a tiny share of sentences between 1900 and 1919, and was absent in the 1920s, it gains importance in the 1930s to the 1950s (though still representing less than 5% of all sentences). During this period, the heart of the debate concerned the measurability of utility and the opposition between “cardinal” and “ordinal” utility. In the 1930s, the debate still bore on the psychological dimension of utility measurement. In 1933, John Hicks and Roy Allen [-@hicksReconsideration1934] coauthored an article on demand analysis that eliminated marginal utility by appealing to the concept of the marginal rate of substitution—the slope of the indifference curve [see @moscatiMeasuring2019, 98–100]. Already in 1932, Allen had made this project explicit: by starting from “preferential discrimination,” or individuals’ preferences over different bundles of goods, it becomes unnecessary to “make any assumption about the existence of ‘total utility’ or about the measurability of ‘utility’; the hedonistic hypothesis has been rendered superfluous” [@allenFoundations1932, 207]. In other words, “Subjective and psychological concepts have been discarded from pure economic theory” (ibid.).</w:t>
-      </w:r>
-    </w:p>
-    <w:p>
-      <w:pPr>
-        <w:rPr/>
-      </w:pPr>
-      <w:r>
-        <w:rPr>
-          <w:rtl w:val="0"/>
-        </w:rPr>
-        <w:t xml:space="preserve">Yet this position was not uncontested. Wallace Edwin Armstrong, a Cambridge anthropologist turned economist [@gregoryArmstrong2018], defended the measurability of utility in the </w:t>
+        <w:t xml:space="preserve">.</w:t>
+      </w:r>
+      <w:r>
+        <w:rPr>
+          <w:rtl w:val="0"/>
+        </w:rPr>
+        <w:t xml:space="preserve"> Semantic cluster 12, for instance, which spans the period from 1900 to 1979, deals with firms and entrepreneurs. In the 1920s, the cluster emphasizes entrepreneurial decision-making, understood primarily as prudence facing uncertainty rather than formal optimization. From the 1940s, this cluster increasingly centers on “profit maximization.” The cluster captures the core of the so-called “marginalist controversy” [@backhouseFriedmans2009], notably through </w:t>
+      </w:r>
+      <w:r>
+        <w:rPr>
+          <w:rtl w:val="0"/>
+        </w:rPr>
+        <w:t xml:space="preserve">Richard Lester’s attack on marginal theory and</w:t>
+      </w:r>
+      <w:r>
+        <w:rPr>
+          <w:rtl w:val="0"/>
+        </w:rPr>
+        <w:t xml:space="preserve"> Fritz Machlup’s [-@machlupMarginal1946] response. Machlup mounted a defense of profit maximization and, more broadly, of marginalist theory. He rejected the evidential value of Lester’s questionnaire-based surveys of entrepreneurs, while Lester replied that “at the heart of economic theory should be an adequate analysis and understanding of the psychology, policies, and practices of business management in modern industry” [@lesterMarginalism1947, 146].</w:t>
+      </w:r>
+      <w:r>
+        <w:rPr>
+          <w:vertAlign w:val="superscript"/>
+        </w:rPr>
+        <w:footnoteReference w:customMarkFollows="0" w:id="19"/>
+      </w:r>
+      <w:r>
+        <w:rPr>
+          <w:rtl w:val="0"/>
+        </w:rPr>
+        <w:t xml:space="preserve"> The marginalist controversy more generally provided a key intellectual background for Friedman’s essay on positive economics [-@friedmanMethodology1953], in which he formulated the famous “as if” principle to justify, among other assumptions, profit maximization. Interestingly, in the 1950s the most cited articles within cluster 12 were Machlup’s [-@machlupMarginal1946] and Friedman’s [@friedmanUtility1948], both of which relied heavily on “as if” reasoning, notably to justify the assumption of expected utility.</w:t>
+      </w:r>
+    </w:p>
+    <w:p>
+      <w:pPr>
+        <w:rPr/>
+      </w:pPr>
+      <w:r>
+        <w:rPr>
+          <w:rtl w:val="0"/>
+        </w:rPr>
+        <w:t xml:space="preserve">Shifts in the discipline’s methodology are also captured by semantic cluster 9, which gathers sentences in which authors reflect on their own methodological choices</w:t>
       </w:r>
       <w:r>
         <w:rPr>
@@ -2193,85 +2265,35 @@
           <w:iCs w:val="1"/>
           <w:rtl w:val="0"/>
         </w:rPr>
-        <w:t xml:space="preserve">Economic Journal</w:t>
-      </w:r>
-      <w:r>
-        <w:rPr>
-          <w:rtl w:val="0"/>
-        </w:rPr>
-        <w:t xml:space="preserve"> on the basis of introspection. He argued that if it were possible to observe “by introspection the fact that I prefer A to B more strongly than I prefer A to C,” this would constitute sufficient grounds for assuming a determinate utility function and employing the marginal-utility concept [@armstrongDeterminateness1939, 462].</w:t>
-      </w:r>
-      <w:r>
-        <w:rPr>
-          <w:rtl w:val="0"/>
-        </w:rPr>
-      </w:r>
-    </w:p>
-    <w:p>
-      <w:pPr>
-        <w:rPr/>
-      </w:pPr>
-      <w:r>
-        <w:rPr>
-          <w:rtl w:val="0"/>
-        </w:rPr>
-        <w:t xml:space="preserve">In these debates, terms such as “introspection,” “satisfaction(s),” and “pleasure” recur frequently in the cluster during the 1930s and 1940s. But they disappear from the top identifying words in the 1950s. During this period, debates on ordinal versus cardinal utility continued—with a renewed defense of the cardinalist position and ongoing disputes about the very meaning of “measuring utility” [@moscatiMeasuring2019, chapter 10]—yet these discussions had largely emancipated themselves from psychological or behaviorist considerations. These debates are also associated with a new cluster (cluster 5), which appears in the 1940s and grows substantially (to nearly 8% of all sentences) in the 1950s. This cluster concerns the formalization of agents’ preferences and choices. Here, we encounter what would become the standard vocabulary of decision theory: “individual orderings,” “preferences,” “decisions,” “transitive,” etc., and @vonneumannTheory1944, @friedmanUtility1948, and @savageFoundations1954 appear as the most cited references in the core articles of the cluster.  To complete this panorama, another cluster emerges in the 1950s: the game-theory cluster, which ultimately comes to represent nearly 15% of all sentences after 1990.</w:t>
-      </w:r>
-    </w:p>
-    <w:p>
-      <w:pPr>
-        <w:rPr/>
-      </w:pPr>
-      <w:r>
-        <w:rPr>
-          <w:rtl w:val="0"/>
-        </w:rPr>
-        <w:t xml:space="preserve">Such transformations of rationality in economics are also visible through changing considerations of the proper methods of the discipline. Semantic cluster 12, which spans the period from 1900 to 1979, deals with firms, profits, and entrepreneurs. After 1940, it becomes clear that this cluster increasingly centers on “profit maximization.” In the 1940s, the cluster captures the core of the so-called “marginalist controversy” [@backhouseFriedmans2009], notably through Fritz Machlup’s response to Richard Lester’s attack on marginal theory, particularly as applied to firms’ behavior [-@machlupMarginal1946]. Machlup mounted a defense of profit maximization and, more broadly, of marginalist theory. He rejected the evidential value of Lester’s questionnaire-based surveys of entrepreneurs, while Lester replied that “at the heart of economic theory should be an adequate analysis and understanding of the psychology, policies, and practices of business management in modern industry” [@lesterMarginalism1947, 146].</w:t>
-      </w:r>
-    </w:p>
-    <w:p>
-      <w:pPr>
-        <w:rPr/>
-      </w:pPr>
-      <w:r>
-        <w:rPr>
-          <w:rtl w:val="0"/>
-        </w:rPr>
-        <w:t xml:space="preserve">Machlup’s position was that even if a “goodly portion of all business behavior may be non-rational, thoughtless, [or] blindly repetitive” [-@machlupMarginal1946, 520], questionnaire evidence and empirical findings more generally did not demonstrate the failure of marginal theory when properly interpreted. In a similar defense of profit maximization, Leonid Hurwicz first acknowledged that it was not “inconceivable that business is run more by routine than by rationality” [@hurwiczTheory1946, 110], but argued that behavior may appear irrational or merely “routine” from the standpoint of a purely static theory that ignores uncertainty, while proving fully “rational” once uncertainty and long-run effects are taken into account. Although Hurwicz’s article called for further empirical work to improve the theory of the firm [@herfeldTheories2018], the marginalist controversy more generally provided a key intellectual background for Friedman’s essay on positive economics [-@friedmanMethodology1953], in which he formulated the famous “as if” principle to justify, among other assumptions, profit maximization. Interestingly, in the 1950s the most cited articles within cluster 12 were Machlup’s [-@machlupMarginal1946] and Friedman’s [@friedmanUtility1948], both of which relied heavily on “as if” reasoning, notably to justify the assumption of expected utility.</w:t>
-      </w:r>
-    </w:p>
-    <w:p>
-      <w:pPr>
-        <w:rPr/>
-      </w:pPr>
-      <w:r>
-        <w:rPr>
-          <w:rtl w:val="0"/>
-        </w:rPr>
-        <w:t xml:space="preserve">Finally, a quick look at semantic cluster 9, centered on the methodology of economics, provides further clues about the changing status of debates on rationality after the 1930s. While in the 1920s and 1930s economists still dealt with “human nature,” “passions,” or “prejudices,” terms such as “logical implications” and “assumptions”—and, after the 1970s, “model” and “optimal”—became increasingly central.</w:t>
-      </w:r>
-    </w:p>
-    <w:p>
-      <w:pPr>
-        <w:rPr/>
-      </w:pPr>
-      <w:r>
-        <w:rPr>
-          <w:rtl w:val="0"/>
-        </w:rPr>
-        <w:t xml:space="preserve">It thus becomes clear that by the 1950s the conception of rationality had been profoundly transformed, moving in a more formal direction and largely emancipated from psychology.</w:t>
-      </w:r>
-      <w:r>
-        <w:rPr>
-          <w:vertAlign w:val="superscript"/>
-        </w:rPr>
-        <w:footnoteReference w:customMarkFollows="0" w:id="22"/>
-      </w:r>
-      <w:r>
-        <w:rPr>
-          <w:rtl w:val="0"/>
-        </w:rPr>
-        <w:t xml:space="preserve"> Another transformation also deserves emphasis: as rationality was recast in terms of consistent choice rather than as a psychological portrait of </w:t>
+        <w:t xml:space="preserve">.</w:t>
+      </w:r>
+      <w:r>
+        <w:rPr>
+          <w:rtl w:val="0"/>
+        </w:rPr>
+        <w:t xml:space="preserve"> </w:t>
+      </w:r>
+      <w:r>
+        <w:rPr>
+          <w:rtl w:val="0"/>
+        </w:rPr>
+        <w:t xml:space="preserve">While in the 1920s and 1930s economists still engaged with notions such as “human nature,” “passions,” or “prejudices,” the postwar period saw the growing prominence of terms such as “logical implications” and “assumptions,” followed, from the 1970s onward, by an increasing focus on “models” and “optimality.”</w:t>
+      </w:r>
+      <w:r>
+        <w:rPr>
+          <w:rtl w:val="0"/>
+        </w:rPr>
+      </w:r>
+    </w:p>
+    <w:p>
+      <w:pPr>
+        <w:rPr/>
+      </w:pPr>
+      <w:r>
+        <w:rPr>
+          <w:rtl w:val="0"/>
+        </w:rPr>
+        <w:t xml:space="preserve">It thus becomes clear that by the 1950s the conception of rationality had been profoundly transformed, moving in a more formal direction and largely emancipated from psychology. Another transformation also deserves emphasis: as rationality was recast in terms of consistent choice rather than as a psychological portrait of </w:t>
       </w:r>
       <w:r>
         <w:rPr>
@@ -2296,30 +2318,24 @@
         <w:rPr>
           <w:rtl w:val="0"/>
         </w:rPr>
-        <w:t xml:space="preserve">This shift is first observable in semantic cluster 11 on rationality, which in the 1930s focused on the concept—relatively neglected in the history of economic thought—of “rationalization.” In a review of the literature on the topic, Robert Brady [@bradyMeaning1932, 526] remarked that “scarcely any term… has occasioned more discussion and dispute.” The concept referred to “every technique, program, or plan of organization which promised to promote (…) the ‘efficiency’ of individual enterprises, entire industries, or even the total of economic processes nationally or internationally considered.” Attention to “rationalisation” is also visible in cluster 13, devoted to agricultural economics and the rise of “farm management.” It becomes even more pronounced, however, with the multiplication of debates on economic planning and the rationalization of policy decisions from the 1940s onward, particularly in cluster 8.</w:t>
-      </w:r>
-    </w:p>
-    <w:p>
-      <w:pPr>
-        <w:rPr/>
-      </w:pPr>
-      <w:r>
-        <w:rPr>
-          <w:rtl w:val="0"/>
-        </w:rPr>
-        <w:t xml:space="preserve">Cluster 5 further exemplifies the emergence of this social dimension of rationality, in which “human decision” is linked to rational “decision making” not only for individuals but also for firms and public policy. It is also in this cluster that issues of social choice emerge, notably debates on the implications of Arrow’s impossibility theorem [-@arrowSocial1951; see e.g. @igersheimDeath2019].</w:t>
-      </w:r>
-      <w:r>
-        <w:rPr>
-          <w:vertAlign w:val="superscript"/>
-        </w:rPr>
-        <w:footnoteReference w:customMarkFollows="0" w:id="23"/>
-      </w:r>
-      <w:r>
-        <w:rPr>
-          <w:rtl w:val="0"/>
-        </w:rPr>
-        <w:t xml:space="preserve"> Arrow’s contribution also stimulated the formation of cluster 16 in the 1960s, where it appears as the primary reference, alongside works by @downsEconomic1957 and @buchananCalculus1962. This cluster is centered on “voting” and “majority decision” and is closely associated with publications by </w:t>
+        <w:t xml:space="preserve">T</w:t>
+      </w:r>
+      <w:r>
+        <w:rPr>
+          <w:rtl w:val="0"/>
+        </w:rPr>
+        <w:t xml:space="preserve">he emergence of this social dimension of rationality is already observable in the interwar period. In the 1930s, cluster 11 focused on the concept—relatively neglected in the history of economic thought—of “rationalization.” In a literature review on this concept, Robert Brady [@bradyMeaning1932, 526] remarked that “scarcely any term… has occasioned more discussion and dispute.” The concept referred to “every technique, program, or plan of organization which promised to promote (…) the ‘efficiency’ of individual enterprises, entire industries, or even the total of economic processes nationally or internationally considered.” Attention to “rationalisation” is also visible in cluster 13, devoted to agricultural economics and the rise of “farm management” aimed at improving farmers’ living conditions. It becomes even more pronounced with the multiplication of debates on economic planning and the rationalization of policy decisions from the 1940s onward, particularly in cluster 8.</w:t>
+      </w:r>
+    </w:p>
+    <w:p>
+      <w:pPr>
+        <w:rPr/>
+      </w:pPr>
+      <w:r>
+        <w:rPr>
+          <w:rtl w:val="0"/>
+        </w:rPr>
+        <w:t xml:space="preserve">As rationality increasingly came to be framed through modern microeconomics, the concept was extended to both individual and collective choice.</w:t>
       </w:r>
       <w:r>
         <w:rPr>
@@ -2327,25 +2343,57 @@
           <w:iCs w:val="1"/>
           <w:rtl w:val="0"/>
         </w:rPr>
+        <w:t xml:space="preserve"> </w:t>
+      </w:r>
+      <w:r>
+        <w:rPr>
+          <w:rtl w:val="0"/>
+        </w:rPr>
+        <w:t xml:space="preserve">In semantic c</w:t>
+      </w:r>
+      <w:r>
+        <w:rPr>
+          <w:rtl w:val="0"/>
+        </w:rPr>
+        <w:t xml:space="preserve">luster 5—gathering sentences on decision theory—the  rational “decision making” is not applied not only for individuals but also for firms and public policy. It is also in this cluster that issues of social choice emerge, notably debates on the implications of Arrow’s impossibility theorem [-@arrowSocial1951; see e.g. @igersheimDeath2019].</w:t>
+      </w:r>
+      <w:r>
+        <w:rPr>
+          <w:vertAlign w:val="superscript"/>
+        </w:rPr>
+        <w:footnoteReference w:customMarkFollows="0" w:id="20"/>
+      </w:r>
+      <w:r>
+        <w:rPr>
+          <w:rtl w:val="0"/>
+        </w:rPr>
+        <w:t xml:space="preserve"> Arrow’s contribution also stimulated the formation of cluster 16 on law and economics in the 1960s, where it appears as the primary reference, alongside works by @downsEconomic1957 and @buchananCalculus1962. This cluster is closely associated with publications by </w:t>
+      </w:r>
+      <w:r>
+        <w:rPr>
+          <w:i w:val="1"/>
+          <w:iCs w:val="1"/>
+          <w:rtl w:val="0"/>
+        </w:rPr>
         <w:t xml:space="preserve">Public Choice</w:t>
       </w:r>
       <w:r>
         <w:rPr>
           <w:rtl w:val="0"/>
         </w:rPr>
-        <w:t xml:space="preserve"> [see @cherrierEconomists2017].</w:t>
-      </w:r>
-    </w:p>
-    <w:p>
-      <w:pPr>
-        <w:rPr/>
-      </w:pPr>
+        <w:t xml:space="preserve"> [see @cherrierEconomists2017]. </w:t>
+      </w:r>
       <w:r>
         <w:rPr>
           <w:rtl w:val="0"/>
         </w:rPr>
         <w:t xml:space="preserve">Welfare economics and public choice, as well as public finance [@desmarais-tremblayPublic2023], are also clearly visible in the bibliometric analysis after 1960. Indeed, one of the major bibliometric communities of the 1960s is organized around public goods and externalities, with James Buchanan, Ronald Coase, and Richard Musgrave as central references. The prominence of public finance increases further in subsequent decades, with the appearance of another community devoted to optimal taxation after 1968; taken together, these two communities account for nearly one fifth of the entire network in this period.</w:t>
       </w:r>
+      <w:r>
+        <w:rPr>
+          <w:rtl w:val="0"/>
+        </w:rPr>
+      </w:r>
     </w:p>
     <w:p>
       <w:pPr>
@@ -2363,22 +2411,17 @@
         </w:rPr>
         <w:t xml:space="preserve"> </w:t>
       </w:r>
-    </w:p>
-    <w:p>
-      <w:pPr>
-        <w:rPr/>
-      </w:pPr>
-      <w:r>
-        <w:rPr>
-          <w:rtl w:val="0"/>
-        </w:rPr>
-        <w:t xml:space="preserve">The concept has an early history: it was developed by @muthRational1961 in the context of price movements in agriculture and later popularized when Carnegie colleagues—Robert E. Lucas, Edward C. Prescott, and Thomas J. Sargent—applied it to macroeconomics [@lucasExpectations1972; @sargentRational1973]. Rational expectations became central in the early 1970s and quickly controversial in debates over monetary and fiscal policy [see, e.g., @sargentwallace1975]. By the late 1970s, it had circulated beyond academia into policy circles and the press and was often described as a “rational expectations revolution” [@duarteRise2025]. Our methods help account for this rapid diffusion beyond controversial policy debates during the stagflation era. First, the results show no significant trace of rational expectations in the 1960s in either the bibliometric or textual outputs.</w:t>
+      <w:r>
+        <w:rPr>
+          <w:rtl w:val="0"/>
+        </w:rPr>
+        <w:t xml:space="preserve">The concept was developed by @muthRational1961 but only later popularized when Carnegie colleagues—Robert E. Lucas, Edward C. Prescott, and Thomas J. Sargent—applied it to macroeconomics [@lucasExpectations1972; @sargentRational1973]. By the late 1970s, it had circulated beyond academia into policy circles and the press and was often described as a “rational expectations revolution” [@duarteRise2025]. Our methods help account for this rapid diffusion beyond controversial policy debates during the stagflation era. First, the results show no significant trace of rational expectations in the 1960s in either the bibliometric or textual outputs.</w:t>
       </w:r>
       <w:r>
         <w:rPr>
           <w:vertAlign w:val="superscript"/>
         </w:rPr>
-        <w:footnoteReference w:customMarkFollows="0" w:id="24"/>
+        <w:footnoteReference w:customMarkFollows="0" w:id="21"/>
       </w:r>
       <w:r>
         <w:rPr>
@@ -2395,29 +2438,156 @@
         <w:rPr>
           <w:rtl w:val="0"/>
         </w:rPr>
-        <w:t xml:space="preserve">A similar trajectory to macroeconomics can also be observed in finance. The origins of financial issues can be traced to semantic cluster 3, which appears from the outset and is initially centered on returns on capital. After the 1940s, this cluster still represents a relatively small share of sentences (around 4%) but now focuses on investment decisions; during this period, @shackleTheory1942 on investment under uncertainty is among the most representative articles. After the 1960s, cluster 3 becomes much more prominent, consistently accounting for more than 10% of all sentences, with “portfolio,” “risk,” “arbitrage,” and “capital asset pricing” becoming standard vocabulary.</w:t>
-      </w:r>
-    </w:p>
-    <w:p>
-      <w:pPr>
-        <w:rPr/>
-      </w:pPr>
-      <w:r>
-        <w:rPr>
-          <w:rtl w:val="0"/>
-        </w:rPr>
-        <w:t xml:space="preserve">Interestingly, we also observe increasing proximities between the finance literature and the rational-expectations framework from the mid-1970s onward. This is particularly visible in the bibliometric community labeled “Rational Expectations and Market Information,” which emerges in the 1976–1983 window. At its core lies the problem of imperfect information, with @rothschildEquilibrium1976 as a key reference. Another central contribution is @grossmanImpossibility1980, which draws on Lucas’s imperfect-information framework [@lucasExpectations1972] and combines rational expectations with noisy signals to question market efficiency [see @delceyEfficient2023].</w:t>
-      </w:r>
-    </w:p>
-    <w:p>
-      <w:pPr>
-        <w:rPr/>
-      </w:pPr>
-      <w:r>
-        <w:rPr>
-          <w:rtl w:val="0"/>
-        </w:rPr>
-        <w:t xml:space="preserve">The 1970s and 1980s thus marked a relative dominance of macroeconomics and finance, with comparatively less weight given to debates on individual rationality. This situation begins to change gradually from the 1980s onward. In the 1979–1986 bibliometric network, a “Behavioral Decision Theory” community appears (representing around 2% of the network), capturing the early emergence of behavioral economics as promoted by Kahneman and Tversky. In the 1990s, the rise of behavioral economics—together with new approaches in game theory—fundamentally altered this configuration, leading to more specialized investigations of individual rationality, which now dominate and are distributed across multiple bibliometric communities. This transformation represents not merely a shift in research topics, but a profound reframing of how economics approaches rationality: from an assumption embedded in aggregate models to an object of direct investigation at the individual level.</w:t>
+        <w:t xml:space="preserve">A similar trajectory to macroeconomics can also be observed in finance. The origins of financial issues can be traced to semantic cluster 3 which focused initially on the theory of investment. Until the 1930s, the issue was framed around the returns of capital. For instance, the cluster includes the so-called Hayek-Knight controversy on the conception of capital [@</w:t>
+      </w:r>
+      <w:r>
+        <w:rPr>
+          <w:rtl w:val="0"/>
+        </w:rPr>
+        <w:t xml:space="preserve">CohenHayek2003]. After the 1940s, decision-making under uncertainty becomes a central theme, crystallized by works such as @shackleTheory1942 on investment under radical uncertainty, which figures among the most representative articles.</w:t>
+      </w:r>
+      <w:r>
+        <w:rPr>
+          <w:rtl w:val="0"/>
+        </w:rPr>
+        <w:t xml:space="preserve"> One decade later, Jack @hirshleiferInvestment1958 </w:t>
+      </w:r>
+      <w:r>
+        <w:rPr>
+          <w:rtl w:val="0"/>
+        </w:rPr>
+        <w:t xml:space="preserve">inscribed</w:t>
+      </w:r>
+      <w:r>
+        <w:rPr>
+          <w:rtl w:val="0"/>
+        </w:rPr>
+        <w:t xml:space="preserve"> investment theory within the rising neoclassical conception of rationality, </w:t>
+      </w:r>
+      <w:r>
+        <w:rPr>
+          <w:rtl w:val="0"/>
+        </w:rPr>
+        <w:t xml:space="preserve">by formalizing investment decisions as a problem of intertemporal maximization of consumption</w:t>
+      </w:r>
+      <w:r>
+        <w:rPr>
+          <w:i w:val="1"/>
+          <w:iCs w:val="1"/>
+          <w:rtl w:val="0"/>
+        </w:rPr>
+        <w:t xml:space="preserve">. </w:t>
+      </w:r>
+      <w:r>
+        <w:rPr>
+          <w:rtl w:val="0"/>
+        </w:rPr>
+        <w:t xml:space="preserve">In the same vein, the Modigliani–Miller theorem [@ModiglianiCost1958] further consolidated this shift by </w:t>
+      </w:r>
+      <w:r>
+        <w:rPr>
+          <w:rtl w:val="0"/>
+        </w:rPr>
+        <w:t xml:space="preserve">grounding</w:t>
+      </w:r>
+      <w:r>
+        <w:rPr>
+          <w:rtl w:val="0"/>
+        </w:rPr>
+        <w:t xml:space="preserve"> firm financial </w:t>
+      </w:r>
+      <w:r>
+        <w:rPr>
+          <w:rtl w:val="0"/>
+        </w:rPr>
+        <w:t xml:space="preserve">decisions</w:t>
+      </w:r>
+      <w:r>
+        <w:rPr>
+          <w:rtl w:val="0"/>
+        </w:rPr>
+        <w:t xml:space="preserve"> as an arbitrage problem, </w:t>
+      </w:r>
+      <w:r>
+        <w:rPr>
+          <w:rtl w:val="0"/>
+        </w:rPr>
+        <w:t xml:space="preserve">opening the path to modern financial economics. Their theorem, they argued, can be used “as a basis for rational investment decision-making within the firm” [@ModiglianiCost1958: 296]. </w:t>
+      </w:r>
+      <w:r>
+        <w:rPr>
+          <w:rtl w:val="0"/>
+        </w:rPr>
+        <w:t xml:space="preserve">After the 1960s, cluster 3 </w:t>
+      </w:r>
+      <w:r>
+        <w:rPr>
+          <w:rtl w:val="0"/>
+        </w:rPr>
+        <w:t xml:space="preserve">became</w:t>
+      </w:r>
+      <w:r>
+        <w:rPr>
+          <w:rtl w:val="0"/>
+        </w:rPr>
+        <w:t xml:space="preserve"> much more prominent, consistently accounting for more than 10% of all sentences. In this period, rationality is increasingly framed in formal decision-theoretic terms and focused on appropriate investment choices under uncertainty.  Hence, our analysis shows that rationality in finance enters primarily through corporate finance, rather than through asset-pricing issues such as market efficiency, where rationality long remains an implicit assumption and rarely discussed explicitly prior to the emergence of behavioral finance.</w:t>
+      </w:r>
+    </w:p>
+    <w:p>
+      <w:pPr>
+        <w:rPr/>
+      </w:pPr>
+      <w:r>
+        <w:rPr>
+          <w:rtl w:val="0"/>
+        </w:rPr>
+        <w:t xml:space="preserve">From the 1980s onward, modern asset pricing becomes dominant within cluster 3 </w:t>
+      </w:r>
+      <w:r>
+        <w:rPr>
+          <w:rtl w:val="0"/>
+        </w:rPr>
+        <w:t xml:space="preserve">as indicated by the growing prominence of terms </w:t>
+      </w:r>
+      <w:r>
+        <w:rPr>
+          <w:rtl w:val="0"/>
+        </w:rPr>
+        <w:t xml:space="preserve">such as “assets,” “arbitrage,” and “capital asset pricing”. We also observe increasing proximities between the finance literature and the rational-expectations framework from the mid-1970s onward. This is both visible in the semantic clusters and in the bibliometric communities, in particular, the “Rational Expectations and Market Information,” which emerges in the 1976–1983 window. A central contribution found in both semantic and bibliometric clusters is @grossmanImpossibility1980, which draws on Lucas’s imperfect-information framework [@lucasExpectations1972] and combines rational expectations with noisy signals to question market efficiency. </w:t>
+      </w:r>
+      <w:r>
+        <w:rPr>
+          <w:rtl w:val="0"/>
+        </w:rPr>
+        <w:t xml:space="preserve">More generally, rational expectations models—initially developed in a macroeconomic context—became a central framework for analyzing the (ir)rational use of information in finance [see @delceyEfficient2023]. </w:t>
+      </w:r>
+      <w:r>
+        <w:rPr>
+          <w:rtl w:val="0"/>
+        </w:rPr>
+      </w:r>
+    </w:p>
+    <w:p>
+      <w:pPr>
+        <w:rPr/>
+      </w:pPr>
+      <w:r>
+        <w:rPr>
+          <w:rtl w:val="0"/>
+        </w:rPr>
+        <w:t xml:space="preserve">The 1970s and 1980s thus marked a relative dominance of macroeconomics and finance, with comparatively less weight given to debates on individual rationality. This situation begins to change gradually from the 1980s onward. In the 1979–1986 bibliometric network, a “Behavioral Decision Theory” community appears (representing around 2% of the network), capturing the early emergence of behavioral economics as promoted by Kahneman and Tversky. In the 1990s, the rise of behavioral economics—together with new approaches in game theory—fundamentally altered this configuration, leading to more specialized investigations of individual rationality, which now dominate and are distributed across multiple bibliometric communities. This transformation represents not merely a shift in research topics, but a profound reframing of how economics approaches rationality: from an assumption embedded in </w:t>
+      </w:r>
+      <w:r>
+        <w:rPr>
+          <w:rtl w:val="0"/>
+        </w:rPr>
+        <w:t xml:space="preserve">theories and models</w:t>
+      </w:r>
+      <w:r>
+        <w:rPr>
+          <w:rtl w:val="0"/>
+        </w:rPr>
+        <w:t xml:space="preserve"> to an object of direct investigation at the individual level.</w:t>
       </w:r>
     </w:p>
     <w:p>
@@ -2477,19 +2647,7 @@
         <w:rPr>
           <w:rtl w:val="0"/>
         </w:rPr>
-        <w:t xml:space="preserve">Our textual analysis reveals Simon's conceptual centrality. Textual cluster 40, spanning roughly seventy years from 1950 onward, captures general discussions on rationality in economics. While early debates (1950s) focused on game theory and expected-utility theory [@schellingAbandonment1959; @ellsbergTheory1956; @marschakRational1950; @chernoffRational1954], by the 1970s "bounded rationality" became the cluster's most prevalent expression. By the 1990s, discussions of "boundedly rational agents," "unbounded rationality," and "procedural rationality" clearly positioned Simon's concepts as central to economic thought signaling a late but significant integration.</w:t>
-      </w:r>
-      <w:r>
-        <w:rPr>
-          <w:vertAlign w:val="superscript"/>
-        </w:rPr>
-        <w:footnoteReference w:customMarkFollows="0" w:id="25"/>
-      </w:r>
-      <w:r>
-        <w:rPr>
-          <w:rtl w:val="0"/>
-        </w:rPr>
-        <w:t xml:space="preserve"> This is corroborated by citation analysis as citations to Simon (1955) only rised very slowly in economics after its publications with peak citations happening in the post 2000s (@fig-rationality-paper-citations).</w:t>
+        <w:t xml:space="preserve">Our textual analysis reveals Simon's conceptual centrality in some areas of economics. Textual cluster 11 about individual rationality in economics changed rapidly after the influence of Simon rised in the 1970s. While in the 1950s the discussion was structured by rationality terms (“rational”, “empirical reality” or “irrationality”), by the 1970s and after "bounded rationality" became the cluster's most prevalent expression. By the 1990s, discussions of "boundedly rational agents" and "procedural rationality" clearly positioned Simon's concepts as central to economic thought signaling a late but significant integration. Not only did the way economists talked about rationality changed radically after the introduction of Simon’s ideas, but these discussoins became also more prevalent overall. While in the 1950s 5.76 % of all sentences belong to the topic this share increased to 7.85% in the 1980s. This is corroborated by citation analysis as citations to Simon (1955) only rised very slowly in economics after its publications with peak citations happening in the post 2000s (@fig-rationality-paper-citations).</w:t>
       </w:r>
     </w:p>
     <w:p>
@@ -2501,7 +2659,6 @@
         <w:rPr>
           <w:rtl w:val="0"/>
         </w:rPr>
-        <w:t xml:space="preserve">However, this conceptual influence did not translate into stable research communities. Bibliometrically, we find only small, unstable clusters formed around Simon's work. From 1960–1967, his ideas appeared in operations research circles (cl_5) and organizational theory critiques of profit maximization. Simon his more generally associated with other researcher critical perfect rationality like @winterSatisficing1971, which applies satisficing to firm behavior, and @cyertCompetition1969. A related strand is @leibensteinAllocative1966 on “X-efficiency,” which challenges economics’ focus on allocative efficiency. Together, Simon, Winter, Cyert (with George), and Leibenstein form a diverse critique of how rationality—especially through profit maximization—is employed in economics, from an organizational theory perspective. After 1969–1976, this stream landed in a smaller, short-lived community (cl_175). References to Simon and critiques of profit maximization then remain scattered, moving through several small communities (cl_182, cl_251, cl_300, cl_328). While Simon's influence in economics was enduring, it remains marginal.</w:t>
       </w:r>
     </w:p>
     <w:p>
@@ -2513,7 +2670,6 @@
         <w:rPr>
           <w:rtl w:val="0"/>
         </w:rPr>
-        <w:t xml:space="preserve">In the 1977–1984 period, Simon's work was absorbed into a large "Behavioral Economics and Choice Theory" cluster alongside Kahneman's prospect theory. A similar phenomena can be observed in the textual analysis as the textual cluster 40 commented earlier. The cluster becomes increasingly populated by “new” behavioral economists (Matthew Rabin, Daniel Kahneman or Robert Sugden) and now includes critical comparison of “new” behavioral economics with other approaches such as the one formulated by Nathan Berg and Berg Gigerenzer [@bergAs-if2010] who criticize the tameness of “new” behavioral economcis models.</w:t>
       </w:r>
     </w:p>
     <w:p>
@@ -2525,6 +2681,160 @@
         <w:rPr>
           <w:rtl w:val="0"/>
         </w:rPr>
+        <w:t xml:space="preserve">However, Simon’s influence remain relatively limited overall. Textual cluster 11 peak in the 1990s with 9.56% of all sentence belonging to this topic, down to 7.43% in the early 2000s. Indeed, while Simon’s bounded rationality remain conceptually in parts of economics, there was a larger shift that happened and reshaped how economists approached rationality. Progressively after the 1980s, cluster 11 relative importance decreases in favor of more specialized clusters also about individual rationality. Cluster 5 and 15 about expected utility theory, risk and ambiguity. Cluster 6 and 7 about intertemporal behavior and other-regarding behavior. All these clusters become increasingly important in the 1980s with most being individually bigger than cluster 11 in share of sentences. While they do integrate bounded rationality ideas, they do so by using “new” behavioral economics concepts ranging from prospect theory for risk to the paradigmatic experimental results of the ultimatum game [@gualaParadigmatic2008]. </w:t>
+      </w:r>
+    </w:p>
+    <w:p>
+      <w:pPr>
+        <w:ind w:right="0"/>
+        <w:rPr/>
+      </w:pPr>
+      <w:r>
+        <w:rPr>
+          <w:rtl w:val="0"/>
+        </w:rPr>
+      </w:r>
+    </w:p>
+    <w:p>
+      <w:pPr>
+        <w:ind w:right="0"/>
+        <w:rPr/>
+      </w:pPr>
+      <w:r>
+        <w:rPr>
+          <w:rtl w:val="0"/>
+        </w:rPr>
+      </w:r>
+    </w:p>
+    <w:p>
+      <w:pPr>
+        <w:ind w:right="0"/>
+        <w:rPr/>
+      </w:pPr>
+      <w:r>
+        <w:rPr>
+          <w:rtl w:val="0"/>
+        </w:rPr>
+        <w:t xml:space="preserve">More generally, Simon’s conceptual influence speardeaded by bounded rationality did not translate into stable research communities. Bibliometrically, only small, unstable clusters formed around Simon's work. In the 1960s and early 1970s, his ideas appeared in operations research circles (</w:t>
+      </w:r>
+      <w:r>
+        <w:rPr>
+          <w:i w:val="1"/>
+          <w:iCs w:val="1"/>
+          <w:rtl w:val="0"/>
+        </w:rPr>
+        <w:t xml:space="preserve">Firm Behavior and Planning</w:t>
+      </w:r>
+      <w:r>
+        <w:rPr>
+          <w:rtl w:val="0"/>
+        </w:rPr>
+        <w:t xml:space="preserve">) and organizational theory critiques of profit maximization (</w:t>
+      </w:r>
+      <w:r>
+        <w:rPr>
+          <w:i w:val="1"/>
+          <w:iCs w:val="1"/>
+          <w:rtl w:val="0"/>
+        </w:rPr>
+        <w:t xml:space="preserve">Organizational Efficiency and Firm Theory</w:t>
+      </w:r>
+      <w:r>
+        <w:rPr>
+          <w:rtl w:val="0"/>
+        </w:rPr>
+        <w:t xml:space="preserve">). Simon his more generally associated with other researcher critical perfect rationality like @winterSatisficing1971, which applies satisficing to firm behavior, and @cyertCompetition1969. A related strand is @leibensteinAllocative1966 on “X-efficiency,” which challenges economics’ focus on allocative efficiency. Together, Simon, Winter, Cyert (with George), and Leibenstein form a diverse critique of how rationality—especially through profit maximization—is employed in economics, from an organizational theory perspective. After 1969–1976, this stream landed in a smaller, short-lived community and references to Simon and critiques of profit maximization then remain scattered, moving through several small communities (e.g, cl_761, cl_251, </w:t>
+      </w:r>
+      <w:r>
+        <w:rPr>
+          <w:i w:val="1"/>
+          <w:iCs w:val="1"/>
+          <w:rtl w:val="0"/>
+        </w:rPr>
+        <w:t xml:space="preserve">Welfare Economics and Public Finance</w:t>
+      </w:r>
+      <w:r>
+        <w:rPr>
+          <w:rtl w:val="0"/>
+        </w:rPr>
+        <w:t xml:space="preserve">, </w:t>
+      </w:r>
+      <w:r>
+        <w:rPr>
+          <w:i w:val="1"/>
+          <w:iCs w:val="1"/>
+          <w:rtl w:val="0"/>
+        </w:rPr>
+        <w:t xml:space="preserve">Evolutionary Economic Theory</w:t>
+      </w:r>
+      <w:r>
+        <w:rPr>
+          <w:rtl w:val="0"/>
+        </w:rPr>
+        <w:t xml:space="preserve">). While Simon's influence in economics was enduring, it remains marginal as a structuring force.</w:t>
+      </w:r>
+    </w:p>
+    <w:p>
+      <w:pPr>
+        <w:ind w:right="0"/>
+        <w:rPr/>
+      </w:pPr>
+      <w:r>
+        <w:rPr>
+          <w:rtl w:val="0"/>
+        </w:rPr>
+      </w:r>
+    </w:p>
+    <w:p>
+      <w:pPr>
+        <w:ind w:right="0"/>
+        <w:rPr/>
+      </w:pPr>
+      <w:r>
+        <w:rPr>
+          <w:rtl w:val="0"/>
+        </w:rPr>
+      </w:r>
+    </w:p>
+    <w:p>
+      <w:pPr>
+        <w:ind w:right="0"/>
+        <w:rPr/>
+      </w:pPr>
+      <w:r>
+        <w:rPr>
+          <w:rtl w:val="0"/>
+        </w:rPr>
+        <w:t xml:space="preserve">Like with textual clusters, the bibliometric analysis reveal a larger shift that absorb Simon’s legacy. In the 1979–1987 period, most clusters citing Simon became part of a large "Behavioral Decision Theory" cluster alongside Kahneman and Tversky.</w:t>
+      </w:r>
+      <w:r>
+        <w:rPr>
+          <w:color w:val="ff0000"/>
+          <w:rtl w:val="0"/>
+        </w:rPr>
+        <w:t xml:space="preserve"> </w:t>
+      </w:r>
+      <w:r>
+        <w:rPr>
+          <w:rtl w:val="0"/>
+        </w:rPr>
+        <w:t xml:space="preserve">Contrary to Simon’s, the Heuristics and Biases research program of Kahneman, Tversky and other “new” behavioral economists lead to multiple stable clusters that form well identified and large research communities. A main “Behavioral Decision Theory” stable cluster in the 1980s made of the early “new” behavioral ecomists (Kahneman, Tversky, Richard Thaler, George Loewenstein</w:t>
+      </w:r>
+      <w:r>
+        <w:rPr>
+          <w:rtl w:val="0"/>
+        </w:rPr>
+      </w:r>
+    </w:p>
+    <w:p>
+      <w:pPr>
+        <w:ind w:right="0"/>
+        <w:rPr/>
+      </w:pPr>
+      <w:r>
+        <w:rPr>
+          <w:rtl w:val="0"/>
+        </w:rPr>
         <w:t xml:space="preserve">The crystallization of a distinct "Behavioral Decision Theory" around Kahneman and Tversky's contributions signal the beginning of an explosive growth of "new" behavioral economics. The cluster spins off several autonomous communities capturing the emergence of sub-fields within behavioral economics: pro-social behavior </w:t>
       </w:r>
       <w:r>
@@ -2601,7 +2911,13 @@
         <w:rPr>
           <w:rtl w:val="0"/>
         </w:rPr>
-        <w:t xml:space="preserve">A first surprising results from our quantitative study is the stark contrasting reception of Kahneman and Simon in terms of temporality. For historian Floris Heukelom [@heukelomSense2012; @heukelomBehavioral2014], a pivotal moment in the history of behavioral economics is the explicit creation of research program within the Sloan and Russell Sage Foundations between 1984 and 1992 that most notably led to the pairing of Kahneman and Thaler that changed the trajectory of behavioral economics. However, our quantitative analysis suggests that even in the early 1980s it was clear that something particular was happening in terms of reception with the work of Kahneman and Tversky. Despite @kahnemanProspect1979 being the only economics publication of duo until 1985 and long before the Sloan-Sage Foundation research program (1984–1992) that formalized behavioral economics, prospect theory became very cited rapidly (@fig-rationality-paper-citations). As early as the 1977–1984 bibliometirc network, we find a cluster structured by the work of Kahneman and Tversky suggesting that not only their article his cited, but it rapidly structured a new strand of research in a way that never happened with Simon’s work in economics.</w:t>
+        <w:t xml:space="preserve">A first</w:t>
+      </w:r>
+      <w:r>
+        <w:rPr>
+          <w:rtl w:val="0"/>
+        </w:rPr>
+        <w:t xml:space="preserve"> surprising result from our quantitative study is the stark contrasting reception of Kahneman and Simon in terms of temporality. For historian Floris Heukelom [@heukelomSense2012; @heukelomBehavioral2014], a pivotal moment in the history of behavioral economics is the explicit creation of research program within the Sloan and Russell Sage Foundations between 1984 and 1992 that most notably led to the pairing of Kahneman and Thaler that changed the trajectory of behavioral economics. However, our quantitative analysis suggests that even in the early 1980s it was clear that something particular was happening in terms of reception with the work of Kahneman and Tversky. Despite @kahnemanProspect1979 being the only economics publication of duo until 1985 and long before the Sloan-Sage Foundation research program (1984–1992) that formalized behavioral economics, prospect theory became very cited rapidly (@fig-rationality-paper-citations). As early as the 1977–1984 bibliometirc network, we find a cluster structured by the work of Kahneman and Tversky suggesting that not only their article his cited, but it rapidly structured a new strand of research in a way that never happened with Simon’s work in economics.</w:t>
       </w:r>
     </w:p>
     <w:p>
@@ -2638,7 +2954,7 @@
       <w:pPr>
         <w:numPr>
           <w:ilvl w:val="0"/>
-          <w:numId w:val="3"/>
+          <w:numId w:val="2"/>
         </w:numPr>
         <w:spacing w:before="0" w:lineRule="auto"/>
         <w:ind w:left="720" w:hanging="360"/>
@@ -2650,7 +2966,7 @@
         <w:rPr>
           <w:rtl w:val="0"/>
         </w:rPr>
-        <w:t xml:space="preserve">“Neither Kahneman nor Thaler have sought to promote earlier behavioral economics alongside more recent work. Instead, they give the impression that behavioral economics started around 1979–1980 with the publication of Kahneman and Tversky’s (1979) article on prospect theory and that theory’s use by Thaler (1980). All in all, this is a very curious state of affairs: a cynic might suggest that it looks rather as if the earlier work has been airbrushed from the history of economic thought by the strategic redefinition of what constitutes behavioral economics. A more charitable and reflexive view would see the situation as resulting from insufficient familiarity with the earlier literature [...]” (@earlPrinciples2022, p.2)</w:t>
+        <w:t xml:space="preserve">“Neither Kahneman nor Thaler have sought to promote earlier behavioral economics alongside more recent work. Instead, they give the impression that behavioral economics started around 1979–1980 with the publication of Kahneman and Tversky’s (1979) article on prospect theory and that theory’s use by Thaler (1980). All in all, this is a very curious state of affairs: a cynic might suggest that it looks rather as if the earlier work has been airbrushed from the history of economic thought by the strategic redefinition of what constitutes behavioral economics. A more charitable and reflexive view would see the situation as resulting from insufficient familiarity with the earlier literature [...]” [@earlPrinciples2022, 2]</w:t>
       </w:r>
     </w:p>
     <w:p>
@@ -2820,68 +3136,135 @@
         <w:rPr>
           <w:rtl w:val="0"/>
         </w:rPr>
-        <w:t xml:space="preserve">Why it’s innovative</w:t>
-      </w:r>
-    </w:p>
-    <w:p>
-      <w:pPr>
-        <w:rPr/>
-      </w:pPr>
-      <w:r>
-        <w:rPr>
-          <w:rtl w:val="0"/>
-        </w:rPr>
-        <w:t xml:space="preserve">The issue of zooming in and zooming out</w:t>
-      </w:r>
-    </w:p>
-    <w:p>
-      <w:pPr>
-        <w:rPr/>
-      </w:pPr>
-      <w:r>
-        <w:rPr>
-          <w:rtl w:val="0"/>
-        </w:rPr>
-        <w:t xml:space="preserve">Some claims about results:</w:t>
-      </w:r>
-    </w:p>
-    <w:p>
-      <w:pPr>
-        <w:numPr>
-          <w:ilvl w:val="0"/>
-          <w:numId w:val="2"/>
-        </w:numPr>
-        <w:ind w:left="720" w:hanging="360"/>
-        <w:rPr>
-          <w:u w:val="none"/>
-        </w:rPr>
-      </w:pPr>
-      <w:r>
-        <w:rPr>
-          <w:rtl w:val="0"/>
-        </w:rPr>
-        <w:t xml:space="preserve">Underline the capacity of the method to classify a range of contributions of institutional economics from early twentieth century in accordance with the literature on the topic.</w:t>
-      </w:r>
-      <w:r>
-        <w:rPr>
-          <w:rtl w:val="0"/>
-        </w:rPr>
-      </w:r>
-    </w:p>
-    <w:p>
-      <w:pPr>
-        <w:rPr/>
-      </w:pPr>
-      <w:r>
-        <w:rPr>
-          <w:rtl w:val="0"/>
-        </w:rPr>
-      </w:r>
-    </w:p>
-    <w:p>
-      <w:pPr>
-        <w:rPr/>
-      </w:pPr>
+        <w:t xml:space="preserve">This article is first and foremost methodological: it aims to demonstrate, through a concrete application, the usefulness of quantitative methods for the history of economic thought. Nonetheless, it does so by breaking new ground in the history and philosophy of economics. First, the corpus we build—comprising nearly 290,000 full-text economics articles spanning more than a century—is, to our knowledge, the largest and most comprehensive database ever used to study economic contributions in English. Second, this article constitutes the first application of quantitative methods to the study of semantic change within the history of economics, an area that represents an important and growing strand of the broader literature on quantitative text analysis [@peritiSystematic2024].</w:t>
+      </w:r>
+    </w:p>
+    <w:p>
+      <w:pPr>
+        <w:rPr/>
+      </w:pPr>
+      <w:r>
+        <w:rPr>
+          <w:rtl w:val="0"/>
+        </w:rPr>
+        <w:t xml:space="preserve">Our approach allows us to identify, within this corpus, the sentences most closely associated with the words “rational” and “rationality” and, by extension, the articles most likely to engage with rationality in one way or another. This procedure necessarily involves setting similarity thresholds to determine when a sentence or an article can be considered sufficiently “close.” By retaining approximately 500,000 sentences for the textual analysis and 29,000 articles for the bibliometric analysis, we deliberately opted for a broad initial corpus. Higher thresholds would have reduced these numbers and restricted the material to discussions more narrowly centered on rationality. Our methodological choice was instead to cast a wide net at the outset, in order to preserve flexibility for subsequent stages of analysis.</w:t>
+      </w:r>
+    </w:p>
+    <w:p>
+      <w:pPr>
+        <w:rPr/>
+      </w:pPr>
+      <w:r>
+        <w:rPr>
+          <w:rtl w:val="0"/>
+        </w:rPr>
+        <w:t xml:space="preserve">This choice is central to the interest of the unsupervised methods we deploy. By allowing the algorithms to identify dozens of semantic clusters and bibliometric communities within short temporal windows (eight years or a decade), and by then aggregating these groupings over time and characterizing them through multiple indicators, we can conduct analyses at different scales. This makes it possible both to </w:t>
+      </w:r>
+      <w:r>
+        <w:rPr>
+          <w:i w:val="1"/>
+          <w:iCs w:val="1"/>
+          <w:rtl w:val="0"/>
+        </w:rPr>
+        <w:t xml:space="preserve">zoom out</w:t>
+      </w:r>
+      <w:r>
+        <w:rPr>
+          <w:rtl w:val="0"/>
+        </w:rPr>
+        <w:t xml:space="preserve">, by examining the overall configuration of clusters across periods, and to </w:t>
+      </w:r>
+      <w:r>
+        <w:rPr>
+          <w:i w:val="1"/>
+          <w:iCs w:val="1"/>
+          <w:rtl w:val="0"/>
+        </w:rPr>
+        <w:t xml:space="preserve">zoom in</w:t>
+      </w:r>
+      <w:r>
+        <w:rPr>
+          <w:rtl w:val="0"/>
+        </w:rPr>
+        <w:t xml:space="preserve">, by focusing on subsets of clusters more directly concerned with rationality. As shown in the previous section, a panoramic view that considers all semantic clusters may initially include groups that appear only loosely connected to rationality—especially in the early decades. While examining these clusters can be informative for understanding the broader intellectual context, the analyst can also foreground more explicitly rationality-oriented clusters when addressing more targeted research questions. This flexibility is only possible because the initial corpus is sufficiently inclusive, reducing the risk of overlooking relevant developments. More generally, our approach allows the scale of analysis to be adjusted to the question at hand, rather than imposing it ex ante.</w:t>
+      </w:r>
+      <w:r>
+        <w:rPr>
+          <w:rtl w:val="0"/>
+        </w:rPr>
+      </w:r>
+    </w:p>
+    <w:p>
+      <w:pPr>
+        <w:rPr/>
+      </w:pPr>
+      <w:r>
+        <w:rPr>
+          <w:rtl w:val="0"/>
+        </w:rPr>
+        <w:t xml:space="preserve">We want to conclude by drawing several general methodological and historiographic claims from the approaches developed in this article.</w:t>
+      </w:r>
+    </w:p>
+    <w:p>
+      <w:pPr>
+        <w:rPr/>
+      </w:pPr>
+      <w:r>
+        <w:rPr>
+          <w:rtl w:val="0"/>
+        </w:rPr>
+        <w:t xml:space="preserve">First, although quantitative methods in the history and philosophy of economics have been applied mainly to the postwar—and often post-1970s—period, our study shows that they can also be used effectively for earlier periods. Despite problems of text recognition in JSTOR articles prior to the 1930s, our methods nonetheless provide a fine-grained depiction of economic debates in the early twentieth century. In particular, we were able to recover most of the institutionalist contributions on rationality highlighted by @rutherfordInstitutionalist2013 and @yonayStruggle2001. At the same time, our results bring to light additional contributions not covered in these accounts, thereby opening avenues for further inquiry. Of course, some important works remain absent because they were published as books rather than journal articles. This limitation suggests that extending the corpus to include books would be a worthwhile direction for future research.</w:t>
+      </w:r>
+    </w:p>
+    <w:p>
+      <w:pPr>
+        <w:rPr/>
+      </w:pPr>
+      <w:r>
+        <w:rPr>
+          <w:rtl w:val="0"/>
+        </w:rPr>
+        <w:t xml:space="preserve">Second, a key property of groupings produced by unsupervised methods is that they bring together documents that share cognitive content without presupposing agreement. The texts clustered together address the same objects or problems, but they may do so in divergent, and sometimes opposing, ways. As a result, our methods make it possible to identify sites of resistance to dominant models or ideas. What emerges most clearly are the objects that attract sustained attention; within those sites, one can then examine who endorses, revises, or contests particular ways of treating them. This feature opens the way to a more “symmetrical” historical analysis [@bloor1976], one that gives analytical weight not only to intellectual “winners” but also to those whose positions did not ultimately prevail.</w:t>
+      </w:r>
+    </w:p>
+    <w:p>
+      <w:pPr>
+        <w:rPr/>
+      </w:pPr>
+      <w:r>
+        <w:rPr>
+          <w:rtl w:val="0"/>
+        </w:rPr>
+        <w:t xml:space="preserve">Finally, these methods are also “discovery tools.” While they can be used to confirm or challenge existing claims in the history and philosophy of economics, they also help identify patterns that have so far been absent—or only marginally present—in the historical literature. </w:t>
+      </w:r>
+      <w:commentRangeStart w:id="2"/>
+      <w:r>
+        <w:rPr>
+          <w:rtl w:val="0"/>
+        </w:rPr>
+        <w:t xml:space="preserve">We have briefly pointed to some of these patterns above.</w:t>
+      </w:r>
+      <w:commentRangeEnd w:id="2"/>
+      <w:r>
+        <w:commentReference w:id="2"/>
+      </w:r>
+      <w:r>
+        <w:rPr>
+          <w:rtl w:val="0"/>
+        </w:rPr>
+        <w:t xml:space="preserve"> By making available two interactive applications to explore our results, we hope to encourage readers to pursue their own paths of discovery within the corpus.</w:t>
+      </w:r>
+    </w:p>
+    <w:p>
+      <w:pPr>
+        <w:rPr/>
+      </w:pPr>
+      <w:r>
+        <w:rPr>
+          <w:rtl w:val="0"/>
+        </w:rPr>
+        <w:t xml:space="preserve">   </w:t>
+      </w:r>
       <w:r>
         <w:rPr>
           <w:rtl w:val="0"/>
@@ -2909,7 +3292,7 @@
 
 <file path=word/comments.xml><?xml version="1.0" encoding="utf-8"?>
 <w:comments xmlns:mc="http://schemas.openxmlformats.org/markup-compatibility/2006" xmlns:o="urn:schemas-microsoft-com:office:office" xmlns:r="http://schemas.openxmlformats.org/officeDocument/2006/relationships" xmlns:m="http://schemas.openxmlformats.org/officeDocument/2006/math" xmlns:v="urn:schemas-microsoft-com:vml" xmlns:wp="http://schemas.openxmlformats.org/drawingml/2006/wordprocessingDrawing" xmlns:w10="urn:schemas-microsoft-com:office:word" xmlns:w="http://schemas.openxmlformats.org/wordprocessingml/2006/main" xmlns:wne="http://schemas.microsoft.com/office/word/2006/wordml" xmlns:sl="http://schemas.openxmlformats.org/schemaLibrary/2006/main" xmlns:a="http://schemas.openxmlformats.org/drawingml/2006/main" xmlns:pic="http://schemas.openxmlformats.org/drawingml/2006/picture" xmlns:c="http://schemas.openxmlformats.org/drawingml/2006/chart" xmlns:lc="http://schemas.openxmlformats.org/drawingml/2006/lockedCanvas" xmlns:dgm="http://schemas.openxmlformats.org/drawingml/2006/diagram" xmlns:wps="http://schemas.microsoft.com/office/word/2010/wordprocessingShape" xmlns:wpg="http://schemas.microsoft.com/office/word/2010/wordprocessingGroup" xmlns:w14="http://schemas.microsoft.com/office/word/2010/wordml" xmlns:w15="http://schemas.microsoft.com/office/word/2012/wordml" xmlns:w16="http://schemas.microsoft.com/office/word/2018/wordml" xmlns:w16cex="http://schemas.microsoft.com/office/word/2018/wordml/cex" xmlns:w16cid="http://schemas.microsoft.com/office/word/2016/wordml/cid" xmlns="http://schemas.microsoft.com/office/tasks/2019/documenttasks" xmlns:cr="http://schemas.microsoft.com/office/comments/2020/reactions">
-  <w:comment w:author="Aurélien Goutsmedt" w:id="1" w:date="2025-11-27T18:23:45Z">
+  <w:comment w:author="Aurélien Goutsmedt" w:id="2" w:date="2025-12-16T10:01:08Z">
     <w:p>
       <w:pPr>
         <w:keepNext w:val="0"/>
@@ -2960,11 +3343,11 @@
           <w:vertAlign w:val="baseline"/>
           <w:rtl w:val="0"/>
         </w:rPr>
-        <w:t xml:space="preserve">REf</w:t>
+        <w:t xml:space="preserve">J'ai eu la flemme de mettre des exemples pour le moment.</w:t>
       </w:r>
     </w:p>
   </w:comment>
-  <w:comment w:author="Aurélien Goutsmedt" w:id="0" w:date="2025-11-26T11:06:17Z">
+  <w:comment w:author="Thomas Delcey" w:id="0" w:date="2025-12-13T01:11:21Z">
     <w:p>
       <w:pPr>
         <w:keepNext w:val="0"/>
@@ -3015,66 +3398,11 @@
           <w:vertAlign w:val="baseline"/>
           <w:rtl w:val="0"/>
         </w:rPr>
-        <w:t xml:space="preserve">Il faudra ajouter des refs. Par exemple Forder.</w:t>
+        <w:t xml:space="preserve">Est-ce qu'on garde le label IA dans la version finale ? On a pas vraiment checké à quel point c'était pertinent.</w:t>
       </w:r>
     </w:p>
   </w:comment>
-  <w:comment w:author="Thomas Delcey" w:id="2" w:date="2025-12-13T01:11:21Z">
-    <w:p>
-      <w:pPr>
-        <w:keepNext w:val="0"/>
-        <w:keepLines w:val="0"/>
-        <w:pageBreakBefore w:val="0"/>
-        <w:widowControl w:val="0"/>
-        <w:pBdr>
-          <w:top w:space="0" w:sz="0" w:val="nil"/>
-          <w:left w:space="0" w:sz="0" w:val="nil"/>
-          <w:bottom w:space="0" w:sz="0" w:val="nil"/>
-          <w:right w:space="0" w:sz="0" w:val="nil"/>
-          <w:between w:space="0" w:sz="0" w:val="nil"/>
-        </w:pBdr>
-        <w:shd w:fill="auto" w:val="clear"/>
-        <w:spacing w:after="0" w:before="0" w:line="240" w:lineRule="auto"/>
-        <w:ind w:left="0" w:right="0" w:firstLine="0"/>
-        <w:jc w:val="left"/>
-        <w:rPr>
-          <w:rFonts w:ascii="Arial" w:cs="Arial" w:eastAsia="Arial" w:hAnsi="Arial"/>
-          <w:b w:val="0"/>
-          <w:bCs w:val="0"/>
-          <w:i w:val="0"/>
-          <w:iCs w:val="0"/>
-          <w:smallCaps w:val="0"/>
-          <w:strike w:val="0"/>
-          <w:color w:val="000000"/>
-          <w:sz w:val="22"/>
-          <w:szCs w:val="22"/>
-          <w:u w:val="none"/>
-          <w:shd w:fill="auto" w:val="clear"/>
-          <w:vertAlign w:val="baseline"/>
-        </w:rPr>
-      </w:pPr>
-      <w:r>
-        <w:rPr>
-          <w:rFonts w:ascii="Arial" w:cs="Arial" w:eastAsia="Arial" w:hAnsi="Arial"/>
-          <w:b w:val="0"/>
-          <w:bCs w:val="0"/>
-          <w:i w:val="0"/>
-          <w:iCs w:val="0"/>
-          <w:smallCaps w:val="0"/>
-          <w:strike w:val="0"/>
-          <w:color w:val="000000"/>
-          <w:sz w:val="22"/>
-          <w:szCs w:val="22"/>
-          <w:u w:val="none"/>
-          <w:shd w:fill="auto" w:val="clear"/>
-          <w:vertAlign w:val="baseline"/>
-          <w:rtl w:val="0"/>
-        </w:rPr>
-        <w:t xml:space="preserve">Est-ce qu'on garde le label IA dans la version finale ? On a pas vraiment checké à quel point c'était pertinent.</w:t>
-      </w:r>
-    </w:p>
-  </w:comment>
-  <w:comment w:author="Aurélien Goutsmedt" w:id="3" w:date="2025-12-13T11:14:16Z">
+  <w:comment w:author="Aurélien Goutsmedt" w:id="1" w:date="2025-12-13T11:14:16Z">
     <w:p>
       <w:pPr>
         <w:keepNext w:val="0"/>
@@ -3236,7 +3564,7 @@
       </w:r>
     </w:p>
   </w:footnote>
-  <w:footnote w:id="6">
+  <w:footnote w:id="5">
     <w:p>
       <w:pPr>
         <w:spacing w:before="0" w:line="240" w:lineRule="auto"/>
@@ -3262,7 +3590,7 @@
       </w:r>
     </w:p>
   </w:footnote>
-  <w:footnote w:id="25">
+  <w:footnote w:id="0">
     <w:p>
       <w:pPr>
         <w:spacing w:before="0" w:line="240" w:lineRule="auto"/>
@@ -3284,14 +3612,14 @@
           <w:szCs w:val="20"/>
           <w:rtl w:val="0"/>
         </w:rPr>
-        <w:t xml:space="preserve"> Simon himself became one of the most prevalent words of the cluster.</w:t>
+        <w:t xml:space="preserve"> The bibliometric communities, identified through network analysis, could also be called clusters. But we opted for “communities” in order to distinguish them from the “semantic clusters”.</w:t>
       </w:r>
     </w:p>
   </w:footnote>
-  <w:footnote w:id="0">
-    <w:p>
-      <w:pPr>
-        <w:spacing w:before="0" w:line="240" w:lineRule="auto"/>
+  <w:footnote w:id="2">
+    <w:p>
+      <w:pPr>
+        <w:spacing w:after="0" w:before="0" w:line="240" w:lineRule="auto"/>
         <w:rPr>
           <w:sz w:val="20"/>
           <w:szCs w:val="20"/>
@@ -3310,36 +3638,12 @@
           <w:szCs w:val="20"/>
           <w:rtl w:val="0"/>
         </w:rPr>
-        <w:t xml:space="preserve"> The bibliometric communities, identified through network analysis, could also be called clusters. But we opted for “communities” in order to distinguish them from the “semantic clusters”.</w:t>
-      </w:r>
-    </w:p>
-  </w:footnote>
-  <w:footnote w:id="2">
-    <w:p>
-      <w:pPr>
-        <w:spacing w:before="0" w:line="240" w:lineRule="auto"/>
+        <w:t xml:space="preserve"> </w:t>
+      </w:r>
+      <w:r>
         <w:rPr>
           <w:sz w:val="20"/>
           <w:szCs w:val="20"/>
-        </w:rPr>
-      </w:pPr>
-      <w:r>
-        <w:rPr>
-          <w:rStyle w:val="FootnoteReference"/>
-          <w:vertAlign w:val="superscript"/>
-        </w:rPr>
-        <w:footnoteRef/>
-      </w:r>
-      <w:r>
-        <w:rPr>
-          <w:sz w:val="20"/>
-          <w:szCs w:val="20"/>
-          <w:rtl w:val="0"/>
-        </w:rPr>
-        <w:t xml:space="preserve"> </w:t>
-      </w:r>
-      <w:r>
-        <w:rPr>
           <w:rtl w:val="0"/>
         </w:rPr>
         <w:t xml:space="preserve">One of the main challenges for a quantitative history of economics is to move beyond reliance on proprietary digital libraries and to actively develop open, historically inclusive corpora. This includes incorporating materials produced in non-Anglophone countries and expanding the range of textual formats considered—such as books, book reviews, working papers, and conference proceedings.</w:t>
@@ -3351,7 +3655,7 @@
       </w:r>
     </w:p>
   </w:footnote>
-  <w:footnote w:id="5">
+  <w:footnote w:id="4">
     <w:p>
       <w:pPr>
         <w:spacing w:after="0" w:before="0" w:line="240" w:lineRule="auto"/>
@@ -3392,7 +3696,7 @@
       </w:r>
     </w:p>
   </w:footnote>
-  <w:footnote w:id="4">
+  <w:footnote w:id="3">
     <w:p>
       <w:pPr>
         <w:spacing w:after="0" w:before="0" w:line="240" w:lineRule="auto"/>
@@ -3418,7 +3722,7 @@
       </w:r>
     </w:p>
   </w:footnote>
-  <w:footnote w:id="7">
+  <w:footnote w:id="6">
     <w:p>
       <w:pPr>
         <w:spacing w:after="0" w:before="0" w:line="240" w:lineRule="auto"/>
@@ -3444,7 +3748,7 @@
       </w:r>
     </w:p>
   </w:footnote>
-  <w:footnote w:id="8">
+  <w:footnote w:id="7">
     <w:p>
       <w:pPr>
         <w:spacing w:after="0" w:before="0" w:line="240" w:lineRule="auto"/>
@@ -3466,7 +3770,41 @@
           <w:szCs w:val="20"/>
           <w:rtl w:val="0"/>
         </w:rPr>
-        <w:t xml:space="preserve"> X study fragmentation of economics through the “blue ribbon” of economics journals… (OeConomia special issue)</w:t>
+        <w:t xml:space="preserve"> </w:t>
+      </w:r>
+      <w:r>
+        <w:rPr>
+          <w:sz w:val="20"/>
+          <w:szCs w:val="20"/>
+          <w:rtl w:val="0"/>
+        </w:rPr>
+        <w:t xml:space="preserve">Adding these other outlets would pose additional challenges. For both working papers and, above all, books, no large-scale databases provide comprehensive full texts or complete reference lists. In addition, working papers raise the problem of potential double counting, as they may eventually be published in economic journals.</w:t>
+      </w:r>
+    </w:p>
+  </w:footnote>
+  <w:footnote w:id="8">
+    <w:p>
+      <w:pPr>
+        <w:spacing w:after="0" w:before="0" w:line="240" w:lineRule="auto"/>
+        <w:rPr>
+          <w:sz w:val="20"/>
+          <w:szCs w:val="20"/>
+        </w:rPr>
+      </w:pPr>
+      <w:r>
+        <w:rPr>
+          <w:rStyle w:val="FootnoteReference"/>
+          <w:vertAlign w:val="superscript"/>
+        </w:rPr>
+        <w:footnoteRef/>
+      </w:r>
+      <w:r>
+        <w:rPr>
+          <w:sz w:val="20"/>
+          <w:szCs w:val="20"/>
+          <w:rtl w:val="0"/>
+        </w:rPr>
+        <w:t xml:space="preserve"> We did not filter journals by language a priori. Indeed, many non-anglo-saxon journals also publish English articles at some more or less frequent occasions. It was thus easier to filter by language a posteriori and at the document level, once articles were collected.</w:t>
       </w:r>
     </w:p>
   </w:footnote>
@@ -3492,25 +3830,65 @@
           <w:szCs w:val="20"/>
           <w:rtl w:val="0"/>
         </w:rPr>
-        <w:t xml:space="preserve"> </w:t>
-      </w:r>
-      <w:r>
+        <w:t xml:space="preserve"> Our goal here is not to provide the reader with extensive details on what these models are and how we use them (see the appendix for additional details and references), but rather to provide general intuitions about the use of the LLMs, to understand the building of our corpus.</w:t>
+      </w:r>
+    </w:p>
+  </w:footnote>
+  <w:footnote w:id="10">
+    <w:p>
+      <w:pPr>
+        <w:spacing w:after="0" w:before="0" w:line="240" w:lineRule="auto"/>
         <w:rPr>
           <w:sz w:val="20"/>
           <w:szCs w:val="20"/>
-          <w:rtl w:val="0"/>
-        </w:rPr>
-        <w:t xml:space="preserve">Adding these other outlets would pose additional challenges. For both working papers and, above all, books, no large-scale databases provide comprehensive full texts or complete reference lists. In addition, working papers raise the problem of potential double counting, as they may eventually be published in economic journals.</w:t>
-      </w:r>
-    </w:p>
-  </w:footnote>
-  <w:footnote w:id="10">
-    <w:p>
-      <w:pPr>
-        <w:spacing w:after="0" w:before="0" w:line="240" w:lineRule="auto"/>
+        </w:rPr>
+      </w:pPr>
+      <w:r>
+        <w:rPr>
+          <w:rStyle w:val="FootnoteReference"/>
+          <w:vertAlign w:val="superscript"/>
+        </w:rPr>
+        <w:footnoteRef/>
+      </w:r>
+      <w:r>
         <w:rPr>
           <w:sz w:val="20"/>
           <w:szCs w:val="20"/>
+          <w:rtl w:val="0"/>
+        </w:rPr>
+        <w:t xml:space="preserve"> </w:t>
+      </w:r>
+      <w:r>
+        <w:rPr>
+          <w:sz w:val="20"/>
+          <w:szCs w:val="20"/>
+          <w:rtl w:val="0"/>
+        </w:rPr>
+        <w:t xml:space="preserve">Moreover, the texts used to train these models are not primarily academic articles in economics. This means that there may be important gaps between the general language patterns the model has learned and the specific vocabulary, concepts, and writing practices of our “domain” [see e.g. @zhangEconBERT2025].</w:t>
+      </w:r>
+    </w:p>
+    <w:p>
+      <w:pPr>
+        <w:spacing w:after="0" w:before="0" w:line="240" w:lineRule="auto"/>
+        <w:rPr>
+          <w:sz w:val="20"/>
+          <w:szCs w:val="20"/>
+        </w:rPr>
+      </w:pPr>
+      <w:r>
+        <w:rPr>
+          <w:rtl w:val="0"/>
+        </w:rPr>
+      </w:r>
+    </w:p>
+  </w:footnote>
+  <w:footnote w:id="12">
+    <w:p>
+      <w:pPr>
+        <w:spacing w:after="0" w:before="0" w:line="240" w:lineRule="auto"/>
+        <w:rPr>
+          <w:sz w:val="20"/>
+          <w:szCs w:val="20"/>
         </w:rPr>
       </w:pPr>
       <w:r>
@@ -3526,7 +3904,96 @@
           <w:szCs w:val="20"/>
           <w:rtl w:val="0"/>
         </w:rPr>
-        <w:t xml:space="preserve"> Pottier et al. were confronted to this point when studying… [More general references about the explosion of the number of journals and the questions it raises in studying specific fields…]</w:t>
+        <w:t xml:space="preserve"> Taking the top 1% means that we consider, once excluded as much as we can, bibliographies, headings, etc, that 1 sentence over 100 in economics articles deal with rationality. This threshold is, of course, open to discussion and can easily be adjusted.</w:t>
+      </w:r>
+    </w:p>
+  </w:footnote>
+  <w:footnote w:id="13">
+    <w:p>
+      <w:pPr>
+        <w:spacing w:after="0" w:before="0" w:line="240" w:lineRule="auto"/>
+        <w:rPr>
+          <w:sz w:val="20"/>
+          <w:szCs w:val="20"/>
+        </w:rPr>
+      </w:pPr>
+      <w:r>
+        <w:rPr>
+          <w:rStyle w:val="FootnoteReference"/>
+          <w:vertAlign w:val="superscript"/>
+        </w:rPr>
+        <w:footnoteRef/>
+      </w:r>
+      <w:r>
+        <w:rPr>
+          <w:sz w:val="20"/>
+          <w:szCs w:val="20"/>
+          <w:rtl w:val="0"/>
+        </w:rPr>
+        <w:t xml:space="preserve"> Note here that we don’t use overlapping windows in this case, notably for computational reasons: finding HDSBCAN clusters on a set of tens of thousands of sentences is much computationally intensive than finding bibliographic communities for at most five thousands of articles..</w:t>
+      </w:r>
+    </w:p>
+  </w:footnote>
+  <w:footnote w:id="14">
+    <w:p>
+      <w:pPr>
+        <w:spacing w:after="0" w:before="0" w:line="240" w:lineRule="auto"/>
+        <w:rPr>
+          <w:sz w:val="20"/>
+          <w:szCs w:val="20"/>
+        </w:rPr>
+      </w:pPr>
+      <w:r>
+        <w:rPr>
+          <w:rStyle w:val="FootnoteReference"/>
+          <w:vertAlign w:val="superscript"/>
+        </w:rPr>
+        <w:footnoteRef/>
+      </w:r>
+      <w:r>
+        <w:rPr>
+          <w:sz w:val="20"/>
+          <w:szCs w:val="20"/>
+          <w:rtl w:val="0"/>
+        </w:rPr>
+        <w:t xml:space="preserve"> Refer to the appendix for more details about this.</w:t>
+      </w:r>
+    </w:p>
+  </w:footnote>
+  <w:footnote w:id="15">
+    <w:p>
+      <w:pPr>
+        <w:spacing w:after="0" w:before="0" w:line="240" w:lineRule="auto"/>
+        <w:rPr>
+          <w:sz w:val="20"/>
+          <w:szCs w:val="20"/>
+        </w:rPr>
+      </w:pPr>
+      <w:r>
+        <w:rPr>
+          <w:rStyle w:val="FootnoteReference"/>
+          <w:vertAlign w:val="superscript"/>
+        </w:rPr>
+        <w:footnoteRef/>
+      </w:r>
+      <w:r>
+        <w:rPr>
+          <w:sz w:val="20"/>
+          <w:szCs w:val="20"/>
+          <w:rtl w:val="0"/>
+        </w:rPr>
+        <w:t xml:space="preserve"> </w:t>
+      </w:r>
+      <w:r>
+        <w:rPr>
+          <w:rtl w:val="0"/>
+        </w:rPr>
+        <w:t xml:space="preserve">Modeling choices (for example, the minimum size of clusters in the HDBSCAN algorithm) affect the partition in communities and clusters. Since these outputs are never self-interpreting and always require human qualitative assessment, it is time consuming to conduct robustness checks. </w:t>
+      </w:r>
+      <w:r>
+        <w:rPr>
+          <w:rtl w:val="0"/>
+        </w:rPr>
       </w:r>
     </w:p>
   </w:footnote>
@@ -3552,11 +4019,11 @@
           <w:szCs w:val="20"/>
           <w:rtl w:val="0"/>
         </w:rPr>
-        <w:t xml:space="preserve"> We did not filter journals by language a priori. Indeed, many non-anglo-saxon journals also published in English at some more or less frequent occasions. It was thus easier to filter by language a posteriori and at the document level, once articles were collected.</w:t>
+        <w:t xml:space="preserve"> “Unsupervised” does not mean that the modeller has no influence on the output. The analysts must choose a particular model and its parameters and these choices embed methodological priors about the types of patterns the procedure is likely to reveal. For instance, one famous crucial parameter in many unsupervised models is the number of categories that will emerge from the algorithm.</w:t>
       </w:r>
     </w:p>
   </w:footnote>
-  <w:footnote w:id="12">
+  <w:footnote w:id="17">
     <w:p>
       <w:pPr>
         <w:spacing w:after="0" w:before="0" w:line="240" w:lineRule="auto"/>
@@ -3578,11 +4045,11 @@
           <w:szCs w:val="20"/>
           <w:rtl w:val="0"/>
         </w:rPr>
-        <w:t xml:space="preserve"> Our goal here is not to provide the reader with extensive details on what these models are and how we use them (see the appendix for additional details and references), but rather to provide general intuitions about the use of the LLMs, to understand the building of our corpus.</w:t>
+        <w:t xml:space="preserve"> However, because we focus on English, published articles, our clusters are likely biased toward American journals, notably in the first decades.</w:t>
       </w:r>
     </w:p>
   </w:footnote>
-  <w:footnote w:id="13">
+  <w:footnote w:id="16">
     <w:p>
       <w:pPr>
         <w:spacing w:after="0" w:before="0" w:line="240" w:lineRule="auto"/>
@@ -3612,9 +4079,11 @@
           <w:szCs w:val="20"/>
           <w:rtl w:val="0"/>
         </w:rPr>
-        <w:t xml:space="preserve">Moreover, the texts used to train these models are not primarily academic articles in economics. This means that there may be important gaps between the general language patterns the model has learned and the specific vocabulary, concepts, and writing practices of our “domain” [see e.g. @zhangEconBERT2025].</w:t>
-      </w:r>
-    </w:p>
+        <w:t xml:space="preserve">Of course, as in any historical inquiry of this kind, we are not entirely protected from selective emphasis and from choosing illustrations that support a particular line of interpretation—all the more so given that the scope of our study is too broad to summarize every pattern revealed by our results. Other scholars could have, at various junctures, pursued different interpretive directions on the basis of the same material. The publication of the interactive applications we used to explore the results thus serves as an exercise in transparency and—in addition to being, we hope, useful for historians of economic thought more generally—allows readers to assess the robustness and limits of our narrative.</w:t>
+      </w:r>
+    </w:p>
+  </w:footnote>
+  <w:footnote w:id="18">
     <w:p>
       <w:pPr>
         <w:spacing w:after="0" w:before="0" w:line="240" w:lineRule="auto"/>
@@ -3625,18 +4094,28 @@
       </w:pPr>
       <w:r>
         <w:rPr>
-          <w:rtl w:val="0"/>
-        </w:rPr>
-      </w:r>
-    </w:p>
-  </w:footnote>
-  <w:footnote w:id="3">
-    <w:p>
-      <w:pPr>
-        <w:spacing w:after="0" w:before="0" w:line="240" w:lineRule="auto"/>
+          <w:rStyle w:val="FootnoteReference"/>
+          <w:vertAlign w:val="superscript"/>
+        </w:rPr>
+        <w:footnoteRef/>
+      </w:r>
+      <w:r>
         <w:rPr>
           <w:sz w:val="20"/>
           <w:szCs w:val="20"/>
+          <w:rtl w:val="0"/>
+        </w:rPr>
+        <w:t xml:space="preserve"> Some years earlier, @mitchellRationality1910[97; see semantic cluster 9 and 4] already pushed forward similar claims, regretting that “few economists have regarded the study of psychology as a necessary part of the equipment of their work”, often relying on “tacit preconceptions” rather than to seek to “psychologists to gain a knowledge of the mind and its modes of operation”.</w:t>
+      </w:r>
+    </w:p>
+  </w:footnote>
+  <w:footnote w:id="20">
+    <w:p>
+      <w:pPr>
+        <w:spacing w:after="0" w:before="0" w:line="240" w:lineRule="auto"/>
+        <w:rPr>
+          <w:sz w:val="20"/>
+          <w:szCs w:val="20"/>
         </w:rPr>
       </w:pPr>
       <w:r>
@@ -3652,81 +4131,15 @@
           <w:szCs w:val="20"/>
           <w:rtl w:val="0"/>
         </w:rPr>
-        <w:t xml:space="preserve"> </w:t>
-      </w:r>
-      <w:r>
-        <w:rPr>
-          <w:rtl w:val="0"/>
-        </w:rPr>
-        <w:t xml:space="preserve">In their study of the journal </w:t>
-      </w:r>
-      <w:r>
-        <w:rPr>
-          <w:i w:val="1"/>
-          <w:iCs w:val="1"/>
-          <w:rtl w:val="0"/>
-        </w:rPr>
-        <w:t xml:space="preserve">La Revue Economique, </w:t>
-      </w:r>
-      <w:r>
-        <w:rPr>
-          <w:rtl w:val="0"/>
-        </w:rPr>
-        <w:t xml:space="preserve">@DelceyRevue2025 enriched the dataset provided by the journal with missing full texts and authors’ information from the digital libraries </w:t>
-      </w:r>
-      <w:r>
-        <w:rPr>
-          <w:i w:val="1"/>
-          <w:iCs w:val="1"/>
-          <w:rtl w:val="0"/>
-        </w:rPr>
-        <w:t xml:space="preserve">Persée</w:t>
-      </w:r>
-      <w:r>
-        <w:rPr>
-          <w:rtl w:val="0"/>
-        </w:rPr>
-        <w:t xml:space="preserve">, </w:t>
-      </w:r>
-      <w:r>
-        <w:rPr>
-          <w:i w:val="1"/>
-          <w:iCs w:val="1"/>
-          <w:rtl w:val="0"/>
-        </w:rPr>
-        <w:t xml:space="preserve">Cairn</w:t>
-      </w:r>
-      <w:r>
-        <w:rPr>
-          <w:rtl w:val="0"/>
-        </w:rPr>
-        <w:t xml:space="preserve">, and </w:t>
-      </w:r>
-      <w:r>
-        <w:rPr>
-          <w:i w:val="1"/>
-          <w:iCs w:val="1"/>
-          <w:rtl w:val="0"/>
-        </w:rPr>
-        <w:t xml:space="preserve">IdRef</w:t>
-      </w:r>
-      <w:r>
-        <w:rPr>
-          <w:rtl w:val="0"/>
-        </w:rPr>
-        <w:t xml:space="preserve">.</w:t>
-      </w:r>
-      <w:r>
-        <w:rPr>
-          <w:rtl w:val="0"/>
-        </w:rPr>
+        <w:t xml:space="preserve"> This grouping of sentences in the 1970s actually took its origins in the semantic cluster 14 on utility, which ended in the 1960s, with a focus on welfare economics.</w:t>
       </w:r>
     </w:p>
   </w:footnote>
-  <w:footnote w:id="15">
-    <w:p>
-      <w:pPr>
-        <w:spacing w:after="0" w:before="0" w:line="240" w:lineRule="auto"/>
+  <w:footnote w:id="21">
+    <w:p>
+      <w:pPr>
+        <w:spacing w:before="0" w:line="240" w:lineRule="auto"/>
+        <w:ind w:right="600"/>
         <w:rPr>
           <w:sz w:val="20"/>
           <w:szCs w:val="20"/>
@@ -3745,11 +4158,11 @@
           <w:szCs w:val="20"/>
           <w:rtl w:val="0"/>
         </w:rPr>
-        <w:t xml:space="preserve"> Taking the top 1% means that we consider, once excluded as much as we can, bibliographies, headings, etc, that 1 sentence over 100 in economics articles deal with rationality. This threshold is, of course, open to discussion and can easily be adjusted.</w:t>
+        <w:t xml:space="preserve"> This highlights a key caveat. Because these methods foreground statistically “significant” patterns and indicators’ prevalence, they are not always well suited to tracing and interpreting the origins of a concept or theory with the care that close historical study and archival research provide.</w:t>
       </w:r>
     </w:p>
   </w:footnote>
-  <w:footnote w:id="16">
+  <w:footnote w:id="19">
     <w:p>
       <w:pPr>
         <w:spacing w:after="0" w:before="0" w:line="240" w:lineRule="auto"/>
@@ -3771,272 +4184,30 @@
           <w:szCs w:val="20"/>
           <w:rtl w:val="0"/>
         </w:rPr>
-        <w:t xml:space="preserve"> Note here that we don’t use overlapping windows in this case, notably for computational reasons: finding HDSBCAN clusters on a set of tens of thousands of sentences is much computationally intensive than finding bibliographic communities for at most five thousands of articles..</w:t>
-      </w:r>
-    </w:p>
-  </w:footnote>
-  <w:footnote w:id="17">
-    <w:p>
-      <w:pPr>
-        <w:spacing w:after="0" w:before="0" w:line="240" w:lineRule="auto"/>
-        <w:rPr>
-          <w:sz w:val="20"/>
-          <w:szCs w:val="20"/>
-        </w:rPr>
-      </w:pPr>
-      <w:r>
-        <w:rPr>
-          <w:rStyle w:val="FootnoteReference"/>
-          <w:vertAlign w:val="superscript"/>
-        </w:rPr>
-        <w:footnoteRef/>
-      </w:r>
-      <w:r>
-        <w:rPr>
-          <w:sz w:val="20"/>
-          <w:szCs w:val="20"/>
-          <w:rtl w:val="0"/>
-        </w:rPr>
-        <w:t xml:space="preserve"> Refer to the appendix for more details about this.</w:t>
-      </w:r>
-    </w:p>
-  </w:footnote>
-  <w:footnote w:id="18">
-    <w:p>
-      <w:pPr>
-        <w:spacing w:after="0" w:before="0" w:line="240" w:lineRule="auto"/>
-        <w:rPr>
-          <w:sz w:val="20"/>
-          <w:szCs w:val="20"/>
-        </w:rPr>
-      </w:pPr>
-      <w:r>
-        <w:rPr>
-          <w:rStyle w:val="FootnoteReference"/>
-          <w:vertAlign w:val="superscript"/>
-        </w:rPr>
-        <w:footnoteRef/>
-      </w:r>
-      <w:r>
-        <w:rPr>
-          <w:sz w:val="20"/>
-          <w:szCs w:val="20"/>
-          <w:rtl w:val="0"/>
-        </w:rPr>
         <w:t xml:space="preserve"> </w:t>
       </w:r>
       <w:r>
         <w:rPr>
           <w:rtl w:val="0"/>
         </w:rPr>
-        <w:t xml:space="preserve">Modeling choices (for example, the minimum size of clusters in the HDBSCAN algorithm) affect the partition in communities and clusters. Since these outputs are never self-interpreting and always require human qualitative assessment, it is time consuming to conduct robustness checks. </w:t>
-      </w:r>
-      <w:r>
-        <w:rPr>
-          <w:rtl w:val="0"/>
-        </w:rPr>
-      </w:r>
-    </w:p>
-  </w:footnote>
-  <w:footnote w:id="14">
-    <w:p>
-      <w:pPr>
-        <w:spacing w:after="0" w:before="0" w:line="240" w:lineRule="auto"/>
-        <w:rPr>
-          <w:sz w:val="20"/>
-          <w:szCs w:val="20"/>
-        </w:rPr>
-      </w:pPr>
-      <w:r>
-        <w:rPr>
-          <w:rStyle w:val="FootnoteReference"/>
-          <w:vertAlign w:val="superscript"/>
-        </w:rPr>
-        <w:footnoteRef/>
-      </w:r>
-      <w:r>
-        <w:rPr>
-          <w:sz w:val="20"/>
-          <w:szCs w:val="20"/>
-          <w:rtl w:val="0"/>
-        </w:rPr>
-        <w:t xml:space="preserve"> “Unsupervised” does not mean that the modeller has no influence on the output. The analysts must choose a particular model and its parameters and these choices embed methodological priors about the types of patterns the procedure is likely to reveal. For instance, one famous crucial parameter in many unsupervised models is the number of categories that will emerge from the algorithm.</w:t>
-      </w:r>
-    </w:p>
-  </w:footnote>
-  <w:footnote w:id="20">
-    <w:p>
-      <w:pPr>
-        <w:spacing w:after="0" w:before="0" w:line="240" w:lineRule="auto"/>
-        <w:rPr>
-          <w:sz w:val="20"/>
-          <w:szCs w:val="20"/>
-        </w:rPr>
-      </w:pPr>
-      <w:r>
-        <w:rPr>
-          <w:rStyle w:val="FootnoteReference"/>
-          <w:vertAlign w:val="superscript"/>
-        </w:rPr>
-        <w:footnoteRef/>
-      </w:r>
-      <w:r>
-        <w:rPr>
-          <w:sz w:val="20"/>
-          <w:szCs w:val="20"/>
-          <w:rtl w:val="0"/>
-        </w:rPr>
-        <w:t xml:space="preserve"> However, because we focus on English, published articles, our clusters are likely biased toward American journals, notably in the first decades.</w:t>
-      </w:r>
-    </w:p>
-  </w:footnote>
-  <w:footnote w:id="19">
-    <w:p>
-      <w:pPr>
-        <w:spacing w:after="0" w:before="0" w:line="240" w:lineRule="auto"/>
-        <w:rPr>
-          <w:sz w:val="20"/>
-          <w:szCs w:val="20"/>
-        </w:rPr>
-      </w:pPr>
-      <w:r>
-        <w:rPr>
-          <w:rStyle w:val="FootnoteReference"/>
-          <w:vertAlign w:val="superscript"/>
-        </w:rPr>
-        <w:footnoteRef/>
-      </w:r>
-      <w:r>
-        <w:rPr>
-          <w:sz w:val="20"/>
-          <w:szCs w:val="20"/>
-          <w:rtl w:val="0"/>
-        </w:rPr>
-        <w:t xml:space="preserve"> </w:t>
-      </w:r>
-      <w:r>
-        <w:rPr>
-          <w:sz w:val="20"/>
-          <w:szCs w:val="20"/>
-          <w:rtl w:val="0"/>
-        </w:rPr>
-        <w:t xml:space="preserve">Of course, as in any historical inquiry of this kind, we are not entirely protected from selective emphasis and from choosing illustrations that support a particular line of interpretation—all the more so given that the scope of our study is too broad to summarize every pattern revealed by our results. Other scholars could have, at various junctures, pursued different interpretive directions on the basis of the same material. The publication of the interactive applications we used to explore the results thus serves as an exercise in transparency and—in addition to being, we hope, useful for historians of economic thought more generally—allows readers to assess the robustness and limits of our narrative.</w:t>
-      </w:r>
-    </w:p>
-  </w:footnote>
-  <w:footnote w:id="21">
-    <w:p>
-      <w:pPr>
-        <w:spacing w:after="0" w:before="0" w:line="240" w:lineRule="auto"/>
-        <w:rPr>
-          <w:sz w:val="20"/>
-          <w:szCs w:val="20"/>
-        </w:rPr>
-      </w:pPr>
-      <w:r>
-        <w:rPr>
-          <w:rStyle w:val="FootnoteReference"/>
-          <w:vertAlign w:val="superscript"/>
-        </w:rPr>
-        <w:footnoteRef/>
-      </w:r>
-      <w:r>
-        <w:rPr>
-          <w:sz w:val="20"/>
-          <w:szCs w:val="20"/>
-          <w:rtl w:val="0"/>
-        </w:rPr>
-        <w:t xml:space="preserve"> Some years earlier, @mitchellRationality1910[97; see semantic cluster 9 and 4] already pushed forward similar claims, regretting that “few economists have regarded the study of psychology as a necessary part of the equipment of their work”, often relying on “tacit preconceptions” rather than to seek to “psychologists to gain a knowledge of the mind and its modes of operation”.</w:t>
-      </w:r>
-    </w:p>
-  </w:footnote>
-  <w:footnote w:id="22">
-    <w:p>
-      <w:pPr>
-        <w:spacing w:after="0" w:before="0" w:line="240" w:lineRule="auto"/>
-        <w:rPr>
-          <w:sz w:val="20"/>
-          <w:szCs w:val="20"/>
-        </w:rPr>
-      </w:pPr>
-      <w:r>
-        <w:rPr>
-          <w:rStyle w:val="FootnoteReference"/>
-          <w:vertAlign w:val="superscript"/>
-        </w:rPr>
-        <w:footnoteRef/>
-      </w:r>
-      <w:r>
-        <w:rPr>
-          <w:sz w:val="20"/>
-          <w:szCs w:val="20"/>
-          <w:rtl w:val="0"/>
-        </w:rPr>
-        <w:t xml:space="preserve"> </w:t>
-      </w:r>
-      <w:r>
-        <w:rPr>
-          <w:rtl w:val="0"/>
-        </w:rPr>
-        <w:t xml:space="preserve">This did not go without any resistances. For instance… challenged to expected utility; georgescu rogen criticism of utility, Simon’s work on firms…</w:t>
-      </w:r>
-      <w:r>
-        <w:rPr>
-          <w:rtl w:val="0"/>
-        </w:rPr>
-      </w:r>
-    </w:p>
-  </w:footnote>
-  <w:footnote w:id="23">
-    <w:p>
-      <w:pPr>
-        <w:spacing w:after="0" w:before="0" w:line="240" w:lineRule="auto"/>
-        <w:rPr>
-          <w:sz w:val="20"/>
-          <w:szCs w:val="20"/>
-        </w:rPr>
-      </w:pPr>
-      <w:r>
-        <w:rPr>
-          <w:rStyle w:val="FootnoteReference"/>
-          <w:vertAlign w:val="superscript"/>
-        </w:rPr>
-        <w:footnoteRef/>
-      </w:r>
-      <w:r>
-        <w:rPr>
-          <w:sz w:val="20"/>
-          <w:szCs w:val="20"/>
-          <w:rtl w:val="0"/>
-        </w:rPr>
-        <w:t xml:space="preserve"> This grouping of sentences in the 1970s actually took its origins in the semantic cluster 14 on utility, which ended in the 1960s, with a focus on welfare economics.</w:t>
-      </w:r>
-    </w:p>
-  </w:footnote>
-  <w:footnote w:id="24">
-    <w:p>
-      <w:pPr>
-        <w:spacing w:before="0" w:line="240" w:lineRule="auto"/>
-        <w:ind w:right="600"/>
-        <w:rPr>
-          <w:sz w:val="20"/>
-          <w:szCs w:val="20"/>
-        </w:rPr>
-      </w:pPr>
-      <w:r>
-        <w:rPr>
-          <w:rStyle w:val="FootnoteReference"/>
-          <w:vertAlign w:val="superscript"/>
-        </w:rPr>
-        <w:footnoteRef/>
-      </w:r>
-      <w:r>
-        <w:rPr>
-          <w:sz w:val="20"/>
-          <w:szCs w:val="20"/>
-          <w:rtl w:val="0"/>
-        </w:rPr>
-        <w:t xml:space="preserve"> This highlights a key caveat. Because these methods foreground statistically “significant” patterns and indicators’ prevalence, they are not always well suited to tracing and interpreting the origins of a concept or theory with the care that close historical study and archival research provide.</w:t>
+        <w:t xml:space="preserve">Machlup’s position was that even if a “goodly portion of all business behavior may be non-rational, thoughtless, [or] blindly repetitive” [-@machlupMarginal1946, 520], questionnaire evidence and empirical findings more generally did not demonstrate the failure of marginal theory when properly interpreted. In a similar defense of profit maximization, Leonid @hurwiczTheory1946[110] first acknowledged that it was not “inconceivable that business is run more by routine than by rationality”, but argued that behavior may appear irrational or merely “routine” from the standpoint of a purely static theory that ignores uncertainty, while proving fully “rational” once uncertainty and long-run effects are taken into account [see also @</w:t>
+      </w:r>
+      <w:r>
+        <w:rPr>
+          <w:rtl w:val="0"/>
+        </w:rPr>
+        <w:t xml:space="preserve">herfeldTheories2018]</w:t>
+      </w:r>
+      <w:r>
+        <w:rPr>
+          <w:rtl w:val="0"/>
+        </w:rPr>
+        <w:t xml:space="preserve">.</w:t>
+      </w:r>
+      <w:r>
+        <w:rPr>
+          <w:rtl w:val="0"/>
+        </w:rPr>
       </w:r>
     </w:p>
   </w:footnote>
@@ -4174,116 +4345,6 @@
     <w:lvl w:ilvl="0">
       <w:start w:val="1"/>
       <w:numFmt w:val="bullet"/>
-      <w:lvlText w:val="-"/>
-      <w:lvlJc w:val="left"/>
-      <w:pPr>
-        <w:ind w:left="720" w:hanging="360"/>
-      </w:pPr>
-      <w:rPr>
-        <w:u w:val="none"/>
-      </w:rPr>
-    </w:lvl>
-    <w:lvl w:ilvl="1">
-      <w:start w:val="1"/>
-      <w:numFmt w:val="bullet"/>
-      <w:lvlText w:val="-"/>
-      <w:lvlJc w:val="left"/>
-      <w:pPr>
-        <w:ind w:left="1440" w:hanging="360"/>
-      </w:pPr>
-      <w:rPr>
-        <w:u w:val="none"/>
-      </w:rPr>
-    </w:lvl>
-    <w:lvl w:ilvl="2">
-      <w:start w:val="1"/>
-      <w:numFmt w:val="bullet"/>
-      <w:lvlText w:val="-"/>
-      <w:lvlJc w:val="left"/>
-      <w:pPr>
-        <w:ind w:left="2160" w:hanging="360"/>
-      </w:pPr>
-      <w:rPr>
-        <w:u w:val="none"/>
-      </w:rPr>
-    </w:lvl>
-    <w:lvl w:ilvl="3">
-      <w:start w:val="1"/>
-      <w:numFmt w:val="bullet"/>
-      <w:lvlText w:val="-"/>
-      <w:lvlJc w:val="left"/>
-      <w:pPr>
-        <w:ind w:left="2880" w:hanging="360"/>
-      </w:pPr>
-      <w:rPr>
-        <w:u w:val="none"/>
-      </w:rPr>
-    </w:lvl>
-    <w:lvl w:ilvl="4">
-      <w:start w:val="1"/>
-      <w:numFmt w:val="bullet"/>
-      <w:lvlText w:val="-"/>
-      <w:lvlJc w:val="left"/>
-      <w:pPr>
-        <w:ind w:left="3600" w:hanging="360"/>
-      </w:pPr>
-      <w:rPr>
-        <w:u w:val="none"/>
-      </w:rPr>
-    </w:lvl>
-    <w:lvl w:ilvl="5">
-      <w:start w:val="1"/>
-      <w:numFmt w:val="bullet"/>
-      <w:lvlText w:val="-"/>
-      <w:lvlJc w:val="left"/>
-      <w:pPr>
-        <w:ind w:left="4320" w:hanging="360"/>
-      </w:pPr>
-      <w:rPr>
-        <w:u w:val="none"/>
-      </w:rPr>
-    </w:lvl>
-    <w:lvl w:ilvl="6">
-      <w:start w:val="1"/>
-      <w:numFmt w:val="bullet"/>
-      <w:lvlText w:val="-"/>
-      <w:lvlJc w:val="left"/>
-      <w:pPr>
-        <w:ind w:left="5040" w:hanging="360"/>
-      </w:pPr>
-      <w:rPr>
-        <w:u w:val="none"/>
-      </w:rPr>
-    </w:lvl>
-    <w:lvl w:ilvl="7">
-      <w:start w:val="1"/>
-      <w:numFmt w:val="bullet"/>
-      <w:lvlText w:val="-"/>
-      <w:lvlJc w:val="left"/>
-      <w:pPr>
-        <w:ind w:left="5760" w:hanging="360"/>
-      </w:pPr>
-      <w:rPr>
-        <w:u w:val="none"/>
-      </w:rPr>
-    </w:lvl>
-    <w:lvl w:ilvl="8">
-      <w:start w:val="1"/>
-      <w:numFmt w:val="bullet"/>
-      <w:lvlText w:val="-"/>
-      <w:lvlJc w:val="left"/>
-      <w:pPr>
-        <w:ind w:left="6480" w:hanging="360"/>
-      </w:pPr>
-      <w:rPr>
-        <w:u w:val="none"/>
-      </w:rPr>
-    </w:lvl>
-  </w:abstractNum>
-  <w:abstractNum w:abstractNumId="3">
-    <w:lvl w:ilvl="0">
-      <w:start w:val="1"/>
-      <w:numFmt w:val="bullet"/>
       <w:lvlText w:val="●"/>
       <w:lvlJc w:val="left"/>
       <w:pPr>
@@ -4395,9 +4456,6 @@
   </w:num>
   <w:num w:numId="2">
     <w:abstractNumId w:val="2"/>
-  </w:num>
-  <w:num w:numId="3">
-    <w:abstractNumId w:val="3"/>
   </w:num>
 </w:numbering>
 </file>

</xml_diff>

<commit_message>
Adjust table size and add new references
</commit_message>
<xml_diff>
--- a/paper/gdoc.docx
+++ b/paper/gdoc.docx
@@ -127,7 +127,29 @@
         <w:rPr>
           <w:rtl w:val="0"/>
         </w:rPr>
-        <w:t xml:space="preserve">In what follows, we concentrate on what such a quantitative analysis requires in practice. We highlight what kinds of questions and challenges arise at each stage of the research process. This focus lets us highlight (a) the crucial issue of selecting sources and building data; (b) how even simple quantitative assessments can be informative; (c) the challenges and subjective choices involved in building and adapting tools; and (d) why interpreting results demands careful attention to various indicators and close knowledge of both the corpus and its historical context. By tracing, step by step, how we assemble and analyze our corpus, we aim to provide a practical example and a reflection on broader methodological issues faced by historians of economics in quantitative inquiries.</w:t>
+        <w:t xml:space="preserve">In what follows, we concentrate on what such a quantitative analysis requires in practice. We highlight what kinds of questions and challenges arise at each stage of the research process. This focus lets us highlight (a) the crucial issue of selecting sources and building data; (b) how even simple quantitative assessments can be informative; (c) the challenges and subjective choices involved in building and adapting tools; and (d) why interpreting results demands careful attention to various indicators and close knowledge of both the corpus and its historical context. By tracing, step by step, how we assemble and analyze our corpus, we aim to provide a practical example and a reflection on broader methodological issues faced by historians of economics in quantitative inquiries. </w:t>
+      </w:r>
+      <w:commentRangeStart w:id="0"/>
+      <w:r>
+        <w:rPr>
+          <w:rtl w:val="0"/>
+        </w:rPr>
+        <w:t xml:space="preserve">The analysis of the results relies on the use of an interactive application that we have built for this article.</w:t>
+      </w:r>
+      <w:commentRangeEnd w:id="0"/>
+      <w:r>
+        <w:commentReference w:id="0"/>
+      </w:r>
+      <w:r>
+        <w:rPr>
+          <w:vertAlign w:val="superscript"/>
+        </w:rPr>
+        <w:footnoteReference w:customMarkFollows="0" w:id="2"/>
+      </w:r>
+      <w:r>
+        <w:rPr>
+          <w:rtl w:val="0"/>
+        </w:rPr>
       </w:r>
     </w:p>
     <w:p>
@@ -244,7 +266,7 @@
         <w:rPr>
           <w:vertAlign w:val="superscript"/>
         </w:rPr>
-        <w:footnoteReference w:customMarkFollows="0" w:id="2"/>
+        <w:footnoteReference w:customMarkFollows="0" w:id="3"/>
       </w:r>
       <w:r>
         <w:rPr>
@@ -379,7 +401,7 @@
         <w:rPr>
           <w:vertAlign w:val="superscript"/>
         </w:rPr>
-        <w:footnoteReference w:customMarkFollows="0" w:id="3"/>
+        <w:footnoteReference w:customMarkFollows="0" w:id="4"/>
       </w:r>
       <w:r>
         <w:rPr>
@@ -462,7 +484,7 @@
         <w:rPr>
           <w:vertAlign w:val="superscript"/>
         </w:rPr>
-        <w:footnoteReference w:customMarkFollows="0" w:id="4"/>
+        <w:footnoteReference w:customMarkFollows="0" w:id="5"/>
       </w:r>
       <w:r>
         <w:rPr>
@@ -474,7 +496,7 @@
         <w:rPr>
           <w:vertAlign w:val="superscript"/>
         </w:rPr>
-        <w:footnoteReference w:customMarkFollows="0" w:id="5"/>
+        <w:footnoteReference w:customMarkFollows="0" w:id="6"/>
       </w:r>
       <w:r>
         <w:rPr>
@@ -648,7 +670,7 @@
         <w:rPr>
           <w:vertAlign w:val="superscript"/>
         </w:rPr>
-        <w:footnoteReference w:customMarkFollows="0" w:id="6"/>
+        <w:footnoteReference w:customMarkFollows="0" w:id="7"/>
       </w:r>
       <w:r>
         <w:rPr>
@@ -827,7 +849,7 @@
         <w:rPr>
           <w:vertAlign w:val="superscript"/>
         </w:rPr>
-        <w:footnoteReference w:customMarkFollows="0" w:id="7"/>
+        <w:footnoteReference w:customMarkFollows="0" w:id="8"/>
       </w:r>
       <w:r>
         <w:rPr>
@@ -845,7 +867,7 @@
         <w:rPr>
           <w:vertAlign w:val="superscript"/>
         </w:rPr>
-        <w:footnoteReference w:customMarkFollows="0" w:id="8"/>
+        <w:footnoteReference w:customMarkFollows="0" w:id="9"/>
       </w:r>
       <w:r>
         <w:rPr>
@@ -918,7 +940,7 @@
         <w:rPr>
           <w:vertAlign w:val="superscript"/>
         </w:rPr>
-        <w:footnoteReference w:customMarkFollows="0" w:id="9"/>
+        <w:footnoteReference w:customMarkFollows="0" w:id="10"/>
       </w:r>
       <w:r>
         <w:rPr>
@@ -999,7 +1021,7 @@
         <w:rPr>
           <w:vertAlign w:val="superscript"/>
         </w:rPr>
-        <w:footnoteReference w:customMarkFollows="0" w:id="10"/>
+        <w:footnoteReference w:customMarkFollows="0" w:id="11"/>
       </w:r>
       <w:r>
         <w:rPr>
@@ -1116,7 +1138,7 @@
         <w:rPr>
           <w:rtl w:val="0"/>
         </w:rPr>
-        <w:t xml:space="preserve">Simple indicators may not always provide the clearest  answers to research questions, but they can play an important exploratory role: helping researchers refine their questions, identify anomalies, or detect unexpected patterns.</w:t>
+        <w:t xml:space="preserve">Simple indicators may not always provide the clearest answers to research questions, but they play an important exploratory role: helping researchers refine their questions, identify anomalies, or detect unexpected patterns.</w:t>
       </w:r>
     </w:p>
     <w:p>
@@ -1133,7 +1155,7 @@
         <w:rPr>
           <w:rtl w:val="0"/>
         </w:rPr>
-        <w:t xml:space="preserve"> textual data, one of the most straightforward indicators is term frequency, that is counting how often particular words or expressions appear. </w:t>
+        <w:t xml:space="preserve"> textual data, term frequency, that is counting how often particular words or expressions appear, is a straightforward indicator. </w:t>
       </w:r>
       <w:r>
         <w:rPr>
@@ -1172,7 +1194,7 @@
         <w:rPr>
           <w:rtl w:val="0"/>
         </w:rPr>
-        <w:t xml:space="preserve">While our usage of a large language model will shed light on the context surrounding this rise, such context can also be approximated with simpler, more straightforward measures. Co-occurrence analysis helps recover the different intellectual settings in which rationality is invoked. @fig-co-occurence reports, by decade, the five words most frequently adjacent to “rational” or “rationality,” showing how these associations shift over time. Before the 1930s, the picture was heterogeneous. The notion was tied to the marginalist idea of “calculation,” but it referred not only to individual behavior but also to “systems” or “organizations.” The discussion was explicitly methodological, as indicated by the prominence of terms such as “method,” “explanation,” “law,” and “foundation.” From the 1940s onward, the rise of choice theory places rationality at the center of economic modeling as a device for describing and formalizing behavior. This is mostly visible with the rise of multiple common bi-grams (i.e., combination of two words) that remain stable from the 1930s through the 1980s such as “economic rationality”, “rational choice”, “rational behavior”. By the 1970s—and especially the 1980s—the framework was both extended and contested. First, the most common bi-gram by far becomes “rational expectations” signalling the emergence of a new predominant concept extending rationality. In the 1980s, “rational expectations” appeared 15 more times than the other most common bi-grams. Second, while the concept “bounded rationality” was developed by Herbert Simon initially in the 1950s, the concept only became prevalent during the 1990s with the bi-gram becoming the fourth most common one. </w:t>
+        <w:t xml:space="preserve">While our usage of a large language model will shed light on the context surrounding this rise, such context can also be approximated with simple measures. Co-occurrence analysis helps recover the different intellectual settings in which rationality is invoked. @fig-co-occurence reports, by decade, the five words most frequently adjacent to “rational” or “rationality,” showing how these associations shift over time. Before the 1930s, the picture was heterogeneous. The notion was tied to the marginalist idea of “calculation,” but it referred not only to individual behavior but also to “systems” or “organizations.”simplersimpler The discussion was explicitly methodological, as indicated by the prominence of terms such as “method,” “explanation,” “law,” and “foundation.” From the 1940s onward, the rise of choice theory places rationality at the center of economic modeling as a device for describing and formalizing behavior. This is mostly visible with the rise of multiple common bi-grams (i.e., combination of two words) that remain stable from the 1930s through the 1980s such as “economic rationality”, “rational choice”, “rational behavior”. By the 1970s—and especially the 1980s—the framework was both extended and contested. First, the most common bi-gram by far becomes “rational expectations” signalling the emergence of a new predominant concept extending rationality. In the 1980s, “rational expectations” appeared 15 more times than the other most common bi-grams. Second, while the concept “bounded rationality” was developed by Herbert Simon initially in the 1950s, the concept only became prevalent during the 1990s with the bi-gram becoming the fourth most common one. </w:t>
       </w:r>
     </w:p>
     <w:p>
@@ -1195,7 +1217,7 @@
         <w:rPr>
           <w:rtl w:val="0"/>
         </w:rPr>
-        <w:t xml:space="preserve"> source of information for corpus exploration. The evolution of an idea depends not only on how it is formulated by its authors, but also on how it is appropriated, and reinterpreted by readers. A substantial literature in citation theory examines how citations function as a scientific practice and how they should be interpreted. As emphasized in this literature [see, e.g., @TahamtanCore1979], citations may reflect a wide range of motivations—from a genuine desire to acknowledge intellectual debt to more strategic uses aimed at persuading readers or satisfying referees. Nevertheless, citations at the very least signal a relationship that can help trace the lineage and diffusion of ideas, even when the reasons behind the citation are not purely intellectual.</w:t>
+        <w:t xml:space="preserve"> source of information for corpus exploration. The evolution of an idea depends not only on how it is formulated by its authors, but also on how it is appropriated, and reinterpreted by readers. A substantial literature in citation theory examines how citations function as a scientific practice and how they should be interpreted [see, e.g., @TahamtanCore1979]. Citations may reflect a wide range of motivations—from a genuine desire to acknowledge intellectual debt to more strategic uses aimed at persuading readers or satisfying referees. Nevertheless, citations at the very least signal a relationship that can help trace the lineage and diffusion of ideas, even when the reasons behind the citation are not purely intellectual.</w:t>
       </w:r>
     </w:p>
     <w:p>
@@ -1234,29 +1256,18 @@
         <w:rPr>
           <w:rtl w:val="0"/>
         </w:rPr>
-        <w:t xml:space="preserve">Historians routinely discuss scientific influence and recognition using proxies such as major grants, prizes, and honors. For example, Sent’s [-@sent_behavioral_2004] narrative of the transition from the dominance of rational choice, through the limited success of “old” behavioral economics (e.g., Simon, George Katona), to the emergence of “new” behavioral economics is organized around such milestones. In this sense, citations serve as a complementary proxy alongside these traditional indicators. For instance, although both Simon and Kahneman received the Nobel Prize, Kahneman ultimately exerted a broader influence on the discipline—something that is reflected in citation patterns. In a large qualitative–quantitative study of the Nobel Prize, @offerNobel2016 distinguished several trajectories among laureates: those who peak at the prize and subsequently decline, “innovators with staying power,” “still rising” winners honored before their citation peak, and late winners recognized long after their peak.</w:t>
-      </w:r>
-    </w:p>
-    <w:p>
-      <w:pPr>
-        <w:rPr/>
-      </w:pPr>
-      <w:r>
-        <w:rPr>
-          <w:rtl w:val="0"/>
-        </w:rPr>
-        <w:t xml:space="preserve">@fig-rationality-paper-citations plots citation patterns across all WoS economics journals and across the top five journals for four seminal references that critiqued the standard approach to rationality in economics. @simonBehavioral1955 and @allaisComportementHommeRationnel1953 represent early critiques of neoclassical rational choice, while @akerlofMarket1970 and @kahnemanProspect1979 are foundational contributions to what economists now refer to as “new” behavioral economics.</w:t>
-      </w:r>
-    </w:p>
-    <w:p>
-      <w:pPr>
-        <w:rPr/>
-      </w:pPr>
-      <w:r>
-        <w:rPr>
-          <w:rtl w:val="0"/>
-        </w:rPr>
-        <w:t xml:space="preserve">The influence of “new” behavioral economics clearly exceeds that of the earlier tradition, both in the top five journals and in the broader set of economics journals indexed in Web of Science. Whereas @simonBehavioral1955 and @allaisComportementHommeRationnel1953 are cited by no more than 0.2% of all economics articles, @kahnemanProspect1979 surpasses 1% by the late 2010s and continues to rise. The contrast lies not only in the scale of influence but also in the speed and timing of acceptance: citations to the two “new” behavioral papers grow rapidly and steadily from the moment of publication, while Simon and Allais reach their modest peaks only around the time of their Nobel Prizes—or even later in the 2000s, with the renewed attention generated by “new” behavioral economics. As argued by @offerNobel2016, many laureates experience a “Nobel premium,” a modest increase in citations following the award. Simon and Allais conform to this pattern, but Kahneman and Tversky represent an exceptional case: after the Nobel, their previously declining citation trajectory reverses and climbs sharply throughout the period studied [@offerNobel2016].</w:t>
+        <w:t xml:space="preserve">Historians routinely discuss scientific influence and recognition using proxies such as major grants, prizes, and honors. For example, Sent’s [-@sent_behavioral_2004] narrative of the transition from the dominance of rational choice, through the limited success of “old” behavioral economics (with contributions by, e.g., Simon and George Katona), to the emergence of “new” behavioral economics is organized around such milestones. In this sense, citations serve as a complementary proxy alongside these traditional indicators. For instance, although both Simon and Kahneman received the Nobel Prize, Kahneman ultimately exerted a broader influence on the discipline—something that is reflected in citation patterns. </w:t>
+      </w:r>
+    </w:p>
+    <w:p>
+      <w:pPr>
+        <w:rPr/>
+      </w:pPr>
+      <w:r>
+        <w:rPr>
+          <w:rtl w:val="0"/>
+        </w:rPr>
+        <w:t xml:space="preserve">In a large qualitative–quantitative study of the Nobel Prize, @offerNobel2016 distinguished several trajectories among laureates: those who peak at the prize and subsequently decline, “innovators with staying power,” “still rising” winners honored before their citation peak, and late winners recognized long after their peak. @fig-rationality-paper-citations plots citation patterns across all WoS economics journals and across the top five journals for four seminal references that critiqued the standard approach to rationality in economics. @simonBehavioral1955 and @allaisComportementHommeRationnel1953 represent early critiques of neoclassical rational choice, while @akerlofMarket1970 and @kahnemanProspect1979 are foundational contributions to what economists now refer to as “new” behavioral economics. The influence of “new” behavioral economics clearly exceeds that of the earlier tradition, both in the top five journals and in the broader set of economics journals indexed in WoS. Whereas @simonBehavioral1955 and @allaisComportementHommeRationnel1953 are cited by no more than 0.2% of all economics articles, @kahnemanProspect1979 surpasses 1% by the late 2010s and continues to rise. The contrast lies not only in the scale of influence but also in the speed and timing of acceptance: citations to the two “new” behavioral papers grow rapidly and steadily from the moment of publication, while Simon and Allais reach their modest peaks only around the time of their Nobel Prizes—or even later in the 2000s, with the renewed attention generated by “new” behavioral economics. As argued by @offerNobel2016, many laureates experience a “Nobel premium,” a modest increase in citations following the award. Simon and Allais conform to this pattern, but Kahneman and Tversky represent an exceptional case: after the Nobel, their previously declining citation trajectory reverses and climbs sharply throughout the period studied [@offerNobel2016].</w:t>
       </w:r>
       <w:r>
         <w:rPr>
@@ -1299,7 +1310,7 @@
         <w:rPr>
           <w:rtl w:val="0"/>
         </w:rPr>
-        <w:t xml:space="preserve">Citation counts are a blunt tool and cannot answer many questions of interest to historians of economics: Who cites these works? Are they cited together? In what intellectual contexts do they appear? Moreover, focusing on a small set of references introduces a degree of arbitrariness into the analysis. Likewise, simply counting the words that appear next to “rationality” tells us little about whether these words are used jointly within the same argument or whether they belong to distinct topics and contexts that mobilize the concept differently. It also overlooks the much broader vocabulary related to rationality (e.g., profit maximization, expected utility, social choice).</w:t>
+        <w:t xml:space="preserve">Citation counts are a blunt tool and cannot answer many questions of interest to historians of economics: Who cites these works? Are they cited together? In what intellectual contexts do they appear? Moreover, focusing on a small set of references introduces a degree of arbitrariness into the analysis. Likewise, simply counting the words that appear next to “rationality” tells us little about whether these words and expressions are used jointly within the same argument or whether they belong to distinct topics and contexts that mobilize the concept differently. It also overlooks the much broader vocabulary related to rationality (e.g., profit maximization, expected utility, social choice).</w:t>
       </w:r>
     </w:p>
     <w:p>
@@ -1316,7 +1327,7 @@
         <w:rPr>
           <w:vertAlign w:val="superscript"/>
         </w:rPr>
-        <w:footnoteReference w:customMarkFollows="0" w:id="11"/>
+        <w:footnoteReference w:customMarkFollows="0" w:id="12"/>
       </w:r>
       <w:r>
         <w:rPr>
@@ -1333,7 +1344,7 @@
         <w:rPr>
           <w:rtl w:val="0"/>
         </w:rPr>
-        <w:t xml:space="preserve">The counterpart of unsupervised methods are supervised methods—such as regressions—which estimate predefined relationships in the data. In contrast, unsupervised methods are particularly well suited to exploratory analysis. In this research context, analysts often lack precise knowledge of the corpus and its various intellectual contexts. While supervised methods require clearly specified hypotheses and well-defined variables, unsupervised approaches allow researchers to let a </w:t>
+        <w:t xml:space="preserve">The counterpart of unsupervised methods are supervised methods—such as regressions—which estimate predefined relationships in the data. While supervised methods require clearly specified hypotheses and well-defined variables, unsupervised approaches allow researchers to let a </w:t>
       </w:r>
       <w:r>
         <w:rPr>
@@ -1347,34 +1358,34 @@
         <w:rPr>
           <w:rtl w:val="0"/>
         </w:rPr>
-        <w:t xml:space="preserve">structure of the material emerge. This is especially true for large-scale and long-run analysis, where labelled data become harder to obtain and increase the risk of imposing categories that are inadequate or anachronistic relative to the historical context. That does not mean, however, that an unsupervised algorithm can be applied blindly to historical questions: a substantial part of our effort has consisted in adapting the method to our historical data, especially to accommodate the growth of the corpus over time.</w:t>
-      </w:r>
-      <w:r>
-        <w:rPr>
-          <w:rtl w:val="0"/>
-        </w:rPr>
-      </w:r>
-    </w:p>
-    <w:p>
-      <w:pPr>
-        <w:rPr/>
-      </w:pPr>
-      <w:r>
-        <w:rPr>
-          <w:rtl w:val="0"/>
-        </w:rPr>
-        <w:t xml:space="preserve">In this paper, for citation data, we use a method commonly employed in the history of economic thought: bibliographic coupling [ref]. We begin with a corpus composed of the 10% of articles whose average embeddings are most similar to our annual representative vectors for “rationality” and “rational.” In this network, articles are represented as nodes, and connections between them depend on the number of shared references in their bibliographies. The more references two articles share, the stronger their link—and the closer they appear in a two-dimensional network visualization. The underlying premise is that shared references serve as a proxy for intellectual proximity. These maps help delineate the boundaries of disciplines, fields, or sub-specialties and reveal their internal organization, including hierarchies and core–periphery structures.</w:t>
-      </w:r>
-    </w:p>
-    <w:p>
-      <w:pPr>
-        <w:rPr/>
-      </w:pPr>
-      <w:r>
-        <w:rPr>
-          <w:rtl w:val="0"/>
-        </w:rPr>
-        <w:t xml:space="preserve">However, citation practices tend to favor more recent works, which makes it unhelpful for historians to construct a single citation network spanning an entire century. Following a method that has proven effective in the field [three papers], we therefore split our corpus into overlapping eight-year windows, beginning in 1960 (1960–1967; 1961–1968; … ; 2002–2009), and built a series of 43 separate networks. Using community-detection algorithms [@traag…], we identify groups of documents that share a substantial fraction of references and therefore have a similar intellectual background; we refer to these groups as “bibliographic communities.” Our next step is to identify communities that persist over time. When two communities from consecutive networks share many of the same articles, we treat them as instances of the same underlying group—an “intertemporal bibliographic community.” In this way, our bibliographic communities bring together documents from different </w:t>
+        <w:t xml:space="preserve">structure of the material emerge. This is especially true for large-scale and long-run analysis, where the risk of imposing categories that are inadequate or anachronistic relative to the historical context increases. That does not mean, however, that an unsupervised algorithm can be applied blindly to historical questions: a substantial part of our effort has consisted in adapting the method to our historical data, especially to accommodate the growth of the corpus over time.</w:t>
+      </w:r>
+      <w:r>
+        <w:rPr>
+          <w:rtl w:val="0"/>
+        </w:rPr>
+      </w:r>
+    </w:p>
+    <w:p>
+      <w:pPr>
+        <w:rPr/>
+      </w:pPr>
+      <w:r>
+        <w:rPr>
+          <w:rtl w:val="0"/>
+        </w:rPr>
+        <w:t xml:space="preserve">In this paper, for citation data, we use a method commonly employed in the history of economic thought: bibliographic coupling [see e.g., @claveauMacrodynamics2016; trucForty2022]. We begin with a corpus composed of the 10% of articles whose average embeddings are most similar to our annual representative vectors for “rationality” and “rational.” In this network, articles are represented as nodes, and connections between them depend on the number of shared references in their bibliographies. The more references two articles share, the stronger their link—and the closer they appear in a two-dimensional network visualization. The underlying premise is that shared references serve as a proxy for intellectual proximity. These maps help delineate the boundaries of disciplines, fields, or sub-specialties and reveal core–periphery structures.</w:t>
+      </w:r>
+    </w:p>
+    <w:p>
+      <w:pPr>
+        <w:rPr/>
+      </w:pPr>
+      <w:r>
+        <w:rPr>
+          <w:rtl w:val="0"/>
+        </w:rPr>
+        <w:t xml:space="preserve">However, citation practices tend to favor more recent works, which makes it unhelpful for historians to construct a single citation network spanning an entire century. Following a method that has proven effective in the field [@goutsmedtIndependent2023; @camilottoNavigating2023], we therefore split our corpus into overlapping eight-year windows, starting in 1960 (1960–1967; 1961–1968; … ; 2002–2009), and built a series of 43 separate networks. Using community-detection algorithms [@traagLouvain2019], we identify groups of documents that share a substantial fraction of references and therefore have a similar intellectual background; we refer to these groups as “bibliometric communities.” Our next step is to identify communities that persist over time. When two communities from consecutive networks share many of the same nodes (i.e. articles), we treat them as instances of the same underlying group—an “intertemporal bibliometric community.” In this way, our bibliometric communities bring together documents from different </w:t>
       </w:r>
       <w:r>
         <w:rPr>
@@ -1442,36 +1453,36 @@
         <w:rPr>
           <w:rtl w:val="0"/>
         </w:rPr>
-        <w:t xml:space="preserve">For textual data, historians of economics frequently rely on topic modeling [Ref]. Topic modeling identifies the latent themes in a corpus by learning distributions of words associated with each topic. Each document is then represented by a mixture of these topics—often with one or two dominating—while each topic can be described through its most representative words and expressions. While topic modeling is a convenient tool for historical analysis, our research question pushed us toward a more targeted approach.</w:t>
-      </w:r>
-    </w:p>
-    <w:p>
-      <w:pPr>
-        <w:rPr/>
-      </w:pPr>
-      <w:r>
-        <w:rPr>
-          <w:rtl w:val="0"/>
-        </w:rPr>
-        <w:t xml:space="preserve">Because we focus on one large and historically fluid concept, we draw on the literature on semantic drift [ref] and take inspiration from @ref. Rather than starting with full documents, </w:t>
-      </w:r>
-      <w:r>
-        <w:rPr>
-          <w:rtl w:val="0"/>
-        </w:rPr>
-        <w:t xml:space="preserve">we filter each year’s corpus to retain only the </w:t>
-      </w:r>
-      <w:r>
-        <w:rPr>
-          <w:rtl w:val="0"/>
-        </w:rPr>
-        <w:t xml:space="preserve"> top 1% of sentences that are most similar to our annual representative vectors of “rationality” and “rational.” In other words, we extract the sentences most likely to engage with the concept of rationality in any form.</w:t>
+        <w:t xml:space="preserve">For textual data, historians of economics frequently rely on topic modeling [bakeevAcademic2023; fontanaFragmentation2023; acostaSix2024]. Topic modeling identifies the latent themes in a corpus by learning distributions of words associated with each topic. Each document is then represented by a mixture of these topics—often with one or two dominating—while each topic can be described through its most representative words and expressions. While topic modeling is a convenient tool for historical analysis, our research question pushed us toward a more targeted approach.</w:t>
+      </w:r>
+    </w:p>
+    <w:p>
+      <w:pPr>
+        <w:rPr/>
+      </w:pPr>
+      <w:r>
+        <w:rPr>
+          <w:rtl w:val="0"/>
+        </w:rPr>
+        <w:t xml:space="preserve">Because we focus on one large and historically fluid concept, we draw on the literature on semantic drift [@kutuzovDiachronic2018; montanelliSurvey2024] and take inspiration from @giulianelliAnalysing2020a. Rather than starting with full documents, </w:t>
+      </w:r>
+      <w:r>
+        <w:rPr>
+          <w:rtl w:val="0"/>
+        </w:rPr>
+        <w:t xml:space="preserve">we filter each year’s corpus to retain only the</w:t>
+      </w:r>
+      <w:r>
+        <w:rPr>
+          <w:rtl w:val="0"/>
+        </w:rPr>
+        <w:t xml:space="preserve"> top 1% of sentences that are most similar to our annual representative vectors of sentences with “rationality” and “rational.” In other words, we extract the sentences most likely to engage with the concept of rationality in any form.</w:t>
       </w:r>
       <w:r>
         <w:rPr>
           <w:vertAlign w:val="superscript"/>
         </w:rPr>
-        <w:footnoteReference w:customMarkFollows="0" w:id="12"/>
+        <w:footnoteReference w:customMarkFollows="0" w:id="13"/>
       </w:r>
       <w:r>
         <w:rPr>
@@ -1494,7 +1505,7 @@
         <w:rPr>
           <w:vertAlign w:val="superscript"/>
         </w:rPr>
-        <w:footnoteReference w:customMarkFollows="0" w:id="13"/>
+        <w:footnoteReference w:customMarkFollows="0" w:id="14"/>
       </w:r>
       <w:r>
         <w:rPr>
@@ -1506,7 +1517,7 @@
         <w:rPr>
           <w:vertAlign w:val="superscript"/>
         </w:rPr>
-        <w:footnoteReference w:customMarkFollows="0" w:id="14"/>
+        <w:footnoteReference w:customMarkFollows="0" w:id="15"/>
       </w:r>
       <w:r>
         <w:rPr>
@@ -1523,13 +1534,13 @@
         <w:rPr>
           <w:rtl w:val="0"/>
         </w:rPr>
-        <w:t xml:space="preserve">With both methods, we thus obtain a list of “intertemporal bibliographic communities” and “intertemporal semantic clusters.” These allow us to identify subgroups within our corpus across multiple dimensions: different subfields of economics (e.g., behavioral economics, macroeconomics), different conceptions of rationality (e.g., bounded rationality, rational expectations), or even, more heuristically, different methodological traditions (e.g., experimental work, econometrics).  </w:t>
-      </w:r>
-      <w:r>
-        <w:rPr>
-          <w:rtl w:val="0"/>
-        </w:rPr>
-        <w:t xml:space="preserve">Both approaches have clear strengths and limitations. Some are largely inherited from their respective sources. In our case, citation data cannot be meaningfully exploited before the 1960s, while our OCR full texts handle formulas and tables poorly, making economic models—an essential component of our story—less visible in the semantic analysis than through citations. Choosing between the two therefore depends directly on the specific historical questions one aims to address. </w:t>
+        <w:t xml:space="preserve">With both methods, we thus obtain a list of “intertemporal bibliometric communities” (from 1960 to 2009) and “intertemporal semantic clusters” (from 1900 to 2009). These allow us to identify subgroups within our corpus across multiple dimensions: different subfields of economics (e.g., behavioral economics, macroeconomics), different conceptions of rationality (e.g., bounded rationality, rational expectations), or even, more heuristically, different methodological traditions (e.g., experimental work, econometrics). </w:t>
+      </w:r>
+      <w:r>
+        <w:rPr>
+          <w:rtl w:val="0"/>
+        </w:rPr>
+        <w:t xml:space="preserve">Both approaches have clear strengths and limitations. Some are largely inherited from their respective sources. In our case, citation data cannot be meaningfully exploited before the 1960s, while our OCR full texts handle formulas and tables poorly, making economic models—an essential component of our story—less visible in the semantic analysis. </w:t>
       </w:r>
     </w:p>
     <w:p>
@@ -1569,7 +1580,7 @@
         <w:rPr>
           <w:vertAlign w:val="superscript"/>
         </w:rPr>
-        <w:footnoteReference w:customMarkFollows="0" w:id="15"/>
+        <w:footnoteReference w:customMarkFollows="0" w:id="16"/>
       </w:r>
       <w:r>
         <w:rPr>
@@ -1615,7 +1626,7 @@
         <w:rPr>
           <w:rtl w:val="0"/>
         </w:rPr>
-        <w:t xml:space="preserve">Taken together, the textual and bibliometric approaches allow us to study both the semantic and thematic contexts of the uses of rationality in economics and the channels through which these ideas circulated within the discipline. But how should such a “study” proceed? Unlike simpler quantitative tools, unsupervised methods do not produce ready-made results. In our case, they generate statistical categories—bibliographic communities and semantic clusters—that lack predefined conceptual “labels”. This strategy—reducing a large and complex corpus to a smaller number of coherent groups—is well established. Yet the groups themselves are created solely on the basis of statistical similarities, and their historical or conceptual significance emerges only through subsequent analysis. Groups resulting from an unsupervised method can comprise, depending on the corpus, anything from a few dozen to several thousand texts. To make sense of what brings peculiar texts together, we therefore need indicators that identify shared features and help hierarchise the documents to be read first</w:t>
+        <w:t xml:space="preserve">Taken together, the textual and bibliometric approaches allow us to study both the semantic and thematic contexts of the uses of rationality in economics and the channels through which these ideas circulated within the discipline. But how should such a “study” proceed? Unlike simpler quantitative tools, unsupervised methods do not produce ready-made results. In our case, they generate statistical categories—bibliometric communities and semantic clusters—that lack predefined conceptual “labels.” This strategy—reducing a large and complex corpus to a smaller number of coherent groups—is well established. Yet the groups themselves are created solely on the basis of statistical similarities, and their historical or conceptual significance emerges only through subsequent analysis. To make sense of what brings texts together, we therefore need indicators that identify shared features and help hierarchise the documents to be read first</w:t>
       </w:r>
       <w:r>
         <w:rPr>
@@ -1641,29 +1652,46 @@
         <w:rPr>
           <w:rtl w:val="0"/>
         </w:rPr>
-        <w:t xml:space="preserve">Thus, whether at the stage of data construction or in the interpretation of statistical patterns, quantitative methods demand a continuous dialogue with qualitative interpretation, supported by a close reading of the secondary literature on the topic at stake. Only through this back-and-forth can we turn algorithmic groupings into meaningful historical insights. This is both a weakness and a strength. </w:t>
-      </w:r>
-      <w:r>
-        <w:rPr>
-          <w:rtl w:val="0"/>
-        </w:rPr>
-        <w:t xml:space="preserve">On the one hand, the analysis is not immediately transparent, as it requires the construction of intermediate tools—such as our interactive applications—to guide interpretation. On the other hand, it is consistent with the practices of historians of economic thought, who likewise select, prioritise, and read texts in order to make sense of their corpus.</w:t>
-      </w:r>
-      <w:r>
-        <w:rPr>
-          <w:rtl w:val="0"/>
-        </w:rPr>
-      </w:r>
-    </w:p>
-    <w:p>
-      <w:pPr>
-        <w:rPr/>
-      </w:pPr>
-      <w:r>
-        <w:rPr>
-          <w:rtl w:val="0"/>
-        </w:rPr>
-        <w:t xml:space="preserve">Let us take as an example the semantic cluster 11, which gathers close to 20,000 sentences from 1920 to 2009. How can we get a sense of what this cluster actually coalesces around? Before any qualitative interpretation or contextualization with the secondary literature is possible, we must first produce a series of indicators to characterize the cluster. Such indicators include:</w:t>
+        <w:t xml:space="preserve">Therefore, whether at the stage of data construction or in the interpretation of statistical patterns, quantitative methods demand a continuous dialogue with qualitative interpretation, supported by a close reading of the secondary literature on the issues at stake. Only through this back-and-forth can we turn algorithmic groupings into meaningful historical insights. This is both a weakness and a strength. </w:t>
+      </w:r>
+      <w:r>
+        <w:rPr>
+          <w:rtl w:val="0"/>
+        </w:rPr>
+        <w:t xml:space="preserve">On the one hand, the analysis is not immediately transparent, as it requires the construction of intermediate tools</w:t>
+      </w:r>
+      <w:commentRangeStart w:id="1"/>
+      <w:r>
+        <w:rPr>
+          <w:rtl w:val="0"/>
+        </w:rPr>
+        <w:t xml:space="preserve">—such as our interactive applications—</w:t>
+      </w:r>
+      <w:commentRangeEnd w:id="1"/>
+      <w:r>
+        <w:commentReference w:id="1"/>
+      </w:r>
+      <w:r>
+        <w:rPr>
+          <w:rtl w:val="0"/>
+        </w:rPr>
+        <w:t xml:space="preserve">to guide interpretation. On the other hand, it is consistent with the practices of historians of economic thought, who likewise select, prioritise, and read texts in order to make sense of their corpus.</w:t>
+      </w:r>
+      <w:r>
+        <w:rPr>
+          <w:rtl w:val="0"/>
+        </w:rPr>
+      </w:r>
+    </w:p>
+    <w:p>
+      <w:pPr>
+        <w:rPr/>
+      </w:pPr>
+      <w:r>
+        <w:rPr>
+          <w:rtl w:val="0"/>
+        </w:rPr>
+        <w:t xml:space="preserve">For the purpose of the exploration and interpretation of our results, we have built an online interactive application, where we can find all the semantic clusters and bibliometric communities, and their corresponding indicators. Let us take as an example the semantic cluster 11, which gathers close to 20,000 sentences from 1920 to 2009. How can we get a sense of what this cluster actually coalesces around? Before any qualitative interpretation or contextualization with the secondary literature, we must first produce a series of indicators to characterize the cluster. Such indicators include:</w:t>
       </w:r>
     </w:p>
     <w:p>
@@ -1697,7 +1725,7 @@
         <w:rPr>
           <w:rtl w:val="0"/>
         </w:rPr>
-        <w:t xml:space="preserve">The most recurring authors. While Talcott Parsons and Frank Knight appear frequently in the 1920s and 1930s, Herbert Simon becomes a central author in the 1950s and 1970s. In the 1990s, we notably find Robert Sugden a behavioral economists.</w:t>
+        <w:t xml:space="preserve">The most recurring authors. Talcott Parsons and Frank Knight appear frequently in the 1920s and 1930s, and Herbert Simon becomes a central author in the 1950s and 1970s. In the 1990s, we notably find Robert Sugden, a behavioral economist.</w:t>
       </w:r>
     </w:p>
     <w:p>
@@ -1778,7 +1806,7 @@
         <w:rPr>
           <w:rtl w:val="0"/>
         </w:rPr>
-        <w:t xml:space="preserve">The sentences within the semantic cluster that are closest to its year-representative vector, i.e., those closest to “rational” and “rationality,” as well as the most representative sentences of the cluster for each period. The first category tends to highlight how the concept of rationality is discussed, while the second category centers more directly on the core semantic content of the cluster, often offering clues about the topics and debates that animate it in different periods. For instance, in the 1950s, one of the sentences closest to the representative vectors is Simon’s claim that “If man, according to this interpretation, makes decisions and choices that have some appearance of rationality, rationality in real life must involve something simpler than maximization of utility or profit” [@simonTheories1959, 259–260]. As for the most representative sentences, Allan Drazen [@drazenRecent1980, 294] warned in the 1980s that “Deciding on the suitable notion or definition of rationality is not an easy task,” in his survey of the disequilibrium-theory literature in macroeconomics.</w:t>
+        <w:t xml:space="preserve">The sentences within the semantic cluster that are closest to its year-representative vector, i.e., those closest to “rational” and “rationality,” as well as the most representative sentences of the cluster itself for each period. The first category tends to highlight how the concept of rationality is discussed, while the second category centers more directly on the core semantic content of the cluster, often offering clues about the topics and debates that animate it in different periods. For instance, in the 1950s, one of the sentences closest to the representative vectors is Simon’s claim that “If man, according to this interpretation, makes decisions and choices that have some appearance of rationality, rationality in real life must involve something simpler than maximization of utility or profit” [@simonTheories1959, 259–260]. As for the most representative sentences, Allan Drazen [@drazenRecent1980, 294] warned in the 1980s that “Deciding on the suitable notion or definition of rationality is not an easy task,” in his survey of the disequilibrium-theory literature in macroeconomics.</w:t>
       </w:r>
     </w:p>
     <w:p>
@@ -1851,18 +1879,18 @@
         <w:rPr>
           <w:rtl w:val="0"/>
         </w:rPr>
-        <w:t xml:space="preserve">With all these indicators—and prior to any further qualitative investigation—we can already see that this semantic cluster is centrally relevant to our study, as it bears directly on the concept of rationality itself. Our textual approach is thus able to extract some specific uses of rationality, here debates on the meaning of rationality itself in economics, and to see the evolution of these uses across time but also across topics and subdisciplines (in game theory, macroeconomics, behavioral economics or evolutionary economics).</w:t>
-      </w:r>
-    </w:p>
-    <w:p>
-      <w:pPr>
-        <w:rPr/>
-      </w:pPr>
-      <w:r>
-        <w:rPr>
-          <w:rtl w:val="0"/>
-        </w:rPr>
-        <w:t xml:space="preserve">The bibliometric approach does not allow for such fine-grained temporal or cross-subdisciplinary exploration. In our bibliometric communities, no grouping addresses rationality and its limits in general across multiple decades. Rather, bibliometric analysis </w:t>
+        <w:t xml:space="preserve">With all these indicators—and prior to any further qualitative investigation—we can already see that this semantic cluster is centrally relevant to our study, as it bears directly on the concept of rationality itself. Our textual approach is thus able to extract some specific uses of rationality, here debates on the meaning of rationality itself in economics, allowing us to observe the evolution of these uses across time but also across topics and subdisciplines (in game theory, macroeconomics, behavioral economics, or evolutionary economics).</w:t>
+      </w:r>
+    </w:p>
+    <w:p>
+      <w:pPr>
+        <w:rPr/>
+      </w:pPr>
+      <w:r>
+        <w:rPr>
+          <w:rtl w:val="0"/>
+        </w:rPr>
+        <w:t xml:space="preserve">The bibliometric approach does not allow for such temporal or cross-subdisciplinary exploration. In our bibliometric communities, no grouping addresses rationality and its limits in general across multiple decades. Rather, bibliometric analysis </w:t>
       </w:r>
       <w:r>
         <w:rPr>
@@ -1876,27 +1904,27 @@
         </w:rPr>
         <w:t xml:space="preserve">n relation to semantic cluster 11, we observe, for instance, the emergence of a </w:t>
       </w:r>
-      <w:commentRangeStart w:id="0"/>
-      <w:commentRangeStart w:id="1"/>
+      <w:commentRangeStart w:id="2"/>
+      <w:commentRangeStart w:id="3"/>
       <w:r>
         <w:rPr>
           <w:rtl w:val="0"/>
         </w:rPr>
         <w:t xml:space="preserve">“Behavioral Economics and Choice Theory”</w:t>
       </w:r>
-      <w:commentRangeEnd w:id="0"/>
-      <w:r>
-        <w:commentReference w:id="0"/>
-      </w:r>
-      <w:commentRangeEnd w:id="1"/>
-      <w:r>
-        <w:commentReference w:id="1"/>
-      </w:r>
-      <w:r>
-        <w:rPr>
-          <w:rtl w:val="0"/>
-        </w:rPr>
-        <w:t xml:space="preserve"> community in the 1977–1984 window. As with the semantic clusters, for each bibliometric community in each temporal window we extract, notably, the sentences closest to the representative vectors—based on the articles belonging to the community—as well as the most cited references and the most identifying words. We also examine how each community in a given window originates (i.e., whether it derives primarily from the same or from different communities in preceding periods) and what it becomes in the following period (i.e., its subsequent “destiny”).</w:t>
+      <w:commentRangeEnd w:id="2"/>
+      <w:r>
+        <w:commentReference w:id="2"/>
+      </w:r>
+      <w:commentRangeEnd w:id="3"/>
+      <w:r>
+        <w:commentReference w:id="3"/>
+      </w:r>
+      <w:r>
+        <w:rPr>
+          <w:rtl w:val="0"/>
+        </w:rPr>
+        <w:t xml:space="preserve"> community in the 1977-1984 window. As with the semantic clusters, for each bibliometric community in each temporal window we extract, notably, the sentences closest to the representative vectors—based on the articles belonging to the community—as well as the most cited references and the most identifying words. We also examine how each community in a given window originates (i.e., whether it derives primarily from the same or from different communities in preceding periods) and what it becomes in the following period (i.e., its subsequent “destiny”).</w:t>
       </w:r>
       <w:r>
         <w:rPr>
@@ -1976,7 +2004,7 @@
         <w:rPr>
           <w:vertAlign w:val="superscript"/>
         </w:rPr>
-        <w:footnoteReference w:customMarkFollows="0" w:id="16"/>
+        <w:footnoteReference w:customMarkFollows="0" w:id="17"/>
       </w:r>
       <w:r>
         <w:rPr>
@@ -2036,18 +2064,7 @@
         <w:rPr>
           <w:rtl w:val="0"/>
         </w:rPr>
-        <w:t xml:space="preserve"> in 1900, the concept of rationality had already gained prominence, in line with the rise of scientific and abstract reasoning in the late nineteenth century. The scope of rational behavior was closely tied to debates on the proper domain of economic analysis [@giocoliModeling2003]. </w:t>
-      </w:r>
-    </w:p>
-    <w:p>
-      <w:pPr>
-        <w:rPr/>
-      </w:pPr>
-      <w:r>
-        <w:rPr>
-          <w:rtl w:val="0"/>
-        </w:rPr>
-        <w:t xml:space="preserve">With the marginalists, the economic agent was increasingly defined by calculative capacity. Jevons, for instance, portrayed the agent as a “calculating machine” balancing pleasures and pains, a view later formalized as utility maximization [@maasMechanical1999]. </w:t>
+        <w:t xml:space="preserve"> in 1900, the concept of rationality had already gained prominence, in line with the rise of scientific and abstract reasoning in the late nineteenth century. The scope of rational behavior was closely tied to debates on the proper domain of economic analysis [@giocoliModeling2003]. With the marginalists, the economic agent was increasingly defined by calculative capacity. Jevons, for instance, portrayed the agent as a “calculating machine” balancing pleasures and pains, a view later formalized as utility maximization [@maasMechanical1999]. </w:t>
       </w:r>
     </w:p>
     <w:p>
@@ -2070,7 +2087,7 @@
         <w:rPr>
           <w:vertAlign w:val="superscript"/>
         </w:rPr>
-        <w:footnoteReference w:customMarkFollows="0" w:id="17"/>
+        <w:footnoteReference w:customMarkFollows="0" w:id="18"/>
       </w:r>
       <w:r>
         <w:rPr>
@@ -2092,7 +2109,7 @@
         <w:rPr>
           <w:vertAlign w:val="superscript"/>
         </w:rPr>
-        <w:footnoteReference w:customMarkFollows="0" w:id="18"/>
+        <w:footnoteReference w:customMarkFollows="0" w:id="19"/>
       </w:r>
       <w:r>
         <w:rPr>
@@ -2254,7 +2271,7 @@
         <w:rPr>
           <w:vertAlign w:val="superscript"/>
         </w:rPr>
-        <w:footnoteReference w:customMarkFollows="0" w:id="19"/>
+        <w:footnoteReference w:customMarkFollows="0" w:id="20"/>
       </w:r>
       <w:r>
         <w:rPr>
@@ -2375,7 +2392,7 @@
         <w:rPr>
           <w:vertAlign w:val="superscript"/>
         </w:rPr>
-        <w:footnoteReference w:customMarkFollows="0" w:id="20"/>
+        <w:footnoteReference w:customMarkFollows="0" w:id="21"/>
       </w:r>
       <w:r>
         <w:rPr>
@@ -2435,7 +2452,7 @@
         <w:rPr>
           <w:vertAlign w:val="superscript"/>
         </w:rPr>
-        <w:footnoteReference w:customMarkFollows="0" w:id="21"/>
+        <w:footnoteReference w:customMarkFollows="0" w:id="22"/>
       </w:r>
       <w:r>
         <w:rPr>
@@ -2526,7 +2543,7 @@
         <w:rPr>
           <w:rtl w:val="0"/>
         </w:rPr>
-        <w:t xml:space="preserve">opening the path to modern financial economics. Their theorem, they argued, can be used “as a basis for rational investment decision-making within the firm” [@ModiglianiCost1958: 296]. </w:t>
+        <w:t xml:space="preserve">opening the path to modern financial economics. Their theorem, they argued, can be used “as a basis for rational investment decision-making within the firm” [@ModiglianiCost1958, 296]. </w:t>
       </w:r>
       <w:r>
         <w:rPr>
@@ -2957,7 +2974,7 @@
         <w:rPr>
           <w:rtl w:val="0"/>
         </w:rPr>
-        <w:t xml:space="preserve">This article is first and foremost methodological: it aims to demonstrate, through a concrete application, the usefulness of quantitative methods for the history of economic thought. Nonetheless, it does so by breaking new ground in the history and philosophy of economics. First, the corpus we build—comprising nearly 290,000 full-text economics articles spanning more than a century—is, to our knowledge, the largest and most comprehensive database ever used to study economic contributions in English. Second, this article constitutes the first application of quantitative methods to the study of semantic change within the history of economics, an area that represents an important and growing strand of the broader literature on quantitative text analysis [@peritiSystematic2024].</w:t>
+        <w:t xml:space="preserve">This article is first and foremost methodological: it aims to demonstrate, through a concrete application, the usefulness of quantitative methods for the history of economic thought. Nonetheless, it does so by breaking new ground in the history and philosophy of economics. First, the corpus we build—comprising nearly 290,000 full-text economics articles spanning more than a century—is, to our knowledge, the largest and most comprehensive database ever used to study economic contributions in English. Second, this article constitutes the first application of quantitative methods to the study of semantic change within the history of economics, an area that represents an important and growing strand of the broader literature on quantitative text analysis [@montanelliSurvey2024].</w:t>
       </w:r>
     </w:p>
     <w:p>
@@ -3058,16 +3075,16 @@
         </w:rPr>
         <w:t xml:space="preserve">Finally, these methods are also “discovery tools.” While they can be used to confirm or challenge existing claims in the history and philosophy of economics, they also help identify patterns that have so far been absent—or only marginally present—in the historical literature. </w:t>
       </w:r>
-      <w:commentRangeStart w:id="2"/>
+      <w:commentRangeStart w:id="4"/>
       <w:r>
         <w:rPr>
           <w:rtl w:val="0"/>
         </w:rPr>
         <w:t xml:space="preserve">We have briefly pointed to some of these patterns above.</w:t>
       </w:r>
-      <w:commentRangeEnd w:id="2"/>
-      <w:r>
-        <w:commentReference w:id="2"/>
+      <w:commentRangeEnd w:id="4"/>
+      <w:r>
+        <w:commentReference w:id="4"/>
       </w:r>
       <w:r>
         <w:rPr>
@@ -3113,7 +3130,7 @@
 
 <file path=word/comments.xml><?xml version="1.0" encoding="utf-8"?>
 <w:comments xmlns:mc="http://schemas.openxmlformats.org/markup-compatibility/2006" xmlns:o="urn:schemas-microsoft-com:office:office" xmlns:r="http://schemas.openxmlformats.org/officeDocument/2006/relationships" xmlns:m="http://schemas.openxmlformats.org/officeDocument/2006/math" xmlns:v="urn:schemas-microsoft-com:vml" xmlns:wp="http://schemas.openxmlformats.org/drawingml/2006/wordprocessingDrawing" xmlns:w10="urn:schemas-microsoft-com:office:word" xmlns:w="http://schemas.openxmlformats.org/wordprocessingml/2006/main" xmlns:wne="http://schemas.microsoft.com/office/word/2006/wordml" xmlns:sl="http://schemas.openxmlformats.org/schemaLibrary/2006/main" xmlns:a="http://schemas.openxmlformats.org/drawingml/2006/main" xmlns:pic="http://schemas.openxmlformats.org/drawingml/2006/picture" xmlns:c="http://schemas.openxmlformats.org/drawingml/2006/chart" xmlns:lc="http://schemas.openxmlformats.org/drawingml/2006/lockedCanvas" xmlns:dgm="http://schemas.openxmlformats.org/drawingml/2006/diagram" xmlns:wps="http://schemas.microsoft.com/office/word/2010/wordprocessingShape" xmlns:wpg="http://schemas.microsoft.com/office/word/2010/wordprocessingGroup" xmlns:w14="http://schemas.microsoft.com/office/word/2010/wordml" xmlns:w15="http://schemas.microsoft.com/office/word/2012/wordml" xmlns:w16="http://schemas.microsoft.com/office/word/2018/wordml" xmlns:w16cex="http://schemas.microsoft.com/office/word/2018/wordml/cex" xmlns:w16cid="http://schemas.microsoft.com/office/word/2016/wordml/cid" xmlns="http://schemas.microsoft.com/office/tasks/2019/documenttasks" xmlns:cr="http://schemas.microsoft.com/office/comments/2020/reactions">
-  <w:comment w:author="Aurélien Goutsmedt" w:id="2" w:date="2025-12-16T10:01:08Z">
+  <w:comment w:author="Aurélien Goutsmedt" w:id="0" w:date="2025-12-19T14:41:23Z">
     <w:p>
       <w:pPr>
         <w:keepNext w:val="0"/>
@@ -3164,11 +3181,11 @@
           <w:vertAlign w:val="baseline"/>
           <w:rtl w:val="0"/>
         </w:rPr>
-        <w:t xml:space="preserve">J'ai eu la flemme de mettre des exemples pour le moment.</w:t>
+        <w:t xml:space="preserve">Add the link</w:t>
       </w:r>
     </w:p>
   </w:comment>
-  <w:comment w:author="Thomas Delcey" w:id="0" w:date="2025-12-13T01:11:21Z">
+  <w:comment w:author="Aurélien Goutsmedt" w:id="1" w:date="2025-12-19T14:42:06Z">
     <w:p>
       <w:pPr>
         <w:keepNext w:val="0"/>
@@ -3219,11 +3236,11 @@
           <w:vertAlign w:val="baseline"/>
           <w:rtl w:val="0"/>
         </w:rPr>
-        <w:t xml:space="preserve">Est-ce qu'on garde le label IA dans la version finale ? On a pas vraiment checké à quel point c'était pertinent.</w:t>
+        <w:t xml:space="preserve">Check if 1 or 2 at the end</w:t>
       </w:r>
     </w:p>
   </w:comment>
-  <w:comment w:author="Aurélien Goutsmedt" w:id="1" w:date="2025-12-13T11:14:16Z">
+  <w:comment w:author="Aurélien Goutsmedt" w:id="4" w:date="2025-12-16T10:01:08Z">
     <w:p>
       <w:pPr>
         <w:keepNext w:val="0"/>
@@ -3274,9 +3291,11 @@
           <w:vertAlign w:val="baseline"/>
           <w:rtl w:val="0"/>
         </w:rPr>
-        <w:t xml:space="preserve">A voir si on a le temps de renommer... </w:t>
-      </w:r>
-    </w:p>
+        <w:t xml:space="preserve">J'ai eu la flemme de mettre des exemples pour le moment.</w:t>
+      </w:r>
+    </w:p>
+  </w:comment>
+  <w:comment w:author="Thomas Delcey" w:id="2" w:date="2025-12-13T01:11:21Z">
     <w:p>
       <w:pPr>
         <w:keepNext w:val="0"/>
@@ -3327,7 +3346,170 @@
           <w:vertAlign w:val="baseline"/>
           <w:rtl w:val="0"/>
         </w:rPr>
+        <w:t xml:space="preserve">Est-ce qu'on garde le label IA dans la version finale ? On a pas vraiment checké à quel point c'était pertinent.</w:t>
+      </w:r>
+    </w:p>
+  </w:comment>
+  <w:comment w:author="Aurélien Goutsmedt" w:id="3" w:date="2025-12-13T11:14:16Z">
+    <w:p>
+      <w:pPr>
+        <w:keepNext w:val="0"/>
+        <w:keepLines w:val="0"/>
+        <w:pageBreakBefore w:val="0"/>
+        <w:widowControl w:val="0"/>
+        <w:pBdr>
+          <w:top w:space="0" w:sz="0" w:val="nil"/>
+          <w:left w:space="0" w:sz="0" w:val="nil"/>
+          <w:bottom w:space="0" w:sz="0" w:val="nil"/>
+          <w:right w:space="0" w:sz="0" w:val="nil"/>
+          <w:between w:space="0" w:sz="0" w:val="nil"/>
+        </w:pBdr>
+        <w:shd w:fill="auto" w:val="clear"/>
+        <w:spacing w:after="0" w:before="0" w:line="240" w:lineRule="auto"/>
+        <w:ind w:left="0" w:right="0" w:firstLine="0"/>
+        <w:jc w:val="left"/>
+        <w:rPr>
+          <w:rFonts w:ascii="Arial" w:cs="Arial" w:eastAsia="Arial" w:hAnsi="Arial"/>
+          <w:b w:val="0"/>
+          <w:bCs w:val="0"/>
+          <w:i w:val="0"/>
+          <w:iCs w:val="0"/>
+          <w:smallCaps w:val="0"/>
+          <w:strike w:val="0"/>
+          <w:color w:val="000000"/>
+          <w:sz w:val="22"/>
+          <w:szCs w:val="22"/>
+          <w:u w:val="none"/>
+          <w:shd w:fill="auto" w:val="clear"/>
+          <w:vertAlign w:val="baseline"/>
+        </w:rPr>
+      </w:pPr>
+      <w:r>
+        <w:rPr>
+          <w:rFonts w:ascii="Arial" w:cs="Arial" w:eastAsia="Arial" w:hAnsi="Arial"/>
+          <w:b w:val="0"/>
+          <w:bCs w:val="0"/>
+          <w:i w:val="0"/>
+          <w:iCs w:val="0"/>
+          <w:smallCaps w:val="0"/>
+          <w:strike w:val="0"/>
+          <w:color w:val="000000"/>
+          <w:sz w:val="22"/>
+          <w:szCs w:val="22"/>
+          <w:u w:val="none"/>
+          <w:shd w:fill="auto" w:val="clear"/>
+          <w:vertAlign w:val="baseline"/>
+          <w:rtl w:val="0"/>
+        </w:rPr>
+        <w:t xml:space="preserve">A voir si on a le temps de renommer... </w:t>
+      </w:r>
+    </w:p>
+    <w:p>
+      <w:pPr>
+        <w:keepNext w:val="0"/>
+        <w:keepLines w:val="0"/>
+        <w:pageBreakBefore w:val="0"/>
+        <w:widowControl w:val="0"/>
+        <w:pBdr>
+          <w:top w:space="0" w:sz="0" w:val="nil"/>
+          <w:left w:space="0" w:sz="0" w:val="nil"/>
+          <w:bottom w:space="0" w:sz="0" w:val="nil"/>
+          <w:right w:space="0" w:sz="0" w:val="nil"/>
+          <w:between w:space="0" w:sz="0" w:val="nil"/>
+        </w:pBdr>
+        <w:shd w:fill="auto" w:val="clear"/>
+        <w:spacing w:after="0" w:before="0" w:line="240" w:lineRule="auto"/>
+        <w:ind w:left="0" w:right="0" w:firstLine="0"/>
+        <w:jc w:val="left"/>
+        <w:rPr>
+          <w:rFonts w:ascii="Arial" w:cs="Arial" w:eastAsia="Arial" w:hAnsi="Arial"/>
+          <w:b w:val="0"/>
+          <w:bCs w:val="0"/>
+          <w:i w:val="0"/>
+          <w:iCs w:val="0"/>
+          <w:smallCaps w:val="0"/>
+          <w:strike w:val="0"/>
+          <w:color w:val="000000"/>
+          <w:sz w:val="22"/>
+          <w:szCs w:val="22"/>
+          <w:u w:val="none"/>
+          <w:shd w:fill="auto" w:val="clear"/>
+          <w:vertAlign w:val="baseline"/>
+        </w:rPr>
+      </w:pPr>
+      <w:r>
+        <w:rPr>
+          <w:rFonts w:ascii="Arial" w:cs="Arial" w:eastAsia="Arial" w:hAnsi="Arial"/>
+          <w:b w:val="0"/>
+          <w:bCs w:val="0"/>
+          <w:i w:val="0"/>
+          <w:iCs w:val="0"/>
+          <w:smallCaps w:val="0"/>
+          <w:strike w:val="0"/>
+          <w:color w:val="000000"/>
+          <w:sz w:val="22"/>
+          <w:szCs w:val="22"/>
+          <w:u w:val="none"/>
+          <w:shd w:fill="auto" w:val="clear"/>
+          <w:vertAlign w:val="baseline"/>
+          <w:rtl w:val="0"/>
+        </w:rPr>
         <w:t xml:space="preserve">J'aurais bien changé pour les semantic cluster, tout en gardant le numéro.</w:t>
+      </w:r>
+    </w:p>
+  </w:comment>
+  <w:comment w:author="Aurélien Goutsmedt" w:id="5" w:date="2025-12-19T15:03:23Z">
+    <w:p>
+      <w:pPr>
+        <w:keepNext w:val="0"/>
+        <w:keepLines w:val="0"/>
+        <w:pageBreakBefore w:val="0"/>
+        <w:widowControl w:val="0"/>
+        <w:pBdr>
+          <w:top w:space="0" w:sz="0" w:val="nil"/>
+          <w:left w:space="0" w:sz="0" w:val="nil"/>
+          <w:bottom w:space="0" w:sz="0" w:val="nil"/>
+          <w:right w:space="0" w:sz="0" w:val="nil"/>
+          <w:between w:space="0" w:sz="0" w:val="nil"/>
+        </w:pBdr>
+        <w:shd w:fill="auto" w:val="clear"/>
+        <w:spacing w:after="0" w:before="0" w:line="240" w:lineRule="auto"/>
+        <w:ind w:left="0" w:right="0" w:firstLine="0"/>
+        <w:jc w:val="left"/>
+        <w:rPr>
+          <w:rFonts w:ascii="Arial" w:cs="Arial" w:eastAsia="Arial" w:hAnsi="Arial"/>
+          <w:b w:val="0"/>
+          <w:bCs w:val="0"/>
+          <w:i w:val="0"/>
+          <w:iCs w:val="0"/>
+          <w:smallCaps w:val="0"/>
+          <w:strike w:val="0"/>
+          <w:color w:val="000000"/>
+          <w:sz w:val="22"/>
+          <w:szCs w:val="22"/>
+          <w:u w:val="none"/>
+          <w:shd w:fill="auto" w:val="clear"/>
+          <w:vertAlign w:val="baseline"/>
+        </w:rPr>
+      </w:pPr>
+      <w:r>
+        <w:rPr>
+          <w:rFonts w:ascii="Arial" w:cs="Arial" w:eastAsia="Arial" w:hAnsi="Arial"/>
+          <w:b w:val="0"/>
+          <w:bCs w:val="0"/>
+          <w:i w:val="0"/>
+          <w:iCs w:val="0"/>
+          <w:smallCaps w:val="0"/>
+          <w:strike w:val="0"/>
+          <w:color w:val="000000"/>
+          <w:sz w:val="22"/>
+          <w:szCs w:val="22"/>
+          <w:u w:val="none"/>
+          <w:shd w:fill="auto" w:val="clear"/>
+          <w:vertAlign w:val="baseline"/>
+          <w:rtl w:val="0"/>
+        </w:rPr>
+        <w:t xml:space="preserve">One or two</w:t>
       </w:r>
     </w:p>
   </w:comment>
@@ -3385,7 +3567,7 @@
       </w:r>
     </w:p>
   </w:footnote>
-  <w:footnote w:id="5">
+  <w:footnote w:id="6">
     <w:p>
       <w:pPr>
         <w:spacing w:before="0" w:line="240" w:lineRule="auto"/>
@@ -3437,7 +3619,7 @@
       </w:r>
     </w:p>
   </w:footnote>
-  <w:footnote w:id="2">
+  <w:footnote w:id="3">
     <w:p>
       <w:pPr>
         <w:spacing w:after="0" w:before="0" w:line="240" w:lineRule="auto"/>
@@ -3476,7 +3658,7 @@
       </w:r>
     </w:p>
   </w:footnote>
-  <w:footnote w:id="4">
+  <w:footnote w:id="5">
     <w:p>
       <w:pPr>
         <w:spacing w:after="0" w:before="0" w:line="240" w:lineRule="auto"/>
@@ -3517,7 +3699,7 @@
       </w:r>
     </w:p>
   </w:footnote>
-  <w:footnote w:id="3">
+  <w:footnote w:id="4">
     <w:p>
       <w:pPr>
         <w:spacing w:after="0" w:before="0" w:line="240" w:lineRule="auto"/>
@@ -3543,7 +3725,7 @@
       </w:r>
     </w:p>
   </w:footnote>
-  <w:footnote w:id="6">
+  <w:footnote w:id="7">
     <w:p>
       <w:pPr>
         <w:spacing w:after="0" w:before="0" w:line="240" w:lineRule="auto"/>
@@ -3569,7 +3751,7 @@
       </w:r>
     </w:p>
   </w:footnote>
-  <w:footnote w:id="7">
+  <w:footnote w:id="8">
     <w:p>
       <w:pPr>
         <w:spacing w:after="0" w:before="0" w:line="240" w:lineRule="auto"/>
@@ -3603,7 +3785,7 @@
       </w:r>
     </w:p>
   </w:footnote>
-  <w:footnote w:id="8">
+  <w:footnote w:id="9">
     <w:p>
       <w:pPr>
         <w:spacing w:after="0" w:before="0" w:line="240" w:lineRule="auto"/>
@@ -3629,7 +3811,7 @@
       </w:r>
     </w:p>
   </w:footnote>
-  <w:footnote w:id="9">
+  <w:footnote w:id="10">
     <w:p>
       <w:pPr>
         <w:spacing w:after="0" w:before="0" w:line="240" w:lineRule="auto"/>
@@ -3655,7 +3837,7 @@
       </w:r>
     </w:p>
   </w:footnote>
-  <w:footnote w:id="10">
+  <w:footnote w:id="11">
     <w:p>
       <w:pPr>
         <w:spacing w:after="0" w:before="0" w:line="240" w:lineRule="auto"/>
@@ -3703,7 +3885,7 @@
       </w:r>
     </w:p>
   </w:footnote>
-  <w:footnote w:id="12">
+  <w:footnote w:id="13">
     <w:p>
       <w:pPr>
         <w:spacing w:after="0" w:before="0" w:line="240" w:lineRule="auto"/>
@@ -3729,7 +3911,7 @@
       </w:r>
     </w:p>
   </w:footnote>
-  <w:footnote w:id="13">
+  <w:footnote w:id="14">
     <w:p>
       <w:pPr>
         <w:spacing w:after="0" w:before="0" w:line="240" w:lineRule="auto"/>
@@ -3751,11 +3933,11 @@
           <w:szCs w:val="20"/>
           <w:rtl w:val="0"/>
         </w:rPr>
-        <w:t xml:space="preserve"> Note here that we don’t use overlapping windows in this case, notably for computational reasons: finding HDSBCAN clusters on a set of tens of thousands of sentences is much computationally intensive than finding bibliographic communities for at most five thousands of articles..</w:t>
+        <w:t xml:space="preserve"> We don’t use overlapping windows in this case, notably for computational reasons: finding HDSBCAN clusters on a set of tens of thousands of sentences is much more computationally intensive than finding bibliometric communities for at most five thousands of articles.</w:t>
       </w:r>
     </w:p>
   </w:footnote>
-  <w:footnote w:id="14">
+  <w:footnote w:id="15">
     <w:p>
       <w:pPr>
         <w:spacing w:after="0" w:before="0" w:line="240" w:lineRule="auto"/>
@@ -3777,11 +3959,11 @@
           <w:szCs w:val="20"/>
           <w:rtl w:val="0"/>
         </w:rPr>
-        <w:t xml:space="preserve"> Refer to the appendix for more details about this.</w:t>
+        <w:t xml:space="preserve"> Refer to the appendix for details.</w:t>
       </w:r>
     </w:p>
   </w:footnote>
-  <w:footnote w:id="15">
+  <w:footnote w:id="16">
     <w:p>
       <w:pPr>
         <w:spacing w:after="0" w:before="0" w:line="240" w:lineRule="auto"/>
@@ -3803,22 +3985,11 @@
           <w:szCs w:val="20"/>
           <w:rtl w:val="0"/>
         </w:rPr>
-        <w:t xml:space="preserve"> </w:t>
-      </w:r>
-      <w:r>
-        <w:rPr>
-          <w:rtl w:val="0"/>
-        </w:rPr>
-        <w:t xml:space="preserve">Modeling choices (for example, the minimum size of clusters in the HDBSCAN algorithm) affect the partition in communities and clusters. Since these outputs are never self-interpreting and always require human qualitative assessment, it is time consuming to conduct robustness checks. </w:t>
-      </w:r>
-      <w:r>
-        <w:rPr>
-          <w:rtl w:val="0"/>
-        </w:rPr>
+        <w:t xml:space="preserve"> Modeling choices (for example, the minimum size of clusters in the HDBSCAN algorithm) affect the partition in communities and clusters. Since these outputs are never self-interpreting and always require human qualitative assessment, it is time consuming to conduct robustness checks. </w:t>
       </w:r>
     </w:p>
   </w:footnote>
-  <w:footnote w:id="11">
+  <w:footnote w:id="12">
     <w:p>
       <w:pPr>
         <w:spacing w:after="0" w:before="0" w:line="240" w:lineRule="auto"/>
@@ -3840,7 +4011,33 @@
           <w:szCs w:val="20"/>
           <w:rtl w:val="0"/>
         </w:rPr>
-        <w:t xml:space="preserve"> “Unsupervised” does not mean that the modeller has no influence on the output. The analysts must choose a particular model and its parameters and these choices embed methodological priors about the types of patterns the procedure is likely to reveal. For instance, one famous crucial parameter in many unsupervised models is the number of categories that will emerge from the algorithm.</w:t>
+        <w:t xml:space="preserve"> “Unsupervised” does not mean that the modeller has no influence on the output. The analyst must choose a particular model and its parameters and these choices embed methodological priors about the types of patterns the procedure is likely to reveal. For instance, one crucial parameter in many unsupervised models is the number of categories that will emerge from the algorithm.</w:t>
+      </w:r>
+    </w:p>
+  </w:footnote>
+  <w:footnote w:id="18">
+    <w:p>
+      <w:pPr>
+        <w:spacing w:after="0" w:before="0" w:line="240" w:lineRule="auto"/>
+        <w:rPr>
+          <w:sz w:val="20"/>
+          <w:szCs w:val="20"/>
+        </w:rPr>
+      </w:pPr>
+      <w:r>
+        <w:rPr>
+          <w:rStyle w:val="FootnoteReference"/>
+          <w:vertAlign w:val="superscript"/>
+        </w:rPr>
+        <w:footnoteRef/>
+      </w:r>
+      <w:r>
+        <w:rPr>
+          <w:sz w:val="20"/>
+          <w:szCs w:val="20"/>
+          <w:rtl w:val="0"/>
+        </w:rPr>
+        <w:t xml:space="preserve"> However, because we focus on English, published articles, our clusters are likely biased toward American journals, notably in the first decades.</w:t>
       </w:r>
     </w:p>
   </w:footnote>
@@ -3866,11 +4063,40 @@
           <w:szCs w:val="20"/>
           <w:rtl w:val="0"/>
         </w:rPr>
-        <w:t xml:space="preserve"> However, because we focus on English, published articles, our clusters are likely biased toward American journals, notably in the first decades.</w:t>
+        <w:t xml:space="preserve"> </w:t>
+      </w:r>
+      <w:r>
+        <w:rPr>
+          <w:sz w:val="20"/>
+          <w:szCs w:val="20"/>
+          <w:rtl w:val="0"/>
+        </w:rPr>
+        <w:t xml:space="preserve">Of course, as in any historical inquiry of this kind, we are not entirely protected from selective emphasis, all the more so given that the scope of our study is too broad to summarize every pattern revealed by our results. Other scholars could have, at various junctures, pursued different interpretive directions on the basis of the same material. The publication of the </w:t>
+      </w:r>
+      <w:commentRangeStart w:id="5"/>
+      <w:r>
+        <w:rPr>
+          <w:sz w:val="20"/>
+          <w:szCs w:val="20"/>
+          <w:rtl w:val="0"/>
+        </w:rPr>
+        <w:t xml:space="preserve">interactive applications</w:t>
+      </w:r>
+      <w:commentRangeEnd w:id="5"/>
+      <w:r>
+        <w:commentReference w:id="5"/>
+      </w:r>
+      <w:r>
+        <w:rPr>
+          <w:sz w:val="20"/>
+          <w:szCs w:val="20"/>
+          <w:rtl w:val="0"/>
+        </w:rPr>
+        <w:t xml:space="preserve"> we used to explore the results thus serves as an exercise in transparency and—in addition to being, we hope, useful for historians of economic thought more generally—allows readers to assess the robustness and limits of our narrative.</w:t>
       </w:r>
     </w:p>
   </w:footnote>
-  <w:footnote w:id="16">
+  <w:footnote w:id="19">
     <w:p>
       <w:pPr>
         <w:spacing w:after="0" w:before="0" w:line="240" w:lineRule="auto"/>
@@ -3892,19 +4118,11 @@
           <w:szCs w:val="20"/>
           <w:rtl w:val="0"/>
         </w:rPr>
-        <w:t xml:space="preserve"> </w:t>
-      </w:r>
-      <w:r>
-        <w:rPr>
-          <w:sz w:val="20"/>
-          <w:szCs w:val="20"/>
-          <w:rtl w:val="0"/>
-        </w:rPr>
-        <w:t xml:space="preserve">Of course, as in any historical inquiry of this kind, we are not entirely protected from selective emphasis and from choosing illustrations that support a particular line of interpretation—all the more so given that the scope of our study is too broad to summarize every pattern revealed by our results. Other scholars could have, at various junctures, pursued different interpretive directions on the basis of the same material. The publication of the interactive applications we used to explore the results thus serves as an exercise in transparency and—in addition to being, we hope, useful for historians of economic thought more generally—allows readers to assess the robustness and limits of our narrative.</w:t>
+        <w:t xml:space="preserve"> Some years earlier, @mitchellRationality1910[97; see semantic cluster 9 and 4] already pushed forward similar claims, regretting that “few economists have regarded the study of psychology as a necessary part of the equipment of their work”, often relying on “tacit preconceptions” rather than to seek to “psychologists to gain a knowledge of the mind and its modes of operation”.</w:t>
       </w:r>
     </w:p>
   </w:footnote>
-  <w:footnote w:id="18">
+  <w:footnote w:id="21">
     <w:p>
       <w:pPr>
         <w:spacing w:after="0" w:before="0" w:line="240" w:lineRule="auto"/>
@@ -3926,7 +4144,34 @@
           <w:szCs w:val="20"/>
           <w:rtl w:val="0"/>
         </w:rPr>
-        <w:t xml:space="preserve"> Some years earlier, @mitchellRationality1910[97; see semantic cluster 9 and 4] already pushed forward similar claims, regretting that “few economists have regarded the study of psychology as a necessary part of the equipment of their work”, often relying on “tacit preconceptions” rather than to seek to “psychologists to gain a knowledge of the mind and its modes of operation”.</w:t>
+        <w:t xml:space="preserve"> This grouping of sentences in the 1970s actually took its origins in the semantic cluster 14 on utility, which ended in the 1960s, with a focus on welfare economics.</w:t>
+      </w:r>
+    </w:p>
+  </w:footnote>
+  <w:footnote w:id="22">
+    <w:p>
+      <w:pPr>
+        <w:spacing w:before="0" w:line="240" w:lineRule="auto"/>
+        <w:ind w:right="600"/>
+        <w:rPr>
+          <w:sz w:val="20"/>
+          <w:szCs w:val="20"/>
+        </w:rPr>
+      </w:pPr>
+      <w:r>
+        <w:rPr>
+          <w:rStyle w:val="FootnoteReference"/>
+          <w:vertAlign w:val="superscript"/>
+        </w:rPr>
+        <w:footnoteRef/>
+      </w:r>
+      <w:r>
+        <w:rPr>
+          <w:sz w:val="20"/>
+          <w:szCs w:val="20"/>
+          <w:rtl w:val="0"/>
+        </w:rPr>
+        <w:t xml:space="preserve"> This highlights a key caveat. Because these methods foreground statistically “significant” patterns and indicators’ prevalence, they are not always well suited to tracing and interpreting the origins of a concept or theory with the care that close historical study and archival research provide.</w:t>
       </w:r>
     </w:p>
   </w:footnote>
@@ -3952,15 +4197,37 @@
           <w:szCs w:val="20"/>
           <w:rtl w:val="0"/>
         </w:rPr>
-        <w:t xml:space="preserve"> This grouping of sentences in the 1970s actually took its origins in the semantic cluster 14 on utility, which ended in the 1960s, with a focus on welfare economics.</w:t>
+        <w:t xml:space="preserve"> </w:t>
+      </w:r>
+      <w:r>
+        <w:rPr>
+          <w:rtl w:val="0"/>
+        </w:rPr>
+        <w:t xml:space="preserve">Machlup’s position was that even if a “goodly portion of all business behavior may be non-rational, thoughtless, [or] blindly repetitive” [-@machlupMarginal1946, 520], questionnaire evidence and empirical findings more generally did not demonstrate the failure of marginal theory when properly interpreted. In a similar defense of profit maximization, Leonid @hurwiczTheory1946[110] first acknowledged that it was not “inconceivable that business is run more by routine than by rationality”, but argued that behavior may appear irrational or merely “routine” from the standpoint of a purely static theory that ignores uncertainty, while proving fully “rational” once uncertainty and long-run effects are taken into account [see also @</w:t>
+      </w:r>
+      <w:r>
+        <w:rPr>
+          <w:rtl w:val="0"/>
+        </w:rPr>
+        <w:t xml:space="preserve">herfeldTheories2018]</w:t>
+      </w:r>
+      <w:r>
+        <w:rPr>
+          <w:rtl w:val="0"/>
+        </w:rPr>
+        <w:t xml:space="preserve">.</w:t>
+      </w:r>
+      <w:r>
+        <w:rPr>
+          <w:rtl w:val="0"/>
+        </w:rPr>
       </w:r>
     </w:p>
   </w:footnote>
-  <w:footnote w:id="21">
-    <w:p>
-      <w:pPr>
-        <w:spacing w:before="0" w:line="240" w:lineRule="auto"/>
-        <w:ind w:right="600"/>
+  <w:footnote w:id="2">
+    <w:p>
+      <w:pPr>
+        <w:spacing w:after="0" w:before="0" w:line="240" w:lineRule="auto"/>
         <w:rPr>
           <w:sz w:val="20"/>
           <w:szCs w:val="20"/>
@@ -3979,56 +4246,7 @@
           <w:szCs w:val="20"/>
           <w:rtl w:val="0"/>
         </w:rPr>
-        <w:t xml:space="preserve"> This highlights a key caveat. Because these methods foreground statistically “significant” patterns and indicators’ prevalence, they are not always well suited to tracing and interpreting the origins of a concept or theory with the care that close historical study and archival research provide.</w:t>
-      </w:r>
-    </w:p>
-  </w:footnote>
-  <w:footnote w:id="19">
-    <w:p>
-      <w:pPr>
-        <w:spacing w:after="0" w:before="0" w:line="240" w:lineRule="auto"/>
-        <w:rPr>
-          <w:sz w:val="20"/>
-          <w:szCs w:val="20"/>
-        </w:rPr>
-      </w:pPr>
-      <w:r>
-        <w:rPr>
-          <w:rStyle w:val="FootnoteReference"/>
-          <w:vertAlign w:val="superscript"/>
-        </w:rPr>
-        <w:footnoteRef/>
-      </w:r>
-      <w:r>
-        <w:rPr>
-          <w:sz w:val="20"/>
-          <w:szCs w:val="20"/>
-          <w:rtl w:val="0"/>
-        </w:rPr>
-        <w:t xml:space="preserve"> </w:t>
-      </w:r>
-      <w:r>
-        <w:rPr>
-          <w:rtl w:val="0"/>
-        </w:rPr>
-        <w:t xml:space="preserve">Machlup’s position was that even if a “goodly portion of all business behavior may be non-rational, thoughtless, [or] blindly repetitive” [-@machlupMarginal1946, 520], questionnaire evidence and empirical findings more generally did not demonstrate the failure of marginal theory when properly interpreted. In a similar defense of profit maximization, Leonid @hurwiczTheory1946[110] first acknowledged that it was not “inconceivable that business is run more by routine than by rationality”, but argued that behavior may appear irrational or merely “routine” from the standpoint of a purely static theory that ignores uncertainty, while proving fully “rational” once uncertainty and long-run effects are taken into account [see also @</w:t>
-      </w:r>
-      <w:r>
-        <w:rPr>
-          <w:rtl w:val="0"/>
-        </w:rPr>
-        <w:t xml:space="preserve">herfeldTheories2018]</w:t>
-      </w:r>
-      <w:r>
-        <w:rPr>
-          <w:rtl w:val="0"/>
-        </w:rPr>
-        <w:t xml:space="preserve">.</w:t>
-      </w:r>
-      <w:r>
-        <w:rPr>
-          <w:rtl w:val="0"/>
-        </w:rPr>
+        <w:t xml:space="preserve"> The application is available here: LINK</w:t>
       </w:r>
     </w:p>
   </w:footnote>

</xml_diff>

<commit_message>
New version of paper after finishing rereading everything
</commit_message>
<xml_diff>
--- a/paper/gdoc.docx
+++ b/paper/gdoc.docx
@@ -1256,7 +1256,7 @@
         <w:rPr>
           <w:rtl w:val="0"/>
         </w:rPr>
-        <w:t xml:space="preserve">Historians routinely discuss scientific influence and recognition using proxies such as major grants, prizes, and honors. For example, Sent’s [-@sent_behavioral_2004] narrative of the transition from the dominance of rational choice, through the limited success of “old” behavioral economics (with contributions by, e.g., Simon and George Katona), to the emergence of “new” behavioral economics is organized around such milestones. In this sense, citations serve as a complementary proxy alongside these traditional indicators. For instance, although both Simon and Kahneman received the Nobel Prize, Kahneman ultimately exerted a broader influence on the discipline—something that is reflected in citation patterns. </w:t>
+        <w:t xml:space="preserve">Historians routinely discuss scientific influence and recognition using proxies such as major grants, prizes, and honors. For example, Sent’s [-@sent_behavioral_2004] narrative of the transition from the dominance of rational choice, through the limited success of “old” behavioral economics (with contributions by, e.g., Simon and George Katona), to the emergence of “new” behavioral economics is organized around such milestones. In this sense, citations serve as a complementary proxy alongside these traditional indicators. For instance, although both Simon and Daniel Kahneman received the Nobel Prize, Kahneman ultimately exerted a broader influence on the discipline—something that is reflected in citation patterns. </w:t>
       </w:r>
     </w:p>
     <w:p>
@@ -2115,7 +2115,7 @@
         <w:rPr>
           <w:rtl w:val="0"/>
         </w:rPr>
-        <w:t xml:space="preserve"> Such criticism did not falter in the 1920s. In cluster 11—centered at the time on rationalisation and human reason—@tugwellHuman1922[317] encouraged economists to move beyond the “rigid classical </w:t>
+        <w:t xml:space="preserve"> Such criticism did not falter in the 1920s. In cluster 11—centered at the time on “rationalisation” and “human reason”—@tugwellHuman1922[317] encouraged economists to move beyond the “rigid classical </w:t>
       </w:r>
       <w:r>
         <w:rPr>
@@ -2277,7 +2277,7 @@
         <w:rPr>
           <w:rtl w:val="0"/>
         </w:rPr>
-        <w:t xml:space="preserve"> The marginalist controversy more generally provided a key intellectual background for Friedman’s essay on positive economics [-@friedmanMethodology1953], in which he formulated the famous “as if” principle to justify, among other assumptions, profit maximization. Interestingly, in the 1950s the most cited articles within cluster 12 were Machlup’s [-@machlupMarginal1946] and Friedman’s [@friedmanUtility1948], both of which relied heavily on “as if” reasoning, notably to justify the assumption of expected utility.</w:t>
+        <w:t xml:space="preserve"> The marginalist controversy more generally provided a key intellectual background for Friedman’s essay on positive economics [-@friedmanMethodology1953], in which he formulated the famous “as if” principle to justify, among other assumptions, profit maximization. Interestingly, in the 1950s the most cited articles within cluster 12 were Machlup’s [-@machlupMarginal1946] and Friedman’s [@friedmanUtility1948], both of which relied heavily on “as if” reasoning, notably to justify, in the latter, the behavior of agents regarding expected utility.</w:t>
       </w:r>
     </w:p>
     <w:p>
@@ -2338,7 +2338,7 @@
         <w:rPr>
           <w:rtl w:val="0"/>
         </w:rPr>
-        <w:t xml:space="preserve">, the normative dimension expanded—from individual behavior to questions of social choice and to the design of “rationalizing” policies [@herfeldTheories2018; @handsNormative2015].</w:t>
+        <w:t xml:space="preserve">, the normative dimension expanded—from individual behavior to questions of social choice and of “rationalizing” policies [@ericksonHow2013; @handsNormative2015].</w:t>
       </w:r>
     </w:p>
     <w:p>
@@ -2366,7 +2366,7 @@
         <w:rPr>
           <w:rtl w:val="0"/>
         </w:rPr>
-        <w:t xml:space="preserve">As rationality increasingly came to be framed through modern microeconomics, the concept was extended to both individual and collective choice.</w:t>
+        <w:t xml:space="preserve">As rationality increasingly came to be framed through modern microeconomics, the concept was extended to collective choice.</w:t>
       </w:r>
       <w:r>
         <w:rPr>
@@ -2386,7 +2386,7 @@
         <w:rPr>
           <w:rtl w:val="0"/>
         </w:rPr>
-        <w:t xml:space="preserve">luster 5—gathering sentences on decision theory—the  rational “decision making” is not applied not only for individuals but also for firms and public policy. It is also in this cluster that issues of social choice emerge, notably debates on the implications of Arrow’s impossibility theorem [-@arrowSocial1951; see e.g. @igersheimDeath2019].</w:t>
+        <w:t xml:space="preserve">luster 5—gathering sentences on decision theory—the  rational “decision making” is applied not only for individuals but also for firms and public policy. It is in this cluster that issues of social choice emerge, notably through debates on the implications of Arrow’s impossibility theorem [-@arrowSocial1951; see e.g. @igersheimDeath2019].</w:t>
       </w:r>
       <w:r>
         <w:rPr>
@@ -2398,7 +2398,7 @@
         <w:rPr>
           <w:rtl w:val="0"/>
         </w:rPr>
-        <w:t xml:space="preserve"> Arrow’s contribution also stimulated the formation of cluster 16 on law and economics in the 1960s, where it appears as the primary reference, alongside works by @downsEconomic1957 and @buchananCalculus1962. This cluster is closely associated with publications by </w:t>
+        <w:t xml:space="preserve"> Arrow’s contribution also stimulated the formation of cluster 16 in the 1960s, where it appears as the primary reference, alongside works by @downsEconomic1957 and @buchananCalculus1962. This cluster is closely associated with publications by </w:t>
       </w:r>
       <w:r>
         <w:rPr>
@@ -2434,7 +2434,7 @@
         <w:rPr>
           <w:rtl w:val="0"/>
         </w:rPr>
-        <w:t xml:space="preserve">We have seen how the meaning of rationality progressively transformed and formalized after the 1930s, and how the rationalization of collective decision-making became central in the postwar period. So far, however, we have said little about macroeconomics. Macroeconomics constituted a relatively important semantic cluster from the beginning of our period, in 1900, notably through monetary economics (cluster 1). This cluster grew in importance in the 1930s, particularly in connection with debates surrounding Keynes’s work, liquidity preference, and unemployment. It is only in the 1970s, however, that this cluster becomes dominant in our panorama of rationality. This shift is closely linked to the emergence of the concept of “rational expectations,” which profoundly transformed the way rationality was discussed in economics.</w:t>
+        <w:t xml:space="preserve">We have seen how the meaning of rationality progressively transformed and formalized after the 1930s, and how the rationalization of collective decision-making became central in the postwar period. So far, however, we have said little about macroeconomics. Macro-oriented issues constituted a relatively important semantic cluster from the beginning of our period, in 1900, notably through monetary economics (cluster 1). This cluster grew in importance in the 1930s, in connection with debates surrounding Keynes’s work, liquidity preference, and unemployment. It is only in the 1970s, however, that this cluster becomes dominant in our panorama of rationality. This shift is closely linked to the emergence of the concept of “rational expectations,” which profoundly transformed the way rationality was discussed in economics.</w:t>
       </w:r>
       <w:r>
         <w:rPr>
@@ -2584,7 +2584,7 @@
         <w:rPr>
           <w:rtl w:val="0"/>
         </w:rPr>
-        <w:t xml:space="preserve">such as “assets,” “arbitrage,” and “capital asset pricing”. We also observe increasing proximities between the finance literature and the rational-expectations framework from the mid-1970s onward. This is both visible in the semantic clusters and in the bibliometric communities, in particular, the “Rational Expectations and Market Information,” which emerges in the 1976–1983 window. A central contribution found in both semantic and bibliometric clusters is @grossmanImpossibility1980, which draws on Lucas’s imperfect-information framework [@lucasExpectations1972] and combines rational expectations with noisy signals to question market efficiency. </w:t>
+        <w:t xml:space="preserve">such as “assets,” “arbitrage,” and “capital asset pricing”. We also observe increasing proximities between the finance literature and the rational-expectations framework from the mid-1970s onward. This is both visible in the semantic clusters and in the bibliometric communities, in particular, the “Rational Expectations and Market Information,” which emerges in the 1976-1983 window. A central contribution found in both semantic and bibliometric clusters is @grossmanImpossibility1980, which draws on Lucas’s imperfect-information framework [@lucasExpectations1972] and combines rational expectations with noisy signals to question market efficiency. </w:t>
       </w:r>
       <w:r>
         <w:rPr>
@@ -2606,7 +2606,7 @@
         <w:rPr>
           <w:rtl w:val="0"/>
         </w:rPr>
-        <w:t xml:space="preserve">The 1970s and 1980s thus marked a relative dominance of macroeconomics and finance, with comparatively less weight given to debates on individual rationality. This situation begins to change gradually from the 1980s onward. In the 1979–1986 bibliometric network, a “Behavioral Decision Theory” community appears (representing around 2% of the network), capturing the early emergence of behavioral economics as promoted by Kahneman and Tversky. In the 1990s, the rise of behavioral economics—together with new approaches in game theory—fundamentally altered this configuration, leading to more specialized investigations of individual rationality, which now dominate and are distributed across multiple bibliometric communities. This transformation represents not merely a shift in research topics, but a profound reframing of how economics approaches rationality: from an assumption embedded in </w:t>
+        <w:t xml:space="preserve">The 1970s and 1980s thus marked a relative dominance of macroeconomics and finance, with comparatively less weight given to debates on individual rationality. This situation begins to change gradually from the 1980s onward. In the 1979-1986 bibliometric network, a “Behavioral Decision Theory” community appears (representing around 2% of the network), capturing the early emergence of behavioral economics as promoted by Kahneman and Tversky. In the 1990s, the rise of behavioral economics—together with new approaches in game theory—fundamentally altered this configuration, leading to more specialized investigations of individual rationality, which now dominate and are distributed across multiple bibliometric communities. This transformation represents not merely a shift in research topics, but a profound reframing of how economics approaches rationality: from an assumption embedded in </w:t>
       </w:r>
       <w:r>
         <w:rPr>
@@ -2654,62 +2654,62 @@
         <w:rPr>
           <w:rtl w:val="0"/>
         </w:rPr>
-        <w:t xml:space="preserve">The term "behavioral economics" has a complex history. While nowadays it is mostly associated to Kahneman and Tversky, George Katona is often credited as an early adopter [@giladEconomic1984; @hosseiniGeorge2011]. To distinguish different strands of behavioral economics, @sent_behavioral_2004 made an historical distinction between “old” and “new” behavioral economics to separates the “old” heterogenous attempts by Katona, Simon and others to reform mainstream economics from the “new” more homogenous heuristic and biases research program of Kahneman and Tversky. Sent argues that "new" behavioral economics succeeded it was less radical than “old” approaches, and that it emerged in the 1980s when economic theory faced multiple epistemological challenges, creating an opportune moment for alternative approaches. </w:t>
-      </w:r>
-    </w:p>
-    <w:p>
-      <w:pPr>
-        <w:rPr/>
-      </w:pPr>
-      <w:r>
-        <w:rPr>
-          <w:rtl w:val="0"/>
-        </w:rPr>
-        <w:t xml:space="preserve">The divergent fates of Herbert Simon's bounded rationality and Daniel Kahneman and Amos Tversky's heuristics and biases approache present a striking puzzle in the history of economic thought. Both challenged standard rationality assumptions under a “behavioral economics” approach, both earned Nobel recognition, yet their reception patterns differed dramatically. While our method cannot pinpoint the exact epistemological reasons for this shift, we can trace the patterns of reception and influence of both approaches to understand how and when they diverged.</w:t>
-      </w:r>
-    </w:p>
-    <w:p>
-      <w:pPr>
-        <w:rPr/>
-      </w:pPr>
-      <w:r>
-        <w:rPr>
-          <w:rtl w:val="0"/>
-        </w:rPr>
-        <w:t xml:space="preserve">Our analysis suggests that Simon's concept of "bounded rationality" do stands as one of the most influential critiques of standard rationality in economics in the sense that it framed a lot of the debates surrounding rationality. His presence dominated 1960s and 1970s discussions with his seminal articles and Nobel lecture  [@simonRational1979] appearing across numerous research areas from social choice theory to the theory of the firm and price setting. The textual analysis demonstrates Simon's conceptual centrality: Cluster 11, which captures discussions of individual rationality in economics, transformed rapidly after Simon's influence rose in the 1970s. In the 1950s, the general discourse of economists centered on terms like "rational," "empirical reality," and "irrationality." By the 1970s, "bounded rationality" had become the cluster's most prevalent expression, and by the 1990s, discussions of "boundedly rational agents" and "procedural rationality" clearly positioned Simon's concepts as central to economic thought with a late but significant integration.</w:t>
-      </w:r>
-    </w:p>
-    <w:p>
-      <w:pPr>
-        <w:rPr/>
-      </w:pPr>
-      <w:r>
-        <w:rPr>
-          <w:rtl w:val="0"/>
-        </w:rPr>
-        <w:t xml:space="preserve">Not only did economists' language about rationality change radically after Simon's ideas gained traction, but these discussions also became substantially more prevalent. Cluster 11's share of all sentences grew from 5.76% in the 1950s to 7.85% in the 1980s, peaking at 9.56% in the 1990s. This represents a major shift in how much attention economics devoted to foundational questions about rationality. Citation analysis corroborates this late integration: references to @simonBehavioral1955 rose slowly after publication, with peak citations occurring only in the post-2000s period (@fig-rationality-paper-citations).</w:t>
-      </w:r>
-    </w:p>
-    <w:p>
-      <w:pPr>
-        <w:rPr/>
-      </w:pPr>
-      <w:r>
-        <w:rPr>
-          <w:rtl w:val="0"/>
-        </w:rPr>
-        <w:t xml:space="preserve">However, Simon's influence remained limited in two critical respects. First, the slow adoption of his framework meant that by the time it achieved conceptual prominence, it faced competition from "new" behavioral economics. After peaking in the 1990s, Cluster 11 declined to 7.43% of sentences in the early 2000s. While bounded rationality remained conceptually embedded in many parts of economics, a larger transformation was underway. Progressively after the 1980s, Cluster 11's relative importance decreased in favor of more specialized clusters, each addressing specific dimensions of rationality: Clusters 5 and 15 examined expected utility theory, risk, and ambiguity; Clusters 6 and 7 focused on intertemporal and other-regarding behavior. All these clusters grew increasingly important in the 1980s, with most of them individually surpassing Cluster 11 in sentence share. While they integrated bounded rationality ideas, they did so primarily through "new" behavioral economics concepts, from prospect theory for risk, to experimental paradigms like the ultimatum game for other-regarding behavior [@gualaParadigmatic2008].</w:t>
-      </w:r>
-    </w:p>
-    <w:p>
-      <w:pPr>
-        <w:rPr/>
-      </w:pPr>
-      <w:r>
-        <w:rPr>
-          <w:rtl w:val="0"/>
-        </w:rPr>
-        <w:t xml:space="preserve">Second, Simon's conceptual influence, spearheaded by bounded rationality, never translated into stable research communities. While his framework shaped how many economists approached rationality, very few actually developed the research program he initiated. Bibliometrically, only small, unstable clusters formed around Simon's work. In the 1960s and early 1970s, his ideas appeared in operations research circles (</w:t>
+        <w:t xml:space="preserve">The term “behavioral economics” has a complex history. While it is now mostly associated with the work of Kahneman and Amos Tversky, George Katona is often credited as an early adopter of a behavioral approach [@giladEconomic1984; @hosseiniGeorge2011]. To distinguish among different strands of behavioral economics, @sent_behavioral_2004 proposed an influential distinction between “old” and “new” behavioral economics. This distinction separates the heterogeneous and reformist efforts of Katona, Simon, and others to challenge mainstream economics from the more homogeneous heuristics-and-biases research program developed by Kahneman and Tversky. Sent argues that “new” behavioral economics succeeded in part because it was less radical than earlier approaches and because it emerged in the 1980s, at a moment when economic theory faced multiple epistemological challenges, thereby creating an opportune context for alternative frameworks.</w:t>
+      </w:r>
+    </w:p>
+    <w:p>
+      <w:pPr>
+        <w:rPr/>
+      </w:pPr>
+      <w:r>
+        <w:rPr>
+          <w:rtl w:val="0"/>
+        </w:rPr>
+        <w:t xml:space="preserve">The divergent fates of Simon’s bounded rationality and Kahneman and Tversky’s heuristics-and-biases approach thus present a striking puzzle in the history of economic thought. Both challenged standard assumptions of rationality under the banner of behavioral economics, and both were ultimately recognized with Nobel Prizes, yet their patterns of reception and adoption differed. While our methods cannot identify the precise epistemological mechanisms behind this divergence, they allow us to trace and compare the trajectories of reception and influence of these two approaches, shedding light on how and when they followed different paths.</w:t>
+      </w:r>
+    </w:p>
+    <w:p>
+      <w:pPr>
+        <w:rPr/>
+      </w:pPr>
+      <w:r>
+        <w:rPr>
+          <w:rtl w:val="0"/>
+        </w:rPr>
+        <w:t xml:space="preserve">Our analysis suggests that Simon’s concept of “bounded rationality” stands as one of the most influential critiques of standard rationality in economics, particularly in its role in structuring debates about rationality itself. Simon’s work dominated discussions in the 1960s and 1970s, with his seminal articles [@simonBehavioral1955; @simonTheories1959] and his Nobel lecture [@simonRational1979] appearing across a wide range of research areas, from social choice theory to the theory of the firm and price setting. The textual analysis highlights Simon’s conceptual centrality. Semantic cluster 11, which captures discussions about individual rationality, undergoes a marked transformation following the rise of Simon’s influence. In the 1950s, discourse centered on terms such as “rational,” “empirical reality,” and “irrationality.” By the 1970s, “bounded rationality” had become the most prevalent expression in the cluster, and by the 1990s, references to “boundedly rational agents” and “procedural rationality” clearly positioned Simon’s concepts at the core of economic discussions, reflecting a delayed but substantial integration into the discipline.</w:t>
+      </w:r>
+    </w:p>
+    <w:p>
+      <w:pPr>
+        <w:rPr/>
+      </w:pPr>
+      <w:r>
+        <w:rPr>
+          <w:rtl w:val="0"/>
+        </w:rPr>
+        <w:t xml:space="preserve">Moreover, Simon’s impact is visible not only in the changing language of rationality but also in the growing prominence of these debates within economics. Semantic cluster 11 expands from 5.76% of all sentences in the 1950s to 7.85% in the 1980s, peaking at 9.56% in the 1990s. This growth signals a significant increase in the attention devoted to foundational questions of rationality. Citation analysis corroborates this pattern of late recognition: references to @simonBehavioral1955 rise gradually after publication, with citation peaks occurring only in the post-2000s period (see @fig-rationality-paper-citations).</w:t>
+      </w:r>
+    </w:p>
+    <w:p>
+      <w:pPr>
+        <w:rPr/>
+      </w:pPr>
+      <w:r>
+        <w:rPr>
+          <w:rtl w:val="0"/>
+        </w:rPr>
+        <w:t xml:space="preserve">However, Simon’s influence remained limited in two critical respects. First, the slow diffusion of his framework meant that, by the time it achieved broad conceptual prominence, it faced direct competition from “new” behavioral economics. From the 1980s onward, semantic cluster 11 declined in relative importance, and attention shifted toward more specialized clusters addressing distinct dimensions of rationality. Clusters 5 and 15 focused on expected utility theory, risk, and ambiguity, while clusters 6 and 7 examined intertemporal and other-regarding behavior. All of these clusters expanded rapidly in the 1980s, with most of them individually surpassing cluster 11 in their share of sentences. Although these strands incorporated elements of bounded rationality, they did so primarily through the conceptual tools of “new” behavioral economics—ranging from prospect theory in the analysis of risk to experimental paradigms such as the ultimatum game in the study of other-regarding behavior [@gualaParadigmatic2008].</w:t>
+      </w:r>
+    </w:p>
+    <w:p>
+      <w:pPr>
+        <w:rPr/>
+      </w:pPr>
+      <w:r>
+        <w:rPr>
+          <w:rtl w:val="0"/>
+        </w:rPr>
+        <w:t xml:space="preserve">Second, Simon's conceptual influence, spearheaded by bounded rationality, never translated into stable research communities. While his framework shaped how many economists approached rationality, very few actually developed the research program he initiated. Bibliometrically, only small, unstable communities formed around Simon's work. In the 1960s and early 1970s, his ideas appeared in operations research circles (</w:t>
       </w:r>
       <w:r>
         <w:rPr>
@@ -2737,7 +2737,7 @@
         <w:rPr>
           <w:rtl w:val="0"/>
         </w:rPr>
-        <w:t xml:space="preserve">). Simon was generally associated with other researchers critical of perfect rationality: @winterSatisficing1971, which applied satisficing to firm behavior; @cyertCompetition1969 on behavioral theory of the firm; and @leibensteinAllocative1966 on "X-efficiency," challenging economics' focus on allocative efficiency. Together, Simon, Winter, Cyert, and Leibenstein formed a diverse organizational theory critique of how rationality, especially through profit maximization, is employed in economics. While this collective movement had some momentum, none of these research had an individual effect on economics structure. After 1969–1976, this research stream coalesced into a smaller, short-lived community before fragmenting. References to Simon and critiques of profit maximization remained scattered, moving through several small communities (e.g., cl_761, cl_251, </w:t>
+        <w:t xml:space="preserve">). Simon was generally associated with other researchers critical of perfect rationality: @winterSatisficing1971, which applied satisficing to firm behavior; @cyertCompetition1969 on behavioral theory of the firm; and @leibensteinAllocative1966 on “X-efficiency,” challenging economics' focus on allocative efficiency. Together, Simon, Winter, Cyert, and Leibenstein formed a diverse organizational theory critique of how rationality, especially through profit maximization, is employed in economics. While this collective movement had some momentum, none of these research had an individual effect on economics structure [see also @sent_behavioral_2004]. After 1969-1976, this research stream coalesced into a smaller, short-lived community before fragmenting. References to Simon and critiques of profit maximization remained scattered, moving through several small communities (e.g., </w:t>
       </w:r>
       <w:r>
         <w:rPr>
@@ -2745,7 +2745,7 @@
           <w:iCs w:val="1"/>
           <w:rtl w:val="0"/>
         </w:rPr>
-        <w:t xml:space="preserve">Welfare Economics and Public Finance</w:t>
+        <w:t xml:space="preserve">cl_761</w:t>
       </w:r>
       <w:r>
         <w:rPr>
@@ -2759,25 +2759,13 @@
           <w:iCs w:val="1"/>
           <w:rtl w:val="0"/>
         </w:rPr>
-        <w:t xml:space="preserve">Evolutionary Economic Theory</w:t>
-      </w:r>
-      <w:r>
-        <w:rPr>
-          <w:rtl w:val="0"/>
-        </w:rPr>
-        <w:t xml:space="preserve">) without ever achieving the critical mass. While Simon's influence in economics was conceptually enduring, it remained marginal as a structuring force, unable to generate coherent, large and stable research communities.</w:t>
-      </w:r>
-    </w:p>
-    <w:p>
-      <w:pPr>
-        <w:ind w:right="0"/>
-        <w:rPr/>
-      </w:pPr>
-      <w:r>
-        <w:rPr>
-          <w:rtl w:val="0"/>
-        </w:rPr>
-        <w:t xml:space="preserve">Studying “new” behavioral economics reception reveals a dramatic contrast. In the 1979–1987 period, most clusters citing Simon became absorbed into a large "Behavioral Decision Theory" cluster dominated by Kahneman and Tversky. Unlike Simon's trajectory, the heuristics and biases research program of Kahneman, Tversky, and other "new" behavioral economists generated multiple stable clusters that formed well-identified and substantial research communities. A main "Behavioral Decision Theory" cluster emerged in the 1980s, structured by early adopters of the new approach. The crystallization of this distinct cluster signaled the beginning of explosive growth and the spinning off of several autonomous communities that captured emerging specialized areas of behavioral economics: pro-social behavior and behavioral game theory (</w:t>
+        <w:t xml:space="preserve">cl_251</w:t>
+      </w:r>
+      <w:r>
+        <w:rPr>
+          <w:rtl w:val="0"/>
+        </w:rPr>
+        <w:t xml:space="preserve">, </w:t>
       </w:r>
       <w:r>
         <w:rPr>
@@ -2785,13 +2773,13 @@
           <w:iCs w:val="1"/>
           <w:rtl w:val="0"/>
         </w:rPr>
-        <w:t xml:space="preserve">Behavioral Game Theory</w:t>
-      </w:r>
-      <w:r>
-        <w:rPr>
-          <w:rtl w:val="0"/>
-        </w:rPr>
-        <w:t xml:space="preserve">), intertemporal decision-making and risk (</w:t>
+        <w:t xml:space="preserve">Welfare Economics and Public Finance</w:t>
+      </w:r>
+      <w:r>
+        <w:rPr>
+          <w:rtl w:val="0"/>
+        </w:rPr>
+        <w:t xml:space="preserve">, </w:t>
       </w:r>
       <w:r>
         <w:rPr>
@@ -2799,19 +2787,25 @@
           <w:iCs w:val="1"/>
           <w:rtl w:val="0"/>
         </w:rPr>
-        <w:t xml:space="preserve">Behavioral Economics and Choice</w:t>
-      </w:r>
-      <w:r>
-        <w:rPr>
-          <w:rtl w:val="0"/>
-        </w:rPr>
-        <w:t xml:space="preserve">), and behavioral finance </w:t>
-      </w:r>
-      <w:r>
-        <w:rPr>
-          <w:rtl w:val="0"/>
-        </w:rPr>
-        <w:t xml:space="preserve">(</w:t>
+        <w:t xml:space="preserve">Evolutionary Economic Theory</w:t>
+      </w:r>
+      <w:r>
+        <w:rPr>
+          <w:rtl w:val="0"/>
+        </w:rPr>
+        <w:t xml:space="preserve">) without ever achieving the critical mass. While Simon’s influence in economics was conceptually enduring, it remained marginal as a structuring force, unable to generate coherent, large and stable research communities.</w:t>
+      </w:r>
+    </w:p>
+    <w:p>
+      <w:pPr>
+        <w:ind w:right="0"/>
+        <w:rPr/>
+      </w:pPr>
+      <w:r>
+        <w:rPr>
+          <w:rtl w:val="0"/>
+        </w:rPr>
+        <w:t xml:space="preserve">“New” behavioral economics reception reveals a dramatic contrast. Unlike Simon’s trajectory, the heuristics and biases research program of Kahneman, Tversky, and other “new” behavioral economists generated multiple stable clusters that formed well-identified and substantial research communities. A main “Behavioral Decision Theory” cluster emerged in 1979-1987, structured by early adopters of the new approach. The crystallization of this distinct cluster signaled the beginning of explosive growth and the spinning off of several autonomous communities that captured emerging specialized areas of behavioral economics: pro-social behavior and behavioral game theory (</w:t>
       </w:r>
       <w:r>
         <w:rPr>
@@ -2819,6 +2813,40 @@
           <w:iCs w:val="1"/>
           <w:rtl w:val="0"/>
         </w:rPr>
+        <w:t xml:space="preserve">Behavioral Game Theory</w:t>
+      </w:r>
+      <w:r>
+        <w:rPr>
+          <w:rtl w:val="0"/>
+        </w:rPr>
+        <w:t xml:space="preserve">), intertemporal decision-making and risk (</w:t>
+      </w:r>
+      <w:r>
+        <w:rPr>
+          <w:i w:val="1"/>
+          <w:iCs w:val="1"/>
+          <w:rtl w:val="0"/>
+        </w:rPr>
+        <w:t xml:space="preserve">Behavioral Economics and Choice</w:t>
+      </w:r>
+      <w:r>
+        <w:rPr>
+          <w:rtl w:val="0"/>
+        </w:rPr>
+        <w:t xml:space="preserve">), and behavioral finance </w:t>
+      </w:r>
+      <w:r>
+        <w:rPr>
+          <w:rtl w:val="0"/>
+        </w:rPr>
+        <w:t xml:space="preserve">(</w:t>
+      </w:r>
+      <w:r>
+        <w:rPr>
+          <w:i w:val="1"/>
+          <w:iCs w:val="1"/>
+          <w:rtl w:val="0"/>
+        </w:rPr>
         <w:t xml:space="preserve">Financial Market Expectations</w:t>
       </w:r>
       <w:r>
@@ -2837,107 +2865,130 @@
         <w:rPr>
           <w:rtl w:val="0"/>
         </w:rPr>
-        <w:t xml:space="preserve">By the 2000s, behavioral economics had become the dominant venue for research on rationality. Three behavioral economics clusters represented approximately 30% of the entire network with many additional clusters structured by behavioral economics research without being explicitly characterized as such. The scale and speed of acceptance differed dramatically from Simon's experience. By 1980, @kahnemanProspect1979 was already more cited than @simonBehavioral1955 had been at that point (@fig-rationality-paper-citations). By 1985, prospect theory had surpassed the lifetime citation peak that Simon's work would ever achieve in economics. By the 2000s, most microeconomics publications about rationality connected to the behavioral economics research program. While bounded and procedural rationality remained regularly invoked concepts, no later research community clearly carried Simon's heritage as a bibliometric anchor.</w:t>
-      </w:r>
-    </w:p>
-    <w:p>
-      <w:pPr>
-        <w:ind w:right="0"/>
-        <w:rPr/>
-      </w:pPr>
-      <w:r>
-        <w:rPr>
-          <w:rtl w:val="0"/>
-        </w:rPr>
-        <w:t xml:space="preserve">The contrast is stark and raises fundamental questions about disciplinary reception: Why did one Nobel Prize-winning critique of rationality spawn a research empire while another remained conceptually influential but institutionally homeless?</w:t>
-      </w:r>
-    </w:p>
-    <w:p>
-      <w:pPr>
-        <w:rPr/>
-      </w:pPr>
-      <w:r>
-        <w:rPr>
-          <w:rtl w:val="0"/>
-        </w:rPr>
-        <w:t xml:space="preserve">Our quantitative study yields two particularly surprising results about the contrasting reception of Kahneman and Simon. First, the temporal pattern of adoption differed radically. For historian @heukelomBehavioral2014, a pivotal moment in behavioral economics history was the explicit creation of research programs within the Sloan and Russell Sage Foundations between 1984 and 1992, notably leading to the Kahneman-Thaler collaboration that transformed the field's trajectory. However, our analysis suggests that even by the early 1980s, something distinctive was already happening with Kahneman and Tversky's reception. Despite @kahnemanProspect1979 being the duo's only economics publication until 1985 — long before the Sloan-Sage Foundation programs formalized behavioral economics — prospect theory became highly cited with rapid growth (@fig-rationality-paper-citations). As early as the 1977–1984 bibliometric network, we find a cluster structured by their work, suggesting that their article not only attracted citations but rapidly catalyzed new research strands in a way Simon's work never achieved in economics [@heukelomSense2012].</w:t>
-      </w:r>
-    </w:p>
-    <w:p>
-      <w:pPr>
-        <w:rPr/>
-      </w:pPr>
-      <w:r>
-        <w:rPr>
-          <w:rtl w:val="0"/>
-        </w:rPr>
-        <w:t xml:space="preserve">This rapid adoption is particularly striking given the external similarities between the cases. Both Kahneman and Simon published in top economics journals and received Nobel Prizes. Yet Simon's Nobel Prize increased his influence in economics only marginally, while Kahneman's Nobel reversed a downward citation trend in the 2000s, cementing their contribution as a structural pillar of a wide-spanning research program.</w:t>
-      </w:r>
-    </w:p>
-    <w:p>
-      <w:pPr>
-        <w:rPr/>
-      </w:pPr>
-      <w:r>
-        <w:rPr>
-          <w:rtl w:val="0"/>
-        </w:rPr>
-        <w:t xml:space="preserve">The second surprising finding concerns the relationship between "old" and "new" behavioral economics. Citations to @simonBehavioral1955 have never been higher than since the ascent of new behavioral economics, a paradoxical pattern given accusations that the field has forgotten its roots. @earlPrinciples2022 criticizes this apparent amnesia:</w:t>
-      </w:r>
-    </w:p>
-    <w:p>
-      <w:pPr>
-        <w:numPr>
-          <w:ilvl w:val="0"/>
-          <w:numId w:val="2"/>
-        </w:numPr>
+        <w:t xml:space="preserve">By the 2000s, behavioral economics had become the dominant venue for research on rationality. Three behavioral economics communities represented approximately 30% of the entire network with many additional communities structured by behavioral economics research without being explicitly characterized as such. The scale and speed of acceptance differed dramatically from Simon’s experience. </w:t>
+      </w:r>
+      <w:commentRangeStart w:id="4"/>
+      <w:r>
+        <w:rPr>
+          <w:rtl w:val="0"/>
+        </w:rPr>
+        <w:t xml:space="preserve">By 1980, @kahnemanProspect1979 was already more cited than @simonBehavioral1955 had been at that point (@fig-rationality-paper-citations).</w:t>
+      </w:r>
+      <w:commentRangeEnd w:id="4"/>
+      <w:r>
+        <w:commentReference w:id="4"/>
+      </w:r>
+      <w:r>
+        <w:rPr>
+          <w:rtl w:val="0"/>
+        </w:rPr>
+        <w:t xml:space="preserve"> </w:t>
+      </w:r>
+      <w:r>
+        <w:rPr>
+          <w:rtl w:val="0"/>
+        </w:rPr>
+        <w:t xml:space="preserve">By 1985, prospect theory had already surpassed the lifetime citation peak that Simon’s work would ever reach within economics. By the 2000s, most microeconomic publications addressing rationality were explicitly connected to the behavioral economics research program. While bounded and procedural rationality remained frequently invoked concepts, no subsequent research community clearly carried Simon’s legacy as a stable bibliometric anchor.</w:t>
+      </w:r>
+    </w:p>
+    <w:p>
+      <w:pPr>
+        <w:rPr/>
+      </w:pPr>
+      <w:r>
+        <w:rPr>
+          <w:rtl w:val="0"/>
+        </w:rPr>
+        <w:t xml:space="preserve">The contrast is stark and raises fundamental questions about disciplinary reception: Why did one Nobel Prize–winning critique of rationality give rise to a vast and self-sustaining research program, while another remained conceptually influential yet institutionally homeless?</w:t>
+      </w:r>
+      <w:r>
+        <w:rPr>
+          <w:rtl w:val="0"/>
+        </w:rPr>
+      </w:r>
+    </w:p>
+    <w:p>
+      <w:pPr>
+        <w:rPr/>
+      </w:pPr>
+      <w:r>
+        <w:rPr>
+          <w:rtl w:val="0"/>
+        </w:rPr>
+        <w:t xml:space="preserve">Our quantitative study yields two particularly surprising results regarding the contrasting reception of Kahneman and Simon. First, the temporal patterns of adoption differ radically. For the historian @heukelomBehavioral2014, a pivotal moment in the history of behavioral economics was the explicit creation of research programs within the Sloan and Russell Sage Foundations between 1984 and 1992, notably fostering the Kahneman–Thaler collaboration that decisively transformed the field’s trajectory. Our analysis, however, suggests that a distinctive dynamic was already underway by the early 1980s in the reception of Kahneman and Tversky’s work. Despite the fact that @kahnemanProspect1979 was the duo’s only publication in an economics journal until 1985—well before the Sloan–Russell Sage programs formally institutionalized behavioral economics—prospect theory experienced rapid and sustained citation growth (@fig-rationality-paper-citations). As early as the 1977–1984 bibliometric network, we identify a cluster structured around their work, indicating that the article not only attracted citations but quickly catalyzed new research strands, in a way Simon’s work never did within economics [@heukelomSense2012].</w:t>
+      </w:r>
+    </w:p>
+    <w:p>
+      <w:pPr>
+        <w:rPr/>
+      </w:pPr>
+      <w:r>
+        <w:rPr>
+          <w:rtl w:val="0"/>
+        </w:rPr>
+        <w:t xml:space="preserve">The second surprising finding concerns the relationship between “old” and “new” behavioral economics. Contrary to narratives of rupture or forgetting, citations to @simonBehavioral1955 have never been as high as during the rise of new behavioral economics—a paradoxical pattern given recurrent claims that the field has neglected its intellectual roots. @earlPrinciples2022 criticizes this apparent amnesia:</w:t>
+      </w:r>
+    </w:p>
+    <w:p>
+      <w:pPr>
         <w:spacing w:before="0" w:lineRule="auto"/>
-        <w:ind w:left="720" w:hanging="360"/>
-      </w:pPr>
-      <w:r>
-        <w:rPr>
-          <w:rtl w:val="0"/>
-        </w:rPr>
-        <w:t xml:space="preserve">“Neither Kahneman nor Thaler have sought to promote earlier behavioral economics alongside more recent work. Instead, they give the impression that behavioral economics started around 1979–1980 with the publication of Kahneman and Tversky’s (1979) article on prospect theory and that theory’s use by Thaler (1980). All in all, this is a very curious state of affairs: a cynic might suggest that it looks rather as if the earlier work has been airbrushed from the history of economic thought by the strategic redefinition of what constitutes behavioral economics. A more charitable and reflexive view would see the situation as resulting from insufficient familiarity with the earlier literature [...]” [@earlPrinciples2022, 2]</w:t>
-      </w:r>
-      <w:r>
-        <w:rPr>
-          <w:rtl w:val="0"/>
-        </w:rPr>
-      </w:r>
-    </w:p>
-    <w:p>
-      <w:pPr>
-        <w:ind w:right="0"/>
-        <w:rPr/>
-      </w:pPr>
-      <w:r>
-        <w:rPr>
-          <w:rtl w:val="0"/>
-        </w:rPr>
-        <w:t xml:space="preserve">The rising citations to older work from Simon and Allais demonstrate that while "new" behavioral economists may not always acknowledge "old" behavioral economics contributions all the time, the field's rapid growth and large size has actually drawn more attention to earlier work than it ever received during its original publication period. This pattern admits at least three interpretations, each with different implications for how we understand the evolution of economic thought.</w:t>
-      </w:r>
-    </w:p>
-    <w:p>
-      <w:pPr>
-        <w:rPr/>
-      </w:pPr>
-      <w:r>
-        <w:rPr>
-          <w:rtl w:val="0"/>
-        </w:rPr>
-        <w:t xml:space="preserve">A favorable reading suggests that the "new" behavioral economics genuinely helped revive abandoned research directions, moving toward reconciliation with earlier strands, a research direction wished by @sentRationality2008 and more recently by @earlPrinciples2022. A more critical view sees intellectual appropriation, in which classic references are strategically reframed to fit the new agenda, renewing interest but through a biased and presentist lens as it happened with Allais [@monginAllais2019]. A third interpretation suggests that citation increases reflect growing backlash against the "new" program from defenders of "old" behavioral economics, as critics invoke Simon and others to challenge the heuristics and biases framework.</w:t>
-      </w:r>
-    </w:p>
-    <w:p>
-      <w:pPr>
-        <w:rPr/>
-      </w:pPr>
-      <w:r>
-        <w:rPr>
-          <w:rtl w:val="0"/>
-        </w:rPr>
-        <w:t xml:space="preserve">Our findings tentatively support the second interpretation. The sparse and unstructured citation patterns to "old" behavioral economics, combined with the fact that discussions of rationality are increasingly framed by "new" behavioral and experimental concepts, suggest appropriation rather than genuine integration. Citations may acknowledge earlier work without meaningfully engaging its methodological or theoretical distinctiveness. The conceptual influence of Simon remains as a way to frame the general discussion and reconstruct behavioral economics intellectual lineages, but his actual methodological and conceptual framework remain superficially integrated. While a definitive conclusion requires deeper qualitative analysis of how these citations are used in contemporary work, our study provides a quantitative roadmap for future research examining the complex relationship between "old" and "new" behavioral economics. </w:t>
+        <w:ind w:left="0" w:firstLine="0"/>
+        <w:rPr/>
+      </w:pPr>
+      <w:r>
+        <w:rPr>
+          <w:rtl w:val="0"/>
+        </w:rPr>
+        <w:t xml:space="preserve">&gt; </w:t>
+      </w:r>
+      <w:r>
+        <w:rPr>
+          <w:rtl w:val="0"/>
+        </w:rPr>
+        <w:t xml:space="preserve">“Neither Kahneman nor Thaler have sought to promote earlier behavioral economics alongside more recent work. Instead, they give the impression that behavioral economics started around 1979–1980 with the publication of Kahneman and Tversky’s (1979) article on prospect theory and that theory’s use by Thaler (1980). All in all, this is a very curious state of affairs: a cynic might suggest that it looks rather as if the earlier work has been airbrushed from the history of economic thought by the strategic redefinition of what constitutes behavioral economics. A more charitable and reflexive view would see the situation as resulting from insufficient familiarity with the earlier literature” [@earlPrinciples2022, 2]</w:t>
+      </w:r>
+      <w:r>
+        <w:rPr>
+          <w:rtl w:val="0"/>
+        </w:rPr>
+      </w:r>
+    </w:p>
+    <w:p>
+      <w:pPr>
+        <w:rPr/>
+      </w:pPr>
+      <w:r>
+        <w:rPr>
+          <w:rtl w:val="0"/>
+        </w:rPr>
+        <w:t xml:space="preserve">The rising citations to earlier work by Simon and Allais demonstrate that, while “new” behavioral economists may not consistently acknowledge the contributions of “old” behavioral economics, the rapid expansion and growing scale of the field have nevertheless drawn unprecedented attention to these earlier works, far exceeding the recognition they received at the time of their original publication. This pattern admits at least three interpretations, each carrying distinct implications for how we understand the evolution of economic thought.</w:t>
+      </w:r>
+    </w:p>
+    <w:p>
+      <w:pPr>
+        <w:rPr/>
+      </w:pPr>
+      <w:r>
+        <w:rPr>
+          <w:rtl w:val="0"/>
+        </w:rPr>
+        <w:t xml:space="preserve">A favorable interpretation holds that “new” behavioral economics has genuinely revived previously abandoned research directions, moving toward a reconciliation with earlier strands—a trajectory explicitly advocated by @sentRationality2008 and more recently by @earlPrinciples2022. A more critical reading emphasizes intellectual appropriation, whereby classic references are selectively reframed to fit the new agenda, renewing interest but through a biased and presentist lens, as Mongin has argued in the case of Allais [@monginAllais2019]. A third interpretation suggests that rising citation counts reflect a growing backlash against the “new” behavioral program, as defenders of “old” behavioral economics increasingly invoke Simon and others to challenge the heuristics-and-biases framework.</w:t>
+      </w:r>
+    </w:p>
+    <w:p>
+      <w:pPr>
+        <w:rPr/>
+      </w:pPr>
+      <w:r>
+        <w:rPr>
+          <w:rtl w:val="0"/>
+        </w:rPr>
+        <w:t xml:space="preserve">Our findings tentatively support the second interpretation. The sparse and weakly structured citation patterns associated with “old” behavioral economics, combined with the fact that contemporary discussions of rationality are increasingly framed through the concepts and tools of “new” behavioral and experimental economics, point toward appropriation rather than genuine integration. Citations may acknowledge earlier work without engaging its distinctive methodological commitments or theoretical ambitions. Simon’s influence thus persists primarily as a symbolic and framing reference, useful for situating debates and reconstructing intellectual lineages, while his substantive framework remains only superficially incorporated. Although a definitive assessment would require closer qualitative analysis of how these citations function in contemporary texts, our study provides a quantitative roadmap for future research on the complex and ambivalent relationship between “old” and “new” behavioral economics.</w:t>
+      </w:r>
+      <w:r>
+        <w:rPr>
+          <w:rtl w:val="0"/>
+        </w:rPr>
       </w:r>
     </w:p>
     <w:p>
@@ -2985,18 +3036,7 @@
         <w:rPr>
           <w:rtl w:val="0"/>
         </w:rPr>
-        <w:t xml:space="preserve">Our approach allows us to identify, within this corpus, the sentences most closely associated with the words “rational” and “rationality” and, by extension, the articles most likely to engage with rationality in one way or another. This procedure necessarily involves setting similarity thresholds to determine when a sentence or an article can be considered sufficiently “close.” By retaining approximately 500,000 sentences for the textual analysis and 29,000 articles for the bibliometric analysis, we deliberately opted for a broad initial corpus. Higher thresholds would have reduced these numbers and restricted the material to discussions more narrowly centered on rationality. Our methodological choice was instead to cast a wide net at the outset, in order to preserve flexibility for subsequent stages of analysis.</w:t>
-      </w:r>
-    </w:p>
-    <w:p>
-      <w:pPr>
-        <w:rPr/>
-      </w:pPr>
-      <w:r>
-        <w:rPr>
-          <w:rtl w:val="0"/>
-        </w:rPr>
-        <w:t xml:space="preserve">This choice is central to the interest of the unsupervised methods we deploy. By allowing the algorithms to identify dozens of semantic clusters and bibliometric communities within short temporal windows (eight years or a decade), and by then aggregating these groupings over time and characterizing them through multiple indicators, we can conduct analyses at different scales. This makes it possible both to </w:t>
+        <w:t xml:space="preserve">Our approach allows us to identify, within this corpus, the sentences most closely associated with the words “rational” and “rationality” and, by extension, the articles most likely to engage with rationality in one way or another. By allowing the algorithms to identify dozens of semantic clusters and bibliometric communities within short temporal windows (eight years or a decade), and by then aggregating these groupings over time and characterizing them through multiple indicators, we can conduct analyses at different scales. This makes it possible both to </w:t>
       </w:r>
       <w:r>
         <w:rPr>
@@ -3075,22 +3115,34 @@
         </w:rPr>
         <w:t xml:space="preserve">Finally, these methods are also “discovery tools.” While they can be used to confirm or challenge existing claims in the history and philosophy of economics, they also help identify patterns that have so far been absent—or only marginally present—in the historical literature. </w:t>
       </w:r>
-      <w:commentRangeStart w:id="4"/>
       <w:r>
         <w:rPr>
           <w:rtl w:val="0"/>
         </w:rPr>
         <w:t xml:space="preserve">We have briefly pointed to some of these patterns above.</w:t>
       </w:r>
-      <w:commentRangeEnd w:id="4"/>
-      <w:r>
-        <w:commentReference w:id="4"/>
-      </w:r>
-      <w:r>
-        <w:rPr>
-          <w:rtl w:val="0"/>
-        </w:rPr>
-        <w:t xml:space="preserve"> By making available two interactive applications to explore our results, we hope to encourage readers to pursue their own paths of discovery within the corpus.</w:t>
+      <w:r>
+        <w:rPr>
+          <w:rtl w:val="0"/>
+        </w:rPr>
+        <w:t xml:space="preserve"> By making available </w:t>
+      </w:r>
+      <w:commentRangeStart w:id="5"/>
+      <w:r>
+        <w:rPr>
+          <w:rtl w:val="0"/>
+        </w:rPr>
+        <w:t xml:space="preserve">two interactive applications </w:t>
+      </w:r>
+      <w:commentRangeEnd w:id="5"/>
+      <w:r>
+        <w:commentReference w:id="5"/>
+      </w:r>
+      <w:r>
+        <w:rPr>
+          <w:rtl w:val="0"/>
+        </w:rPr>
+        <w:t xml:space="preserve">to explore our results, we hope to encourage readers to pursue their own paths of discovery within the corpus.</w:t>
       </w:r>
     </w:p>
     <w:p>
@@ -3240,7 +3292,7 @@
       </w:r>
     </w:p>
   </w:comment>
-  <w:comment w:author="Aurélien Goutsmedt" w:id="4" w:date="2025-12-16T10:01:08Z">
+  <w:comment w:author="Thomas Delcey" w:id="2" w:date="2025-12-13T01:11:21Z">
     <w:p>
       <w:pPr>
         <w:keepNext w:val="0"/>
@@ -3291,11 +3343,11 @@
           <w:vertAlign w:val="baseline"/>
           <w:rtl w:val="0"/>
         </w:rPr>
-        <w:t xml:space="preserve">J'ai eu la flemme de mettre des exemples pour le moment.</w:t>
+        <w:t xml:space="preserve">Est-ce qu'on garde le label IA dans la version finale ? On a pas vraiment checké à quel point c'était pertinent.</w:t>
       </w:r>
     </w:p>
   </w:comment>
-  <w:comment w:author="Thomas Delcey" w:id="2" w:date="2025-12-13T01:11:21Z">
+  <w:comment w:author="Aurélien Goutsmedt" w:id="3" w:date="2025-12-13T11:14:16Z">
     <w:p>
       <w:pPr>
         <w:keepNext w:val="0"/>
@@ -3346,11 +3398,9 @@
           <w:vertAlign w:val="baseline"/>
           <w:rtl w:val="0"/>
         </w:rPr>
-        <w:t xml:space="preserve">Est-ce qu'on garde le label IA dans la version finale ? On a pas vraiment checké à quel point c'était pertinent.</w:t>
-      </w:r>
-    </w:p>
-  </w:comment>
-  <w:comment w:author="Aurélien Goutsmedt" w:id="3" w:date="2025-12-13T11:14:16Z">
+        <w:t xml:space="preserve">A voir si on a le temps de renommer... </w:t>
+      </w:r>
+    </w:p>
     <w:p>
       <w:pPr>
         <w:keepNext w:val="0"/>
@@ -3401,9 +3451,11 @@
           <w:vertAlign w:val="baseline"/>
           <w:rtl w:val="0"/>
         </w:rPr>
-        <w:t xml:space="preserve">A voir si on a le temps de renommer... </w:t>
-      </w:r>
-    </w:p>
+        <w:t xml:space="preserve">J'aurais bien changé pour les semantic cluster, tout en gardant le numéro.</w:t>
+      </w:r>
+    </w:p>
+  </w:comment>
+  <w:comment w:author="Aurélien Goutsmedt" w:id="4" w:date="2025-12-19T16:36:47Z">
     <w:p>
       <w:pPr>
         <w:keepNext w:val="0"/>
@@ -3454,11 +3506,11 @@
           <w:vertAlign w:val="baseline"/>
           <w:rtl w:val="0"/>
         </w:rPr>
-        <w:t xml:space="preserve">J'aurais bien changé pour les semantic cluster, tout en gardant le numéro.</w:t>
+        <w:t xml:space="preserve">@alexandre.truc77@gmail.com je comprends pas ce que tu veux dire là? En 1980 le papier a déjà plus de citations que le papier de Simon? Où il est plus cité que Simon cette année là? Où il est plus cité que Simon 55 un an après sa publication?</w:t>
       </w:r>
     </w:p>
   </w:comment>
-  <w:comment w:author="Aurélien Goutsmedt" w:id="5" w:date="2025-12-19T15:03:23Z">
+  <w:comment w:author="Aurélien Goutsmedt" w:id="6" w:date="2025-12-19T15:03:23Z">
     <w:p>
       <w:pPr>
         <w:keepNext w:val="0"/>
@@ -3510,6 +3562,61 @@
           <w:rtl w:val="0"/>
         </w:rPr>
         <w:t xml:space="preserve">One or two</w:t>
+      </w:r>
+    </w:p>
+  </w:comment>
+  <w:comment w:author="Aurélien Goutsmedt" w:id="5" w:date="2025-12-19T16:53:00Z">
+    <w:p>
+      <w:pPr>
+        <w:keepNext w:val="0"/>
+        <w:keepLines w:val="0"/>
+        <w:pageBreakBefore w:val="0"/>
+        <w:widowControl w:val="0"/>
+        <w:pBdr>
+          <w:top w:space="0" w:sz="0" w:val="nil"/>
+          <w:left w:space="0" w:sz="0" w:val="nil"/>
+          <w:bottom w:space="0" w:sz="0" w:val="nil"/>
+          <w:right w:space="0" w:sz="0" w:val="nil"/>
+          <w:between w:space="0" w:sz="0" w:val="nil"/>
+        </w:pBdr>
+        <w:shd w:fill="auto" w:val="clear"/>
+        <w:spacing w:after="0" w:before="0" w:line="240" w:lineRule="auto"/>
+        <w:ind w:left="0" w:right="0" w:firstLine="0"/>
+        <w:jc w:val="left"/>
+        <w:rPr>
+          <w:rFonts w:ascii="Arial" w:cs="Arial" w:eastAsia="Arial" w:hAnsi="Arial"/>
+          <w:b w:val="0"/>
+          <w:bCs w:val="0"/>
+          <w:i w:val="0"/>
+          <w:iCs w:val="0"/>
+          <w:smallCaps w:val="0"/>
+          <w:strike w:val="0"/>
+          <w:color w:val="000000"/>
+          <w:sz w:val="22"/>
+          <w:szCs w:val="22"/>
+          <w:u w:val="none"/>
+          <w:shd w:fill="auto" w:val="clear"/>
+          <w:vertAlign w:val="baseline"/>
+        </w:rPr>
+      </w:pPr>
+      <w:r>
+        <w:rPr>
+          <w:rFonts w:ascii="Arial" w:cs="Arial" w:eastAsia="Arial" w:hAnsi="Arial"/>
+          <w:b w:val="0"/>
+          <w:bCs w:val="0"/>
+          <w:i w:val="0"/>
+          <w:iCs w:val="0"/>
+          <w:smallCaps w:val="0"/>
+          <w:strike w:val="0"/>
+          <w:color w:val="000000"/>
+          <w:sz w:val="22"/>
+          <w:szCs w:val="22"/>
+          <w:u w:val="none"/>
+          <w:shd w:fill="auto" w:val="clear"/>
+          <w:vertAlign w:val="baseline"/>
+          <w:rtl w:val="0"/>
+        </w:rPr>
+        <w:t xml:space="preserve">One or two?</w:t>
       </w:r>
     </w:p>
   </w:comment>
@@ -4073,7 +4180,7 @@
         </w:rPr>
         <w:t xml:space="preserve">Of course, as in any historical inquiry of this kind, we are not entirely protected from selective emphasis, all the more so given that the scope of our study is too broad to summarize every pattern revealed by our results. Other scholars could have, at various junctures, pursued different interpretive directions on the basis of the same material. The publication of the </w:t>
       </w:r>
-      <w:commentRangeStart w:id="5"/>
+      <w:commentRangeStart w:id="6"/>
       <w:r>
         <w:rPr>
           <w:sz w:val="20"/>
@@ -4082,9 +4189,9 @@
         </w:rPr>
         <w:t xml:space="preserve">interactive applications</w:t>
       </w:r>
-      <w:commentRangeEnd w:id="5"/>
-      <w:r>
-        <w:commentReference w:id="5"/>
+      <w:commentRangeEnd w:id="6"/>
+      <w:r>
+        <w:commentReference w:id="6"/>
       </w:r>
       <w:r>
         <w:rPr>
@@ -4118,7 +4225,7 @@
           <w:szCs w:val="20"/>
           <w:rtl w:val="0"/>
         </w:rPr>
-        <w:t xml:space="preserve"> Some years earlier, @mitchellRationality1910[97; see semantic cluster 9 and 4] already pushed forward similar claims, regretting that “few economists have regarded the study of psychology as a necessary part of the equipment of their work”, often relying on “tacit preconceptions” rather than to seek to “psychologists to gain a knowledge of the mind and its modes of operation”.</w:t>
+        <w:t xml:space="preserve"> Some years earlier, Mitchell [@mitchellRationality1910, 97; see semantic cluster 9 and 4] already pushed forward similar claims, regretting that “few economists have regarded the study of psychology as a necessary part of the equipment of their work”, often relying on “tacit preconceptions” rather than to seek to “psychologists to gain a knowledge of the mind and its modes of operation”.</w:t>
       </w:r>
     </w:p>
   </w:footnote>
@@ -4171,7 +4278,7 @@
           <w:szCs w:val="20"/>
           <w:rtl w:val="0"/>
         </w:rPr>
-        <w:t xml:space="preserve"> This highlights a key caveat. Because these methods foreground statistically “significant” patterns and indicators’ prevalence, they are not always well suited to tracing and interpreting the origins of a concept or theory with the care that close historical study and archival research provide.</w:t>
+        <w:t xml:space="preserve"> This highlights a key caveat of our methods. Because these methods foreground statistically “significant” patterns and indicators’ prevalence, they are not always well suited to tracing and interpreting the origins of a concept or theory with the care that close historical study and archival research provide.</w:t>
       </w:r>
     </w:p>
   </w:footnote>
@@ -4180,8 +4287,8 @@
       <w:pPr>
         <w:spacing w:after="0" w:before="0" w:line="240" w:lineRule="auto"/>
         <w:rPr>
-          <w:sz w:val="20"/>
-          <w:szCs w:val="20"/>
+          <w:sz w:val="18"/>
+          <w:szCs w:val="18"/>
         </w:rPr>
       </w:pPr>
       <w:r>
@@ -4201,18 +4308,24 @@
       </w:r>
       <w:r>
         <w:rPr>
+          <w:sz w:val="20"/>
+          <w:szCs w:val="20"/>
           <w:rtl w:val="0"/>
         </w:rPr>
         <w:t xml:space="preserve">Machlup’s position was that even if a “goodly portion of all business behavior may be non-rational, thoughtless, [or] blindly repetitive” [-@machlupMarginal1946, 520], questionnaire evidence and empirical findings more generally did not demonstrate the failure of marginal theory when properly interpreted. In a similar defense of profit maximization, Leonid @hurwiczTheory1946[110] first acknowledged that it was not “inconceivable that business is run more by routine than by rationality”, but argued that behavior may appear irrational or merely “routine” from the standpoint of a purely static theory that ignores uncertainty, while proving fully “rational” once uncertainty and long-run effects are taken into account [see also @</w:t>
       </w:r>
       <w:r>
         <w:rPr>
+          <w:sz w:val="20"/>
+          <w:szCs w:val="20"/>
           <w:rtl w:val="0"/>
         </w:rPr>
         <w:t xml:space="preserve">herfeldTheories2018]</w:t>
       </w:r>
       <w:r>
         <w:rPr>
+          <w:sz w:val="20"/>
+          <w:szCs w:val="20"/>
           <w:rtl w:val="0"/>
         </w:rPr>
         <w:t xml:space="preserve">.</w:t>
@@ -4380,121 +4493,8 @@
       </w:rPr>
     </w:lvl>
   </w:abstractNum>
-  <w:abstractNum w:abstractNumId="2">
-    <w:lvl w:ilvl="0">
-      <w:start w:val="1"/>
-      <w:numFmt w:val="bullet"/>
-      <w:lvlText w:val="●"/>
-      <w:lvlJc w:val="left"/>
-      <w:pPr>
-        <w:ind w:left="720" w:hanging="360"/>
-      </w:pPr>
-      <w:rPr>
-        <w:u w:val="none"/>
-      </w:rPr>
-    </w:lvl>
-    <w:lvl w:ilvl="1">
-      <w:start w:val="1"/>
-      <w:numFmt w:val="bullet"/>
-      <w:lvlText w:val="○"/>
-      <w:lvlJc w:val="left"/>
-      <w:pPr>
-        <w:ind w:left="1440" w:hanging="360"/>
-      </w:pPr>
-      <w:rPr>
-        <w:u w:val="none"/>
-      </w:rPr>
-    </w:lvl>
-    <w:lvl w:ilvl="2">
-      <w:start w:val="1"/>
-      <w:numFmt w:val="bullet"/>
-      <w:lvlText w:val="■"/>
-      <w:lvlJc w:val="left"/>
-      <w:pPr>
-        <w:ind w:left="2160" w:hanging="360"/>
-      </w:pPr>
-      <w:rPr>
-        <w:u w:val="none"/>
-      </w:rPr>
-    </w:lvl>
-    <w:lvl w:ilvl="3">
-      <w:start w:val="1"/>
-      <w:numFmt w:val="bullet"/>
-      <w:lvlText w:val="●"/>
-      <w:lvlJc w:val="left"/>
-      <w:pPr>
-        <w:ind w:left="2880" w:hanging="360"/>
-      </w:pPr>
-      <w:rPr>
-        <w:u w:val="none"/>
-      </w:rPr>
-    </w:lvl>
-    <w:lvl w:ilvl="4">
-      <w:start w:val="1"/>
-      <w:numFmt w:val="bullet"/>
-      <w:lvlText w:val="○"/>
-      <w:lvlJc w:val="left"/>
-      <w:pPr>
-        <w:ind w:left="3600" w:hanging="360"/>
-      </w:pPr>
-      <w:rPr>
-        <w:u w:val="none"/>
-      </w:rPr>
-    </w:lvl>
-    <w:lvl w:ilvl="5">
-      <w:start w:val="1"/>
-      <w:numFmt w:val="bullet"/>
-      <w:lvlText w:val="■"/>
-      <w:lvlJc w:val="left"/>
-      <w:pPr>
-        <w:ind w:left="4320" w:hanging="360"/>
-      </w:pPr>
-      <w:rPr>
-        <w:u w:val="none"/>
-      </w:rPr>
-    </w:lvl>
-    <w:lvl w:ilvl="6">
-      <w:start w:val="1"/>
-      <w:numFmt w:val="bullet"/>
-      <w:lvlText w:val="●"/>
-      <w:lvlJc w:val="left"/>
-      <w:pPr>
-        <w:ind w:left="5040" w:hanging="360"/>
-      </w:pPr>
-      <w:rPr>
-        <w:u w:val="none"/>
-      </w:rPr>
-    </w:lvl>
-    <w:lvl w:ilvl="7">
-      <w:start w:val="1"/>
-      <w:numFmt w:val="bullet"/>
-      <w:lvlText w:val="○"/>
-      <w:lvlJc w:val="left"/>
-      <w:pPr>
-        <w:ind w:left="5760" w:hanging="360"/>
-      </w:pPr>
-      <w:rPr>
-        <w:u w:val="none"/>
-      </w:rPr>
-    </w:lvl>
-    <w:lvl w:ilvl="8">
-      <w:start w:val="1"/>
-      <w:numFmt w:val="bullet"/>
-      <w:lvlText w:val="■"/>
-      <w:lvlJc w:val="left"/>
-      <w:pPr>
-        <w:ind w:left="6480" w:hanging="360"/>
-      </w:pPr>
-      <w:rPr>
-        <w:u w:val="none"/>
-      </w:rPr>
-    </w:lvl>
-  </w:abstractNum>
   <w:num w:numId="1">
     <w:abstractNumId w:val="1"/>
-  </w:num>
-  <w:num w:numId="2">
-    <w:abstractNumId w:val="2"/>
   </w:num>
 </w:numbering>
 </file>

</xml_diff>

<commit_message>
order slides files in a folder and update papers with appendix
</commit_message>
<xml_diff>
--- a/paper/gdoc.docx
+++ b/paper/gdoc.docx
@@ -185,7 +185,7 @@
         <w:rPr>
           <w:rtl w:val="0"/>
         </w:rPr>
-        <w:t xml:space="preserve">From sources to data</w:t>
+        <w:t xml:space="preserve">From sources to data {#sec-sources_data}</w:t>
       </w:r>
     </w:p>
     <w:p>
@@ -389,13 +389,13 @@
         <w:rPr>
           <w:rtl w:val="0"/>
         </w:rPr>
-        <w:t xml:space="preserve"> As for full text, we relied on three providers. First, JSTOR’s full-text collection offers high-quality scans of most leading economics journals. </w:t>
-      </w:r>
-      <w:r>
-        <w:rPr>
-          <w:rtl w:val="0"/>
-        </w:rPr>
-        <w:t xml:space="preserve">Second, we used Scopus to identify peer-reviewed economics journals not included in JSTOR and to compile a complementary list of articles; for these, we retrieved full texts first through the Elsevier Full-Text API, when available. Third, remaining full texts were obtained through the ISTEX project, which provides access to a substantial corpus of documents for researchers affiliated with French universities.</w:t>
+        <w:t xml:space="preserve"> As for full text, we relied on three providers. First, JSTOR’s full-text collection offers high-quality scans of most leading economics journals [@jstorText2025]. </w:t>
+      </w:r>
+      <w:r>
+        <w:rPr>
+          <w:rtl w:val="0"/>
+        </w:rPr>
+        <w:t xml:space="preserve">Second, we used Scopus to identify peer-reviewed economics journals not included in JSTOR and to compile a complementary list of articles; for these, we retrieved full texts first through the Elsevier Full-Text API, when available. Third, remaining full texts were obtained through the ISTEX project [@istexInfrastructure2025], which provides access to a substantial corpus of documents for researchers affiliated with French universities.</w:t>
       </w:r>
       <w:r>
         <w:rPr>
@@ -2865,18 +2865,13 @@
         <w:rPr>
           <w:rtl w:val="0"/>
         </w:rPr>
-        <w:t xml:space="preserve">By the 2000s, behavioral economics had become the dominant venue for research on rationality. Three behavioral economics communities represented approximately 30% of the entire network with many additional communities structured by behavioral economics research without being explicitly characterized as such. The scale and speed of acceptance differed dramatically from Simon’s experience. </w:t>
-      </w:r>
-      <w:commentRangeStart w:id="4"/>
-      <w:r>
-        <w:rPr>
-          <w:rtl w:val="0"/>
-        </w:rPr>
-        <w:t xml:space="preserve">By 1980, @kahnemanProspect1979 was already more cited than @simonBehavioral1955 had been at that point (@fig-rationality-paper-citations).</w:t>
-      </w:r>
-      <w:commentRangeEnd w:id="4"/>
-      <w:r>
-        <w:commentReference w:id="4"/>
+        <w:t xml:space="preserve">By the 2000s, behavioral economics had become the dominant venue for research on rationality. Three behavioral economics communities represented approximately 30% of the entire network with many additional communities structured by behavioral economics research without being explicitly characterized as such. The scale and speed of acceptance differed dramatically from Simon’s experience. By 1980, @kahnemanProspect1979 had already surpassed @simonBehavioral1955 in annual citations</w:t>
+      </w:r>
+      <w:r>
+        <w:rPr>
+          <w:rtl w:val="0"/>
+        </w:rPr>
+        <w:t xml:space="preserve"> (@fig-rationality-paper-citations).</w:t>
       </w:r>
       <w:r>
         <w:rPr>
@@ -2899,23 +2894,7 @@
         <w:rPr>
           <w:rtl w:val="0"/>
         </w:rPr>
-        <w:t xml:space="preserve">The contrast is stark and raises fundamental questions about disciplinary reception: Why did one Nobel Prize–winning critique of rationality give rise to a vast and self-sustaining research program, while another remained conceptually influential yet institutionally homeless?</w:t>
-      </w:r>
-      <w:r>
-        <w:rPr>
-          <w:rtl w:val="0"/>
-        </w:rPr>
-      </w:r>
-    </w:p>
-    <w:p>
-      <w:pPr>
-        <w:rPr/>
-      </w:pPr>
-      <w:r>
-        <w:rPr>
-          <w:rtl w:val="0"/>
-        </w:rPr>
-        <w:t xml:space="preserve">Our quantitative study yields two particularly surprising results regarding the contrasting reception of Kahneman and Simon. First, the temporal patterns of adoption differ radically. For the historian @heukelomBehavioral2014, a pivotal moment in the history of behavioral economics was the explicit creation of research programs within the Sloan and Russell Sage Foundations between 1984 and 1992, notably fostering the Kahneman–Thaler collaboration that decisively transformed the field’s trajectory. Our analysis, however, suggests that a distinctive dynamic was already underway by the early 1980s in the reception of Kahneman and Tversky’s work. Despite the fact that @kahnemanProspect1979 was the duo’s only publication in an economics journal until 1985—well before the Sloan–Russell Sage programs formally institutionalized behavioral economics—prospect theory experienced rapid and sustained citation growth (@fig-rationality-paper-citations). As early as the 1977–1984 bibliometric network, we identify a cluster structured around their work, indicating that the article not only attracted citations but quickly catalyzed new research strands, in a way Simon’s work never did within economics [@heukelomSense2012].</w:t>
+        <w:t xml:space="preserve">The contrast is stark and raises fundamental questions about disciplinary reception. Our quantitative study yields two particularly surprising results regarding the contrasting influence of Kahneman and Simon. First, the temporal patterns of adoption differ radically. For the historian @heukelomBehavioral2014, a pivotal moment in the history of behavioral economics was the explicit creation of research programs within the Sloan and Russell Sage Foundations between 1984 and 1992, notably fostering the Kahneman–Thaler collaboration that decisively transformed the field’s trajectory. Our analysis, however, suggests that a distinctive dynamic was already underway by the early 1980s in the reception of Kahneman and Tversky’s work. Despite the fact that @kahnemanProspect1979 was the duo’s only publication in an economics journal until 1985—well before the Sloan–Russell Sage programs formally institutionalized behavioral economics—prospect theory experienced rapid and sustained citation growth (@fig-rationality-paper-citations). As early as the 1977–1984 bibliometric network, we identify a cluster structured around their work, indicating that the article not only attracted citations but quickly catalyzed new research strands, in a way Simon’s work never did within economics [@heukelomSense2012].</w:t>
       </w:r>
     </w:p>
     <w:p>
@@ -3127,16 +3106,16 @@
         </w:rPr>
         <w:t xml:space="preserve"> By making available </w:t>
       </w:r>
-      <w:commentRangeStart w:id="5"/>
+      <w:commentRangeStart w:id="4"/>
       <w:r>
         <w:rPr>
           <w:rtl w:val="0"/>
         </w:rPr>
         <w:t xml:space="preserve">two interactive applications </w:t>
       </w:r>
-      <w:commentRangeEnd w:id="5"/>
-      <w:r>
-        <w:commentReference w:id="5"/>
+      <w:commentRangeEnd w:id="4"/>
+      <w:r>
+        <w:commentReference w:id="4"/>
       </w:r>
       <w:r>
         <w:rPr>
@@ -3455,7 +3434,7 @@
       </w:r>
     </w:p>
   </w:comment>
-  <w:comment w:author="Aurélien Goutsmedt" w:id="4" w:date="2025-12-19T16:36:47Z">
+  <w:comment w:author="Aurélien Goutsmedt" w:id="5" w:date="2025-12-19T15:03:23Z">
     <w:p>
       <w:pPr>
         <w:keepNext w:val="0"/>
@@ -3506,66 +3485,11 @@
           <w:vertAlign w:val="baseline"/>
           <w:rtl w:val="0"/>
         </w:rPr>
-        <w:t xml:space="preserve">@alexandre.truc77@gmail.com je comprends pas ce que tu veux dire là? En 1980 le papier a déjà plus de citations que le papier de Simon? Où il est plus cité que Simon cette année là? Où il est plus cité que Simon 55 un an après sa publication?</w:t>
+        <w:t xml:space="preserve">One or two</w:t>
       </w:r>
     </w:p>
   </w:comment>
-  <w:comment w:author="Aurélien Goutsmedt" w:id="6" w:date="2025-12-19T15:03:23Z">
-    <w:p>
-      <w:pPr>
-        <w:keepNext w:val="0"/>
-        <w:keepLines w:val="0"/>
-        <w:pageBreakBefore w:val="0"/>
-        <w:widowControl w:val="0"/>
-        <w:pBdr>
-          <w:top w:space="0" w:sz="0" w:val="nil"/>
-          <w:left w:space="0" w:sz="0" w:val="nil"/>
-          <w:bottom w:space="0" w:sz="0" w:val="nil"/>
-          <w:right w:space="0" w:sz="0" w:val="nil"/>
-          <w:between w:space="0" w:sz="0" w:val="nil"/>
-        </w:pBdr>
-        <w:shd w:fill="auto" w:val="clear"/>
-        <w:spacing w:after="0" w:before="0" w:line="240" w:lineRule="auto"/>
-        <w:ind w:left="0" w:right="0" w:firstLine="0"/>
-        <w:jc w:val="left"/>
-        <w:rPr>
-          <w:rFonts w:ascii="Arial" w:cs="Arial" w:eastAsia="Arial" w:hAnsi="Arial"/>
-          <w:b w:val="0"/>
-          <w:bCs w:val="0"/>
-          <w:i w:val="0"/>
-          <w:iCs w:val="0"/>
-          <w:smallCaps w:val="0"/>
-          <w:strike w:val="0"/>
-          <w:color w:val="000000"/>
-          <w:sz w:val="22"/>
-          <w:szCs w:val="22"/>
-          <w:u w:val="none"/>
-          <w:shd w:fill="auto" w:val="clear"/>
-          <w:vertAlign w:val="baseline"/>
-        </w:rPr>
-      </w:pPr>
-      <w:r>
-        <w:rPr>
-          <w:rFonts w:ascii="Arial" w:cs="Arial" w:eastAsia="Arial" w:hAnsi="Arial"/>
-          <w:b w:val="0"/>
-          <w:bCs w:val="0"/>
-          <w:i w:val="0"/>
-          <w:iCs w:val="0"/>
-          <w:smallCaps w:val="0"/>
-          <w:strike w:val="0"/>
-          <w:color w:val="000000"/>
-          <w:sz w:val="22"/>
-          <w:szCs w:val="22"/>
-          <w:u w:val="none"/>
-          <w:shd w:fill="auto" w:val="clear"/>
-          <w:vertAlign w:val="baseline"/>
-          <w:rtl w:val="0"/>
-        </w:rPr>
-        <w:t xml:space="preserve">One or two</w:t>
-      </w:r>
-    </w:p>
-  </w:comment>
-  <w:comment w:author="Aurélien Goutsmedt" w:id="5" w:date="2025-12-19T16:53:00Z">
+  <w:comment w:author="Aurélien Goutsmedt" w:id="4" w:date="2025-12-19T16:53:00Z">
     <w:p>
       <w:pPr>
         <w:keepNext w:val="0"/>
@@ -4180,7 +4104,7 @@
         </w:rPr>
         <w:t xml:space="preserve">Of course, as in any historical inquiry of this kind, we are not entirely protected from selective emphasis, all the more so given that the scope of our study is too broad to summarize every pattern revealed by our results. Other scholars could have, at various junctures, pursued different interpretive directions on the basis of the same material. The publication of the </w:t>
       </w:r>
-      <w:commentRangeStart w:id="6"/>
+      <w:commentRangeStart w:id="5"/>
       <w:r>
         <w:rPr>
           <w:sz w:val="20"/>
@@ -4189,9 +4113,9 @@
         </w:rPr>
         <w:t xml:space="preserve">interactive applications</w:t>
       </w:r>
-      <w:commentRangeEnd w:id="6"/>
-      <w:r>
-        <w:commentReference w:id="6"/>
+      <w:commentRangeEnd w:id="5"/>
+      <w:r>
+        <w:commentReference w:id="5"/>
       </w:r>
       <w:r>
         <w:rPr>

</xml_diff>

<commit_message>
Last adjustment on paper: tables and figures in order, some problematic references, etc...
</commit_message>
<xml_diff>
--- a/paper/gdoc.docx
+++ b/paper/gdoc.docx
@@ -129,16 +129,11 @@
         </w:rPr>
         <w:t xml:space="preserve">In what follows, we concentrate on what such a quantitative analysis requires in practice. We highlight what kinds of questions and challenges arise at each stage of the research process. This focus lets us highlight (a) the crucial issue of selecting sources and building data; (b) how even simple quantitative assessments can be informative; (c) the challenges and subjective choices involved in building and adapting tools; and (d) why interpreting results demands careful attention to various indicators and close knowledge of both the corpus and its historical context. By tracing, step by step, how we assemble and analyze our corpus, we aim to provide a practical example and a reflection on broader methodological issues faced by historians of economics in quantitative inquiries. </w:t>
       </w:r>
-      <w:commentRangeStart w:id="0"/>
       <w:r>
         <w:rPr>
           <w:rtl w:val="0"/>
         </w:rPr>
         <w:t xml:space="preserve">The analysis of the results relies on the use of an interactive application that we have built for this article.</w:t>
-      </w:r>
-      <w:commentRangeEnd w:id="0"/>
-      <w:r>
-        <w:commentReference w:id="0"/>
       </w:r>
       <w:r>
         <w:rPr>
@@ -1063,21 +1058,7 @@
         <w:rPr>
           <w:rtl w:val="0"/>
         </w:rPr>
-        <w:t xml:space="preserve">. A sentence from 1910 is therefore judged similar not to the general, and likely modern-day meaning of rationality, but to the way the concept was expressed during its own historical period. </w:t>
-      </w:r>
-      <w:ins w:author="Thomas Delcey" w:id="0" w:date="2025-12-21T06:20:39Z">
-        <w:r>
-          <w:rPr>
-            <w:rtl w:val="0"/>
-          </w:rPr>
-          <w:t xml:space="preserve">The representative vector should be interpreted as an operational summary of the various semantic contexts in which ‘rationality’ is used in a given year, not as a unique theoretical definition of rationality itself. </w:t>
-        </w:r>
-      </w:ins>
-      <w:r>
-        <w:rPr>
-          <w:rtl w:val="0"/>
-        </w:rPr>
-        <w:t xml:space="preserve">This helps ensure that our analysis is sensitive to historical changes in language. </w:t>
+        <w:t xml:space="preserve">. A sentence from 1910 is therefore judged similar not to the general, and likely modern-day meaning of rationality, but to the way the concept was expressed during its own historical period. The representative vector should be interpreted as an operational summary of the various semantic contexts in which ‘rationality’ is used in a given year, not as a unique theoretical definition of rationality itself. This helps ensure that our analysis is sensitive to historical changes in language. </w:t>
       </w:r>
       <w:r>
         <w:rPr>
@@ -1674,16 +1655,11 @@
         </w:rPr>
         <w:t xml:space="preserve">On the one hand, the analysis is not immediately transparent, as it requires the construction of intermediate tools</w:t>
       </w:r>
-      <w:commentRangeStart w:id="1"/>
-      <w:r>
-        <w:rPr>
-          <w:rtl w:val="0"/>
-        </w:rPr>
-        <w:t xml:space="preserve">—such as our interactive applications—</w:t>
-      </w:r>
-      <w:commentRangeEnd w:id="1"/>
-      <w:r>
-        <w:commentReference w:id="1"/>
+      <w:r>
+        <w:rPr>
+          <w:rtl w:val="0"/>
+        </w:rPr>
+        <w:t xml:space="preserve">—such as our interactive application—</w:t>
       </w:r>
       <w:r>
         <w:rPr>
@@ -1705,7 +1681,7 @@
         <w:rPr>
           <w:rtl w:val="0"/>
         </w:rPr>
-        <w:t xml:space="preserve">For the purpose of the exploration and interpretation of our results, we have built an online interactive application, where we can find all the semantic clusters and bibliometric communities, and their corresponding indicators. Let us take as an example the semantic cluster 11, which gathers close to 20,000 sentences from 1920 to 2009. How can we get a sense of what this cluster actually coalesces around? Before any qualitative interpretation or contextualization with the secondary literature, we must first produce a series of indicators to characterize the cluster. Such indicators include:</w:t>
+        <w:t xml:space="preserve">For the purpose of the exploration and interpretation of our results, we have built an [online interactive application](https://019adac8-81d4-aa0e-808c-08861c261fd2.share.connect.posit.cloud/), where we can find all the semantic clusters and bibliometric communities, and their corresponding indicators. Let us take as an example the semantic cluster 11, which gathers close to 20,000 sentences from 1920 to 2009. How can we get a sense of what this cluster actually coalesces around? Before any qualitative interpretation or contextualization with the secondary literature, we must first produce a series of indicators to characterize the cluster. Such indicators include:</w:t>
       </w:r>
     </w:p>
     <w:p>
@@ -1918,21 +1894,21 @@
         </w:rPr>
         <w:t xml:space="preserve">n relation to semantic cluster 11, we observe, for instance, the emergence of a </w:t>
       </w:r>
-      <w:commentRangeStart w:id="2"/>
-      <w:commentRangeStart w:id="3"/>
+      <w:commentRangeStart w:id="0"/>
+      <w:commentRangeStart w:id="1"/>
       <w:r>
         <w:rPr>
           <w:rtl w:val="0"/>
         </w:rPr>
         <w:t xml:space="preserve">“Behavioral Economics and Choice Theory”</w:t>
       </w:r>
-      <w:commentRangeEnd w:id="2"/>
-      <w:r>
-        <w:commentReference w:id="2"/>
-      </w:r>
-      <w:commentRangeEnd w:id="3"/>
-      <w:r>
-        <w:commentReference w:id="3"/>
+      <w:commentRangeEnd w:id="0"/>
+      <w:r>
+        <w:commentReference w:id="0"/>
+      </w:r>
+      <w:commentRangeEnd w:id="1"/>
+      <w:r>
+        <w:commentReference w:id="1"/>
       </w:r>
       <w:r>
         <w:rPr>
@@ -2168,7 +2144,7 @@
         <w:rPr>
           <w:rtl w:val="0"/>
         </w:rPr>
-        <w:t xml:space="preserve">. In cluster 9, @veblenLimitations1909[620] again argued against the “statical character” of marginal-utility theory, which offered “no theory of a movement of any kind,” being occupied solely with “the adjustment of values to a given situation.” Similarly, E. H. @downeyFutility1910[253], in the cluster 14, claimed that “Marginal-utility economics has nothing to say of the genesis, growth, or current working of economic institutions” [see also @rutherfordInstitutionalist2013, 141]. Its “deliverances,” he argued, were therefore “futile for the problem of social betterment,” since such “betterment” concerned the adjustment of institutions to changing circumstances and ideals. In the early twentieth century, economic behavior, according to institutionalists, had to be understood through the prism of the “pecuniary institutions” that shaped it. For instance, Charles Cooley [@cooleyProgress1915] underlined that “pecuniary valuation,” or economic valuation, is only possible because of the institutions that make such valuation possible [see also @rutherfordInstitutionalist2013, 58–59]. Figure @fig-co-occurence shows well the importance of “pecuniary” as a neighbor to “rational” and “rationality” in the first twenty years of the twentieth century.</w:t>
+        <w:t xml:space="preserve">. In cluster 9, @veblenLimitations1909[620] again argued against the “statical character” of marginal-utility theory, which offered “no theory of a movement of any kind,” being occupied solely with “the adjustment of values to a given situation.” Similarly, E. H. @downeyFutility1910[253], in the cluster 14, claimed that “Marginal-utility economics has nothing to say of the genesis, growth, or current working of economic institutions” [see also @rutherfordInstitutionalist2013, 141]. Its “deliverances,” he argued, were therefore “futile for the problem of social betterment,” since such “betterment” concerned the adjustment of institutions to changing circumstances and ideals. In the early twentieth century, economic behavior, according to institutionalists, had to be understood through the prism of the “pecuniary institutions” that shaped it. For instance, Charles Cooley [@cooleyProgress1915] underlined that “pecuniary valuation,” or economic valuation, is only possible because of the institutions that make such valuation possible [see also @rutherfordInstitutionalist2013, 58–59]. @fig-co-occurence shows well the importance of “pecuniary” as a neighbor to “rational” and “rationality” in the first twenty years of the twentieth century.</w:t>
       </w:r>
     </w:p>
     <w:p>
@@ -3118,18 +3094,13 @@
         <w:rPr>
           <w:rtl w:val="0"/>
         </w:rPr>
-        <w:t xml:space="preserve"> By making available </w:t>
-      </w:r>
-      <w:commentRangeStart w:id="4"/>
-      <w:r>
-        <w:rPr>
-          <w:rtl w:val="0"/>
-        </w:rPr>
-        <w:t xml:space="preserve">two interactive applications </w:t>
-      </w:r>
-      <w:commentRangeEnd w:id="4"/>
-      <w:r>
-        <w:commentReference w:id="4"/>
+        <w:t xml:space="preserve"> By making available an [</w:t>
+      </w:r>
+      <w:r>
+        <w:rPr>
+          <w:rtl w:val="0"/>
+        </w:rPr>
+        <w:t xml:space="preserve">interactive application](https://019adac8-81d4-aa0e-808c-08861c261fd2.share.connect.posit.cloud/) </w:t>
       </w:r>
       <w:r>
         <w:rPr>
@@ -3175,7 +3146,7 @@
 
 <file path=word/comments.xml><?xml version="1.0" encoding="utf-8"?>
 <w:comments xmlns:mc="http://schemas.openxmlformats.org/markup-compatibility/2006" xmlns:o="urn:schemas-microsoft-com:office:office" xmlns:r="http://schemas.openxmlformats.org/officeDocument/2006/relationships" xmlns:m="http://schemas.openxmlformats.org/officeDocument/2006/math" xmlns:v="urn:schemas-microsoft-com:vml" xmlns:wp="http://schemas.openxmlformats.org/drawingml/2006/wordprocessingDrawing" xmlns:w10="urn:schemas-microsoft-com:office:word" xmlns:w="http://schemas.openxmlformats.org/wordprocessingml/2006/main" xmlns:wne="http://schemas.microsoft.com/office/word/2006/wordml" xmlns:sl="http://schemas.openxmlformats.org/schemaLibrary/2006/main" xmlns:a="http://schemas.openxmlformats.org/drawingml/2006/main" xmlns:pic="http://schemas.openxmlformats.org/drawingml/2006/picture" xmlns:c="http://schemas.openxmlformats.org/drawingml/2006/chart" xmlns:lc="http://schemas.openxmlformats.org/drawingml/2006/lockedCanvas" xmlns:dgm="http://schemas.openxmlformats.org/drawingml/2006/diagram" xmlns:wps="http://schemas.microsoft.com/office/word/2010/wordprocessingShape" xmlns:wpg="http://schemas.microsoft.com/office/word/2010/wordprocessingGroup" xmlns:w14="http://schemas.microsoft.com/office/word/2010/wordml" xmlns:w15="http://schemas.microsoft.com/office/word/2012/wordml" xmlns:w16="http://schemas.microsoft.com/office/word/2018/wordml" xmlns:w16cex="http://schemas.microsoft.com/office/word/2018/wordml/cex" xmlns:w16cid="http://schemas.microsoft.com/office/word/2016/wordml/cid" xmlns="http://schemas.microsoft.com/office/tasks/2019/documenttasks" xmlns:cr="http://schemas.microsoft.com/office/comments/2020/reactions">
-  <w:comment w:author="Aurélien Goutsmedt" w:id="0" w:date="2025-12-19T14:41:23Z">
+  <w:comment w:author="Thomas Delcey" w:id="0" w:date="2025-12-13T01:11:21Z">
     <w:p>
       <w:pPr>
         <w:keepNext w:val="0"/>
@@ -3226,11 +3197,11 @@
           <w:vertAlign w:val="baseline"/>
           <w:rtl w:val="0"/>
         </w:rPr>
-        <w:t xml:space="preserve">Add the link</w:t>
+        <w:t xml:space="preserve">Est-ce qu'on garde le label IA dans la version finale ? On a pas vraiment checké à quel point c'était pertinent.</w:t>
       </w:r>
     </w:p>
   </w:comment>
-  <w:comment w:author="Aurélien Goutsmedt" w:id="1" w:date="2025-12-19T14:42:06Z">
+  <w:comment w:author="Aurélien Goutsmedt" w:id="1" w:date="2025-12-13T11:14:16Z">
     <w:p>
       <w:pPr>
         <w:keepNext w:val="0"/>
@@ -3281,11 +3252,9 @@
           <w:vertAlign w:val="baseline"/>
           <w:rtl w:val="0"/>
         </w:rPr>
-        <w:t xml:space="preserve">Check if 1 or 2 at the end</w:t>
-      </w:r>
-    </w:p>
-  </w:comment>
-  <w:comment w:author="Thomas Delcey" w:id="2" w:date="2025-12-13T01:11:21Z">
+        <w:t xml:space="preserve">A voir si on a le temps de renommer... </w:t>
+      </w:r>
+    </w:p>
     <w:p>
       <w:pPr>
         <w:keepNext w:val="0"/>
@@ -3336,225 +3305,7 @@
           <w:vertAlign w:val="baseline"/>
           <w:rtl w:val="0"/>
         </w:rPr>
-        <w:t xml:space="preserve">Est-ce qu'on garde le label IA dans la version finale ? On a pas vraiment checké à quel point c'était pertinent.</w:t>
-      </w:r>
-    </w:p>
-  </w:comment>
-  <w:comment w:author="Aurélien Goutsmedt" w:id="3" w:date="2025-12-13T11:14:16Z">
-    <w:p>
-      <w:pPr>
-        <w:keepNext w:val="0"/>
-        <w:keepLines w:val="0"/>
-        <w:pageBreakBefore w:val="0"/>
-        <w:widowControl w:val="0"/>
-        <w:pBdr>
-          <w:top w:space="0" w:sz="0" w:val="nil"/>
-          <w:left w:space="0" w:sz="0" w:val="nil"/>
-          <w:bottom w:space="0" w:sz="0" w:val="nil"/>
-          <w:right w:space="0" w:sz="0" w:val="nil"/>
-          <w:between w:space="0" w:sz="0" w:val="nil"/>
-        </w:pBdr>
-        <w:shd w:fill="auto" w:val="clear"/>
-        <w:spacing w:after="0" w:before="0" w:line="240" w:lineRule="auto"/>
-        <w:ind w:left="0" w:right="0" w:firstLine="0"/>
-        <w:jc w:val="left"/>
-        <w:rPr>
-          <w:rFonts w:ascii="Arial" w:cs="Arial" w:eastAsia="Arial" w:hAnsi="Arial"/>
-          <w:b w:val="0"/>
-          <w:bCs w:val="0"/>
-          <w:i w:val="0"/>
-          <w:iCs w:val="0"/>
-          <w:smallCaps w:val="0"/>
-          <w:strike w:val="0"/>
-          <w:color w:val="000000"/>
-          <w:sz w:val="22"/>
-          <w:szCs w:val="22"/>
-          <w:u w:val="none"/>
-          <w:shd w:fill="auto" w:val="clear"/>
-          <w:vertAlign w:val="baseline"/>
-        </w:rPr>
-      </w:pPr>
-      <w:r>
-        <w:rPr>
-          <w:rFonts w:ascii="Arial" w:cs="Arial" w:eastAsia="Arial" w:hAnsi="Arial"/>
-          <w:b w:val="0"/>
-          <w:bCs w:val="0"/>
-          <w:i w:val="0"/>
-          <w:iCs w:val="0"/>
-          <w:smallCaps w:val="0"/>
-          <w:strike w:val="0"/>
-          <w:color w:val="000000"/>
-          <w:sz w:val="22"/>
-          <w:szCs w:val="22"/>
-          <w:u w:val="none"/>
-          <w:shd w:fill="auto" w:val="clear"/>
-          <w:vertAlign w:val="baseline"/>
-          <w:rtl w:val="0"/>
-        </w:rPr>
-        <w:t xml:space="preserve">A voir si on a le temps de renommer... </w:t>
-      </w:r>
-    </w:p>
-    <w:p>
-      <w:pPr>
-        <w:keepNext w:val="0"/>
-        <w:keepLines w:val="0"/>
-        <w:pageBreakBefore w:val="0"/>
-        <w:widowControl w:val="0"/>
-        <w:pBdr>
-          <w:top w:space="0" w:sz="0" w:val="nil"/>
-          <w:left w:space="0" w:sz="0" w:val="nil"/>
-          <w:bottom w:space="0" w:sz="0" w:val="nil"/>
-          <w:right w:space="0" w:sz="0" w:val="nil"/>
-          <w:between w:space="0" w:sz="0" w:val="nil"/>
-        </w:pBdr>
-        <w:shd w:fill="auto" w:val="clear"/>
-        <w:spacing w:after="0" w:before="0" w:line="240" w:lineRule="auto"/>
-        <w:ind w:left="0" w:right="0" w:firstLine="0"/>
-        <w:jc w:val="left"/>
-        <w:rPr>
-          <w:rFonts w:ascii="Arial" w:cs="Arial" w:eastAsia="Arial" w:hAnsi="Arial"/>
-          <w:b w:val="0"/>
-          <w:bCs w:val="0"/>
-          <w:i w:val="0"/>
-          <w:iCs w:val="0"/>
-          <w:smallCaps w:val="0"/>
-          <w:strike w:val="0"/>
-          <w:color w:val="000000"/>
-          <w:sz w:val="22"/>
-          <w:szCs w:val="22"/>
-          <w:u w:val="none"/>
-          <w:shd w:fill="auto" w:val="clear"/>
-          <w:vertAlign w:val="baseline"/>
-        </w:rPr>
-      </w:pPr>
-      <w:r>
-        <w:rPr>
-          <w:rFonts w:ascii="Arial" w:cs="Arial" w:eastAsia="Arial" w:hAnsi="Arial"/>
-          <w:b w:val="0"/>
-          <w:bCs w:val="0"/>
-          <w:i w:val="0"/>
-          <w:iCs w:val="0"/>
-          <w:smallCaps w:val="0"/>
-          <w:strike w:val="0"/>
-          <w:color w:val="000000"/>
-          <w:sz w:val="22"/>
-          <w:szCs w:val="22"/>
-          <w:u w:val="none"/>
-          <w:shd w:fill="auto" w:val="clear"/>
-          <w:vertAlign w:val="baseline"/>
-          <w:rtl w:val="0"/>
-        </w:rPr>
         <w:t xml:space="preserve">J'aurais bien changé pour les semantic cluster, tout en gardant le numéro.</w:t>
-      </w:r>
-    </w:p>
-  </w:comment>
-  <w:comment w:author="Aurélien Goutsmedt" w:id="5" w:date="2025-12-19T15:03:23Z">
-    <w:p>
-      <w:pPr>
-        <w:keepNext w:val="0"/>
-        <w:keepLines w:val="0"/>
-        <w:pageBreakBefore w:val="0"/>
-        <w:widowControl w:val="0"/>
-        <w:pBdr>
-          <w:top w:space="0" w:sz="0" w:val="nil"/>
-          <w:left w:space="0" w:sz="0" w:val="nil"/>
-          <w:bottom w:space="0" w:sz="0" w:val="nil"/>
-          <w:right w:space="0" w:sz="0" w:val="nil"/>
-          <w:between w:space="0" w:sz="0" w:val="nil"/>
-        </w:pBdr>
-        <w:shd w:fill="auto" w:val="clear"/>
-        <w:spacing w:after="0" w:before="0" w:line="240" w:lineRule="auto"/>
-        <w:ind w:left="0" w:right="0" w:firstLine="0"/>
-        <w:jc w:val="left"/>
-        <w:rPr>
-          <w:rFonts w:ascii="Arial" w:cs="Arial" w:eastAsia="Arial" w:hAnsi="Arial"/>
-          <w:b w:val="0"/>
-          <w:bCs w:val="0"/>
-          <w:i w:val="0"/>
-          <w:iCs w:val="0"/>
-          <w:smallCaps w:val="0"/>
-          <w:strike w:val="0"/>
-          <w:color w:val="000000"/>
-          <w:sz w:val="22"/>
-          <w:szCs w:val="22"/>
-          <w:u w:val="none"/>
-          <w:shd w:fill="auto" w:val="clear"/>
-          <w:vertAlign w:val="baseline"/>
-        </w:rPr>
-      </w:pPr>
-      <w:r>
-        <w:rPr>
-          <w:rFonts w:ascii="Arial" w:cs="Arial" w:eastAsia="Arial" w:hAnsi="Arial"/>
-          <w:b w:val="0"/>
-          <w:bCs w:val="0"/>
-          <w:i w:val="0"/>
-          <w:iCs w:val="0"/>
-          <w:smallCaps w:val="0"/>
-          <w:strike w:val="0"/>
-          <w:color w:val="000000"/>
-          <w:sz w:val="22"/>
-          <w:szCs w:val="22"/>
-          <w:u w:val="none"/>
-          <w:shd w:fill="auto" w:val="clear"/>
-          <w:vertAlign w:val="baseline"/>
-          <w:rtl w:val="0"/>
-        </w:rPr>
-        <w:t xml:space="preserve">One or two</w:t>
-      </w:r>
-    </w:p>
-  </w:comment>
-  <w:comment w:author="Aurélien Goutsmedt" w:id="4" w:date="2025-12-19T16:53:00Z">
-    <w:p>
-      <w:pPr>
-        <w:keepNext w:val="0"/>
-        <w:keepLines w:val="0"/>
-        <w:pageBreakBefore w:val="0"/>
-        <w:widowControl w:val="0"/>
-        <w:pBdr>
-          <w:top w:space="0" w:sz="0" w:val="nil"/>
-          <w:left w:space="0" w:sz="0" w:val="nil"/>
-          <w:bottom w:space="0" w:sz="0" w:val="nil"/>
-          <w:right w:space="0" w:sz="0" w:val="nil"/>
-          <w:between w:space="0" w:sz="0" w:val="nil"/>
-        </w:pBdr>
-        <w:shd w:fill="auto" w:val="clear"/>
-        <w:spacing w:after="0" w:before="0" w:line="240" w:lineRule="auto"/>
-        <w:ind w:left="0" w:right="0" w:firstLine="0"/>
-        <w:jc w:val="left"/>
-        <w:rPr>
-          <w:rFonts w:ascii="Arial" w:cs="Arial" w:eastAsia="Arial" w:hAnsi="Arial"/>
-          <w:b w:val="0"/>
-          <w:bCs w:val="0"/>
-          <w:i w:val="0"/>
-          <w:iCs w:val="0"/>
-          <w:smallCaps w:val="0"/>
-          <w:strike w:val="0"/>
-          <w:color w:val="000000"/>
-          <w:sz w:val="22"/>
-          <w:szCs w:val="22"/>
-          <w:u w:val="none"/>
-          <w:shd w:fill="auto" w:val="clear"/>
-          <w:vertAlign w:val="baseline"/>
-        </w:rPr>
-      </w:pPr>
-      <w:r>
-        <w:rPr>
-          <w:rFonts w:ascii="Arial" w:cs="Arial" w:eastAsia="Arial" w:hAnsi="Arial"/>
-          <w:b w:val="0"/>
-          <w:bCs w:val="0"/>
-          <w:i w:val="0"/>
-          <w:iCs w:val="0"/>
-          <w:smallCaps w:val="0"/>
-          <w:strike w:val="0"/>
-          <w:color w:val="000000"/>
-          <w:sz w:val="22"/>
-          <w:szCs w:val="22"/>
-          <w:u w:val="none"/>
-          <w:shd w:fill="auto" w:val="clear"/>
-          <w:vertAlign w:val="baseline"/>
-          <w:rtl w:val="0"/>
-        </w:rPr>
-        <w:t xml:space="preserve">One or two?</w:t>
       </w:r>
     </w:p>
   </w:comment>
@@ -4116,28 +3867,23 @@
           <w:szCs w:val="20"/>
           <w:rtl w:val="0"/>
         </w:rPr>
-        <w:t xml:space="preserve">Of course, as in any historical inquiry of this kind, we are not entirely protected from selective emphasis, all the more so given that the scope of our study is too broad to summarize every pattern revealed by our results. Other scholars could have, at various junctures, pursued different interpretive directions on the basis of the same material. The publication of the </w:t>
-      </w:r>
-      <w:commentRangeStart w:id="5"/>
-      <w:r>
-        <w:rPr>
-          <w:sz w:val="20"/>
-          <w:szCs w:val="20"/>
-          <w:rtl w:val="0"/>
-        </w:rPr>
-        <w:t xml:space="preserve">interactive applications</w:t>
-      </w:r>
-      <w:commentRangeEnd w:id="5"/>
-      <w:r>
-        <w:commentReference w:id="5"/>
-      </w:r>
-      <w:r>
-        <w:rPr>
-          <w:sz w:val="20"/>
-          <w:szCs w:val="20"/>
-          <w:rtl w:val="0"/>
-        </w:rPr>
-        <w:t xml:space="preserve"> we used to explore the results thus serves as an exercise in transparency and—in addition to being, we hope, useful for historians of economic thought more generally—allows readers to assess the robustness and limits of our narrative.</w:t>
+        <w:t xml:space="preserve">Of course, as in any historical inquiry of this kind, we are not entirely protected from selective emphasis, all the more so given that the scope of our study is too broad to summarize every pattern revealed by our results. Other scholars could have, at various junctures, pursued different interpretive directions on the basis of the same material. The publication of the [</w:t>
+      </w:r>
+      <w:r>
+        <w:rPr>
+          <w:sz w:val="20"/>
+          <w:szCs w:val="20"/>
+          <w:rtl w:val="0"/>
+        </w:rPr>
+        <w:t xml:space="preserve">interactive application</w:t>
+      </w:r>
+      <w:r>
+        <w:rPr>
+          <w:sz w:val="20"/>
+          <w:szCs w:val="20"/>
+          <w:rtl w:val="0"/>
+        </w:rPr>
+        <w:t xml:space="preserve">](https://019adac8-81d4-aa0e-808c-08861c261fd2.share.connect.posit.cloud/) we used to explore the results thus serves as an exercise in transparency and—in addition to being, we hope, useful for historians of economic thought more generally—allows readers to assess the robustness and limits of our narrative.</w:t>
       </w:r>
     </w:p>
   </w:footnote>
@@ -4163,7 +3909,7 @@
           <w:szCs w:val="20"/>
           <w:rtl w:val="0"/>
         </w:rPr>
-        <w:t xml:space="preserve"> Some years earlier, Mitchell [@mitchellRationality1910, 97; see semantic cluster 9 and 4] already pushed forward similar claims, regretting that “few economists have regarded the study of psychology as a necessary part of the equipment of their work”, often relying on “tacit preconceptions” rather than to seek to “psychologists to gain a knowledge of the mind and its modes of operation”.</w:t>
+        <w:t xml:space="preserve"> Some years earlier, @mitchellRationality1910[97] already pushed forward similar claims, regretting that “few economists have regarded the study of psychology as a necessary part of the equipment of their work,” often relying on “tacit preconceptions” rather than to seek to “psychologists to gain a knowledge of the mind and its modes of operation.”</w:t>
       </w:r>
     </w:p>
   </w:footnote>
@@ -4250,7 +3996,7 @@
           <w:szCs w:val="20"/>
           <w:rtl w:val="0"/>
         </w:rPr>
-        <w:t xml:space="preserve">Machlup’s position was that even if a “goodly portion of all business behavior may be non-rational, thoughtless, [or] blindly repetitive” [-@machlupMarginal1946, 520], questionnaire evidence and empirical findings more generally did not demonstrate the failure of marginal theory when properly interpreted. In a similar defense of profit maximization, Leonid @hurwiczTheory1946[110] first acknowledged that it was not “inconceivable that business is run more by routine than by rationality”, but argued that behavior may appear irrational or merely “routine” from the standpoint of a purely static theory that ignores uncertainty, while proving fully “rational” once uncertainty and long-run effects are taken into account [see also @</w:t>
+        <w:t xml:space="preserve">Machlup’s position was that even if a “goodly portion of all business behavior may be non-rational, thoughtless, [or] blindly repetitive” [-@machlupMarginal1946, 520], questionnaire evidence and empirical findings more generally did not demonstrate the failure of marginal theory when properly interpreted. In a similar defense of profit maximization, Leonid @hurwiczTheory1946[110] first acknowledged that it was not “inconceivable that business is run more by routine than by rationality,” but argued that behavior may appear irrational or merely “routine” from the standpoint of a purely static theory that ignores uncertainty, while proving fully “rational” once uncertainty and long-run effects are taken into account [see also @</w:t>
       </w:r>
       <w:r>
         <w:rPr>
@@ -4297,7 +4043,27 @@
           <w:szCs w:val="20"/>
           <w:rtl w:val="0"/>
         </w:rPr>
-        <w:t xml:space="preserve"> The application is available here: LINK</w:t>
+        <w:t xml:space="preserve"> The application is available here: </w:t>
+      </w:r>
+      <w:hyperlink r:id="rId1">
+        <w:r>
+          <w:rPr>
+            <w:color w:val="1155cc"/>
+            <w:sz w:val="20"/>
+            <w:szCs w:val="20"/>
+            <w:u w:val="single"/>
+            <w:rtl w:val="0"/>
+          </w:rPr>
+          <w:t xml:space="preserve">https://019adac8-81d4-aa0e-808c-08861c261fd2.share.connect.posit.cloud/</w:t>
+        </w:r>
+      </w:hyperlink>
+      <w:r>
+        <w:rPr>
+          <w:sz w:val="20"/>
+          <w:szCs w:val="20"/>
+          <w:rtl w:val="0"/>
+        </w:rPr>
+        <w:t xml:space="preserve"> </w:t>
       </w:r>
     </w:p>
   </w:footnote>

</xml_diff>

<commit_message>
new doc, new qmd, new pdf
</commit_message>
<xml_diff>
--- a/paper/gdoc.docx
+++ b/paper/gdoc.docx
@@ -1212,7 +1212,7 @@
         <w:rPr>
           <w:rtl w:val="0"/>
         </w:rPr>
-        <w:t xml:space="preserve"> source of information for corpus exploration. The evolution of an idea depends not only on how it is formulated by its authors, but also on how it is appropriated, and reinterpreted by readers. A substantial literature in citation theory examines how citations function as a scientific practice and how they should be interpreted [see, e.g., @TahamtanCore1979]. Citations may reflect a wide range of motivations—from a genuine desire to acknowledge intellectual debt to more strategic uses aimed at persuading readers or satisfying referees. Nevertheless, citations at the very least signal a relationship that can help trace the lineage and diffusion of ideas, even when the reasons behind the citation are not purely intellectual.</w:t>
+        <w:t xml:space="preserve"> source of information for corpus exploration. The evolution of an idea depends not only on how it is formulated by its authors, but also on how it is appropriated, and reinterpreted by readers. A substantial literature in citation theory examines how citations function as a scientific practice and how they should be interpreted [see, e.g., @tahamtanCore2018]. Citations may reflect a wide range of motivations—from a genuine desire to acknowledge intellectual debt to more strategic uses aimed at persuading readers or satisfying referees. Nevertheless, citations at the very least signal a relationship that can help trace the lineage and diffusion of ideas, even when the reasons behind the citation are not purely intellectual.</w:t>
       </w:r>
     </w:p>
     <w:p>
@@ -2884,7 +2884,7 @@
         <w:rPr>
           <w:rtl w:val="0"/>
         </w:rPr>
-        <w:t xml:space="preserve">The contrast is stark and raises fundamental questions about disciplinary reception. Our quantitative study yields two particularly surprising results regarding the contrasting influence of Kahneman and Simon. First, the temporal patterns of adoption differ radically. For the historian @heukelomBehavioral2014, a pivotal moment in the history of behavioral economics was the explicit creation of research programs within the Sloan and Russell Sage Foundations between 1984 and 1992, notably fostering the Kahneman–Thaler collaboration that decisively transformed the field’s trajectory. Our analysis, however, suggests that a distinctive dynamic was already underway by the early 1980s in the reception of Kahneman and Tversky’s work. Despite the fact that @kahnemanProspect1979 was the duo’s only publication in an economics journal until 1985—well before the Sloan–Russell Sage programs formally institutionalized behavioral economics—prospect theory experienced rapid and sustained citation growth (@fig-rationality-paper-citations). As early as the 1977–1984 bibliometric network, we identify a cluster structured around their work, indicating that the article not only attracted citations but quickly catalyzed new research strands, in a way Simon’s work never did within economics [@heukelomSense2012].</w:t>
+        <w:t xml:space="preserve">The contrast is stark and raises fundamental questions about disciplinary reception. Our quantitative study yields two particularly surprising results regarding the contrasting influence of Kahneman and Simon. First, the temporal patterns of adoption differ radically. For the historian @heukelomBehavioral2014, a pivotal moment in the history of behavioral economics was the explicit creation of research programs within the Sloan and Russell Sage Foundations between 1984 and 1992, notably fostering the Kahneman–Thaler collaboration that decisively transformed the field’s trajectory. Our analysis, however, suggests that a distinctive dynamic was already underway by the early 1980s in the reception of Kahneman and Tversky’s work. Despite the fact that @kahnemanProspect1979 was the duo’s only publication in an economics journal until 1985—well before the Sloan–Russell Sage programs formally institutionalized behavioral economics—prospect theory experienced rapid and sustained citation growth (@fig-rationality-paper-citations). As early as the 1977–1984 bibliometric network, we identify a cluster structured around their work, indicating that the article not only attracted citations but quickly catalyzed new research strands, in a way Simon’s work never did within economics [@heukelom_sense_2012].</w:t>
       </w:r>
     </w:p>
     <w:p>

</xml_diff>

<commit_message>
rename paper files to v2/v3; update data paths towards google drive
</commit_message>
<xml_diff>
--- a/paper/gdoc.docx
+++ b/paper/gdoc.docx
@@ -32,7 +32,79 @@
         <w:rPr>
           <w:rtl w:val="0"/>
         </w:rPr>
-        <w:t xml:space="preserve">In the last decade, the number of history of economics papers employing quantitative methods has increased [see e.g., @goutsmedtQuantitative2023 special issue]. Several essays have adopted a reflexive stance, examining the implications of using quantitative methods in the history of economics [@cherrierQuantitative2018; @edwardsQuantitative2018]. These contributions have aimed to provide broad discussions on the use of such methods. However, given the virtually unlimited variety of quantitative approaches potentially relevant to historians of economics—and the wide array of research questions they can address—these reflections often remain abstract and offer little practical guidance. As a result, they tend to provide useful broad overviews, but without clearly articulating what quantification entails in practice, and how it can be both meaningful and challenging to integrate into research specific to the history and philosophy of economics.</w:t>
+        <w:t xml:space="preserve">In the last decade, the number of history of economics papers employing quantitative methods has increased [see e.g., @goutsmedtQuantitative2023 special issue]. Several essays have adopted a reflexive stance, examining the implications of using quantitative methods in the history of economics [@cherrierQuantitative2018; @edwardsQuantitative2018]. These contributions </w:t>
+      </w:r>
+      <w:ins w:author="Aurélien Goutsmedt" w:id="0" w:date="2026-04-08T15:53:55Z">
+        <w:r>
+          <w:rPr>
+            <w:rtl w:val="0"/>
+          </w:rPr>
+          <w:t xml:space="preserve">provided</w:t>
+        </w:r>
+      </w:ins>
+      <w:del w:author="Aurélien Goutsmedt" w:id="0" w:date="2026-04-08T15:53:55Z">
+        <w:r>
+          <w:rPr>
+            <w:rtl w:val="0"/>
+          </w:rPr>
+          <w:delText xml:space="preserve">have aimed to provide </w:delText>
+        </w:r>
+      </w:del>
+      <w:r>
+        <w:rPr>
+          <w:rtl w:val="0"/>
+        </w:rPr>
+        <w:t xml:space="preserve">broad discussions on the use of such methods. However, given the virtually unlimited variety of quantitative approaches potentially relevant to historians of economics—and the wide array of research questions they can address—these reflections often remain</w:t>
+      </w:r>
+      <w:ins w:author="Aurélien Goutsmedt" w:id="1" w:date="2026-04-08T15:54:18Z">
+        <w:r>
+          <w:rPr>
+            <w:rtl w:val="0"/>
+          </w:rPr>
+          <w:t xml:space="preserve">ed at an</w:t>
+        </w:r>
+      </w:ins>
+      <w:r>
+        <w:rPr>
+          <w:rtl w:val="0"/>
+        </w:rPr>
+        <w:t xml:space="preserve"> abstract</w:t>
+      </w:r>
+      <w:ins w:author="Aurélien Goutsmedt" w:id="2" w:date="2026-04-08T15:54:29Z">
+        <w:r>
+          <w:rPr>
+            <w:rtl w:val="0"/>
+          </w:rPr>
+          <w:t xml:space="preserve"> level</w:t>
+        </w:r>
+      </w:ins>
+      <w:r>
+        <w:rPr>
+          <w:rtl w:val="0"/>
+        </w:rPr>
+        <w:t xml:space="preserve"> and offer little practical guidance. As a result, they tend to provide useful broad overviews, but without clearly articulating what quantification entails in practice, and how </w:t>
+      </w:r>
+      <w:ins w:author="Aurélien Goutsmedt" w:id="3" w:date="2026-04-08T15:55:09Z">
+        <w:r>
+          <w:rPr>
+            <w:rtl w:val="0"/>
+          </w:rPr>
+          <w:t xml:space="preserve">quantitative methods</w:t>
+        </w:r>
+      </w:ins>
+      <w:del w:author="Aurélien Goutsmedt" w:id="3" w:date="2026-04-08T15:55:09Z">
+        <w:r>
+          <w:rPr>
+            <w:rtl w:val="0"/>
+          </w:rPr>
+          <w:delText xml:space="preserve">it</w:delText>
+        </w:r>
+      </w:del>
+      <w:r>
+        <w:rPr>
+          <w:rtl w:val="0"/>
+        </w:rPr>
+        <w:t xml:space="preserve"> can be both meaningful and challenging to integrate into research specific to the history and philosophy of economics.</w:t>
       </w:r>
     </w:p>
     <w:p>
@@ -54,18 +126,110 @@
         <w:rPr>
           <w:rtl w:val="0"/>
         </w:rPr>
-        <w:t xml:space="preserve">We focus our discussion on unsupervised methods that have been particularly influential in the history of economics. Unsupervised methods are machine-learning techniques in which algorithms identify patterns from unlabelled data, as opposed to supervised learning methods—such as regressions—that learn patterns from labelled data to make inferences. The goal of unsupervised methods is not necessarily to provide a “measure” [@grimmerText2022]—though they can be adapted to do so—but to organise in categories large corpora and enable accelerated and “distant reading” [@morettiDistant2013; @guldiDangerous2023]. They are well suited to historical inquiry because their unsupervised nature reduces the risk of presentism: rather than imposing present-day categories on the past, unsupervised algorithms uncover patterns directly from the data. When time is explicitly incorporated, they allow researchers to map the discipline at different points of time, to identify the emergence and decline of subjects and concepts, and to assess the influence of specific economists or ideas.</w:t>
-      </w:r>
-    </w:p>
-    <w:p>
-      <w:pPr>
-        <w:rPr/>
-      </w:pPr>
-      <w:r>
-        <w:rPr>
-          <w:rtl w:val="0"/>
-        </w:rPr>
-        <w:t xml:space="preserve">Our article uses two types of data, texts and citations. The analysis of textual corpora offers a direct window into the semantic content of debates, while citation data provides a lens through which to view intellectual interconnections and channels of influence within the discipline. We show how a large corpus of documents can be classified based on the information contained in textual and citation data—what we call “semantic clusters” and “bibliometric communities.”</w:t>
+        <w:t xml:space="preserve">We focus our discussion on unsupervised methods that have been particularly influential in the history of economics. </w:t>
+      </w:r>
+      <w:commentRangeStart w:id="0"/>
+      <w:commentRangeStart w:id="1"/>
+      <w:r>
+        <w:rPr>
+          <w:rtl w:val="0"/>
+        </w:rPr>
+        <w:t xml:space="preserve">Unsupervised methods are machine-learning techniques in which algorithms identify patterns from unlabelled data, as opposed to supervised learning methods—such as regressions—that learn patterns from labelled data to make inferences. The goal of unsupervised methods is not necessarily to provide a “measure” [@grimmerText2022]—though they can be adapted to do so—but to organise in categories large corpora and enable accelerated and “distant reading” [@morettiDistant2013; @guldiDangerous2023]. </w:t>
+      </w:r>
+      <w:commentRangeEnd w:id="0"/>
+      <w:r>
+        <w:commentReference w:id="0"/>
+      </w:r>
+      <w:commentRangeEnd w:id="1"/>
+      <w:r>
+        <w:commentReference w:id="1"/>
+      </w:r>
+      <w:r>
+        <w:rPr>
+          <w:rtl w:val="0"/>
+        </w:rPr>
+        <w:t xml:space="preserve">They are well suited to historical inquiry because their unsupervised nature reduces the risk of presentism: rather than imposing present-day categories on the past, unsupervised algorithms uncover patterns directly from the data. When time is explicitly incorporated, </w:t>
+      </w:r>
+      <w:del w:author="Aurélien Goutsmedt" w:id="4" w:date="2026-04-08T15:59:03Z">
+        <w:r>
+          <w:rPr>
+            <w:rtl w:val="0"/>
+          </w:rPr>
+          <w:delText xml:space="preserve">they allow </w:delText>
+        </w:r>
+      </w:del>
+      <w:r>
+        <w:rPr>
+          <w:rtl w:val="0"/>
+        </w:rPr>
+        <w:t xml:space="preserve">researchers </w:t>
+      </w:r>
+      <w:ins w:author="Aurélien Goutsmedt" w:id="5" w:date="2026-04-08T15:59:07Z">
+        <w:r>
+          <w:rPr>
+            <w:rtl w:val="0"/>
+          </w:rPr>
+          <w:t xml:space="preserve">can</w:t>
+        </w:r>
+      </w:ins>
+      <w:del w:author="Aurélien Goutsmedt" w:id="5" w:date="2026-04-08T15:59:07Z">
+        <w:r>
+          <w:rPr>
+            <w:rtl w:val="0"/>
+          </w:rPr>
+          <w:delText xml:space="preserve">to</w:delText>
+        </w:r>
+      </w:del>
+      <w:r>
+        <w:rPr>
+          <w:rtl w:val="0"/>
+        </w:rPr>
+        <w:t xml:space="preserve"> map the discipline at different points of time, to identify the emergence and decline of subjects and concepts, and to assess the influence of specific economists or ideas.</w:t>
+      </w:r>
+    </w:p>
+    <w:p>
+      <w:pPr>
+        <w:rPr/>
+      </w:pPr>
+      <w:r>
+        <w:rPr>
+          <w:rtl w:val="0"/>
+        </w:rPr>
+        <w:t xml:space="preserve">Our article uses two types of data, texts and citations. The analysis of textual corpora offers a direct window into the semantic content of debates, while citation data provides a lens through which to view intellectual interconnections and channels of influence within the discipline. We show how a large corpus of documents can be classified based on the information contained in textual and citation data—what we call “</w:t>
+      </w:r>
+      <w:r>
+        <w:rPr>
+          <w:i w:val="1"/>
+          <w:iCs w:val="1"/>
+          <w:rtl w:val="0"/>
+          <w:rPrChange w:author="Aurélien Goutsmedt" w:id="6" w:date="2026-04-08T16:01:36Z">
+            <w:rPr/>
+          </w:rPrChange>
+        </w:rPr>
+        <w:t xml:space="preserve">semantic clusters</w:t>
+      </w:r>
+      <w:r>
+        <w:rPr>
+          <w:rtl w:val="0"/>
+        </w:rPr>
+        <w:t xml:space="preserve">” and “</w:t>
+      </w:r>
+      <w:r>
+        <w:rPr>
+          <w:i w:val="1"/>
+          <w:iCs w:val="1"/>
+          <w:rtl w:val="0"/>
+          <w:rPrChange w:author="Aurélien Goutsmedt" w:id="7" w:date="2026-04-08T16:01:41Z">
+            <w:rPr/>
+          </w:rPrChange>
+        </w:rPr>
+        <w:t xml:space="preserve">bibliometric communities</w:t>
+      </w:r>
+      <w:r>
+        <w:rPr>
+          <w:rtl w:val="0"/>
+        </w:rPr>
+        <w:t xml:space="preserve">.”</w:t>
       </w:r>
       <w:r>
         <w:rPr>
@@ -104,7 +268,29 @@
         <w:rPr>
           <w:rtl w:val="0"/>
         </w:rPr>
-        <w:t xml:space="preserve">The concept of “rationality” is an effective focus for a concrete demonstration. First, many historians of economics engage with it in one way or another, which makes the exercise relevant for a broad audience. Second, because the concept is broad and pervasive in economics, applying quantitative methods to a very large corpus is particularly informative.</w:t>
+        <w:t xml:space="preserve">The concept of “rationality” is an effective focus for </w:t>
+      </w:r>
+      <w:ins w:author="Aurélien Goutsmedt" w:id="8" w:date="2026-04-08T16:30:29Z">
+        <w:r>
+          <w:rPr>
+            <w:rtl w:val="0"/>
+          </w:rPr>
+          <w:t xml:space="preserve">this</w:t>
+        </w:r>
+      </w:ins>
+      <w:del w:author="Aurélien Goutsmedt" w:id="8" w:date="2026-04-08T16:30:29Z">
+        <w:r>
+          <w:rPr>
+            <w:rtl w:val="0"/>
+          </w:rPr>
+          <w:delText xml:space="preserve">a</w:delText>
+        </w:r>
+      </w:del>
+      <w:r>
+        <w:rPr>
+          <w:rtl w:val="0"/>
+        </w:rPr>
+        <w:t xml:space="preserve"> concrete demonstration. First, many historians of economics engage with it in one way or another, which makes the exercise relevant for a broad audience. Second, because the concept is broad and pervasive in economics, applying quantitative methods to a very large corpus is particularly informative.</w:t>
       </w:r>
       <w:r>
         <w:rPr>
@@ -116,7 +302,60 @@
         <w:rPr>
           <w:rtl w:val="0"/>
         </w:rPr>
-        <w:t xml:space="preserve"> We use a corpus of around 290 000 articles in economics extending back to 1900 to show how these methods can handle long time horizons. Third, the multiple meanings attached to “rationality” and its uses applied to various subjects show how textual methods, coupled with bibliometrics, can help capture this semantic plurality.</w:t>
+        <w:t xml:space="preserve"> We use a corpus of around 290 000 articles </w:t>
+      </w:r>
+      <w:commentRangeStart w:id="2"/>
+      <w:r>
+        <w:rPr>
+          <w:rtl w:val="0"/>
+        </w:rPr>
+        <w:t xml:space="preserve">in economics </w:t>
+      </w:r>
+      <w:ins w:author="Aurélien Goutsmedt" w:id="9" w:date="2026-04-08T16:31:36Z">
+        <w:r>
+          <w:rPr>
+            <w:rtl w:val="0"/>
+          </w:rPr>
+          <w:t xml:space="preserve">between </w:t>
+        </w:r>
+      </w:ins>
+      <w:del w:author="Aurélien Goutsmedt" w:id="9" w:date="2026-04-08T16:31:36Z">
+        <w:r>
+          <w:rPr>
+            <w:rtl w:val="0"/>
+          </w:rPr>
+          <w:delText xml:space="preserve">extending back to </w:delText>
+        </w:r>
+      </w:del>
+      <w:r>
+        <w:rPr>
+          <w:rtl w:val="0"/>
+        </w:rPr>
+        <w:t xml:space="preserve">1900</w:t>
+      </w:r>
+      <w:ins w:author="Aurélien Goutsmedt" w:id="10" w:date="2026-04-08T16:31:39Z">
+        <w:r>
+          <w:rPr>
+            <w:rtl w:val="0"/>
+          </w:rPr>
+          <w:t xml:space="preserve"> and 2009</w:t>
+        </w:r>
+      </w:ins>
+      <w:r>
+        <w:rPr>
+          <w:rtl w:val="0"/>
+        </w:rPr>
+        <w:t xml:space="preserve"> to show h</w:t>
+      </w:r>
+      <w:commentRangeEnd w:id="2"/>
+      <w:r>
+        <w:commentReference w:id="2"/>
+      </w:r>
+      <w:r>
+        <w:rPr>
+          <w:rtl w:val="0"/>
+        </w:rPr>
+        <w:t xml:space="preserve">ow these methods can handle long time horizons. Third, the multiple meanings attached to “rationality” and its uses applied to various subjects show how textual methods, coupled with bibliometrics, can help capture this semantic plurality.</w:t>
       </w:r>
     </w:p>
     <w:p>
@@ -191,18 +430,201 @@
         <w:rPr>
           <w:rtl w:val="0"/>
         </w:rPr>
-        <w:t xml:space="preserve">Discussions on quantitative methods often focus on the varieties of existing methods. In practice, however, analysis and interpretation come last. Most effort goes into collecting, cleaning, and structuring data, much of which remains invisible in published work. Sources rarely arrive as ready-to-use datasets; they must be transformed from somewhat raw materials into usable corpora. In short, the quantitative historian must be as much a data wrangler as a data analyst.</w:t>
-      </w:r>
-    </w:p>
-    <w:p>
-      <w:pPr>
-        <w:rPr/>
-      </w:pPr>
-      <w:r>
-        <w:rPr>
-          <w:rtl w:val="0"/>
-        </w:rPr>
-        <w:t xml:space="preserve">Bibliometric databases are a convenient way to access corpora of economic texts: they record relatively well-structured data, gathering key features of scientific output—such as authors, journals and affiliations, </w:t>
+        <w:t xml:space="preserve">Discussions on quantitative methods often focus on the varieties of existing methods. In practice, however, </w:t>
+      </w:r>
+      <w:ins w:author="Aurélien Goutsmedt" w:id="11" w:date="2026-04-09T13:08:54Z">
+        <w:r>
+          <w:rPr>
+            <w:rtl w:val="0"/>
+          </w:rPr>
+          <w:t xml:space="preserve">implementing a method</w:t>
+        </w:r>
+      </w:ins>
+      <w:del w:author="Aurélien Goutsmedt" w:id="11" w:date="2026-04-09T13:08:54Z">
+        <w:r>
+          <w:rPr>
+            <w:rtl w:val="0"/>
+          </w:rPr>
+          <w:delText xml:space="preserve">analysis</w:delText>
+        </w:r>
+      </w:del>
+      <w:r>
+        <w:rPr>
+          <w:rtl w:val="0"/>
+        </w:rPr>
+        <w:t xml:space="preserve"> and </w:t>
+      </w:r>
+      <w:ins w:author="Aurélien Goutsmedt" w:id="12" w:date="2026-04-09T13:09:01Z">
+        <w:r>
+          <w:rPr>
+            <w:rtl w:val="0"/>
+            <w:rPrChange w:author="Aurélien Goutsmedt" w:id="13" w:date="2026-04-09T13:09:01Z">
+              <w:rPr/>
+            </w:rPrChange>
+          </w:rPr>
+          <w:t xml:space="preserve">interpreting</w:t>
+        </w:r>
+      </w:ins>
+      <w:del w:author="Aurélien Goutsmedt" w:id="12" w:date="2026-04-09T13:09:01Z">
+        <w:r>
+          <w:rPr>
+            <w:rtl w:val="0"/>
+            <w:rPrChange w:author="Aurélien Goutsmedt" w:id="13" w:date="2026-04-09T13:09:01Z">
+              <w:rPr/>
+            </w:rPrChange>
+          </w:rPr>
+          <w:delText xml:space="preserve">interpretati</w:delText>
+        </w:r>
+      </w:del>
+      <w:ins w:author="Aurélien Goutsmedt" w:id="12" w:date="2026-04-09T13:09:01Z">
+        <w:del w:author="Aurélien Goutsmedt" w:id="12" w:date="2026-04-09T13:09:01Z">
+          <w:r>
+            <w:rPr>
+              <w:rtl w:val="0"/>
+              <w:rPrChange w:author="Aurélien Goutsmedt" w:id="13" w:date="2026-04-09T13:09:01Z">
+                <w:rPr/>
+              </w:rPrChange>
+            </w:rPr>
+            <w:delText xml:space="preserve">ng</w:delText>
+          </w:r>
+        </w:del>
+        <w:r>
+          <w:rPr>
+            <w:rtl w:val="0"/>
+          </w:rPr>
+          <w:t xml:space="preserve"> its results</w:t>
+        </w:r>
+      </w:ins>
+      <w:del w:author="Aurélien Goutsmedt" w:id="12" w:date="2026-04-09T13:09:01Z">
+        <w:r>
+          <w:rPr>
+            <w:rtl w:val="0"/>
+          </w:rPr>
+          <w:delText xml:space="preserve">on</w:delText>
+        </w:r>
+      </w:del>
+      <w:r>
+        <w:rPr>
+          <w:rtl w:val="0"/>
+        </w:rPr>
+        <w:t xml:space="preserve"> come last. </w:t>
+      </w:r>
+      <w:ins w:author="Aurélien Goutsmedt" w:id="14" w:date="2026-04-09T13:09:36Z">
+        <w:r>
+          <w:rPr>
+            <w:rtl w:val="0"/>
+          </w:rPr>
+          <w:t xml:space="preserve">A great deal of </w:t>
+        </w:r>
+      </w:ins>
+      <w:del w:author="Aurélien Goutsmedt" w:id="14" w:date="2026-04-09T13:09:36Z">
+        <w:r>
+          <w:rPr>
+            <w:rtl w:val="0"/>
+          </w:rPr>
+          <w:delText xml:space="preserve">Most </w:delText>
+        </w:r>
+      </w:del>
+      <w:r>
+        <w:rPr>
+          <w:rtl w:val="0"/>
+        </w:rPr>
+        <w:t xml:space="preserve">effort goes into collecting, cleaning, and structuring data, much of which remains invisible in published work. Sources rarely arrive as ready-to-use datasets; they must be transformed from somewhat raw materials into usable corpora. In short, the quantitative historian</w:t>
+      </w:r>
+      <w:ins w:author="Aurélien Goutsmedt" w:id="15" w:date="2026-04-09T13:06:02Z">
+        <w:r>
+          <w:rPr>
+            <w:rtl w:val="0"/>
+          </w:rPr>
+          <w:t xml:space="preserve"> is</w:t>
+        </w:r>
+      </w:ins>
+      <w:r>
+        <w:rPr>
+          <w:rtl w:val="0"/>
+        </w:rPr>
+        <w:t xml:space="preserve"> </w:t>
+      </w:r>
+      <w:del w:author="Aurélien Goutsmedt" w:id="16" w:date="2026-04-09T13:06:08Z">
+        <w:r>
+          <w:rPr>
+            <w:rtl w:val="0"/>
+          </w:rPr>
+          <w:delText xml:space="preserve">must be as much </w:delText>
+        </w:r>
+      </w:del>
+      <w:r>
+        <w:rPr>
+          <w:rtl w:val="0"/>
+        </w:rPr>
+        <w:t xml:space="preserve">a data wrangler as</w:t>
+      </w:r>
+      <w:ins w:author="Aurélien Goutsmedt" w:id="17" w:date="2026-04-09T13:06:12Z">
+        <w:r>
+          <w:rPr>
+            <w:rtl w:val="0"/>
+          </w:rPr>
+          <w:t xml:space="preserve"> much as</w:t>
+        </w:r>
+      </w:ins>
+      <w:r>
+        <w:rPr>
+          <w:rtl w:val="0"/>
+        </w:rPr>
+        <w:t xml:space="preserve"> a data analyst.</w:t>
+      </w:r>
+    </w:p>
+    <w:p>
+      <w:pPr>
+        <w:rPr/>
+      </w:pPr>
+      <w:r>
+        <w:rPr>
+          <w:rtl w:val="0"/>
+        </w:rPr>
+        <w:t xml:space="preserve">Bibliometric databases are a convenient way to access corpora of economic texts: they record relatively well-structured data, gathering key features of scientific output—</w:t>
+      </w:r>
+      <w:del w:author="Aurélien Goutsmedt" w:id="18" w:date="2026-04-09T13:10:37Z">
+        <w:r>
+          <w:rPr>
+            <w:rtl w:val="0"/>
+          </w:rPr>
+          <w:delText xml:space="preserve">such as </w:delText>
+        </w:r>
+      </w:del>
+      <w:r>
+        <w:rPr>
+          <w:rtl w:val="0"/>
+        </w:rPr>
+        <w:t xml:space="preserve">authors, journals</w:t>
+      </w:r>
+      <w:ins w:author="Aurélien Goutsmedt" w:id="19" w:date="2026-04-09T13:10:43Z">
+        <w:r>
+          <w:rPr>
+            <w:rtl w:val="0"/>
+          </w:rPr>
+          <w:t xml:space="preserve">,</w:t>
+        </w:r>
+      </w:ins>
+      <w:r>
+        <w:rPr>
+          <w:rtl w:val="0"/>
+        </w:rPr>
+        <w:t xml:space="preserve"> </w:t>
+      </w:r>
+      <w:del w:author="Aurélien Goutsmedt" w:id="20" w:date="2026-04-09T13:10:40Z">
+        <w:r>
+          <w:rPr>
+            <w:rtl w:val="0"/>
+          </w:rPr>
+          <w:delText xml:space="preserve">and </w:delText>
+        </w:r>
+      </w:del>
+      <w:r>
+        <w:rPr>
+          <w:rtl w:val="0"/>
+        </w:rPr>
+        <w:t xml:space="preserve">affiliations, </w:t>
       </w:r>
       <w:r>
         <w:rPr>
@@ -244,18 +666,222 @@
         <w:rPr>
           <w:rtl w:val="0"/>
         </w:rPr>
-        <w:t xml:space="preserve"> record citation data, which enables tracing intellectual influence through diffusion patterns, and mapping scholarly contributions over time. </w:t>
-      </w:r>
-    </w:p>
-    <w:p>
-      <w:pPr>
-        <w:rPr/>
-      </w:pPr>
-      <w:r>
-        <w:rPr>
-          <w:rtl w:val="0"/>
-        </w:rPr>
-        <w:t xml:space="preserve">Each database has its own strengths and weaknesses. While at a very general level Web of Science, OpenAlex, or Scopus have similar coverage [@martin-martinGoogleScholarMicrosoft2021; @culbertReference2025], some studies might suffer from choosing a less appropriate database regarding the research questions. For instance, Scopus has a lower coverage of the top 5 economics journals before the 1990s and while being openaccess, OpenAlex has been less curated than the products of private publishers. Whatever the provider, less successful or now-defunct journals are also more likely to have incomplete or discontinuous digital coverage, impeding their inclusion for historical analyses. Additionally, databases are oriented toward English-speaking contributions; these databases may thus be deficient for a research project targeting another or multiple languages.</w:t>
+        <w:t xml:space="preserve"> record citation data, which enables tracing intellectual influence through </w:t>
+      </w:r>
+      <w:ins w:author="Aurélien Goutsmedt" w:id="21" w:date="2026-04-09T13:13:21Z">
+        <w:r>
+          <w:rPr>
+            <w:rtl w:val="0"/>
+          </w:rPr>
+          <w:t xml:space="preserve">references</w:t>
+        </w:r>
+      </w:ins>
+      <w:del w:author="Aurélien Goutsmedt" w:id="21" w:date="2026-04-09T13:13:21Z">
+        <w:r>
+          <w:rPr>
+            <w:rtl w:val="0"/>
+          </w:rPr>
+          <w:delText xml:space="preserve">diffusion patterns,</w:delText>
+        </w:r>
+      </w:del>
+      <w:r>
+        <w:rPr>
+          <w:rtl w:val="0"/>
+        </w:rPr>
+        <w:t xml:space="preserve"> and mapping scholarly contributions over time. </w:t>
+      </w:r>
+    </w:p>
+    <w:p>
+      <w:pPr>
+        <w:rPr/>
+      </w:pPr>
+      <w:ins w:author="Aurélien Goutsmedt" w:id="22" w:date="2026-04-09T13:23:49Z">
+        <w:r>
+          <w:rPr>
+            <w:rtl w:val="0"/>
+          </w:rPr>
+          <w:t xml:space="preserve">Regarding data availability, e</w:t>
+        </w:r>
+      </w:ins>
+      <w:del w:author="Aurélien Goutsmedt" w:id="22" w:date="2026-04-09T13:23:49Z">
+        <w:r>
+          <w:rPr>
+            <w:rtl w:val="0"/>
+          </w:rPr>
+          <w:delText xml:space="preserve">E</w:delText>
+        </w:r>
+      </w:del>
+      <w:r>
+        <w:rPr>
+          <w:rtl w:val="0"/>
+        </w:rPr>
+        <w:t xml:space="preserve">ach database has its own strengths and weaknesses. While at a very general level Web of Science, OpenAlex, or Scopus have similar coverage [@martin-martinGoogleScholarMicrosoft2021; @culbertReference2025], some studies might suffer from choosing a less appropriate database regarding the research questions. For instance, Scopus has a lower coverage of the </w:t>
+      </w:r>
+      <w:ins w:author="Aurélien Goutsmedt" w:id="23" w:date="2026-04-09T13:16:43Z">
+        <w:r>
+          <w:rPr>
+            <w:rtl w:val="0"/>
+          </w:rPr>
+          <w:t xml:space="preserve">“</w:t>
+        </w:r>
+      </w:ins>
+      <w:r>
+        <w:rPr>
+          <w:rtl w:val="0"/>
+        </w:rPr>
+        <w:t xml:space="preserve">top </w:t>
+      </w:r>
+      <w:ins w:author="Aurélien Goutsmedt" w:id="24" w:date="2026-04-09T13:16:36Z">
+        <w:r>
+          <w:rPr>
+            <w:rtl w:val="0"/>
+          </w:rPr>
+          <w:t xml:space="preserve">five”</w:t>
+        </w:r>
+      </w:ins>
+      <w:del w:author="Aurélien Goutsmedt" w:id="24" w:date="2026-04-09T13:16:36Z">
+        <w:r>
+          <w:rPr>
+            <w:rtl w:val="0"/>
+          </w:rPr>
+          <w:delText xml:space="preserve">5</w:delText>
+        </w:r>
+      </w:del>
+      <w:r>
+        <w:rPr>
+          <w:rtl w:val="0"/>
+        </w:rPr>
+        <w:t xml:space="preserve"> economics journals before the 1990s and</w:t>
+      </w:r>
+      <w:ins w:author="Aurélien Goutsmedt" w:id="25" w:date="2026-04-09T13:17:01Z">
+        <w:r>
+          <w:rPr>
+            <w:rtl w:val="0"/>
+          </w:rPr>
+          <w:t xml:space="preserve">,</w:t>
+        </w:r>
+      </w:ins>
+      <w:r>
+        <w:rPr>
+          <w:rtl w:val="0"/>
+        </w:rPr>
+        <w:t xml:space="preserve"> while being openaccess, OpenAlex has been less curated than the products of </w:t>
+      </w:r>
+      <w:ins w:author="Aurélien Goutsmedt" w:id="26" w:date="2026-04-09T13:17:12Z">
+        <w:r>
+          <w:rPr>
+            <w:rtl w:val="0"/>
+          </w:rPr>
+          <w:t xml:space="preserve">for-profit</w:t>
+        </w:r>
+      </w:ins>
+      <w:del w:author="Aurélien Goutsmedt" w:id="26" w:date="2026-04-09T13:17:12Z">
+        <w:r>
+          <w:rPr>
+            <w:rtl w:val="0"/>
+          </w:rPr>
+          <w:delText xml:space="preserve">private</w:delText>
+        </w:r>
+      </w:del>
+      <w:r>
+        <w:rPr>
+          <w:rtl w:val="0"/>
+        </w:rPr>
+        <w:t xml:space="preserve"> publishers. Whatever the provider, less </w:t>
+      </w:r>
+      <w:ins w:author="Aurélien Goutsmedt" w:id="27" w:date="2026-04-09T13:18:03Z">
+        <w:r>
+          <w:rPr>
+            <w:rtl w:val="0"/>
+          </w:rPr>
+          <w:t xml:space="preserve">central</w:t>
+        </w:r>
+      </w:ins>
+      <w:del w:author="Aurélien Goutsmedt" w:id="27" w:date="2026-04-09T13:18:03Z">
+        <w:r>
+          <w:rPr>
+            <w:rtl w:val="0"/>
+          </w:rPr>
+          <w:delText xml:space="preserve">successful</w:delText>
+        </w:r>
+      </w:del>
+      <w:r>
+        <w:rPr>
+          <w:rtl w:val="0"/>
+        </w:rPr>
+        <w:t xml:space="preserve"> or now-defunct journals are </w:t>
+      </w:r>
+      <w:del w:author="Aurélien Goutsmedt" w:id="28" w:date="2026-04-09T13:18:16Z">
+        <w:r>
+          <w:rPr>
+            <w:rtl w:val="0"/>
+          </w:rPr>
+          <w:delText xml:space="preserve">also </w:delText>
+        </w:r>
+      </w:del>
+      <w:r>
+        <w:rPr>
+          <w:rtl w:val="0"/>
+        </w:rPr>
+        <w:t xml:space="preserve">more likely to have incomplete or discontinuous digital coverage, impeding their inclusion for historical analyses. Additionally, </w:t>
+      </w:r>
+      <w:ins w:author="Aurélien Goutsmedt" w:id="29" w:date="2026-04-09T13:18:57Z">
+        <w:r>
+          <w:rPr>
+            <w:rtl w:val="0"/>
+          </w:rPr>
+          <w:t xml:space="preserve">as these </w:t>
+        </w:r>
+      </w:ins>
+      <w:r>
+        <w:rPr>
+          <w:rtl w:val="0"/>
+        </w:rPr>
+        <w:t xml:space="preserve">databases are oriented toward English-speaking contributions</w:t>
+      </w:r>
+      <w:ins w:author="Aurélien Goutsmedt" w:id="30" w:date="2026-04-09T13:19:37Z">
+        <w:r>
+          <w:rPr>
+            <w:rtl w:val="0"/>
+          </w:rPr>
+          <w:t xml:space="preserve">, they may be inadequate </w:t>
+        </w:r>
+      </w:ins>
+      <w:del w:author="Aurélien Goutsmedt" w:id="30" w:date="2026-04-09T13:19:37Z">
+        <w:r>
+          <w:rPr>
+            <w:rtl w:val="0"/>
+          </w:rPr>
+          <w:delText xml:space="preserve">; these databases may thus be deficient </w:delText>
+        </w:r>
+      </w:del>
+      <w:r>
+        <w:rPr>
+          <w:rtl w:val="0"/>
+        </w:rPr>
+        <w:t xml:space="preserve">for a research project targeting </w:t>
+      </w:r>
+      <w:ins w:author="Aurélien Goutsmedt" w:id="31" w:date="2026-04-09T13:19:56Z">
+        <w:r>
+          <w:rPr>
+            <w:rtl w:val="0"/>
+          </w:rPr>
+          <w:t xml:space="preserve">other</w:t>
+        </w:r>
+      </w:ins>
+      <w:del w:author="Aurélien Goutsmedt" w:id="31" w:date="2026-04-09T13:19:56Z">
+        <w:r>
+          <w:rPr>
+            <w:rtl w:val="0"/>
+          </w:rPr>
+          <w:delText xml:space="preserve">another or multiple</w:delText>
+        </w:r>
+      </w:del>
+      <w:r>
+        <w:rPr>
+          <w:rtl w:val="0"/>
+        </w:rPr>
+        <w:t xml:space="preserve"> languages.</w:t>
       </w:r>
       <w:r>
         <w:rPr>
@@ -267,46 +893,235 @@
         <w:rPr>
           <w:rtl w:val="0"/>
         </w:rPr>
-        <w:t xml:space="preserve"> More generally, citation practices have only standardised progressively in the postwar period. Consequently, citation data are most of the time relatively poor before the 1960s. Last but not least, although they provide useful metadata and citation information, these databases generally lack full text, which is subject to copyright and therefore cannot be obtained from a single publisher. </w:t>
-      </w:r>
-    </w:p>
-    <w:p>
-      <w:pPr>
-        <w:rPr/>
-      </w:pPr>
-      <w:r>
-        <w:rPr>
-          <w:rtl w:val="0"/>
-        </w:rPr>
-        <w:t xml:space="preserve">Even when citations and full texts are available, the amount and quality of information that can be reliably encoded remain limited. </w:t>
-      </w:r>
-      <w:r>
-        <w:rPr>
-          <w:rtl w:val="0"/>
-        </w:rPr>
-        <w:t xml:space="preserve">Citation data are notoriously difficult to structure, because both the very notion of what constitutes a reference and the conventions governing its recording have changed over time—for instance, from references embedded in footnotes to the development of standardized bibliographies and the author–date system [@graftonFootnote1999]. </w:t>
-      </w:r>
-      <w:r>
-        <w:rPr>
-          <w:rtl w:val="0"/>
-        </w:rPr>
-        <w:t xml:space="preserve">Full texts face similar limitations: mathematical expressions and empirical material, such as tables, are often poorly captured or inconsistently encoded by providers. These shortcomings restrict what can be studied by  quantitative tools.</w:t>
-      </w:r>
-      <w:r>
-        <w:rPr>
-          <w:rtl w:val="0"/>
-        </w:rPr>
-      </w:r>
-    </w:p>
-    <w:p>
-      <w:pPr>
-        <w:rPr/>
-      </w:pPr>
-      <w:r>
-        <w:rPr>
-          <w:rtl w:val="0"/>
-        </w:rPr>
-        <w:t xml:space="preserve">A first important point is, therefore, that data availability shapes what can be asked and so answered.</w:t>
+        <w:t xml:space="preserve"> More generally, citation practices have only standardised progressively in the postwar period. Consequently, citation data are most of the time relatively poor before the 1960s. Last</w:t>
+      </w:r>
+      <w:del w:author="Aurélien Goutsmedt" w:id="32" w:date="2026-04-09T13:26:27Z">
+        <w:r>
+          <w:rPr>
+            <w:rtl w:val="0"/>
+          </w:rPr>
+          <w:delText xml:space="preserve"> but not least</w:delText>
+        </w:r>
+      </w:del>
+      <w:r>
+        <w:rPr>
+          <w:rtl w:val="0"/>
+        </w:rPr>
+        <w:t xml:space="preserve">, although they provide useful metadata and citation information, these databases generally lack full text, which is subject to copyright and therefore</w:t>
+      </w:r>
+      <w:ins w:author="Aurélien Goutsmedt" w:id="33" w:date="2026-04-09T13:29:38Z">
+        <w:r>
+          <w:rPr>
+            <w:rtl w:val="0"/>
+          </w:rPr>
+          <w:t xml:space="preserve">, a large and representative corpus of economics articles</w:t>
+        </w:r>
+      </w:ins>
+      <w:r>
+        <w:rPr>
+          <w:rtl w:val="0"/>
+        </w:rPr>
+        <w:t xml:space="preserve"> cannot be obtained from a single publisher. </w:t>
+      </w:r>
+    </w:p>
+    <w:p>
+      <w:pPr>
+        <w:rPr/>
+      </w:pPr>
+      <w:r>
+        <w:rPr>
+          <w:rtl w:val="0"/>
+        </w:rPr>
+        <w:t xml:space="preserve">Even when citations and full texts are available, the </w:t>
+      </w:r>
+      <w:del w:author="Aurélien Goutsmedt" w:id="34" w:date="2026-04-09T13:24:34Z">
+        <w:r>
+          <w:rPr>
+            <w:rtl w:val="0"/>
+          </w:rPr>
+          <w:delText xml:space="preserve">amount and </w:delText>
+        </w:r>
+      </w:del>
+      <w:r>
+        <w:rPr>
+          <w:rtl w:val="0"/>
+        </w:rPr>
+        <w:t xml:space="preserve">quality of information that can be reliably encoded </w:t>
+      </w:r>
+      <w:ins w:author="Aurélien Goutsmedt" w:id="35" w:date="2026-04-09T13:24:40Z">
+        <w:r>
+          <w:rPr>
+            <w:rtl w:val="0"/>
+            <w:rPrChange w:author="Aurélien Goutsmedt" w:id="36" w:date="2026-04-09T13:24:40Z">
+              <w:rPr/>
+            </w:rPrChange>
+          </w:rPr>
+          <w:t xml:space="preserve">remains</w:t>
+        </w:r>
+      </w:ins>
+      <w:del w:author="Aurélien Goutsmedt" w:id="35" w:date="2026-04-09T13:24:40Z">
+        <w:r>
+          <w:rPr>
+            <w:rtl w:val="0"/>
+            <w:rPrChange w:author="Aurélien Goutsmedt" w:id="36" w:date="2026-04-09T13:24:40Z">
+              <w:rPr/>
+            </w:rPrChange>
+          </w:rPr>
+          <w:delText xml:space="preserve">remain</w:delText>
+        </w:r>
+      </w:del>
+      <w:r>
+        <w:rPr>
+          <w:rtl w:val="0"/>
+        </w:rPr>
+        <w:t xml:space="preserve"> limited. </w:t>
+      </w:r>
+      <w:r>
+        <w:rPr>
+          <w:rtl w:val="0"/>
+        </w:rPr>
+        <w:t xml:space="preserve">Citation data are </w:t>
+      </w:r>
+      <w:del w:author="Aurélien Goutsmedt" w:id="37" w:date="2026-04-09T13:32:04Z">
+        <w:r>
+          <w:rPr>
+            <w:rtl w:val="0"/>
+          </w:rPr>
+          <w:delText xml:space="preserve">notoriously </w:delText>
+        </w:r>
+      </w:del>
+      <w:r>
+        <w:rPr>
+          <w:rtl w:val="0"/>
+        </w:rPr>
+        <w:t xml:space="preserve">difficult to structure, because both the very notion of what constitutes a reference and the conventions governing its recording have changed over time—for instance, from references embedded in footnotes to the development of standardized bibliographies and the author–date system [@graftonFootnote1999]. </w:t>
+      </w:r>
+      <w:r>
+        <w:rPr>
+          <w:rtl w:val="0"/>
+        </w:rPr>
+        <w:t xml:space="preserve">Full texts face similar limitations: mathematical expressions and empirical material, such as tables, are often poorly captured </w:t>
+      </w:r>
+      <w:del w:author="Aurélien Goutsmedt" w:id="38" w:date="2026-04-09T13:32:38Z">
+        <w:r>
+          <w:rPr>
+            <w:rtl w:val="0"/>
+          </w:rPr>
+          <w:delText xml:space="preserve">or inconsistently encoded </w:delText>
+        </w:r>
+      </w:del>
+      <w:r>
+        <w:rPr>
+          <w:rtl w:val="0"/>
+        </w:rPr>
+        <w:t xml:space="preserve">by providers</w:t>
+      </w:r>
+      <w:ins w:author="Aurélien Goutsmedt" w:id="39" w:date="2026-04-09T13:32:42Z">
+        <w:r>
+          <w:rPr>
+            <w:rtl w:val="0"/>
+          </w:rPr>
+          <w:t xml:space="preserve"> and difficult to encode properly</w:t>
+        </w:r>
+      </w:ins>
+      <w:r>
+        <w:rPr>
+          <w:rtl w:val="0"/>
+        </w:rPr>
+        <w:t xml:space="preserve">. These shortcomings restrict what can be studied by quantitative tools.</w:t>
+      </w:r>
+      <w:r>
+        <w:rPr>
+          <w:rtl w:val="0"/>
+        </w:rPr>
+      </w:r>
+    </w:p>
+    <w:p>
+      <w:pPr>
+        <w:rPr/>
+      </w:pPr>
+      <w:ins w:author="Aurélien Goutsmedt" w:id="40" w:date="2026-04-09T14:01:49Z">
+        <w:r>
+          <w:rPr>
+            <w:rtl w:val="0"/>
+          </w:rPr>
+          <w:t xml:space="preserve">In short,</w:t>
+        </w:r>
+      </w:ins>
+      <w:del w:author="Aurélien Goutsmedt" w:id="40" w:date="2026-04-09T14:01:49Z">
+        <w:r>
+          <w:rPr>
+            <w:rtl w:val="0"/>
+          </w:rPr>
+          <w:delText xml:space="preserve">A first important point is, therefore, that</w:delText>
+        </w:r>
+      </w:del>
+      <w:r>
+        <w:rPr>
+          <w:rtl w:val="0"/>
+        </w:rPr>
+        <w:t xml:space="preserve"> </w:t>
+      </w:r>
+      <w:ins w:author="Aurélien Goutsmedt" w:id="41" w:date="2026-04-09T14:02:37Z">
+        <w:r>
+          <w:rPr>
+            <w:rtl w:val="0"/>
+          </w:rPr>
+          <w:t xml:space="preserve">the</w:t>
+        </w:r>
+      </w:ins>
+      <w:del w:author="Aurélien Goutsmedt" w:id="41" w:date="2026-04-09T14:02:37Z">
+        <w:r>
+          <w:rPr>
+            <w:rtl w:val="0"/>
+          </w:rPr>
+          <w:delText xml:space="preserve">data</w:delText>
+        </w:r>
+      </w:del>
+      <w:r>
+        <w:rPr>
+          <w:rtl w:val="0"/>
+        </w:rPr>
+        <w:t xml:space="preserve"> availability</w:t>
+      </w:r>
+      <w:ins w:author="Aurélien Goutsmedt" w:id="42" w:date="2026-04-09T14:01:53Z">
+        <w:r>
+          <w:rPr>
+            <w:rtl w:val="0"/>
+          </w:rPr>
+          <w:t xml:space="preserve"> and quality of data</w:t>
+        </w:r>
+      </w:ins>
+      <w:r>
+        <w:rPr>
+          <w:rtl w:val="0"/>
+        </w:rPr>
+        <w:t xml:space="preserve"> </w:t>
+      </w:r>
+      <w:ins w:author="Aurélien Goutsmedt" w:id="43" w:date="2026-04-09T14:02:54Z">
+        <w:r>
+          <w:rPr>
+            <w:rtl w:val="0"/>
+            <w:rPrChange w:author="Aurélien Goutsmedt" w:id="44" w:date="2026-04-09T14:02:54Z">
+              <w:rPr/>
+            </w:rPrChange>
+          </w:rPr>
+          <w:t xml:space="preserve">determine</w:t>
+        </w:r>
+      </w:ins>
+      <w:del w:author="Aurélien Goutsmedt" w:id="43" w:date="2026-04-09T14:02:54Z">
+        <w:r>
+          <w:rPr>
+            <w:rtl w:val="0"/>
+          </w:rPr>
+          <w:delText xml:space="preserve">shapes</w:delText>
+        </w:r>
+      </w:del>
+      <w:r>
+        <w:rPr>
+          <w:rtl w:val="0"/>
+        </w:rPr>
+        <w:t xml:space="preserve"> what can be asked and so answered.</w:t>
       </w:r>
       <w:r>
         <w:rPr>
@@ -320,7 +1135,21 @@
         <w:rPr>
           <w:rtl w:val="0"/>
         </w:rPr>
-        <w:t xml:space="preserve">The scarcity and structure of available data affect every stage of inquiry, from the choice of research questions to the interpretations of quantitative results.</w:t>
+        <w:t xml:space="preserve">The scarcity and structure of </w:t>
+      </w:r>
+      <w:del w:author="Aurélien Goutsmedt" w:id="45" w:date="2026-04-09T14:04:41Z">
+        <w:r>
+          <w:rPr>
+            <w:rtl w:val="0"/>
+          </w:rPr>
+          <w:delText xml:space="preserve">available </w:delText>
+        </w:r>
+      </w:del>
+      <w:r>
+        <w:rPr>
+          <w:rtl w:val="0"/>
+        </w:rPr>
+        <w:t xml:space="preserve">data affect every stage of inquiry, from the choice of research questions to the interpretations of quantitative results.</w:t>
       </w:r>
       <w:r>
         <w:rPr>
@@ -328,23 +1157,77 @@
         </w:rPr>
         <w:t xml:space="preserve"> </w:t>
       </w:r>
-      <w:r>
-        <w:rPr>
-          <w:rtl w:val="0"/>
-        </w:rPr>
-        <w:t xml:space="preserve">In practice,  research may be shaped as much by the scarcity of</w:t>
-      </w:r>
-      <w:r>
-        <w:rPr>
-          <w:rtl w:val="0"/>
-        </w:rPr>
-        <w:t xml:space="preserve"> our data as by researchers’ own preferences. </w:t>
-      </w:r>
-      <w:r>
-        <w:rPr>
-          <w:rtl w:val="0"/>
-        </w:rPr>
-        <w:t xml:space="preserve">It is of course possible to build handmade datasets from scratch, but, in the case of textual and citation data, such tasks remain time-consuming beyond small-scale study. </w:t>
+      <w:del w:author="Aurélien Goutsmedt" w:id="46" w:date="2026-04-09T14:05:08Z">
+        <w:r>
+          <w:rPr>
+            <w:rtl w:val="0"/>
+          </w:rPr>
+          <w:delText xml:space="preserve">In practice,  research may be shaped as much by the scarcity of</w:delText>
+        </w:r>
+        <w:r>
+          <w:rPr>
+            <w:rtl w:val="0"/>
+          </w:rPr>
+          <w:delText xml:space="preserve"> our data as by researchers’ own preferences. </w:delText>
+        </w:r>
+      </w:del>
+      <w:ins w:author="Aurélien Goutsmedt" w:id="46" w:date="2026-04-09T14:05:08Z">
+        <w:r>
+          <w:rPr>
+            <w:rtl w:val="0"/>
+          </w:rPr>
+          <w:t xml:space="preserve">Scholars are not condemned to rely on existing databases and may </w:t>
+        </w:r>
+      </w:ins>
+      <w:del w:author="Aurélien Goutsmedt" w:id="46" w:date="2026-04-09T14:05:08Z">
+        <w:r>
+          <w:rPr>
+            <w:rtl w:val="0"/>
+          </w:rPr>
+          <w:delText xml:space="preserve">It is of course possible to </w:delText>
+        </w:r>
+      </w:del>
+      <w:r>
+        <w:rPr>
+          <w:rtl w:val="0"/>
+        </w:rPr>
+        <w:t xml:space="preserve">build handmade </w:t>
+      </w:r>
+      <w:ins w:author="Aurélien Goutsmedt" w:id="47" w:date="2026-04-09T14:06:24Z">
+        <w:r>
+          <w:rPr>
+            <w:rtl w:val="0"/>
+          </w:rPr>
+          <w:t xml:space="preserve">textual and citation </w:t>
+        </w:r>
+      </w:ins>
+      <w:r>
+        <w:rPr>
+          <w:rtl w:val="0"/>
+        </w:rPr>
+        <w:t xml:space="preserve">datasets from scratch</w:t>
+      </w:r>
+      <w:ins w:author="Aurélien Goutsmedt" w:id="48" w:date="2026-04-09T14:06:34Z">
+        <w:r>
+          <w:rPr>
+            <w:rtl w:val="0"/>
+          </w:rPr>
+          <w:t xml:space="preserve">. However,</w:t>
+        </w:r>
+      </w:ins>
+      <w:del w:author="Aurélien Goutsmedt" w:id="48" w:date="2026-04-09T14:06:34Z">
+        <w:r>
+          <w:rPr>
+            <w:rtl w:val="0"/>
+          </w:rPr>
+          <w:delText xml:space="preserve">, but, in the case of textual and citation data,</w:delText>
+        </w:r>
+      </w:del>
+      <w:r>
+        <w:rPr>
+          <w:rtl w:val="0"/>
+        </w:rPr>
+        <w:t xml:space="preserve"> such tasks remain time-consuming beyond small-scale study. </w:t>
       </w:r>
       <w:r>
         <w:rPr>
@@ -356,7 +1239,43 @@
         <w:rPr>
           <w:rtl w:val="0"/>
         </w:rPr>
-        <w:t xml:space="preserve">For example, a medium-scale study of the publications of the European Economic Review [@goutsmedtIndependent2023]—few thousands documents—required to combine three heterogenous databases: Econlit (for JEL codes classification) Web of Science, and Scopus (due to imperfect coverage of Web of Science).</w:t>
+        <w:t xml:space="preserve">For example, a medium-scale study of the publications of the European Economic Review [@goutsmedtIndependent2023]—few thousands documents—required to combine three heterogenous databases: Econlit (for JEL codes classification) Web of Science, and Scopus (due to </w:t>
+      </w:r>
+      <w:ins w:author="Aurélien Goutsmedt" w:id="49" w:date="2026-04-09T14:10:28Z">
+        <w:r>
+          <w:rPr>
+            <w:rtl w:val="0"/>
+          </w:rPr>
+          <w:t xml:space="preserve">incomplete</w:t>
+        </w:r>
+      </w:ins>
+      <w:del w:author="Aurélien Goutsmedt" w:id="49" w:date="2026-04-09T14:10:28Z">
+        <w:r>
+          <w:rPr>
+            <w:rtl w:val="0"/>
+          </w:rPr>
+          <w:delText xml:space="preserve">imperfect</w:delText>
+        </w:r>
+      </w:del>
+      <w:r>
+        <w:rPr>
+          <w:rtl w:val="0"/>
+        </w:rPr>
+        <w:t xml:space="preserve"> coverage of</w:t>
+      </w:r>
+      <w:ins w:author="Aurélien Goutsmedt" w:id="50" w:date="2026-04-09T14:10:15Z">
+        <w:r>
+          <w:rPr>
+            <w:rtl w:val="0"/>
+          </w:rPr>
+          <w:t xml:space="preserve"> the EER in</w:t>
+        </w:r>
+      </w:ins>
+      <w:r>
+        <w:rPr>
+          <w:rtl w:val="0"/>
+        </w:rPr>
+        <w:t xml:space="preserve"> Web of Science).</w:t>
       </w:r>
       <w:r>
         <w:rPr>
@@ -374,23 +1293,63 @@
         </w:rPr>
         <w:t xml:space="preserve">For our study of rationality, the first step was to identify the best sources. </w:t>
       </w:r>
-      <w:r>
-        <w:rPr>
-          <w:rtl w:val="0"/>
-        </w:rPr>
-        <w:t xml:space="preserve">For citation data, the Web of Science (WoS) provides the most reliable and consistent coverage for our period and has been widely used in the history of economics.</w:t>
-      </w:r>
-      <w:r>
-        <w:rPr>
-          <w:rtl w:val="0"/>
-        </w:rPr>
-        <w:t xml:space="preserve"> As for full text, we relied on three providers. First, JSTOR’s full-text collection offers high-quality scans of most leading economics journals [@jstorText2025]. </w:t>
-      </w:r>
-      <w:r>
-        <w:rPr>
-          <w:rtl w:val="0"/>
-        </w:rPr>
-        <w:t xml:space="preserve">Second, we used Scopus to identify peer-reviewed economics journals not included in JSTOR and to compile a complementary list of articles; for these, we retrieved full texts first through the Elsevier Full-Text API, when available. Third, remaining full texts were obtained through the ISTEX project [@istexInfrastructure2025], which provides access to a substantial corpus of documents for researchers affiliated with French universities.</w:t>
+      <w:commentRangeStart w:id="3"/>
+      <w:r>
+        <w:rPr>
+          <w:rtl w:val="0"/>
+        </w:rPr>
+        <w:t xml:space="preserve">For citation data, the Web of Science (WoS) provides the most reliable and consistent coverage for our period and has been widely used in the history of economics</w:t>
+      </w:r>
+      <w:commentRangeEnd w:id="3"/>
+      <w:r>
+        <w:commentReference w:id="3"/>
+      </w:r>
+      <w:r>
+        <w:rPr>
+          <w:rtl w:val="0"/>
+        </w:rPr>
+        <w:t xml:space="preserve">.</w:t>
+      </w:r>
+      <w:r>
+        <w:rPr>
+          <w:rtl w:val="0"/>
+        </w:rPr>
+        <w:t xml:space="preserve"> As for full text, we relied on three providers. First, JSTOR’s full-text collection offers </w:t>
+      </w:r>
+      <w:ins w:author="Aurélien Goutsmedt" w:id="51" w:date="2026-04-09T14:12:28Z">
+        <w:r>
+          <w:rPr>
+            <w:rtl w:val="0"/>
+          </w:rPr>
+          <w:t xml:space="preserve">good</w:t>
+        </w:r>
+      </w:ins>
+      <w:del w:author="Aurélien Goutsmedt" w:id="51" w:date="2026-04-09T14:12:28Z">
+        <w:r>
+          <w:rPr>
+            <w:rtl w:val="0"/>
+          </w:rPr>
+          <w:delText xml:space="preserve">high</w:delText>
+        </w:r>
+      </w:del>
+      <w:r>
+        <w:rPr>
+          <w:rtl w:val="0"/>
+        </w:rPr>
+        <w:t xml:space="preserve">-quality scans of most leading economics journals [@jstorText2025]. </w:t>
+      </w:r>
+      <w:r>
+        <w:rPr>
+          <w:rtl w:val="0"/>
+        </w:rPr>
+        <w:t xml:space="preserve">Second, we used Scopus to identify peer-reviewed economics journals not included in JSTOR and to compile a complementary list of articles; for these, we retrieved full texts first through the Elsevier Full-Text API, when available. </w:t>
+      </w:r>
+      <w:commentRangeStart w:id="4"/>
+      <w:r>
+        <w:rPr>
+          <w:rtl w:val="0"/>
+        </w:rPr>
+        <w:t xml:space="preserve">Third, remaining full texts were obtained through the ISTEX project [@istexInfrastructure2025], which provides access to a substantial corpus of documents for researchers affiliated with French universities.</w:t>
       </w:r>
       <w:r>
         <w:rPr>
@@ -398,6 +1357,10 @@
         </w:rPr>
         <w:footnoteReference w:customMarkFollows="0" w:id="4"/>
       </w:r>
+      <w:commentRangeEnd w:id="4"/>
+      <w:r>
+        <w:commentReference w:id="4"/>
+      </w:r>
       <w:r>
         <w:rPr>
           <w:rtl w:val="0"/>
@@ -418,7 +1381,21 @@
         <w:rPr>
           <w:rtl w:val="0"/>
         </w:rPr>
-        <w:t xml:space="preserve">@fig-distribution shows the distribution of this corpus. It can be already noted that our corpus disproportionately represents Anglo-Saxon journals, which are also those most systematically digitized and preserved. Not only do we tend to overlook other traditions of research, but this also raises a serious issue of presentism: the fact that retrospective data on these journals are easily accessible today does not imply that they were equally central in earlier ones, nor that articles were the dominant vehicle for the diffusion of ideas. </w:t>
+        <w:t xml:space="preserve">@fig-distribution shows the distribution</w:t>
+      </w:r>
+      <w:ins w:author="Aurélien Goutsmedt" w:id="52" w:date="2026-04-09T14:36:12Z">
+        <w:r>
+          <w:rPr>
+            <w:rtl w:val="0"/>
+          </w:rPr>
+          <w:t xml:space="preserve"> over year</w:t>
+        </w:r>
+      </w:ins>
+      <w:r>
+        <w:rPr>
+          <w:rtl w:val="0"/>
+        </w:rPr>
+        <w:t xml:space="preserve"> of this corpus. It can be already noted that our corpus disproportionately represents Anglo-Saxon journals, which are also those most systematically digitized and preserved. Not only do we tend to overlook other traditions of research, but this also raises a serious issue of presentism: the fact that retrospective data on these journals are easily accessible today does not imply that they were equally central in earlier ones, nor that articles were the dominant vehicle for the diffusion of ideas. </w:t>
       </w:r>
       <w:r>
         <w:rPr>
@@ -1894,21 +2871,21 @@
         </w:rPr>
         <w:t xml:space="preserve">n relation to semantic cluster 11, we observe, for instance, the emergence of a </w:t>
       </w:r>
-      <w:commentRangeStart w:id="0"/>
-      <w:commentRangeStart w:id="1"/>
+      <w:commentRangeStart w:id="5"/>
+      <w:commentRangeStart w:id="6"/>
       <w:r>
         <w:rPr>
           <w:rtl w:val="0"/>
         </w:rPr>
         <w:t xml:space="preserve">“Behavioral Economics and Choice Theory”</w:t>
       </w:r>
-      <w:commentRangeEnd w:id="0"/>
-      <w:r>
-        <w:commentReference w:id="0"/>
-      </w:r>
-      <w:commentRangeEnd w:id="1"/>
-      <w:r>
-        <w:commentReference w:id="1"/>
+      <w:commentRangeEnd w:id="5"/>
+      <w:r>
+        <w:commentReference w:id="5"/>
+      </w:r>
+      <w:commentRangeEnd w:id="6"/>
+      <w:r>
+        <w:commentReference w:id="6"/>
       </w:r>
       <w:r>
         <w:rPr>
@@ -3146,7 +4123,7 @@
 
 <file path=word/comments.xml><?xml version="1.0" encoding="utf-8"?>
 <w:comments xmlns:mc="http://schemas.openxmlformats.org/markup-compatibility/2006" xmlns:o="urn:schemas-microsoft-com:office:office" xmlns:r="http://schemas.openxmlformats.org/officeDocument/2006/relationships" xmlns:m="http://schemas.openxmlformats.org/officeDocument/2006/math" xmlns:v="urn:schemas-microsoft-com:vml" xmlns:wp="http://schemas.openxmlformats.org/drawingml/2006/wordprocessingDrawing" xmlns:w10="urn:schemas-microsoft-com:office:word" xmlns:w="http://schemas.openxmlformats.org/wordprocessingml/2006/main" xmlns:wne="http://schemas.microsoft.com/office/word/2006/wordml" xmlns:sl="http://schemas.openxmlformats.org/schemaLibrary/2006/main" xmlns:a="http://schemas.openxmlformats.org/drawingml/2006/main" xmlns:pic="http://schemas.openxmlformats.org/drawingml/2006/picture" xmlns:c="http://schemas.openxmlformats.org/drawingml/2006/chart" xmlns:lc="http://schemas.openxmlformats.org/drawingml/2006/lockedCanvas" xmlns:dgm="http://schemas.openxmlformats.org/drawingml/2006/diagram" xmlns:wps="http://schemas.microsoft.com/office/word/2010/wordprocessingShape" xmlns:wpg="http://schemas.microsoft.com/office/word/2010/wordprocessingGroup" xmlns:w14="http://schemas.microsoft.com/office/word/2010/wordml" xmlns:w15="http://schemas.microsoft.com/office/word/2012/wordml" xmlns:w16="http://schemas.microsoft.com/office/word/2018/wordml" xmlns:w16cex="http://schemas.microsoft.com/office/word/2018/wordml/cex" xmlns:w16cid="http://schemas.microsoft.com/office/word/2016/wordml/cid" xmlns="http://schemas.microsoft.com/office/tasks/2019/documenttasks" xmlns:cr="http://schemas.microsoft.com/office/comments/2020/reactions">
-  <w:comment w:author="Thomas Delcey" w:id="0" w:date="2025-12-13T01:11:21Z">
+  <w:comment w:author="Aurélien Goutsmedt" w:id="2" w:date="2026-04-08T16:32:10Z">
     <w:p>
       <w:pPr>
         <w:keepNext w:val="0"/>
@@ -3197,11 +4174,11 @@
           <w:vertAlign w:val="baseline"/>
           <w:rtl w:val="0"/>
         </w:rPr>
-        <w:t xml:space="preserve">Est-ce qu'on garde le label IA dans la version finale ? On a pas vraiment checké à quel point c'était pertinent.</w:t>
+        <w:t xml:space="preserve">Autant être clair dès le début, mais, à vérifier: on est d'accord que 290 000 c'est jusqu'à 2009?</w:t>
       </w:r>
     </w:p>
   </w:comment>
-  <w:comment w:author="Aurélien Goutsmedt" w:id="1" w:date="2025-12-13T11:14:16Z">
+  <w:comment w:author="Aurélien Goutsmedt" w:id="4" w:date="2026-04-09T14:33:00Z">
     <w:p>
       <w:pPr>
         <w:keepNext w:val="0"/>
@@ -3252,9 +4229,11 @@
           <w:vertAlign w:val="baseline"/>
           <w:rtl w:val="0"/>
         </w:rPr>
-        <w:t xml:space="preserve">A voir si on a le temps de renommer... </w:t>
-      </w:r>
-    </w:p>
+        <w:t xml:space="preserve">Je pense qu'on a besoin d'un schéma qui clarifie les trois sources, avec le nombre d'articles et de journaux (tout en renvoyant à l'appendice et en détaillant bien ça dans l'appendice).</w:t>
+      </w:r>
+    </w:p>
+  </w:comment>
+  <w:comment w:author="Aurélien Goutsmedt" w:id="3" w:date="2026-04-09T14:12:05Z">
     <w:p>
       <w:pPr>
         <w:keepNext w:val="0"/>
@@ -3305,7 +4284,280 @@
           <w:vertAlign w:val="baseline"/>
           <w:rtl w:val="0"/>
         </w:rPr>
+        <w:t xml:space="preserve">Possible to substantiate this by some reference?</w:t>
+      </w:r>
+    </w:p>
+  </w:comment>
+  <w:comment w:author="Thomas Delcey" w:id="5" w:date="2025-12-13T01:11:21Z">
+    <w:p>
+      <w:pPr>
+        <w:keepNext w:val="0"/>
+        <w:keepLines w:val="0"/>
+        <w:pageBreakBefore w:val="0"/>
+        <w:widowControl w:val="0"/>
+        <w:pBdr>
+          <w:top w:space="0" w:sz="0" w:val="nil"/>
+          <w:left w:space="0" w:sz="0" w:val="nil"/>
+          <w:bottom w:space="0" w:sz="0" w:val="nil"/>
+          <w:right w:space="0" w:sz="0" w:val="nil"/>
+          <w:between w:space="0" w:sz="0" w:val="nil"/>
+        </w:pBdr>
+        <w:shd w:fill="auto" w:val="clear"/>
+        <w:spacing w:after="0" w:before="0" w:line="240" w:lineRule="auto"/>
+        <w:ind w:left="0" w:right="0" w:firstLine="0"/>
+        <w:jc w:val="left"/>
+        <w:rPr>
+          <w:rFonts w:ascii="Arial" w:cs="Arial" w:eastAsia="Arial" w:hAnsi="Arial"/>
+          <w:b w:val="0"/>
+          <w:bCs w:val="0"/>
+          <w:i w:val="0"/>
+          <w:iCs w:val="0"/>
+          <w:smallCaps w:val="0"/>
+          <w:strike w:val="0"/>
+          <w:color w:val="000000"/>
+          <w:sz w:val="22"/>
+          <w:szCs w:val="22"/>
+          <w:u w:val="none"/>
+          <w:shd w:fill="auto" w:val="clear"/>
+          <w:vertAlign w:val="baseline"/>
+        </w:rPr>
+      </w:pPr>
+      <w:r>
+        <w:rPr>
+          <w:rFonts w:ascii="Arial" w:cs="Arial" w:eastAsia="Arial" w:hAnsi="Arial"/>
+          <w:b w:val="0"/>
+          <w:bCs w:val="0"/>
+          <w:i w:val="0"/>
+          <w:iCs w:val="0"/>
+          <w:smallCaps w:val="0"/>
+          <w:strike w:val="0"/>
+          <w:color w:val="000000"/>
+          <w:sz w:val="22"/>
+          <w:szCs w:val="22"/>
+          <w:u w:val="none"/>
+          <w:shd w:fill="auto" w:val="clear"/>
+          <w:vertAlign w:val="baseline"/>
+          <w:rtl w:val="0"/>
+        </w:rPr>
+        <w:t xml:space="preserve">Est-ce qu'on garde le label IA dans la version finale ? On a pas vraiment checké à quel point c'était pertinent.</w:t>
+      </w:r>
+    </w:p>
+  </w:comment>
+  <w:comment w:author="Aurélien Goutsmedt" w:id="6" w:date="2025-12-13T11:14:16Z">
+    <w:p>
+      <w:pPr>
+        <w:keepNext w:val="0"/>
+        <w:keepLines w:val="0"/>
+        <w:pageBreakBefore w:val="0"/>
+        <w:widowControl w:val="0"/>
+        <w:pBdr>
+          <w:top w:space="0" w:sz="0" w:val="nil"/>
+          <w:left w:space="0" w:sz="0" w:val="nil"/>
+          <w:bottom w:space="0" w:sz="0" w:val="nil"/>
+          <w:right w:space="0" w:sz="0" w:val="nil"/>
+          <w:between w:space="0" w:sz="0" w:val="nil"/>
+        </w:pBdr>
+        <w:shd w:fill="auto" w:val="clear"/>
+        <w:spacing w:after="0" w:before="0" w:line="240" w:lineRule="auto"/>
+        <w:ind w:left="0" w:right="0" w:firstLine="0"/>
+        <w:jc w:val="left"/>
+        <w:rPr>
+          <w:rFonts w:ascii="Arial" w:cs="Arial" w:eastAsia="Arial" w:hAnsi="Arial"/>
+          <w:b w:val="0"/>
+          <w:bCs w:val="0"/>
+          <w:i w:val="0"/>
+          <w:iCs w:val="0"/>
+          <w:smallCaps w:val="0"/>
+          <w:strike w:val="0"/>
+          <w:color w:val="000000"/>
+          <w:sz w:val="22"/>
+          <w:szCs w:val="22"/>
+          <w:u w:val="none"/>
+          <w:shd w:fill="auto" w:val="clear"/>
+          <w:vertAlign w:val="baseline"/>
+        </w:rPr>
+      </w:pPr>
+      <w:r>
+        <w:rPr>
+          <w:rFonts w:ascii="Arial" w:cs="Arial" w:eastAsia="Arial" w:hAnsi="Arial"/>
+          <w:b w:val="0"/>
+          <w:bCs w:val="0"/>
+          <w:i w:val="0"/>
+          <w:iCs w:val="0"/>
+          <w:smallCaps w:val="0"/>
+          <w:strike w:val="0"/>
+          <w:color w:val="000000"/>
+          <w:sz w:val="22"/>
+          <w:szCs w:val="22"/>
+          <w:u w:val="none"/>
+          <w:shd w:fill="auto" w:val="clear"/>
+          <w:vertAlign w:val="baseline"/>
+          <w:rtl w:val="0"/>
+        </w:rPr>
+        <w:t xml:space="preserve">A voir si on a le temps de renommer... </w:t>
+      </w:r>
+    </w:p>
+    <w:p>
+      <w:pPr>
+        <w:keepNext w:val="0"/>
+        <w:keepLines w:val="0"/>
+        <w:pageBreakBefore w:val="0"/>
+        <w:widowControl w:val="0"/>
+        <w:pBdr>
+          <w:top w:space="0" w:sz="0" w:val="nil"/>
+          <w:left w:space="0" w:sz="0" w:val="nil"/>
+          <w:bottom w:space="0" w:sz="0" w:val="nil"/>
+          <w:right w:space="0" w:sz="0" w:val="nil"/>
+          <w:between w:space="0" w:sz="0" w:val="nil"/>
+        </w:pBdr>
+        <w:shd w:fill="auto" w:val="clear"/>
+        <w:spacing w:after="0" w:before="0" w:line="240" w:lineRule="auto"/>
+        <w:ind w:left="0" w:right="0" w:firstLine="0"/>
+        <w:jc w:val="left"/>
+        <w:rPr>
+          <w:rFonts w:ascii="Arial" w:cs="Arial" w:eastAsia="Arial" w:hAnsi="Arial"/>
+          <w:b w:val="0"/>
+          <w:bCs w:val="0"/>
+          <w:i w:val="0"/>
+          <w:iCs w:val="0"/>
+          <w:smallCaps w:val="0"/>
+          <w:strike w:val="0"/>
+          <w:color w:val="000000"/>
+          <w:sz w:val="22"/>
+          <w:szCs w:val="22"/>
+          <w:u w:val="none"/>
+          <w:shd w:fill="auto" w:val="clear"/>
+          <w:vertAlign w:val="baseline"/>
+        </w:rPr>
+      </w:pPr>
+      <w:r>
+        <w:rPr>
+          <w:rFonts w:ascii="Arial" w:cs="Arial" w:eastAsia="Arial" w:hAnsi="Arial"/>
+          <w:b w:val="0"/>
+          <w:bCs w:val="0"/>
+          <w:i w:val="0"/>
+          <w:iCs w:val="0"/>
+          <w:smallCaps w:val="0"/>
+          <w:strike w:val="0"/>
+          <w:color w:val="000000"/>
+          <w:sz w:val="22"/>
+          <w:szCs w:val="22"/>
+          <w:u w:val="none"/>
+          <w:shd w:fill="auto" w:val="clear"/>
+          <w:vertAlign w:val="baseline"/>
+          <w:rtl w:val="0"/>
+        </w:rPr>
         <w:t xml:space="preserve">J'aurais bien changé pour les semantic cluster, tout en gardant le numéro.</w:t>
+      </w:r>
+    </w:p>
+  </w:comment>
+  <w:comment w:author="Aurélien Goutsmedt" w:id="0" w:date="2026-04-08T15:57:46Z">
+    <w:p>
+      <w:pPr>
+        <w:keepNext w:val="0"/>
+        <w:keepLines w:val="0"/>
+        <w:pageBreakBefore w:val="0"/>
+        <w:widowControl w:val="0"/>
+        <w:pBdr>
+          <w:top w:space="0" w:sz="0" w:val="nil"/>
+          <w:left w:space="0" w:sz="0" w:val="nil"/>
+          <w:bottom w:space="0" w:sz="0" w:val="nil"/>
+          <w:right w:space="0" w:sz="0" w:val="nil"/>
+          <w:between w:space="0" w:sz="0" w:val="nil"/>
+        </w:pBdr>
+        <w:shd w:fill="auto" w:val="clear"/>
+        <w:spacing w:after="0" w:before="0" w:line="240" w:lineRule="auto"/>
+        <w:ind w:left="0" w:right="0" w:firstLine="0"/>
+        <w:jc w:val="left"/>
+        <w:rPr>
+          <w:rFonts w:ascii="Arial" w:cs="Arial" w:eastAsia="Arial" w:hAnsi="Arial"/>
+          <w:b w:val="0"/>
+          <w:bCs w:val="0"/>
+          <w:i w:val="0"/>
+          <w:iCs w:val="0"/>
+          <w:smallCaps w:val="0"/>
+          <w:strike w:val="0"/>
+          <w:color w:val="000000"/>
+          <w:sz w:val="22"/>
+          <w:szCs w:val="22"/>
+          <w:u w:val="none"/>
+          <w:shd w:fill="auto" w:val="clear"/>
+          <w:vertAlign w:val="baseline"/>
+        </w:rPr>
+      </w:pPr>
+      <w:r>
+        <w:rPr>
+          <w:rFonts w:ascii="Arial" w:cs="Arial" w:eastAsia="Arial" w:hAnsi="Arial"/>
+          <w:b w:val="0"/>
+          <w:bCs w:val="0"/>
+          <w:i w:val="0"/>
+          <w:iCs w:val="0"/>
+          <w:smallCaps w:val="0"/>
+          <w:strike w:val="0"/>
+          <w:color w:val="000000"/>
+          <w:sz w:val="22"/>
+          <w:szCs w:val="22"/>
+          <w:u w:val="none"/>
+          <w:shd w:fill="auto" w:val="clear"/>
+          <w:vertAlign w:val="baseline"/>
+          <w:rtl w:val="0"/>
+        </w:rPr>
+        <w:t xml:space="preserve">First occurrence of unsupervised/supervised. See R2.3. Do we answer here, or wait for more development later?</w:t>
+      </w:r>
+    </w:p>
+  </w:comment>
+  <w:comment w:author="Aurélien Goutsmedt" w:id="1" w:date="2026-04-08T15:58:19Z">
+    <w:p>
+      <w:pPr>
+        <w:keepNext w:val="0"/>
+        <w:keepLines w:val="0"/>
+        <w:pageBreakBefore w:val="0"/>
+        <w:widowControl w:val="0"/>
+        <w:pBdr>
+          <w:top w:space="0" w:sz="0" w:val="nil"/>
+          <w:left w:space="0" w:sz="0" w:val="nil"/>
+          <w:bottom w:space="0" w:sz="0" w:val="nil"/>
+          <w:right w:space="0" w:sz="0" w:val="nil"/>
+          <w:between w:space="0" w:sz="0" w:val="nil"/>
+        </w:pBdr>
+        <w:shd w:fill="auto" w:val="clear"/>
+        <w:spacing w:after="0" w:before="0" w:line="240" w:lineRule="auto"/>
+        <w:ind w:left="0" w:right="0" w:firstLine="0"/>
+        <w:jc w:val="left"/>
+        <w:rPr>
+          <w:rFonts w:ascii="Arial" w:cs="Arial" w:eastAsia="Arial" w:hAnsi="Arial"/>
+          <w:b w:val="0"/>
+          <w:bCs w:val="0"/>
+          <w:i w:val="0"/>
+          <w:iCs w:val="0"/>
+          <w:smallCaps w:val="0"/>
+          <w:strike w:val="0"/>
+          <w:color w:val="000000"/>
+          <w:sz w:val="22"/>
+          <w:szCs w:val="22"/>
+          <w:u w:val="none"/>
+          <w:shd w:fill="auto" w:val="clear"/>
+          <w:vertAlign w:val="baseline"/>
+        </w:rPr>
+      </w:pPr>
+      <w:r>
+        <w:rPr>
+          <w:rFonts w:ascii="Arial" w:cs="Arial" w:eastAsia="Arial" w:hAnsi="Arial"/>
+          <w:b w:val="0"/>
+          <w:bCs w:val="0"/>
+          <w:i w:val="0"/>
+          <w:iCs w:val="0"/>
+          <w:smallCaps w:val="0"/>
+          <w:strike w:val="0"/>
+          <w:color w:val="000000"/>
+          <w:sz w:val="22"/>
+          <w:szCs w:val="22"/>
+          <w:u w:val="none"/>
+          <w:shd w:fill="auto" w:val="clear"/>
+          <w:vertAlign w:val="baseline"/>
+          <w:rtl w:val="0"/>
+        </w:rPr>
+        <w:t xml:space="preserve">Do we remove reference to regressions, or qualify more clearly what "supervised" learning is?</w:t>
       </w:r>
     </w:p>
   </w:comment>
@@ -3411,7 +4663,30 @@
           <w:szCs w:val="20"/>
           <w:rtl w:val="0"/>
         </w:rPr>
-        <w:t xml:space="preserve"> The bibliometric communities, identified through network analysis, could also be called clusters. But we opted for “communities” in order to distinguish them from the “semantic clusters”.</w:t>
+        <w:t xml:space="preserve"> The bibliometric communities, identified through network analysis, could also be called clusters. But we opted for “communities”</w:t>
+      </w:r>
+      <w:ins w:author="Aurélien Goutsmedt" w:id="53" w:date="2026-04-08T16:01:55Z">
+        <w:r>
+          <w:rPr>
+            <w:sz w:val="20"/>
+            <w:szCs w:val="20"/>
+            <w:rtl w:val="0"/>
+          </w:rPr>
+          <w:t xml:space="preserve">, a term often used in network analysis,</w:t>
+        </w:r>
+      </w:ins>
+      <w:r>
+        <w:rPr>
+          <w:sz w:val="20"/>
+          <w:szCs w:val="20"/>
+          <w:rtl w:val="0"/>
+        </w:rPr>
+        <w:t xml:space="preserve"> in order to distinguish them from the “semantic clusters”.</w:t>
+      </w:r>
+      <w:r>
+        <w:rPr>
+          <w:rtl w:val="0"/>
+        </w:rPr>
       </w:r>
     </w:p>
   </w:footnote>

</xml_diff>

<commit_message>
update papers, and place many draft files in depreciated folder
</commit_message>
<xml_diff>
--- a/paper/gdoc.docx
+++ b/paper/gdoc.docx
@@ -2187,16 +2187,11 @@
         </w:rPr>
         <w:t xml:space="preserve">However, citation practices tend to favor more recent works, which makes it unhelpful for historians to construct a single citation network spanning an entire century. Following a method that has proven effective in the field </w:t>
       </w:r>
-      <w:commentRangeStart w:id="25"/>
       <w:r>
         <w:rPr>
           <w:rtl w:val="0"/>
         </w:rPr>
         <w:t xml:space="preserve">[@claveauMacrodyanmics2016; @goutsmedtIndependent2023; @camilottoNavigating2023]</w:t>
-      </w:r>
-      <w:commentRangeEnd w:id="25"/>
-      <w:r>
-        <w:commentReference w:id="25"/>
       </w:r>
       <w:r>
         <w:rPr>
@@ -2278,67 +2273,67 @@
       <w:pPr>
         <w:rPr/>
       </w:pPr>
+      <w:commentRangeStart w:id="25"/>
+      <w:r>
+        <w:rPr>
+          <w:rtl w:val="0"/>
+        </w:rPr>
+        <w:t xml:space="preserve">For textual data, historians of economics frequently rely on topic modeling [bakeevAcademic2023; fontanaFragmentation2023; acostaSix2024]. Topic modeling identifies the latent themes in a corpus by learning distributions of words associated with each topic. Each document is then represented by a mixture of these topics—often with one or two dominating—while each topic can be described through its most representative words and expressions. While topic modeling is a convenient tool for historical analysis, our research question pushed us toward a more targeted approach.</w:t>
+      </w:r>
+      <w:commentRangeEnd w:id="25"/>
+      <w:r>
+        <w:commentReference w:id="25"/>
+      </w:r>
+      <w:r>
+        <w:rPr>
+          <w:rtl w:val="0"/>
+        </w:rPr>
+      </w:r>
+    </w:p>
+    <w:p>
+      <w:pPr>
+        <w:rPr/>
+      </w:pPr>
       <w:commentRangeStart w:id="26"/>
       <w:r>
         <w:rPr>
           <w:rtl w:val="0"/>
         </w:rPr>
-        <w:t xml:space="preserve">For textual data, historians of economics frequently rely on topic modeling [bakeevAcademic2023; fontanaFragmentation2023; acostaSix2024]. Topic modeling identifies the latent themes in a corpus by learning distributions of words associated with each topic. Each document is then represented by a mixture of these topics—often with one or two dominating—while each topic can be described through its most representative words and expressions. While topic modeling is a convenient tool for historical analysis, our research question pushed us toward a more targeted approach.</w:t>
+        <w:t xml:space="preserve">The sentences-corpus are </w:t>
+      </w:r>
+      <w:r>
+        <w:rPr>
+          <w:rtl w:val="0"/>
+        </w:rPr>
+        <w:t xml:space="preserve">the top 1% of sentences that are most similar to our annual representative vectors of sentences with “rationality” and “rational.”</w:t>
+      </w:r>
+      <w:r>
+        <w:rPr>
+          <w:vertAlign w:val="superscript"/>
+        </w:rPr>
+        <w:footnoteReference w:customMarkFollows="0" w:id="21"/>
+      </w:r>
+      <w:r>
+        <w:rPr>
+          <w:rtl w:val="0"/>
+        </w:rPr>
+        <w:t xml:space="preserve"> </w:t>
+      </w:r>
+      <w:r>
+        <w:rPr>
+          <w:rtl w:val="0"/>
+        </w:rPr>
+        <w:t xml:space="preserve">To analyse this corpus, as with bibliographic coupling, we want a method that groups together our observations , here the sentences, that employ similar meanings of rationality. W</w:t>
+      </w:r>
+      <w:r>
+        <w:rPr>
+          <w:rtl w:val="0"/>
+        </w:rPr>
+        <w:t xml:space="preserve">e draw on the literature on semantic drift [@kutuzovDiachronic2018; @montanelliSurvey2024] and take inspiration from @giulianelliAnalysing2020. We therefore cluster the sentence embeddings using the HDBSCAN algorithm, a widely used unsupervised method for clustering LLM embeddings.</w:t>
       </w:r>
       <w:commentRangeEnd w:id="26"/>
       <w:r>
         <w:commentReference w:id="26"/>
-      </w:r>
-      <w:r>
-        <w:rPr>
-          <w:rtl w:val="0"/>
-        </w:rPr>
-      </w:r>
-    </w:p>
-    <w:p>
-      <w:pPr>
-        <w:rPr/>
-      </w:pPr>
-      <w:commentRangeStart w:id="27"/>
-      <w:r>
-        <w:rPr>
-          <w:rtl w:val="0"/>
-        </w:rPr>
-        <w:t xml:space="preserve">The sentences-corpus are </w:t>
-      </w:r>
-      <w:r>
-        <w:rPr>
-          <w:rtl w:val="0"/>
-        </w:rPr>
-        <w:t xml:space="preserve">the top 1% of sentences that are most similar to our annual representative vectors of sentences with “rationality” and “rational.”</w:t>
-      </w:r>
-      <w:r>
-        <w:rPr>
-          <w:vertAlign w:val="superscript"/>
-        </w:rPr>
-        <w:footnoteReference w:customMarkFollows="0" w:id="21"/>
-      </w:r>
-      <w:r>
-        <w:rPr>
-          <w:rtl w:val="0"/>
-        </w:rPr>
-        <w:t xml:space="preserve"> </w:t>
-      </w:r>
-      <w:r>
-        <w:rPr>
-          <w:rtl w:val="0"/>
-        </w:rPr>
-        <w:t xml:space="preserve">To analyse this corpus, as with bibliographic coupling, we want a method that groups together our observations , here the sentences, that employ similar meanings of rationality. W</w:t>
-      </w:r>
-      <w:r>
-        <w:rPr>
-          <w:rtl w:val="0"/>
-        </w:rPr>
-        <w:t xml:space="preserve">e draw on the literature on semantic drift [@kutuzovDiachronic2018; montanelliSurvey2024] and take inspiration from @giulianelliAnalysing2020. We therefore cluster the sentence embeddings using the HDBSCAN algorithm, a widely used unsupervised method for clustering LLM embeddings.</w:t>
-      </w:r>
-      <w:commentRangeEnd w:id="27"/>
-      <w:r>
-        <w:commentReference w:id="27"/>
       </w:r>
       <w:r>
         <w:rPr>
@@ -2726,60 +2721,60 @@
       <w:pPr>
         <w:rPr/>
       </w:pPr>
+      <w:commentRangeStart w:id="27"/>
+      <w:r>
+        <w:rPr>
+          <w:rtl w:val="0"/>
+        </w:rPr>
+        <w:t xml:space="preserve">With all these indicators—and prior to any further qualitative investigation—we can already see that this semantic cluster is centrally relevant to our study, as it bears directly on the concept of rationality itself. Our textual approach is thus able to extract some specific uses of rationality, here debates on the meaning of rationality itself in economics, allowing us to observe the evolution of these uses across time but also across topics and subdisciplines (in game theory, macroeconomics, behavioral economics, or evolutionary economics).</w:t>
+      </w:r>
+      <w:commentRangeEnd w:id="27"/>
+      <w:r>
+        <w:commentReference w:id="27"/>
+      </w:r>
+      <w:r>
+        <w:rPr>
+          <w:rtl w:val="0"/>
+        </w:rPr>
+      </w:r>
+    </w:p>
+    <w:p>
+      <w:pPr>
+        <w:rPr/>
+      </w:pPr>
+      <w:r>
+        <w:rPr>
+          <w:rtl w:val="0"/>
+        </w:rPr>
+        <w:t xml:space="preserve">The bibliometric approach does not allow for such temporal or cross-subdisciplinary exploration. In our bibliometric communities, no grouping addresses rationality and its limits in general across multiple decades. Rather, bibliometric analysis </w:t>
+      </w:r>
+      <w:r>
+        <w:rPr>
+          <w:rtl w:val="0"/>
+        </w:rPr>
+        <w:t xml:space="preserve">identifies groups of texts from authors in close academic communities. I</w:t>
+      </w:r>
+      <w:r>
+        <w:rPr>
+          <w:rtl w:val="0"/>
+        </w:rPr>
+        <w:t xml:space="preserve">n relation to semantic cluster 11, we observe, for instance, the emergence of a </w:t>
+      </w:r>
       <w:commentRangeStart w:id="28"/>
-      <w:r>
-        <w:rPr>
-          <w:rtl w:val="0"/>
-        </w:rPr>
-        <w:t xml:space="preserve">With all these indicators—and prior to any further qualitative investigation—we can already see that this semantic cluster is centrally relevant to our study, as it bears directly on the concept of rationality itself. Our textual approach is thus able to extract some specific uses of rationality, here debates on the meaning of rationality itself in economics, allowing us to observe the evolution of these uses across time but also across topics and subdisciplines (in game theory, macroeconomics, behavioral economics, or evolutionary economics).</w:t>
+      <w:commentRangeStart w:id="29"/>
+      <w:r>
+        <w:rPr>
+          <w:rtl w:val="0"/>
+        </w:rPr>
+        <w:t xml:space="preserve">“Behavioral Economics and Choice Theory”</w:t>
       </w:r>
       <w:commentRangeEnd w:id="28"/>
       <w:r>
         <w:commentReference w:id="28"/>
       </w:r>
-      <w:r>
-        <w:rPr>
-          <w:rtl w:val="0"/>
-        </w:rPr>
-      </w:r>
-    </w:p>
-    <w:p>
-      <w:pPr>
-        <w:rPr/>
-      </w:pPr>
-      <w:r>
-        <w:rPr>
-          <w:rtl w:val="0"/>
-        </w:rPr>
-        <w:t xml:space="preserve">The bibliometric approach does not allow for such temporal or cross-subdisciplinary exploration. In our bibliometric communities, no grouping addresses rationality and its limits in general across multiple decades. Rather, bibliometric analysis </w:t>
-      </w:r>
-      <w:r>
-        <w:rPr>
-          <w:rtl w:val="0"/>
-        </w:rPr>
-        <w:t xml:space="preserve">identifies groups of texts from authors in close academic communities. I</w:t>
-      </w:r>
-      <w:r>
-        <w:rPr>
-          <w:rtl w:val="0"/>
-        </w:rPr>
-        <w:t xml:space="preserve">n relation to semantic cluster 11, we observe, for instance, the emergence of a </w:t>
-      </w:r>
-      <w:commentRangeStart w:id="29"/>
-      <w:commentRangeStart w:id="30"/>
-      <w:r>
-        <w:rPr>
-          <w:rtl w:val="0"/>
-        </w:rPr>
-        <w:t xml:space="preserve">“Behavioral Economics and Choice Theory”</w:t>
-      </w:r>
       <w:commentRangeEnd w:id="29"/>
       <w:r>
         <w:commentReference w:id="29"/>
-      </w:r>
-      <w:commentRangeEnd w:id="30"/>
-      <w:r>
-        <w:commentReference w:id="30"/>
       </w:r>
       <w:r>
         <w:rPr>
@@ -3666,7 +3661,14 @@
         <w:rPr>
           <w:rtl w:val="0"/>
         </w:rPr>
-        <w:t xml:space="preserve">“New” behavioral economics reception reveals a dramatic contrast. Unlike Simon’s trajectory, the heuristics and biases research program of Kahneman, Tversky, and other “new” behavioral economists generated multiple stable clusters that formed well-identified and substantial research communities. A main “Behavioral Decision Theory” cluster emerged in 1979-1987, structured by early adopters of the new approach. The crystallization of this distinct cluster signaled the beginning of explosive growth and the spinning off of several autonomous communities that captured emerging specialized areas of behavioral economics: pro-social behavior and behavioral game theory (</w:t>
+        <w:t xml:space="preserve">“New” behavioral economics reception reveals a dramatic contrast. Unlike Simon’s trajectory, the heuristics and biases research program of Kahneman, Tversky, and other “new” behavioral economists generated multiple stable clusters that formed well-identified and substantial research communities. A main “Behavioral Decision Theory” cluster emerged in 1979-1987, structured by early adopters of the new approach. The crystallization of this distinct cluster signaled the beginning of explosive growth and the spinning off of several autonomous communities that captured emerging specialized</w:t>
+      </w:r>
+      <w:commentRangeStart w:id="30"/>
+      <w:r>
+        <w:rPr>
+          <w:rtl w:val="0"/>
+        </w:rPr>
+        <w:t xml:space="preserve"> areas of behavioral economics: pro-social behavior and behavioral game theory (</w:t>
       </w:r>
       <w:r>
         <w:rPr>
@@ -3715,6 +3717,15 @@
           <w:rtl w:val="0"/>
         </w:rPr>
         <w:t xml:space="preserve">).</w:t>
+      </w:r>
+      <w:commentRangeEnd w:id="30"/>
+      <w:r>
+        <w:commentReference w:id="30"/>
+      </w:r>
+      <w:r>
+        <w:rPr>
+          <w:rtl w:val="0"/>
+        </w:rPr>
       </w:r>
     </w:p>
     <w:p>
@@ -4127,7 +4138,7 @@
       </w:r>
     </w:p>
   </w:comment>
-  <w:comment w:author="Thomas Delcey" w:id="28" w:date="2026-04-13T10:05:59Z">
+  <w:comment w:author="Thomas Delcey" w:id="27" w:date="2026-04-13T10:05:59Z">
     <w:p>
       <w:pPr>
         <w:keepNext w:val="0"/>
@@ -4237,7 +4248,7 @@
       </w:r>
     </w:p>
   </w:comment>
-  <w:comment w:author="Aurélien Goutsmedt" w:id="34" w:date="2026-04-12T20:37:18Z">
+  <w:comment w:author="Aurélien Goutsmedt" w:id="31" w:date="2026-04-12T20:37:18Z">
     <w:p>
       <w:pPr>
         <w:keepNext w:val="0"/>
@@ -4457,7 +4468,7 @@
       </w:r>
     </w:p>
   </w:comment>
-  <w:comment w:author="Thomas Delcey" w:id="31" w:date="2026-04-10T14:46:41Z">
+  <w:comment w:author="Aurélien Goutsmedt" w:id="18" w:date="2026-04-10T12:33:26Z">
     <w:p>
       <w:pPr>
         <w:keepNext w:val="0"/>
@@ -4508,11 +4519,11 @@
           <w:vertAlign w:val="baseline"/>
           <w:rtl w:val="0"/>
         </w:rPr>
-        <w:t xml:space="preserve">Concernant le "??". Je suis pas sur qu'Istex ait des journaux que Elsevier n'a pas (hormis les journaux mort avant 1997). Je check quand j'ai mon ordi fixe.</w:t>
+        <w:t xml:space="preserve">Add references</w:t>
       </w:r>
     </w:p>
   </w:comment>
-  <w:comment w:author="Aurélien Goutsmedt" w:id="32" w:date="2026-04-12T18:52:31Z">
+  <w:comment w:author="Aurélien Goutsmedt" w:id="14" w:date="2026-04-09T19:25:22Z">
     <w:p>
       <w:pPr>
         <w:keepNext w:val="0"/>
@@ -4563,11 +4574,11 @@
           <w:vertAlign w:val="baseline"/>
           <w:rtl w:val="0"/>
         </w:rPr>
-        <w:t xml:space="preserve">Si bien sûr, puisque Elsevier c'est juste les journaux Elsevier. Istex récupère tous les journaux qu'on a classé via scopus, et qui ne sont ni dans jstor, ni dans elsevier.</w:t>
+        <w:t xml:space="preserve">Add reference on text selection here. @agoutsmedt@gmail.com  search in Guldi</w:t>
       </w:r>
     </w:p>
   </w:comment>
-  <w:comment w:author="Thomas Delcey" w:id="33" w:date="2026-04-13T08:56:24Z">
+  <w:comment w:author="Thomas Delcey" w:id="28" w:date="2025-12-13T01:11:21Z">
     <w:p>
       <w:pPr>
         <w:keepNext w:val="0"/>
@@ -4618,11 +4629,11 @@
           <w:vertAlign w:val="baseline"/>
           <w:rtl w:val="0"/>
         </w:rPr>
-        <w:t xml:space="preserve">Done</w:t>
+        <w:t xml:space="preserve">Est-ce qu'on garde le label IA dans la version finale ? On a pas vraiment checké à quel point c'était pertinent.</w:t>
       </w:r>
     </w:p>
   </w:comment>
-  <w:comment w:author="Aurélien Goutsmedt" w:id="18" w:date="2026-04-10T12:33:26Z">
+  <w:comment w:author="Aurélien Goutsmedt" w:id="29" w:date="2025-12-13T11:14:16Z">
     <w:p>
       <w:pPr>
         <w:keepNext w:val="0"/>
@@ -4673,11 +4684,9 @@
           <w:vertAlign w:val="baseline"/>
           <w:rtl w:val="0"/>
         </w:rPr>
-        <w:t xml:space="preserve">Add references</w:t>
-      </w:r>
-    </w:p>
-  </w:comment>
-  <w:comment w:author="Aurélien Goutsmedt" w:id="14" w:date="2026-04-09T19:25:22Z">
+        <w:t xml:space="preserve">A voir si on a le temps de renommer... </w:t>
+      </w:r>
+    </w:p>
     <w:p>
       <w:pPr>
         <w:keepNext w:val="0"/>
@@ -4728,11 +4737,11 @@
           <w:vertAlign w:val="baseline"/>
           <w:rtl w:val="0"/>
         </w:rPr>
-        <w:t xml:space="preserve">Add reference on text selection here. @agoutsmedt@gmail.com  search in Guldi</w:t>
+        <w:t xml:space="preserve">J'aurais bien changé pour les semantic cluster, tout en gardant le numéro.</w:t>
       </w:r>
     </w:p>
   </w:comment>
-  <w:comment w:author="Thomas Delcey" w:id="29" w:date="2025-12-13T01:11:21Z">
+  <w:comment w:author="Thomas Delcey" w:id="26" w:date="2026-04-13T11:52:15Z">
     <w:p>
       <w:pPr>
         <w:keepNext w:val="0"/>
@@ -4783,11 +4792,11 @@
           <w:vertAlign w:val="baseline"/>
           <w:rtl w:val="0"/>
         </w:rPr>
-        <w:t xml:space="preserve">Est-ce qu'on garde le label IA dans la version finale ? On a pas vraiment checké à quel point c'était pertinent.</w:t>
+        <w:t xml:space="preserve">Réponse partielle à R2.5.</w:t>
       </w:r>
     </w:p>
   </w:comment>
-  <w:comment w:author="Aurélien Goutsmedt" w:id="30" w:date="2025-12-13T11:14:16Z">
+  <w:comment w:author="Aurélien Goutsmedt" w:id="15" w:date="2026-04-09T19:27:20Z">
     <w:p>
       <w:pPr>
         <w:keepNext w:val="0"/>
@@ -4838,9 +4847,11 @@
           <w:vertAlign w:val="baseline"/>
           <w:rtl w:val="0"/>
         </w:rPr>
-        <w:t xml:space="preserve">A voir si on a le temps de renommer... </w:t>
-      </w:r>
-    </w:p>
+        <w:t xml:space="preserve">Add ref on the use of LLMs in social sciences</w:t>
+      </w:r>
+    </w:p>
+  </w:comment>
+  <w:comment w:author="Thomas Delcey" w:id="24" w:date="2026-04-13T11:52:08Z">
     <w:p>
       <w:pPr>
         <w:keepNext w:val="0"/>
@@ -4891,11 +4902,11 @@
           <w:vertAlign w:val="baseline"/>
           <w:rtl w:val="0"/>
         </w:rPr>
-        <w:t xml:space="preserve">J'aurais bien changé pour les semantic cluster, tout en gardant le numéro.</w:t>
+        <w:t xml:space="preserve">Réponse partielle à R2.5. Modifications du paragraphe pour mettre avant la tripartition entre les trois corpora.</w:t>
       </w:r>
     </w:p>
   </w:comment>
-  <w:comment w:author="Thomas Delcey" w:id="27" w:date="2026-04-13T11:52:15Z">
+  <w:comment w:author="Aurélien Goutsmedt" w:id="10" w:date="2026-04-09T18:42:54Z">
     <w:p>
       <w:pPr>
         <w:keepNext w:val="0"/>
@@ -4946,11 +4957,11 @@
           <w:vertAlign w:val="baseline"/>
           <w:rtl w:val="0"/>
         </w:rPr>
-        <w:t xml:space="preserve">Réponse partielle à R2.5.</w:t>
+        <w:t xml:space="preserve">Vu que le papier ne sera pas dans le numéro spécial, est-ce qu'on supprime la phrase, ou bien en renvoie à un autre papier ? Par exemple sur BE?</w:t>
       </w:r>
     </w:p>
   </w:comment>
-  <w:comment w:author="Aurélien Goutsmedt" w:id="15" w:date="2026-04-09T19:27:20Z">
+  <w:comment w:author="Thomas Delcey" w:id="0" w:date="2026-04-13T13:25:53Z">
     <w:p>
       <w:pPr>
         <w:keepNext w:val="0"/>
@@ -5001,11 +5012,11 @@
           <w:vertAlign w:val="baseline"/>
           <w:rtl w:val="0"/>
         </w:rPr>
-        <w:t xml:space="preserve">Add ref on the use of LLMs in social sciences</w:t>
+        <w:t xml:space="preserve">Peut être mieux justifier pourquoi on utilise les 2 ici pour répondre à R2.7</w:t>
       </w:r>
     </w:p>
   </w:comment>
-  <w:comment w:author="Thomas Delcey" w:id="24" w:date="2026-04-13T11:52:08Z">
+  <w:comment w:author="Thomas Delcey" w:id="22" w:date="2026-04-11T11:25:49Z">
     <w:p>
       <w:pPr>
         <w:keepNext w:val="0"/>
@@ -5056,11 +5067,11 @@
           <w:vertAlign w:val="baseline"/>
           <w:rtl w:val="0"/>
         </w:rPr>
-        <w:t xml:space="preserve">Réponse partielle à R2.5.</w:t>
+        <w:t xml:space="preserve">Réponse à R2.3.</w:t>
       </w:r>
     </w:p>
   </w:comment>
-  <w:comment w:author="Aurélien Goutsmedt" w:id="10" w:date="2026-04-09T18:42:54Z">
+  <w:comment w:author="Thomas Delcey" w:id="23" w:date="2026-04-11T11:38:14Z">
     <w:p>
       <w:pPr>
         <w:keepNext w:val="0"/>
@@ -5111,11 +5122,11 @@
           <w:vertAlign w:val="baseline"/>
           <w:rtl w:val="0"/>
         </w:rPr>
-        <w:t xml:space="preserve">Vu que le papier ne sera pas dans le numéro spécial, est-ce qu'on supprime la phrase, ou bien en renvoie à un autre papier ? Par exemple sur BE?</w:t>
+        <w:t xml:space="preserve">En plus de la reformulation, ajouter une ref sur le non supervisé dans ce type de travaux de longue durée.</w:t>
       </w:r>
     </w:p>
   </w:comment>
-  <w:comment w:author="Thomas Delcey" w:id="0" w:date="2026-04-13T13:25:53Z">
+  <w:comment w:author="Thomas Delcey" w:id="32" w:date="2026-04-11T11:25:49Z">
     <w:p>
       <w:pPr>
         <w:keepNext w:val="0"/>
@@ -5166,11 +5177,11 @@
           <w:vertAlign w:val="baseline"/>
           <w:rtl w:val="0"/>
         </w:rPr>
-        <w:t xml:space="preserve">Peut être mieux justifier pourquoi on utilise les 2 ici pour répondre à R2.7</w:t>
+        <w:t xml:space="preserve">Réponse à R2.3.</w:t>
       </w:r>
     </w:p>
   </w:comment>
-  <w:comment w:author="Thomas Delcey" w:id="22" w:date="2026-04-11T11:25:49Z">
+  <w:comment w:author="Thomas Delcey" w:id="33" w:date="2026-04-11T11:38:14Z">
     <w:p>
       <w:pPr>
         <w:keepNext w:val="0"/>
@@ -5221,11 +5232,11 @@
           <w:vertAlign w:val="baseline"/>
           <w:rtl w:val="0"/>
         </w:rPr>
-        <w:t xml:space="preserve">Réponse à R2.3.</w:t>
+        <w:t xml:space="preserve">En plus de la reformulation, ajouter une ref sur le non supervisé dans ce type de travaux de longue durée.</w:t>
       </w:r>
     </w:p>
   </w:comment>
-  <w:comment w:author="Thomas Delcey" w:id="23" w:date="2026-04-11T11:38:14Z">
+  <w:comment w:author="Aurélien Goutsmedt" w:id="2" w:date="2026-04-09T15:23:46Z">
     <w:p>
       <w:pPr>
         <w:keepNext w:val="0"/>
@@ -5276,11 +5287,11 @@
           <w:vertAlign w:val="baseline"/>
           <w:rtl w:val="0"/>
         </w:rPr>
-        <w:t xml:space="preserve">En plus de la reformulation, ajouter une ref sur le non supervisé dans ce type de travaux de longue durée.</w:t>
+        <w:t xml:space="preserve">@agoutsmedt@gmail.com look at Guldi for references to add here</w:t>
       </w:r>
     </w:p>
   </w:comment>
-  <w:comment w:author="Thomas Delcey" w:id="35" w:date="2026-04-11T11:25:49Z">
+  <w:comment w:author="Aurélien Goutsmedt" w:id="3" w:date="2026-04-09T15:42:06Z">
     <w:p>
       <w:pPr>
         <w:keepNext w:val="0"/>
@@ -5331,11 +5342,9 @@
           <w:vertAlign w:val="baseline"/>
           <w:rtl w:val="0"/>
         </w:rPr>
-        <w:t xml:space="preserve">Réponse à R2.3.</w:t>
-      </w:r>
-    </w:p>
-  </w:comment>
-  <w:comment w:author="Thomas Delcey" w:id="36" w:date="2026-04-11T11:38:14Z">
+        <w:t xml:space="preserve">Cette idée de "uniqueness" of HET du rapporteur pourrait venir d'ici. On pourrait citer ce passage comme modification.</w:t>
+      </w:r>
+    </w:p>
     <w:p>
       <w:pPr>
         <w:keepNext w:val="0"/>
@@ -5386,11 +5395,11 @@
           <w:vertAlign w:val="baseline"/>
           <w:rtl w:val="0"/>
         </w:rPr>
-        <w:t xml:space="preserve">En plus de la reformulation, ajouter une ref sur le non supervisé dans ce type de travaux de longue durée.</w:t>
+        <w:t xml:space="preserve">Il faudrait aussi ajouter une référence pour la forme.</w:t>
       </w:r>
     </w:p>
   </w:comment>
-  <w:comment w:author="Aurélien Goutsmedt" w:id="2" w:date="2026-04-09T15:23:46Z">
+  <w:comment w:author="Aurélien Goutsmedt" w:id="11" w:date="2026-04-09T19:02:14Z">
     <w:p>
       <w:pPr>
         <w:keepNext w:val="0"/>
@@ -5441,11 +5450,11 @@
           <w:vertAlign w:val="baseline"/>
           <w:rtl w:val="0"/>
         </w:rPr>
-        <w:t xml:space="preserve">@agoutsmedt@gmail.com look at Guldi for references to add here</w:t>
+        <w:t xml:space="preserve">Add ref to corresponding papers</w:t>
       </w:r>
     </w:p>
   </w:comment>
-  <w:comment w:author="Aurélien Goutsmedt" w:id="3" w:date="2026-04-09T15:42:06Z">
+  <w:comment w:author="Thomas Delcey" w:id="19" w:date="2026-04-11T11:57:15Z">
     <w:p>
       <w:pPr>
         <w:keepNext w:val="0"/>
@@ -5496,9 +5505,11 @@
           <w:vertAlign w:val="baseline"/>
           <w:rtl w:val="0"/>
         </w:rPr>
-        <w:t xml:space="preserve">Cette idée de "uniqueness" of HET du rapporteur pourrait venir d'ici. On pourrait citer ce passage comme modification.</w:t>
-      </w:r>
-    </w:p>
+        <w:t xml:space="preserve">Partial answer to R2.5</w:t>
+      </w:r>
+    </w:p>
+  </w:comment>
+  <w:comment w:author="Aurélien Goutsmedt" w:id="12" w:date="2026-04-09T19:02:25Z">
     <w:p>
       <w:pPr>
         <w:keepNext w:val="0"/>
@@ -5549,11 +5560,11 @@
           <w:vertAlign w:val="baseline"/>
           <w:rtl w:val="0"/>
         </w:rPr>
-        <w:t xml:space="preserve">Il faudrait aussi ajouter une référence pour la forme.</w:t>
+        <w:t xml:space="preserve">Add ref on corpus delineation here</w:t>
       </w:r>
     </w:p>
   </w:comment>
-  <w:comment w:author="Aurélien Goutsmedt" w:id="11" w:date="2026-04-09T19:02:14Z">
+  <w:comment w:author="Aurélien Goutsmedt" w:id="13" w:date="2026-04-09T19:04:19Z">
     <w:p>
       <w:pPr>
         <w:keepNext w:val="0"/>
@@ -5604,11 +5615,11 @@
           <w:vertAlign w:val="baseline"/>
           <w:rtl w:val="0"/>
         </w:rPr>
-        <w:t xml:space="preserve">Add ref to corresponding papers</w:t>
+        <w:t xml:space="preserve">Ref to Bacceli or others to be more "open"</w:t>
       </w:r>
     </w:p>
   </w:comment>
-  <w:comment w:author="Thomas Delcey" w:id="19" w:date="2026-04-11T11:57:15Z">
+  <w:comment w:author="Aurélien Goutsmedt" w:id="1" w:date="2026-04-09T14:12:05Z">
     <w:p>
       <w:pPr>
         <w:keepNext w:val="0"/>
@@ -5659,11 +5670,11 @@
           <w:vertAlign w:val="baseline"/>
           <w:rtl w:val="0"/>
         </w:rPr>
-        <w:t xml:space="preserve">Partial answer to R2.5</w:t>
+        <w:t xml:space="preserve">Possible to substantiate this by some reference?</w:t>
       </w:r>
     </w:p>
   </w:comment>
-  <w:comment w:author="Aurélien Goutsmedt" w:id="12" w:date="2026-04-09T19:02:25Z">
+  <w:comment w:author="Thomas Delcey" w:id="4" w:date="2026-04-10T14:51:08Z">
     <w:p>
       <w:pPr>
         <w:keepNext w:val="0"/>
@@ -5714,11 +5725,11 @@
           <w:vertAlign w:val="baseline"/>
           <w:rtl w:val="0"/>
         </w:rPr>
-        <w:t xml:space="preserve">Add ref on corpus delineation here</w:t>
+        <w:t xml:space="preserve">Réponse partielle à R2.2 sur "l'alienating". Manipuler les sources primaires et filtrer, nettoyer, sélectionner fait partie du job d'historien.</w:t>
       </w:r>
     </w:p>
   </w:comment>
-  <w:comment w:author="Aurélien Goutsmedt" w:id="13" w:date="2026-04-09T19:04:19Z">
+  <w:comment w:author="Thomas Delcey" w:id="9" w:date="2026-04-10T14:56:15Z">
     <w:p>
       <w:pPr>
         <w:keepNext w:val="0"/>
@@ -5769,11 +5780,11 @@
           <w:vertAlign w:val="baseline"/>
           <w:rtl w:val="0"/>
         </w:rPr>
-        <w:t xml:space="preserve">Ref to Bacceli or others to be more "open"</w:t>
+        <w:t xml:space="preserve">ça me semble pas approprié, l'article porte pas sur un individu mais un article autant trouver un autre papier et réduire le taux d'auto-citation.</w:t>
       </w:r>
     </w:p>
   </w:comment>
-  <w:comment w:author="Aurélien Goutsmedt" w:id="1" w:date="2026-04-09T14:12:05Z">
+  <w:comment w:author="Thomas Delcey" w:id="25" w:date="2026-04-13T10:48:50Z">
     <w:p>
       <w:pPr>
         <w:keepNext w:val="0"/>
@@ -5824,11 +5835,11 @@
           <w:vertAlign w:val="baseline"/>
           <w:rtl w:val="0"/>
         </w:rPr>
-        <w:t xml:space="preserve">Possible to substantiate this by some reference?</w:t>
+        <w:t xml:space="preserve">Ce paragraphe me semble pas nécessaire dans la mesure où on introduit depuis la section précédente les LLM et c'est évident qu'on va utiliser ça, à la limite en footnote si on veut évoquer les ptm</w:t>
       </w:r>
     </w:p>
   </w:comment>
-  <w:comment w:author="Thomas Delcey" w:id="4" w:date="2026-04-10T14:51:08Z">
+  <w:comment w:author="Truc Alexandre" w:id="30" w:date="2026-04-14T16:11:44Z">
     <w:p>
       <w:pPr>
         <w:keepNext w:val="0"/>
@@ -5879,172 +5890,7 @@
           <w:vertAlign w:val="baseline"/>
           <w:rtl w:val="0"/>
         </w:rPr>
-        <w:t xml:space="preserve">Réponse partielle à R2.2 sur "l'alienating". Manipuler les sources primaires et filtrer, nettoyer, sélectionner fait partie du job d'historien.</w:t>
-      </w:r>
-    </w:p>
-  </w:comment>
-  <w:comment w:author="Thomas Delcey" w:id="9" w:date="2026-04-10T14:56:15Z">
-    <w:p>
-      <w:pPr>
-        <w:keepNext w:val="0"/>
-        <w:keepLines w:val="0"/>
-        <w:pageBreakBefore w:val="0"/>
-        <w:widowControl w:val="0"/>
-        <w:pBdr>
-          <w:top w:space="0" w:sz="0" w:val="nil"/>
-          <w:left w:space="0" w:sz="0" w:val="nil"/>
-          <w:bottom w:space="0" w:sz="0" w:val="nil"/>
-          <w:right w:space="0" w:sz="0" w:val="nil"/>
-          <w:between w:space="0" w:sz="0" w:val="nil"/>
-        </w:pBdr>
-        <w:shd w:fill="auto" w:val="clear"/>
-        <w:spacing w:after="0" w:before="0" w:line="240" w:lineRule="auto"/>
-        <w:ind w:left="0" w:right="0" w:firstLine="0"/>
-        <w:jc w:val="left"/>
-        <w:rPr>
-          <w:rFonts w:ascii="Arial" w:cs="Arial" w:eastAsia="Arial" w:hAnsi="Arial"/>
-          <w:b w:val="0"/>
-          <w:bCs w:val="0"/>
-          <w:i w:val="0"/>
-          <w:iCs w:val="0"/>
-          <w:smallCaps w:val="0"/>
-          <w:strike w:val="0"/>
-          <w:color w:val="000000"/>
-          <w:sz w:val="22"/>
-          <w:szCs w:val="22"/>
-          <w:u w:val="none"/>
-          <w:shd w:fill="auto" w:val="clear"/>
-          <w:vertAlign w:val="baseline"/>
-        </w:rPr>
-      </w:pPr>
-      <w:r>
-        <w:rPr>
-          <w:rFonts w:ascii="Arial" w:cs="Arial" w:eastAsia="Arial" w:hAnsi="Arial"/>
-          <w:b w:val="0"/>
-          <w:bCs w:val="0"/>
-          <w:i w:val="0"/>
-          <w:iCs w:val="0"/>
-          <w:smallCaps w:val="0"/>
-          <w:strike w:val="0"/>
-          <w:color w:val="000000"/>
-          <w:sz w:val="22"/>
-          <w:szCs w:val="22"/>
-          <w:u w:val="none"/>
-          <w:shd w:fill="auto" w:val="clear"/>
-          <w:vertAlign w:val="baseline"/>
-          <w:rtl w:val="0"/>
-        </w:rPr>
-        <w:t xml:space="preserve">ça me semble pas approprié, l'article porte pas sur un individu mais un article autant trouver un autre papier et réduire le taux d'auto-citation.</w:t>
-      </w:r>
-    </w:p>
-  </w:comment>
-  <w:comment w:author="Thomas Delcey" w:id="26" w:date="2026-04-13T10:48:50Z">
-    <w:p>
-      <w:pPr>
-        <w:keepNext w:val="0"/>
-        <w:keepLines w:val="0"/>
-        <w:pageBreakBefore w:val="0"/>
-        <w:widowControl w:val="0"/>
-        <w:pBdr>
-          <w:top w:space="0" w:sz="0" w:val="nil"/>
-          <w:left w:space="0" w:sz="0" w:val="nil"/>
-          <w:bottom w:space="0" w:sz="0" w:val="nil"/>
-          <w:right w:space="0" w:sz="0" w:val="nil"/>
-          <w:between w:space="0" w:sz="0" w:val="nil"/>
-        </w:pBdr>
-        <w:shd w:fill="auto" w:val="clear"/>
-        <w:spacing w:after="0" w:before="0" w:line="240" w:lineRule="auto"/>
-        <w:ind w:left="0" w:right="0" w:firstLine="0"/>
-        <w:jc w:val="left"/>
-        <w:rPr>
-          <w:rFonts w:ascii="Arial" w:cs="Arial" w:eastAsia="Arial" w:hAnsi="Arial"/>
-          <w:b w:val="0"/>
-          <w:bCs w:val="0"/>
-          <w:i w:val="0"/>
-          <w:iCs w:val="0"/>
-          <w:smallCaps w:val="0"/>
-          <w:strike w:val="0"/>
-          <w:color w:val="000000"/>
-          <w:sz w:val="22"/>
-          <w:szCs w:val="22"/>
-          <w:u w:val="none"/>
-          <w:shd w:fill="auto" w:val="clear"/>
-          <w:vertAlign w:val="baseline"/>
-        </w:rPr>
-      </w:pPr>
-      <w:r>
-        <w:rPr>
-          <w:rFonts w:ascii="Arial" w:cs="Arial" w:eastAsia="Arial" w:hAnsi="Arial"/>
-          <w:b w:val="0"/>
-          <w:bCs w:val="0"/>
-          <w:i w:val="0"/>
-          <w:iCs w:val="0"/>
-          <w:smallCaps w:val="0"/>
-          <w:strike w:val="0"/>
-          <w:color w:val="000000"/>
-          <w:sz w:val="22"/>
-          <w:szCs w:val="22"/>
-          <w:u w:val="none"/>
-          <w:shd w:fill="auto" w:val="clear"/>
-          <w:vertAlign w:val="baseline"/>
-          <w:rtl w:val="0"/>
-        </w:rPr>
-        <w:t xml:space="preserve">Ce paragraphe me semble pas nécessaire dans la mesure où on introduit depuis la section précédente les LLM et c'est évident qu'on va utiliser ça, à la limite en footnote si on veut évoquer les ptm</w:t>
-      </w:r>
-    </w:p>
-  </w:comment>
-  <w:comment w:author="Thomas Delcey" w:id="25" w:date="2026-04-13T10:34:05Z">
-    <w:p>
-      <w:pPr>
-        <w:keepNext w:val="0"/>
-        <w:keepLines w:val="0"/>
-        <w:pageBreakBefore w:val="0"/>
-        <w:widowControl w:val="0"/>
-        <w:pBdr>
-          <w:top w:space="0" w:sz="0" w:val="nil"/>
-          <w:left w:space="0" w:sz="0" w:val="nil"/>
-          <w:bottom w:space="0" w:sz="0" w:val="nil"/>
-          <w:right w:space="0" w:sz="0" w:val="nil"/>
-          <w:between w:space="0" w:sz="0" w:val="nil"/>
-        </w:pBdr>
-        <w:shd w:fill="auto" w:val="clear"/>
-        <w:spacing w:after="0" w:before="0" w:line="240" w:lineRule="auto"/>
-        <w:ind w:left="0" w:right="0" w:firstLine="0"/>
-        <w:jc w:val="left"/>
-        <w:rPr>
-          <w:rFonts w:ascii="Arial" w:cs="Arial" w:eastAsia="Arial" w:hAnsi="Arial"/>
-          <w:b w:val="0"/>
-          <w:bCs w:val="0"/>
-          <w:i w:val="0"/>
-          <w:iCs w:val="0"/>
-          <w:smallCaps w:val="0"/>
-          <w:strike w:val="0"/>
-          <w:color w:val="000000"/>
-          <w:sz w:val="22"/>
-          <w:szCs w:val="22"/>
-          <w:u w:val="none"/>
-          <w:shd w:fill="auto" w:val="clear"/>
-          <w:vertAlign w:val="baseline"/>
-        </w:rPr>
-      </w:pPr>
-      <w:r>
-        <w:rPr>
-          <w:rFonts w:ascii="Arial" w:cs="Arial" w:eastAsia="Arial" w:hAnsi="Arial"/>
-          <w:b w:val="0"/>
-          <w:bCs w:val="0"/>
-          <w:i w:val="0"/>
-          <w:iCs w:val="0"/>
-          <w:smallCaps w:val="0"/>
-          <w:strike w:val="0"/>
-          <w:color w:val="000000"/>
-          <w:sz w:val="22"/>
-          <w:szCs w:val="22"/>
-          <w:u w:val="none"/>
-          <w:shd w:fill="auto" w:val="clear"/>
-          <w:vertAlign w:val="baseline"/>
-          <w:rtl w:val="0"/>
-        </w:rPr>
-        <w:t xml:space="preserve">add claveau and gingras ?</w:t>
+        <w:t xml:space="preserve">Be more explicit about how old clusters disappear (GT for social, decision)</w:t>
       </w:r>
     </w:p>
   </w:comment>
@@ -6555,135 +6401,43 @@
           <w:szCs w:val="20"/>
           <w:rtl w:val="0"/>
         </w:rPr>
-        <w:t xml:space="preserve"> </w:t>
-      </w:r>
-      <w:ins w:author="Aurélien Goutsmedt" w:id="2" w:date="2026-04-09T15:59:16Z">
-        <w:commentRangeStart w:id="31"/>
-        <w:commentRangeStart w:id="32"/>
-        <w:commentRangeStart w:id="33"/>
-        <w:r>
-          <w:rPr>
-            <w:sz w:val="20"/>
-            <w:szCs w:val="20"/>
-            <w:rtl w:val="0"/>
-          </w:rPr>
-          <w:t xml:space="preserve">ISTEX allows us to retrieve economics journals not available through JSTOR or Elsevier API, such as </w:t>
-        </w:r>
-      </w:ins>
-      <w:ins w:author="Thomas Delcey" w:id="3" w:date="2026-04-13T08:55:41Z">
-        <w:commentRangeEnd w:id="31"/>
-        <w:r>
-          <w:commentReference w:id="31"/>
-        </w:r>
-        <w:commentRangeEnd w:id="32"/>
-        <w:r>
-          <w:commentReference w:id="32"/>
-        </w:r>
-        <w:commentRangeEnd w:id="33"/>
-        <w:r>
-          <w:commentReference w:id="33"/>
-        </w:r>
-        <w:r>
-          <w:rPr>
-            <w:sz w:val="20"/>
-            <w:szCs w:val="20"/>
-            <w:rtl w:val="0"/>
-          </w:rPr>
-          <w:t xml:space="preserve">the </w:t>
-        </w:r>
-        <w:r>
-          <w:rPr>
-            <w:i w:val="1"/>
-            <w:iCs w:val="1"/>
-            <w:sz w:val="20"/>
-            <w:szCs w:val="20"/>
-            <w:rtl w:val="0"/>
-            <w:rPrChange w:author="Thomas Delcey" w:id="4" w:date="2026-04-13T08:55:41Z">
-              <w:rPr>
-                <w:sz w:val="20"/>
-                <w:szCs w:val="20"/>
-              </w:rPr>
-            </w:rPrChange>
-          </w:rPr>
-          <w:t xml:space="preserve">Journal of Economic Theory</w:t>
-        </w:r>
-      </w:ins>
-      <w:ins w:author="Aurélien Goutsmedt" w:id="2" w:date="2026-04-09T15:59:16Z">
-        <w:r>
-          <w:rPr>
-            <w:sz w:val="20"/>
-            <w:szCs w:val="20"/>
-            <w:rtl w:val="0"/>
-            <w:rPrChange w:author="Thomas Delcey" w:id="4" w:date="2026-04-13T08:55:41Z">
-              <w:rPr>
-                <w:sz w:val="20"/>
-                <w:szCs w:val="20"/>
-              </w:rPr>
-            </w:rPrChange>
-          </w:rPr>
-          <w:t xml:space="preserve"> </w:t>
-        </w:r>
-        <w:del w:author="Thomas Delcey" w:id="3" w:date="2026-04-13T08:55:41Z">
-          <w:r>
-            <w:rPr>
-              <w:sz w:val="20"/>
-              <w:szCs w:val="20"/>
-              <w:rtl w:val="0"/>
-              <w:rPrChange w:author="Thomas Delcey" w:id="4" w:date="2026-04-13T08:55:41Z">
-                <w:rPr>
-                  <w:sz w:val="20"/>
-                  <w:szCs w:val="20"/>
-                </w:rPr>
-              </w:rPrChange>
-            </w:rPr>
-            <w:delText xml:space="preserve">“, </w:delText>
-          </w:r>
-        </w:del>
-        <w:r>
-          <w:rPr>
-            <w:sz w:val="20"/>
-            <w:szCs w:val="20"/>
-            <w:rtl w:val="0"/>
-          </w:rPr>
-          <w:t xml:space="preserve">and to access specific issues of Elsevier journals for which we lack institutional access (e.g., the </w:t>
-        </w:r>
-        <w:r>
-          <w:rPr>
-            <w:i w:val="1"/>
-            <w:iCs w:val="1"/>
-            <w:sz w:val="20"/>
-            <w:szCs w:val="20"/>
-            <w:rtl w:val="0"/>
-            <w:rPrChange w:author="Aurélien Goutsmedt" w:id="5" w:date="2026-04-09T15:59:16Z">
-              <w:rPr>
-                <w:sz w:val="20"/>
-                <w:szCs w:val="20"/>
-              </w:rPr>
-            </w:rPrChange>
-          </w:rPr>
-          <w:t xml:space="preserve">European Economic review</w:t>
-        </w:r>
-        <w:r>
-          <w:rPr>
-            <w:sz w:val="20"/>
-            <w:szCs w:val="20"/>
-            <w:rtl w:val="0"/>
-          </w:rPr>
-          <w:t xml:space="preserve"> before 1997). </w:t>
-        </w:r>
-      </w:ins>
-      <w:r>
-        <w:rPr>
-          <w:sz w:val="20"/>
-          <w:szCs w:val="20"/>
-          <w:rtl w:val="0"/>
-        </w:rPr>
-        <w:t xml:space="preserve">For more detailed information on the collection of data, see the appendix.</w:t>
-      </w:r>
-      <w:r>
-        <w:rPr>
-          <w:rtl w:val="0"/>
-        </w:rPr>
+        <w:t xml:space="preserve"> ISTEX allows us to retrieve economics journals not available through JSTOR or Elsevier API, such as the </w:t>
+      </w:r>
+      <w:r>
+        <w:rPr>
+          <w:i w:val="1"/>
+          <w:iCs w:val="1"/>
+          <w:sz w:val="20"/>
+          <w:szCs w:val="20"/>
+          <w:rtl w:val="0"/>
+        </w:rPr>
+        <w:t xml:space="preserve">Journal of Economic Theory</w:t>
+      </w:r>
+      <w:r>
+        <w:rPr>
+          <w:sz w:val="20"/>
+          <w:szCs w:val="20"/>
+          <w:rtl w:val="0"/>
+        </w:rPr>
+        <w:t xml:space="preserve"> and to access specific issues of Elsevier journals for which we lack institutional access (e.g., the </w:t>
+      </w:r>
+      <w:r>
+        <w:rPr>
+          <w:i w:val="1"/>
+          <w:iCs w:val="1"/>
+          <w:sz w:val="20"/>
+          <w:szCs w:val="20"/>
+          <w:rtl w:val="0"/>
+        </w:rPr>
+        <w:t xml:space="preserve">European Economic review</w:t>
+      </w:r>
+      <w:r>
+        <w:rPr>
+          <w:sz w:val="20"/>
+          <w:szCs w:val="20"/>
+          <w:rtl w:val="0"/>
+        </w:rPr>
+        <w:t xml:space="preserve"> before 1997). For more detailed information on the collection of data, see the appendix.</w:t>
       </w:r>
     </w:p>
   </w:footnote>
@@ -7285,7 +7039,7 @@
         </w:rPr>
         <w:t xml:space="preserve"> Centroids are widely used in the literature to represent the average embedding of a temporal slice or a cluster of a corpus</w:t>
       </w:r>
-      <w:commentRangeStart w:id="34"/>
+      <w:commentRangeStart w:id="31"/>
       <w:r>
         <w:rPr>
           <w:sz w:val="20"/>
@@ -7295,9 +7049,9 @@
         </w:rPr>
         <w:t xml:space="preserve"> (e.g., see…).</w:t>
       </w:r>
-      <w:commentRangeEnd w:id="34"/>
-      <w:r>
-        <w:commentReference w:id="34"/>
+      <w:commentRangeEnd w:id="31"/>
+      <w:r>
+        <w:commentReference w:id="31"/>
       </w:r>
       <w:r>
         <w:rPr>
@@ -7431,8 +7185,8 @@
         </w:rPr>
         <w:t xml:space="preserve"> </w:t>
       </w:r>
-      <w:commentRangeStart w:id="35"/>
-      <w:commentRangeStart w:id="36"/>
+      <w:commentRangeStart w:id="32"/>
+      <w:commentRangeStart w:id="33"/>
       <w:r>
         <w:rPr>
           <w:sz w:val="20"/>
@@ -7441,13 +7195,13 @@
         </w:rPr>
         <w:t xml:space="preserve">That does not mean, however, that an unsupervised algorithm can be applied blindly to historical questions: a substantial part of our effort has consisted in adapting the method to our historical data, especially to accommodate the growth of the corpus over time.</w:t>
       </w:r>
-      <w:commentRangeEnd w:id="35"/>
-      <w:r>
-        <w:commentReference w:id="35"/>
-      </w:r>
-      <w:commentRangeEnd w:id="36"/>
-      <w:r>
-        <w:commentReference w:id="36"/>
+      <w:commentRangeEnd w:id="32"/>
+      <w:r>
+        <w:commentReference w:id="32"/>
+      </w:r>
+      <w:commentRangeEnd w:id="33"/>
+      <w:r>
+        <w:commentReference w:id="33"/>
       </w:r>
       <w:r>
         <w:rPr>

</xml_diff>

<commit_message>
new version of the paper
</commit_message>
<xml_diff>
--- a/paper/gdoc.docx
+++ b/paper/gdoc.docx
@@ -123,80 +123,7 @@
         <w:rPr>
           <w:rtl w:val="0"/>
         </w:rPr>
-        <w:t xml:space="preserve">Combining </w:t>
-      </w:r>
-      <w:ins w:author="Thomas Delcey" w:id="0" w:date="2026-05-12T14:09:15Z">
-        <w:r>
-          <w:rPr>
-            <w:rtl w:val="0"/>
-          </w:rPr>
-          <w:t xml:space="preserve">both </w:t>
-        </w:r>
-      </w:ins>
-      <w:del w:author="Thomas Delcey" w:id="0" w:date="2026-05-12T14:09:15Z">
-        <w:r>
-          <w:rPr>
-            <w:rtl w:val="0"/>
-          </w:rPr>
-          <w:delText xml:space="preserve">these two methods</w:delText>
-        </w:r>
-      </w:del>
-      <w:r>
-        <w:rPr>
-          <w:rtl w:val="0"/>
-        </w:rPr>
-        <w:t xml:space="preserve"> allows us </w:t>
-      </w:r>
-      <w:del w:author="Thomas Delcey" w:id="1" w:date="2026-05-12T14:07:30Z">
-        <w:r>
-          <w:rPr>
-            <w:rtl w:val="0"/>
-          </w:rPr>
-          <w:delText xml:space="preserve">both </w:delText>
-        </w:r>
-      </w:del>
-      <w:r>
-        <w:rPr>
-          <w:rtl w:val="0"/>
-        </w:rPr>
-        <w:t xml:space="preserve">to illustrate concretely the use of two </w:t>
-      </w:r>
-      <w:ins w:author="Thomas Delcey" w:id="2" w:date="2026-05-12T14:10:42Z">
-        <w:r>
-          <w:rPr>
-            <w:rtl w:val="0"/>
-          </w:rPr>
-          <w:t xml:space="preserve">popular </w:t>
-        </w:r>
-        <w:r>
-          <w:rPr>
-            <w:rtl w:val="0"/>
-            <w:rPrChange w:author="Thomas Delcey" w:id="3" w:date="2026-05-12T14:10:42Z">
-              <w:rPr/>
-            </w:rPrChange>
-          </w:rPr>
-          <w:t xml:space="preserve">sets</w:t>
-        </w:r>
-        <w:r>
-          <w:rPr>
-            <w:rtl w:val="0"/>
-          </w:rPr>
-          <w:t xml:space="preserve"> of data </w:t>
-        </w:r>
-      </w:ins>
-      <w:del w:author="Thomas Delcey" w:id="2" w:date="2026-05-12T14:10:42Z">
-        <w:r>
-          <w:rPr>
-            <w:rtl w:val="0"/>
-          </w:rPr>
-          <w:delText xml:space="preserve">common approaches </w:delText>
-        </w:r>
-      </w:del>
-      <w:r>
-        <w:rPr>
-          <w:rtl w:val="0"/>
-        </w:rPr>
-        <w:t xml:space="preserve">for the history of economics. This combination is also justified by what we regard as a crucial principle of quantitative analysis in the history of economics in particular, and more broadly in the history of science: the triangulation of different sources of data and the validation of results through the comparison of findings obtained from distinct methods.</w:t>
+        <w:t xml:space="preserve">Combining both allows us to illustrate concretely the use of two popular sets of data for the history of economics. This combination is also justified by what we regard as a crucial principle of quantitative analysis in the history of economics in particular, and more broadly in the history of science: the triangulation of different sources of data and the validation of results through the comparison of findings obtained from distinct methods.</w:t>
       </w:r>
       <w:r>
         <w:rPr>
@@ -544,7 +471,7 @@
         <w:rPr>
           <w:rtl w:val="0"/>
         </w:rPr>
-        <w:t xml:space="preserve"> [@culbertReference2025;@martin-martinGoogle2021;@claveauMacrodynamics2016]</w:t>
+        <w:t xml:space="preserve"> [@culbertReference2025;@martin-martinGoogleScholarMicrosoft2021;@claveauMacrodynamics2016]</w:t>
       </w:r>
       <w:r>
         <w:rPr>
@@ -693,21 +620,7 @@
         <w:rPr>
           <w:rtl w:val="0"/>
         </w:rPr>
-        <w:t xml:space="preserve">This challenge is particularly true in the history of science and ideas, and more specifically in the history of economics, where the primary sources often are the texts themselves. These texts contain layers of </w:t>
-      </w:r>
-      <w:ins w:author="Thomas Delcey" w:id="4" w:date="2026-05-12T14:28:24Z">
-        <w:r>
-          <w:rPr>
-            <w:rtl w:val="0"/>
-          </w:rPr>
-          <w:t xml:space="preserve">noisy </w:t>
-        </w:r>
-      </w:ins>
-      <w:r>
-        <w:rPr>
-          <w:rtl w:val="0"/>
-        </w:rPr>
-        <w:t xml:space="preserve">content, such as section headings, footnotes, or bibliographic references.</w:t>
+        <w:t xml:space="preserve">This challenge is particularly true in the history of science and ideas, and more specifically in the history of economics, where the primary sources often are the texts themselves. These texts contain layers of noisy content, such as section headings, footnotes, or bibliographic references.</w:t>
       </w:r>
       <w:r>
         <w:rPr>
@@ -781,26 +694,7 @@
         <w:rPr>
           <w:rtl w:val="0"/>
         </w:rPr>
-        <w:t xml:space="preserve"> We also restrain our analysis to research articles and filter out book reviews, comments, editorial reports or obituaries.</w:t>
-      </w:r>
-      <w:del w:author="Thomas Delcey" w:id="5" w:date="2026-05-12T14:34:32Z">
-        <w:commentRangeStart w:id="0"/>
-        <w:r>
-          <w:rPr>
-            <w:vertAlign w:val="superscript"/>
-          </w:rPr>
-          <w:footnoteReference w:customMarkFollows="0" w:id="9"/>
-        </w:r>
-      </w:del>
-      <w:commentRangeEnd w:id="0"/>
-      <w:r>
-        <w:commentReference w:id="0"/>
-      </w:r>
-      <w:r>
-        <w:rPr>
-          <w:rtl w:val="0"/>
-        </w:rPr>
-        <w:t xml:space="preserve"> While such materials can illuminate how rationality was debated, they are not primary sites for articulating new ideas within the discipline. Moreover, textual data are by nature voluminous, and filtering improves tractability for large-scale computation.</w:t>
+        <w:t xml:space="preserve"> We also restrain our analysis to research articles and filter out book reviews, comments, editorial reports or obituaries. While such materials can illuminate how rationality was debated, they are not primary sites for articulating new ideas within the discipline. Moreover, textual data are by nature voluminous, and filtering improves tractability for large-scale computation.</w:t>
       </w:r>
       <w:r>
         <w:rPr>
@@ -952,7 +846,7 @@
         <w:rPr>
           <w:vertAlign w:val="superscript"/>
         </w:rPr>
-        <w:footnoteReference w:customMarkFollows="0" w:id="10"/>
+        <w:footnoteReference w:customMarkFollows="0" w:id="9"/>
       </w:r>
       <w:r>
         <w:rPr>
@@ -1030,7 +924,7 @@
         <w:rPr>
           <w:rtl w:val="0"/>
         </w:rPr>
-        <w:t xml:space="preserve">This definitional issue becomes even more pronounced when the object of study is a specific “field” or “research specialty” [@morrisMapping2008; @lyutovMachine2021; ]</w:t>
+        <w:t xml:space="preserve">This definitional issue becomes even more pronounced when the object of study is a specific “field” or “research specialty” [@morrisMapping2008; @lyutovMachine2021]</w:t>
       </w:r>
       <w:r>
         <w:rPr>
@@ -1224,25 +1118,25 @@
         <w:rPr>
           <w:vertAlign w:val="superscript"/>
         </w:rPr>
+        <w:footnoteReference w:customMarkFollows="0" w:id="10"/>
+      </w:r>
+      <w:r>
+        <w:rPr>
+          <w:rtl w:val="0"/>
+        </w:rPr>
+        <w:t xml:space="preserve"> In addition, it only partially captures interdisciplinarity, missing interdisciplinary journals or economists publishing in other disciplinary journals. Finally, this choice also entails boundary decisions regarding which journals to include,  particularly for those at the margins of “economics”, due to their ambiguous editorial standards. </w:t>
+      </w:r>
+      <w:r>
+        <w:rPr>
+          <w:rtl w:val="0"/>
+        </w:rPr>
+        <w:t xml:space="preserve">We eventually settled on a carefully curated list of 329 journals identified as economics journals in JSTOR and Scopus, but excluding journals that are not entirely academic, insufficiently focused on economics, or only founded within the last twenty years.</w:t>
+      </w:r>
+      <w:r>
+        <w:rPr>
+          <w:vertAlign w:val="superscript"/>
+        </w:rPr>
         <w:footnoteReference w:customMarkFollows="0" w:id="11"/>
-      </w:r>
-      <w:r>
-        <w:rPr>
-          <w:rtl w:val="0"/>
-        </w:rPr>
-        <w:t xml:space="preserve"> In addition, it only partially captures interdisciplinarity, missing interdisciplinary journals or economists publishing in other disciplinary journals. Finally, this choice also entails boundary decisions regarding which journals to include,  particularly for those at the margins of “economics”, due to their ambiguous editorial standards. </w:t>
-      </w:r>
-      <w:r>
-        <w:rPr>
-          <w:rtl w:val="0"/>
-        </w:rPr>
-        <w:t xml:space="preserve">We eventually settled on a carefully curated list of 329 journals identified as economics journals in JSTOR and Scopus, but excluding journals that are not entirely academic, insufficiently focused on economics, or only founded within the last twenty years.</w:t>
-      </w:r>
-      <w:r>
-        <w:rPr>
-          <w:vertAlign w:val="superscript"/>
-        </w:rPr>
-        <w:footnoteReference w:customMarkFollows="0" w:id="12"/>
       </w:r>
       <w:r>
         <w:rPr>
@@ -1344,55 +1238,55 @@
         <w:rPr>
           <w:vertAlign w:val="superscript"/>
         </w:rPr>
+        <w:footnoteReference w:customMarkFollows="0" w:id="12"/>
+      </w:r>
+      <w:r>
+        <w:rPr>
+          <w:rtl w:val="0"/>
+        </w:rPr>
+        <w:t xml:space="preserve"> </w:t>
+      </w:r>
+      <w:r>
+        <w:rPr>
+          <w:rtl w:val="0"/>
+        </w:rPr>
+        <w:t xml:space="preserve">LLMs are trained on extremely large collections of text to learn patterns in language. The type of models we use, i.e. bidirectional encoder models such as BERT, learns to predict missing words in a sentence or to determine whether two sentences follow each other. Through this training, the model learns billions of internal parameters that capture regularities in vocabulary, grammar, and meaning.</w:t>
+      </w:r>
+      <w:r>
+        <w:rPr>
+          <w:rtl w:val="0"/>
+        </w:rPr>
+        <w:t xml:space="preserve"> </w:t>
+      </w:r>
+      <w:r>
+        <w:rPr>
+          <w:rtl w:val="0"/>
+        </w:rPr>
+        <w:t xml:space="preserve">Such a model represents texts as vectors—often called embeddings—that capture their context and meaning</w:t>
+      </w:r>
+      <w:r>
+        <w:rPr>
+          <w:rtl w:val="0"/>
+        </w:rPr>
+        <w:t xml:space="preserve">.</w:t>
+      </w:r>
+      <w:r>
+        <w:rPr>
+          <w:rtl w:val="0"/>
+        </w:rPr>
+        <w:t xml:space="preserve"> </w:t>
+      </w:r>
+      <w:r>
+        <w:rPr>
+          <w:rtl w:val="0"/>
+        </w:rPr>
+        <w:t xml:space="preserve">The relative position of each vector in this space reflects semantic proximity: standard distance metrics—such as cosine similarity—can then be used to compare, rank, or hierarchically cluster sentences by meaning.</w:t>
+      </w:r>
+      <w:r>
+        <w:rPr>
+          <w:vertAlign w:val="superscript"/>
+        </w:rPr>
         <w:footnoteReference w:customMarkFollows="0" w:id="13"/>
-      </w:r>
-      <w:r>
-        <w:rPr>
-          <w:rtl w:val="0"/>
-        </w:rPr>
-        <w:t xml:space="preserve"> </w:t>
-      </w:r>
-      <w:r>
-        <w:rPr>
-          <w:rtl w:val="0"/>
-        </w:rPr>
-        <w:t xml:space="preserve">LLMs are trained on extremely large collections of text to learn patterns in language. The type of models we use, i.e. bidirectional encoder models such as BERT, learns to predict missing words in a sentence or to determine whether two sentences follow each other. Through this training, the model learns billions of internal parameters that capture regularities in vocabulary, grammar, and meaning.</w:t>
-      </w:r>
-      <w:r>
-        <w:rPr>
-          <w:rtl w:val="0"/>
-        </w:rPr>
-        <w:t xml:space="preserve"> </w:t>
-      </w:r>
-      <w:r>
-        <w:rPr>
-          <w:rtl w:val="0"/>
-        </w:rPr>
-        <w:t xml:space="preserve">Such a model represents texts as vectors—often called embeddings—that capture their context and meaning</w:t>
-      </w:r>
-      <w:r>
-        <w:rPr>
-          <w:rtl w:val="0"/>
-        </w:rPr>
-        <w:t xml:space="preserve">.</w:t>
-      </w:r>
-      <w:r>
-        <w:rPr>
-          <w:rtl w:val="0"/>
-        </w:rPr>
-        <w:t xml:space="preserve"> </w:t>
-      </w:r>
-      <w:r>
-        <w:rPr>
-          <w:rtl w:val="0"/>
-        </w:rPr>
-        <w:t xml:space="preserve">The relative position of each vector in this space reflects semantic proximity: standard distance metrics—such as cosine similarity—can then be used to compare, rank, or hierarchically cluster sentences by meaning.</w:t>
-      </w:r>
-      <w:r>
-        <w:rPr>
-          <w:vertAlign w:val="superscript"/>
-        </w:rPr>
-        <w:footnoteReference w:customMarkFollows="0" w:id="14"/>
       </w:r>
       <w:r>
         <w:rPr>
@@ -1634,7 +1528,7 @@
         <w:rPr>
           <w:vertAlign w:val="superscript"/>
         </w:rPr>
-        <w:footnoteReference w:customMarkFollows="0" w:id="15"/>
+        <w:footnoteReference w:customMarkFollows="0" w:id="14"/>
       </w:r>
       <w:r>
         <w:rPr>
@@ -1764,25 +1658,25 @@
         <w:rPr>
           <w:vertAlign w:val="superscript"/>
         </w:rPr>
+        <w:footnoteReference w:customMarkFollows="0" w:id="15"/>
+      </w:r>
+      <w:r>
+        <w:rPr>
+          <w:rtl w:val="0"/>
+        </w:rPr>
+        <w:t xml:space="preserve"> </w:t>
+      </w:r>
+      <w:r>
+        <w:rPr>
+          <w:rtl w:val="0"/>
+        </w:rPr>
+        <w:t xml:space="preserve">Concretely, for the year 1910, we averaged the vectors of all sentences containing “rationality” or “rational” from 1905 to 1915.</w:t>
+      </w:r>
+      <w:r>
+        <w:rPr>
+          <w:vertAlign w:val="superscript"/>
+        </w:rPr>
         <w:footnoteReference w:customMarkFollows="0" w:id="16"/>
-      </w:r>
-      <w:r>
-        <w:rPr>
-          <w:rtl w:val="0"/>
-        </w:rPr>
-        <w:t xml:space="preserve"> </w:t>
-      </w:r>
-      <w:r>
-        <w:rPr>
-          <w:rtl w:val="0"/>
-        </w:rPr>
-        <w:t xml:space="preserve">Concretely, for the year 1910, we averaged the vectors of all sentences containing “rationality” or “rational” from 1905 to 1915.</w:t>
-      </w:r>
-      <w:r>
-        <w:rPr>
-          <w:vertAlign w:val="superscript"/>
-        </w:rPr>
-        <w:footnoteReference w:customMarkFollows="0" w:id="17"/>
       </w:r>
       <w:r>
         <w:rPr>
@@ -1945,7 +1839,7 @@
         <w:rPr>
           <w:vertAlign w:val="superscript"/>
         </w:rPr>
-        <w:footnoteReference w:customMarkFollows="0" w:id="18"/>
+        <w:footnoteReference w:customMarkFollows="0" w:id="17"/>
       </w:r>
       <w:r>
         <w:rPr>
@@ -2048,7 +1942,7 @@
         <w:rPr>
           <w:vertAlign w:val="superscript"/>
         </w:rPr>
-        <w:footnoteReference w:customMarkFollows="0" w:id="19"/>
+        <w:footnoteReference w:customMarkFollows="0" w:id="18"/>
       </w:r>
       <w:r>
         <w:rPr>
@@ -2203,7 +2097,7 @@
         <w:rPr>
           <w:rtl w:val="0"/>
         </w:rPr>
-        <w:t xml:space="preserve">While our usage of a LLM will shed light on the context surrounding this upward movement, such context can also be approximated with simple measures. Co-occurrence analysis helps recover the different intellectual settings in which rationality is invoked. @fig-co-occurence reports, by decade, the five words most frequently adjacent to “rational” or “rationality,” showing how these associations shift over time. Before the 1930s, the picture was heterogeneous. The notion was tied to the marginalist idea of “calculation,” but it referred not only to individual behavior but also to “systems” or “organizations.” The discussion was explicitly methodological, as indicated by the prominence of terms such as “method,” “explanation,” “law,” and “foundation.” From the 1940s onward, the rise of choice theory places rationality at the center of economic modeling as a device for describing and formalizing behavior. This is mostly visible with the rise of multiple common bi-grams (i.e., combination of two words) that remain stable from the 1930s through the 1980s such as “economic rationality”, “rational choice”, “rational behavior”. By the 1970s—and especially the 1980s—the framework was both extended and contested. First, the most common bi-gram by far becomes “rational expectations” signalling the emergence of a new predominant concept extending rationality. In the 1980s, “rational expectations” appeared 15 more times than the other most common bi-grams. Second, while the concept “bounded rationality” was developed by Herbert Simon initially in the 1950s, the concept only became prevalent during the 1990s with the bi-gram becoming the fourth most common one. </w:t>
+        <w:t xml:space="preserve">While our usage of a LLM will shed light on the context surrounding this upward movement, such context can also be approximated with simple measures. Co-occurrence analysis helps recover the different intellectual settings in which rationality is invoked. @fig-co-occurence reports, by decade, the five words most frequently adjacent to “rational” or “rationality,” showing how these associations shift over time. Before the 1930s, the picture was heterogeneous. The notion was tied to the marginalist idea of “calculation,” but it referred not only to individual behavior but also to “system” or “organization.” The discussion was explicitly methodological, as indicated by the prominence of terms such as “method,” “explanation,” “law,” and “foundation.” From the 1940s onward, the rise of choice theory places rationality at the center of economic modeling as a device for describing and formalizing behavior. This is mostly visible with the rise of multiple common bi-grams (i.e., combination of two words) that remain stable from the 1930s through the 1980s such as “economic rationality”, “rational choice”, “rational behavior”. By the 1970s—and especially the 1980s—the framework was both extended and contested. First, the most common bi-gram by far becomes “rational expectations” signalling the emergence of a new predominant concept extending rationality. In the 1980s, “rational expectations” appeared 15 more times than the other most common bi-grams. Second, while the concept “bounded rationality” was developed by Herbert Simon initially in the 1950s, the concept only became prevalent during the 1990s with the bi-gram becoming the fourth most common one. </w:t>
       </w:r>
     </w:p>
     <w:p>
@@ -2256,7 +2150,7 @@
         <w:rPr>
           <w:rtl w:val="0"/>
         </w:rPr>
-        <w:t xml:space="preserve"> [@teixeiraMatthew2021; @teplitskiyHow2022</w:t>
+        <w:t xml:space="preserve"> [@teixeiradasilvaMatthew2021; @teplitskiyHow2022</w:t>
       </w:r>
       <w:r>
         <w:rPr>
@@ -2356,30 +2250,42 @@
         <w:rPr>
           <w:vertAlign w:val="superscript"/>
         </w:rPr>
+        <w:footnoteReference w:customMarkFollows="0" w:id="19"/>
+      </w:r>
+      <w:r>
+        <w:rPr>
+          <w:rtl w:val="0"/>
+        </w:rPr>
+        <w:t xml:space="preserve"> Assigning such categories imposes a form of internal organization on large and otherwise unwieldy bodies of material, enabling an accelerated or “distant reading” [@morettiDistant2013]. The typical output of these methods is a map of a discipline or research area, showing how different entities—topics, articles, authors—relate to one another.  </w:t>
+      </w:r>
+    </w:p>
+    <w:p>
+      <w:pPr>
+        <w:rPr/>
+      </w:pPr>
+      <w:r>
+        <w:rPr>
+          <w:rtl w:val="0"/>
+        </w:rPr>
+        <w:t xml:space="preserve">In contrast to </w:t>
+      </w:r>
+      <w:r>
+        <w:rPr>
+          <w:rtl w:val="0"/>
+        </w:rPr>
+        <w:t xml:space="preserve">unsupervised methods, supervised methods aim to estimate predefined relationships or reproduce categories specified in advance. Supervised methods—such as regression models or classification algorithms—require researchers to formulate hypotheses, define variables, or establish categories prior to analysis [@doAugmented2022]. Unsupervised methods rather seek to detect patterns, groupings, or structures that emerge from the data itself.</w:t>
+      </w:r>
+      <w:r>
+        <w:rPr>
+          <w:vertAlign w:val="superscript"/>
+        </w:rPr>
         <w:footnoteReference w:customMarkFollows="0" w:id="20"/>
       </w:r>
       <w:r>
         <w:rPr>
           <w:rtl w:val="0"/>
         </w:rPr>
-        <w:t xml:space="preserve"> Assigning such categories imposes a form of internal organization on large and otherwise unwieldy bodies of material, enabling an accelerated or “distant reading” [@morettiDistant2013]. The typical output of these methods is a map of a discipline or research area, showing how different entities—topics, articles, authors—relate to one another.  </w:t>
-      </w:r>
-    </w:p>
-    <w:p>
-      <w:pPr>
-        <w:rPr/>
-      </w:pPr>
-      <w:r>
-        <w:rPr>
-          <w:rtl w:val="0"/>
-        </w:rPr>
-        <w:t xml:space="preserve">In contrast to </w:t>
-      </w:r>
-      <w:r>
-        <w:rPr>
-          <w:rtl w:val="0"/>
-        </w:rPr>
-        <w:t xml:space="preserve">unsupervised methods, supervised methods aim to estimate predefined relationships or reproduce categories specified in advance. Supervised methods—such as regression models or classification algorithms—require researchers to formulate hypotheses, define variables, or establish categories prior to analysis [@doAugmented2022]. Unsupervised methods rather seek to detect patterns, groupings, or structures that emerge from the data itself.</w:t>
+        <w:t xml:space="preserve"> This “discovery” capacity [@grimmerText2022]  is especially valuable in large-scale and long-run historical analysis, where the relevant categories may be uncertain, evolving, or difficult to define in advance. In such contexts, imposing predefined classifications risks introducing categories that are historically inadequate or anachronistic. Unsupervised approaches therefore provide a useful way to identify unexpected regularities, semantic groupings, or intellectual communities before moving to interpretation.</w:t>
       </w:r>
       <w:r>
         <w:rPr>
@@ -2391,69 +2297,69 @@
         <w:rPr>
           <w:rtl w:val="0"/>
         </w:rPr>
-        <w:t xml:space="preserve"> This “discovery” capacity [@grimmerText2022]  is especially valuable in large-scale and long-run historical analysis, where the relevant categories may be uncertain, evolving, or difficult to define in advance. In such contexts, imposing predefined classifications risks introducing categories that are historically inadequate or anachronistic. Unsupervised approaches therefore provide a useful way to identify unexpected regularities, semantic groupings, or intellectual communities before moving to interpretation.</w:t>
+      </w:r>
+    </w:p>
+    <w:p>
+      <w:pPr>
+        <w:rPr/>
+      </w:pPr>
+      <w:r>
+        <w:rPr>
+          <w:rtl w:val="0"/>
+        </w:rPr>
+        <w:t xml:space="preserve">In this paper, we use unsupervised methods to analyse both the articles-corpus and the sentences-corpus. The articles-corpus consists of the 10% of articles whose embeddings are most similar to the annual representative vectors. To make sense of this large set of documents, we employ a method that groups together documents mobilizing similar understandings of rationality. We use bibliographic coupling, a method commonly employed in the history of economic thought [see e.g., @claveauMacrodynamics2016; @trucForty2022; @bacciniDoes2025]. In a bibliographic coupling network, documents are represented as nodes, and links between them are weighted according to the number of references they share. The more references two articles have in common, the stronger their connection—and, in network visualisations, the closer they tend to appear to one another. The underlying premise is that shared references provide a proxy for intellectual proximity. Such networks make it possible to identify communities of closely related documents and to delineate the core-periphery structure of a discipline or research field. </w:t>
+      </w:r>
+      <w:r>
+        <w:rPr>
+          <w:rtl w:val="0"/>
+        </w:rPr>
+      </w:r>
+    </w:p>
+    <w:p>
+      <w:pPr>
+        <w:rPr/>
+      </w:pPr>
+      <w:r>
+        <w:rPr>
+          <w:rtl w:val="0"/>
+        </w:rPr>
+        <w:t xml:space="preserve">However, citation practices tend to favor more recent works, which makes it unhelpful for historians to construct a single citation network spanning an entire century. Following a method that has proven effective in the field </w:t>
+      </w:r>
+      <w:r>
+        <w:rPr>
+          <w:rtl w:val="0"/>
+        </w:rPr>
+        <w:t xml:space="preserve">[@</w:t>
+      </w:r>
+      <w:r>
+        <w:rPr>
+          <w:rtl w:val="0"/>
+        </w:rPr>
+        <w:t xml:space="preserve">claveauMacrodynamics2016</w:t>
+      </w:r>
+      <w:r>
+        <w:rPr>
+          <w:rtl w:val="0"/>
+        </w:rPr>
+        <w:t xml:space="preserve">; @goutsmedtIndependent2023; @camilottoNavigating2023]</w:t>
+      </w:r>
+      <w:r>
+        <w:rPr>
+          <w:rtl w:val="0"/>
+        </w:rPr>
+        <w:t xml:space="preserve">, </w:t>
+      </w:r>
+      <w:r>
+        <w:rPr>
+          <w:rtl w:val="0"/>
+        </w:rPr>
+        <w:t xml:space="preserve">we therefore split our corpus into overlapping eight-year windows,</w:t>
       </w:r>
       <w:r>
         <w:rPr>
           <w:vertAlign w:val="superscript"/>
         </w:rPr>
         <w:footnoteReference w:customMarkFollows="0" w:id="22"/>
-      </w:r>
-      <w:r>
-        <w:rPr>
-          <w:rtl w:val="0"/>
-        </w:rPr>
-      </w:r>
-    </w:p>
-    <w:p>
-      <w:pPr>
-        <w:rPr/>
-      </w:pPr>
-      <w:r>
-        <w:rPr>
-          <w:rtl w:val="0"/>
-        </w:rPr>
-        <w:t xml:space="preserve">In this paper, we use unsupervised methods to analyse both the articles-corpus and the sentences-corpus. The articles-corpus consists of the 10% of articles whose embeddings are most similar to the annual representative vectors. To make sense of this large set of documents, we employ a method that groups together documents mobilizing similar understandings of rationality. We use bibliographic coupling, a method commonly employed in the history of economic thought [see e.g., @claveauMacrodynamics2016; @trucForty2022; @bacciniDoes2025]. In a bibliographic coupling network, documents are represented as nodes, and links between them are weighted according to the number of references they share. The more references two articles have in common, the stronger their connection—and, in network visualisations, the closer they tend to appear to one another. The underlying premise is that shared references provide a proxy for intellectual proximity. Such networks make it possible to identify communities of closely related documents and to delineate the core-periphery structure of a discipline or research field. </w:t>
-      </w:r>
-      <w:r>
-        <w:rPr>
-          <w:rtl w:val="0"/>
-        </w:rPr>
-      </w:r>
-    </w:p>
-    <w:p>
-      <w:pPr>
-        <w:rPr/>
-      </w:pPr>
-      <w:r>
-        <w:rPr>
-          <w:rtl w:val="0"/>
-        </w:rPr>
-        <w:t xml:space="preserve">However, citation practices tend to favor more recent works, which makes it unhelpful for historians to construct a single citation network spanning an entire century. Following a method that has proven effective in the field </w:t>
-      </w:r>
-      <w:r>
-        <w:rPr>
-          <w:rtl w:val="0"/>
-        </w:rPr>
-        <w:t xml:space="preserve">[@claveauMacrodyanmics2016; @goutsmedtIndependent2023; @camilottoNavigating2023]</w:t>
-      </w:r>
-      <w:r>
-        <w:rPr>
-          <w:rtl w:val="0"/>
-        </w:rPr>
-        <w:t xml:space="preserve">, </w:t>
-      </w:r>
-      <w:r>
-        <w:rPr>
-          <w:rtl w:val="0"/>
-        </w:rPr>
-        <w:t xml:space="preserve">we therefore split our corpus into overlapping eight-year windows,</w:t>
-      </w:r>
-      <w:r>
-        <w:rPr>
-          <w:vertAlign w:val="superscript"/>
-        </w:rPr>
-        <w:footnoteReference w:customMarkFollows="0" w:id="23"/>
       </w:r>
       <w:r>
         <w:rPr>
@@ -2523,106 +2429,106 @@
         <w:rPr>
           <w:vertAlign w:val="superscript"/>
         </w:rPr>
+        <w:footnoteReference w:customMarkFollows="0" w:id="23"/>
+      </w:r>
+      <w:r>
+        <w:rPr>
+          <w:rtl w:val="0"/>
+        </w:rPr>
+        <w:t xml:space="preserve"> </w:t>
+      </w:r>
+      <w:r>
+        <w:rPr>
+          <w:rtl w:val="0"/>
+        </w:rPr>
+      </w:r>
+    </w:p>
+    <w:p>
+      <w:pPr>
+        <w:rPr/>
+      </w:pPr>
+      <w:r>
+        <w:rPr>
+          <w:rtl w:val="0"/>
+        </w:rPr>
+        <w:t xml:space="preserve">For textual analysis, we use t</w:t>
+      </w:r>
+      <w:r>
+        <w:rPr>
+          <w:rtl w:val="0"/>
+        </w:rPr>
+        <w:t xml:space="preserve">he sentences-corpus that gathers </w:t>
+      </w:r>
+      <w:r>
+        <w:rPr>
+          <w:rtl w:val="0"/>
+        </w:rPr>
+        <w:t xml:space="preserve">the top 1% of sentences that are most similar to our annual representative vectors of sentences with “rationality” and “rational” (</w:t>
+      </w:r>
+      <w:r>
+        <w:rPr>
+          <w:rtl w:val="0"/>
+        </w:rPr>
+        <w:t xml:space="preserve">see above and @fig-rv-method-diagram in the appendix</w:t>
+      </w:r>
+      <w:r>
+        <w:rPr>
+          <w:rtl w:val="0"/>
+        </w:rPr>
+        <w:t xml:space="preserve">).</w:t>
+      </w:r>
+      <w:r>
+        <w:rPr>
+          <w:rtl w:val="0"/>
+        </w:rPr>
+        <w:t xml:space="preserve"> </w:t>
+      </w:r>
+      <w:r>
+        <w:rPr>
+          <w:rtl w:val="0"/>
+        </w:rPr>
+        <w:t xml:space="preserve">To analyse this corpus, as with bibliographic coupling, we want a method that groups together our observations (here the sentences) that employ similar meanings of rationality. W</w:t>
+      </w:r>
+      <w:r>
+        <w:rPr>
+          <w:rtl w:val="0"/>
+        </w:rPr>
+        <w:t xml:space="preserve">e draw on the literature on semantic change that measures the change of meaning of words over time [@kutuzovDiachronic2018; @giulianelliAnalysing2020; @montanelliSurvey2024; @peritiSystematic2024a]. We therefore cluster the sentence embeddings using the HDBSCAN algorithm, a widely used unsupervised method for clustering LLM embeddings.</w:t>
+      </w:r>
+      <w:r>
+        <w:rPr>
+          <w:rtl w:val="0"/>
+        </w:rPr>
+        <w:t xml:space="preserve"> </w:t>
+      </w:r>
+    </w:p>
+    <w:p>
+      <w:pPr>
+        <w:rPr/>
+      </w:pPr>
+      <w:r>
+        <w:rPr>
+          <w:rtl w:val="0"/>
+        </w:rPr>
+        <w:t xml:space="preserve">Because the distribution of identified sentences is strongly present-biased (@fig-distribution), clustering all sentences at once would risk over-representing recent periods. We therefore perform clustering separately for each decade from 1900 onward (merging the first two decades due to fewer sentences).</w:t>
+      </w:r>
+      <w:r>
+        <w:rPr>
+          <w:vertAlign w:val="superscript"/>
+        </w:rPr>
         <w:footnoteReference w:customMarkFollows="0" w:id="24"/>
       </w:r>
       <w:r>
         <w:rPr>
           <w:rtl w:val="0"/>
         </w:rPr>
-        <w:t xml:space="preserve"> </w:t>
-      </w:r>
-      <w:r>
-        <w:rPr>
-          <w:rtl w:val="0"/>
-        </w:rPr>
-      </w:r>
-    </w:p>
-    <w:p>
-      <w:pPr>
-        <w:rPr/>
-      </w:pPr>
-      <w:r>
-        <w:rPr>
-          <w:rtl w:val="0"/>
-        </w:rPr>
-        <w:t xml:space="preserve">For textual analysis, we use t</w:t>
-      </w:r>
-      <w:r>
-        <w:rPr>
-          <w:rtl w:val="0"/>
-        </w:rPr>
-        <w:t xml:space="preserve">he sentences-corpus that gathers </w:t>
-      </w:r>
-      <w:r>
-        <w:rPr>
-          <w:rtl w:val="0"/>
-        </w:rPr>
-        <w:t xml:space="preserve">the top 1% of sentences that are most similar to our annual representative vectors of sentences with “rationality” and “rational” (</w:t>
-      </w:r>
-      <w:r>
-        <w:rPr>
-          <w:rtl w:val="0"/>
-        </w:rPr>
-        <w:t xml:space="preserve">see above and @fig-rv-method-diagram in the appendix</w:t>
-      </w:r>
-      <w:r>
-        <w:rPr>
-          <w:rtl w:val="0"/>
-        </w:rPr>
-        <w:t xml:space="preserve">).</w:t>
-      </w:r>
-      <w:r>
-        <w:rPr>
-          <w:rtl w:val="0"/>
-        </w:rPr>
-        <w:t xml:space="preserve"> </w:t>
-      </w:r>
-      <w:r>
-        <w:rPr>
-          <w:rtl w:val="0"/>
-        </w:rPr>
-        <w:t xml:space="preserve">To analyse this corpus, as with bibliographic coupling, we want a method that groups together our observations (here the sentences) that employ similar meanings of rationality. W</w:t>
-      </w:r>
-      <w:r>
-        <w:rPr>
-          <w:rtl w:val="0"/>
-        </w:rPr>
-        <w:t xml:space="preserve">e draw on the literature on semantic change that measures the change of meaning of words over time [@kutuzovDiachronic2018; @montanelliSurvey2024; @peritiSystematic2024a] and take inspiration from @giulianelliAnalysing2020. We therefore cluster the sentence embeddings using the HDBSCAN algorithm, a widely used unsupervised method for clustering LLM embeddings.</w:t>
-      </w:r>
-      <w:r>
-        <w:rPr>
-          <w:rtl w:val="0"/>
-        </w:rPr>
-        <w:t xml:space="preserve"> </w:t>
-      </w:r>
-    </w:p>
-    <w:p>
-      <w:pPr>
-        <w:rPr/>
-      </w:pPr>
-      <w:r>
-        <w:rPr>
-          <w:rtl w:val="0"/>
-        </w:rPr>
-        <w:t xml:space="preserve">Again, historical perspective matters. Because the distribution of identified sentences is strongly present-biased (@fig-distribution), clustering all sentences at once would risk over-representing recent periods. We therefore perform clustering separately for each decade from 1900 onward (merging the first two decades due to fewer sentences).</w:t>
+        <w:t xml:space="preserve"> As in our bibliographic approach, we then seek to form larger groups over time, allowing us to “zoom in” and “zoom out” depending on what we are searching for. Using the cosine similarity between clusters across decades, we merge the closest ones into 17 “intertemporal semantic clusters.”</w:t>
       </w:r>
       <w:r>
         <w:rPr>
           <w:vertAlign w:val="superscript"/>
         </w:rPr>
         <w:footnoteReference w:customMarkFollows="0" w:id="25"/>
-      </w:r>
-      <w:r>
-        <w:rPr>
-          <w:rtl w:val="0"/>
-        </w:rPr>
-        <w:t xml:space="preserve"> As in our bibliographic approach, we then seek to form larger groups over time, allowing us to “zoom in” and “zoom out” depending on what we are searching for. Using the cosine similarity between clusters across decades, we merge the closest ones into 17 “intertemporal semantic clusters.”</w:t>
-      </w:r>
-      <w:r>
-        <w:rPr>
-          <w:vertAlign w:val="superscript"/>
-        </w:rPr>
-        <w:footnoteReference w:customMarkFollows="0" w:id="26"/>
       </w:r>
       <w:r>
         <w:rPr>
@@ -2719,7 +2625,7 @@
         <w:rPr>
           <w:rtl w:val="0"/>
         </w:rPr>
-        <w:t xml:space="preserve">Taken together, the textual and bibliometric approaches allow us to study both the semantic and thematic contexts of the uses of rationality in economics and the channels through which these ideas circulated within the discipline. But how should such a “study” proceed? Unlike simpler quantitative tools, unsupervised methods do not produce ready-made results. In our case, they generate statistical categories—bibliometric communities and semantic clusters—that lack predefined conceptual “labels.” This strategy—reducing a large and complex corpus to a smaller number of coherent groups—is well established. Yet the groups themselves are created solely on the basis of statistical similarities, and their historical or conceptual significance emerges only through subsequent “exploration” [@simonsLarge2026] and “validation” [@grimmerText2013]. To make sense of what brings texts together, we therefore need indicators that identify shared features and help hierarchise the documents to be read first</w:t>
+        <w:t xml:space="preserve">Taken together, the textual and bibliometric approaches allow us to study both the semantic and thematic contexts of the uses of rationality in economics and the channels through which these ideas circulated within the discipline. But how should such a “study” proceed? Unlike simpler quantitative tools, unsupervised methods do not produce ready-made results but reduce large and complex data to a smaller number of coherent groups. In our case, they generate statistical categories—bibliometric communities and semantic clusters—that lack predefined conceptual “labels.” They are created solely on the basis of statistical similarities, and their historical or conceptual significance emerges only through subsequent “exploration” [@simonsLarge2026] and “validation” [@grimmerText2013]. To make sense of what brings texts together, we therefore need indicators that identify shared features and help hierarchise the documents to be read first</w:t>
       </w:r>
       <w:r>
         <w:rPr>
@@ -2745,7 +2651,7 @@
         <w:rPr>
           <w:rtl w:val="0"/>
         </w:rPr>
-        <w:t xml:space="preserve">Therefore, whether at the stage of data construction or in the interpretation of statistical patterns, quantitative methods demand a continuous dialogue with qualitative interpretation, grounded in a close reading of the relevant secondary literature. Only through this iterative back-and-forth can we turn algorithmic groupings into meaningful historical insights. This is both a weakness and a strength. </w:t>
+        <w:t xml:space="preserve">This point illustrates again that, whether at the stage of data construction or in the interpretation of statistical patterns, quantitative methods demand a continuous dialogue with qualitative interpretation, grounded in a close reading of the relevant secondary literature. Only through this iterative back-and-forth can we turn statistical groupings into meaningful historical insights. This is both a weakness and a strength. </w:t>
       </w:r>
       <w:r>
         <w:rPr>
@@ -2779,31 +2685,53 @@
         <w:rPr>
           <w:rtl w:val="0"/>
         </w:rPr>
-        <w:t xml:space="preserve">For the purpose of the exploration and interpretation of our results, we have built an [online interactive application](</w:t>
-      </w:r>
-      <w:hyperlink r:id="rId8">
-        <w:r>
-          <w:rPr>
-            <w:color w:val="1155cc"/>
-            <w:sz w:val="20"/>
-            <w:szCs w:val="20"/>
-            <w:u w:val="single"/>
-            <w:rtl w:val="0"/>
-          </w:rPr>
-          <w:t xml:space="preserve">https://019adac8-81d4-aa0e-808c-08861c261fd2.share.connect.posit.cloud/</w:t>
-        </w:r>
-      </w:hyperlink>
-      <w:r>
-        <w:rPr>
-          <w:rtl w:val="0"/>
-        </w:rPr>
-        <w:t xml:space="preserve">)</w:t>
-      </w:r>
-      <w:r>
-        <w:rPr>
-          <w:rtl w:val="0"/>
-        </w:rPr>
-        <w:t xml:space="preserve">, where one finds all the semantic clusters and bibliometric communities, and their corresponding indicators. Let us take as an example the semantic cluster “Rationality and its Limits,” which gathers close to 20,000 sentences from 1920 to 2009.</w:t>
+        <w:t xml:space="preserve">A key step for the interpretation of our results is thus the process by which we </w:t>
+      </w:r>
+      <w:r>
+        <w:rPr>
+          <w:i w:val="1"/>
+          <w:iCs w:val="1"/>
+          <w:rtl w:val="0"/>
+        </w:rPr>
+        <w:t xml:space="preserve">select</w:t>
+      </w:r>
+      <w:r>
+        <w:rPr>
+          <w:rtl w:val="0"/>
+        </w:rPr>
+        <w:t xml:space="preserve"> and </w:t>
+      </w:r>
+      <w:r>
+        <w:rPr>
+          <w:i w:val="1"/>
+          <w:iCs w:val="1"/>
+          <w:rtl w:val="0"/>
+        </w:rPr>
+        <w:t xml:space="preserve">prioritise </w:t>
+      </w:r>
+      <w:r>
+        <w:rPr>
+          <w:rtl w:val="0"/>
+        </w:rPr>
+        <w:t xml:space="preserve">observations that will make sense of them. To make this crucial step as transparent and replicable as possible</w:t>
+      </w:r>
+      <w:r>
+        <w:rPr>
+          <w:rtl w:val="0"/>
+        </w:rPr>
+        <w:t xml:space="preserve">, we have built an application, where readers can explore all the semantic clusters and bibliometric communities, together with their corresponding indicators.</w:t>
+      </w:r>
+      <w:r>
+        <w:rPr>
+          <w:vertAlign w:val="superscript"/>
+        </w:rPr>
+        <w:footnoteReference w:customMarkFollows="0" w:id="26"/>
+      </w:r>
+      <w:r>
+        <w:rPr>
+          <w:rtl w:val="0"/>
+        </w:rPr>
+        <w:t xml:space="preserve"> Let us take as an example the semantic cluster “Rationality and its Limits,” which gathers close to 20,000 sentences from 1920 to 2009.</w:t>
       </w:r>
       <w:r>
         <w:rPr>
@@ -2815,7 +2743,7 @@
         <w:rPr>
           <w:rtl w:val="0"/>
         </w:rPr>
-        <w:t xml:space="preserve"> How can we get a sense of what this cluster actually coalesces around? Before any qualitative interpretation or contextualization with the secondary literature, we must first produce a series of indicators to characterize the cluster. Such indicators include:</w:t>
+        <w:t xml:space="preserve"> How can we get a sense of what this cluster actually coalesces around? Before any qualitative interpretation or contextualization with the secondary literature, we must first produce a series of indicators to help us at characterizing the cluster. We choose the following indicators: </w:t>
       </w:r>
     </w:p>
     <w:p>
@@ -2830,9 +2758,43 @@
       </w:pPr>
       <w:r>
         <w:rPr>
-          <w:rtl w:val="0"/>
-        </w:rPr>
-        <w:t xml:space="preserve">The most identifying words of the cluster for each decade, based on Term Frequency-Inverse Document Frequency (TF-IDF). While the first period of the cluster (the 1920s) deals notably with “rationalisation” and “human reason,” the 1950s are more directly focused on “rationalism,” “rationality,” and “rational behavior.” After the 1970s and until 2009, “bounded rationality” emerges as a core concept in this cluster.</w:t>
+          <w:b w:val="1"/>
+          <w:bCs w:val="1"/>
+          <w:rtl w:val="0"/>
+        </w:rPr>
+        <w:t xml:space="preserve">The TF-IDF. </w:t>
+      </w:r>
+      <w:r>
+        <w:rPr>
+          <w:rtl w:val="0"/>
+        </w:rPr>
+        <w:t xml:space="preserve">We</w:t>
+      </w:r>
+      <w:r>
+        <w:rPr>
+          <w:b w:val="1"/>
+          <w:bCs w:val="1"/>
+          <w:rtl w:val="0"/>
+        </w:rPr>
+        <w:t xml:space="preserve"> </w:t>
+      </w:r>
+      <w:r>
+        <w:rPr>
+          <w:rtl w:val="0"/>
+        </w:rPr>
+        <w:t xml:space="preserve">identify words specific to the cluster for each decade, based on Term Frequency-Inverse Document Frequency (TF-IDF). For instance, while the first period of the cluster (the 1920s) deals notably with “rationalisation” and “human reason,” the 1950s are more directly focused on “rationalism,” “rationality,” and “rational behavior.” After the 1970s and until 2009, “bounded rationality” </w:t>
+      </w:r>
+      <w:r>
+        <w:rPr>
+          <w:rtl w:val="0"/>
+        </w:rPr>
+        <w:t xml:space="preserve">emerges</w:t>
+      </w:r>
+      <w:r>
+        <w:rPr>
+          <w:rtl w:val="0"/>
+        </w:rPr>
+        <w:t xml:space="preserve"> as a core concept in this cluster.</w:t>
       </w:r>
     </w:p>
     <w:p>
@@ -2847,9 +2809,23 @@
       </w:pPr>
       <w:r>
         <w:rPr>
-          <w:rtl w:val="0"/>
-        </w:rPr>
-        <w:t xml:space="preserve">The sentences within the semantic cluster that are closest to its year-representative vector as well as the closest sentences from the  cluster’s centroid itself for each period. The first category tends to highlight how the concept of rationality is discussed, while the second category centers more directly on the core semantic content of the cluster, often offering clues about the topics and debates that animate it in different periods. For instance, in the 1950s, one of the sentences closest to the representative vectors is Simon’s claim that “If man, according to this interpretation, makes decisions and choices that have some appearance of rationality, rationality in real life must involve something simpler than maximization of utility or profit” [@simonTheories1959, 259–260]. As for the closest sentences from cluster’s centroid, Allan Drazen [@drazenRecent1980, 294] warned in the 1980s that “Deciding on the suitable notion or definition of rationality is not an easy task,” in his survey of the disequilibrium-theory literature in macroeconomics.</w:t>
+          <w:b w:val="1"/>
+          <w:bCs w:val="1"/>
+          <w:rtl w:val="0"/>
+        </w:rPr>
+        <w:t xml:space="preserve">The closest sentences.</w:t>
+      </w:r>
+      <w:r>
+        <w:rPr>
+          <w:rtl w:val="0"/>
+        </w:rPr>
+        <w:t xml:space="preserve"> W</w:t>
+      </w:r>
+      <w:r>
+        <w:rPr>
+          <w:rtl w:val="0"/>
+        </w:rPr>
+        <w:t xml:space="preserve">e use two different definitions. First, the sentences within the semantic cluster that are closest to its year-representative vector. Second, the closest sentences from the  cluster’s centroid itself for each period. The first tends to highlight how the concept of rationality is discussed, while the second centers more directly on the core semantic content of the cluster, often offering clues about the topics and debates that animate it in different periods. For instance, in the 1950s, one of the sentences closest to the representative vectors is Simon’s claim that “If man, according to this interpretation, makes decisions and choices that have some appearance of rationality, rationality in real life must involve something simpler than maximization of utility or profit” [@simonTheories1959, 259–260]. As for the closest sentences from cluster’s centroid, Allan Drazen [@drazenRecent1980, 294] warned in the 1980s that “Deciding on the suitable notion or definition of rationality is not an easy task,” in his survey of the disequilibrium-theory literature in macroeconomics.</w:t>
       </w:r>
     </w:p>
     <w:p>
@@ -2864,9 +2840,17 @@
       </w:pPr>
       <w:r>
         <w:rPr>
-          <w:rtl w:val="0"/>
-        </w:rPr>
-        <w:t xml:space="preserve">The articles with the most sentences in the cluster for each decade. Here we find, for example, Terence Hutchison’s “Expectation and Rational Conduct” [@hutchisonExpectation1937]; Jacob Marschak’s “Rational Behavior, Uncertain Prospects, and Measurable Utility” [@marschakRational1950]; Herbert Simon’s 1978 Richard T. Ely Lecture at the AEA meetings [@simonRationality1978] and his Nobel lecture [@simonRational1979]; as well as Sugden’s 1991 </w:t>
+          <w:b w:val="1"/>
+          <w:bCs w:val="1"/>
+          <w:rtl w:val="0"/>
+        </w:rPr>
+        <w:t xml:space="preserve">The closest articles</w:t>
+      </w:r>
+      <w:r>
+        <w:rPr>
+          <w:rtl w:val="0"/>
+        </w:rPr>
+        <w:t xml:space="preserve">. We define the closest articles as those containing the highest number of sentences belonging to the cluster within each decade. Here we find, for example, Terence Hutchison’s “Expectation and Rational Conduct” [@hutchisonExpectation1937]; Jacob Marschak’s “Rational Behavior, Uncertain Prospects, and Measurable Utility” [@marschakRational1950]; Herbert Simon’s 1978 Richard T. Ely Lecture at the AEA meetings [@simonRationality1978] and his Nobel lecture [@simonRational1979]; as well as Sugden’s 1991 </w:t>
       </w:r>
       <w:r>
         <w:rPr>
@@ -2934,9 +2918,17 @@
       </w:pPr>
       <w:r>
         <w:rPr>
-          <w:rtl w:val="0"/>
-        </w:rPr>
-        <w:t xml:space="preserve">From the 1950s onward, the most cited references (based on the number of citations per article, whether the article has one or ten sentences in the cluster). In the 1950s, one of the most important references within this cluster is John von Neumann and Oskar Morgenstern’s </w:t>
+          <w:b w:val="1"/>
+          <w:bCs w:val="1"/>
+          <w:rtl w:val="0"/>
+        </w:rPr>
+        <w:t xml:space="preserve">The most cited references.</w:t>
+      </w:r>
+      <w:r>
+        <w:rPr>
+          <w:rtl w:val="0"/>
+        </w:rPr>
+        <w:t xml:space="preserve"> From the 1950s onward, we compute the most cited references in the cluster (based on the number of citations per article, whether the article has one or ten sentences in the cluster). For instance, in the 1950s, one of the most important references within this cluster is John von Neumann and Oskar Morgenstern’s </w:t>
       </w:r>
       <w:r>
         <w:rPr>
@@ -2996,7 +2988,7 @@
         <w:rPr>
           <w:rtl w:val="0"/>
         </w:rPr>
-        <w:t xml:space="preserve"> community in the 1981-1988 window. As with the semantic clusters, for each bibliometric community in each temporal window we extract, notably, the sentences closest to the representative vectors—based on the articles belonging to the community—as well as the most cited references and the most identifying words. We also examine how each community in a given window originates (i.e., whether it derives primarily from the same or from different communities in preceding periods) and what it becomes in the following period (i.e., its subsequent “destiny”).</w:t>
+        <w:t xml:space="preserve"> community in the 1981-1988 window. As with the semantic clusters, for each bibliometric community in each temporal window we extract, equivalent indicators: the most identifying words, the sentences closest to the representative vectors—based on the articles belonging to the community—as well as the most cited references. We also examine the flows of each community in a given window: that is whether its nodes derive primarily from the same or from different communities in preceding periods (“origins”)  and what they become in the following period (“destinies”).</w:t>
       </w:r>
       <w:r>
         <w:rPr>
@@ -3153,7 +3145,7 @@
         <w:rPr>
           <w:rtl w:val="0"/>
         </w:rPr>
-        <w:t xml:space="preserve"> Cluster “History of Economic Thought &amp; Philosophy of Economics” also captures discussions about utility: arguments about utility were framed as interpretations, critiques, or extensions of classical authors—most notably Mill, Ricardo or Malthus. Yet, if anything, our results suggest that marginal utility theory appears mostly under severe criticism in this period, especially from institutionalist economists such as Thorstein Veblen, Wesley Mitchell, John Maurice Clark, and Rexford Tugwell.</w:t>
+        <w:t xml:space="preserve"> Cluster “History of Economic Thought &amp; Philosophy of Economics” also captures discussions about utility that were framed as interpretations, critiques, or extensions of classical authors—most notably Mill, Ricardo or Malthus. Yet, if anything, our results suggest that marginal utility theory appears mostly under severe criticism in this period, especially from institutionalist economists such as Thorstein Veblen, Wesley Mitchell, John Maurice Clark, and Rexford Tugwell.</w:t>
       </w:r>
       <w:r>
         <w:rPr>
@@ -3175,7 +3167,7 @@
         <w:rPr>
           <w:rtl w:val="0"/>
         </w:rPr>
-        <w:t xml:space="preserve">The criticism was directed along two main lines. First, as @giocoliModeling2003[48–50] points out, institutionalist economists rejected the “unfounded psychological underpinnings of neoclassical economics” and sought to replace them with sounder foundations [see also @yonayStruggle2001, 101-106]. They proposed instead to renew the economic method by drawing on psychology and its emerging “behaviorist” approach [@rutherfordInstitutional2001, 175–176]. Semantic cluster “Methodological Discussions” captures a significant share of sentences from 1900–1920 that articulate such institutionalist critiques. Institutionalists were energized by new developments in psychology. In his review of the literature on “Human Behavior and Economics,” Mitchell emphasized the growing interest of economists in psychological matters, which stemmed from “a somewhat tardy recognition that hedonism is unsound psychology, and that the economics of both Ricardo and Jevons originally rested on hedonistic preconceptions” [@mitchellHuman1914, 1]. For economics, the crucial issue was thus to choose “between providing a sounder psychological basis for our analysis, and holding that its psychological basis does not concern the economist” (2).</w:t>
+        <w:t xml:space="preserve">The criticism was directed along two main lines. First, as @giocoliModeling2003[48–50] points out, institutionalist economists rejected the “unfounded psychological underpinnings of neoclassical economics” and sought to replace them with sounder foundations [see also @yonayStruggle2001, 101-106]. They proposed instead to renew the economic method by drawing on psychology and its emerging “behaviorist” approach [@rutherfordInstitutional2001, 175–176]. From 1900–1920, the semantic cluster “Methodological Discussions” captures a significant share of sentences that address such institutionalist critiques. Institutionalists were energized by new developments in psychology. In his review of the literature on “Human Behavior and Economics,” Mitchell emphasized the growing interest of economists in psychological matters, which stemmed from “a somewhat tardy recognition that hedonism is unsound psychology, and that the economics of both Ricardo and Jevons originally rested on hedonistic preconceptions” [@mitchellHuman1914, 1]. For economics, the crucial issue was thus to choose “between providing a sounder psychological basis for our analysis, and holding that its psychological basis does not concern the economist” (2).</w:t>
       </w:r>
       <w:r>
         <w:rPr>
@@ -3220,7 +3212,7 @@
         <w:rPr>
           <w:rtl w:val="0"/>
         </w:rPr>
-        <w:t xml:space="preserve">Second, for institutionalist economists, institutions were indispensable for understanding economic behavior, and different institutions implied different behaviors; there was no single, context-independent </w:t>
+        <w:t xml:space="preserve">A second line of criticism held that institutions were indispensable for understanding economic behavior, and different institutions implied different behaviors; there was no single, context-independent </w:t>
       </w:r>
       <w:r>
         <w:rPr>
@@ -3279,7 +3271,7 @@
         <w:rPr>
           <w:rtl w:val="0"/>
         </w:rPr>
-        <w:t xml:space="preserve">While intertemporal semantic cluster “Utility Theory” constituted only a tiny share of sentences between 1900 and 1919, and was absent in the 1920s, it gains importance in the 1930s to the 1950s (though still representing less than 5% of all sentences). During this period, the heart of the debate concerned the measurability of utility and the opposition between “cardinal” and “ordinal” utility. In the 1930s, the debate still bore on the psychological dimension of utility measurement. In 1933, John Hicks and Roy Allen [-@hicksReconsideration1934] coauthored an article on demand analysis that eliminated marginal utility by appealing to the concept of the marginal rate of substitution—the slope of the indifference curve [see @moscatiMeasuring2019, 98–100]. Already in 1932, Allen had made this project explicit: by starting from “preferential discrimination,” or individuals’ preferences over different bundles of goods, it becomes unnecessary to “make any assumption about the existence of ‘total utility’ or about the measurability of ‘utility’; the hedonistic hypothesis has been rendered superfluous” [@allenFoundations1932, 207].</w:t>
+        <w:t xml:space="preserve">These transformations are visible in the intertemporal semantic semantic cluster “Utility Theory”. While it constituted only a tiny share of sentences between 1900 and 1919, and was absent in the 1920s, it gained importance in the 1930s to the 1950s (though still representing less than 5% of all sentences). During this period, the cluster captures the heart of the debate concerning the measurability of utility and the opposition between “cardinal” and “ordinal” utility. In the 1930s, the debate still bore on the psychological dimension of utility measurement. In 1933, John Hicks and Roy Allen [-@hicksReconsideration1934] coauthored an article on demand analysis that eliminated marginal utility by appealing to the concept of the marginal rate of substitution—the slope of the indifference curve [see also @moscatiMeasuring2019, 98–100]. Already in 1932, Allen had made this project explicit: by starting from “preferential discrimination,” or individuals’ preferences over different bundles of goods, it becomes unnecessary to “make any assumption about the existence of ‘total utility’ or about the measurability of ‘utility’; the hedonistic hypothesis has been rendered superfluous” [@allenFoundations1932, 207].</w:t>
       </w:r>
       <w:r>
         <w:rPr>
@@ -3308,7 +3300,7 @@
         <w:rPr>
           <w:rtl w:val="0"/>
         </w:rPr>
-        <w:t xml:space="preserve">in these debates, terms such as “introspection,” “satisfaction(s),” and “pleasure” recur frequently in the cluster during the 1930s and 1940s [see TF-IDF, and, for instance, </w:t>
+        <w:t xml:space="preserve">in the same cluster, terms such as “introspection,” “satisfaction(s),” and “pleasure” recur frequently during the 1930s and 1940s [see TF-IDF, and, for instance, </w:t>
       </w:r>
       <w:r>
         <w:rPr>
@@ -3320,7 +3312,7 @@
         <w:rPr>
           <w:rtl w:val="0"/>
         </w:rPr>
-        <w:t xml:space="preserve">. But they disappear from the top identifying words in the 1950s. During this period, debates on ordinal versus cardinal utility continued—with a renewed defense of the cardinalist position and ongoing disputes about the very meaning of “measuring utility” [@moscatiMeasuring2019, chapter 10]—yet these discussions had largely emancipated themselves from psychological or behaviorist considerations. These debates are also associated with a new intertemporal semantic cluster “Decision Theory”, distinct from the cluster “Utility Theory.” Appearing in the 1940s and expanding substantially during the 1950s—to nearly 8% of all sentences—this cluster centers on the formalization of agents’ preferences and choices. Here, we encounter what would become the standard vocabulary of decision theory: “individual orderings,” “preferences,” “decisions,” “transitive,” etc., and @vonneumannTheory1944, @friedmanUtility1948, and @savageFoundations1954 are the most cited references by the core articles of the cluster.  To complete this panorama, a separate cluster “Game Theory” emerges in the 1950s, which ultimately comes to represent nearly 15% of all sentences after 1990.</w:t>
+        <w:t xml:space="preserve">. But they disappeared from the top identifying words in the 1950s. During this period, debates on ordinal versus cardinal utility continued—with a renewed defense of the cardinalist position and ongoing disputes about the very meaning of “measuring utility” [@moscatiMeasuring2019, chapter 10]—yet these discussions had largely emancipated themselves from psychological or behaviorist considerations. These debates are also associated with a new intertemporal semantic cluster “Decision Theory”, distinct from the cluster “Utility Theory.” Appearing in the 1940s and expanding substantially during the 1950s—to nearly 8% of all sentences—this cluster centers on the formalization of agents’ preferences and choices. Here, we encounter what would become the standard vocabulary of decision theory: “individual orderings,” “preferences,” “decisions,” “transitive,” etc., and @vonneumannTheory1944, @friedmanUtility1948, and @savageFoundations1954 are the most cited references by the core articles of the cluster.  To complete this panorama, a separate cluster “Game Theory” emerged in the 1950s, which ultimately comes to represent nearly 15% of all sentences after 1990.</w:t>
       </w:r>
     </w:p>
     <w:p>
@@ -3345,7 +3337,7 @@
         <w:rPr>
           <w:rtl w:val="0"/>
         </w:rPr>
-        <w:t xml:space="preserve"> The cluster “Firm Theory &amp; Entrepreneur” spans the period from 1900 to 1979 and therefore provides a useful vantage point from which to trace how changing conceptions of rationality reshaped the treatment of firms’ decisions. In the 1920s, the cluster emphasizes entrepreneurial decision-making, understood primarily as prudence facing uncertainty rather than formal optimization. From the 1940s, this cluster increasingly centers on “profit maximization.” The cluster captures the core of the so-called “marginalist controversy” [@backhouseFriedmans2009], notably through </w:t>
+        <w:t xml:space="preserve"> For instance, the cluster “Firm Theory &amp; Entrepreneur” spans the period from 1900 to 1979 and therefore provides a useful vantage point from which to trace how changing conceptions of rationality reshaped the treatment of firms’ decisions. In the 1920s, the cluster emphasizes entrepreneurial decision-making, understood primarily as prudence facing uncertainty rather than formal optimization. From the 1940s, this cluster increasingly centers on “profit maximization.” The cluster captures the core of the so-called “marginalist controversy” [@backhouseFriedmans2009], notably through </w:t>
       </w:r>
       <w:r>
         <w:rPr>
@@ -3481,7 +3473,7 @@
         <w:rPr>
           <w:rtl w:val="0"/>
         </w:rPr>
-        <w:t xml:space="preserve">luster "Decision Theory”, the rational “decision making” is applied not only to individuals but also to firms and public policy. Social choice issues emerge in this cluster in the 1970s, notably through debates on the implications of Arrow’s impossibility theorem [-@arrowSocial1951; see e.g. @igersheimDeath2019].</w:t>
+        <w:t xml:space="preserve">luster “Decision Theory”, the rational “decision making” is applied not only to individuals but also to firms and public policy. Social choice issues emerge in this cluster in the 1970s, notably through debates on the implications of Arrow’s impossibility theorem [-@arrowSocial1951; see e.g. @igersheimDeath2019].</w:t>
       </w:r>
       <w:r>
         <w:rPr>
@@ -3529,7 +3521,7 @@
         <w:rPr>
           <w:rtl w:val="0"/>
         </w:rPr>
-        <w:t xml:space="preserve">We have seen how the meaning of rationality progressively transformed and formalized after the 1930s, and how the rationalization of collective decision-making became central in the postwar period. So far, however, we have said little about macroeconomics. Macro-oriented issues constituted a relatively important semantic cluster from the beginning of our period, in 1900, notably with the intertemporal semantic cluster “Monetary Policy &amp; Rational Expectations). This cluster grew in importance in the 1930s, in connection with debates surrounding Keynes’s work, liquidity preference, and unemployment. It is only in the 1970s, however, that this cluster becomes dominant in our panorama of rationality. This shift is closely linked to the emergence of the concept of “rational expectations,” which profoundly transformed the way rationality was discussed in economics.</w:t>
+        <w:t xml:space="preserve">We have seen how the meaning of rationality progressively transformed and formalized after the 1930s, and how the rationalization of collective decision-making became central in the postwar period. So far, however, we have said little about macroeconomics. Macro-oriented issues constituted a relatively important semantic cluster from the beginning of our period, in 1900, notably with the intertemporal semantic cluster “Monetary Policy &amp; Rational Expectations”. This cluster grew in importance in the 1930s, in connection with debates surrounding Keynes’s work, liquidity preference, and unemployment. It is only in the 1970s, however, that this cluster becomes dominant in our panorama of rationality. This shift is closely linked to the emergence of the concept of “rational expectations,” which profoundly transformed the way rationality was discussed in economics.</w:t>
       </w:r>
       <w:r>
         <w:rPr>
@@ -3570,7 +3562,7 @@
         <w:rPr>
           <w:rtl w:val="0"/>
         </w:rPr>
-        <w:t xml:space="preserve">ohenHayek2003]. After the 1940s, decision-making under uncertainty becomes a central theme, crystallized by works such as George @shackleTheory1942 on investment under radical uncertainty, which figures among the most representative articles.</w:t>
+        <w:t xml:space="preserve">ohenHayek2003]. After the 1940s, decision-making under uncertainty became a central theme, crystallized by works such as George @shackleTheory1942 on investment under radical uncertainty, which figures among the most representative articles.</w:t>
       </w:r>
       <w:r>
         <w:rPr>
@@ -3656,18 +3648,18 @@
         <w:rPr>
           <w:rtl w:val="0"/>
         </w:rPr>
-        <w:t xml:space="preserve"> much more prominent, accounting for more than 10% of all sentences. In this period, rationality is increasingly framed in formal decision-theoretic terms and focused on appropriate investment choices under uncertainty.  Hence, our analysis shows that rationality in finance enters primarily through corporate finance, rather than through asset-pricing issues such as market efficiency, where rationality long remains an implicit assumption, rarely discussed explicitly prior to the emergence of behavioral finance.</w:t>
-      </w:r>
-    </w:p>
-    <w:p>
-      <w:pPr>
-        <w:rPr/>
-      </w:pPr>
-      <w:r>
-        <w:rPr>
-          <w:rtl w:val="0"/>
-        </w:rPr>
-        <w:t xml:space="preserve">However, from the 1980s onward, modern asset pricing becomes dominant within the cluster “Capital &amp; Investment Theory” </w:t>
+        <w:t xml:space="preserve"> much more prominent, accounting for more than 10% of all sentences. In this period, rationality is increasingly framed in formal decision-theoretic terms and focused on appropriate investment choices under uncertainty.  Hence, our analysis suggests that rationality in finance enters primarily through corporate finance, rather than through asset pricing, where rationality seems to have  remained an implicit assumption, rarely discussed explicitly prior to the emergence of behavioral finance. </w:t>
+      </w:r>
+    </w:p>
+    <w:p>
+      <w:pPr>
+        <w:rPr/>
+      </w:pPr>
+      <w:r>
+        <w:rPr>
+          <w:rtl w:val="0"/>
+        </w:rPr>
+        <w:t xml:space="preserve">However, from the 1980s onward, modern asset pricing became dominant within the cluster “Capital &amp; Investment Theory” </w:t>
       </w:r>
       <w:r>
         <w:rPr>
@@ -3679,7 +3671,7 @@
         <w:rPr>
           <w:rtl w:val="0"/>
         </w:rPr>
-        <w:t xml:space="preserve">such as “assets,” “arbitrage,” and “capital asset pricing”. We also observe increasing proximities between the finance literature and the rational-expectations framework from the mid-1970s onward. This is visible both in the textual and bibliometric analysis, in particular with the “Finance: Market Information” bibliometric community, which emerges in the 1971-1978 window and focuses increasingly on rational expectations. A central contribution found in both semantic and bibliometric clusters is @grossmanImpossibility1980, which draws on Lucas’s imperfect-information framework [@lucasExpectations1972] and combines rational expectations with noisy signals to question market efficiency. </w:t>
+        <w:t xml:space="preserve">such as “assets,” “arbitrage,” and “capital asset pricing”. We also observe increasing proximities between the finance literature and the rational-expectations framework from the mid-1970s onward. This is visible both in the textual and bibliometric analysis, in particular with the “Finance: Market Information” bibliometric community, which emerged in the 1971-1978 window and focuses increasingly on rational expectations. A central contribution found in both semantic and bibliometric clusters is @grossmanImpossibility1980, which draws on Lucas’s imperfect-information framework [@lucasExpectations1972] and combines rational expectations with noisy signals to question market efficiency. </w:t>
       </w:r>
       <w:r>
         <w:rPr>
@@ -3701,7 +3693,7 @@
         <w:rPr>
           <w:rtl w:val="0"/>
         </w:rPr>
-        <w:t xml:space="preserve">The 1970s and 1980s thus marked a relative dominance of macroeconomics and finance, with comparatively less weight given to debates on individual rationality. This situation begins to change gradually from the 1980s onward. In the 1981-1988 bibliometric network, the community “</w:t>
+        <w:t xml:space="preserve">The 1970s and 1980s thus marked a relative dominance of macroeconomics and finance, with comparatively less weight given to debates on individual rationality. This situation began to change gradually from the 1980s onward. In the 1981-1988 bibliometric network, the community “</w:t>
       </w:r>
       <w:r>
         <w:rPr>
@@ -3736,7 +3728,19 @@
         <w:rPr>
           <w:rtl w:val="0"/>
         </w:rPr>
-        <w:t xml:space="preserve">We have sought here to offer a broad panorama of the major transformations in the concept of “rationality” in economics. This approach allows us to identify large-scale changes when they become visible in the data—namely, when particular clusters come to represent a significant share of sentences (or of the bibliometric networks). However, historians of economic thought are often concerned with understanding how such transformations came about: which contributions, authors, and communities played a decisive role. Addressing these questions requires a more focused perspective, tracing the evolution of specific topics and literatures. This is the aim of the next section, which moves beyond the panoramic view to provide a more detailed narrative of the rise of behavioral economics outlined above.</w:t>
+        <w:t xml:space="preserve">We have sought here to offer a broad panorama of the major transformations in the concept of “rationality” in economics. These results are largely consistent with an established historiography, although this approach could be particularly useful in less studied areas or to assess more </w:t>
+      </w:r>
+      <w:r>
+        <w:rPr>
+          <w:rtl w:val="0"/>
+        </w:rPr>
+        <w:t xml:space="preserve">accurately</w:t>
+      </w:r>
+      <w:r>
+        <w:rPr>
+          <w:rtl w:val="0"/>
+        </w:rPr>
+        <w:t xml:space="preserve"> the timing of change. Here, it allows us to identify large-scale changes when they become visible in the data—namely, when particular clusters come to represent a significant share of sentences (or of the bibliometric networks). For instance, we observe that the “social” dimension of rationality became prominent already in the 1930s, when the issue of “rationalising” economic processes and policy arose. Still, historians of economic thought are often concerned with uncovering how such transformations came about: which contributions, authors, and communities played a decisive role. Addressing these questions requires a more focused perspective, tracing the evolution of specific topics and literatures. This is the aim of the next section, which moves beyond the panoramic view to provide a more detailed narrative of the rise of behavioral economics outlined above.</w:t>
       </w:r>
     </w:p>
     <w:p>
@@ -3772,18 +3776,32 @@
         <w:rPr>
           <w:rtl w:val="0"/>
         </w:rPr>
-        <w:t xml:space="preserve">The divergent fates of Simon’s bounded rationality and Kahneman and Tversky’s heuristics-and-biases approach thus present a striking puzzle in the history of economic thought. Both challenged standard assumptions of rationality under the banner of behavioral economics, and both were ultimately recognized with Nobel Prizes, yet their patterns of reception and adoption differed. While our methods cannot identify the precise epistemological mechanisms behind this divergence, they allow us to trace and compare the trajectories of reception and influence of these two approaches, shedding light on how and when they followed different paths.</w:t>
-      </w:r>
-    </w:p>
-    <w:p>
-      <w:pPr>
-        <w:rPr/>
-      </w:pPr>
-      <w:r>
-        <w:rPr>
-          <w:rtl w:val="0"/>
-        </w:rPr>
-        <w:t xml:space="preserve">Our analysis suggests that Simon’s concept of “bounded rationality” stands as one of the most influential critiques of standard rationality in economics, particularly in its role in structuring debates about rationality itself. Simon’s work dominated discussions in the 1960s and 1970s, with his seminal articles [@simonBehavioral1955; @simonTheories1959] and his Nobel lecture [@simonRational1979] appearing across a wide range of research areas, from social choice theory to the theory of the firm and price setting. The textual analysis highlights Simon’s conceptual centrality. Semantic cluster “Rationality &amp; its Limits” undergoes a marked transformation following the rise of Simon’s influence. In the 1950s, the discourse was centered on terms such as “rational behavior,” “rationalization,” and “irrationality.” By the 1970s, “bounded rationality” had become one the most prevalent expression in the cluster, and by the 1990s, references to “boundedly rational agents” and “procedural rationality” clearly positioned Simon’s concepts at the core of economic discussions, reflecting a delayed but substantial integration into the discipline.</w:t>
+        <w:t xml:space="preserve">Why did these two closely conceptually-related research programs follow such different trajectories and levels of influence in economics?  Both challenged standard assumptions of rationality under the banner of behavioral economics, and both were ultimately recognized with Nobel Prizes, yet their patterns of reception and adoption differed. While our methods cannot identify the comprehensive mechanisms behind this divergence, they allow us to trace and compare the trajectories of reception and influence of these two approaches, shedding light on how and when they followed different paths.</w:t>
+      </w:r>
+    </w:p>
+    <w:p>
+      <w:pPr>
+        <w:rPr/>
+      </w:pPr>
+      <w:r>
+        <w:rPr>
+          <w:rtl w:val="0"/>
+        </w:rPr>
+        <w:t xml:space="preserve">Our analysis suggests that Simon’s concept of “bounded rationality” stands as one of the most influential critiques of standard rationality in economics, particularly in its role in structuring debates about rationality itself. Simon’s work dominated discussions in the 1960s and 1970s, with his seminal articles [@simonBehavioral1955; @simonTheories1959] and his Nobel lecture [@simonRational1979] appearing across a wide range of research areas, from social choice theory to the theory of the firm and price setting. The textual analysis highlights Simon’s conceptual centrality. The semantic cluster “Rationality &amp; its Limits” undergoes a marked transformation following the rise of Simon’s influence. In the 1950s, the TF-IDF</w:t>
+      </w:r>
+      <w:r>
+        <w:rPr>
+          <w:b w:val="1"/>
+          <w:bCs w:val="1"/>
+          <w:rtl w:val="0"/>
+        </w:rPr>
+        <w:t xml:space="preserve"> </w:t>
+      </w:r>
+      <w:r>
+        <w:rPr>
+          <w:rtl w:val="0"/>
+        </w:rPr>
+        <w:t xml:space="preserve">associated with this cluster was centered on terms such as “rational behavior,” “rationalization,” and “irrationality.” By the 1970s, “bounded rationality” had become one the most prevalent expressions in the cluster, and by the 1990s, references to “boundedly rational agents” and “procedural rationality” clearly positioned Simon’s concepts at the core of economic discussions, reflecting a delayed but substantial integration into the discipline.</w:t>
       </w:r>
     </w:p>
     <w:p>
@@ -3805,18 +3823,18 @@
         <w:rPr>
           <w:rtl w:val="0"/>
         </w:rPr>
-        <w:t xml:space="preserve">However, Simon’s influence remained limited in two critical respects. First, the slow diffusion of his framework meant that, by the time it achieved broad conceptual prominence, it faced direct competition from “new” behavioral economics, present in semantic clusters “Decision Theory” and “Decision Under Uncertainty”, as well as in “Consumption, Savings &amp; Intertemporal Choice” and “Game Theory”. All of these four clusters expanded rapidly in the 1980s, with most of them individually surpassing cluster “Rationality &amp; its Limits” in their share of sentences. Although these strands incorporated elements of bounded rationality, they did so primarily through the conceptual tools of “new” behavioral economics—ranging from prospect theory in the analysis of risk to experimental paradigms such as the ultimatum game in game theory [@gualaParadigmatic2008].</w:t>
-      </w:r>
-    </w:p>
-    <w:p>
-      <w:pPr>
-        <w:rPr/>
-      </w:pPr>
-      <w:r>
-        <w:rPr>
-          <w:rtl w:val="0"/>
-        </w:rPr>
-        <w:t xml:space="preserve">Second, Simon's conceptual influence, spearheaded by bounded rationality, never translated into stable research communities. While his framework shaped how many economists approached rationality, very few actually developed the research program he initiated. Bibliometrically, only small, unstable communities formed around Simon's work. In the 1960s and early 1970s, his ideas appeared in </w:t>
+        <w:t xml:space="preserve">However, Simon’s influence remained limited in two critical respects. First, the slow diffusion of his framework meant that, by the time it achieved broad conceptual prominence, it faced direct competition from “new” behavioral economics, present in the semantic clusters “Decision Theory” and “Decision Under Uncertainty”, as well as in “Consumption, Savings &amp; Intertemporal Choice” and “Game Theory”. All of these four clusters expanded rapidly in the 1980s, with most of them individually surpassing cluster “Rationality &amp; its Limits” in their share of sentences. Although these strands incorporated elements of bounded rationality, they did so primarily through the conceptual tools of “new” behavioral economics—ranging from prospect theory in the analysis of risk to experimental paradigms such as the ultimatum game in game theory [@gualaParadigmatic2008].</w:t>
+      </w:r>
+    </w:p>
+    <w:p>
+      <w:pPr>
+        <w:rPr/>
+      </w:pPr>
+      <w:r>
+        <w:rPr>
+          <w:rtl w:val="0"/>
+        </w:rPr>
+        <w:t xml:space="preserve">Second, Simon's conceptual influence, spearheaded by bounded rationality, never translated into stable bibliometric communities. While his framework shaped how many economists approached rationality, very few actually developed the research program he initiated. In our bibliometric networks, only small, unstable communities formed around Simon's work. In the 1960s and early 1970s, his ideas appeared in </w:t>
       </w:r>
       <w:r>
         <w:rPr>
@@ -3878,7 +3896,7 @@
         <w:rPr>
           <w:rtl w:val="0"/>
         </w:rPr>
-        <w:t xml:space="preserve">). Together, Simon, Winter, Cyert, and Leibenstein formed a diverse organizational theory critique of how rationality, especially through profit maximization, is employed in economics. While this collective movement had some momentum, none of these research had an individual effect on economics structure [see also @sent_behavioral_2004]. After 1969-1976, these different research streams coalesced into small short-lived community (</w:t>
+        <w:t xml:space="preserve">). Together, Simon, Winter, Cyert, and Leibenstein formed a diverse organizational theory critique of how rationality, especially through profit maximization, is employed in economics. While this collective movement had some momentum, none of these research had an individual effect on economics structure [see also @sent_behavioral_2004]. After 1969-1976, these different research streams coalesced into a small short-lived community (</w:t>
       </w:r>
       <w:r>
         <w:rPr>
@@ -3972,7 +3990,7 @@
         <w:rPr>
           <w:rtl w:val="0"/>
         </w:rPr>
-        <w:t xml:space="preserve">) without ever achieving the critical mass. While Simon’s influence in economics was conceptually enduring, it remained marginal as a structuring force, unable to generate coherent, large and stable research communities.</w:t>
+        <w:t xml:space="preserve">) without ever achieving the critical mass. While Simon’s influence in economics was conceptually enduring, it remained marginal and  unable to generate coherent, large and stable bibliometric communities.</w:t>
       </w:r>
     </w:p>
     <w:p>
@@ -4123,13 +4141,31 @@
         <w:rPr>
           <w:rtl w:val="0"/>
         </w:rPr>
-        <w:t xml:space="preserve">The contrast is stark and raises fundamental questions about disciplinary reception. Our quantitative study yields two particularly surprising results regarding the contrasting influence of Kahneman and Simon. First, the temporal patterns of adoption differ radically. For the historian @heukelomBehavioral2014, a pivotal moment in the history of behavioral economics was the explicit creation of research programs within the Sloan and Russell Sage Foundations between 1984 and 1992, notably fostering the Kahneman–Thaler collaboration that decisively transformed the field’s trajectory. Our analysis, however, suggests that a distinctive dynamic was already underway by the early 1980s in the reception of Kahneman and Tversky’s work. Despite the fact that @kahnemanProspect1979 was the duo’s only publication in an economics journal until 1985—well before the Sloan–Russell Sage programs formally institutionalized behavioral economics—prospect theory experienced rapid and sustained citation growth (@fig-rationality-paper-citations). </w:t>
-      </w:r>
-      <w:r>
-        <w:rPr>
-          <w:rtl w:val="0"/>
-        </w:rPr>
-        <w:t xml:space="preserve">This aligns with a general finding in scientometrics that citations in the first two years after publication explain more than half of the variation in cumulative citations [@sternHighRanked2014]. While the institutional structures that came after played an important role in the subsequent reception of the research program as a whole, it is important to recognize how the reception of Kahneman and Tversky’s differ greatly in the couple of years after publication. Moreover, </w:t>
+        <w:t xml:space="preserve">Our quantitative study suggests two </w:t>
+      </w:r>
+      <w:r>
+        <w:rPr>
+          <w:rtl w:val="0"/>
+        </w:rPr>
+        <w:t xml:space="preserve">points regarding</w:t>
+      </w:r>
+      <w:r>
+        <w:rPr>
+          <w:rtl w:val="0"/>
+        </w:rPr>
+        <w:t xml:space="preserve"> the contrasting influence of Kahneman and Simon. First, the temporal patterns of adoption differ radically. For the historian @heukelomBehavioral2014, a pivotal moment in the history of behavioral economics was the explicit creation of research programs within the Sloan and Russell Sage Foundations between 1984 and 1992, notably fostering the Kahneman–Thaler collaboration that decisively transformed the field’s trajectory. Our analysis, however, suggests that a distinctive dynamic was already underway by the early 1980s in the reception of Kahneman and Tversky’s work. Despite the fact that @kahnemanProspect1979 was the duo’s only publication in an economics journal until 1985—well before the Sloan–Russell Sage programs formally institutionalized behavioral economics—prospect theory experienced rapid and sustained citation growth (@fig-rationality-paper-citations).</w:t>
+      </w:r>
+      <w:r>
+        <w:rPr>
+          <w:vertAlign w:val="superscript"/>
+        </w:rPr>
+        <w:footnoteReference w:customMarkFollows="0" w:id="36"/>
+      </w:r>
+      <w:r>
+        <w:rPr>
+          <w:rtl w:val="0"/>
+        </w:rPr>
+        <w:t xml:space="preserve"> Moreover, </w:t>
       </w:r>
       <w:r>
         <w:rPr>
@@ -4147,18 +4183,18 @@
         <w:rPr>
           <w:rtl w:val="0"/>
         </w:rPr>
-        <w:t xml:space="preserve"> an autonomous cluster structured around their work (cl_391), indicating that the article not only attracted citations but quickly catalyzed new research strands, in a way Simon’s work never did within economics [@heukelom_sense_2012].</w:t>
-      </w:r>
-    </w:p>
-    <w:p>
-      <w:pPr>
-        <w:rPr/>
-      </w:pPr>
-      <w:r>
-        <w:rPr>
-          <w:rtl w:val="0"/>
-        </w:rPr>
-        <w:t xml:space="preserve">The second surprising finding concerns the relationship between “old” and “new” behavioral economics. Contrary to narratives of rupture or forgetting, citations to @simonBehavioral1955 have never been as high as during the rise of new behavioral economics—a paradoxical pattern given recurrent claims that the field has neglected its intellectual roots. @earlPrinciples2022 criticizes this apparent amnesia:</w:t>
+        <w:t xml:space="preserve"> an autonomous cluster structured around their work (cl_391), indicating that the article not only attracted citations but quickly catalyzed new research strands, in a way Simon’s work never did within economics [@heukelom_sense_2012]. Hence, while the institutional structures that came after played an important role in the subsequent reception of the research program as a whole, the reception of Kahneman and Tversky’s seminal paper was already important just after its publication. </w:t>
+      </w:r>
+    </w:p>
+    <w:p>
+      <w:pPr>
+        <w:rPr/>
+      </w:pPr>
+      <w:r>
+        <w:rPr>
+          <w:rtl w:val="0"/>
+        </w:rPr>
+        <w:t xml:space="preserve">The second point concerns the relationship between “old” and “new” behavioral economics. Contrary to narratives of rupture or forgetting, citations to @simonBehavioral1955 have never been as high as during the rise of new behavioral economics—a paradoxical pattern given recurrent claims that the field has neglected its intellectual roots. @earlPrinciples2022 criticizes this apparent amnesia:</w:t>
       </w:r>
     </w:p>
     <w:p>
@@ -4198,13 +4234,15 @@
     </w:p>
     <w:p>
       <w:pPr>
-        <w:rPr/>
-      </w:pPr>
-      <w:r>
-        <w:rPr>
-          <w:rtl w:val="0"/>
-        </w:rPr>
-        <w:t xml:space="preserve">A favorable interpretation holds that “new” behavioral economics has genuinely revived previously abandoned research directions, moving toward a reconciliation with earlier strands—a trajectory explicitly advocated by @sentRationality2008 and more recently by @earlPrinciples2022. A more critical reading emphasizes intellectual appropriation, whereby classic references are selectively reframed to fit the new agenda, renewing interest but through a biased and presentist lens, as Mongin has argued in the case of Allais [@monginAllais2019]. </w:t>
+        <w:rPr>
+          <w:ins w:author="Thomas Delcey" w:id="0" w:date="2026-05-13T14:54:05Z"/>
+        </w:rPr>
+      </w:pPr>
+      <w:r>
+        <w:rPr>
+          <w:rtl w:val="0"/>
+        </w:rPr>
+        <w:t xml:space="preserve">A favorable interpretation holds that “new” behavioral economics has genuinely revived abandoned research directions, moving toward a reconciliation with earlier strands—a trajectory explicitly advocated by @sentRationality2008 and more recently by @earlPrinciples2022. A more critical reading emphasizes intellectual appropriation, whereby classic references are selectively reframed to fit the new agenda, renewing interest but through a biased and presentist lens, as Mongin has argued in the case of Allais [@monginAllais2019]. </w:t>
       </w:r>
       <w:r>
         <w:rPr>
@@ -4216,41 +4254,163 @@
         <w:rPr>
           <w:rtl w:val="0"/>
         </w:rPr>
-        <w:t xml:space="preserve"> (see @vranasGigerenzers2000 for an analysis of Simon’s inspired criticisms towards “new” behavioral economics).</w:t>
-      </w:r>
-    </w:p>
-    <w:p>
-      <w:pPr>
-        <w:rPr/>
-      </w:pPr>
-      <w:r>
-        <w:rPr>
-          <w:rtl w:val="0"/>
-        </w:rPr>
-        <w:t xml:space="preserve">Although a definitive assessment would require closer qualitative analysis, our quantitative findings  tentatively support the second interpretation. First, we find no evidence of a backlash against "old" behavioral economics, either qualitatively or quantitatively. </w:t>
-      </w:r>
-      <w:r>
-        <w:rPr>
-          <w:rtl w:val="0"/>
-        </w:rPr>
-        <w:t xml:space="preserve">The clearest example of negative citation patterns in our network is that of behavioral finance economists toward Eugene Fama's work, which functions as an explicit critical benchmark</w:t>
-      </w:r>
-      <w:r>
-        <w:rPr>
-          <w:rtl w:val="0"/>
-        </w:rPr>
-        <w:t xml:space="preserve"> (e.g., the 2002–2009 coupling cluster "Finance: Behavioral Finance"). We observe no such patterns in other behavioral economics clusters (see @trucForty2022 for more on this topic). Second, we find no evidence of a revival of “old” behavioral economics either. While citations to “old” behavioral economics references increased, they are not structurally central to any identified behavioral economics cluster (e.g., the 2002–2009 coupling cluster "Behavioral Economics: Risk &amp; Uncertainty"). Nor do we identify any cluster organized around a distinct behavioral approach closer to “old” behavioral economics. We find no “old” behavioral economics sub-specialty analogous to game theory, behavioral finance, or pro-social behavior which suggests a widespread diffusion rather than the formation of a structured approach. Most concepts associated with "old" behavioral economics are absent from "new" behavioral economists' vocabulary (e.g., the 2000–2009 semantic clusters "Game Theory" and "Decision Theory"), and where such concepts do appear, they are largely confined to institutionalist or heterodox clusters (e.g., the 2000–2009 semantic cluster "Rationality and its Limits"). </w:t>
-      </w:r>
-    </w:p>
-    <w:p>
-      <w:pPr>
-        <w:rPr/>
-      </w:pPr>
-      <w:r>
-        <w:rPr>
-          <w:rtl w:val="0"/>
-        </w:rPr>
-        <w:t xml:space="preserve">Taken together, the sparse and weakly structured citation patterns associated with “old” behavioral economics combined with the fact that contemporary discussions of rationality are increasingly framed through the concepts of “new” behavioral and experimental economics point toward appropriation rather than genuine integration. “Old” behavioral economists are invoked alongside canonical figures such as Adam Smith or Allais to anchor “new” behavioral economics within a longer tradition of criticism of standard rationality (e.g., the 2002–2009 coupling cluster "Behavioral Economics: Social Preferences"). Simon's influence thus persists primarily as a symbolic and framing reference, useful for situating debates and reconstructing intellectual lineages, while his substantive framework remains only superficially incorporated. Although a definitive assessment requires both closer qualitative analysis and targeted quantitative studies (such as tracing more precisely “old” behavioral economics influence), our work offers a roadmap for future research into the complex, ambivalent relationship between 'old' and 'new' behavioral economics.</w:t>
+        <w:t xml:space="preserve"> [@vranasGigerenzers2000].</w:t>
+      </w:r>
+      <w:ins w:author="Thomas Delcey" w:id="0" w:date="2026-05-13T14:54:05Z">
+        <w:commentRangeStart w:id="0"/>
+        <w:r>
+          <w:rPr>
+            <w:rtl w:val="0"/>
+          </w:rPr>
+        </w:r>
+      </w:ins>
+    </w:p>
+    <w:p>
+      <w:pPr>
+        <w:rPr/>
+      </w:pPr>
+      <w:ins w:author="Thomas Delcey" w:id="0" w:date="2026-05-13T14:54:05Z">
+        <w:commentRangeStart w:id="0"/>
+        <w:commentRangeEnd w:id="0"/>
+        <w:r>
+          <w:commentReference w:id="0"/>
+        </w:r>
+        <w:r>
+          <w:rPr>
+            <w:rtl w:val="0"/>
+            <w:rPrChange w:author="Thomas Delcey" w:id="1" w:date="2026-05-13T14:54:05Z">
+              <w:rPr/>
+            </w:rPrChange>
+          </w:rPr>
+          <w:t xml:space="preserve">A definitive assessment requires both closer qualitative analysis and targeted quantitative studies (such as tracing more precisely “old” behavioral economics influence). But our work already offers a roadmap for future research into the ambivalent relationship between “old” and “new” behavioral economics. The sparse and weakly structured citation patterns associated with “old” behavioral economics that we observed point toward appropriation rather than genuine integration. Our bibliometric networks show that neither Simon nor researchers associated with his ideas formed stable communities or structured those of “new” behavioral economics. Most concepts associated with “old” behavioral economics are absent from “new” behavioral economists’ vocabulary (e.g., the 2000–2009 semantic clusters “Game Theory” and “Decision Theory”), and where such concepts do appear, they are largely confined to institutionalist or heterodox clusters (e.g., the 2000–2009 semantic cluster “Rationality and its Limits”). “Old” behavioral economists are invoked alongside canonical figures such as Adam Smith or Allais to anchor “new” behavioral economics within a longer tradition of criticism of standard rationality (e.g., the 2002–2009 coupling cluster “Behavioral Economics: Social Preferences”). Simon’s influence thus persists primarily as a symbolic and framing reference, useful for situating debates and reconstructing intellectual lineages, while his substantive framework remains only superficially incorporated. </w:t>
+        </w:r>
+      </w:ins>
+      <w:r>
+        <w:rPr>
+          <w:rtl w:val="0"/>
+        </w:rPr>
+      </w:r>
+    </w:p>
+    <w:p>
+      <w:pPr>
+        <w:rPr>
+          <w:del w:author="Thomas Delcey" w:id="2" w:date="2026-05-13T14:25:39Z"/>
+        </w:rPr>
+      </w:pPr>
+      <w:del w:author="Thomas Delcey" w:id="2" w:date="2026-05-13T14:25:39Z">
+        <w:commentRangeStart w:id="1"/>
+        <w:r>
+          <w:rPr>
+            <w:rtl w:val="0"/>
+          </w:rPr>
+          <w:delText xml:space="preserve"> </w:delText>
+        </w:r>
+        <w:r>
+          <w:rPr>
+            <w:rtl w:val="0"/>
+          </w:rPr>
+          <w:delText xml:space="preserve">First, we find no evidence of </w:delText>
+        </w:r>
+      </w:del>
+      <w:ins w:author="Thomas Delcey" w:id="2" w:date="2026-05-13T14:25:39Z">
+        <w:del w:author="Thomas Delcey" w:id="2" w:date="2026-05-13T14:25:39Z">
+          <w:commentRangeEnd w:id="1"/>
+          <w:r>
+            <w:commentReference w:id="1"/>
+          </w:r>
+          <w:r>
+            <w:rPr>
+              <w:rtl w:val="0"/>
+            </w:rPr>
+            <w:delText xml:space="preserve">negative citations toward  </w:delText>
+          </w:r>
+        </w:del>
+      </w:ins>
+      <w:del w:author="Thomas Delcey" w:id="2" w:date="2026-05-13T14:25:39Z">
+        <w:r>
+          <w:rPr>
+            <w:rtl w:val="0"/>
+          </w:rPr>
+          <w:delText xml:space="preserve">a backlash against “old” behavioral economics, either qualitatively or quantitatively </w:delText>
+        </w:r>
+        <w:commentRangeStart w:id="2"/>
+        <w:r>
+          <w:rPr>
+            <w:rtl w:val="0"/>
+          </w:rPr>
+          <w:delText xml:space="preserve">The clearest example of negative citation patterns in our network is that of behavioral finance economists toward Eugene Fama's work, which functions as an explicit critical benchmark</w:delText>
+        </w:r>
+        <w:r>
+          <w:rPr>
+            <w:rtl w:val="0"/>
+          </w:rPr>
+          <w:delText xml:space="preserve"> (e.g., the 2002–2009 coupling cluster "Finance: Behavioral Finance"). </w:delText>
+        </w:r>
+        <w:commentRangeEnd w:id="2"/>
+        <w:r>
+          <w:commentReference w:id="2"/>
+        </w:r>
+        <w:r>
+          <w:rPr>
+            <w:rtl w:val="0"/>
+          </w:rPr>
+          <w:delText xml:space="preserve">We observe no such patterns in other behavioral economics clusters</w:delText>
+        </w:r>
+        <w:r>
+          <w:rPr>
+            <w:rtl w:val="0"/>
+          </w:rPr>
+          <w:delText xml:space="preserve"> (see also @trucForty2022). Second, we find no evidence of a revival of “old” behavioral economics either. While citations to “old” behavioral economics references increased, they are not structurally central to any identified behavioral economics cluster (e.g., the 2002–2009 coupling cluster “Behavioral Economics: Risk &amp; Uncertainty”). Nor do we identify any cluster organized around a distinct behavioral approach closer to “old” behavioral economics</w:delText>
+        </w:r>
+      </w:del>
+      <w:ins w:author="Thomas Delcey" w:id="3" w:date="2026-05-13T13:54:31Z">
+        <w:del w:author="Thomas Delcey" w:id="2" w:date="2026-05-13T14:25:39Z">
+          <w:r>
+            <w:rPr>
+              <w:rtl w:val="0"/>
+            </w:rPr>
+            <w:delText xml:space="preserve">,</w:delText>
+          </w:r>
+        </w:del>
+      </w:ins>
+      <w:del w:author="Thomas Delcey" w:id="2" w:date="2026-05-13T14:25:39Z">
+        <w:r>
+          <w:rPr>
+            <w:rtl w:val="0"/>
+          </w:rPr>
+          <w:delText xml:space="preserve">. We find no “old” behavioral economics sub-specialty analogous to game theory, behavioral finance, or pro-social behavior </w:delText>
+        </w:r>
+        <w:r>
+          <w:rPr>
+            <w:rtl w:val="0"/>
+          </w:rPr>
+          <w:delText xml:space="preserve">which suggests a widespread diffusion rather than the formation of a structured approach. Most concepts associated with “old” behavioral economics are absent from “new” behavioral economists’ vocabulary (e.g., the 2000–2009 semantic clusters “Game Theory” and “Decision Theory”), and where such concepts do appear, they are largely confined to institutionalist or heterodox clusters (e.g., the 2000–2009 semantic cluster “Rationality and its Limits”). </w:delText>
+        </w:r>
+      </w:del>
+    </w:p>
+    <w:p>
+      <w:pPr>
+        <w:rPr/>
+      </w:pPr>
+      <w:del w:author="Thomas Delcey" w:id="2" w:date="2026-05-13T14:25:39Z">
+        <w:r>
+          <w:rPr>
+            <w:rtl w:val="0"/>
+          </w:rPr>
+          <w:delText xml:space="preserve">Taken together, the sparse and weakly structured citation patterns associated with “old” behavioral economics combined with the fact that contemporary discussions of rationality are increasingly framed through the concepts of “new” behavioral and experimental economics point toward appropriation rather than genuine integration. “Old” behavioral economists are invoked alongside canonical figures such as Adam Smith or Allais to anchor “new” behavioral economics within a longer tradition of criticism of standard rationality (e.g., the 2002–2009 coupling cluster “Behavioral Economics: Social Preferences”). Simon's influence thus persists primarily as a symbolic and framing reference, useful for situating debates and reconstructing intellectual lineages, while his substantive framework remains only superficially incorporated. </w:delText>
+        </w:r>
+        <w:r>
+          <w:rPr>
+            <w:rtl w:val="0"/>
+          </w:rPr>
+          <w:delText xml:space="preserve">Although a definitive assessment requires both closer qualitative analysis and targeted quantitative studies (such as tracing more precisely “old” behavioral economics influence), our work offers a roadmap for future research into the complex, ambivalent relationship between 'old' and 'new' behavioral economics</w:delText>
+        </w:r>
+      </w:del>
+      <w:r>
+        <w:rPr>
+          <w:rtl w:val="0"/>
+        </w:rPr>
+        <w:t xml:space="preserve">.</w:t>
       </w:r>
       <w:r>
         <w:rPr>
@@ -4266,8 +4426,8 @@
           <w:bCs w:val="1"/>
         </w:rPr>
         <w:sectPr>
-          <w:headerReference r:id="rId9" w:type="default"/>
-          <w:footerReference r:id="rId10" w:type="default"/>
+          <w:headerReference r:id="rId8" w:type="default"/>
+          <w:footerReference r:id="rId9" w:type="default"/>
           <w:pgSz w:h="16834" w:w="11909" w:orient="portrait"/>
           <w:pgMar w:bottom="1440" w:top="1440" w:left="1440" w:right="1440" w:header="720" w:footer="720"/>
           <w:pgNumType w:start="1"/>
@@ -4294,131 +4454,143 @@
         </w:rPr>
         <w:t xml:space="preserve">This article is first and foremost methodological: it aims to demonstrate, through a concrete application, the usefulness of quantitative methods for the history of economic thought. Nonetheless, it does so by breaking new ground in the history and philosophy of economics. First, the corpus we build—comprising nearly 290,000 full-text economics articles spanning more than a century—is, to our knowledge, the largest and most comprehensive database ever used to study economic contributions in English. Second, this article constitutes the first application of quantitative methods to the study of “semantic change” within the history of economics, an area that represents an important and growing strand of the literature on quantitative text analysis [@montanelliSurvey2024].</w:t>
       </w:r>
-    </w:p>
-    <w:p>
-      <w:pPr>
-        <w:rPr/>
-      </w:pPr>
-      <w:r>
-        <w:rPr>
-          <w:rtl w:val="0"/>
-        </w:rPr>
-        <w:t xml:space="preserve">Our approach allows us to identify, within this corpus, the sentences most closely associated with the words “rational” and “rationality” and, by extension, the articles most likely to engage with rationality in one way or another. By allowing the algorithms to identify dozens of semantic clusters and bibliometric communities within short temporal windows (eight years or a decade), and by then aggregating these groupings over time and characterizing them through multiple indicators, we can conduct analyses at different scales. This makes it possible both to </w:t>
-      </w:r>
-      <w:r>
-        <w:rPr>
-          <w:i w:val="1"/>
-          <w:iCs w:val="1"/>
-          <w:rtl w:val="0"/>
-        </w:rPr>
-        <w:t xml:space="preserve">zoom out</w:t>
-      </w:r>
-      <w:r>
-        <w:rPr>
-          <w:rtl w:val="0"/>
-        </w:rPr>
-        <w:t xml:space="preserve">, by examining the overall configuration of clusters across periods, and to </w:t>
-      </w:r>
-      <w:r>
-        <w:rPr>
-          <w:i w:val="1"/>
-          <w:iCs w:val="1"/>
-          <w:rtl w:val="0"/>
-        </w:rPr>
-        <w:t xml:space="preserve">zoom in</w:t>
-      </w:r>
-      <w:r>
-        <w:rPr>
-          <w:rtl w:val="0"/>
-        </w:rPr>
-        <w:t xml:space="preserve">, by focusing on subsets of clusters more directly concerned with rationality. As shown in the previous section, a panoramic view that considers all semantic clusters may initially include groups that appear only loosely connected to rationality—especially in the early decades. While examining these clusters can be informative for understanding the broader intellectual context, the analyst can also foreground more explicitly rationality-oriented clusters when addressing more targeted research questions. This flexibility is only possible because the initial corpus is sufficiently inclusive, reducing the risk of overlooking relevant developments. More generally, our approach allows the scale of analysis to be adjusted to the question at hand, rather than imposing it ex ante.</w:t>
-      </w:r>
-      <w:r>
-        <w:rPr>
-          <w:rtl w:val="0"/>
-        </w:rPr>
-      </w:r>
-    </w:p>
-    <w:p>
-      <w:pPr>
-        <w:rPr/>
-      </w:pPr>
-      <w:r>
-        <w:rPr>
-          <w:rtl w:val="0"/>
-        </w:rPr>
-        <w:t xml:space="preserve">We want to conclude by drawing several general methodological and historiographic claims from the approaches developed in this article.</w:t>
-      </w:r>
-    </w:p>
-    <w:p>
-      <w:pPr>
-        <w:rPr/>
-      </w:pPr>
-      <w:r>
-        <w:rPr>
-          <w:rtl w:val="0"/>
-        </w:rPr>
-        <w:t xml:space="preserve">First, although quantitative methods in the history and philosophy of economics have been applied mainly to the postwar—and often post-1970s—period, our study shows that they can also be used effectively for earlier periods. Despite problems of text recognition in JSTOR articles prior to the 1930s, our methods nonetheless provide a fine-grained depiction of economic debates in the early twentieth century. In particular, we were able to recover most of the institutionalist contributions on rationality highlighted by @rutherfordInstitutionalist2013 and @yonayStruggle2001. At the same time, our results bring to light additional contributions not covered in these accounts, thereby opening avenues for further inquiry. Of course, some important works remain absent because they were published as books rather than journal articles. This limitation suggests that extending the corpus to include books would be a worthwhile direction for future research.</w:t>
-      </w:r>
-    </w:p>
-    <w:p>
-      <w:pPr>
-        <w:rPr/>
-      </w:pPr>
-      <w:r>
-        <w:rPr>
-          <w:rtl w:val="0"/>
-        </w:rPr>
-        <w:t xml:space="preserve">Second, a key property of groupings produced by unsupervised methods is that they bring together documents that share cognitive content without presupposing agreement. The texts clustered together address the same objects or problems, but they may do so in divergent, and sometimes opposing, ways. As a result, our methods make it possible to identify sites of resistance to dominant models or ideas. What emerges most clearly are the objects that attract sustained attention; within those sites, one can then examine who endorses, revises, or contests particular ways of treating them. This feature opens the way to a more “symmetrical” historical analysis [@bloor1976], one that gives analytical weight not only to intellectual “winners” but also to those whose positions did not ultimately prevail.</w:t>
-      </w:r>
-    </w:p>
-    <w:p>
-      <w:pPr>
-        <w:rPr/>
-      </w:pPr>
-      <w:r>
-        <w:rPr>
-          <w:rtl w:val="0"/>
-        </w:rPr>
-        <w:t xml:space="preserve">Finally, these methods are also “discovery tools.” While they can be used to confirm or challenge existing claims in the history and philosophy of economics, they also help identify patterns that have so far been absent—or only marginally present—in the historical literature. </w:t>
-      </w:r>
-      <w:r>
-        <w:rPr>
-          <w:rtl w:val="0"/>
-        </w:rPr>
-        <w:t xml:space="preserve">We have briefly pointed to some of these patterns above.</w:t>
-      </w:r>
-      <w:r>
-        <w:rPr>
-          <w:rtl w:val="0"/>
-        </w:rPr>
-        <w:t xml:space="preserve"> By making available an [</w:t>
-      </w:r>
-      <w:r>
-        <w:rPr>
-          <w:rtl w:val="0"/>
-        </w:rPr>
-        <w:t xml:space="preserve">interactive application](https://019adac8-81d4-aa0e-808c-08861c261fd2.share.connect.posit.cloud/) </w:t>
-      </w:r>
-      <w:r>
-        <w:rPr>
-          <w:rtl w:val="0"/>
-        </w:rPr>
-        <w:t xml:space="preserve">to explore our results, we hope to encourage readers to pursue their own paths of discovery within the corpus</w:t>
-      </w:r>
-      <w:ins w:author="Thomas Delcey" w:id="6" w:date="2026-05-12T14:00:55Z">
+      <w:ins w:author="Thomas Delcey" w:id="4" w:date="2026-05-13T14:12:22Z">
         <w:r>
           <w:rPr>
             <w:rtl w:val="0"/>
           </w:rPr>
-          <w:t xml:space="preserve"> and those methods</w:t>
+          <w:t xml:space="preserve">Third, we also provide a LLM-base measure, with a time component, to select corpora that goes beyond raw set of keyword.</w:t>
         </w:r>
       </w:ins>
       <w:r>
         <w:rPr>
           <w:rtl w:val="0"/>
         </w:rPr>
-        <w:t xml:space="preserve">.</w:t>
+      </w:r>
+    </w:p>
+    <w:p>
+      <w:pPr>
+        <w:rPr/>
+      </w:pPr>
+      <w:r>
+        <w:rPr>
+          <w:rtl w:val="0"/>
+        </w:rPr>
+        <w:t xml:space="preserve">Our approach allows us to identify, within this corpus, the sentences most closely associated with the words “rational” and “rationality” and, by extension, the articles most likely to engage with rationality in one way or another. By allowing the algorithms to identify dozens of semantic clusters and bibliometric communities within short temporal windows (eight years or a decade), and by then aggregating these groupings over time and characterizing them through multiple indicators, we can conduct analyses at different scales. This makes it possible both to </w:t>
+      </w:r>
+      <w:r>
+        <w:rPr>
+          <w:i w:val="1"/>
+          <w:iCs w:val="1"/>
+          <w:rtl w:val="0"/>
+        </w:rPr>
+        <w:t xml:space="preserve">zoom out</w:t>
+      </w:r>
+      <w:r>
+        <w:rPr>
+          <w:rtl w:val="0"/>
+        </w:rPr>
+        <w:t xml:space="preserve">, by examining the overall configuration of clusters across periods, and to </w:t>
+      </w:r>
+      <w:r>
+        <w:rPr>
+          <w:i w:val="1"/>
+          <w:iCs w:val="1"/>
+          <w:rtl w:val="0"/>
+        </w:rPr>
+        <w:t xml:space="preserve">zoom in</w:t>
+      </w:r>
+      <w:r>
+        <w:rPr>
+          <w:rtl w:val="0"/>
+        </w:rPr>
+        <w:t xml:space="preserve">, by focusing on subsets of clusters more directly concerned with rationality. As shown in the previous section, a panoramic view that considers all semantic clusters may initially include groups that appear only loosely connected to rationality—especially in the early decades. While examining these clusters can be informative for understanding the broader intellectual context, the analyst can also foreground more explicitly rationality-oriented clusters when addressing more targeted research questions. This flexibility is only possible because the initial corpus is sufficiently inclusive, reducing the risk of overlooking relevant developments. More generally, our approach allows the scale of analysis to be adjusted to the question at hand, rather than imposing it ex ante.</w:t>
+      </w:r>
+      <w:r>
+        <w:rPr>
+          <w:rtl w:val="0"/>
+        </w:rPr>
+      </w:r>
+    </w:p>
+    <w:p>
+      <w:pPr>
+        <w:rPr/>
+      </w:pPr>
+      <w:r>
+        <w:rPr>
+          <w:rtl w:val="0"/>
+        </w:rPr>
+        <w:t xml:space="preserve">We want to conclude by drawing several general methodological and historiographic points from the approaches developed in this article.</w:t>
+      </w:r>
+    </w:p>
+    <w:p>
+      <w:pPr>
+        <w:rPr/>
+      </w:pPr>
+      <w:r>
+        <w:rPr>
+          <w:rtl w:val="0"/>
+        </w:rPr>
+        <w:t xml:space="preserve">First, although quantitative methods in the history and philosophy of economics have been applied mainly to the postwar—and often post-1970s—period, our study shows that they can also be used effectively for earlier periods. Despite problems of text recognition in JSTOR articles prior to the 1930s, our methods nonetheless provide a fine-grained depiction of economic debates in the early twentieth century. In particular, we were able to recover most of the institutionalist contributions on rationality highlighted by @rutherfordInstitutionalist2013 and @yonayStruggle2001. At the same time, our results bring to light additional contributions not covered in these accounts, thereby opening avenues for further inquiry. Of course, some important works remain absent because they were published as books rather than journal articles. This limitation suggests that extending the corpus to include books would be a worthwhile direction for future research.</w:t>
+      </w:r>
+    </w:p>
+    <w:p>
+      <w:pPr>
+        <w:rPr/>
+      </w:pPr>
+      <w:r>
+        <w:rPr>
+          <w:rtl w:val="0"/>
+        </w:rPr>
+        <w:t xml:space="preserve">Second, a key property of groupings produced by unsupervised methods is that they bring together documents that share cognitive content without presupposing agreement. The texts clustered together address the same objects or problems, but they may do so in divergent, and sometimes opposing, ways. As a result, our methods make it possible to identify sites of resistance to dominant models or ideas. What emerges most clearly are the objects that attract sustained attention; within those sites, one can then examine who endorses, revises, or contests particular ways of treating them. This feature opens the way to a more “symmetrical” historical analysis [@bloor1976], one that gives analytical weight not only to intellectual “winners” but also to those whose positions did not ultimately prevail.</w:t>
+      </w:r>
+    </w:p>
+    <w:p>
+      <w:pPr>
+        <w:rPr/>
+      </w:pPr>
+      <w:r>
+        <w:rPr>
+          <w:rtl w:val="0"/>
+        </w:rPr>
+        <w:t xml:space="preserve">Finally, these methods are also “discovery tools.” While they can be used to confirm or challenge existing claims in the history and philosophy of economics, they also help identify patterns that have so far been absent—or only marginally present—in the historical literature. </w:t>
+      </w:r>
+      <w:del w:author="Thomas Delcey" w:id="5" w:date="2026-05-13T14:18:58Z">
+        <w:commentRangeStart w:id="3"/>
+        <w:r>
+          <w:rPr>
+            <w:rtl w:val="0"/>
+          </w:rPr>
+          <w:delText xml:space="preserve">We have briefly pointed to some of these patterns above.</w:delText>
+        </w:r>
+        <w:r>
+          <w:rPr>
+            <w:rtl w:val="0"/>
+          </w:rPr>
+          <w:delText xml:space="preserve"> </w:delText>
+        </w:r>
+      </w:del>
+      <w:commentRangeEnd w:id="3"/>
+      <w:r>
+        <w:commentReference w:id="3"/>
+      </w:r>
+      <w:r>
+        <w:rPr>
+          <w:rtl w:val="0"/>
+        </w:rPr>
+        <w:t xml:space="preserve">By making available an interactive application</w:t>
+      </w:r>
+      <w:r>
+        <w:rPr>
+          <w:rtl w:val="0"/>
+        </w:rPr>
+        <w:t xml:space="preserve"> </w:t>
+      </w:r>
+      <w:r>
+        <w:rPr>
+          <w:rtl w:val="0"/>
+        </w:rPr>
+        <w:t xml:space="preserve">to explore our results, we hope to encourage readers to pursue their own paths of discovery within the corpus.</w:t>
       </w:r>
       <w:r>
         <w:rPr>
@@ -4437,7 +4609,7 @@
 
 <file path=word/comments.xml><?xml version="1.0" encoding="utf-8"?>
 <w:comments xmlns:mc="http://schemas.openxmlformats.org/markup-compatibility/2006" xmlns:o="urn:schemas-microsoft-com:office:office" xmlns:r="http://schemas.openxmlformats.org/officeDocument/2006/relationships" xmlns:m="http://schemas.openxmlformats.org/officeDocument/2006/math" xmlns:v="urn:schemas-microsoft-com:vml" xmlns:wp="http://schemas.openxmlformats.org/drawingml/2006/wordprocessingDrawing" xmlns:w10="urn:schemas-microsoft-com:office:word" xmlns:w="http://schemas.openxmlformats.org/wordprocessingml/2006/main" xmlns:wne="http://schemas.microsoft.com/office/word/2006/wordml" xmlns:sl="http://schemas.openxmlformats.org/schemaLibrary/2006/main" xmlns:a="http://schemas.openxmlformats.org/drawingml/2006/main" xmlns:pic="http://schemas.openxmlformats.org/drawingml/2006/picture" xmlns:c="http://schemas.openxmlformats.org/drawingml/2006/chart" xmlns:lc="http://schemas.openxmlformats.org/drawingml/2006/lockedCanvas" xmlns:dgm="http://schemas.openxmlformats.org/drawingml/2006/diagram" xmlns:wps="http://schemas.microsoft.com/office/word/2010/wordprocessingShape" xmlns:wpg="http://schemas.microsoft.com/office/word/2010/wordprocessingGroup" xmlns:w14="http://schemas.microsoft.com/office/word/2010/wordml" xmlns:w15="http://schemas.microsoft.com/office/word/2012/wordml" xmlns:w16="http://schemas.microsoft.com/office/word/2018/wordml" xmlns:w16cex="http://schemas.microsoft.com/office/word/2018/wordml/cex" xmlns:w16cid="http://schemas.microsoft.com/office/word/2016/wordml/cid" xmlns="http://schemas.microsoft.com/office/tasks/2019/documenttasks" xmlns:cr="http://schemas.microsoft.com/office/comments/2020/reactions">
-  <w:comment w:author="Thomas Delcey" w:id="0" w:date="2026-05-12T14:34:37Z">
+  <w:comment w:author="Thomas Delcey" w:id="2" w:date="2026-05-13T13:47:00Z">
     <w:p>
       <w:pPr>
         <w:keepNext w:val="0"/>
@@ -4488,7 +4660,356 @@
           <w:vertAlign w:val="baseline"/>
           <w:rtl w:val="0"/>
         </w:rPr>
-        <w:t xml:space="preserve">Move to appendix</w:t>
+        <w:t xml:space="preserve">ça me semble pas nécessaire, et ça mériterait plus de précision. Si c'est prouvé par notre analyse, c'est quoi les indicateurs ? Je vois 0 phrases qui parlent de Fama. Tout le monde cite Fama, y compris pour des raisons méthodologiques neutres.</w:t>
+      </w:r>
+    </w:p>
+  </w:comment>
+  <w:comment w:author="Thomas Delcey" w:id="0" w:date="2026-05-13T14:59:38Z">
+    <w:p>
+      <w:pPr>
+        <w:keepNext w:val="0"/>
+        <w:keepLines w:val="0"/>
+        <w:pageBreakBefore w:val="0"/>
+        <w:widowControl w:val="0"/>
+        <w:pBdr>
+          <w:top w:space="0" w:sz="0" w:val="nil"/>
+          <w:left w:space="0" w:sz="0" w:val="nil"/>
+          <w:bottom w:space="0" w:sz="0" w:val="nil"/>
+          <w:right w:space="0" w:sz="0" w:val="nil"/>
+          <w:between w:space="0" w:sz="0" w:val="nil"/>
+        </w:pBdr>
+        <w:shd w:fill="auto" w:val="clear"/>
+        <w:spacing w:after="0" w:before="0" w:line="240" w:lineRule="auto"/>
+        <w:ind w:left="0" w:right="0" w:firstLine="0"/>
+        <w:jc w:val="left"/>
+        <w:rPr>
+          <w:rFonts w:ascii="Arial" w:cs="Arial" w:eastAsia="Arial" w:hAnsi="Arial"/>
+          <w:b w:val="0"/>
+          <w:bCs w:val="0"/>
+          <w:i w:val="0"/>
+          <w:iCs w:val="0"/>
+          <w:smallCaps w:val="0"/>
+          <w:strike w:val="0"/>
+          <w:color w:val="000000"/>
+          <w:sz w:val="22"/>
+          <w:szCs w:val="22"/>
+          <w:u w:val="none"/>
+          <w:shd w:fill="auto" w:val="clear"/>
+          <w:vertAlign w:val="baseline"/>
+        </w:rPr>
+      </w:pPr>
+      <w:r>
+        <w:rPr>
+          <w:rFonts w:ascii="Arial" w:cs="Arial" w:eastAsia="Arial" w:hAnsi="Arial"/>
+          <w:b w:val="0"/>
+          <w:bCs w:val="0"/>
+          <w:i w:val="0"/>
+          <w:iCs w:val="0"/>
+          <w:smallCaps w:val="0"/>
+          <w:strike w:val="0"/>
+          <w:color w:val="000000"/>
+          <w:sz w:val="22"/>
+          <w:szCs w:val="22"/>
+          <w:u w:val="none"/>
+          <w:shd w:fill="auto" w:val="clear"/>
+          <w:vertAlign w:val="baseline"/>
+          <w:rtl w:val="0"/>
+        </w:rPr>
+        <w:t xml:space="preserve">@aurelien.goutsmedt@uclouvain.be @alexandre.truc77@gmail.com </w:t>
+      </w:r>
+    </w:p>
+    <w:p>
+      <w:pPr>
+        <w:keepNext w:val="0"/>
+        <w:keepLines w:val="0"/>
+        <w:pageBreakBefore w:val="0"/>
+        <w:widowControl w:val="0"/>
+        <w:pBdr>
+          <w:top w:space="0" w:sz="0" w:val="nil"/>
+          <w:left w:space="0" w:sz="0" w:val="nil"/>
+          <w:bottom w:space="0" w:sz="0" w:val="nil"/>
+          <w:right w:space="0" w:sz="0" w:val="nil"/>
+          <w:between w:space="0" w:sz="0" w:val="nil"/>
+        </w:pBdr>
+        <w:shd w:fill="auto" w:val="clear"/>
+        <w:spacing w:after="0" w:before="0" w:line="240" w:lineRule="auto"/>
+        <w:ind w:left="0" w:right="0" w:firstLine="0"/>
+        <w:jc w:val="left"/>
+        <w:rPr>
+          <w:rFonts w:ascii="Arial" w:cs="Arial" w:eastAsia="Arial" w:hAnsi="Arial"/>
+          <w:b w:val="0"/>
+          <w:bCs w:val="0"/>
+          <w:i w:val="0"/>
+          <w:iCs w:val="0"/>
+          <w:smallCaps w:val="0"/>
+          <w:strike w:val="0"/>
+          <w:color w:val="000000"/>
+          <w:sz w:val="22"/>
+          <w:szCs w:val="22"/>
+          <w:u w:val="none"/>
+          <w:shd w:fill="auto" w:val="clear"/>
+          <w:vertAlign w:val="baseline"/>
+        </w:rPr>
+      </w:pPr>
+      <w:r>
+        <w:rPr>
+          <w:rtl w:val="0"/>
+        </w:rPr>
+      </w:r>
+    </w:p>
+    <w:p>
+      <w:pPr>
+        <w:keepNext w:val="0"/>
+        <w:keepLines w:val="0"/>
+        <w:pageBreakBefore w:val="0"/>
+        <w:widowControl w:val="0"/>
+        <w:pBdr>
+          <w:top w:space="0" w:sz="0" w:val="nil"/>
+          <w:left w:space="0" w:sz="0" w:val="nil"/>
+          <w:bottom w:space="0" w:sz="0" w:val="nil"/>
+          <w:right w:space="0" w:sz="0" w:val="nil"/>
+          <w:between w:space="0" w:sz="0" w:val="nil"/>
+        </w:pBdr>
+        <w:shd w:fill="auto" w:val="clear"/>
+        <w:spacing w:after="0" w:before="0" w:line="240" w:lineRule="auto"/>
+        <w:ind w:left="0" w:right="0" w:firstLine="0"/>
+        <w:jc w:val="left"/>
+        <w:rPr>
+          <w:rFonts w:ascii="Arial" w:cs="Arial" w:eastAsia="Arial" w:hAnsi="Arial"/>
+          <w:b w:val="0"/>
+          <w:bCs w:val="0"/>
+          <w:i w:val="0"/>
+          <w:iCs w:val="0"/>
+          <w:smallCaps w:val="0"/>
+          <w:strike w:val="0"/>
+          <w:color w:val="000000"/>
+          <w:sz w:val="22"/>
+          <w:szCs w:val="22"/>
+          <w:u w:val="none"/>
+          <w:shd w:fill="auto" w:val="clear"/>
+          <w:vertAlign w:val="baseline"/>
+        </w:rPr>
+      </w:pPr>
+      <w:r>
+        <w:rPr>
+          <w:rFonts w:ascii="Arial" w:cs="Arial" w:eastAsia="Arial" w:hAnsi="Arial"/>
+          <w:b w:val="0"/>
+          <w:bCs w:val="0"/>
+          <w:i w:val="0"/>
+          <w:iCs w:val="0"/>
+          <w:smallCaps w:val="0"/>
+          <w:strike w:val="0"/>
+          <w:color w:val="000000"/>
+          <w:sz w:val="22"/>
+          <w:szCs w:val="22"/>
+          <w:u w:val="none"/>
+          <w:shd w:fill="auto" w:val="clear"/>
+          <w:vertAlign w:val="baseline"/>
+          <w:rtl w:val="0"/>
+        </w:rPr>
+        <w:t xml:space="preserve">Proposition de synthétise tes paragraphes Alex. Je trouve ça très long et surtout je trouve ça peu convaincant. La seule preuve apportée c'est un manque de structure des citations de Simon mais je vois pas trop comment ça implique une réfutation de l'H1 ou de l'H3, ou encore même d'une H4 (Simon est cité en dehors du BE). Je pense que le papier de prétendre démontrer des choses, c'est ta réponse au rapporteur 1, et autant faire court sur les remarques spéculatives.</w:t>
+      </w:r>
+    </w:p>
+  </w:comment>
+  <w:comment w:author="Thomas Delcey" w:id="3" w:date="2026-05-13T14:19:05Z">
+    <w:p>
+      <w:pPr>
+        <w:keepNext w:val="0"/>
+        <w:keepLines w:val="0"/>
+        <w:pageBreakBefore w:val="0"/>
+        <w:widowControl w:val="0"/>
+        <w:pBdr>
+          <w:top w:space="0" w:sz="0" w:val="nil"/>
+          <w:left w:space="0" w:sz="0" w:val="nil"/>
+          <w:bottom w:space="0" w:sz="0" w:val="nil"/>
+          <w:right w:space="0" w:sz="0" w:val="nil"/>
+          <w:between w:space="0" w:sz="0" w:val="nil"/>
+        </w:pBdr>
+        <w:shd w:fill="auto" w:val="clear"/>
+        <w:spacing w:after="0" w:before="0" w:line="240" w:lineRule="auto"/>
+        <w:ind w:left="0" w:right="0" w:firstLine="0"/>
+        <w:jc w:val="left"/>
+        <w:rPr>
+          <w:rFonts w:ascii="Arial" w:cs="Arial" w:eastAsia="Arial" w:hAnsi="Arial"/>
+          <w:b w:val="0"/>
+          <w:bCs w:val="0"/>
+          <w:i w:val="0"/>
+          <w:iCs w:val="0"/>
+          <w:smallCaps w:val="0"/>
+          <w:strike w:val="0"/>
+          <w:color w:val="000000"/>
+          <w:sz w:val="22"/>
+          <w:szCs w:val="22"/>
+          <w:u w:val="none"/>
+          <w:shd w:fill="auto" w:val="clear"/>
+          <w:vertAlign w:val="baseline"/>
+        </w:rPr>
+      </w:pPr>
+      <w:r>
+        <w:rPr>
+          <w:rFonts w:ascii="Arial" w:cs="Arial" w:eastAsia="Arial" w:hAnsi="Arial"/>
+          <w:b w:val="0"/>
+          <w:bCs w:val="0"/>
+          <w:i w:val="0"/>
+          <w:iCs w:val="0"/>
+          <w:smallCaps w:val="0"/>
+          <w:strike w:val="0"/>
+          <w:color w:val="000000"/>
+          <w:sz w:val="22"/>
+          <w:szCs w:val="22"/>
+          <w:u w:val="none"/>
+          <w:shd w:fill="auto" w:val="clear"/>
+          <w:vertAlign w:val="baseline"/>
+          <w:rtl w:val="0"/>
+        </w:rPr>
+        <w:t xml:space="preserve">On en parle plus tant que ça non ? Supprimer si j'ai loupé un argument important.</w:t>
+      </w:r>
+    </w:p>
+  </w:comment>
+  <w:comment w:author="Thomas Delcey" w:id="1" w:date="2026-05-13T14:52:32Z">
+    <w:p>
+      <w:pPr>
+        <w:keepNext w:val="0"/>
+        <w:keepLines w:val="0"/>
+        <w:pageBreakBefore w:val="0"/>
+        <w:widowControl w:val="0"/>
+        <w:pBdr>
+          <w:top w:space="0" w:sz="0" w:val="nil"/>
+          <w:left w:space="0" w:sz="0" w:val="nil"/>
+          <w:bottom w:space="0" w:sz="0" w:val="nil"/>
+          <w:right w:space="0" w:sz="0" w:val="nil"/>
+          <w:between w:space="0" w:sz="0" w:val="nil"/>
+        </w:pBdr>
+        <w:shd w:fill="auto" w:val="clear"/>
+        <w:spacing w:after="0" w:before="0" w:line="240" w:lineRule="auto"/>
+        <w:ind w:left="0" w:right="0" w:firstLine="0"/>
+        <w:jc w:val="left"/>
+        <w:rPr>
+          <w:rFonts w:ascii="Arial" w:cs="Arial" w:eastAsia="Arial" w:hAnsi="Arial"/>
+          <w:b w:val="0"/>
+          <w:bCs w:val="0"/>
+          <w:i w:val="0"/>
+          <w:iCs w:val="0"/>
+          <w:smallCaps w:val="0"/>
+          <w:strike w:val="0"/>
+          <w:color w:val="000000"/>
+          <w:sz w:val="22"/>
+          <w:szCs w:val="22"/>
+          <w:u w:val="none"/>
+          <w:shd w:fill="auto" w:val="clear"/>
+          <w:vertAlign w:val="baseline"/>
+        </w:rPr>
+      </w:pPr>
+      <w:r>
+        <w:rPr>
+          <w:rFonts w:ascii="Arial" w:cs="Arial" w:eastAsia="Arial" w:hAnsi="Arial"/>
+          <w:b w:val="0"/>
+          <w:bCs w:val="0"/>
+          <w:i w:val="0"/>
+          <w:iCs w:val="0"/>
+          <w:smallCaps w:val="0"/>
+          <w:strike w:val="0"/>
+          <w:color w:val="000000"/>
+          <w:sz w:val="22"/>
+          <w:szCs w:val="22"/>
+          <w:u w:val="none"/>
+          <w:shd w:fill="auto" w:val="clear"/>
+          <w:vertAlign w:val="baseline"/>
+          <w:rtl w:val="0"/>
+        </w:rPr>
+        <w:t xml:space="preserve">"Most concepts associated with “old” behavioral economics are absent from “new” behavioral economists’ vocabulary (e.g., the 2000–2009 semantic clusters “Game Theory” and “Decision Theory”), and where such concepts do appear, they are largely confined to institutionalist or heterodox clusters (e.g., the 2000–2009 semantic cluster “Rationality and its Limits”)." </w:t>
+      </w:r>
+    </w:p>
+    <w:p>
+      <w:pPr>
+        <w:keepNext w:val="0"/>
+        <w:keepLines w:val="0"/>
+        <w:pageBreakBefore w:val="0"/>
+        <w:widowControl w:val="0"/>
+        <w:pBdr>
+          <w:top w:space="0" w:sz="0" w:val="nil"/>
+          <w:left w:space="0" w:sz="0" w:val="nil"/>
+          <w:bottom w:space="0" w:sz="0" w:val="nil"/>
+          <w:right w:space="0" w:sz="0" w:val="nil"/>
+          <w:between w:space="0" w:sz="0" w:val="nil"/>
+        </w:pBdr>
+        <w:shd w:fill="auto" w:val="clear"/>
+        <w:spacing w:after="0" w:before="0" w:line="240" w:lineRule="auto"/>
+        <w:ind w:left="0" w:right="0" w:firstLine="0"/>
+        <w:jc w:val="left"/>
+        <w:rPr>
+          <w:rFonts w:ascii="Arial" w:cs="Arial" w:eastAsia="Arial" w:hAnsi="Arial"/>
+          <w:b w:val="0"/>
+          <w:bCs w:val="0"/>
+          <w:i w:val="0"/>
+          <w:iCs w:val="0"/>
+          <w:smallCaps w:val="0"/>
+          <w:strike w:val="0"/>
+          <w:color w:val="000000"/>
+          <w:sz w:val="22"/>
+          <w:szCs w:val="22"/>
+          <w:u w:val="none"/>
+          <w:shd w:fill="auto" w:val="clear"/>
+          <w:vertAlign w:val="baseline"/>
+        </w:rPr>
+      </w:pPr>
+      <w:r>
+        <w:rPr>
+          <w:rtl w:val="0"/>
+        </w:rPr>
+      </w:r>
+    </w:p>
+    <w:p>
+      <w:pPr>
+        <w:keepNext w:val="0"/>
+        <w:keepLines w:val="0"/>
+        <w:pageBreakBefore w:val="0"/>
+        <w:widowControl w:val="0"/>
+        <w:pBdr>
+          <w:top w:space="0" w:sz="0" w:val="nil"/>
+          <w:left w:space="0" w:sz="0" w:val="nil"/>
+          <w:bottom w:space="0" w:sz="0" w:val="nil"/>
+          <w:right w:space="0" w:sz="0" w:val="nil"/>
+          <w:between w:space="0" w:sz="0" w:val="nil"/>
+        </w:pBdr>
+        <w:shd w:fill="auto" w:val="clear"/>
+        <w:spacing w:after="0" w:before="0" w:line="240" w:lineRule="auto"/>
+        <w:ind w:left="0" w:right="0" w:firstLine="0"/>
+        <w:jc w:val="left"/>
+        <w:rPr>
+          <w:rFonts w:ascii="Arial" w:cs="Arial" w:eastAsia="Arial" w:hAnsi="Arial"/>
+          <w:b w:val="0"/>
+          <w:bCs w:val="0"/>
+          <w:i w:val="0"/>
+          <w:iCs w:val="0"/>
+          <w:smallCaps w:val="0"/>
+          <w:strike w:val="0"/>
+          <w:color w:val="000000"/>
+          <w:sz w:val="22"/>
+          <w:szCs w:val="22"/>
+          <w:u w:val="none"/>
+          <w:shd w:fill="auto" w:val="clear"/>
+          <w:vertAlign w:val="baseline"/>
+        </w:rPr>
+      </w:pPr>
+      <w:r>
+        <w:rPr>
+          <w:rFonts w:ascii="Arial" w:cs="Arial" w:eastAsia="Arial" w:hAnsi="Arial"/>
+          <w:b w:val="0"/>
+          <w:bCs w:val="0"/>
+          <w:i w:val="0"/>
+          <w:iCs w:val="0"/>
+          <w:smallCaps w:val="0"/>
+          <w:strike w:val="0"/>
+          <w:color w:val="000000"/>
+          <w:sz w:val="22"/>
+          <w:szCs w:val="22"/>
+          <w:u w:val="none"/>
+          <w:shd w:fill="auto" w:val="clear"/>
+          <w:vertAlign w:val="baseline"/>
+          <w:rtl w:val="0"/>
+        </w:rPr>
+        <w:t xml:space="preserve">Du coup, ça valide plutôt l'H3 ou une H4: Simon est cité par des hétérodoxes qui s'en foutent du new BE.</w:t>
       </w:r>
     </w:p>
   </w:comment>
@@ -4546,40 +5067,6 @@
       </w:r>
     </w:p>
   </w:footnote>
-  <w:footnote w:id="9">
-    <w:p>
-      <w:pPr>
-        <w:spacing w:before="0" w:line="240" w:lineRule="auto"/>
-        <w:rPr>
-          <w:del w:author="Thomas Delcey" w:id="5" w:date="2026-05-12T14:34:32Z"/>
-          <w:sz w:val="20"/>
-          <w:szCs w:val="20"/>
-        </w:rPr>
-      </w:pPr>
-      <w:r>
-        <w:rPr>
-          <w:rStyle w:val="FootnoteReference"/>
-          <w:vertAlign w:val="superscript"/>
-        </w:rPr>
-        <w:footnoteRef/>
-      </w:r>
-      <w:del w:author="Thomas Delcey" w:id="5" w:date="2026-05-12T14:34:32Z">
-        <w:r>
-          <w:rPr>
-            <w:sz w:val="20"/>
-            <w:szCs w:val="20"/>
-            <w:rtl w:val="0"/>
-          </w:rPr>
-          <w:delText xml:space="preserve"> This filtering draws on JSTOR’s and Scopus’ own classifications, supplemented by some additional filtering from ourselves. Despite these safeguards, a perfectly clean restriction to research articles was not feasible, and some residual “non-article” items likely remain.</w:delText>
-        </w:r>
-        <w:r>
-          <w:rPr>
-            <w:rtl w:val="0"/>
-          </w:rPr>
-        </w:r>
-      </w:del>
-    </w:p>
-  </w:footnote>
   <w:footnote w:id="0">
     <w:p>
       <w:pPr>
@@ -4748,6 +5235,32 @@
       </w:r>
     </w:p>
   </w:footnote>
+  <w:footnote w:id="9">
+    <w:p>
+      <w:pPr>
+        <w:spacing w:after="0" w:before="0" w:line="240" w:lineRule="auto"/>
+        <w:rPr>
+          <w:sz w:val="20"/>
+          <w:szCs w:val="20"/>
+        </w:rPr>
+      </w:pPr>
+      <w:r>
+        <w:rPr>
+          <w:rStyle w:val="FootnoteReference"/>
+          <w:vertAlign w:val="superscript"/>
+        </w:rPr>
+        <w:footnoteRef/>
+      </w:r>
+      <w:r>
+        <w:rPr>
+          <w:sz w:val="20"/>
+          <w:szCs w:val="20"/>
+          <w:rtl w:val="0"/>
+        </w:rPr>
+        <w:t xml:space="preserve"> See the appendix for more information on the matching process, in particular, @tbl-wos-match-decade.</w:t>
+      </w:r>
+    </w:p>
+  </w:footnote>
   <w:footnote w:id="10">
     <w:p>
       <w:pPr>
@@ -4770,7 +5283,15 @@
           <w:szCs w:val="20"/>
           <w:rtl w:val="0"/>
         </w:rPr>
-        <w:t xml:space="preserve"> See the appendix for more information on the matching process, in particular, @tbl-wos-match-decade.</w:t>
+        <w:t xml:space="preserve"> </w:t>
+      </w:r>
+      <w:r>
+        <w:rPr>
+          <w:sz w:val="20"/>
+          <w:szCs w:val="20"/>
+          <w:rtl w:val="0"/>
+        </w:rPr>
+        <w:t xml:space="preserve">Adding these other outlets would pose additional challenges. For both working papers and, above all, books, no large-scale databases provide comprehensive full texts or complete reference lists. In addition, working papers raise the problem of potential double counting, as they may eventually be published in economic journals.</w:t>
       </w:r>
     </w:p>
   </w:footnote>
@@ -4796,15 +5317,7 @@
           <w:szCs w:val="20"/>
           <w:rtl w:val="0"/>
         </w:rPr>
-        <w:t xml:space="preserve"> </w:t>
-      </w:r>
-      <w:r>
-        <w:rPr>
-          <w:sz w:val="20"/>
-          <w:szCs w:val="20"/>
-          <w:rtl w:val="0"/>
-        </w:rPr>
-        <w:t xml:space="preserve">Adding these other outlets would pose additional challenges. For both working papers and, above all, books, no large-scale databases provide comprehensive full texts or complete reference lists. In addition, working papers raise the problem of potential double counting, as they may eventually be published in economic journals.</w:t>
+        <w:t xml:space="preserve"> We did not filter journals by language a priori. Indeed, many non-anglo-saxon journals also publish English articles at some more or less frequent occasions. It was thus easier to filter by language a posteriori and at the document level, once articles were collected.</w:t>
       </w:r>
     </w:p>
   </w:footnote>
@@ -4830,11 +5343,11 @@
           <w:szCs w:val="20"/>
           <w:rtl w:val="0"/>
         </w:rPr>
-        <w:t xml:space="preserve"> We did not filter journals by language a priori. Indeed, many non-anglo-saxon journals also publish English articles at some more or less frequent occasions. It was thus easier to filter by language a posteriori and at the document level, once articles were collected.</w:t>
+        <w:t xml:space="preserve"> Our goal here is not to provide the reader with extensive details on what these models are and how we use them (see the appendix for additional details and references), but rather to provide general intuitions about the use of LLMs, to understand the building of our corpus.</w:t>
       </w:r>
     </w:p>
   </w:footnote>
-  <w:footnote w:id="13">
+  <w:footnote w:id="24">
     <w:p>
       <w:pPr>
         <w:spacing w:after="0" w:before="0" w:line="240" w:lineRule="auto"/>
@@ -4856,7 +5369,7 @@
           <w:szCs w:val="20"/>
           <w:rtl w:val="0"/>
         </w:rPr>
-        <w:t xml:space="preserve"> Our goal here is not to provide the reader with extensive details on what these models are and how we use them (see the appendix for additional details and references), but rather to provide general intuitions about the use of LLMs, to understand the building of our corpus.</w:t>
+        <w:t xml:space="preserve"> We don’t use overlapping windows in this case, notably for computational reasons: finding HDSBCAN clusters on a set of tens of thousands of sentences is much more computationally intensive than finding bibliometric communities for at most a few thousands of articles.</w:t>
       </w:r>
     </w:p>
   </w:footnote>
@@ -4882,37 +5395,11 @@
           <w:szCs w:val="20"/>
           <w:rtl w:val="0"/>
         </w:rPr>
-        <w:t xml:space="preserve"> We don’t use overlapping windows in this case, notably for computational reasons: finding HDSBCAN clusters on a set of tens of thousands of sentences is much more computationally intensive than finding bibliometric communities for at most five thousands of articles.</w:t>
+        <w:t xml:space="preserve"> Refer to the appendix for details.</w:t>
       </w:r>
     </w:p>
   </w:footnote>
-  <w:footnote w:id="26">
-    <w:p>
-      <w:pPr>
-        <w:spacing w:after="0" w:before="0" w:line="240" w:lineRule="auto"/>
-        <w:rPr>
-          <w:sz w:val="20"/>
-          <w:szCs w:val="20"/>
-        </w:rPr>
-      </w:pPr>
-      <w:r>
-        <w:rPr>
-          <w:rStyle w:val="FootnoteReference"/>
-          <w:vertAlign w:val="superscript"/>
-        </w:rPr>
-        <w:footnoteRef/>
-      </w:r>
-      <w:r>
-        <w:rPr>
-          <w:sz w:val="20"/>
-          <w:szCs w:val="20"/>
-          <w:rtl w:val="0"/>
-        </w:rPr>
-        <w:t xml:space="preserve"> Intertemporal semantic clusters are thus composed of several intra-decade clusters that have been aggregated together. Refer to the appendix for details.</w:t>
-      </w:r>
-    </w:p>
-  </w:footnote>
-  <w:footnote w:id="20">
+  <w:footnote w:id="19">
     <w:p>
       <w:pPr>
         <w:spacing w:after="0" w:before="0" w:line="240" w:lineRule="auto"/>
@@ -5255,7 +5742,7 @@
       </w:r>
     </w:p>
   </w:footnote>
-  <w:footnote w:id="15">
+  <w:footnote w:id="14">
     <w:p>
       <w:pPr>
         <w:spacing w:after="0" w:before="0" w:line="240" w:lineRule="auto"/>
@@ -5280,6 +5767,34 @@
           <w:rtl w:val="0"/>
         </w:rPr>
         <w:t xml:space="preserve"> Moreover, the texts used to train these models are not primarily academic articles in economics. This means that there may be important gaps between the general language patterns the model has learned and the specific vocabulary, concepts, and writing practices of our “domain” [see e.g. @zhangEconBERT2025].</w:t>
+      </w:r>
+    </w:p>
+  </w:footnote>
+  <w:footnote w:id="17">
+    <w:p>
+      <w:pPr>
+        <w:spacing w:after="0" w:before="0" w:line="240" w:lineRule="auto"/>
+        <w:rPr>
+          <w:sz w:val="20"/>
+          <w:szCs w:val="20"/>
+          <w:highlight w:val="white"/>
+        </w:rPr>
+      </w:pPr>
+      <w:r>
+        <w:rPr>
+          <w:rStyle w:val="FootnoteReference"/>
+          <w:vertAlign w:val="superscript"/>
+        </w:rPr>
+        <w:footnoteRef/>
+      </w:r>
+      <w:r>
+        <w:rPr>
+          <w:sz w:val="20"/>
+          <w:szCs w:val="20"/>
+          <w:highlight w:val="white"/>
+          <w:rtl w:val="0"/>
+        </w:rPr>
+        <w:t xml:space="preserve"> The choice of the 1% quantile reflects a trade-off between false positives and false negatives. We observed that a more restrictive threshold (e.g., 0.5%) excludes many sentences that obviously deal with rationality in economics, whereas a more permissive threshold (e.g. 2%) includes sentences that are too distant from our core focus, particularly in earlier periods. The 1% threshold therefore appeared as a reasonable compromise. Moreover, a moderate number of false positives does not substantially threaten the analysis, since such sentences are likely to be classified as “noise” by the HDBSCAN algorithm. </w:t>
       </w:r>
     </w:p>
   </w:footnote>
@@ -5290,7 +5805,6 @@
         <w:rPr>
           <w:sz w:val="20"/>
           <w:szCs w:val="20"/>
-          <w:highlight w:val="white"/>
         </w:rPr>
       </w:pPr>
       <w:r>
@@ -5304,14 +5818,45 @@
         <w:rPr>
           <w:sz w:val="20"/>
           <w:szCs w:val="20"/>
-          <w:highlight w:val="white"/>
-          <w:rtl w:val="0"/>
-        </w:rPr>
-        <w:t xml:space="preserve"> The choice of the 1% quantile reflects a trade-off between false positives and false negatives. We observed that a more restrictive threshold (e.g., 0.5%) excludes many sentences that obviously deal with rationality in economics, whereas a more permissive threshold (e.g. 2%) includes sentences that are too distant from our core focus, particularly in earlier periods. The 1% threshold therefore appeared as a reasonable compromise. Moreover, a moderate number of false positives does not substantially threaten the analysis, since such sentences are likely to be classified as “noise” by the HDBSCAN algorithm. </w:t>
+          <w:rtl w:val="0"/>
+        </w:rPr>
+        <w:t xml:space="preserve"> The “articles-corpus” only </w:t>
+      </w:r>
+      <w:r>
+        <w:rPr>
+          <w:sz w:val="20"/>
+          <w:szCs w:val="20"/>
+          <w:rtl w:val="0"/>
+        </w:rPr>
+        <w:t xml:space="preserve">starts</w:t>
+      </w:r>
+      <w:r>
+        <w:rPr>
+          <w:sz w:val="20"/>
+          <w:szCs w:val="20"/>
+          <w:rtl w:val="0"/>
+        </w:rPr>
+        <w:t xml:space="preserve"> in 1960, because the bibliographic data from WoS </w:t>
+      </w:r>
+      <w:r>
+        <w:rPr>
+          <w:sz w:val="20"/>
+          <w:szCs w:val="20"/>
+          <w:rtl w:val="0"/>
+        </w:rPr>
+        <w:t xml:space="preserve">are</w:t>
+      </w:r>
+      <w:r>
+        <w:rPr>
+          <w:sz w:val="20"/>
+          <w:szCs w:val="20"/>
+          <w:rtl w:val="0"/>
+        </w:rPr>
+        <w:t xml:space="preserve"> too limited prior to this date to be reliably used.</w:t>
       </w:r>
     </w:p>
   </w:footnote>
-  <w:footnote w:id="19">
+  <w:footnote w:id="16">
     <w:p>
       <w:pPr>
         <w:spacing w:after="0" w:before="0" w:line="240" w:lineRule="auto"/>
@@ -5333,43 +5878,11 @@
           <w:szCs w:val="20"/>
           <w:rtl w:val="0"/>
         </w:rPr>
-        <w:t xml:space="preserve"> The “articles-corpus” only </w:t>
-      </w:r>
-      <w:r>
-        <w:rPr>
-          <w:sz w:val="20"/>
-          <w:szCs w:val="20"/>
-          <w:rtl w:val="0"/>
-        </w:rPr>
-        <w:t xml:space="preserve">starts</w:t>
-      </w:r>
-      <w:r>
-        <w:rPr>
-          <w:sz w:val="20"/>
-          <w:szCs w:val="20"/>
-          <w:rtl w:val="0"/>
-        </w:rPr>
-        <w:t xml:space="preserve"> in 1960, because the bibliographic data from WoS </w:t>
-      </w:r>
-      <w:r>
-        <w:rPr>
-          <w:sz w:val="20"/>
-          <w:szCs w:val="20"/>
-          <w:rtl w:val="0"/>
-        </w:rPr>
-        <w:t xml:space="preserve">are</w:t>
-      </w:r>
-      <w:r>
-        <w:rPr>
-          <w:sz w:val="20"/>
-          <w:szCs w:val="20"/>
-          <w:rtl w:val="0"/>
-        </w:rPr>
-        <w:t xml:space="preserve"> too limited prior to this date to be reliably used.</w:t>
+        <w:t xml:space="preserve"> We initially tested a symmetric two-year window. However, particularly in the early periods, this specification resulted in substantial volatility in average usage of the terms “rational” and “rationality”, thereby increasing the number of “noisy” sentences (i.e. sentences not clearly related to rationality or tied to highly specific issues). Conversely, longer windows would reduce the advantages of our historical approach, as they would blur temporal variation too much, especially given the rapid growth of the corpus after the 1960s.</w:t>
       </w:r>
     </w:p>
   </w:footnote>
-  <w:footnote w:id="17">
+  <w:footnote w:id="13">
     <w:p>
       <w:pPr>
         <w:spacing w:after="0" w:before="0" w:line="240" w:lineRule="auto"/>
@@ -5391,11 +5904,11 @@
           <w:szCs w:val="20"/>
           <w:rtl w:val="0"/>
         </w:rPr>
-        <w:t xml:space="preserve"> We initially tested a symmetric two-year window. However, particularly in the early periods, this specification resulted in substantial volatility in average usage of the terms “rational” and “rationality”, thereby increasing the number of “noisy” sentences (i.e. sentences not clearly related to rationality or tied to highly specific issues). Conversely, longer windows would reduce the advantages of our historical approach, as they would blur temporal variation too much, especially given the rapid growth of the corpus after the 1960s.</w:t>
+        <w:t xml:space="preserve"> Henceforth, “similarity” between sentences or documents refers to cosine similarity.</w:t>
       </w:r>
     </w:p>
   </w:footnote>
-  <w:footnote w:id="14">
+  <w:footnote w:id="21">
     <w:p>
       <w:pPr>
         <w:spacing w:after="0" w:before="0" w:line="240" w:lineRule="auto"/>
@@ -5413,11 +5926,220 @@
       </w:r>
       <w:r>
         <w:rPr>
-          <w:sz w:val="20"/>
-          <w:szCs w:val="20"/>
-          <w:rtl w:val="0"/>
-        </w:rPr>
-        <w:t xml:space="preserve"> Henceforth, “similarity” between sentences or documents refers to cosine similarity.</w:t>
+          <w:rtl w:val="0"/>
+        </w:rPr>
+        <w:t xml:space="preserve"> </w:t>
+      </w:r>
+      <w:r>
+        <w:rPr>
+          <w:sz w:val="20"/>
+          <w:szCs w:val="20"/>
+          <w:rtl w:val="0"/>
+        </w:rPr>
+        <w:t xml:space="preserve">That does not mean, however, that an unsupervised algorithm can be applied blindly to historical questions: a substantial part of our effort has consisted in adapting the method to our historical data, especially to accommodate the growth of the corpus over time.</w:t>
+      </w:r>
+      <w:r>
+        <w:rPr>
+          <w:rtl w:val="0"/>
+        </w:rPr>
+      </w:r>
+    </w:p>
+  </w:footnote>
+  <w:footnote w:id="23">
+    <w:p>
+      <w:pPr>
+        <w:spacing w:after="0" w:before="0" w:line="240" w:lineRule="auto"/>
+        <w:rPr>
+          <w:sz w:val="20"/>
+          <w:szCs w:val="20"/>
+        </w:rPr>
+      </w:pPr>
+      <w:r>
+        <w:rPr>
+          <w:rStyle w:val="FootnoteReference"/>
+          <w:vertAlign w:val="superscript"/>
+        </w:rPr>
+        <w:footnoteRef/>
+      </w:r>
+      <w:r>
+        <w:rPr>
+          <w:sz w:val="20"/>
+          <w:szCs w:val="20"/>
+          <w:rtl w:val="0"/>
+        </w:rPr>
+        <w:t xml:space="preserve">  Refer to the appendix for details.</w:t>
+      </w:r>
+    </w:p>
+  </w:footnote>
+  <w:footnote w:id="6">
+    <w:p>
+      <w:pPr>
+        <w:spacing w:after="0" w:before="0" w:line="240" w:lineRule="auto"/>
+        <w:rPr>
+          <w:sz w:val="20"/>
+          <w:szCs w:val="20"/>
+        </w:rPr>
+      </w:pPr>
+      <w:r>
+        <w:rPr>
+          <w:rStyle w:val="FootnoteReference"/>
+          <w:vertAlign w:val="superscript"/>
+        </w:rPr>
+        <w:footnoteRef/>
+      </w:r>
+      <w:r>
+        <w:rPr>
+          <w:sz w:val="20"/>
+          <w:szCs w:val="20"/>
+          <w:rtl w:val="0"/>
+        </w:rPr>
+        <w:t xml:space="preserve"> Bibliometric and textual data themselves have a history; they are “made by institutions, through human processes” [@</w:t>
+      </w:r>
+      <w:r>
+        <w:rPr>
+          <w:sz w:val="20"/>
+          <w:szCs w:val="20"/>
+          <w:rtl w:val="0"/>
+        </w:rPr>
+        <w:t xml:space="preserve">guldiDangerous2023</w:t>
+      </w:r>
+      <w:r>
+        <w:rPr>
+          <w:sz w:val="20"/>
+          <w:szCs w:val="20"/>
+          <w:rtl w:val="0"/>
+        </w:rPr>
+        <w:t xml:space="preserve">, 34]. Whether digital or material, archives are shaped by “distortions” and "occlusions", and the processes through which they are constituted are themselves worthy subjects of historical investigation [@dastonSciences2012]. </w:t>
+      </w:r>
+    </w:p>
+  </w:footnote>
+  <w:footnote w:id="7">
+    <w:p>
+      <w:pPr>
+        <w:spacing w:after="0" w:before="0" w:line="240" w:lineRule="auto"/>
+        <w:rPr>
+          <w:sz w:val="20"/>
+          <w:szCs w:val="20"/>
+        </w:rPr>
+      </w:pPr>
+      <w:r>
+        <w:rPr>
+          <w:rStyle w:val="FootnoteReference"/>
+          <w:vertAlign w:val="superscript"/>
+        </w:rPr>
+        <w:footnoteRef/>
+      </w:r>
+      <w:r>
+        <w:rPr>
+          <w:sz w:val="20"/>
+          <w:szCs w:val="20"/>
+          <w:rtl w:val="0"/>
+        </w:rPr>
+        <w:t xml:space="preserve"> The programming dimension of such computational approaches enable iterative feedback between analysis and corpus cleaning [@nelsonComputational2020]; critical scrutiny can therefore be continuously exercised at each stage of the research “pipeline” [@leeRole2020].</w:t>
+      </w:r>
+    </w:p>
+  </w:footnote>
+  <w:footnote w:id="20">
+    <w:p>
+      <w:pPr>
+        <w:spacing w:after="0" w:before="0" w:line="240" w:lineRule="auto"/>
+        <w:rPr>
+          <w:sz w:val="20"/>
+          <w:szCs w:val="20"/>
+        </w:rPr>
+      </w:pPr>
+      <w:r>
+        <w:rPr>
+          <w:rStyle w:val="FootnoteReference"/>
+          <w:vertAlign w:val="superscript"/>
+        </w:rPr>
+        <w:footnoteRef/>
+      </w:r>
+      <w:r>
+        <w:rPr>
+          <w:sz w:val="20"/>
+          <w:szCs w:val="20"/>
+          <w:rtl w:val="0"/>
+        </w:rPr>
+        <w:t xml:space="preserve"> See @simonsLarge2026 for a discussion of using LLMs with unsupervised or supervised methods in the history and philosophy of science.</w:t>
+      </w:r>
+    </w:p>
+  </w:footnote>
+  <w:footnote w:id="27">
+    <w:p>
+      <w:pPr>
+        <w:spacing w:after="0" w:before="0" w:line="240" w:lineRule="auto"/>
+        <w:rPr>
+          <w:sz w:val="20"/>
+          <w:szCs w:val="20"/>
+        </w:rPr>
+      </w:pPr>
+      <w:r>
+        <w:rPr>
+          <w:rStyle w:val="FootnoteReference"/>
+          <w:vertAlign w:val="superscript"/>
+        </w:rPr>
+        <w:footnoteRef/>
+      </w:r>
+      <w:r>
+        <w:rPr>
+          <w:sz w:val="20"/>
+          <w:szCs w:val="20"/>
+          <w:rtl w:val="0"/>
+        </w:rPr>
+        <w:t xml:space="preserve"> One step in the discovery and interpretive process is often the assignment of “labels” to clusters in order to facilitate the interpretation of visualizations.</w:t>
+      </w:r>
+    </w:p>
+  </w:footnote>
+  <w:footnote w:id="31">
+    <w:p>
+      <w:pPr>
+        <w:spacing w:after="0" w:before="0" w:line="240" w:lineRule="auto"/>
+        <w:rPr>
+          <w:sz w:val="20"/>
+          <w:szCs w:val="20"/>
+        </w:rPr>
+      </w:pPr>
+      <w:r>
+        <w:rPr>
+          <w:rStyle w:val="FootnoteReference"/>
+          <w:vertAlign w:val="superscript"/>
+        </w:rPr>
+        <w:footnoteRef/>
+      </w:r>
+      <w:r>
+        <w:rPr>
+          <w:sz w:val="20"/>
+          <w:szCs w:val="20"/>
+          <w:rtl w:val="0"/>
+        </w:rPr>
+        <w:t xml:space="preserve"> See closest sentences to the “Utility Theory” cluster’s centroid.</w:t>
+      </w:r>
+    </w:p>
+  </w:footnote>
+  <w:footnote w:id="33">
+    <w:p>
+      <w:pPr>
+        <w:spacing w:after="0" w:before="0" w:line="240" w:lineRule="auto"/>
+        <w:rPr>
+          <w:sz w:val="20"/>
+          <w:szCs w:val="20"/>
+        </w:rPr>
+      </w:pPr>
+      <w:r>
+        <w:rPr>
+          <w:rStyle w:val="FootnoteReference"/>
+          <w:vertAlign w:val="superscript"/>
+        </w:rPr>
+        <w:footnoteRef/>
+      </w:r>
+      <w:r>
+        <w:rPr>
+          <w:sz w:val="20"/>
+          <w:szCs w:val="20"/>
+          <w:rtl w:val="0"/>
+        </w:rPr>
+        <w:t xml:space="preserve"> The cluster “Firm Theory &amp; Entrepreneur” nevertheless remained a site for critiques of profit maximization. During the 1960s and 1970s, contributions that proposed alternative frameworks for explaining firms’ decisions were highly cited [such as @simonTheories1959] or appeared among closest articles from centroid [like @winterSatisficing1971].</w:t>
       </w:r>
     </w:p>
   </w:footnote>
@@ -5439,32 +6161,22 @@
       </w:r>
       <w:r>
         <w:rPr>
-          <w:rtl w:val="0"/>
-        </w:rPr>
-        <w:t xml:space="preserve"> </w:t>
-      </w:r>
-      <w:r>
-        <w:rPr>
-          <w:sz w:val="20"/>
-          <w:szCs w:val="20"/>
-          <w:rtl w:val="0"/>
-        </w:rPr>
-        <w:t xml:space="preserve">That does not mean, however, that an unsupervised algorithm can be applied blindly to historical questions: a substantial part of our effort has consisted in adapting the method to our historical data, especially to accommodate the growth of the corpus over time.</w:t>
-      </w:r>
-      <w:r>
-        <w:rPr>
-          <w:rtl w:val="0"/>
-        </w:rPr>
+          <w:sz w:val="20"/>
+          <w:szCs w:val="20"/>
+          <w:rtl w:val="0"/>
+        </w:rPr>
+        <w:t xml:space="preserve"> The eight-year window for bibliometric communities follows established practice in the quantitative history of economics [@claveauMacrodynamics2016], which is generally between 5 and 10 years [@abramoAssessing2011]. In our case, economics being a social science with longer citation spans of life [@lariviereLongterm2008; @aistleitnerCitation2019], and our object of study spanning across multiple decades, a longer time window than 5 years is favored while preserving more granularity than a 10-year one.</w:t>
       </w:r>
     </w:p>
   </w:footnote>
-  <w:footnote w:id="24">
+  <w:footnote w:id="15">
     <w:p>
       <w:pPr>
         <w:spacing w:after="0" w:before="0" w:line="240" w:lineRule="auto"/>
         <w:rPr>
           <w:sz w:val="20"/>
           <w:szCs w:val="20"/>
+          <w:highlight w:val="white"/>
         </w:rPr>
       </w:pPr>
       <w:r>
@@ -5478,13 +6190,53 @@
         <w:rPr>
           <w:sz w:val="20"/>
           <w:szCs w:val="20"/>
-          <w:rtl w:val="0"/>
-        </w:rPr>
-        <w:t xml:space="preserve">  Refer to the appendix for details.</w:t>
+          <w:highlight w:val="white"/>
+          <w:rtl w:val="0"/>
+        </w:rPr>
+        <w:t xml:space="preserve"> Centroids are widely used in the literature on “semantic change” to represent the average embedding of a temporal slice or a cluster of a corpus [@montanelliSurvey2024]</w:t>
+      </w:r>
+      <w:r>
+        <w:rPr>
+          <w:sz w:val="20"/>
+          <w:szCs w:val="20"/>
+          <w:highlight w:val="white"/>
+          <w:rtl w:val="0"/>
+        </w:rPr>
+        <w:t xml:space="preserve">.</w:t>
+      </w:r>
+      <w:r>
+        <w:rPr>
+          <w:sz w:val="20"/>
+          <w:szCs w:val="20"/>
+          <w:highlight w:val="white"/>
+          <w:rtl w:val="0"/>
+        </w:rPr>
+        <w:t xml:space="preserve"> We adopt the centroid rather than the medoid (i.e. the observed sentences whose embedding is closest to all others in the set), as the centroid smooths over idiosyncratic variation across sentences, whereas the medoid may be disproportionately influenced by a single atypical example. While the medoid is an embedding of a real sentence and is easily interpretable, it is straightforward to compute the closest vector from the centroid (see </w:t>
+      </w:r>
+      <w:r>
+        <w:rPr>
+          <w:sz w:val="20"/>
+          <w:szCs w:val="20"/>
+          <w:rtl w:val="0"/>
+        </w:rPr>
+        <w:t xml:space="preserve">@tbl-illustrative_sentences</w:t>
+      </w:r>
+      <w:r>
+        <w:rPr>
+          <w:sz w:val="20"/>
+          <w:szCs w:val="20"/>
+          <w:rtl w:val="0"/>
+        </w:rPr>
+        <w:t xml:space="preserve">).</w:t>
+      </w:r>
+      <w:r>
+        <w:rPr>
+          <w:rtl w:val="0"/>
+        </w:rPr>
       </w:r>
     </w:p>
   </w:footnote>
-  <w:footnote w:id="6">
+  <w:footnote w:id="26">
     <w:p>
       <w:pPr>
         <w:spacing w:after="0" w:before="0" w:line="240" w:lineRule="auto"/>
@@ -5506,27 +6258,48 @@
           <w:szCs w:val="20"/>
           <w:rtl w:val="0"/>
         </w:rPr>
-        <w:t xml:space="preserve"> Bibliometric and textual data themselves have a history; they are “made by institutions, through human processes” [@</w:t>
-      </w:r>
-      <w:r>
-        <w:rPr>
-          <w:sz w:val="20"/>
-          <w:szCs w:val="20"/>
-          <w:rtl w:val="0"/>
-        </w:rPr>
-        <w:t xml:space="preserve">guldiDangerous2023</w:t>
-      </w:r>
-      <w:r>
-        <w:rPr>
-          <w:sz w:val="20"/>
-          <w:szCs w:val="20"/>
-          <w:rtl w:val="0"/>
-        </w:rPr>
-        <w:t xml:space="preserve">, 34]. Whether digital or material, archives are shaped by “distortions” and "occlusions", and the processes through which they are constituted are themselves worthy subjects of historical investigation [@dastonSciences2012]. </w:t>
+        <w:t xml:space="preserve"> The application is available in the GitHub repository: </w:t>
+      </w:r>
+      <w:hyperlink r:id="rId3">
+        <w:r>
+          <w:rPr>
+            <w:color w:val="1155cc"/>
+            <w:sz w:val="20"/>
+            <w:szCs w:val="20"/>
+            <w:u w:val="single"/>
+            <w:rtl w:val="0"/>
+          </w:rPr>
+          <w:t xml:space="preserve">https://github.com/tdelcey/ejhet_quanti_method_app</w:t>
+        </w:r>
+      </w:hyperlink>
+      <w:r>
+        <w:rPr>
+          <w:sz w:val="20"/>
+          <w:szCs w:val="20"/>
+          <w:rtl w:val="0"/>
+        </w:rPr>
+        <w:t xml:space="preserve">. For non technical-users, a public version is available at the following url: </w:t>
+      </w:r>
+      <w:hyperlink r:id="rId4">
+        <w:r>
+          <w:rPr>
+            <w:color w:val="1155cc"/>
+            <w:sz w:val="20"/>
+            <w:szCs w:val="20"/>
+            <w:u w:val="single"/>
+            <w:rtl w:val="0"/>
+          </w:rPr>
+          <w:t xml:space="preserve">https://019adac8-81d4-aa0e-808c-08861c261fd2.share.connect.posit.cloud/</w:t>
+        </w:r>
+      </w:hyperlink>
+      <w:r>
+        <w:rPr>
+          <w:rtl w:val="0"/>
+        </w:rPr>
       </w:r>
     </w:p>
   </w:footnote>
-  <w:footnote w:id="7">
+  <w:footnote w:id="36">
     <w:p>
       <w:pPr>
         <w:spacing w:after="0" w:before="0" w:line="240" w:lineRule="auto"/>
@@ -5548,204 +6321,7 @@
           <w:szCs w:val="20"/>
           <w:rtl w:val="0"/>
         </w:rPr>
-        <w:t xml:space="preserve"> The programming dimension of such computational approaches enable iterative feedback between analysis and corpus cleaning [@nelsonComputational2020]; critical scrutiny can therefore be continuously exercised at each stage of the research “pipeline” [@leeRole2020].</w:t>
-      </w:r>
-    </w:p>
-  </w:footnote>
-  <w:footnote w:id="21">
-    <w:p>
-      <w:pPr>
-        <w:spacing w:after="0" w:before="0" w:line="240" w:lineRule="auto"/>
-        <w:rPr>
-          <w:sz w:val="20"/>
-          <w:szCs w:val="20"/>
-        </w:rPr>
-      </w:pPr>
-      <w:r>
-        <w:rPr>
-          <w:rStyle w:val="FootnoteReference"/>
-          <w:vertAlign w:val="superscript"/>
-        </w:rPr>
-        <w:footnoteRef/>
-      </w:r>
-      <w:r>
-        <w:rPr>
-          <w:sz w:val="20"/>
-          <w:szCs w:val="20"/>
-          <w:rtl w:val="0"/>
-        </w:rPr>
-        <w:t xml:space="preserve"> See @simonsLarge2026 for a discussion of using LLMs with unsupervised or supervised methods in the history and philosophy of science.</w:t>
-      </w:r>
-    </w:p>
-  </w:footnote>
-  <w:footnote w:id="27">
-    <w:p>
-      <w:pPr>
-        <w:spacing w:after="0" w:before="0" w:line="240" w:lineRule="auto"/>
-        <w:rPr>
-          <w:sz w:val="20"/>
-          <w:szCs w:val="20"/>
-        </w:rPr>
-      </w:pPr>
-      <w:r>
-        <w:rPr>
-          <w:rStyle w:val="FootnoteReference"/>
-          <w:vertAlign w:val="superscript"/>
-        </w:rPr>
-        <w:footnoteRef/>
-      </w:r>
-      <w:r>
-        <w:rPr>
-          <w:sz w:val="20"/>
-          <w:szCs w:val="20"/>
-          <w:rtl w:val="0"/>
-        </w:rPr>
-        <w:t xml:space="preserve"> One step in the discovery and interpretive process is often the assignment of “labels” to clusters in order to facilitate the interpretation of visualizations.</w:t>
-      </w:r>
-    </w:p>
-  </w:footnote>
-  <w:footnote w:id="31">
-    <w:p>
-      <w:pPr>
-        <w:spacing w:after="0" w:before="0" w:line="240" w:lineRule="auto"/>
-        <w:rPr>
-          <w:sz w:val="20"/>
-          <w:szCs w:val="20"/>
-        </w:rPr>
-      </w:pPr>
-      <w:r>
-        <w:rPr>
-          <w:rStyle w:val="FootnoteReference"/>
-          <w:vertAlign w:val="superscript"/>
-        </w:rPr>
-        <w:footnoteRef/>
-      </w:r>
-      <w:r>
-        <w:rPr>
-          <w:sz w:val="20"/>
-          <w:szCs w:val="20"/>
-          <w:rtl w:val="0"/>
-        </w:rPr>
-        <w:t xml:space="preserve"> See closest sentences to the “Utility Theory” cluster’s centroid.</w:t>
-      </w:r>
-    </w:p>
-  </w:footnote>
-  <w:footnote w:id="33">
-    <w:p>
-      <w:pPr>
-        <w:spacing w:after="0" w:before="0" w:line="240" w:lineRule="auto"/>
-        <w:rPr>
-          <w:sz w:val="20"/>
-          <w:szCs w:val="20"/>
-        </w:rPr>
-      </w:pPr>
-      <w:r>
-        <w:rPr>
-          <w:rStyle w:val="FootnoteReference"/>
-          <w:vertAlign w:val="superscript"/>
-        </w:rPr>
-        <w:footnoteRef/>
-      </w:r>
-      <w:r>
-        <w:rPr>
-          <w:sz w:val="20"/>
-          <w:szCs w:val="20"/>
-          <w:rtl w:val="0"/>
-        </w:rPr>
-        <w:t xml:space="preserve"> The cluster “Firm Theory &amp; Entrepreneur” nevertheless remained a site for critiques of profit maximization. During the 1960s and 1970s, contributions that proposed alternative frameworks for explaining firms’ decisions were highly cited [such as @simonTheories1959] or appeared among closest articles from centroid [like @winterSatisficing1971].</w:t>
-      </w:r>
-    </w:p>
-  </w:footnote>
-  <w:footnote w:id="23">
-    <w:p>
-      <w:pPr>
-        <w:spacing w:after="0" w:before="0" w:line="240" w:lineRule="auto"/>
-        <w:rPr>
-          <w:sz w:val="20"/>
-          <w:szCs w:val="20"/>
-        </w:rPr>
-      </w:pPr>
-      <w:r>
-        <w:rPr>
-          <w:rStyle w:val="FootnoteReference"/>
-          <w:vertAlign w:val="superscript"/>
-        </w:rPr>
-        <w:footnoteRef/>
-      </w:r>
-      <w:r>
-        <w:rPr>
-          <w:sz w:val="20"/>
-          <w:szCs w:val="20"/>
-          <w:rtl w:val="0"/>
-        </w:rPr>
-        <w:t xml:space="preserve"> The eight-year window for bibliometric communities follows established practice in the quantitative history of economics [@claveauMacrodyanmics2016], which is generally between 5 and 10 years [@abramoAssessing2011]. In our case, economics being a social science with longer citation spans of life [@lariviereLongterm2008; @aistleitnerCitation2019], and our object of study spanning across multiple decades, a longer time window than 5 years is favored while preserving more granularity than a 10-year one.</w:t>
-      </w:r>
-    </w:p>
-  </w:footnote>
-  <w:footnote w:id="16">
-    <w:p>
-      <w:pPr>
-        <w:spacing w:after="0" w:before="0" w:line="240" w:lineRule="auto"/>
-        <w:rPr>
-          <w:sz w:val="20"/>
-          <w:szCs w:val="20"/>
-          <w:highlight w:val="white"/>
-        </w:rPr>
-      </w:pPr>
-      <w:r>
-        <w:rPr>
-          <w:rStyle w:val="FootnoteReference"/>
-          <w:vertAlign w:val="superscript"/>
-        </w:rPr>
-        <w:footnoteRef/>
-      </w:r>
-      <w:r>
-        <w:rPr>
-          <w:sz w:val="20"/>
-          <w:szCs w:val="20"/>
-          <w:highlight w:val="white"/>
-          <w:rtl w:val="0"/>
-        </w:rPr>
-        <w:t xml:space="preserve"> Centroids are widely used in the literature on “semantic change” to represent the average embedding of a temporal slice or a cluster of a corpus [@montanelliSurvey2024]</w:t>
-      </w:r>
-      <w:r>
-        <w:rPr>
-          <w:sz w:val="20"/>
-          <w:szCs w:val="20"/>
-          <w:highlight w:val="white"/>
-          <w:rtl w:val="0"/>
-        </w:rPr>
-        <w:t xml:space="preserve">.</w:t>
-      </w:r>
-      <w:r>
-        <w:rPr>
-          <w:sz w:val="20"/>
-          <w:szCs w:val="20"/>
-          <w:highlight w:val="white"/>
-          <w:rtl w:val="0"/>
-        </w:rPr>
-        <w:t xml:space="preserve"> We adopt the centroid rather than the medoid (i.e. the observed sentences whose embedding is closest to all others in the set), as the centroid smooths over idiosyncratic variation across sentences, whereas the medoid may be disproportionately influenced by a single atypical example. While the medoid is an embedding of a real sentence and is easily interpretable, it is straightforward to compute the closest vector from the centroid (see </w:t>
-      </w:r>
-      <w:r>
-        <w:rPr>
-          <w:sz w:val="20"/>
-          <w:szCs w:val="20"/>
-          <w:rtl w:val="0"/>
-        </w:rPr>
-        <w:t xml:space="preserve">@tbl-illustrative_sentences</w:t>
-      </w:r>
-      <w:r>
-        <w:rPr>
-          <w:sz w:val="20"/>
-          <w:szCs w:val="20"/>
-          <w:rtl w:val="0"/>
-        </w:rPr>
-        <w:t xml:space="preserve">).</w:t>
-      </w:r>
-      <w:r>
-        <w:rPr>
-          <w:rtl w:val="0"/>
-        </w:rPr>
+        <w:t xml:space="preserve"> This aligns with a general finding in scientometrics that citations in the first two years after publication explain more than half of the variation in cumulative citations [@sternHighRanked2014]</w:t>
       </w:r>
     </w:p>
   </w:footnote>

</xml_diff>

<commit_message>
Last round on the paper
</commit_message>
<xml_diff>
--- a/paper/gdoc.docx
+++ b/paper/gdoc.docx
@@ -162,7 +162,14 @@
         <w:rPr>
           <w:rtl w:val="0"/>
         </w:rPr>
-        <w:t xml:space="preserve"> We use a corpus of 2</w:t>
+        <w:t xml:space="preserve"> We use a corpus of </w:t>
+      </w:r>
+      <w:commentRangeStart w:id="0"/>
+      <w:r>
+        <w:rPr>
+          <w:rtl w:val="0"/>
+        </w:rPr>
+        <w:t xml:space="preserve">2</w:t>
       </w:r>
       <w:r>
         <w:rPr>
@@ -174,7 +181,17 @@
         <w:rPr>
           <w:rtl w:val="0"/>
         </w:rPr>
-        <w:t xml:space="preserve"> articles </w:t>
+        <w:t xml:space="preserve"> </w:t>
+      </w:r>
+      <w:commentRangeEnd w:id="0"/>
+      <w:r>
+        <w:commentReference w:id="0"/>
+      </w:r>
+      <w:r>
+        <w:rPr>
+          <w:rtl w:val="0"/>
+        </w:rPr>
+        <w:t xml:space="preserve">articles </w:t>
       </w:r>
       <w:r>
         <w:rPr>
@@ -533,7 +550,14 @@
         <w:rPr>
           <w:rtl w:val="0"/>
         </w:rPr>
-        <w:t xml:space="preserve"> of 2</w:t>
+        <w:t xml:space="preserve"> of </w:t>
+      </w:r>
+      <w:commentRangeStart w:id="1"/>
+      <w:r>
+        <w:rPr>
+          <w:rtl w:val="0"/>
+        </w:rPr>
+        <w:t xml:space="preserve">2</w:t>
       </w:r>
       <w:r>
         <w:rPr>
@@ -545,7 +569,17 @@
         <w:rPr>
           <w:rtl w:val="0"/>
         </w:rPr>
-        <w:t xml:space="preserve"> economics articles that will be later filtered to focus on “rationality”.</w:t>
+        <w:t xml:space="preserve"> </w:t>
+      </w:r>
+      <w:commentRangeEnd w:id="1"/>
+      <w:r>
+        <w:commentReference w:id="1"/>
+      </w:r>
+      <w:r>
+        <w:rPr>
+          <w:rtl w:val="0"/>
+        </w:rPr>
+        <w:t xml:space="preserve">economics articles that will be later filtered to focus on “rationality”.</w:t>
       </w:r>
     </w:p>
     <w:p>
@@ -2731,7 +2765,7 @@
         <w:rPr>
           <w:rtl w:val="0"/>
         </w:rPr>
-        <w:t xml:space="preserve"> Let us take as an example the semantic cluster “Rationality and its Limits,” which gathers close to 20,000 sentences from 1920 to 2009.</w:t>
+        <w:t xml:space="preserve"> Let us take as an example the semantic cluster we labelled “Rationality and its Limits,” which gathers close to 20,000 sentences from 1920 to 2009.</w:t>
       </w:r>
       <w:r>
         <w:rPr>
@@ -4194,7 +4228,7 @@
         <w:rPr>
           <w:rtl w:val="0"/>
         </w:rPr>
-        <w:t xml:space="preserve">The second point concerns the relationship between “old” and “new” behavioral economics. Contrary to narratives of rupture or forgetting, citations to @simonBehavioral1955 have never been as high as during the rise of new behavioral economics—a paradoxical pattern given recurrent claims that the field has neglected its intellectual roots. @earlPrinciples2022 criticizes this apparent amnesia:</w:t>
+        <w:t xml:space="preserve">The second point concerns the relationship between “old” and “new” behavioral economics. Contrary to narratives of rupture or forgetting, citations to @simonBehavioral1955 have never been as high as during the rise of new behavioral economics—a paradoxical pattern given recurrent claims that the field has neglected its intellectual roots. @earlPrinciples2022[2] criticizes this apparent amnesia:</w:t>
       </w:r>
     </w:p>
     <w:p>
@@ -4213,199 +4247,71 @@
         <w:rPr>
           <w:rtl w:val="0"/>
         </w:rPr>
-        <w:t xml:space="preserve">Neither Kahneman nor Thaler have sought to promote earlier behavioral economics alongside more recent work. Instead, they give the impression that behavioral economics started around 1979–1980 with the publication of Kahneman and Tversky’s (1979) article on prospect theory and that theory’s use by Thaler (1980). All in all, this is a very curious state of affairs: a cynic might suggest that it looks rather as if the earlier work has been airbrushed from the history of economic thought by the strategic redefinition of what constitutes behavioral economics. A more charitable and reflexive view would see the situation as resulting from insufficient familiarity with the earlier literature [@earlPrinciples2022, 2]</w:t>
-      </w:r>
-      <w:r>
-        <w:rPr>
-          <w:rtl w:val="0"/>
-        </w:rPr>
-      </w:r>
-    </w:p>
-    <w:p>
-      <w:pPr>
-        <w:rPr/>
-      </w:pPr>
-      <w:r>
-        <w:rPr>
-          <w:rtl w:val="0"/>
-        </w:rPr>
-        <w:t xml:space="preserve">The rising citations to earlier work by Simon and Allais demonstrate that, while “new” behavioral economists may not consistently acknowledge the contributions of “old” behavioral economics, the rapid expansion and growing scale of the field have nevertheless drawn unprecedented attention to these earlier works, far exceeding the recognition they received at the time of their original publication. This pattern admits at least three interpretations, each carrying distinct implications for how we understand the evolution of economic thought.</w:t>
-      </w:r>
-    </w:p>
-    <w:p>
-      <w:pPr>
-        <w:rPr>
-          <w:ins w:author="Thomas Delcey" w:id="0" w:date="2026-05-13T14:54:05Z"/>
-        </w:rPr>
-      </w:pPr>
-      <w:r>
-        <w:rPr>
-          <w:rtl w:val="0"/>
-        </w:rPr>
-        <w:t xml:space="preserve">A favorable interpretation holds that “new” behavioral economics has genuinely revived abandoned research directions, moving toward a reconciliation with earlier strands—a trajectory explicitly advocated by @sentRationality2008 and more recently by @earlPrinciples2022. A more critical reading emphasizes intellectual appropriation, whereby classic references are selectively reframed to fit the new agenda, renewing interest but through a biased and presentist lens, as Mongin has argued in the case of Allais [@monginAllais2019]. </w:t>
-      </w:r>
-      <w:r>
-        <w:rPr>
-          <w:rtl w:val="0"/>
-        </w:rPr>
-        <w:t xml:space="preserve">A third interpretation suggests that rising citation counts reflect a growing backlash against the “new” behavioral program, as defenders of “old” behavioral economics increasingly invoke Simon and others to challenge the heuristics-and-biases framework</w:t>
-      </w:r>
-      <w:r>
-        <w:rPr>
-          <w:rtl w:val="0"/>
-        </w:rPr>
-        <w:t xml:space="preserve"> [@vranasGigerenzers2000].</w:t>
-      </w:r>
-      <w:ins w:author="Thomas Delcey" w:id="0" w:date="2026-05-13T14:54:05Z">
-        <w:commentRangeStart w:id="0"/>
-        <w:r>
-          <w:rPr>
-            <w:rtl w:val="0"/>
-          </w:rPr>
-        </w:r>
-      </w:ins>
-    </w:p>
-    <w:p>
-      <w:pPr>
-        <w:rPr/>
-      </w:pPr>
-      <w:ins w:author="Thomas Delcey" w:id="0" w:date="2026-05-13T14:54:05Z">
-        <w:commentRangeStart w:id="0"/>
-        <w:commentRangeEnd w:id="0"/>
-        <w:r>
-          <w:commentReference w:id="0"/>
-        </w:r>
-        <w:r>
-          <w:rPr>
-            <w:rtl w:val="0"/>
-            <w:rPrChange w:author="Thomas Delcey" w:id="1" w:date="2026-05-13T14:54:05Z">
-              <w:rPr/>
-            </w:rPrChange>
-          </w:rPr>
-          <w:t xml:space="preserve">A definitive assessment requires both closer qualitative analysis and targeted quantitative studies (such as tracing more precisely “old” behavioral economics influence). But our work already offers a roadmap for future research into the ambivalent relationship between “old” and “new” behavioral economics. The sparse and weakly structured citation patterns associated with “old” behavioral economics that we observed point toward appropriation rather than genuine integration. Our bibliometric networks show that neither Simon nor researchers associated with his ideas formed stable communities or structured those of “new” behavioral economics. Most concepts associated with “old” behavioral economics are absent from “new” behavioral economists’ vocabulary (e.g., the 2000–2009 semantic clusters “Game Theory” and “Decision Theory”), and where such concepts do appear, they are largely confined to institutionalist or heterodox clusters (e.g., the 2000–2009 semantic cluster “Rationality and its Limits”). “Old” behavioral economists are invoked alongside canonical figures such as Adam Smith or Allais to anchor “new” behavioral economics within a longer tradition of criticism of standard rationality (e.g., the 2002–2009 coupling cluster “Behavioral Economics: Social Preferences”). Simon’s influence thus persists primarily as a symbolic and framing reference, useful for situating debates and reconstructing intellectual lineages, while his substantive framework remains only superficially incorporated. </w:t>
-        </w:r>
-      </w:ins>
-      <w:r>
-        <w:rPr>
-          <w:rtl w:val="0"/>
-        </w:rPr>
-      </w:r>
-    </w:p>
-    <w:p>
-      <w:pPr>
-        <w:rPr>
-          <w:del w:author="Thomas Delcey" w:id="2" w:date="2026-05-13T14:25:39Z"/>
-        </w:rPr>
-      </w:pPr>
-      <w:del w:author="Thomas Delcey" w:id="2" w:date="2026-05-13T14:25:39Z">
-        <w:commentRangeStart w:id="1"/>
-        <w:r>
-          <w:rPr>
-            <w:rtl w:val="0"/>
-          </w:rPr>
-          <w:delText xml:space="preserve"> </w:delText>
-        </w:r>
-        <w:r>
-          <w:rPr>
-            <w:rtl w:val="0"/>
-          </w:rPr>
-          <w:delText xml:space="preserve">First, we find no evidence of </w:delText>
-        </w:r>
-      </w:del>
-      <w:ins w:author="Thomas Delcey" w:id="2" w:date="2026-05-13T14:25:39Z">
-        <w:del w:author="Thomas Delcey" w:id="2" w:date="2026-05-13T14:25:39Z">
-          <w:commentRangeEnd w:id="1"/>
-          <w:r>
-            <w:commentReference w:id="1"/>
-          </w:r>
-          <w:r>
-            <w:rPr>
-              <w:rtl w:val="0"/>
-            </w:rPr>
-            <w:delText xml:space="preserve">negative citations toward  </w:delText>
-          </w:r>
-        </w:del>
-      </w:ins>
-      <w:del w:author="Thomas Delcey" w:id="2" w:date="2026-05-13T14:25:39Z">
-        <w:r>
-          <w:rPr>
-            <w:rtl w:val="0"/>
-          </w:rPr>
-          <w:delText xml:space="preserve">a backlash against “old” behavioral economics, either qualitatively or quantitatively </w:delText>
-        </w:r>
-        <w:commentRangeStart w:id="2"/>
-        <w:r>
-          <w:rPr>
-            <w:rtl w:val="0"/>
-          </w:rPr>
-          <w:delText xml:space="preserve">The clearest example of negative citation patterns in our network is that of behavioral finance economists toward Eugene Fama's work, which functions as an explicit critical benchmark</w:delText>
-        </w:r>
-        <w:r>
-          <w:rPr>
-            <w:rtl w:val="0"/>
-          </w:rPr>
-          <w:delText xml:space="preserve"> (e.g., the 2002–2009 coupling cluster "Finance: Behavioral Finance"). </w:delText>
-        </w:r>
-        <w:commentRangeEnd w:id="2"/>
-        <w:r>
-          <w:commentReference w:id="2"/>
-        </w:r>
-        <w:r>
-          <w:rPr>
-            <w:rtl w:val="0"/>
-          </w:rPr>
-          <w:delText xml:space="preserve">We observe no such patterns in other behavioral economics clusters</w:delText>
-        </w:r>
-        <w:r>
-          <w:rPr>
-            <w:rtl w:val="0"/>
-          </w:rPr>
-          <w:delText xml:space="preserve"> (see also @trucForty2022). Second, we find no evidence of a revival of “old” behavioral economics either. While citations to “old” behavioral economics references increased, they are not structurally central to any identified behavioral economics cluster (e.g., the 2002–2009 coupling cluster “Behavioral Economics: Risk &amp; Uncertainty”). Nor do we identify any cluster organized around a distinct behavioral approach closer to “old” behavioral economics</w:delText>
-        </w:r>
-      </w:del>
-      <w:ins w:author="Thomas Delcey" w:id="3" w:date="2026-05-13T13:54:31Z">
-        <w:del w:author="Thomas Delcey" w:id="2" w:date="2026-05-13T14:25:39Z">
-          <w:r>
-            <w:rPr>
-              <w:rtl w:val="0"/>
-            </w:rPr>
-            <w:delText xml:space="preserve">,</w:delText>
-          </w:r>
-        </w:del>
-      </w:ins>
-      <w:del w:author="Thomas Delcey" w:id="2" w:date="2026-05-13T14:25:39Z">
-        <w:r>
-          <w:rPr>
-            <w:rtl w:val="0"/>
-          </w:rPr>
-          <w:delText xml:space="preserve">. We find no “old” behavioral economics sub-specialty analogous to game theory, behavioral finance, or pro-social behavior </w:delText>
-        </w:r>
-        <w:r>
-          <w:rPr>
-            <w:rtl w:val="0"/>
-          </w:rPr>
-          <w:delText xml:space="preserve">which suggests a widespread diffusion rather than the formation of a structured approach. Most concepts associated with “old” behavioral economics are absent from “new” behavioral economists’ vocabulary (e.g., the 2000–2009 semantic clusters “Game Theory” and “Decision Theory”), and where such concepts do appear, they are largely confined to institutionalist or heterodox clusters (e.g., the 2000–2009 semantic cluster “Rationality and its Limits”). </w:delText>
-        </w:r>
-      </w:del>
-    </w:p>
-    <w:p>
-      <w:pPr>
-        <w:rPr/>
-      </w:pPr>
-      <w:del w:author="Thomas Delcey" w:id="2" w:date="2026-05-13T14:25:39Z">
-        <w:r>
-          <w:rPr>
-            <w:rtl w:val="0"/>
-          </w:rPr>
-          <w:delText xml:space="preserve">Taken together, the sparse and weakly structured citation patterns associated with “old” behavioral economics combined with the fact that contemporary discussions of rationality are increasingly framed through the concepts of “new” behavioral and experimental economics point toward appropriation rather than genuine integration. “Old” behavioral economists are invoked alongside canonical figures such as Adam Smith or Allais to anchor “new” behavioral economics within a longer tradition of criticism of standard rationality (e.g., the 2002–2009 coupling cluster “Behavioral Economics: Social Preferences”). Simon's influence thus persists primarily as a symbolic and framing reference, useful for situating debates and reconstructing intellectual lineages, while his substantive framework remains only superficially incorporated. </w:delText>
-        </w:r>
-        <w:r>
-          <w:rPr>
-            <w:rtl w:val="0"/>
-          </w:rPr>
-          <w:delText xml:space="preserve">Although a definitive assessment requires both closer qualitative analysis and targeted quantitative studies (such as tracing more precisely “old” behavioral economics influence), our work offers a roadmap for future research into the complex, ambivalent relationship between 'old' and 'new' behavioral economics</w:delText>
-        </w:r>
-      </w:del>
+        <w:t xml:space="preserve">Neither Kahneman nor Thaler have sought to promote earlier behavioral economics alongside more recent work. Instead, they give the impression that behavioral economics started around 1979–1980 with the publication of Kahneman and Tversky’s (1979) article on prospect theory … a cynic might suggest that it looks rather as if the earlier work has been airbrushed from the history of economic thought by the strategic redefinition of what constitutes behavioral economics. A more charitable and reflexive view would see the situation as resulting from insufficient familiarity with the earlier literature. </w:t>
+      </w:r>
+      <w:r>
+        <w:rPr>
+          <w:rtl w:val="0"/>
+        </w:rPr>
+      </w:r>
+    </w:p>
+    <w:p>
+      <w:pPr>
+        <w:rPr/>
+      </w:pPr>
+      <w:r>
+        <w:rPr>
+          <w:rtl w:val="0"/>
+        </w:rPr>
+        <w:t xml:space="preserve">The surge in citations to earlier works by Simon and Allais reveal a striking tension: while “new” behavioral economists often overlook the contributions of their predecessors, the field’s rapid expansion has paradoxically amplified attention to these earlier works—far beyond the recognition they received upon publication. This pattern supports three competing interpretations, each with distinct implications for the discipline’s trajectory.</w:t>
+      </w:r>
+    </w:p>
+    <w:p>
+      <w:pPr>
+        <w:rPr/>
+      </w:pPr>
+      <w:r>
+        <w:rPr>
+          <w:rtl w:val="0"/>
+        </w:rPr>
+        <w:t xml:space="preserve">First, the trend may reflect a genuine revival of abandoned research directions, suggesting a long-overdue reconciliation between old and new behavioral economics. This aligns with calls by @sentRationality2008 and @earlPrinciples2022 to reintegrate older insights into contemporary frameworks. Second, the citations could signal intellectual appropriation, where classic works are selectively reframed to serve modern agendas. As @monginAllais2019 argues, this risks distorting historical contributions through a presentist lens, prioritizing utility over fidelity. Third, the surge in citations may instead represent a backlash against the “new” behavioral program, with defenders of earlier traditions invoking Simon and Allais to challenge the hegemony of heuristics-and-biases frameworks [@vranasGigerenzers2000]. Here, citations function less as homage than as rhetorical weapons in an ongoing contest over the field’s direction.</w:t>
+      </w:r>
+    </w:p>
+    <w:p>
+      <w:pPr>
+        <w:rPr/>
+      </w:pPr>
+      <w:r>
+        <w:rPr>
+          <w:rtl w:val="0"/>
+        </w:rPr>
+        <w:t xml:space="preserve">A definitive assessment of this dynamic will require both deeper qualitative analysis—such as archival work or interviews to uncover latent influences—and targeted quantitative studies, including finer-grained tracing of “old” behavioral economics’ intellectual footprint. This goes beyond the scope of this article. Yet our findings provide a roadmap for future research, one that highlights the ambivalent relationship between the field’s past and present. The sparse and fragmented citation patterns we observed for “old” behavioral economics suggest appropriation rather than integration. Our bibliometric networks reveal that neither Simon nor researchers associated with his ideas formed stable or influential communities within the broader landscape of “new” behavioral economics. Instead, their ideas appear as isolated echoes, rarely shaping the field’s core structures.</w:t>
+      </w:r>
+    </w:p>
+    <w:p>
+      <w:pPr>
+        <w:rPr/>
+      </w:pPr>
+      <w:r>
+        <w:rPr>
+          <w:rtl w:val="0"/>
+        </w:rPr>
+        <w:t xml:space="preserve">This disconnection becomes even clearer in the last years of our study. Key concepts from “old” behavioral economics are largely absent from the dominant vocabularies of “new” behavioral economists, particularly in clusters “Game Theory” and “Decision Theory.” Where such ideas </w:t>
+      </w:r>
+      <w:r>
+        <w:rPr>
+          <w:i w:val="1"/>
+          <w:iCs w:val="1"/>
+          <w:rtl w:val="0"/>
+        </w:rPr>
+        <w:t xml:space="preserve">do</w:t>
+      </w:r>
+      <w:r>
+        <w:rPr>
+          <w:rtl w:val="0"/>
+        </w:rPr>
+        <w:t xml:space="preserve"> appear, they are marginalized—confined to heterodox or institutionalist spaces, such as the 2000–2009 cluster “Rationality and its Limits.” Even the invocation of “old” behavioral economists follows a pattern of selective framing: figures like Simon are coupled with canonical critics of standard rationality (from Adam Smith to Allais) in the bibliometric community “Behavioral Economics: Social Preferences,” (2002-2009) not to engage with their substantive contributions, but to anchor “new” behavioral economics within a longer tradition of dissent. Simon’s legacy thus seems to endure primarily as a symbolic touchstone—a rhetorical device for situating debates and constructing intellectual genealogies—while his analytical framework remains superficially absorbed, if not sidelined.</w:t>
+      </w:r>
       <w:r>
         <w:rPr>
           <w:rtl w:val="0"/>
@@ -4452,20 +4358,7 @@
         <w:rPr>
           <w:rtl w:val="0"/>
         </w:rPr>
-        <w:t xml:space="preserve">This article is first and foremost methodological: it aims to demonstrate, through a concrete application, the usefulness of quantitative methods for the history of economic thought. Nonetheless, it does so by breaking new ground in the history and philosophy of economics. First, the corpus we build—comprising nearly 290,000 full-text economics articles spanning more than a century—is, to our knowledge, the largest and most comprehensive database ever used to study economic contributions in English. Second, this article constitutes the first application of quantitative methods to the study of “semantic change” within the history of economics, an area that represents an important and growing strand of the literature on quantitative text analysis [@montanelliSurvey2024].</w:t>
-      </w:r>
-      <w:ins w:author="Thomas Delcey" w:id="4" w:date="2026-05-13T14:12:22Z">
-        <w:r>
-          <w:rPr>
-            <w:rtl w:val="0"/>
-          </w:rPr>
-          <w:t xml:space="preserve">Third, we also provide a LLM-base measure, with a time component, to select corpora that goes beyond raw set of keyword.</w:t>
-        </w:r>
-      </w:ins>
-      <w:r>
-        <w:rPr>
-          <w:rtl w:val="0"/>
-        </w:rPr>
+        <w:t xml:space="preserve">This article is first and foremost methodological: it aims to demonstrate, through a concrete application, the usefulness of quantitative methods for the history of economic thought. Nonetheless, it does so by breaking new ground in the history and philosophy of economics. First, the corpus we build—comprising nearly 290,000 full-text economics articles spanning more than a century—is, to our knowledge, the largest and most comprehensive database ever used to study economic contributions in English. Second, this article constitutes the first application of quantitative methods to the study of “semantic change” within the history of economics, an area that represents an important and growing strand of the literature on quantitative text analysis [@montanelliSurvey2024]. Third, we also provide a LLM-base measure, with a time component (the representative vectors), to select corpora that goes beyond building a raw set of keywords.</w:t>
       </w:r>
     </w:p>
     <w:p>
@@ -4555,30 +4448,17 @@
         </w:rPr>
         <w:t xml:space="preserve">Finally, these methods are also “discovery tools.” While they can be used to confirm or challenge existing claims in the history and philosophy of economics, they also help identify patterns that have so far been absent—or only marginally present—in the historical literature. </w:t>
       </w:r>
-      <w:del w:author="Thomas Delcey" w:id="5" w:date="2026-05-13T14:18:58Z">
-        <w:commentRangeStart w:id="3"/>
-        <w:r>
-          <w:rPr>
-            <w:rtl w:val="0"/>
-          </w:rPr>
-          <w:delText xml:space="preserve">We have briefly pointed to some of these patterns above.</w:delText>
-        </w:r>
-        <w:r>
-          <w:rPr>
-            <w:rtl w:val="0"/>
-          </w:rPr>
-          <w:delText xml:space="preserve"> </w:delText>
-        </w:r>
-      </w:del>
-      <w:commentRangeEnd w:id="3"/>
-      <w:r>
-        <w:commentReference w:id="3"/>
-      </w:r>
-      <w:r>
-        <w:rPr>
-          <w:rtl w:val="0"/>
-        </w:rPr>
-        <w:t xml:space="preserve">By making available an interactive application</w:t>
+      <w:r>
+        <w:rPr>
+          <w:rtl w:val="0"/>
+        </w:rPr>
+        <w:t xml:space="preserve">We have briefly pointed to some of these patterns above.</w:t>
+      </w:r>
+      <w:r>
+        <w:rPr>
+          <w:rtl w:val="0"/>
+        </w:rPr>
+        <w:t xml:space="preserve"> By making available an interactive application</w:t>
       </w:r>
       <w:r>
         <w:rPr>
@@ -4609,7 +4489,7 @@
 
 <file path=word/comments.xml><?xml version="1.0" encoding="utf-8"?>
 <w:comments xmlns:mc="http://schemas.openxmlformats.org/markup-compatibility/2006" xmlns:o="urn:schemas-microsoft-com:office:office" xmlns:r="http://schemas.openxmlformats.org/officeDocument/2006/relationships" xmlns:m="http://schemas.openxmlformats.org/officeDocument/2006/math" xmlns:v="urn:schemas-microsoft-com:vml" xmlns:wp="http://schemas.openxmlformats.org/drawingml/2006/wordprocessingDrawing" xmlns:w10="urn:schemas-microsoft-com:office:word" xmlns:w="http://schemas.openxmlformats.org/wordprocessingml/2006/main" xmlns:wne="http://schemas.microsoft.com/office/word/2006/wordml" xmlns:sl="http://schemas.openxmlformats.org/schemaLibrary/2006/main" xmlns:a="http://schemas.openxmlformats.org/drawingml/2006/main" xmlns:pic="http://schemas.openxmlformats.org/drawingml/2006/picture" xmlns:c="http://schemas.openxmlformats.org/drawingml/2006/chart" xmlns:lc="http://schemas.openxmlformats.org/drawingml/2006/lockedCanvas" xmlns:dgm="http://schemas.openxmlformats.org/drawingml/2006/diagram" xmlns:wps="http://schemas.microsoft.com/office/word/2010/wordprocessingShape" xmlns:wpg="http://schemas.microsoft.com/office/word/2010/wordprocessingGroup" xmlns:w14="http://schemas.microsoft.com/office/word/2010/wordml" xmlns:w15="http://schemas.microsoft.com/office/word/2012/wordml" xmlns:w16="http://schemas.microsoft.com/office/word/2018/wordml" xmlns:w16cex="http://schemas.microsoft.com/office/word/2018/wordml/cex" xmlns:w16cid="http://schemas.microsoft.com/office/word/2016/wordml/cid" xmlns="http://schemas.microsoft.com/office/tasks/2019/documenttasks" xmlns:cr="http://schemas.microsoft.com/office/comments/2020/reactions">
-  <w:comment w:author="Thomas Delcey" w:id="2" w:date="2026-05-13T13:47:00Z">
+  <w:comment w:author="Aurélien Goutsmedt" w:id="0" w:date="2026-05-14T07:39:02Z">
     <w:p>
       <w:pPr>
         <w:keepNext w:val="0"/>
@@ -4660,11 +4540,11 @@
           <w:vertAlign w:val="baseline"/>
           <w:rtl w:val="0"/>
         </w:rPr>
-        <w:t xml:space="preserve">ça me semble pas nécessaire, et ça mériterait plus de précision. Si c'est prouvé par notre analyse, c'est quoi les indicateurs ? Je vois 0 phrases qui parlent de Fama. Tout le monde cite Fama, y compris pour des raisons méthodologiques neutres.</w:t>
+        <w:t xml:space="preserve">Add the final number</w:t>
       </w:r>
     </w:p>
   </w:comment>
-  <w:comment w:author="Thomas Delcey" w:id="0" w:date="2026-05-13T14:59:38Z">
+  <w:comment w:author="Aurélien Goutsmedt" w:id="1" w:date="2026-05-14T07:39:09Z">
     <w:p>
       <w:pPr>
         <w:keepNext w:val="0"/>
@@ -4715,301 +4595,7 @@
           <w:vertAlign w:val="baseline"/>
           <w:rtl w:val="0"/>
         </w:rPr>
-        <w:t xml:space="preserve">@aurelien.goutsmedt@uclouvain.be @alexandre.truc77@gmail.com </w:t>
-      </w:r>
-    </w:p>
-    <w:p>
-      <w:pPr>
-        <w:keepNext w:val="0"/>
-        <w:keepLines w:val="0"/>
-        <w:pageBreakBefore w:val="0"/>
-        <w:widowControl w:val="0"/>
-        <w:pBdr>
-          <w:top w:space="0" w:sz="0" w:val="nil"/>
-          <w:left w:space="0" w:sz="0" w:val="nil"/>
-          <w:bottom w:space="0" w:sz="0" w:val="nil"/>
-          <w:right w:space="0" w:sz="0" w:val="nil"/>
-          <w:between w:space="0" w:sz="0" w:val="nil"/>
-        </w:pBdr>
-        <w:shd w:fill="auto" w:val="clear"/>
-        <w:spacing w:after="0" w:before="0" w:line="240" w:lineRule="auto"/>
-        <w:ind w:left="0" w:right="0" w:firstLine="0"/>
-        <w:jc w:val="left"/>
-        <w:rPr>
-          <w:rFonts w:ascii="Arial" w:cs="Arial" w:eastAsia="Arial" w:hAnsi="Arial"/>
-          <w:b w:val="0"/>
-          <w:bCs w:val="0"/>
-          <w:i w:val="0"/>
-          <w:iCs w:val="0"/>
-          <w:smallCaps w:val="0"/>
-          <w:strike w:val="0"/>
-          <w:color w:val="000000"/>
-          <w:sz w:val="22"/>
-          <w:szCs w:val="22"/>
-          <w:u w:val="none"/>
-          <w:shd w:fill="auto" w:val="clear"/>
-          <w:vertAlign w:val="baseline"/>
-        </w:rPr>
-      </w:pPr>
-      <w:r>
-        <w:rPr>
-          <w:rtl w:val="0"/>
-        </w:rPr>
-      </w:r>
-    </w:p>
-    <w:p>
-      <w:pPr>
-        <w:keepNext w:val="0"/>
-        <w:keepLines w:val="0"/>
-        <w:pageBreakBefore w:val="0"/>
-        <w:widowControl w:val="0"/>
-        <w:pBdr>
-          <w:top w:space="0" w:sz="0" w:val="nil"/>
-          <w:left w:space="0" w:sz="0" w:val="nil"/>
-          <w:bottom w:space="0" w:sz="0" w:val="nil"/>
-          <w:right w:space="0" w:sz="0" w:val="nil"/>
-          <w:between w:space="0" w:sz="0" w:val="nil"/>
-        </w:pBdr>
-        <w:shd w:fill="auto" w:val="clear"/>
-        <w:spacing w:after="0" w:before="0" w:line="240" w:lineRule="auto"/>
-        <w:ind w:left="0" w:right="0" w:firstLine="0"/>
-        <w:jc w:val="left"/>
-        <w:rPr>
-          <w:rFonts w:ascii="Arial" w:cs="Arial" w:eastAsia="Arial" w:hAnsi="Arial"/>
-          <w:b w:val="0"/>
-          <w:bCs w:val="0"/>
-          <w:i w:val="0"/>
-          <w:iCs w:val="0"/>
-          <w:smallCaps w:val="0"/>
-          <w:strike w:val="0"/>
-          <w:color w:val="000000"/>
-          <w:sz w:val="22"/>
-          <w:szCs w:val="22"/>
-          <w:u w:val="none"/>
-          <w:shd w:fill="auto" w:val="clear"/>
-          <w:vertAlign w:val="baseline"/>
-        </w:rPr>
-      </w:pPr>
-      <w:r>
-        <w:rPr>
-          <w:rFonts w:ascii="Arial" w:cs="Arial" w:eastAsia="Arial" w:hAnsi="Arial"/>
-          <w:b w:val="0"/>
-          <w:bCs w:val="0"/>
-          <w:i w:val="0"/>
-          <w:iCs w:val="0"/>
-          <w:smallCaps w:val="0"/>
-          <w:strike w:val="0"/>
-          <w:color w:val="000000"/>
-          <w:sz w:val="22"/>
-          <w:szCs w:val="22"/>
-          <w:u w:val="none"/>
-          <w:shd w:fill="auto" w:val="clear"/>
-          <w:vertAlign w:val="baseline"/>
-          <w:rtl w:val="0"/>
-        </w:rPr>
-        <w:t xml:space="preserve">Proposition de synthétise tes paragraphes Alex. Je trouve ça très long et surtout je trouve ça peu convaincant. La seule preuve apportée c'est un manque de structure des citations de Simon mais je vois pas trop comment ça implique une réfutation de l'H1 ou de l'H3, ou encore même d'une H4 (Simon est cité en dehors du BE). Je pense que le papier de prétendre démontrer des choses, c'est ta réponse au rapporteur 1, et autant faire court sur les remarques spéculatives.</w:t>
-      </w:r>
-    </w:p>
-  </w:comment>
-  <w:comment w:author="Thomas Delcey" w:id="3" w:date="2026-05-13T14:19:05Z">
-    <w:p>
-      <w:pPr>
-        <w:keepNext w:val="0"/>
-        <w:keepLines w:val="0"/>
-        <w:pageBreakBefore w:val="0"/>
-        <w:widowControl w:val="0"/>
-        <w:pBdr>
-          <w:top w:space="0" w:sz="0" w:val="nil"/>
-          <w:left w:space="0" w:sz="0" w:val="nil"/>
-          <w:bottom w:space="0" w:sz="0" w:val="nil"/>
-          <w:right w:space="0" w:sz="0" w:val="nil"/>
-          <w:between w:space="0" w:sz="0" w:val="nil"/>
-        </w:pBdr>
-        <w:shd w:fill="auto" w:val="clear"/>
-        <w:spacing w:after="0" w:before="0" w:line="240" w:lineRule="auto"/>
-        <w:ind w:left="0" w:right="0" w:firstLine="0"/>
-        <w:jc w:val="left"/>
-        <w:rPr>
-          <w:rFonts w:ascii="Arial" w:cs="Arial" w:eastAsia="Arial" w:hAnsi="Arial"/>
-          <w:b w:val="0"/>
-          <w:bCs w:val="0"/>
-          <w:i w:val="0"/>
-          <w:iCs w:val="0"/>
-          <w:smallCaps w:val="0"/>
-          <w:strike w:val="0"/>
-          <w:color w:val="000000"/>
-          <w:sz w:val="22"/>
-          <w:szCs w:val="22"/>
-          <w:u w:val="none"/>
-          <w:shd w:fill="auto" w:val="clear"/>
-          <w:vertAlign w:val="baseline"/>
-        </w:rPr>
-      </w:pPr>
-      <w:r>
-        <w:rPr>
-          <w:rFonts w:ascii="Arial" w:cs="Arial" w:eastAsia="Arial" w:hAnsi="Arial"/>
-          <w:b w:val="0"/>
-          <w:bCs w:val="0"/>
-          <w:i w:val="0"/>
-          <w:iCs w:val="0"/>
-          <w:smallCaps w:val="0"/>
-          <w:strike w:val="0"/>
-          <w:color w:val="000000"/>
-          <w:sz w:val="22"/>
-          <w:szCs w:val="22"/>
-          <w:u w:val="none"/>
-          <w:shd w:fill="auto" w:val="clear"/>
-          <w:vertAlign w:val="baseline"/>
-          <w:rtl w:val="0"/>
-        </w:rPr>
-        <w:t xml:space="preserve">On en parle plus tant que ça non ? Supprimer si j'ai loupé un argument important.</w:t>
-      </w:r>
-    </w:p>
-  </w:comment>
-  <w:comment w:author="Thomas Delcey" w:id="1" w:date="2026-05-13T14:52:32Z">
-    <w:p>
-      <w:pPr>
-        <w:keepNext w:val="0"/>
-        <w:keepLines w:val="0"/>
-        <w:pageBreakBefore w:val="0"/>
-        <w:widowControl w:val="0"/>
-        <w:pBdr>
-          <w:top w:space="0" w:sz="0" w:val="nil"/>
-          <w:left w:space="0" w:sz="0" w:val="nil"/>
-          <w:bottom w:space="0" w:sz="0" w:val="nil"/>
-          <w:right w:space="0" w:sz="0" w:val="nil"/>
-          <w:between w:space="0" w:sz="0" w:val="nil"/>
-        </w:pBdr>
-        <w:shd w:fill="auto" w:val="clear"/>
-        <w:spacing w:after="0" w:before="0" w:line="240" w:lineRule="auto"/>
-        <w:ind w:left="0" w:right="0" w:firstLine="0"/>
-        <w:jc w:val="left"/>
-        <w:rPr>
-          <w:rFonts w:ascii="Arial" w:cs="Arial" w:eastAsia="Arial" w:hAnsi="Arial"/>
-          <w:b w:val="0"/>
-          <w:bCs w:val="0"/>
-          <w:i w:val="0"/>
-          <w:iCs w:val="0"/>
-          <w:smallCaps w:val="0"/>
-          <w:strike w:val="0"/>
-          <w:color w:val="000000"/>
-          <w:sz w:val="22"/>
-          <w:szCs w:val="22"/>
-          <w:u w:val="none"/>
-          <w:shd w:fill="auto" w:val="clear"/>
-          <w:vertAlign w:val="baseline"/>
-        </w:rPr>
-      </w:pPr>
-      <w:r>
-        <w:rPr>
-          <w:rFonts w:ascii="Arial" w:cs="Arial" w:eastAsia="Arial" w:hAnsi="Arial"/>
-          <w:b w:val="0"/>
-          <w:bCs w:val="0"/>
-          <w:i w:val="0"/>
-          <w:iCs w:val="0"/>
-          <w:smallCaps w:val="0"/>
-          <w:strike w:val="0"/>
-          <w:color w:val="000000"/>
-          <w:sz w:val="22"/>
-          <w:szCs w:val="22"/>
-          <w:u w:val="none"/>
-          <w:shd w:fill="auto" w:val="clear"/>
-          <w:vertAlign w:val="baseline"/>
-          <w:rtl w:val="0"/>
-        </w:rPr>
-        <w:t xml:space="preserve">"Most concepts associated with “old” behavioral economics are absent from “new” behavioral economists’ vocabulary (e.g., the 2000–2009 semantic clusters “Game Theory” and “Decision Theory”), and where such concepts do appear, they are largely confined to institutionalist or heterodox clusters (e.g., the 2000–2009 semantic cluster “Rationality and its Limits”)." </w:t>
-      </w:r>
-    </w:p>
-    <w:p>
-      <w:pPr>
-        <w:keepNext w:val="0"/>
-        <w:keepLines w:val="0"/>
-        <w:pageBreakBefore w:val="0"/>
-        <w:widowControl w:val="0"/>
-        <w:pBdr>
-          <w:top w:space="0" w:sz="0" w:val="nil"/>
-          <w:left w:space="0" w:sz="0" w:val="nil"/>
-          <w:bottom w:space="0" w:sz="0" w:val="nil"/>
-          <w:right w:space="0" w:sz="0" w:val="nil"/>
-          <w:between w:space="0" w:sz="0" w:val="nil"/>
-        </w:pBdr>
-        <w:shd w:fill="auto" w:val="clear"/>
-        <w:spacing w:after="0" w:before="0" w:line="240" w:lineRule="auto"/>
-        <w:ind w:left="0" w:right="0" w:firstLine="0"/>
-        <w:jc w:val="left"/>
-        <w:rPr>
-          <w:rFonts w:ascii="Arial" w:cs="Arial" w:eastAsia="Arial" w:hAnsi="Arial"/>
-          <w:b w:val="0"/>
-          <w:bCs w:val="0"/>
-          <w:i w:val="0"/>
-          <w:iCs w:val="0"/>
-          <w:smallCaps w:val="0"/>
-          <w:strike w:val="0"/>
-          <w:color w:val="000000"/>
-          <w:sz w:val="22"/>
-          <w:szCs w:val="22"/>
-          <w:u w:val="none"/>
-          <w:shd w:fill="auto" w:val="clear"/>
-          <w:vertAlign w:val="baseline"/>
-        </w:rPr>
-      </w:pPr>
-      <w:r>
-        <w:rPr>
-          <w:rtl w:val="0"/>
-        </w:rPr>
-      </w:r>
-    </w:p>
-    <w:p>
-      <w:pPr>
-        <w:keepNext w:val="0"/>
-        <w:keepLines w:val="0"/>
-        <w:pageBreakBefore w:val="0"/>
-        <w:widowControl w:val="0"/>
-        <w:pBdr>
-          <w:top w:space="0" w:sz="0" w:val="nil"/>
-          <w:left w:space="0" w:sz="0" w:val="nil"/>
-          <w:bottom w:space="0" w:sz="0" w:val="nil"/>
-          <w:right w:space="0" w:sz="0" w:val="nil"/>
-          <w:between w:space="0" w:sz="0" w:val="nil"/>
-        </w:pBdr>
-        <w:shd w:fill="auto" w:val="clear"/>
-        <w:spacing w:after="0" w:before="0" w:line="240" w:lineRule="auto"/>
-        <w:ind w:left="0" w:right="0" w:firstLine="0"/>
-        <w:jc w:val="left"/>
-        <w:rPr>
-          <w:rFonts w:ascii="Arial" w:cs="Arial" w:eastAsia="Arial" w:hAnsi="Arial"/>
-          <w:b w:val="0"/>
-          <w:bCs w:val="0"/>
-          <w:i w:val="0"/>
-          <w:iCs w:val="0"/>
-          <w:smallCaps w:val="0"/>
-          <w:strike w:val="0"/>
-          <w:color w:val="000000"/>
-          <w:sz w:val="22"/>
-          <w:szCs w:val="22"/>
-          <w:u w:val="none"/>
-          <w:shd w:fill="auto" w:val="clear"/>
-          <w:vertAlign w:val="baseline"/>
-        </w:rPr>
-      </w:pPr>
-      <w:r>
-        <w:rPr>
-          <w:rFonts w:ascii="Arial" w:cs="Arial" w:eastAsia="Arial" w:hAnsi="Arial"/>
-          <w:b w:val="0"/>
-          <w:bCs w:val="0"/>
-          <w:i w:val="0"/>
-          <w:iCs w:val="0"/>
-          <w:smallCaps w:val="0"/>
-          <w:strike w:val="0"/>
-          <w:color w:val="000000"/>
-          <w:sz w:val="22"/>
-          <w:szCs w:val="22"/>
-          <w:u w:val="none"/>
-          <w:shd w:fill="auto" w:val="clear"/>
-          <w:vertAlign w:val="baseline"/>
-          <w:rtl w:val="0"/>
-        </w:rPr>
-        <w:t xml:space="preserve">Du coup, ça valide plutôt l'H3 ou une H4: Simon est cité par des hétérodoxes qui s'en foutent du new BE.</w:t>
+        <w:t xml:space="preserve">Add the final number</w:t>
       </w:r>
     </w:p>
   </w:comment>
@@ -6075,7 +5661,7 @@
           <w:szCs w:val="20"/>
           <w:rtl w:val="0"/>
         </w:rPr>
-        <w:t xml:space="preserve"> One step in the discovery and interpretive process is often the assignment of “labels” to clusters in order to facilitate the interpretation of visualizations.</w:t>
+        <w:t xml:space="preserve"> One step in the discovery and interpretive process is often the assignment of “labels” to clusters in order to facilitate the interpretation of visualizations. We assign manually a label to each intertemporal semantic cluster and bibliometric community after qualitative inspection.</w:t>
       </w:r>
     </w:p>
   </w:footnote>
@@ -6153,7 +5739,7 @@
           <w:szCs w:val="20"/>
           <w:rtl w:val="0"/>
         </w:rPr>
-        <w:t xml:space="preserve"> The eight-year window for bibliometric communities follows established practice in the quantitative history of economics [@claveauMacrodynamics2016], which is generally between 5 and 10 years [@abramoAssessing2011]. In our case, economics being a social science with longer citation spans of life [@lariviereLongterm2008; @aistleitnerCitation2019], and our object of study spanning across multiple decades, a longer time window than 5 years is favored while preserving more granularity than a 10-year one.</w:t>
+        <w:t xml:space="preserve"> The eight-year window for defining bibliometric communities aligns with established practices in the quantitative history of economics [@claveauMacrodynamics2016], where timeframes typically range between 5 and 10 years [@abramoAssessing2011]. Given that economics exhibits longer citation lifespans than the natural sciences [@lariviereLongterm2008; @aistleitnerCitation2019], and considering the multi-decade scope of our study, we opted for a window longer than five years. This choice balances granularity with the need to capture enduring citation patterns, avoiding the coarser resolution of a 10-year window.</w:t>
       </w:r>
     </w:p>
   </w:footnote>

</xml_diff>

<commit_message>
Correcting fix: clean up malformed URLs in footnotes and paperoble
</commit_message>
<xml_diff>
--- a/paper/gdoc.docx
+++ b/paper/gdoc.docx
@@ -5004,20 +5004,8 @@
           <w:szCs w:val="20"/>
           <w:rtl w:val="0"/>
         </w:rPr>
-        <w:t xml:space="preserve">. A public version is available at the following url: </w:t>
-      </w:r>
-      <w:hyperlink r:id="rId1">
-        <w:r>
-          <w:rPr>
-            <w:color w:val="1155cc"/>
-            <w:sz w:val="20"/>
-            <w:szCs w:val="20"/>
-            <w:u w:val="single"/>
-            <w:rtl w:val="0"/>
-          </w:rPr>
-          <w:t xml:space="preserve">https://019adac8-81d4-aa0e-808c-08861c261fd2.share.connect.posit.cloud/</w:t>
-        </w:r>
-      </w:hyperlink>
+        <w:t xml:space="preserve">. A public version is available at the following url: [https://019adac8-81d4-aa0e-808c-08861c261fd2.share.connect.posit.cloud/](https://019adac8-81d4-aa0e-808c-08861c261fd2.share.connect.posit.cloud/).</w:t>
+      </w:r>
       <w:r>
         <w:rPr>
           <w:rtl w:val="0"/>
@@ -5579,7 +5567,7 @@
         </w:rPr>
         <w:t xml:space="preserve"> The application is available in the GitHub repository: </w:t>
       </w:r>
-      <w:hyperlink r:id="rId2">
+      <w:hyperlink r:id="rId1">
         <w:r>
           <w:rPr>
             <w:color w:val="1155cc"/>
@@ -5597,24 +5585,7 @@
           <w:szCs w:val="20"/>
           <w:rtl w:val="0"/>
         </w:rPr>
-        <w:t xml:space="preserve">. For non technical-users, a public version is available at the following url: </w:t>
-      </w:r>
-      <w:hyperlink r:id="rId3">
-        <w:r>
-          <w:rPr>
-            <w:color w:val="1155cc"/>
-            <w:sz w:val="20"/>
-            <w:szCs w:val="20"/>
-            <w:u w:val="single"/>
-            <w:rtl w:val="0"/>
-          </w:rPr>
-          <w:t xml:space="preserve">https://019adac8-81d4-aa0e-808c-08861c261fd2.share.connect.posit.cloud/</w:t>
-        </w:r>
-      </w:hyperlink>
-      <w:r>
-        <w:rPr>
-          <w:rtl w:val="0"/>
-        </w:rPr>
+        <w:t xml:space="preserve">. For non technical-users, a public version is available at the following url: [https://019adac8-81d4-aa0e-808c-08861c261fd2.share.connect.posit.cloud/](https://019adac8-81d4-aa0e-808c-08861c261fd2.share.connect.posit.cloud/).</w:t>
       </w:r>
     </w:p>
   </w:footnote>

</xml_diff>

<commit_message>
Rereading of the paper and add missing information in bibliography
</commit_message>
<xml_diff>
--- a/paper/gdoc.docx
+++ b/paper/gdoc.docx
@@ -32,7 +32,7 @@
         <w:rPr>
           <w:rtl w:val="0"/>
         </w:rPr>
-        <w:t xml:space="preserve">In the last decade, the number of history of economics papers employing quantitative methods has increased [see e.g., @goutsmedtQuantitative2023]. Several essays have adopted a reflexive stance, examining the implications of using quantitative methods in the history of economics [@cherrierQuantitative2018; @edwardsQuantitative2018]. These contributions provided broad discussions on the use of such methods. However, given the virtually unlimited variety of quantitative approaches potentially relevant to historians of economics—and the wide array of research questions they can address—these reflections often remain at an abstract level and offer little practical guidance. As a result, they tend to provide useful broad overviews, but without clearly articulating what quantification entails in practice, and how quantitative methods can be both meaningful and challenging to integrate into research specific to the history and philosophy of economics.</w:t>
+        <w:t xml:space="preserve">In the last decade, the number of history of economics articles employing quantitative methods has increased [see e.g., @goutsmedtQuantitative2023]. Several essays have adopted a reflexive stance, examining the implications of using quantitative methods in the history of economics [@cherrierQuantitative2018; @edwardsQuantitative2018]. These contributions provided broad discussions on the use of such methods. However, given the virtually unlimited variety of quantitative approaches potentially relevant to historians of economics—and the wide array of research questions they can address—these reflections often remain at an abstract level and offer little practical guidance. As a result, they tend to provide useful broad overviews, but without clearly articulating what quantification entails in practice, and how quantitative methods can be both meaningful and challenging to integrate into research specific to the history and philosophy of economics.</w:t>
       </w:r>
     </w:p>
     <w:p>
@@ -45,6 +45,17 @@
         </w:rPr>
         <w:t xml:space="preserve">Our contribution sits between a historical study that uses quantitative methods to answer a specific question and a general methodological discussion of those methods. From the collection of data to the interpretation of results, we illustrate concretely how these methods are useful and examine, in practice, the methodological choices they entail. We present a step-by-step application of specific quantitative methods to a broad topic: the history of rationality in the twentieth century—using this case to illuminate, in practice, what choices quantitative analysis involves.</w:t>
       </w:r>
+      <w:r>
+        <w:rPr>
+          <w:vertAlign w:val="superscript"/>
+        </w:rPr>
+        <w:footnoteReference w:customMarkFollows="0" w:id="0"/>
+      </w:r>
+      <w:r>
+        <w:rPr>
+          <w:rtl w:val="0"/>
+        </w:rPr>
+      </w:r>
     </w:p>
     <w:p>
       <w:pPr>
@@ -60,7 +71,7 @@
         <w:rPr>
           <w:rtl w:val="0"/>
         </w:rPr>
-        <w:t xml:space="preserve">Unsupervised methods are machine-learning techniques in which algorithms identify patterns from unlabelled data, as opposed to supervised learning methods that learn patterns from labelled data to make inferences. The goal of unsupervised methods is not necessarily to provide a “measure” [@grimmerText2022]—though they can be adapted to do so—but to organise in categories large corpora and enable accelerated and “distant reading” [@morettiDistant2013; @guldiDangerous2023]. </w:t>
+        <w:t xml:space="preserve">Unsupervised methods are machine-learning techniques in which algorithms identify patterns from unlabelled data, as opposed to supervised learning methods that learn patterns from labelled data, based on pre-defined categories, to make inferences. The goal of unsupervised methods is not necessarily to provide a “measure” [@grimmerText2022]—though they can be adapted to do so—but to organise in categories large corpora and enable accelerated and “distant reading” [@morettiDistant2013; @guldiDangerous2023]. </w:t>
       </w:r>
       <w:r>
         <w:rPr>
@@ -77,7 +88,7 @@
         <w:rPr>
           <w:rtl w:val="0"/>
         </w:rPr>
-        <w:t xml:space="preserve">Our article draws on two types of data, texts and citations. The analysis of textual corpora offers a direct window into the semantic content of debates, while citation data provides a means of tracing intellectual connections and channels of influence within the discipline. We show how a large corpus of documents can be classified based on the information contained in textual and citation data—what we call “</w:t>
+        <w:t xml:space="preserve">Our article draws on two types of data, texts and citations. The analysis of textual corpora offers a direct window into the semantic content of economic contributions, while citation data provides a means of tracing intellectual connections and channels of influence within the discipline. We show how a large corpus of documents can be classified based on the information contained in textual and citation data—what we call “</w:t>
       </w:r>
       <w:r>
         <w:rPr>
@@ -111,7 +122,7 @@
         <w:rPr>
           <w:vertAlign w:val="superscript"/>
         </w:rPr>
-        <w:footnoteReference w:customMarkFollows="0" w:id="0"/>
+        <w:footnoteReference w:customMarkFollows="0" w:id="1"/>
       </w:r>
       <w:r>
         <w:rPr>
@@ -123,23 +134,23 @@
         <w:rPr>
           <w:rtl w:val="0"/>
         </w:rPr>
-        <w:t xml:space="preserve">Combining both allows us to illustrate concretely the use of two popular sets of data for the history of economics. This combination is also justified by what we regard as a crucial principle of quantitative analysis in the history of economics in particular, and more broadly in the history of science: the triangulation of different sources of data and the validation of results through the comparison of findings obtained from distinct methods.</w:t>
-      </w:r>
-      <w:r>
-        <w:rPr>
-          <w:rtl w:val="0"/>
-        </w:rPr>
-      </w:r>
-    </w:p>
-    <w:p>
-      <w:pPr>
-        <w:rPr/>
-      </w:pPr>
-      <w:r>
-        <w:rPr>
-          <w:rtl w:val="0"/>
-        </w:rPr>
-        <w:t xml:space="preserve">Above all, our discussion aims to illustrate a core principle for historical inquiry with such unsupervised quantitative methods. They require continuous back-and-forth between aggregate quantitative results, complementary indicators used for interpretation, and preliminary knowledge and close reading of primary and secondary sources. These methods function not only as a form of corroboration but also as “discovery methods” [@grimmerText2022]: they facilitate the exploration of large datasets to reveal historical patterns. They often confirm, and sometimes complement, established findings. They can also reveal pitfalls and blind spots in existing research.</w:t>
+        <w:t xml:space="preserve">Combining both allows us to illustrate concretely the use of two popular sets of data for the history of economics. This combination is also justified by what we regard as a crucial principle of quantitative analysis in the history of economics and other disciplines: the triangulation of different sources of data and the validation of results through the comparison of findings obtained from distinct methods.</w:t>
+      </w:r>
+      <w:r>
+        <w:rPr>
+          <w:rtl w:val="0"/>
+        </w:rPr>
+      </w:r>
+    </w:p>
+    <w:p>
+      <w:pPr>
+        <w:rPr/>
+      </w:pPr>
+      <w:r>
+        <w:rPr>
+          <w:rtl w:val="0"/>
+        </w:rPr>
+        <w:t xml:space="preserve">Above all, our discussion aims to illustrate a core principle for historical inquiry with such unsupervised quantitative methods. They require continuous back-and-forth between aggregate quantitative results, complementary indicators used for interpretation, as well as preliminary knowledge and close reading of primary and secondary sources. These methods function not only as a form of corroboration but also as “discovery methods” [@grimmerText2022]: they facilitate the exploration of large datasets to reveal historical patterns. They often confirm, and sometimes complement, established findings. They can also reveal pitfalls and blind spots in existing research.</w:t>
       </w:r>
     </w:p>
     <w:p>
@@ -156,7 +167,7 @@
         <w:rPr>
           <w:vertAlign w:val="superscript"/>
         </w:rPr>
-        <w:footnoteReference w:customMarkFollows="0" w:id="1"/>
+        <w:footnoteReference w:customMarkFollows="0" w:id="2"/>
       </w:r>
       <w:r>
         <w:rPr>
@@ -185,7 +196,63 @@
         <w:rPr>
           <w:rtl w:val="0"/>
         </w:rPr>
-        <w:t xml:space="preserve">In what follows, we concentrate on what such a quantitative analysis requires in practice. We highlight what kinds of questions and challenges arise at each stage of the research process. This focus lets us highlight (a) the crucial issue of selecting sources and building data; (b) how even simple quantitative assessments can be informative; (c) the challenges and subjective choices involved in building and adapting tools; and (d) why interpreting results demands careful attention to various indicators and close knowledge of both the corpus and its historical context. By tracing, step by step, how we assemble and analyze our corpus, we aim to provide a practical example and a reflection on broader methodological issues faced by historians of economics in quantitative inquiries. </w:t>
+        <w:t xml:space="preserve">In what follows, we concentrate on what such a quantitative analysis requires in practice. We highlight what kinds of questions and challenges arise at each stage of the research process. This focus lets us highlight </w:t>
+      </w:r>
+      <w:r>
+        <w:rPr>
+          <w:i w:val="1"/>
+          <w:iCs w:val="1"/>
+          <w:rtl w:val="0"/>
+        </w:rPr>
+        <w:t xml:space="preserve">(a)</w:t>
+      </w:r>
+      <w:r>
+        <w:rPr>
+          <w:rtl w:val="0"/>
+        </w:rPr>
+        <w:t xml:space="preserve"> the crucial issue of selecting sources and building data; </w:t>
+      </w:r>
+      <w:r>
+        <w:rPr>
+          <w:i w:val="1"/>
+          <w:iCs w:val="1"/>
+          <w:rtl w:val="0"/>
+        </w:rPr>
+        <w:t xml:space="preserve">(b)</w:t>
+      </w:r>
+      <w:r>
+        <w:rPr>
+          <w:rtl w:val="0"/>
+        </w:rPr>
+        <w:t xml:space="preserve"> how even simple quantitative assessments can be informative; </w:t>
+      </w:r>
+      <w:r>
+        <w:rPr>
+          <w:i w:val="1"/>
+          <w:iCs w:val="1"/>
+          <w:rtl w:val="0"/>
+        </w:rPr>
+        <w:t xml:space="preserve">(c)</w:t>
+      </w:r>
+      <w:r>
+        <w:rPr>
+          <w:rtl w:val="0"/>
+        </w:rPr>
+        <w:t xml:space="preserve"> the challenges and subjective choices involved in building and adapting tools; and </w:t>
+      </w:r>
+      <w:r>
+        <w:rPr>
+          <w:i w:val="1"/>
+          <w:iCs w:val="1"/>
+          <w:rtl w:val="0"/>
+        </w:rPr>
+        <w:t xml:space="preserve">(d)</w:t>
+      </w:r>
+      <w:r>
+        <w:rPr>
+          <w:rtl w:val="0"/>
+        </w:rPr>
+        <w:t xml:space="preserve"> why interpreting results demands careful attention to various indicators and close knowledge of both the corpus and its historical context. By tracing, step by step, how we assemble and analyze our corpus, we aim to provide a practical example and a reflection on broader methodological issues faced by historians of economics in quantitative inquiries. </w:t>
       </w:r>
       <w:r>
         <w:rPr>
@@ -197,7 +264,7 @@
         <w:rPr>
           <w:vertAlign w:val="superscript"/>
         </w:rPr>
-        <w:footnoteReference w:customMarkFollows="0" w:id="2"/>
+        <w:footnoteReference w:customMarkFollows="0" w:id="3"/>
       </w:r>
       <w:r>
         <w:rPr>
@@ -330,13 +397,13 @@
         <w:rPr>
           <w:vertAlign w:val="superscript"/>
         </w:rPr>
-        <w:footnoteReference w:customMarkFollows="0" w:id="3"/>
-      </w:r>
-      <w:r>
-        <w:rPr>
-          <w:rtl w:val="0"/>
-        </w:rPr>
-        <w:t xml:space="preserve"> More generally, citation practices have only standardised progressively in the postwar period. Consequently, citation data are most of the time relatively poor before the 1960s. Last, although they provide useful metadata and citation information, these databases generally lack full text, which is subject to copyright and therefore, a large and representative corpus of economics articles cannot be obtained from a single publisher. </w:t>
+        <w:footnoteReference w:customMarkFollows="0" w:id="4"/>
+      </w:r>
+      <w:r>
+        <w:rPr>
+          <w:rtl w:val="0"/>
+        </w:rPr>
+        <w:t xml:space="preserve"> More generally, citation practices have only standardised progressively in the postwar period. Consequently, citation data are most of the time relatively poor before the 1960s. Last, although they provide useful metadata and citation information, these databases generally lack full text, which is subject to copyright and therefore. A large and representative corpus of economics articles cannot be obtained from a single publisher. </w:t>
       </w:r>
     </w:p>
     <w:p>
@@ -359,7 +426,7 @@
         <w:rPr>
           <w:rtl w:val="0"/>
         </w:rPr>
-        <w:t xml:space="preserve">Full texts face similar limitations: mathematical expressions and empirical material, such as tables, are often poorly captured by providers and difficult to encode properly. These shortcomings restrict what can be studied by quantitative tools.</w:t>
+        <w:t xml:space="preserve">Full texts face similar limitations: mathematical expressions and empirical materials, such as those included in tables, are often poorly captured by providers and difficult to encode properly. These shortcomings restrict what can be studied by quantitative tools.</w:t>
       </w:r>
       <w:r>
         <w:rPr>
@@ -453,13 +520,25 @@
         <w:rPr>
           <w:rtl w:val="0"/>
         </w:rPr>
-        <w:t xml:space="preserve">For citation data, the Web of Science (WoS) provides a reliable and consistent coverage for our period and has been widely used in the history of economics</w:t>
-      </w:r>
-      <w:r>
-        <w:rPr>
-          <w:rtl w:val="0"/>
-        </w:rPr>
-        <w:t xml:space="preserve"> [@culbertReference2025;@martin-martinGoogleScholarMicrosoft2021;@claveauMacrodynamics2016]</w:t>
+        <w:t xml:space="preserve">For citation data, the Web of Science (WoS) provides a reliable and consistent coverage for our period </w:t>
+      </w:r>
+      <w:r>
+        <w:rPr>
+          <w:rtl w:val="0"/>
+        </w:rPr>
+        <w:t xml:space="preserve">[@culbertReference2025;@martin-martinGoogleScholarMicrosoft2021] </w:t>
+      </w:r>
+      <w:r>
+        <w:rPr>
+          <w:rtl w:val="0"/>
+        </w:rPr>
+        <w:t xml:space="preserve">and has been widely used in the history of economics</w:t>
+      </w:r>
+      <w:r>
+        <w:rPr>
+          <w:rtl w:val="0"/>
+        </w:rPr>
+        <w:t xml:space="preserve"> [@claveauMacrodynamics2016]</w:t>
       </w:r>
       <w:r>
         <w:rPr>
@@ -471,7 +550,7 @@
         <w:rPr>
           <w:rtl w:val="0"/>
         </w:rPr>
-        <w:t xml:space="preserve"> As for full text, we relied on three providers. First, JSTOR’s full-text collection offers good-quality scans of most leading economics journals [@jstorText2025]. </w:t>
+        <w:t xml:space="preserve"> As for full text, we relied on three providers. First, JSTOR’s full-text collection offers relatively good-quality scans of most leading economics journals [@jstorText2025]. </w:t>
       </w:r>
       <w:r>
         <w:rPr>
@@ -483,7 +562,7 @@
         <w:rPr>
           <w:vertAlign w:val="superscript"/>
         </w:rPr>
-        <w:footnoteReference w:customMarkFollows="0" w:id="4"/>
+        <w:footnoteReference w:customMarkFollows="0" w:id="5"/>
       </w:r>
       <w:r>
         <w:rPr>
@@ -501,7 +580,7 @@
         <w:rPr>
           <w:vertAlign w:val="superscript"/>
         </w:rPr>
-        <w:footnoteReference w:customMarkFollows="0" w:id="5"/>
+        <w:footnoteReference w:customMarkFollows="0" w:id="6"/>
       </w:r>
       <w:r>
         <w:rPr>
@@ -548,7 +627,7 @@
         <w:rPr>
           <w:vertAlign w:val="superscript"/>
         </w:rPr>
-        <w:footnoteReference w:customMarkFollows="0" w:id="6"/>
+        <w:footnoteReference w:customMarkFollows="0" w:id="7"/>
       </w:r>
       <w:r>
         <w:rPr>
@@ -622,7 +701,7 @@
         <w:rPr>
           <w:vertAlign w:val="superscript"/>
         </w:rPr>
-        <w:footnoteReference w:customMarkFollows="0" w:id="7"/>
+        <w:footnoteReference w:customMarkFollows="0" w:id="8"/>
       </w:r>
       <w:r>
         <w:rPr>
@@ -650,7 +729,7 @@
         <w:rPr>
           <w:vertAlign w:val="superscript"/>
         </w:rPr>
-        <w:footnoteReference w:customMarkFollows="0" w:id="8"/>
+        <w:footnoteReference w:customMarkFollows="0" w:id="9"/>
       </w:r>
       <w:r>
         <w:rPr>
@@ -808,7 +887,7 @@
         <w:rPr>
           <w:vertAlign w:val="superscript"/>
         </w:rPr>
-        <w:footnoteReference w:customMarkFollows="0" w:id="9"/>
+        <w:footnoteReference w:customMarkFollows="0" w:id="10"/>
       </w:r>
       <w:r>
         <w:rPr>
@@ -880,13 +959,13 @@
         <w:rPr>
           <w:rtl w:val="0"/>
         </w:rPr>
-        <w:t xml:space="preserve">The first challenge was thus to delineate economics as an object of study. Some research objects are relatively easier to delineate, and the transition from a database to a well-defined corpus is therefore straightforward. For example, writing the history of a particular journal [@edwardsFifty2020; @charlesRevue2025] or of one or several individuals [@trucDisciplinary2025; @andradaUnderstanding2017; @fontanaFragmentation2023] entails comparatively fewer definitional or boundary challenges. While some large-scale studies focus on the discipline as a whole [@claveauMacrodynamics2016; @ambrosinoWhat2018; @bacciniExploring2025], such work still requires an operational definition of what are documents in “economics.” </w:t>
-      </w:r>
-      <w:r>
-        <w:rPr>
-          <w:rtl w:val="0"/>
-        </w:rPr>
-        <w:t xml:space="preserve">This definitional issue becomes even more pronounced when the object of study is a specific “field” or “research specialty” [@morrisMapping2008; @lyutovMachine2021]</w:t>
+        <w:t xml:space="preserve">The first challenge was thus to delineate economics as an object of study. Some research objects are relatively easier to delineate, and the transition from a database to a well-defined corpus is therefore straightforward. For example, writing the history of a particular journal [@charlesRevue2025;@edwardsFifty2020], or of one or several individuals [@andradaUnderstanding2017; @trucDisciplinary2025] entails comparatively fewer definitional or boundary challenges. While some large-scale studies focus on the discipline as a whole [@ambrosinoWhat2018;@bacciniExploring2025;@claveauMacrodynamics2016], such work still requires an operational definition of what are documents in “economics.” </w:t>
+      </w:r>
+      <w:r>
+        <w:rPr>
+          <w:rtl w:val="0"/>
+        </w:rPr>
+        <w:t xml:space="preserve">This definitional issue becomes even more pronounced when the object of study is a specific “field” or “research specialty” [@lyutovMachine2021;@morrisMapping2008]</w:t>
       </w:r>
       <w:r>
         <w:rPr>
@@ -1042,13 +1121,13 @@
           <w:iCs w:val="1"/>
           <w:rtl w:val="0"/>
         </w:rPr>
-        <w:t xml:space="preserve">economic</w:t>
-      </w:r>
-      <w:r>
-        <w:rPr>
-          <w:rtl w:val="0"/>
-        </w:rPr>
-        <w:t xml:space="preserve"> documents by building the corpus from </w:t>
+        <w:t xml:space="preserve">economics</w:t>
+      </w:r>
+      <w:r>
+        <w:rPr>
+          <w:rtl w:val="0"/>
+        </w:rPr>
+        <w:t xml:space="preserve"> documents by building the corpus from a list of </w:t>
       </w:r>
       <w:r>
         <w:rPr>
@@ -1080,7 +1159,7 @@
         <w:rPr>
           <w:vertAlign w:val="superscript"/>
         </w:rPr>
-        <w:footnoteReference w:customMarkFollows="0" w:id="10"/>
+        <w:footnoteReference w:customMarkFollows="0" w:id="11"/>
       </w:r>
       <w:r>
         <w:rPr>
@@ -1098,7 +1177,7 @@
         <w:rPr>
           <w:vertAlign w:val="superscript"/>
         </w:rPr>
-        <w:footnoteReference w:customMarkFollows="0" w:id="11"/>
+        <w:footnoteReference w:customMarkFollows="0" w:id="12"/>
       </w:r>
       <w:r>
         <w:rPr>
@@ -1110,7 +1189,21 @@
         <w:rPr>
           <w:rtl w:val="0"/>
         </w:rPr>
-        <w:t xml:space="preserve">Filtering the raw corpus to retain only English-language research articles from these journals, we obtain 259,165 articles published between 1900 and 2009. These articles constitute what we have called our meta-corpus. </w:t>
+        <w:t xml:space="preserve">Filtering the raw corpus to retain only English-language research articles from these journals, we obtain 259,165 articles published between 1900 and 2009. These articles constitute what we have called our </w:t>
+      </w:r>
+      <w:r>
+        <w:rPr>
+          <w:i w:val="1"/>
+          <w:iCs w:val="1"/>
+          <w:rtl w:val="0"/>
+        </w:rPr>
+        <w:t xml:space="preserve">meta-corpus</w:t>
+      </w:r>
+      <w:r>
+        <w:rPr>
+          <w:rtl w:val="0"/>
+        </w:rPr>
+        <w:t xml:space="preserve">. </w:t>
       </w:r>
     </w:p>
     <w:p>
@@ -1136,13 +1229,27 @@
           <w:iCs w:val="1"/>
           <w:rtl w:val="0"/>
         </w:rPr>
-        <w:t xml:space="preserve">homo oeconomicus”</w:t>
-      </w:r>
-      <w:r>
-        <w:rPr>
-          <w:rtl w:val="0"/>
-        </w:rPr>
-        <w:t xml:space="preserve">, or the “transitivity and completeness of preferences”.</w:t>
+        <w:t xml:space="preserve">homo oeconomicus</w:t>
+      </w:r>
+      <w:r>
+        <w:rPr>
+          <w:rtl w:val="0"/>
+        </w:rPr>
+        <w:t xml:space="preserve">,</w:t>
+      </w:r>
+      <w:r>
+        <w:rPr>
+          <w:i w:val="1"/>
+          <w:iCs w:val="1"/>
+          <w:rtl w:val="0"/>
+        </w:rPr>
+        <w:t xml:space="preserve">”</w:t>
+      </w:r>
+      <w:r>
+        <w:rPr>
+          <w:rtl w:val="0"/>
+        </w:rPr>
+        <w:t xml:space="preserve"> or the “transitivity” and “completeness of preferences.”</w:t>
       </w:r>
     </w:p>
     <w:p>
@@ -1177,13 +1284,13 @@
         <w:rPr>
           <w:rtl w:val="0"/>
         </w:rPr>
-        <w:t xml:space="preserve">To overcome this issue, we use a Large Language Model (LLM) to identify documents—and in particular specific sentences within documents—that deal with rationality in our corpus of economic articles.</w:t>
-      </w:r>
-      <w:r>
-        <w:rPr>
-          <w:vertAlign w:val="superscript"/>
-        </w:rPr>
-        <w:footnoteReference w:customMarkFollows="0" w:id="12"/>
+        <w:t xml:space="preserve">To overcome this issue, we use a Large Language Model (LLM) to identify documents—and in particular specific sentences within documents—that deal with rationality in our meta-corpus of economic articles.</w:t>
+      </w:r>
+      <w:r>
+        <w:rPr>
+          <w:vertAlign w:val="superscript"/>
+        </w:rPr>
+        <w:footnoteReference w:customMarkFollows="0" w:id="13"/>
       </w:r>
       <w:r>
         <w:rPr>
@@ -1207,7 +1314,7 @@
         <w:rPr>
           <w:rtl w:val="0"/>
         </w:rPr>
-        <w:t xml:space="preserve">Such a model represents texts as vectors—often called embeddings—that capture their context and meaning</w:t>
+        <w:t xml:space="preserve">Such a model represents texts as vectors—called embeddings—that capture their context and meaning</w:t>
       </w:r>
       <w:r>
         <w:rPr>
@@ -1231,7 +1338,7 @@
         <w:rPr>
           <w:vertAlign w:val="superscript"/>
         </w:rPr>
-        <w:footnoteReference w:customMarkFollows="0" w:id="13"/>
+        <w:footnoteReference w:customMarkFollows="0" w:id="14"/>
       </w:r>
       <w:r>
         <w:rPr>
@@ -1407,7 +1514,7 @@
         <w:rPr>
           <w:rtl w:val="0"/>
         </w:rPr>
-        <w:t xml:space="preserve"> explicitly mentioning the word “rationality,” we retrieve a set of </w:t>
+        <w:t xml:space="preserve"> explicitly mentioning the words “rationality” and “rational,” we retrieve a set of </w:t>
       </w:r>
       <w:r>
         <w:rPr>
@@ -1433,7 +1540,7 @@
         <w:rPr>
           <w:rtl w:val="0"/>
         </w:rPr>
-        <w:t xml:space="preserve"> the terms but likely discusses a related idea such as profit-maximization [see @ashIdeas2026 for a similar use].</w:t>
+        <w:t xml:space="preserve"> the terms but likely discuss a related idea such as profit-maximization [see @ashIdeas2026 for a similar use].</w:t>
       </w:r>
       <w:r>
         <w:rPr>
@@ -1455,7 +1562,7 @@
         <w:rPr>
           <w:vertAlign w:val="superscript"/>
         </w:rPr>
-        <w:footnoteReference w:customMarkFollows="0" w:id="14"/>
+        <w:footnoteReference w:customMarkFollows="0" w:id="15"/>
       </w:r>
       <w:r>
         <w:rPr>
@@ -1579,13 +1686,13 @@
         <w:rPr>
           <w:rtl w:val="0"/>
         </w:rPr>
-        <w:t xml:space="preserve"> based on all the sentences containing “rationality” or “rational”.</w:t>
-      </w:r>
-      <w:r>
-        <w:rPr>
-          <w:vertAlign w:val="superscript"/>
-        </w:rPr>
-        <w:footnoteReference w:customMarkFollows="0" w:id="15"/>
+        <w:t xml:space="preserve"> based on all the sentences containing “rationality” or “rational.”</w:t>
+      </w:r>
+      <w:r>
+        <w:rPr>
+          <w:vertAlign w:val="superscript"/>
+        </w:rPr>
+        <w:footnoteReference w:customMarkFollows="0" w:id="16"/>
       </w:r>
       <w:r>
         <w:rPr>
@@ -1603,7 +1710,7 @@
         <w:rPr>
           <w:vertAlign w:val="superscript"/>
         </w:rPr>
-        <w:footnoteReference w:customMarkFollows="0" w:id="16"/>
+        <w:footnoteReference w:customMarkFollows="0" w:id="17"/>
       </w:r>
       <w:r>
         <w:rPr>
@@ -1716,7 +1823,7 @@
         <w:rPr>
           <w:rtl w:val="0"/>
         </w:rPr>
-        <w:t xml:space="preserve">We </w:t>
+        <w:t xml:space="preserve">Thus, from our meta-corpus, we </w:t>
       </w:r>
       <w:r>
         <w:rPr>
@@ -1728,7 +1835,7 @@
         <w:rPr>
           <w:rtl w:val="0"/>
         </w:rPr>
-        <w:t xml:space="preserve"> a first corpus, that we call the </w:t>
+        <w:t xml:space="preserve"> a first sub-corpus, that we call the </w:t>
       </w:r>
       <w:r>
         <w:rPr>
@@ -1754,7 +1861,7 @@
         <w:rPr>
           <w:vertAlign w:val="superscript"/>
         </w:rPr>
-        <w:footnoteReference w:customMarkFollows="0" w:id="17"/>
+        <w:footnoteReference w:customMarkFollows="0" w:id="18"/>
       </w:r>
       <w:r>
         <w:rPr>
@@ -1837,7 +1944,7 @@
         <w:rPr>
           <w:rtl w:val="0"/>
         </w:rPr>
-        <w:t xml:space="preserve">each document consists of a set of sentences (and thus is represented by a set of vectors),  we can also give a vectorial representation to the document by computing the centroid of its sentence vectors. We select the 10% of articles published after 1960 whose centroids are closest to the corresponding representative vector. This articles-corpus, composed of 25,916 articles, is then used in the bibliometric analysis to identify </w:t>
+        <w:t xml:space="preserve">each article consists of a set of sentences (and thus is represented by a set of vectors),  we can also give a vectorial representation to the article by computing the centroid of its sentence vectors. We select the 10% of articles published after 1960 whose centroids are closest to the corresponding representative vector. This articles-corpus, composed of 25,916 articles, is then used in the bibliometric analysis to identify </w:t>
       </w:r>
       <w:r>
         <w:rPr>
@@ -1857,7 +1964,7 @@
         <w:rPr>
           <w:vertAlign w:val="superscript"/>
         </w:rPr>
-        <w:footnoteReference w:customMarkFollows="0" w:id="18"/>
+        <w:footnoteReference w:customMarkFollows="0" w:id="19"/>
       </w:r>
       <w:r>
         <w:rPr>
@@ -2141,7 +2248,7 @@
         <w:rPr>
           <w:rtl w:val="0"/>
         </w:rPr>
-        <w:t xml:space="preserve">Citation counts are a blunt tool and cannot answer many questions of interest to historians of economics: Who cites these works? Are they cited together? In what intellectual contexts do these citations occur? Moreover, focusing on a small set of references implies a degree of arbitrariness in the analysis. Likewise, simply counting the words that appear next to “rationality” tells us little about whether these words and expressions are used jointly within the same argument or whether they belong to distinct topics and contexts that mobilize the concept differently. It also overlooks the much broader vocabulary related to rationality (e.g., profit maximization, expected utility, social choice).</w:t>
+        <w:t xml:space="preserve">Citation counts are a blunt tool and cannot answer many questions of interest to historians of economics: Who cites these works? Are they cited together? In what intellectual contexts do these citations occur? Moreover, focusing on a small set of references implies a degree of arbitrariness in the analysis. Likewise, simply counting the words that appear next to “rationality” tells us little about whether these words and expressions are used jointly within the same argument or whether they belong to distinct contexts that mobilize the concept differently. It also overlooks the much broader vocabulary related to rationality (e.g., profit maximization, expected utility, social choice).</w:t>
       </w:r>
     </w:p>
     <w:p>
@@ -2158,7 +2265,7 @@
         <w:rPr>
           <w:vertAlign w:val="superscript"/>
         </w:rPr>
-        <w:footnoteReference w:customMarkFollows="0" w:id="19"/>
+        <w:footnoteReference w:customMarkFollows="0" w:id="20"/>
       </w:r>
       <w:r>
         <w:rPr>
@@ -2187,7 +2294,7 @@
         <w:rPr>
           <w:vertAlign w:val="superscript"/>
         </w:rPr>
-        <w:footnoteReference w:customMarkFollows="0" w:id="20"/>
+        <w:footnoteReference w:customMarkFollows="0" w:id="21"/>
       </w:r>
       <w:r>
         <w:rPr>
@@ -2199,45 +2306,45 @@
         <w:rPr>
           <w:vertAlign w:val="superscript"/>
         </w:rPr>
-        <w:footnoteReference w:customMarkFollows="0" w:id="21"/>
-      </w:r>
-      <w:r>
-        <w:rPr>
-          <w:rtl w:val="0"/>
-        </w:rPr>
-      </w:r>
-    </w:p>
-    <w:p>
-      <w:pPr>
-        <w:rPr/>
-      </w:pPr>
-      <w:r>
-        <w:rPr>
-          <w:rtl w:val="0"/>
-        </w:rPr>
-        <w:t xml:space="preserve">In this paper, we use unsupervised methods to analyse both the articles-corpus and the sentences-corpus. The articles-corpus consists of the 10% of articles whose embeddings are most similar to the annual representative vectors. To make sense of this large set of documents, we employ a method that groups together documents mobilizing similar understandings of rationality. We use bibliographic coupling, a method commonly employed in the history of economic thought [see e.g., @claveauMacrodynamics2016; @trucForty2022; @bacciniDoes2025]. In a bibliographic coupling network, documents are represented as nodes, and links between them are weighted according to the number of references they share. The more references two articles have in common, the stronger their connection—and, in network visualisations, the closer they tend to appear to one another. The underlying premise is that shared references provide a proxy for intellectual proximity. Such networks make it possible to identify communities of closely related documents and to delineate the core-periphery structure of a discipline or research field. </w:t>
-      </w:r>
-      <w:r>
-        <w:rPr>
-          <w:rtl w:val="0"/>
-        </w:rPr>
-      </w:r>
-    </w:p>
-    <w:p>
-      <w:pPr>
-        <w:rPr/>
-      </w:pPr>
-      <w:r>
-        <w:rPr>
-          <w:rtl w:val="0"/>
-        </w:rPr>
-        <w:t xml:space="preserve">However, citation practices tend to favor more recent works, which makes it unhelpful for historians to construct a single citation network spanning an entire century. Following a method that has proven effective in the field </w:t>
-      </w:r>
-      <w:r>
-        <w:rPr>
-          <w:rtl w:val="0"/>
-        </w:rPr>
-        <w:t xml:space="preserve">[@</w:t>
+        <w:footnoteReference w:customMarkFollows="0" w:id="22"/>
+      </w:r>
+      <w:r>
+        <w:rPr>
+          <w:rtl w:val="0"/>
+        </w:rPr>
+      </w:r>
+    </w:p>
+    <w:p>
+      <w:pPr>
+        <w:rPr/>
+      </w:pPr>
+      <w:r>
+        <w:rPr>
+          <w:rtl w:val="0"/>
+        </w:rPr>
+        <w:t xml:space="preserve">In this paper, we use unsupervised methods to analyse both the articles-corpus and the sentences-corpus. The articles-corpus consists of the 10% of articles whose embeddings are most similar to the annual representative vectors. To make sense of this large set of documents, we employ a method that groups together documents mobilizing similar understandings of rationality. We use bibliographic coupling, a method commonly employed in the history of economic thought [see e.g., @bacciniDoes2025;@claveauMacrodynamics2016; @trucForty2022]. In a bibliographic coupling network, documents are represented as nodes, and links between them are weighted according to the number of references they share. The more references two articles have in common, the stronger their connection—and, in network visualisations, the closer they tend to appear to one another. The underlying premise is that shared references provide a proxy for intellectual proximity. Such networks make it possible to identify communities of closely related documents and to delineate the core-periphery structure of a discipline or research field. </w:t>
+      </w:r>
+      <w:r>
+        <w:rPr>
+          <w:rtl w:val="0"/>
+        </w:rPr>
+      </w:r>
+    </w:p>
+    <w:p>
+      <w:pPr>
+        <w:rPr/>
+      </w:pPr>
+      <w:r>
+        <w:rPr>
+          <w:rtl w:val="0"/>
+        </w:rPr>
+        <w:t xml:space="preserve">However, citation practices tend to favor more recent works, which makes it unhelpful for historians to construct a single citation network spanning an entire century. Following a method that has proven effective in the history of economics </w:t>
+      </w:r>
+      <w:r>
+        <w:rPr>
+          <w:rtl w:val="0"/>
+        </w:rPr>
+        <w:t xml:space="preserve">[@camilottoNavigating2023;@</w:t>
       </w:r>
       <w:r>
         <w:rPr>
@@ -2249,7 +2356,7 @@
         <w:rPr>
           <w:rtl w:val="0"/>
         </w:rPr>
-        <w:t xml:space="preserve">; @goutsmedtIndependent2023; @camilottoNavigating2023]</w:t>
+        <w:t xml:space="preserve">; @goutsmedtIndependent2023]</w:t>
       </w:r>
       <w:r>
         <w:rPr>
@@ -2267,7 +2374,7 @@
         <w:rPr>
           <w:vertAlign w:val="superscript"/>
         </w:rPr>
-        <w:footnoteReference w:customMarkFollows="0" w:id="22"/>
+        <w:footnoteReference w:customMarkFollows="0" w:id="23"/>
       </w:r>
       <w:r>
         <w:rPr>
@@ -2337,7 +2444,7 @@
         <w:rPr>
           <w:vertAlign w:val="superscript"/>
         </w:rPr>
-        <w:footnoteReference w:customMarkFollows="0" w:id="23"/>
+        <w:footnoteReference w:customMarkFollows="0" w:id="24"/>
       </w:r>
       <w:r>
         <w:rPr>
@@ -2424,7 +2531,7 @@
         <w:rPr>
           <w:vertAlign w:val="superscript"/>
         </w:rPr>
-        <w:footnoteReference w:customMarkFollows="0" w:id="24"/>
+        <w:footnoteReference w:customMarkFollows="0" w:id="25"/>
       </w:r>
       <w:r>
         <w:rPr>
@@ -2436,7 +2543,7 @@
         <w:rPr>
           <w:vertAlign w:val="superscript"/>
         </w:rPr>
-        <w:footnoteReference w:customMarkFollows="0" w:id="25"/>
+        <w:footnoteReference w:customMarkFollows="0" w:id="26"/>
       </w:r>
       <w:r>
         <w:rPr>
@@ -2633,7 +2740,7 @@
         <w:rPr>
           <w:vertAlign w:val="superscript"/>
         </w:rPr>
-        <w:footnoteReference w:customMarkFollows="0" w:id="26"/>
+        <w:footnoteReference w:customMarkFollows="0" w:id="27"/>
       </w:r>
       <w:r>
         <w:rPr>
@@ -2645,7 +2752,7 @@
         <w:rPr>
           <w:vertAlign w:val="superscript"/>
         </w:rPr>
-        <w:footnoteReference w:customMarkFollows="0" w:id="27"/>
+        <w:footnoteReference w:customMarkFollows="0" w:id="28"/>
       </w:r>
       <w:r>
         <w:rPr>
@@ -2850,7 +2957,7 @@
         <w:rPr>
           <w:rtl w:val="0"/>
         </w:rPr>
-        <w:t xml:space="preserve"> [@vonneumannTheory1944], while @kahnemanProspect1979 becomes the most cited reference in the 2000s.</w:t>
+        <w:t xml:space="preserve"> [-@vonneumannTheory1944], while @kahnemanProspect1979 becomes the most cited reference in the 2000s.</w:t>
       </w:r>
     </w:p>
     <w:p>
@@ -2896,7 +3003,7 @@
         <w:rPr>
           <w:rtl w:val="0"/>
         </w:rPr>
-        <w:t xml:space="preserve"> community in the 1981-1988 window. As with the semantic clusters, for each bibliometric community in each temporal window we extract equivalent indicators: the most identifying words, the sentences closest to the representative vectors—based on the articles belonging to the community—as well as the most cited references. We also examine the flows of each community in a given window: that is, whether its nodes derive primarily from the same or from different communities in preceding periods (“origins”)  and what they become in the following period (“destinies”).</w:t>
+        <w:t xml:space="preserve"> community in the 1981-1988 window, that remains until the last window (2002-2009). As with the semantic clusters, for each bibliometric community in each temporal window we extract equivalent indicators: the most identifying words, the sentences closest to the representative vectors—based on the articles belonging to the community—as well as the most cited references. We also examine the flows of each community in a given window: that is, whether its nodes derive primarily from the same or from different communities in preceding periods (“origins”)  and what they become in the following period (“destinies”).</w:t>
       </w:r>
       <w:r>
         <w:rPr>
@@ -2976,7 +3083,7 @@
         <w:rPr>
           <w:vertAlign w:val="superscript"/>
         </w:rPr>
-        <w:footnoteReference w:customMarkFollows="0" w:id="28"/>
+        <w:footnoteReference w:customMarkFollows="0" w:id="29"/>
       </w:r>
       <w:r>
         <w:rPr>
@@ -3059,7 +3166,7 @@
         <w:rPr>
           <w:vertAlign w:val="superscript"/>
         </w:rPr>
-        <w:footnoteReference w:customMarkFollows="0" w:id="29"/>
+        <w:footnoteReference w:customMarkFollows="0" w:id="30"/>
       </w:r>
       <w:r>
         <w:rPr>
@@ -3081,7 +3188,7 @@
         <w:rPr>
           <w:vertAlign w:val="superscript"/>
         </w:rPr>
-        <w:footnoteReference w:customMarkFollows="0" w:id="30"/>
+        <w:footnoteReference w:customMarkFollows="0" w:id="31"/>
       </w:r>
       <w:r>
         <w:rPr>
@@ -3185,7 +3292,7 @@
         <w:rPr>
           <w:vertAlign w:val="superscript"/>
         </w:rPr>
-        <w:footnoteReference w:customMarkFollows="0" w:id="31"/>
+        <w:footnoteReference w:customMarkFollows="0" w:id="32"/>
       </w:r>
       <w:r>
         <w:rPr>
@@ -3263,7 +3370,7 @@
         <w:rPr>
           <w:vertAlign w:val="superscript"/>
         </w:rPr>
-        <w:footnoteReference w:customMarkFollows="0" w:id="32"/>
+        <w:footnoteReference w:customMarkFollows="0" w:id="33"/>
       </w:r>
       <w:r>
         <w:rPr>
@@ -3275,7 +3382,7 @@
         <w:rPr>
           <w:vertAlign w:val="superscript"/>
         </w:rPr>
-        <w:footnoteReference w:customMarkFollows="0" w:id="33"/>
+        <w:footnoteReference w:customMarkFollows="0" w:id="34"/>
       </w:r>
       <w:r>
         <w:rPr>
@@ -3387,7 +3494,7 @@
         <w:rPr>
           <w:vertAlign w:val="superscript"/>
         </w:rPr>
-        <w:footnoteReference w:customMarkFollows="0" w:id="34"/>
+        <w:footnoteReference w:customMarkFollows="0" w:id="35"/>
       </w:r>
       <w:r>
         <w:rPr>
@@ -3447,7 +3554,7 @@
         <w:rPr>
           <w:vertAlign w:val="superscript"/>
         </w:rPr>
-        <w:footnoteReference w:customMarkFollows="0" w:id="35"/>
+        <w:footnoteReference w:customMarkFollows="0" w:id="36"/>
       </w:r>
       <w:r>
         <w:rPr>
@@ -4067,7 +4174,7 @@
         <w:rPr>
           <w:vertAlign w:val="superscript"/>
         </w:rPr>
-        <w:footnoteReference w:customMarkFollows="0" w:id="36"/>
+        <w:footnoteReference w:customMarkFollows="0" w:id="37"/>
       </w:r>
       <w:r>
         <w:rPr>
@@ -4380,6 +4487,32 @@
 
 <file path=word/footnotes.xml><?xml version="1.0" encoding="utf-8"?>
 <w:footnotes xmlns:mc="http://schemas.openxmlformats.org/markup-compatibility/2006" xmlns:o="urn:schemas-microsoft-com:office:office" xmlns:r="http://schemas.openxmlformats.org/officeDocument/2006/relationships" xmlns:m="http://schemas.openxmlformats.org/officeDocument/2006/math" xmlns:v="urn:schemas-microsoft-com:vml" xmlns:wp="http://schemas.openxmlformats.org/drawingml/2006/wordprocessingDrawing" xmlns:w10="urn:schemas-microsoft-com:office:word" xmlns:w="http://schemas.openxmlformats.org/wordprocessingml/2006/main" xmlns:wne="http://schemas.microsoft.com/office/word/2006/wordml" xmlns:sl="http://schemas.openxmlformats.org/schemaLibrary/2006/main" xmlns:a="http://schemas.openxmlformats.org/drawingml/2006/main" xmlns:pic="http://schemas.openxmlformats.org/drawingml/2006/picture" xmlns:c="http://schemas.openxmlformats.org/drawingml/2006/chart" xmlns:lc="http://schemas.openxmlformats.org/drawingml/2006/lockedCanvas" xmlns:dgm="http://schemas.openxmlformats.org/drawingml/2006/diagram" xmlns:wps="http://schemas.microsoft.com/office/word/2010/wordprocessingShape" xmlns:wpg="http://schemas.microsoft.com/office/word/2010/wordprocessingGroup" xmlns:w14="http://schemas.microsoft.com/office/word/2010/wordml" xmlns:w15="http://schemas.microsoft.com/office/word/2012/wordml" xmlns:w16="http://schemas.microsoft.com/office/word/2018/wordml" xmlns:w16cex="http://schemas.microsoft.com/office/word/2018/wordml/cex" xmlns:w16cid="http://schemas.microsoft.com/office/word/2016/wordml/cid" xmlns="http://schemas.microsoft.com/office/tasks/2019/documenttasks" xmlns:cr="http://schemas.microsoft.com/office/comments/2020/reactions">
+  <w:footnote w:id="2">
+    <w:p>
+      <w:pPr>
+        <w:spacing w:before="0" w:line="240" w:lineRule="auto"/>
+        <w:rPr>
+          <w:sz w:val="20"/>
+          <w:szCs w:val="20"/>
+        </w:rPr>
+      </w:pPr>
+      <w:r>
+        <w:rPr>
+          <w:rStyle w:val="FootnoteReference"/>
+          <w:vertAlign w:val="superscript"/>
+        </w:rPr>
+        <w:footnoteRef/>
+      </w:r>
+      <w:r>
+        <w:rPr>
+          <w:sz w:val="20"/>
+          <w:szCs w:val="20"/>
+          <w:rtl w:val="0"/>
+        </w:rPr>
+        <w:t xml:space="preserve"> To be clear, we don’t think that quantitative methods are only helpful for very large corpora. However, it is where their surplus value may appear as the most obvious.</w:t>
+      </w:r>
+    </w:p>
+  </w:footnote>
   <w:footnote w:id="1">
     <w:p>
       <w:pPr>
@@ -4402,14 +4535,1182 @@
           <w:szCs w:val="20"/>
           <w:rtl w:val="0"/>
         </w:rPr>
-        <w:t xml:space="preserve"> To be clear, we don’t think that quantitative methods are only helpful for very large corpora. However, it is where their surplus value may appear as the most obvious.</w:t>
+        <w:t xml:space="preserve"> The bibliometric communities, identified through network analysis, could also be called clusters. But we opted for “communities”, a term often used in network analysis, in order to distinguish them from the “semantic clusters.”</w:t>
+      </w:r>
+    </w:p>
+  </w:footnote>
+  <w:footnote w:id="4">
+    <w:p>
+      <w:pPr>
+        <w:spacing w:after="0" w:before="0" w:line="240" w:lineRule="auto"/>
+        <w:rPr>
+          <w:sz w:val="20"/>
+          <w:szCs w:val="20"/>
+        </w:rPr>
+      </w:pPr>
+      <w:r>
+        <w:rPr>
+          <w:rStyle w:val="FootnoteReference"/>
+          <w:vertAlign w:val="superscript"/>
+        </w:rPr>
+        <w:footnoteRef/>
+      </w:r>
+      <w:r>
+        <w:rPr>
+          <w:sz w:val="20"/>
+          <w:szCs w:val="20"/>
+          <w:rtl w:val="0"/>
+        </w:rPr>
+        <w:t xml:space="preserve"> </w:t>
+      </w:r>
+      <w:r>
+        <w:rPr>
+          <w:sz w:val="20"/>
+          <w:szCs w:val="20"/>
+          <w:rtl w:val="0"/>
+        </w:rPr>
+        <w:t xml:space="preserve">One of the main challenges for the quantitative history of economics is to move beyond reliance on proprietary digital libraries and to actively develop open, historically inclusive corpora. This includes incorporating materials produced in non-Anglophone countries and expanding the range of textual formats considered—such as books, book reviews, working papers, and conference proceedings.</w:t>
+      </w:r>
+      <w:r>
+        <w:rPr>
+          <w:rtl w:val="0"/>
+        </w:rPr>
+      </w:r>
+    </w:p>
+  </w:footnote>
+  <w:footnote w:id="9">
+    <w:p>
+      <w:pPr>
+        <w:spacing w:after="0" w:before="0" w:line="240" w:lineRule="auto"/>
+        <w:rPr>
+          <w:sz w:val="20"/>
+          <w:szCs w:val="20"/>
+        </w:rPr>
+      </w:pPr>
+      <w:r>
+        <w:rPr>
+          <w:rStyle w:val="FootnoteReference"/>
+          <w:vertAlign w:val="superscript"/>
+        </w:rPr>
+        <w:footnoteRef/>
+      </w:r>
+      <w:r>
+        <w:rPr>
+          <w:sz w:val="20"/>
+          <w:szCs w:val="20"/>
+          <w:rtl w:val="0"/>
+        </w:rPr>
+        <w:t xml:space="preserve"> Indeed, most textual methods are designed to identify commonalities within texts that share a specific linguistic structure. Hence, the same topic discussed by two documents in two different languages will likely not be identified as related because linguistic differences mask underlying semantic similarity</w:t>
+      </w:r>
+      <w:r>
+        <w:rPr>
+          <w:b w:val="1"/>
+          <w:bCs w:val="1"/>
+          <w:sz w:val="20"/>
+          <w:szCs w:val="20"/>
+          <w:rtl w:val="0"/>
+        </w:rPr>
+        <w:t xml:space="preserve">.</w:t>
+      </w:r>
+      <w:r>
+        <w:rPr>
+          <w:rtl w:val="0"/>
+        </w:rPr>
+      </w:r>
+    </w:p>
+  </w:footnote>
+  <w:footnote w:id="6">
+    <w:p>
+      <w:pPr>
+        <w:spacing w:after="0" w:before="0" w:line="240" w:lineRule="auto"/>
+        <w:rPr>
+          <w:sz w:val="20"/>
+          <w:szCs w:val="20"/>
+        </w:rPr>
+      </w:pPr>
+      <w:r>
+        <w:rPr>
+          <w:rStyle w:val="FootnoteReference"/>
+          <w:vertAlign w:val="superscript"/>
+        </w:rPr>
+        <w:footnoteRef/>
+      </w:r>
+      <w:r>
+        <w:rPr>
+          <w:sz w:val="20"/>
+          <w:szCs w:val="20"/>
+          <w:rtl w:val="0"/>
+        </w:rPr>
+        <w:t xml:space="preserve"> ISTEX allows us to retrieve economics journals not available through JSTOR or Elsevier API, such as the </w:t>
+      </w:r>
+      <w:r>
+        <w:rPr>
+          <w:i w:val="1"/>
+          <w:iCs w:val="1"/>
+          <w:sz w:val="20"/>
+          <w:szCs w:val="20"/>
+          <w:rtl w:val="0"/>
+        </w:rPr>
+        <w:t xml:space="preserve">Journal of Economic Theory</w:t>
+      </w:r>
+      <w:r>
+        <w:rPr>
+          <w:sz w:val="20"/>
+          <w:szCs w:val="20"/>
+          <w:rtl w:val="0"/>
+        </w:rPr>
+        <w:t xml:space="preserve"> and to access specific issues of Elsevier journals for which we lack institutional access (e.g., the </w:t>
+      </w:r>
+      <w:r>
+        <w:rPr>
+          <w:i w:val="1"/>
+          <w:iCs w:val="1"/>
+          <w:sz w:val="20"/>
+          <w:szCs w:val="20"/>
+          <w:rtl w:val="0"/>
+        </w:rPr>
+        <w:t xml:space="preserve">European Economic review</w:t>
+      </w:r>
+      <w:r>
+        <w:rPr>
+          <w:sz w:val="20"/>
+          <w:szCs w:val="20"/>
+          <w:rtl w:val="0"/>
+        </w:rPr>
+        <w:t xml:space="preserve"> before 1997). For more detailed information on the collection of data, see the appendix.</w:t>
+      </w:r>
+    </w:p>
+  </w:footnote>
+  <w:footnote w:id="10">
+    <w:p>
+      <w:pPr>
+        <w:spacing w:after="0" w:before="0" w:line="240" w:lineRule="auto"/>
+        <w:rPr>
+          <w:sz w:val="20"/>
+          <w:szCs w:val="20"/>
+        </w:rPr>
+      </w:pPr>
+      <w:r>
+        <w:rPr>
+          <w:rStyle w:val="FootnoteReference"/>
+          <w:vertAlign w:val="superscript"/>
+        </w:rPr>
+        <w:footnoteRef/>
+      </w:r>
+      <w:r>
+        <w:rPr>
+          <w:sz w:val="20"/>
+          <w:szCs w:val="20"/>
+          <w:rtl w:val="0"/>
+        </w:rPr>
+        <w:t xml:space="preserve"> For further details on the matching process, see the appendix, particularly, @tbl-wos-match-decade. A failure to match an article in WoS does not necessarily indicate an error in the matching procedure; it may simply reflect the absence of the article in the WoS database. This is notably the case for certain JSTOR-indexed journals—particularly those that are no longer published—which are not covered in WoS.</w:t>
+      </w:r>
+      <w:r>
+        <w:rPr>
+          <w:rtl w:val="0"/>
+        </w:rPr>
+      </w:r>
+    </w:p>
+  </w:footnote>
+  <w:footnote w:id="11">
+    <w:p>
+      <w:pPr>
+        <w:spacing w:after="0" w:before="0" w:line="240" w:lineRule="auto"/>
+        <w:rPr>
+          <w:sz w:val="20"/>
+          <w:szCs w:val="20"/>
+        </w:rPr>
+      </w:pPr>
+      <w:r>
+        <w:rPr>
+          <w:rStyle w:val="FootnoteReference"/>
+          <w:vertAlign w:val="superscript"/>
+        </w:rPr>
+        <w:footnoteRef/>
+      </w:r>
+      <w:r>
+        <w:rPr>
+          <w:sz w:val="20"/>
+          <w:szCs w:val="20"/>
+          <w:rtl w:val="0"/>
+        </w:rPr>
+        <w:t xml:space="preserve"> </w:t>
+      </w:r>
+      <w:r>
+        <w:rPr>
+          <w:sz w:val="20"/>
+          <w:szCs w:val="20"/>
+          <w:rtl w:val="0"/>
+        </w:rPr>
+        <w:t xml:space="preserve">Adding these other outlets would pose additional challenges. For both working papers and, above all, books, no large-scale databases provide comprehensive full texts or complete reference lists. In addition, working papers raise the problem of potential double counting, as they may eventually be published in economic journals.</w:t>
+      </w:r>
+    </w:p>
+  </w:footnote>
+  <w:footnote w:id="12">
+    <w:p>
+      <w:pPr>
+        <w:spacing w:after="0" w:before="0" w:line="240" w:lineRule="auto"/>
+        <w:rPr>
+          <w:sz w:val="20"/>
+          <w:szCs w:val="20"/>
+        </w:rPr>
+      </w:pPr>
+      <w:r>
+        <w:rPr>
+          <w:rStyle w:val="FootnoteReference"/>
+          <w:vertAlign w:val="superscript"/>
+        </w:rPr>
+        <w:footnoteRef/>
+      </w:r>
+      <w:r>
+        <w:rPr>
+          <w:sz w:val="20"/>
+          <w:szCs w:val="20"/>
+          <w:rtl w:val="0"/>
+        </w:rPr>
+        <w:t xml:space="preserve"> We did not filter journals by language a priori. Indeed, many non-anglo-saxon journals also publish English articles at some more or less frequent occasions. It was thus easier to filter by language a posteriori and at the document level, once articles were collected.</w:t>
+      </w:r>
+    </w:p>
+  </w:footnote>
+  <w:footnote w:id="13">
+    <w:p>
+      <w:pPr>
+        <w:spacing w:after="0" w:before="0" w:line="240" w:lineRule="auto"/>
+        <w:rPr>
+          <w:sz w:val="20"/>
+          <w:szCs w:val="20"/>
+        </w:rPr>
+      </w:pPr>
+      <w:r>
+        <w:rPr>
+          <w:rStyle w:val="FootnoteReference"/>
+          <w:vertAlign w:val="superscript"/>
+        </w:rPr>
+        <w:footnoteRef/>
+      </w:r>
+      <w:r>
+        <w:rPr>
+          <w:sz w:val="20"/>
+          <w:szCs w:val="20"/>
+          <w:rtl w:val="0"/>
+        </w:rPr>
+        <w:t xml:space="preserve"> Our goal here is not to provide the reader with extensive details on what these models are and how we use them (see the appendix for additional details and references), but rather to provide general intuitions about the use of LLMs, to understand the building of our corpus.</w:t>
+      </w:r>
+    </w:p>
+  </w:footnote>
+  <w:footnote w:id="25">
+    <w:p>
+      <w:pPr>
+        <w:spacing w:after="0" w:before="0" w:line="240" w:lineRule="auto"/>
+        <w:rPr>
+          <w:sz w:val="20"/>
+          <w:szCs w:val="20"/>
+        </w:rPr>
+      </w:pPr>
+      <w:r>
+        <w:rPr>
+          <w:rStyle w:val="FootnoteReference"/>
+          <w:vertAlign w:val="superscript"/>
+        </w:rPr>
+        <w:footnoteRef/>
+      </w:r>
+      <w:r>
+        <w:rPr>
+          <w:sz w:val="20"/>
+          <w:szCs w:val="20"/>
+          <w:rtl w:val="0"/>
+        </w:rPr>
+        <w:t xml:space="preserve"> We don’t use overlapping windows in this case, notably for computational reasons: finding HDBSCAN clusters on a set of tens of thousands of sentences is much more computationally intensive than finding bibliometric communities for at most a few thousands of articles.</w:t>
+      </w:r>
+    </w:p>
+  </w:footnote>
+  <w:footnote w:id="26">
+    <w:p>
+      <w:pPr>
+        <w:spacing w:after="0" w:before="0" w:line="240" w:lineRule="auto"/>
+        <w:rPr>
+          <w:sz w:val="20"/>
+          <w:szCs w:val="20"/>
+        </w:rPr>
+      </w:pPr>
+      <w:r>
+        <w:rPr>
+          <w:rStyle w:val="FootnoteReference"/>
+          <w:vertAlign w:val="superscript"/>
+        </w:rPr>
+        <w:footnoteRef/>
+      </w:r>
+      <w:r>
+        <w:rPr>
+          <w:sz w:val="20"/>
+          <w:szCs w:val="20"/>
+          <w:rtl w:val="0"/>
+        </w:rPr>
+        <w:t xml:space="preserve"> Refer to the appendix for details.</w:t>
+      </w:r>
+    </w:p>
+  </w:footnote>
+  <w:footnote w:id="20">
+    <w:p>
+      <w:pPr>
+        <w:spacing w:after="0" w:before="0" w:line="240" w:lineRule="auto"/>
+        <w:rPr>
+          <w:sz w:val="20"/>
+          <w:szCs w:val="20"/>
+        </w:rPr>
+      </w:pPr>
+      <w:r>
+        <w:rPr>
+          <w:rStyle w:val="FootnoteReference"/>
+          <w:vertAlign w:val="superscript"/>
+        </w:rPr>
+        <w:footnoteRef/>
+      </w:r>
+      <w:r>
+        <w:rPr>
+          <w:sz w:val="20"/>
+          <w:szCs w:val="20"/>
+          <w:rtl w:val="0"/>
+        </w:rPr>
+        <w:t xml:space="preserve"> “Unsupervised” does not mean that the modeller has no influence on the output. The analyst must choose a particular model and its parameters and these choices embed methodological priors about the types of patterns the procedure is likely to reveal. For instance, one crucial parameter in many unsupervised models is the number of categories that will emerge from the algorithm. We detail and justify the different parameters chosen for our methods in the appendix.</w:t>
+      </w:r>
+    </w:p>
+  </w:footnote>
+  <w:footnote w:id="30">
+    <w:p>
+      <w:pPr>
+        <w:spacing w:after="0" w:before="0" w:line="240" w:lineRule="auto"/>
+        <w:rPr>
+          <w:sz w:val="20"/>
+          <w:szCs w:val="20"/>
+        </w:rPr>
+      </w:pPr>
+      <w:r>
+        <w:rPr>
+          <w:rStyle w:val="FootnoteReference"/>
+          <w:vertAlign w:val="superscript"/>
+        </w:rPr>
+        <w:footnoteRef/>
+      </w:r>
+      <w:r>
+        <w:rPr>
+          <w:sz w:val="20"/>
+          <w:szCs w:val="20"/>
+          <w:rtl w:val="0"/>
+        </w:rPr>
+        <w:t xml:space="preserve"> However, because we focus on English, published articles, our clusters are biased toward American journals, notably in the first decades.</w:t>
+      </w:r>
+    </w:p>
+  </w:footnote>
+  <w:footnote w:id="29">
+    <w:p>
+      <w:pPr>
+        <w:spacing w:after="0" w:before="0" w:line="240" w:lineRule="auto"/>
+        <w:rPr>
+          <w:sz w:val="20"/>
+          <w:szCs w:val="20"/>
+        </w:rPr>
+      </w:pPr>
+      <w:r>
+        <w:rPr>
+          <w:rStyle w:val="FootnoteReference"/>
+          <w:vertAlign w:val="superscript"/>
+        </w:rPr>
+        <w:footnoteRef/>
+      </w:r>
+      <w:r>
+        <w:rPr>
+          <w:sz w:val="20"/>
+          <w:szCs w:val="20"/>
+          <w:rtl w:val="0"/>
+        </w:rPr>
+        <w:t xml:space="preserve"> </w:t>
+      </w:r>
+      <w:r>
+        <w:rPr>
+          <w:sz w:val="20"/>
+          <w:szCs w:val="20"/>
+          <w:rtl w:val="0"/>
+        </w:rPr>
+        <w:t xml:space="preserve">Of course, as in any historical inquiry of this kind, we are not entirely protected from selective emphasis, all the more so given that the scope of our study is too broad to summarize every pattern revealed by our results. Other scholars could have, at various junctures, pursued different interpretive directions on the basis of the same indicators (especially most similar sentences and articles). The publication of the [</w:t>
+      </w:r>
+      <w:r>
+        <w:rPr>
+          <w:sz w:val="20"/>
+          <w:szCs w:val="20"/>
+          <w:rtl w:val="0"/>
+        </w:rPr>
+        <w:t xml:space="preserve">interactive application</w:t>
+      </w:r>
+      <w:r>
+        <w:rPr>
+          <w:sz w:val="20"/>
+          <w:szCs w:val="20"/>
+          <w:rtl w:val="0"/>
+        </w:rPr>
+        <w:t xml:space="preserve">](https://019adac8-81d4-aa0e-808c-08861c261fd2.share.connect.posit.cloud/) we used to explore the results thus serves as an exercise in transparency and—in addition to being, we hope, useful for historians of economic thought more generally—allows readers to assess the robustness and limits of our narrative.</w:t>
+      </w:r>
+    </w:p>
+  </w:footnote>
+  <w:footnote w:id="31">
+    <w:p>
+      <w:pPr>
+        <w:spacing w:after="0" w:before="0" w:line="240" w:lineRule="auto"/>
+        <w:rPr>
+          <w:sz w:val="20"/>
+          <w:szCs w:val="20"/>
+        </w:rPr>
+      </w:pPr>
+      <w:r>
+        <w:rPr>
+          <w:rStyle w:val="FootnoteReference"/>
+          <w:vertAlign w:val="superscript"/>
+        </w:rPr>
+        <w:footnoteRef/>
+      </w:r>
+      <w:r>
+        <w:rPr>
+          <w:sz w:val="20"/>
+          <w:szCs w:val="20"/>
+          <w:rtl w:val="0"/>
+        </w:rPr>
+        <w:t xml:space="preserve"> Some years earlier, @mitchellRationality1910[97] already pushed forward similar claims, regretting that “few economists have regarded the study of psychology as a necessary part of the equipment of their work,” often relying on “tacit preconceptions” rather than than seeking “psychologists to gain a knowledge of the mind and its modes of operation.”</w:t>
+      </w:r>
+    </w:p>
+  </w:footnote>
+  <w:footnote w:id="35">
+    <w:p>
+      <w:pPr>
+        <w:spacing w:after="0" w:before="0" w:line="240" w:lineRule="auto"/>
+        <w:rPr>
+          <w:sz w:val="20"/>
+          <w:szCs w:val="20"/>
+        </w:rPr>
+      </w:pPr>
+      <w:r>
+        <w:rPr>
+          <w:rStyle w:val="FootnoteReference"/>
+          <w:vertAlign w:val="superscript"/>
+        </w:rPr>
+        <w:footnoteRef/>
+      </w:r>
+      <w:r>
+        <w:rPr>
+          <w:sz w:val="20"/>
+          <w:szCs w:val="20"/>
+          <w:rtl w:val="0"/>
+        </w:rPr>
+        <w:t xml:space="preserve"> This grouping of sentences in the 1970s actually took its origins in the cluster “Utility Theory” (which ended in the 1960s) with a focus on welfare economics.</w:t>
+      </w:r>
+    </w:p>
+  </w:footnote>
+  <w:footnote w:id="36">
+    <w:p>
+      <w:pPr>
+        <w:spacing w:before="0" w:line="240" w:lineRule="auto"/>
+        <w:ind w:right="600"/>
+        <w:rPr>
+          <w:sz w:val="20"/>
+          <w:szCs w:val="20"/>
+        </w:rPr>
+      </w:pPr>
+      <w:r>
+        <w:rPr>
+          <w:rStyle w:val="FootnoteReference"/>
+          <w:vertAlign w:val="superscript"/>
+        </w:rPr>
+        <w:footnoteRef/>
+      </w:r>
+      <w:r>
+        <w:rPr>
+          <w:sz w:val="20"/>
+          <w:szCs w:val="20"/>
+          <w:rtl w:val="0"/>
+        </w:rPr>
+        <w:t xml:space="preserve"> This highlights a key caveat of our methods. Because these methods foreground statistically “significant” patterns and indicators’ prevalence, they are not always well suited to tracing and interpreting the origins of a concept or theory with the care that close historical study and archival research provide.</w:t>
+      </w:r>
+    </w:p>
+  </w:footnote>
+  <w:footnote w:id="33">
+    <w:p>
+      <w:pPr>
+        <w:spacing w:after="0" w:before="0" w:line="240" w:lineRule="auto"/>
+        <w:rPr>
+          <w:sz w:val="18"/>
+          <w:szCs w:val="18"/>
+        </w:rPr>
+      </w:pPr>
+      <w:r>
+        <w:rPr>
+          <w:rStyle w:val="FootnoteReference"/>
+          <w:vertAlign w:val="superscript"/>
+        </w:rPr>
+        <w:footnoteRef/>
+      </w:r>
+      <w:r>
+        <w:rPr>
+          <w:sz w:val="20"/>
+          <w:szCs w:val="20"/>
+          <w:rtl w:val="0"/>
+        </w:rPr>
+        <w:t xml:space="preserve"> </w:t>
+      </w:r>
+      <w:r>
+        <w:rPr>
+          <w:sz w:val="20"/>
+          <w:szCs w:val="20"/>
+          <w:rtl w:val="0"/>
+        </w:rPr>
+        <w:t xml:space="preserve">Machlup’s position was that even if a “goodly portion of all business behavior may be non-rational, thoughtless, [or] blindly repetitive” [-@machlupMarginal1946, 520], questionnaire evidence and empirical findings more generally did not demonstrate the failure of marginal theory when properly interpreted. In a similar defense of profit maximization, Leonid @hurwiczTheory1946[110] first acknowledged that it was not “inconceivable that business is run more by routine than by rationality,” but argued that behavior may appear irrational or merely “routine” from the standpoint of a purely static theory that ignores uncertainty, while proving fully “rational” once uncertainty and long-run effects are taken into account [see also @</w:t>
+      </w:r>
+      <w:r>
+        <w:rPr>
+          <w:sz w:val="20"/>
+          <w:szCs w:val="20"/>
+          <w:rtl w:val="0"/>
+        </w:rPr>
+        <w:t xml:space="preserve">herfeldTheories2018]</w:t>
+      </w:r>
+      <w:r>
+        <w:rPr>
+          <w:sz w:val="20"/>
+          <w:szCs w:val="20"/>
+          <w:rtl w:val="0"/>
+        </w:rPr>
+        <w:t xml:space="preserve">.</w:t>
+      </w:r>
+      <w:r>
+        <w:rPr>
+          <w:rtl w:val="0"/>
+        </w:rPr>
+      </w:r>
+    </w:p>
+  </w:footnote>
+  <w:footnote w:id="3">
+    <w:p>
+      <w:pPr>
+        <w:spacing w:after="0" w:before="0" w:line="240" w:lineRule="auto"/>
+        <w:rPr>
+          <w:sz w:val="20"/>
+          <w:szCs w:val="20"/>
+        </w:rPr>
+      </w:pPr>
+      <w:r>
+        <w:rPr>
+          <w:rStyle w:val="FootnoteReference"/>
+          <w:vertAlign w:val="superscript"/>
+        </w:rPr>
+        <w:footnoteRef/>
+      </w:r>
+      <w:r>
+        <w:rPr>
+          <w:sz w:val="20"/>
+          <w:szCs w:val="20"/>
+          <w:rtl w:val="0"/>
+        </w:rPr>
+        <w:t xml:space="preserve"> The application is available in the GitHub repository: [https://github.com/tdelcey/ejhet_quanti_method_app](https://github.com/tdelcey/ejhet_quanti_method_app)</w:t>
+      </w:r>
+      <w:r>
+        <w:rPr>
+          <w:sz w:val="20"/>
+          <w:szCs w:val="20"/>
+          <w:rtl w:val="0"/>
+        </w:rPr>
+        <w:t xml:space="preserve">. A public version is available at the following url: [https://019adac8-81d4-aa0e-808c-08861c261fd2.share.connect.posit.cloud/](https://019adac8-81d4-aa0e-808c-08861c261fd2.share.connect.posit.cloud/).</w:t>
+      </w:r>
+      <w:r>
+        <w:rPr>
+          <w:rtl w:val="0"/>
+        </w:rPr>
+      </w:r>
+    </w:p>
+  </w:footnote>
+  <w:footnote w:id="5">
+    <w:p>
+      <w:pPr>
+        <w:spacing w:after="0" w:before="0" w:line="240" w:lineRule="auto"/>
+        <w:rPr>
+          <w:sz w:val="20"/>
+          <w:szCs w:val="20"/>
+        </w:rPr>
+      </w:pPr>
+      <w:r>
+        <w:rPr>
+          <w:rStyle w:val="FootnoteReference"/>
+          <w:vertAlign w:val="superscript"/>
+        </w:rPr>
+        <w:footnoteRef/>
+      </w:r>
+      <w:r>
+        <w:rPr>
+          <w:sz w:val="20"/>
+          <w:szCs w:val="20"/>
+          <w:rtl w:val="0"/>
+        </w:rPr>
+        <w:t xml:space="preserve"> Elsevier API allows users to retrieve the full text of Elsevier journals such as the </w:t>
+      </w:r>
+      <w:r>
+        <w:rPr>
+          <w:i w:val="1"/>
+          <w:iCs w:val="1"/>
+          <w:sz w:val="20"/>
+          <w:szCs w:val="20"/>
+          <w:rtl w:val="0"/>
+        </w:rPr>
+        <w:t xml:space="preserve">European Economic Review</w:t>
+      </w:r>
+      <w:r>
+        <w:rPr>
+          <w:sz w:val="20"/>
+          <w:szCs w:val="20"/>
+          <w:rtl w:val="0"/>
+        </w:rPr>
+        <w:t xml:space="preserve">, provided that users have institutional access to the relevant issues.</w:t>
+      </w:r>
+    </w:p>
+  </w:footnote>
+  <w:footnote w:id="15">
+    <w:p>
+      <w:pPr>
+        <w:spacing w:after="0" w:before="0" w:line="240" w:lineRule="auto"/>
+        <w:rPr>
+          <w:sz w:val="20"/>
+          <w:szCs w:val="20"/>
+        </w:rPr>
+      </w:pPr>
+      <w:r>
+        <w:rPr>
+          <w:rStyle w:val="FootnoteReference"/>
+          <w:vertAlign w:val="superscript"/>
+        </w:rPr>
+        <w:footnoteRef/>
+      </w:r>
+      <w:r>
+        <w:rPr>
+          <w:sz w:val="20"/>
+          <w:szCs w:val="20"/>
+          <w:rtl w:val="0"/>
+        </w:rPr>
+        <w:t xml:space="preserve"> Moreover, the texts used to train these models are not primarily academic articles in economics. This means that there may be important gaps between the general language patterns the model has learned and the specific vocabulary, concepts, and writing practices of our “domain” [see e.g. @zhangEconBERT2025].</w:t>
+      </w:r>
+    </w:p>
+  </w:footnote>
+  <w:footnote w:id="18">
+    <w:p>
+      <w:pPr>
+        <w:spacing w:after="0" w:before="0" w:line="240" w:lineRule="auto"/>
+        <w:rPr>
+          <w:sz w:val="20"/>
+          <w:szCs w:val="20"/>
+        </w:rPr>
+      </w:pPr>
+      <w:r>
+        <w:rPr>
+          <w:rStyle w:val="FootnoteReference"/>
+          <w:vertAlign w:val="superscript"/>
+        </w:rPr>
+        <w:footnoteRef/>
+      </w:r>
+      <w:r>
+        <w:rPr>
+          <w:sz w:val="20"/>
+          <w:szCs w:val="20"/>
+          <w:rtl w:val="0"/>
+        </w:rPr>
+        <w:t xml:space="preserve"> The choice of the 1% quantile reflects a trade-off between false positives and false negatives. We observed that a more restrictive threshold (e.g., 0.5%) excludes many sentences that obviously deal with rationality in economics, whereas a more permissive threshold (e.g. 2%) includes sentences that are too distant from our core focus, particularly in earlier periods. The 1% threshold therefore appeared as a reasonable compromise. Moreover, a moderate number of false positives does not substantially threaten the analysis, since such sentences are likely to be later classified as “noise” by the HDBSCAN algorithm. </w:t>
+      </w:r>
+    </w:p>
+  </w:footnote>
+  <w:footnote w:id="19">
+    <w:p>
+      <w:pPr>
+        <w:spacing w:after="0" w:before="0" w:line="240" w:lineRule="auto"/>
+        <w:rPr>
+          <w:sz w:val="20"/>
+          <w:szCs w:val="20"/>
+        </w:rPr>
+      </w:pPr>
+      <w:r>
+        <w:rPr>
+          <w:rStyle w:val="FootnoteReference"/>
+          <w:vertAlign w:val="superscript"/>
+        </w:rPr>
+        <w:footnoteRef/>
+      </w:r>
+      <w:r>
+        <w:rPr>
+          <w:sz w:val="20"/>
+          <w:szCs w:val="20"/>
+          <w:rtl w:val="0"/>
+        </w:rPr>
+        <w:t xml:space="preserve"> The “articles-corpus” only </w:t>
+      </w:r>
+      <w:r>
+        <w:rPr>
+          <w:sz w:val="20"/>
+          <w:szCs w:val="20"/>
+          <w:rtl w:val="0"/>
+        </w:rPr>
+        <w:t xml:space="preserve">starts</w:t>
+      </w:r>
+      <w:r>
+        <w:rPr>
+          <w:sz w:val="20"/>
+          <w:szCs w:val="20"/>
+          <w:rtl w:val="0"/>
+        </w:rPr>
+        <w:t xml:space="preserve"> in 1960, because the bibliographic data from WoS </w:t>
+      </w:r>
+      <w:r>
+        <w:rPr>
+          <w:sz w:val="20"/>
+          <w:szCs w:val="20"/>
+          <w:rtl w:val="0"/>
+        </w:rPr>
+        <w:t xml:space="preserve">are</w:t>
+      </w:r>
+      <w:r>
+        <w:rPr>
+          <w:sz w:val="20"/>
+          <w:szCs w:val="20"/>
+          <w:rtl w:val="0"/>
+        </w:rPr>
+        <w:t xml:space="preserve"> too limited prior to this date to be reliably used.</w:t>
+      </w:r>
+    </w:p>
+  </w:footnote>
+  <w:footnote w:id="17">
+    <w:p>
+      <w:pPr>
+        <w:spacing w:after="0" w:before="0" w:line="240" w:lineRule="auto"/>
+        <w:rPr>
+          <w:sz w:val="20"/>
+          <w:szCs w:val="20"/>
+        </w:rPr>
+      </w:pPr>
+      <w:r>
+        <w:rPr>
+          <w:rStyle w:val="FootnoteReference"/>
+          <w:vertAlign w:val="superscript"/>
+        </w:rPr>
+        <w:footnoteRef/>
+      </w:r>
+      <w:r>
+        <w:rPr>
+          <w:sz w:val="20"/>
+          <w:szCs w:val="20"/>
+          <w:rtl w:val="0"/>
+        </w:rPr>
+        <w:t xml:space="preserve"> We initially tested a symmetric two-year window. However, particularly in the early periods, this specification resulted in substantial volatility in average usage of the terms “rational” and “rationality”, thereby increasing the number of “noisy” sentences (i.e. sentences not clearly related to rationality or tied to highly specific issues). Conversely, longer windows would reduce the advantages of our historical approach, as they would blur temporal variation too much, especially given the rapid growth of the corpus after the 1960s.</w:t>
+      </w:r>
+    </w:p>
+  </w:footnote>
+  <w:footnote w:id="14">
+    <w:p>
+      <w:pPr>
+        <w:spacing w:after="0" w:before="0" w:line="240" w:lineRule="auto"/>
+        <w:rPr>
+          <w:sz w:val="20"/>
+          <w:szCs w:val="20"/>
+        </w:rPr>
+      </w:pPr>
+      <w:r>
+        <w:rPr>
+          <w:rStyle w:val="FootnoteReference"/>
+          <w:vertAlign w:val="superscript"/>
+        </w:rPr>
+        <w:footnoteRef/>
+      </w:r>
+      <w:r>
+        <w:rPr>
+          <w:sz w:val="20"/>
+          <w:szCs w:val="20"/>
+          <w:rtl w:val="0"/>
+        </w:rPr>
+        <w:t xml:space="preserve"> Henceforth, “similarity” between sentences or documents refers to cosine similarity.</w:t>
+      </w:r>
+    </w:p>
+  </w:footnote>
+  <w:footnote w:id="22">
+    <w:p>
+      <w:pPr>
+        <w:spacing w:after="0" w:before="0" w:line="240" w:lineRule="auto"/>
+        <w:rPr>
+          <w:sz w:val="20"/>
+          <w:szCs w:val="20"/>
+        </w:rPr>
+      </w:pPr>
+      <w:r>
+        <w:rPr>
+          <w:rStyle w:val="FootnoteReference"/>
+          <w:vertAlign w:val="superscript"/>
+        </w:rPr>
+        <w:footnoteRef/>
+      </w:r>
+      <w:r>
+        <w:rPr>
+          <w:rtl w:val="0"/>
+        </w:rPr>
+        <w:t xml:space="preserve"> </w:t>
+      </w:r>
+      <w:r>
+        <w:rPr>
+          <w:sz w:val="20"/>
+          <w:szCs w:val="20"/>
+          <w:rtl w:val="0"/>
+        </w:rPr>
+        <w:t xml:space="preserve">That does not mean, however, that an unsupervised algorithm can be applied blindly to historical questions: a substantial part of our effort has consisted in adapting the method to our historical data, especially to accommodate the growth of the corpus over time.</w:t>
+      </w:r>
+      <w:r>
+        <w:rPr>
+          <w:rtl w:val="0"/>
+        </w:rPr>
+      </w:r>
+    </w:p>
+  </w:footnote>
+  <w:footnote w:id="24">
+    <w:p>
+      <w:pPr>
+        <w:spacing w:after="0" w:before="0" w:line="240" w:lineRule="auto"/>
+        <w:rPr>
+          <w:sz w:val="20"/>
+          <w:szCs w:val="20"/>
+        </w:rPr>
+      </w:pPr>
+      <w:r>
+        <w:rPr>
+          <w:rStyle w:val="FootnoteReference"/>
+          <w:vertAlign w:val="superscript"/>
+        </w:rPr>
+        <w:footnoteRef/>
+      </w:r>
+      <w:r>
+        <w:rPr>
+          <w:sz w:val="20"/>
+          <w:szCs w:val="20"/>
+          <w:rtl w:val="0"/>
+        </w:rPr>
+        <w:t xml:space="preserve">  Refer to the appendix for details.</w:t>
+      </w:r>
+    </w:p>
+  </w:footnote>
+  <w:footnote w:id="7">
+    <w:p>
+      <w:pPr>
+        <w:spacing w:after="0" w:before="0" w:line="240" w:lineRule="auto"/>
+        <w:rPr>
+          <w:sz w:val="20"/>
+          <w:szCs w:val="20"/>
+        </w:rPr>
+      </w:pPr>
+      <w:r>
+        <w:rPr>
+          <w:rStyle w:val="FootnoteReference"/>
+          <w:vertAlign w:val="superscript"/>
+        </w:rPr>
+        <w:footnoteRef/>
+      </w:r>
+      <w:r>
+        <w:rPr>
+          <w:sz w:val="20"/>
+          <w:szCs w:val="20"/>
+          <w:rtl w:val="0"/>
+        </w:rPr>
+        <w:t xml:space="preserve"> Bibliometric and textual data themselves have a history; they are “made by institutions, through human processes” [@</w:t>
+      </w:r>
+      <w:r>
+        <w:rPr>
+          <w:sz w:val="20"/>
+          <w:szCs w:val="20"/>
+          <w:rtl w:val="0"/>
+        </w:rPr>
+        <w:t xml:space="preserve">guldiDangerous2023</w:t>
+      </w:r>
+      <w:r>
+        <w:rPr>
+          <w:sz w:val="20"/>
+          <w:szCs w:val="20"/>
+          <w:rtl w:val="0"/>
+        </w:rPr>
+        <w:t xml:space="preserve">, 34]. Whether digital or material, archives are shaped by “distortions” and "occlusions," and the processes through which they are constituted are themselves worthy subjects of historical investigation [@dastonSciences2012]. </w:t>
+      </w:r>
+    </w:p>
+  </w:footnote>
+  <w:footnote w:id="8">
+    <w:p>
+      <w:pPr>
+        <w:spacing w:after="0" w:before="0" w:line="240" w:lineRule="auto"/>
+        <w:rPr>
+          <w:sz w:val="20"/>
+          <w:szCs w:val="20"/>
+        </w:rPr>
+      </w:pPr>
+      <w:r>
+        <w:rPr>
+          <w:rStyle w:val="FootnoteReference"/>
+          <w:vertAlign w:val="superscript"/>
+        </w:rPr>
+        <w:footnoteRef/>
+      </w:r>
+      <w:r>
+        <w:rPr>
+          <w:sz w:val="20"/>
+          <w:szCs w:val="20"/>
+          <w:rtl w:val="0"/>
+        </w:rPr>
+        <w:t xml:space="preserve"> The programming dimension of such computational approaches enable iterative feedback between analysis and corpus cleaning [@nelsonComputational2020]; critical scrutiny can therefore be continuously exercised at each stage of the research “pipeline” [@leeRole2020].</w:t>
+      </w:r>
+    </w:p>
+  </w:footnote>
+  <w:footnote w:id="21">
+    <w:p>
+      <w:pPr>
+        <w:spacing w:after="0" w:before="0" w:line="240" w:lineRule="auto"/>
+        <w:rPr>
+          <w:sz w:val="20"/>
+          <w:szCs w:val="20"/>
+        </w:rPr>
+      </w:pPr>
+      <w:r>
+        <w:rPr>
+          <w:rStyle w:val="FootnoteReference"/>
+          <w:vertAlign w:val="superscript"/>
+        </w:rPr>
+        <w:footnoteRef/>
+      </w:r>
+      <w:r>
+        <w:rPr>
+          <w:sz w:val="20"/>
+          <w:szCs w:val="20"/>
+          <w:rtl w:val="0"/>
+        </w:rPr>
+        <w:t xml:space="preserve"> See @simonsLarge2026 for a discussion of using LLMs with unsupervised or supervised methods in the history and philosophy of science.</w:t>
+      </w:r>
+    </w:p>
+  </w:footnote>
+  <w:footnote w:id="28">
+    <w:p>
+      <w:pPr>
+        <w:spacing w:after="0" w:before="0" w:line="240" w:lineRule="auto"/>
+        <w:rPr>
+          <w:sz w:val="20"/>
+          <w:szCs w:val="20"/>
+        </w:rPr>
+      </w:pPr>
+      <w:r>
+        <w:rPr>
+          <w:rStyle w:val="FootnoteReference"/>
+          <w:vertAlign w:val="superscript"/>
+        </w:rPr>
+        <w:footnoteRef/>
+      </w:r>
+      <w:r>
+        <w:rPr>
+          <w:sz w:val="20"/>
+          <w:szCs w:val="20"/>
+          <w:rtl w:val="0"/>
+        </w:rPr>
+        <w:t xml:space="preserve"> One step in the discovery and interpretive process is often the assignment of “labels” to clusters in order to facilitate the interpretation of visualizations. We assign manually a label to each intertemporal semantic cluster and bibliometric community after qualitative inspection.</w:t>
+      </w:r>
+    </w:p>
+  </w:footnote>
+  <w:footnote w:id="32">
+    <w:p>
+      <w:pPr>
+        <w:spacing w:after="0" w:before="0" w:line="240" w:lineRule="auto"/>
+        <w:rPr>
+          <w:sz w:val="20"/>
+          <w:szCs w:val="20"/>
+        </w:rPr>
+      </w:pPr>
+      <w:r>
+        <w:rPr>
+          <w:rStyle w:val="FootnoteReference"/>
+          <w:vertAlign w:val="superscript"/>
+        </w:rPr>
+        <w:footnoteRef/>
+      </w:r>
+      <w:r>
+        <w:rPr>
+          <w:sz w:val="20"/>
+          <w:szCs w:val="20"/>
+          <w:rtl w:val="0"/>
+        </w:rPr>
+        <w:t xml:space="preserve"> See closest sentences to the “Utility Theory” cluster’s centroid.</w:t>
+      </w:r>
+    </w:p>
+  </w:footnote>
+  <w:footnote w:id="34">
+    <w:p>
+      <w:pPr>
+        <w:spacing w:after="0" w:before="0" w:line="240" w:lineRule="auto"/>
+        <w:rPr>
+          <w:sz w:val="20"/>
+          <w:szCs w:val="20"/>
+        </w:rPr>
+      </w:pPr>
+      <w:r>
+        <w:rPr>
+          <w:rStyle w:val="FootnoteReference"/>
+          <w:vertAlign w:val="superscript"/>
+        </w:rPr>
+        <w:footnoteRef/>
+      </w:r>
+      <w:r>
+        <w:rPr>
+          <w:sz w:val="20"/>
+          <w:szCs w:val="20"/>
+          <w:rtl w:val="0"/>
+        </w:rPr>
+        <w:t xml:space="preserve"> The cluster “Firm Theory &amp; Entrepreneur” nevertheless remained a site for critiques of profit maximization. During the 1960s and 1970s, contributions that proposed alternative frameworks for explaining firms’ decisions were highly cited [such as @simonTheories1959] or appeared among closest articles from centroid [like @winterSatisficing1971].</w:t>
+      </w:r>
+    </w:p>
+  </w:footnote>
+  <w:footnote w:id="23">
+    <w:p>
+      <w:pPr>
+        <w:spacing w:after="0" w:before="0" w:line="240" w:lineRule="auto"/>
+        <w:rPr>
+          <w:sz w:val="20"/>
+          <w:szCs w:val="20"/>
+        </w:rPr>
+      </w:pPr>
+      <w:r>
+        <w:rPr>
+          <w:rStyle w:val="FootnoteReference"/>
+          <w:vertAlign w:val="superscript"/>
+        </w:rPr>
+        <w:footnoteRef/>
+      </w:r>
+      <w:r>
+        <w:rPr>
+          <w:sz w:val="20"/>
+          <w:szCs w:val="20"/>
+          <w:rtl w:val="0"/>
+        </w:rPr>
+        <w:t xml:space="preserve"> The eight-year window for defining bibliometric communities aligns with established practices in the quantitative history of economics [@claveauMacrodynamics2016], where timeframes typically range between 5 and 10 years [@abramoAssessing2011]. Given that economics exhibits longer citation lifespans than the natural sciences [@lariviereLongterm2008; @aistleitnerCitation2019], and considering the multi-decade scope of our study, we opted for a window longer than five years. This choice balances granularity with the need to capture enduring citation patterns, avoiding the coarser resolution of a 10-year window.</w:t>
+      </w:r>
+    </w:p>
+  </w:footnote>
+  <w:footnote w:id="16">
+    <w:p>
+      <w:pPr>
+        <w:spacing w:after="0" w:before="0" w:line="240" w:lineRule="auto"/>
+        <w:rPr>
+          <w:sz w:val="20"/>
+          <w:szCs w:val="20"/>
+        </w:rPr>
+      </w:pPr>
+      <w:r>
+        <w:rPr>
+          <w:rStyle w:val="FootnoteReference"/>
+          <w:vertAlign w:val="superscript"/>
+        </w:rPr>
+        <w:footnoteRef/>
+      </w:r>
+      <w:r>
+        <w:rPr>
+          <w:sz w:val="20"/>
+          <w:szCs w:val="20"/>
+          <w:rtl w:val="0"/>
+        </w:rPr>
+        <w:t xml:space="preserve"> Centroids are widely used in the literature on “semantic change” to represent the average embedding of a temporal slice or a cluster of a corpus [@montanelliSurvey2024]</w:t>
+      </w:r>
+      <w:r>
+        <w:rPr>
+          <w:sz w:val="20"/>
+          <w:szCs w:val="20"/>
+          <w:rtl w:val="0"/>
+        </w:rPr>
+        <w:t xml:space="preserve">.</w:t>
+      </w:r>
+      <w:r>
+        <w:rPr>
+          <w:sz w:val="20"/>
+          <w:szCs w:val="20"/>
+          <w:rtl w:val="0"/>
+        </w:rPr>
+        <w:t xml:space="preserve"> We adopt the centroid rather than the medoid (i.e. the observed sentences whose embedding is closest to all others in the set), as the centroid smooths over idiosyncratic variation across sentences, whereas the medoid may be disproportionately influenced by a single atypical example. While the medoid is an embedding of a real sentence and is easily interpretable, it is straightforward to compute the closest vector from the centroid (see </w:t>
+      </w:r>
+      <w:r>
+        <w:rPr>
+          <w:sz w:val="20"/>
+          <w:szCs w:val="20"/>
+          <w:rtl w:val="0"/>
+        </w:rPr>
+        <w:t xml:space="preserve">@tbl-illustrative_sentences</w:t>
+      </w:r>
+      <w:r>
+        <w:rPr>
+          <w:sz w:val="20"/>
+          <w:szCs w:val="20"/>
+          <w:rtl w:val="0"/>
+        </w:rPr>
+        <w:t xml:space="preserve">).</w:t>
+      </w:r>
+      <w:r>
+        <w:rPr>
+          <w:rtl w:val="0"/>
+        </w:rPr>
+      </w:r>
+    </w:p>
+  </w:footnote>
+  <w:footnote w:id="27">
+    <w:p>
+      <w:pPr>
+        <w:spacing w:after="0" w:before="0" w:line="240" w:lineRule="auto"/>
+        <w:rPr>
+          <w:sz w:val="20"/>
+          <w:szCs w:val="20"/>
+        </w:rPr>
+      </w:pPr>
+      <w:r>
+        <w:rPr>
+          <w:rStyle w:val="FootnoteReference"/>
+          <w:vertAlign w:val="superscript"/>
+        </w:rPr>
+        <w:footnoteRef/>
+      </w:r>
+      <w:r>
+        <w:rPr>
+          <w:sz w:val="20"/>
+          <w:szCs w:val="20"/>
+          <w:rtl w:val="0"/>
+        </w:rPr>
+        <w:t xml:space="preserve"> The application is available in the GitHub repository: [https://github.com/tdelcey/ejhet_quanti_method_app](https://github.com/tdelcey/ejhet_quanti_method_app). For non technical-users, a public version is available at the following url: [https://019adac8-81d4-aa0e-808c-08861c261fd2.share.connect.posit.cloud/](https://019adac8-81d4-aa0e-808c-08861c261fd2.share.connect.posit.cloud/).</w:t>
+      </w:r>
+    </w:p>
+  </w:footnote>
+  <w:footnote w:id="37">
+    <w:p>
+      <w:pPr>
+        <w:spacing w:after="0" w:before="0" w:line="240" w:lineRule="auto"/>
+        <w:rPr>
+          <w:sz w:val="20"/>
+          <w:szCs w:val="20"/>
+        </w:rPr>
+      </w:pPr>
+      <w:r>
+        <w:rPr>
+          <w:rStyle w:val="FootnoteReference"/>
+          <w:vertAlign w:val="superscript"/>
+        </w:rPr>
+        <w:footnoteRef/>
+      </w:r>
+      <w:r>
+        <w:rPr>
+          <w:sz w:val="20"/>
+          <w:szCs w:val="20"/>
+          <w:rtl w:val="0"/>
+        </w:rPr>
+        <w:t xml:space="preserve"> This aligns with a general finding in scientometrics that citations in the first two years after publication explain more than half of the variation in cumulative citations [@sternHighRanked2014]</w:t>
       </w:r>
     </w:p>
   </w:footnote>
   <w:footnote w:id="0">
     <w:p>
       <w:pPr>
-        <w:spacing w:before="0" w:line="240" w:lineRule="auto"/>
+        <w:spacing w:after="0" w:before="0" w:line="240" w:lineRule="auto"/>
         <w:rPr>
           <w:sz w:val="20"/>
           <w:szCs w:val="20"/>
@@ -4428,1190 +5729,7 @@
           <w:szCs w:val="20"/>
           <w:rtl w:val="0"/>
         </w:rPr>
-        <w:t xml:space="preserve"> The bibliometric communities, identified through network analysis, could also be called clusters. But we opted for “communities”, a term often used in network analysis, in order to distinguish them from the “semantic clusters”.</w:t>
-      </w:r>
-    </w:p>
-  </w:footnote>
-  <w:footnote w:id="3">
-    <w:p>
-      <w:pPr>
-        <w:spacing w:after="0" w:before="0" w:line="240" w:lineRule="auto"/>
-        <w:rPr>
-          <w:sz w:val="20"/>
-          <w:szCs w:val="20"/>
-        </w:rPr>
-      </w:pPr>
-      <w:r>
-        <w:rPr>
-          <w:rStyle w:val="FootnoteReference"/>
-          <w:vertAlign w:val="superscript"/>
-        </w:rPr>
-        <w:footnoteRef/>
-      </w:r>
-      <w:r>
-        <w:rPr>
-          <w:sz w:val="20"/>
-          <w:szCs w:val="20"/>
-          <w:rtl w:val="0"/>
-        </w:rPr>
-        <w:t xml:space="preserve"> </w:t>
-      </w:r>
-      <w:r>
-        <w:rPr>
-          <w:sz w:val="20"/>
-          <w:szCs w:val="20"/>
-          <w:rtl w:val="0"/>
-        </w:rPr>
-        <w:t xml:space="preserve">One of the main challenges for a quantitative history of economics is to move beyond reliance on proprietary digital libraries and to actively develop open, historically inclusive corpora. This includes incorporating materials produced in non-Anglophone countries and expanding the range of textual formats considered—such as books, book reviews, working papers, and conference proceedings.</w:t>
-      </w:r>
-      <w:r>
-        <w:rPr>
-          <w:rtl w:val="0"/>
-        </w:rPr>
-      </w:r>
-    </w:p>
-  </w:footnote>
-  <w:footnote w:id="8">
-    <w:p>
-      <w:pPr>
-        <w:spacing w:after="0" w:before="0" w:line="240" w:lineRule="auto"/>
-        <w:rPr>
-          <w:sz w:val="20"/>
-          <w:szCs w:val="20"/>
-        </w:rPr>
-      </w:pPr>
-      <w:r>
-        <w:rPr>
-          <w:rStyle w:val="FootnoteReference"/>
-          <w:vertAlign w:val="superscript"/>
-        </w:rPr>
-        <w:footnoteRef/>
-      </w:r>
-      <w:r>
-        <w:rPr>
-          <w:sz w:val="20"/>
-          <w:szCs w:val="20"/>
-          <w:rtl w:val="0"/>
-        </w:rPr>
-        <w:t xml:space="preserve"> Indeed, most textual methods are designed to identify commonalities within texts that share a specific linguistic structure. Hence, the same topic discussed by two documents in two different languages will likely not be identified as related because linguistic differences mask underlying semantic similarity</w:t>
-      </w:r>
-      <w:r>
-        <w:rPr>
-          <w:b w:val="1"/>
-          <w:bCs w:val="1"/>
-          <w:sz w:val="20"/>
-          <w:szCs w:val="20"/>
-          <w:rtl w:val="0"/>
-        </w:rPr>
-        <w:t xml:space="preserve">.</w:t>
-      </w:r>
-      <w:r>
-        <w:rPr>
-          <w:rtl w:val="0"/>
-        </w:rPr>
-      </w:r>
-    </w:p>
-  </w:footnote>
-  <w:footnote w:id="5">
-    <w:p>
-      <w:pPr>
-        <w:spacing w:after="0" w:before="0" w:line="240" w:lineRule="auto"/>
-        <w:rPr>
-          <w:sz w:val="20"/>
-          <w:szCs w:val="20"/>
-        </w:rPr>
-      </w:pPr>
-      <w:r>
-        <w:rPr>
-          <w:rStyle w:val="FootnoteReference"/>
-          <w:vertAlign w:val="superscript"/>
-        </w:rPr>
-        <w:footnoteRef/>
-      </w:r>
-      <w:r>
-        <w:rPr>
-          <w:sz w:val="20"/>
-          <w:szCs w:val="20"/>
-          <w:rtl w:val="0"/>
-        </w:rPr>
-        <w:t xml:space="preserve"> ISTEX allows us to retrieve economics journals not available through JSTOR or Elsevier API, such as the </w:t>
-      </w:r>
-      <w:r>
-        <w:rPr>
-          <w:i w:val="1"/>
-          <w:iCs w:val="1"/>
-          <w:sz w:val="20"/>
-          <w:szCs w:val="20"/>
-          <w:rtl w:val="0"/>
-        </w:rPr>
-        <w:t xml:space="preserve">Journal of Economic Theory</w:t>
-      </w:r>
-      <w:r>
-        <w:rPr>
-          <w:sz w:val="20"/>
-          <w:szCs w:val="20"/>
-          <w:rtl w:val="0"/>
-        </w:rPr>
-        <w:t xml:space="preserve"> and to access specific issues of Elsevier journals for which we lack institutional access (e.g., the </w:t>
-      </w:r>
-      <w:r>
-        <w:rPr>
-          <w:i w:val="1"/>
-          <w:iCs w:val="1"/>
-          <w:sz w:val="20"/>
-          <w:szCs w:val="20"/>
-          <w:rtl w:val="0"/>
-        </w:rPr>
-        <w:t xml:space="preserve">European Economic review</w:t>
-      </w:r>
-      <w:r>
-        <w:rPr>
-          <w:sz w:val="20"/>
-          <w:szCs w:val="20"/>
-          <w:rtl w:val="0"/>
-        </w:rPr>
-        <w:t xml:space="preserve"> before 1997). For more detailed information on the collection of data, see the appendix.</w:t>
-      </w:r>
-    </w:p>
-  </w:footnote>
-  <w:footnote w:id="9">
-    <w:p>
-      <w:pPr>
-        <w:spacing w:after="0" w:before="0" w:line="240" w:lineRule="auto"/>
-        <w:rPr>
-          <w:sz w:val="20"/>
-          <w:szCs w:val="20"/>
-        </w:rPr>
-      </w:pPr>
-      <w:r>
-        <w:rPr>
-          <w:rStyle w:val="FootnoteReference"/>
-          <w:vertAlign w:val="superscript"/>
-        </w:rPr>
-        <w:footnoteRef/>
-      </w:r>
-      <w:r>
-        <w:rPr>
-          <w:sz w:val="20"/>
-          <w:szCs w:val="20"/>
-          <w:rtl w:val="0"/>
-        </w:rPr>
-        <w:t xml:space="preserve"> See the appendix for more information on the matching process, in particular, @tbl-wos-match-decade.</w:t>
-      </w:r>
-    </w:p>
-  </w:footnote>
-  <w:footnote w:id="10">
-    <w:p>
-      <w:pPr>
-        <w:spacing w:after="0" w:before="0" w:line="240" w:lineRule="auto"/>
-        <w:rPr>
-          <w:sz w:val="20"/>
-          <w:szCs w:val="20"/>
-        </w:rPr>
-      </w:pPr>
-      <w:r>
-        <w:rPr>
-          <w:rStyle w:val="FootnoteReference"/>
-          <w:vertAlign w:val="superscript"/>
-        </w:rPr>
-        <w:footnoteRef/>
-      </w:r>
-      <w:r>
-        <w:rPr>
-          <w:sz w:val="20"/>
-          <w:szCs w:val="20"/>
-          <w:rtl w:val="0"/>
-        </w:rPr>
-        <w:t xml:space="preserve"> </w:t>
-      </w:r>
-      <w:r>
-        <w:rPr>
-          <w:sz w:val="20"/>
-          <w:szCs w:val="20"/>
-          <w:rtl w:val="0"/>
-        </w:rPr>
-        <w:t xml:space="preserve">Adding these other outlets would pose additional challenges. For both working papers and, above all, books, no large-scale databases provide comprehensive full texts or complete reference lists. In addition, working papers raise the problem of potential double counting, as they may eventually be published in economic journals.</w:t>
-      </w:r>
-    </w:p>
-  </w:footnote>
-  <w:footnote w:id="11">
-    <w:p>
-      <w:pPr>
-        <w:spacing w:after="0" w:before="0" w:line="240" w:lineRule="auto"/>
-        <w:rPr>
-          <w:sz w:val="20"/>
-          <w:szCs w:val="20"/>
-        </w:rPr>
-      </w:pPr>
-      <w:r>
-        <w:rPr>
-          <w:rStyle w:val="FootnoteReference"/>
-          <w:vertAlign w:val="superscript"/>
-        </w:rPr>
-        <w:footnoteRef/>
-      </w:r>
-      <w:r>
-        <w:rPr>
-          <w:sz w:val="20"/>
-          <w:szCs w:val="20"/>
-          <w:rtl w:val="0"/>
-        </w:rPr>
-        <w:t xml:space="preserve"> We did not filter journals by language a priori. Indeed, many non-anglo-saxon journals also publish English articles at some more or less frequent occasions. It was thus easier to filter by language a posteriori and at the document level, once articles were collected.</w:t>
-      </w:r>
-    </w:p>
-  </w:footnote>
-  <w:footnote w:id="12">
-    <w:p>
-      <w:pPr>
-        <w:spacing w:after="0" w:before="0" w:line="240" w:lineRule="auto"/>
-        <w:rPr>
-          <w:sz w:val="20"/>
-          <w:szCs w:val="20"/>
-        </w:rPr>
-      </w:pPr>
-      <w:r>
-        <w:rPr>
-          <w:rStyle w:val="FootnoteReference"/>
-          <w:vertAlign w:val="superscript"/>
-        </w:rPr>
-        <w:footnoteRef/>
-      </w:r>
-      <w:r>
-        <w:rPr>
-          <w:sz w:val="20"/>
-          <w:szCs w:val="20"/>
-          <w:rtl w:val="0"/>
-        </w:rPr>
-        <w:t xml:space="preserve"> Our goal here is not to provide the reader with extensive details on what these models are and how we use them (see the appendix for additional details and references), but rather to provide general intuitions about the use of LLMs, to understand the building of our corpus.</w:t>
-      </w:r>
-    </w:p>
-  </w:footnote>
-  <w:footnote w:id="24">
-    <w:p>
-      <w:pPr>
-        <w:spacing w:after="0" w:before="0" w:line="240" w:lineRule="auto"/>
-        <w:rPr>
-          <w:sz w:val="20"/>
-          <w:szCs w:val="20"/>
-        </w:rPr>
-      </w:pPr>
-      <w:r>
-        <w:rPr>
-          <w:rStyle w:val="FootnoteReference"/>
-          <w:vertAlign w:val="superscript"/>
-        </w:rPr>
-        <w:footnoteRef/>
-      </w:r>
-      <w:r>
-        <w:rPr>
-          <w:sz w:val="20"/>
-          <w:szCs w:val="20"/>
-          <w:rtl w:val="0"/>
-        </w:rPr>
-        <w:t xml:space="preserve"> We don’t use overlapping windows in this case, notably for computational reasons: finding HDBSCAN clusters on a set of tens of thousands of sentences is much more computationally intensive than finding bibliometric communities for at most a few thousands of articles.</w:t>
-      </w:r>
-    </w:p>
-  </w:footnote>
-  <w:footnote w:id="25">
-    <w:p>
-      <w:pPr>
-        <w:spacing w:after="0" w:before="0" w:line="240" w:lineRule="auto"/>
-        <w:rPr>
-          <w:sz w:val="20"/>
-          <w:szCs w:val="20"/>
-        </w:rPr>
-      </w:pPr>
-      <w:r>
-        <w:rPr>
-          <w:rStyle w:val="FootnoteReference"/>
-          <w:vertAlign w:val="superscript"/>
-        </w:rPr>
-        <w:footnoteRef/>
-      </w:r>
-      <w:r>
-        <w:rPr>
-          <w:sz w:val="20"/>
-          <w:szCs w:val="20"/>
-          <w:rtl w:val="0"/>
-        </w:rPr>
-        <w:t xml:space="preserve"> Refer to the appendix for details.</w:t>
-      </w:r>
-    </w:p>
-  </w:footnote>
-  <w:footnote w:id="19">
-    <w:p>
-      <w:pPr>
-        <w:spacing w:after="0" w:before="0" w:line="240" w:lineRule="auto"/>
-        <w:rPr>
-          <w:sz w:val="20"/>
-          <w:szCs w:val="20"/>
-        </w:rPr>
-      </w:pPr>
-      <w:r>
-        <w:rPr>
-          <w:rStyle w:val="FootnoteReference"/>
-          <w:vertAlign w:val="superscript"/>
-        </w:rPr>
-        <w:footnoteRef/>
-      </w:r>
-      <w:r>
-        <w:rPr>
-          <w:sz w:val="20"/>
-          <w:szCs w:val="20"/>
-          <w:rtl w:val="0"/>
-        </w:rPr>
-        <w:t xml:space="preserve"> “Unsupervised” does not mean that the modeller has no influence on the output. The analyst must choose a particular model and its parameters and these choices embed methodological priors about the types of patterns the procedure is likely to reveal. For instance, one crucial parameter in many unsupervised models is the number of categories that will emerge from the algorithm. We detail and justify the different parameters chosen for our methods in the appendix.</w:t>
-      </w:r>
-    </w:p>
-  </w:footnote>
-  <w:footnote w:id="29">
-    <w:p>
-      <w:pPr>
-        <w:spacing w:after="0" w:before="0" w:line="240" w:lineRule="auto"/>
-        <w:rPr>
-          <w:sz w:val="20"/>
-          <w:szCs w:val="20"/>
-        </w:rPr>
-      </w:pPr>
-      <w:r>
-        <w:rPr>
-          <w:rStyle w:val="FootnoteReference"/>
-          <w:vertAlign w:val="superscript"/>
-        </w:rPr>
-        <w:footnoteRef/>
-      </w:r>
-      <w:r>
-        <w:rPr>
-          <w:sz w:val="20"/>
-          <w:szCs w:val="20"/>
-          <w:rtl w:val="0"/>
-        </w:rPr>
-        <w:t xml:space="preserve"> However, because we focus on English, published articles, our clusters are biased toward American journals, notably in the first decades.</w:t>
-      </w:r>
-    </w:p>
-  </w:footnote>
-  <w:footnote w:id="28">
-    <w:p>
-      <w:pPr>
-        <w:spacing w:after="0" w:before="0" w:line="240" w:lineRule="auto"/>
-        <w:rPr>
-          <w:sz w:val="20"/>
-          <w:szCs w:val="20"/>
-        </w:rPr>
-      </w:pPr>
-      <w:r>
-        <w:rPr>
-          <w:rStyle w:val="FootnoteReference"/>
-          <w:vertAlign w:val="superscript"/>
-        </w:rPr>
-        <w:footnoteRef/>
-      </w:r>
-      <w:r>
-        <w:rPr>
-          <w:sz w:val="20"/>
-          <w:szCs w:val="20"/>
-          <w:rtl w:val="0"/>
-        </w:rPr>
-        <w:t xml:space="preserve"> </w:t>
-      </w:r>
-      <w:r>
-        <w:rPr>
-          <w:sz w:val="20"/>
-          <w:szCs w:val="20"/>
-          <w:rtl w:val="0"/>
-        </w:rPr>
-        <w:t xml:space="preserve">Of course, as in any historical inquiry of this kind, we are not entirely protected from selective emphasis, all the more so given that the scope of our study is too broad to summarize every pattern revealed by our results. Other scholars could have, at various junctures, pursued different interpretive directions on the basis of the same indicators (especially most similar sentences and articles). The publication of the [</w:t>
-      </w:r>
-      <w:r>
-        <w:rPr>
-          <w:sz w:val="20"/>
-          <w:szCs w:val="20"/>
-          <w:rtl w:val="0"/>
-        </w:rPr>
-        <w:t xml:space="preserve">interactive application</w:t>
-      </w:r>
-      <w:r>
-        <w:rPr>
-          <w:sz w:val="20"/>
-          <w:szCs w:val="20"/>
-          <w:rtl w:val="0"/>
-        </w:rPr>
-        <w:t xml:space="preserve">](https://019adac8-81d4-aa0e-808c-08861c261fd2.share.connect.posit.cloud/) we used to explore the results thus serves as an exercise in transparency and—in addition to being, we hope, useful for historians of economic thought more generally—allows readers to assess the robustness and limits of our narrative.</w:t>
-      </w:r>
-    </w:p>
-  </w:footnote>
-  <w:footnote w:id="30">
-    <w:p>
-      <w:pPr>
-        <w:spacing w:after="0" w:before="0" w:line="240" w:lineRule="auto"/>
-        <w:rPr>
-          <w:sz w:val="20"/>
-          <w:szCs w:val="20"/>
-        </w:rPr>
-      </w:pPr>
-      <w:r>
-        <w:rPr>
-          <w:rStyle w:val="FootnoteReference"/>
-          <w:vertAlign w:val="superscript"/>
-        </w:rPr>
-        <w:footnoteRef/>
-      </w:r>
-      <w:r>
-        <w:rPr>
-          <w:sz w:val="20"/>
-          <w:szCs w:val="20"/>
-          <w:rtl w:val="0"/>
-        </w:rPr>
-        <w:t xml:space="preserve"> Some years earlier, @mitchellRationality1910[97] already pushed forward similar claims, regretting that “few economists have regarded the study of psychology as a necessary part of the equipment of their work,” often relying on “tacit preconceptions” rather than than seeking “psychologists to gain a knowledge of the mind and its modes of operation.”</w:t>
-      </w:r>
-    </w:p>
-  </w:footnote>
-  <w:footnote w:id="34">
-    <w:p>
-      <w:pPr>
-        <w:spacing w:after="0" w:before="0" w:line="240" w:lineRule="auto"/>
-        <w:rPr>
-          <w:sz w:val="20"/>
-          <w:szCs w:val="20"/>
-        </w:rPr>
-      </w:pPr>
-      <w:r>
-        <w:rPr>
-          <w:rStyle w:val="FootnoteReference"/>
-          <w:vertAlign w:val="superscript"/>
-        </w:rPr>
-        <w:footnoteRef/>
-      </w:r>
-      <w:r>
-        <w:rPr>
-          <w:sz w:val="20"/>
-          <w:szCs w:val="20"/>
-          <w:rtl w:val="0"/>
-        </w:rPr>
-        <w:t xml:space="preserve"> This grouping of sentences in the 1970s actually took its origins in the cluster “Utility Theory” (which ended in the 1960s) with a focus on welfare economics.</w:t>
-      </w:r>
-    </w:p>
-  </w:footnote>
-  <w:footnote w:id="35">
-    <w:p>
-      <w:pPr>
-        <w:spacing w:before="0" w:line="240" w:lineRule="auto"/>
-        <w:ind w:right="600"/>
-        <w:rPr>
-          <w:sz w:val="20"/>
-          <w:szCs w:val="20"/>
-        </w:rPr>
-      </w:pPr>
-      <w:r>
-        <w:rPr>
-          <w:rStyle w:val="FootnoteReference"/>
-          <w:vertAlign w:val="superscript"/>
-        </w:rPr>
-        <w:footnoteRef/>
-      </w:r>
-      <w:r>
-        <w:rPr>
-          <w:sz w:val="20"/>
-          <w:szCs w:val="20"/>
-          <w:rtl w:val="0"/>
-        </w:rPr>
-        <w:t xml:space="preserve"> This highlights a key caveat of our methods. Because these methods foreground statistically “significant” patterns and indicators’ prevalence, they are not always well suited to tracing and interpreting the origins of a concept or theory with the care that close historical study and archival research provide.</w:t>
-      </w:r>
-    </w:p>
-  </w:footnote>
-  <w:footnote w:id="32">
-    <w:p>
-      <w:pPr>
-        <w:spacing w:after="0" w:before="0" w:line="240" w:lineRule="auto"/>
-        <w:rPr>
-          <w:sz w:val="18"/>
-          <w:szCs w:val="18"/>
-        </w:rPr>
-      </w:pPr>
-      <w:r>
-        <w:rPr>
-          <w:rStyle w:val="FootnoteReference"/>
-          <w:vertAlign w:val="superscript"/>
-        </w:rPr>
-        <w:footnoteRef/>
-      </w:r>
-      <w:r>
-        <w:rPr>
-          <w:sz w:val="20"/>
-          <w:szCs w:val="20"/>
-          <w:rtl w:val="0"/>
-        </w:rPr>
-        <w:t xml:space="preserve"> </w:t>
-      </w:r>
-      <w:r>
-        <w:rPr>
-          <w:sz w:val="20"/>
-          <w:szCs w:val="20"/>
-          <w:rtl w:val="0"/>
-        </w:rPr>
-        <w:t xml:space="preserve">Machlup’s position was that even if a “goodly portion of all business behavior may be non-rational, thoughtless, [or] blindly repetitive” [-@machlupMarginal1946, 520], questionnaire evidence and empirical findings more generally did not demonstrate the failure of marginal theory when properly interpreted. In a similar defense of profit maximization, Leonid @hurwiczTheory1946[110] first acknowledged that it was not “inconceivable that business is run more by routine than by rationality,” but argued that behavior may appear irrational or merely “routine” from the standpoint of a purely static theory that ignores uncertainty, while proving fully “rational” once uncertainty and long-run effects are taken into account [see also @</w:t>
-      </w:r>
-      <w:r>
-        <w:rPr>
-          <w:sz w:val="20"/>
-          <w:szCs w:val="20"/>
-          <w:rtl w:val="0"/>
-        </w:rPr>
-        <w:t xml:space="preserve">herfeldTheories2018]</w:t>
-      </w:r>
-      <w:r>
-        <w:rPr>
-          <w:sz w:val="20"/>
-          <w:szCs w:val="20"/>
-          <w:rtl w:val="0"/>
-        </w:rPr>
-        <w:t xml:space="preserve">.</w:t>
-      </w:r>
-      <w:r>
-        <w:rPr>
-          <w:rtl w:val="0"/>
-        </w:rPr>
-      </w:r>
-    </w:p>
-  </w:footnote>
-  <w:footnote w:id="2">
-    <w:p>
-      <w:pPr>
-        <w:spacing w:after="0" w:before="0" w:line="240" w:lineRule="auto"/>
-        <w:rPr>
-          <w:sz w:val="20"/>
-          <w:szCs w:val="20"/>
-        </w:rPr>
-      </w:pPr>
-      <w:r>
-        <w:rPr>
-          <w:rStyle w:val="FootnoteReference"/>
-          <w:vertAlign w:val="superscript"/>
-        </w:rPr>
-        <w:footnoteRef/>
-      </w:r>
-      <w:r>
-        <w:rPr>
-          <w:sz w:val="20"/>
-          <w:szCs w:val="20"/>
-          <w:rtl w:val="0"/>
-        </w:rPr>
-        <w:t xml:space="preserve"> The application is available in the GitHub repository: [anonymized]</w:t>
-      </w:r>
-      <w:r>
-        <w:rPr>
-          <w:sz w:val="20"/>
-          <w:szCs w:val="20"/>
-          <w:rtl w:val="0"/>
-        </w:rPr>
-        <w:t xml:space="preserve">. A public version is available at the following url: [https://019adac8-81d4-aa0e-808c-08861c261fd2.share.connect.posit.cloud/](https://019adac8-81d4-aa0e-808c-08861c261fd2.share.connect.posit.cloud/).</w:t>
-      </w:r>
-      <w:r>
-        <w:rPr>
-          <w:rtl w:val="0"/>
-        </w:rPr>
-      </w:r>
-    </w:p>
-  </w:footnote>
-  <w:footnote w:id="4">
-    <w:p>
-      <w:pPr>
-        <w:spacing w:after="0" w:before="0" w:line="240" w:lineRule="auto"/>
-        <w:rPr>
-          <w:sz w:val="20"/>
-          <w:szCs w:val="20"/>
-        </w:rPr>
-      </w:pPr>
-      <w:r>
-        <w:rPr>
-          <w:rStyle w:val="FootnoteReference"/>
-          <w:vertAlign w:val="superscript"/>
-        </w:rPr>
-        <w:footnoteRef/>
-      </w:r>
-      <w:r>
-        <w:rPr>
-          <w:sz w:val="20"/>
-          <w:szCs w:val="20"/>
-          <w:rtl w:val="0"/>
-        </w:rPr>
-        <w:t xml:space="preserve"> The Elsevier API allows users to retrieve the full text of Elsevier journals such as the </w:t>
-      </w:r>
-      <w:r>
-        <w:rPr>
-          <w:i w:val="1"/>
-          <w:iCs w:val="1"/>
-          <w:sz w:val="20"/>
-          <w:szCs w:val="20"/>
-          <w:rtl w:val="0"/>
-        </w:rPr>
-        <w:t xml:space="preserve">European Economic Review</w:t>
-      </w:r>
-      <w:r>
-        <w:rPr>
-          <w:sz w:val="20"/>
-          <w:szCs w:val="20"/>
-          <w:rtl w:val="0"/>
-        </w:rPr>
-        <w:t xml:space="preserve">, provided that they have institutional access to the relevant issues.</w:t>
-      </w:r>
-    </w:p>
-  </w:footnote>
-  <w:footnote w:id="14">
-    <w:p>
-      <w:pPr>
-        <w:spacing w:after="0" w:before="0" w:line="240" w:lineRule="auto"/>
-        <w:rPr>
-          <w:sz w:val="20"/>
-          <w:szCs w:val="20"/>
-        </w:rPr>
-      </w:pPr>
-      <w:r>
-        <w:rPr>
-          <w:rStyle w:val="FootnoteReference"/>
-          <w:vertAlign w:val="superscript"/>
-        </w:rPr>
-        <w:footnoteRef/>
-      </w:r>
-      <w:r>
-        <w:rPr>
-          <w:sz w:val="20"/>
-          <w:szCs w:val="20"/>
-          <w:rtl w:val="0"/>
-        </w:rPr>
-        <w:t xml:space="preserve"> Moreover, the texts used to train these models are not primarily academic articles in economics. This means that there may be important gaps between the general language patterns the model has learned and the specific vocabulary, concepts, and writing practices of our “domain” [see e.g. @zhangEconBERT2025].</w:t>
-      </w:r>
-    </w:p>
-  </w:footnote>
-  <w:footnote w:id="17">
-    <w:p>
-      <w:pPr>
-        <w:spacing w:after="0" w:before="0" w:line="240" w:lineRule="auto"/>
-        <w:rPr>
-          <w:sz w:val="20"/>
-          <w:szCs w:val="20"/>
-        </w:rPr>
-      </w:pPr>
-      <w:r>
-        <w:rPr>
-          <w:rStyle w:val="FootnoteReference"/>
-          <w:vertAlign w:val="superscript"/>
-        </w:rPr>
-        <w:footnoteRef/>
-      </w:r>
-      <w:r>
-        <w:rPr>
-          <w:sz w:val="20"/>
-          <w:szCs w:val="20"/>
-          <w:rtl w:val="0"/>
-        </w:rPr>
-        <w:t xml:space="preserve"> The choice of the 1% quantile reflects a trade-off between false positives and false negatives. We observed that a more restrictive threshold (e.g., 0.5%) excludes many sentences that obviously deal with rationality in economics, whereas a more permissive threshold (e.g. 2%) includes sentences that are too distant from our core focus, particularly in earlier periods. The 1% threshold therefore appeared as a reasonable compromise. Moreover, a moderate number of false positives does not substantially threaten the analysis, since such sentences are likely to be classified as “noise” by the HDBSCAN algorithm. </w:t>
-      </w:r>
-    </w:p>
-  </w:footnote>
-  <w:footnote w:id="18">
-    <w:p>
-      <w:pPr>
-        <w:spacing w:after="0" w:before="0" w:line="240" w:lineRule="auto"/>
-        <w:rPr>
-          <w:sz w:val="20"/>
-          <w:szCs w:val="20"/>
-        </w:rPr>
-      </w:pPr>
-      <w:r>
-        <w:rPr>
-          <w:rStyle w:val="FootnoteReference"/>
-          <w:vertAlign w:val="superscript"/>
-        </w:rPr>
-        <w:footnoteRef/>
-      </w:r>
-      <w:r>
-        <w:rPr>
-          <w:sz w:val="20"/>
-          <w:szCs w:val="20"/>
-          <w:rtl w:val="0"/>
-        </w:rPr>
-        <w:t xml:space="preserve"> The “articles-corpus” only </w:t>
-      </w:r>
-      <w:r>
-        <w:rPr>
-          <w:sz w:val="20"/>
-          <w:szCs w:val="20"/>
-          <w:rtl w:val="0"/>
-        </w:rPr>
-        <w:t xml:space="preserve">starts</w:t>
-      </w:r>
-      <w:r>
-        <w:rPr>
-          <w:sz w:val="20"/>
-          <w:szCs w:val="20"/>
-          <w:rtl w:val="0"/>
-        </w:rPr>
-        <w:t xml:space="preserve"> in 1960, because the bibliographic data from WoS </w:t>
-      </w:r>
-      <w:r>
-        <w:rPr>
-          <w:sz w:val="20"/>
-          <w:szCs w:val="20"/>
-          <w:rtl w:val="0"/>
-        </w:rPr>
-        <w:t xml:space="preserve">are</w:t>
-      </w:r>
-      <w:r>
-        <w:rPr>
-          <w:sz w:val="20"/>
-          <w:szCs w:val="20"/>
-          <w:rtl w:val="0"/>
-        </w:rPr>
-        <w:t xml:space="preserve"> too limited prior to this date to be reliably used.</w:t>
-      </w:r>
-    </w:p>
-  </w:footnote>
-  <w:footnote w:id="16">
-    <w:p>
-      <w:pPr>
-        <w:spacing w:after="0" w:before="0" w:line="240" w:lineRule="auto"/>
-        <w:rPr>
-          <w:sz w:val="20"/>
-          <w:szCs w:val="20"/>
-        </w:rPr>
-      </w:pPr>
-      <w:r>
-        <w:rPr>
-          <w:rStyle w:val="FootnoteReference"/>
-          <w:vertAlign w:val="superscript"/>
-        </w:rPr>
-        <w:footnoteRef/>
-      </w:r>
-      <w:r>
-        <w:rPr>
-          <w:sz w:val="20"/>
-          <w:szCs w:val="20"/>
-          <w:rtl w:val="0"/>
-        </w:rPr>
-        <w:t xml:space="preserve"> We initially tested a symmetric two-year window. However, particularly in the early periods, this specification resulted in substantial volatility in average usage of the terms “rational” and “rationality”, thereby increasing the number of “noisy” sentences (i.e. sentences not clearly related to rationality or tied to highly specific issues). Conversely, longer windows would reduce the advantages of our historical approach, as they would blur temporal variation too much, especially given the rapid growth of the corpus after the 1960s.</w:t>
-      </w:r>
-    </w:p>
-  </w:footnote>
-  <w:footnote w:id="13">
-    <w:p>
-      <w:pPr>
-        <w:spacing w:after="0" w:before="0" w:line="240" w:lineRule="auto"/>
-        <w:rPr>
-          <w:sz w:val="20"/>
-          <w:szCs w:val="20"/>
-        </w:rPr>
-      </w:pPr>
-      <w:r>
-        <w:rPr>
-          <w:rStyle w:val="FootnoteReference"/>
-          <w:vertAlign w:val="superscript"/>
-        </w:rPr>
-        <w:footnoteRef/>
-      </w:r>
-      <w:r>
-        <w:rPr>
-          <w:sz w:val="20"/>
-          <w:szCs w:val="20"/>
-          <w:rtl w:val="0"/>
-        </w:rPr>
-        <w:t xml:space="preserve"> Henceforth, “similarity” between sentences or documents refers to cosine similarity.</w:t>
-      </w:r>
-    </w:p>
-  </w:footnote>
-  <w:footnote w:id="21">
-    <w:p>
-      <w:pPr>
-        <w:spacing w:after="0" w:before="0" w:line="240" w:lineRule="auto"/>
-        <w:rPr>
-          <w:sz w:val="20"/>
-          <w:szCs w:val="20"/>
-        </w:rPr>
-      </w:pPr>
-      <w:r>
-        <w:rPr>
-          <w:rStyle w:val="FootnoteReference"/>
-          <w:vertAlign w:val="superscript"/>
-        </w:rPr>
-        <w:footnoteRef/>
-      </w:r>
-      <w:r>
-        <w:rPr>
-          <w:rtl w:val="0"/>
-        </w:rPr>
-        <w:t xml:space="preserve"> </w:t>
-      </w:r>
-      <w:r>
-        <w:rPr>
-          <w:sz w:val="20"/>
-          <w:szCs w:val="20"/>
-          <w:rtl w:val="0"/>
-        </w:rPr>
-        <w:t xml:space="preserve">That does not mean, however, that an unsupervised algorithm can be applied blindly to historical questions: a substantial part of our effort has consisted in adapting the method to our historical data, especially to accommodate the growth of the corpus over time.</w:t>
-      </w:r>
-      <w:r>
-        <w:rPr>
-          <w:rtl w:val="0"/>
-        </w:rPr>
-      </w:r>
-    </w:p>
-  </w:footnote>
-  <w:footnote w:id="23">
-    <w:p>
-      <w:pPr>
-        <w:spacing w:after="0" w:before="0" w:line="240" w:lineRule="auto"/>
-        <w:rPr>
-          <w:sz w:val="20"/>
-          <w:szCs w:val="20"/>
-        </w:rPr>
-      </w:pPr>
-      <w:r>
-        <w:rPr>
-          <w:rStyle w:val="FootnoteReference"/>
-          <w:vertAlign w:val="superscript"/>
-        </w:rPr>
-        <w:footnoteRef/>
-      </w:r>
-      <w:r>
-        <w:rPr>
-          <w:sz w:val="20"/>
-          <w:szCs w:val="20"/>
-          <w:rtl w:val="0"/>
-        </w:rPr>
-        <w:t xml:space="preserve">  Refer to the appendix for details.</w:t>
-      </w:r>
-    </w:p>
-  </w:footnote>
-  <w:footnote w:id="6">
-    <w:p>
-      <w:pPr>
-        <w:spacing w:after="0" w:before="0" w:line="240" w:lineRule="auto"/>
-        <w:rPr>
-          <w:sz w:val="20"/>
-          <w:szCs w:val="20"/>
-        </w:rPr>
-      </w:pPr>
-      <w:r>
-        <w:rPr>
-          <w:rStyle w:val="FootnoteReference"/>
-          <w:vertAlign w:val="superscript"/>
-        </w:rPr>
-        <w:footnoteRef/>
-      </w:r>
-      <w:r>
-        <w:rPr>
-          <w:sz w:val="20"/>
-          <w:szCs w:val="20"/>
-          <w:rtl w:val="0"/>
-        </w:rPr>
-        <w:t xml:space="preserve"> Bibliometric and textual data themselves have a history; they are “made by institutions, through human processes” [@</w:t>
-      </w:r>
-      <w:r>
-        <w:rPr>
-          <w:sz w:val="20"/>
-          <w:szCs w:val="20"/>
-          <w:rtl w:val="0"/>
-        </w:rPr>
-        <w:t xml:space="preserve">guldiDangerous2023</w:t>
-      </w:r>
-      <w:r>
-        <w:rPr>
-          <w:sz w:val="20"/>
-          <w:szCs w:val="20"/>
-          <w:rtl w:val="0"/>
-        </w:rPr>
-        <w:t xml:space="preserve">, 34]. Whether digital or material, archives are shaped by “distortions” and "occlusions", and the processes through which they are constituted are themselves worthy subjects of historical investigation [@dastonSciences2012]. </w:t>
-      </w:r>
-    </w:p>
-  </w:footnote>
-  <w:footnote w:id="7">
-    <w:p>
-      <w:pPr>
-        <w:spacing w:after="0" w:before="0" w:line="240" w:lineRule="auto"/>
-        <w:rPr>
-          <w:sz w:val="20"/>
-          <w:szCs w:val="20"/>
-        </w:rPr>
-      </w:pPr>
-      <w:r>
-        <w:rPr>
-          <w:rStyle w:val="FootnoteReference"/>
-          <w:vertAlign w:val="superscript"/>
-        </w:rPr>
-        <w:footnoteRef/>
-      </w:r>
-      <w:r>
-        <w:rPr>
-          <w:sz w:val="20"/>
-          <w:szCs w:val="20"/>
-          <w:rtl w:val="0"/>
-        </w:rPr>
-        <w:t xml:space="preserve"> The programming dimension of such computational approaches enable iterative feedback between analysis and corpus cleaning [@nelsonComputational2020]; critical scrutiny can therefore be continuously exercised at each stage of the research “pipeline” [@leeRole2020].</w:t>
-      </w:r>
-    </w:p>
-  </w:footnote>
-  <w:footnote w:id="20">
-    <w:p>
-      <w:pPr>
-        <w:spacing w:after="0" w:before="0" w:line="240" w:lineRule="auto"/>
-        <w:rPr>
-          <w:sz w:val="20"/>
-          <w:szCs w:val="20"/>
-        </w:rPr>
-      </w:pPr>
-      <w:r>
-        <w:rPr>
-          <w:rStyle w:val="FootnoteReference"/>
-          <w:vertAlign w:val="superscript"/>
-        </w:rPr>
-        <w:footnoteRef/>
-      </w:r>
-      <w:r>
-        <w:rPr>
-          <w:sz w:val="20"/>
-          <w:szCs w:val="20"/>
-          <w:rtl w:val="0"/>
-        </w:rPr>
-        <w:t xml:space="preserve"> See @simonsLarge2026 for a discussion of using LLMs with unsupervised or supervised methods in the history and philosophy of science.</w:t>
-      </w:r>
-    </w:p>
-  </w:footnote>
-  <w:footnote w:id="27">
-    <w:p>
-      <w:pPr>
-        <w:spacing w:after="0" w:before="0" w:line="240" w:lineRule="auto"/>
-        <w:rPr>
-          <w:sz w:val="20"/>
-          <w:szCs w:val="20"/>
-        </w:rPr>
-      </w:pPr>
-      <w:r>
-        <w:rPr>
-          <w:rStyle w:val="FootnoteReference"/>
-          <w:vertAlign w:val="superscript"/>
-        </w:rPr>
-        <w:footnoteRef/>
-      </w:r>
-      <w:r>
-        <w:rPr>
-          <w:sz w:val="20"/>
-          <w:szCs w:val="20"/>
-          <w:rtl w:val="0"/>
-        </w:rPr>
-        <w:t xml:space="preserve"> One step in the discovery and interpretive process is often the assignment of “labels” to clusters in order to facilitate the interpretation of visualizations. We assign manually a label to each intertemporal semantic cluster and bibliometric community after qualitative inspection.</w:t>
-      </w:r>
-    </w:p>
-  </w:footnote>
-  <w:footnote w:id="31">
-    <w:p>
-      <w:pPr>
-        <w:spacing w:after="0" w:before="0" w:line="240" w:lineRule="auto"/>
-        <w:rPr>
-          <w:sz w:val="20"/>
-          <w:szCs w:val="20"/>
-        </w:rPr>
-      </w:pPr>
-      <w:r>
-        <w:rPr>
-          <w:rStyle w:val="FootnoteReference"/>
-          <w:vertAlign w:val="superscript"/>
-        </w:rPr>
-        <w:footnoteRef/>
-      </w:r>
-      <w:r>
-        <w:rPr>
-          <w:sz w:val="20"/>
-          <w:szCs w:val="20"/>
-          <w:rtl w:val="0"/>
-        </w:rPr>
-        <w:t xml:space="preserve"> See closest sentences to the “Utility Theory” cluster’s centroid.</w:t>
-      </w:r>
-    </w:p>
-  </w:footnote>
-  <w:footnote w:id="33">
-    <w:p>
-      <w:pPr>
-        <w:spacing w:after="0" w:before="0" w:line="240" w:lineRule="auto"/>
-        <w:rPr>
-          <w:sz w:val="20"/>
-          <w:szCs w:val="20"/>
-        </w:rPr>
-      </w:pPr>
-      <w:r>
-        <w:rPr>
-          <w:rStyle w:val="FootnoteReference"/>
-          <w:vertAlign w:val="superscript"/>
-        </w:rPr>
-        <w:footnoteRef/>
-      </w:r>
-      <w:r>
-        <w:rPr>
-          <w:sz w:val="20"/>
-          <w:szCs w:val="20"/>
-          <w:rtl w:val="0"/>
-        </w:rPr>
-        <w:t xml:space="preserve"> The cluster “Firm Theory &amp; Entrepreneur” nevertheless remained a site for critiques of profit maximization. During the 1960s and 1970s, contributions that proposed alternative frameworks for explaining firms’ decisions were highly cited [such as @simonTheories1959] or appeared among closest articles from centroid [like @winterSatisficing1971].</w:t>
-      </w:r>
-    </w:p>
-  </w:footnote>
-  <w:footnote w:id="22">
-    <w:p>
-      <w:pPr>
-        <w:spacing w:after="0" w:before="0" w:line="240" w:lineRule="auto"/>
-        <w:rPr>
-          <w:sz w:val="20"/>
-          <w:szCs w:val="20"/>
-        </w:rPr>
-      </w:pPr>
-      <w:r>
-        <w:rPr>
-          <w:rStyle w:val="FootnoteReference"/>
-          <w:vertAlign w:val="superscript"/>
-        </w:rPr>
-        <w:footnoteRef/>
-      </w:r>
-      <w:r>
-        <w:rPr>
-          <w:sz w:val="20"/>
-          <w:szCs w:val="20"/>
-          <w:rtl w:val="0"/>
-        </w:rPr>
-        <w:t xml:space="preserve"> The eight-year window for defining bibliometric communities aligns with established practices in the quantitative history of economics [@claveauMacrodynamics2016], where timeframes typically range between 5 and 10 years [@abramoAssessing2011]. Given that economics exhibits longer citation lifespans than the natural sciences [@lariviereLongterm2008; @aistleitnerCitation2019], and considering the multi-decade scope of our study, we opted for a window longer than five years. This choice balances granularity with the need to capture enduring citation patterns, avoiding the coarser resolution of a 10-year window.</w:t>
-      </w:r>
-    </w:p>
-  </w:footnote>
-  <w:footnote w:id="15">
-    <w:p>
-      <w:pPr>
-        <w:spacing w:after="0" w:before="0" w:line="240" w:lineRule="auto"/>
-        <w:rPr>
-          <w:sz w:val="20"/>
-          <w:szCs w:val="20"/>
-        </w:rPr>
-      </w:pPr>
-      <w:r>
-        <w:rPr>
-          <w:rStyle w:val="FootnoteReference"/>
-          <w:vertAlign w:val="superscript"/>
-        </w:rPr>
-        <w:footnoteRef/>
-      </w:r>
-      <w:r>
-        <w:rPr>
-          <w:sz w:val="20"/>
-          <w:szCs w:val="20"/>
-          <w:rtl w:val="0"/>
-        </w:rPr>
-        <w:t xml:space="preserve"> Centroids are widely used in the literature on “semantic change” to represent the average embedding of a temporal slice or a cluster of a corpus [@montanelliSurvey2024]</w:t>
-      </w:r>
-      <w:r>
-        <w:rPr>
-          <w:sz w:val="20"/>
-          <w:szCs w:val="20"/>
-          <w:rtl w:val="0"/>
-        </w:rPr>
-        <w:t xml:space="preserve">.</w:t>
-      </w:r>
-      <w:r>
-        <w:rPr>
-          <w:sz w:val="20"/>
-          <w:szCs w:val="20"/>
-          <w:rtl w:val="0"/>
-        </w:rPr>
-        <w:t xml:space="preserve"> We adopt the centroid rather than the medoid (i.e. the observed sentences whose embedding is closest to all others in the set), as the centroid smooths over idiosyncratic variation across sentences, whereas the medoid may be disproportionately influenced by a single atypical example. While the medoid is an embedding of a real sentence and is easily interpretable, it is straightforward to compute the closest vector from the centroid (see </w:t>
-      </w:r>
-      <w:r>
-        <w:rPr>
-          <w:sz w:val="20"/>
-          <w:szCs w:val="20"/>
-          <w:rtl w:val="0"/>
-        </w:rPr>
-        <w:t xml:space="preserve">@tbl-illustrative_sentences</w:t>
-      </w:r>
-      <w:r>
-        <w:rPr>
-          <w:sz w:val="20"/>
-          <w:szCs w:val="20"/>
-          <w:rtl w:val="0"/>
-        </w:rPr>
-        <w:t xml:space="preserve">).</w:t>
-      </w:r>
-      <w:r>
-        <w:rPr>
-          <w:rtl w:val="0"/>
-        </w:rPr>
-      </w:r>
-    </w:p>
-  </w:footnote>
-  <w:footnote w:id="26">
-    <w:p>
-      <w:pPr>
-        <w:spacing w:after="0" w:before="0" w:line="240" w:lineRule="auto"/>
-        <w:rPr>
-          <w:sz w:val="20"/>
-          <w:szCs w:val="20"/>
-        </w:rPr>
-      </w:pPr>
-      <w:r>
-        <w:rPr>
-          <w:rStyle w:val="FootnoteReference"/>
-          <w:vertAlign w:val="superscript"/>
-        </w:rPr>
-        <w:footnoteRef/>
-      </w:r>
-      <w:r>
-        <w:rPr>
-          <w:sz w:val="20"/>
-          <w:szCs w:val="20"/>
-          <w:rtl w:val="0"/>
-        </w:rPr>
-        <w:t xml:space="preserve"> The application is available in the GitHub repository: </w:t>
-      </w:r>
-      <w:hyperlink r:id="rId1">
-        <w:r>
-          <w:rPr>
-            <w:color w:val="1155cc"/>
-            <w:sz w:val="20"/>
-            <w:szCs w:val="20"/>
-            <w:u w:val="single"/>
-            <w:rtl w:val="0"/>
-          </w:rPr>
-          <w:t xml:space="preserve">https://github.com/tdelcey/ejhet_quanti_method_app</w:t>
-        </w:r>
-      </w:hyperlink>
-      <w:r>
-        <w:rPr>
-          <w:sz w:val="20"/>
-          <w:szCs w:val="20"/>
-          <w:rtl w:val="0"/>
-        </w:rPr>
-        <w:t xml:space="preserve">. For non technical-users, a public version is available at the following url: [https://019adac8-81d4-aa0e-808c-08861c261fd2.share.connect.posit.cloud/](https://019adac8-81d4-aa0e-808c-08861c261fd2.share.connect.posit.cloud/).</w:t>
-      </w:r>
-    </w:p>
-  </w:footnote>
-  <w:footnote w:id="36">
-    <w:p>
-      <w:pPr>
-        <w:spacing w:after="0" w:before="0" w:line="240" w:lineRule="auto"/>
-        <w:rPr>
-          <w:sz w:val="20"/>
-          <w:szCs w:val="20"/>
-        </w:rPr>
-      </w:pPr>
-      <w:r>
-        <w:rPr>
-          <w:rStyle w:val="FootnoteReference"/>
-          <w:vertAlign w:val="superscript"/>
-        </w:rPr>
-        <w:footnoteRef/>
-      </w:r>
-      <w:r>
-        <w:rPr>
-          <w:sz w:val="20"/>
-          <w:szCs w:val="20"/>
-          <w:rtl w:val="0"/>
-        </w:rPr>
-        <w:t xml:space="preserve"> This aligns with a general finding in scientometrics that citations in the first two years after publication explain more than half of the variation in cumulative citations [@sternHighRanked2014]</w:t>
+        <w:t xml:space="preserve"> In this perspective, our purpose is similar to @claveauSocial2018.</w:t>
       </w:r>
     </w:p>
   </w:footnote>

</xml_diff>

<commit_message>
rereading the paper for typos
</commit_message>
<xml_diff>
--- a/paper/gdoc.docx
+++ b/paper/gdoc.docx
@@ -2271,7 +2271,19 @@
         <w:rPr>
           <w:rtl w:val="0"/>
         </w:rPr>
-        <w:t xml:space="preserve"> Assigning such categories imposes a form of internal organization on large and otherwise unwieldy bodies of material, enabling an accelerated or “distant reading” [@morettiDistant2013]. The typical output of these methods is a map of a discipline or research area, showing how different entities—topics, articles, authors—relate to one another.  </w:t>
+        <w:t xml:space="preserve"> Assigning such categories imposes a form of internal organization on large and otherwise unwieldy bodies of material, enabling an accelerated or “distant reading” </w:t>
+      </w:r>
+      <w:r>
+        <w:rPr>
+          <w:rtl w:val="0"/>
+        </w:rPr>
+        <w:t xml:space="preserve">[@morettiDistant2013; @guldiDangerous2023]</w:t>
+      </w:r>
+      <w:r>
+        <w:rPr>
+          <w:rtl w:val="0"/>
+        </w:rPr>
+        <w:t xml:space="preserve">. The typical output of these methods is a map of a discipline or research area, showing how different entities—topics, articles, authors—relate to one another.  </w:t>
       </w:r>
     </w:p>
     <w:p>
@@ -2672,19 +2684,7 @@
         <w:rPr>
           <w:rtl w:val="0"/>
         </w:rPr>
-        <w:t xml:space="preserve">On the one hand, the analysis is not immediately transparent, as it requires the construction of intermediate tools</w:t>
-      </w:r>
-      <w:r>
-        <w:rPr>
-          <w:rtl w:val="0"/>
-        </w:rPr>
-        <w:t xml:space="preserve">—such as our interactive application—</w:t>
-      </w:r>
-      <w:r>
-        <w:rPr>
-          <w:rtl w:val="0"/>
-        </w:rPr>
-        <w:t xml:space="preserve">to guide interpretation. On the other hand, it is consistent with the practices of historians of economic thought, who likewise select, prioritise, and read texts in order to make sense of their corpus.</w:t>
+        <w:t xml:space="preserve">On the one hand, the results are not immediately transparent, as it requires intermediate analyses to make an interpretation. On the other hand, it is consistent with the practices of historians of economic thought, who likewise select, prioritise, and read texts in order to make sense of their corpus.</w:t>
       </w:r>
       <w:r>
         <w:rPr>
@@ -2722,13 +2722,13 @@
           <w:iCs w:val="1"/>
           <w:rtl w:val="0"/>
         </w:rPr>
-        <w:t xml:space="preserve">prioritise </w:t>
-      </w:r>
-      <w:r>
-        <w:rPr>
-          <w:rtl w:val="0"/>
-        </w:rPr>
-        <w:t xml:space="preserve">observations that will make sense of them. To make this crucial step as transparent and replicable as possible</w:t>
+        <w:t xml:space="preserve">rank </w:t>
+      </w:r>
+      <w:r>
+        <w:rPr>
+          <w:rtl w:val="0"/>
+        </w:rPr>
+        <w:t xml:space="preserve">observations (in our case, sentences or documents) that will make sense of clusters. This selection and ranking relies on a series of indicators and a back-and-forth process between them and qualitative analysis. To make this crucial step as transparent and replicable as possible</w:t>
       </w:r>
       <w:r>
         <w:rPr>
@@ -2758,7 +2758,7 @@
         <w:rPr>
           <w:rtl w:val="0"/>
         </w:rPr>
-        <w:t xml:space="preserve"> How can we get a sense of what this cluster actually coalesces around? Before any qualitative interpretation or contextualization with the secondary literature, we must first produce a series of indicators to help us characterize the cluster. We choose the following indicators: </w:t>
+        <w:t xml:space="preserve"> How can we get a sense of what this cluster actually coalesces around? We choose the following indicators: </w:t>
       </w:r>
     </w:p>
     <w:p>
@@ -3038,7 +3038,7 @@
         <w:rPr>
           <w:rtl w:val="0"/>
         </w:rPr>
-        <w:t xml:space="preserve">Equipped with these groupings and indicators, we can make sense of our results. How can they help enrich, complete, and refine our understanding of the various and evolving meanings of rationality in economics? This paper does not propose an alternative history of the </w:t>
+        <w:t xml:space="preserve">Equipped with these groupings and indicators, we can make sense of our results. How can they help enrich, complete, and refine our understanding of the various and evolving meanings of rationality in economics? This paper does not propose a comprehensive history of the </w:t>
       </w:r>
       <w:r>
         <w:rPr>
@@ -3338,7 +3338,7 @@
         <w:rPr>
           <w:rtl w:val="0"/>
         </w:rPr>
-        <w:t xml:space="preserve">Transformations in the conception of rationality are also visible in intertemporal semantic clusters that persist over time while reflecting profound shifts in the discipline’s methodology and the growing centrality of rational choice theory</w:t>
+        <w:t xml:space="preserve">Transformations in the conception of rationality are also visible in the internal evolution of intertemporal semantic clusters</w:t>
       </w:r>
       <w:r>
         <w:rPr>
@@ -3571,7 +3571,7 @@
         <w:rPr>
           <w:rtl w:val="0"/>
         </w:rPr>
-        <w:t xml:space="preserve">Finance shows a trajectory similar to macroeconomics. The origins of financial issues can be traced to the semantic cluster “Capital &amp; Investment Theory,”  which focused initially on the theory of investment. Until the 1930s, the issue was framed around the returns of capital. For instance, the cluster includes the so-called Hayek-Knight controversy on the conception of capital [@c</w:t>
+        <w:t xml:space="preserve">Finance shows a trajectory similar to macroeconomics. Discussions on rationality in the context of finance are captured in the semantic cluster “Capital &amp; Investment Theory.” Until the 1930s, the issue was framed around the concept of capital. For instance, the cluster includes the so-called Hayek-Knight controversy on the conception of capital [@c</w:t>
       </w:r>
       <w:r>
         <w:rPr>
@@ -5217,7 +5217,7 @@
           <w:szCs w:val="20"/>
           <w:rtl w:val="0"/>
         </w:rPr>
-        <w:t xml:space="preserve"> The choice of the 1% quantile reflects a trade-off between false positives and false negatives. We observed that a more restrictive threshold (e.g., 0.5%) excludes many sentences that obviously deal with rationality in economics, whereas a more permissive threshold (e.g. 2%) includes sentences that are too distant from our core focus, particularly in earlier periods. The 1% threshold therefore appeared as a reasonable compromise. Moreover, a moderate number of false positives does not substantially threaten the analysis, since such sentences are likely to be later classified as “noise” by the HDBSCAN algorithm. </w:t>
+        <w:t xml:space="preserve"> The choice of the 1% quantile reflects a trade-off between false positives and false negatives. We observed that a more restrictive threshold (e.g., 0.5%) excludes many sentences that obviously deal with rationality in economics, whereas a more permissive threshold (e.g. 2%) includes sentences that are too distant from our core focus, particularly in earlier periods. The 1% threshold therefore appeared as a reasonable compromise. Moreover, a moderate number of false positives does not substantially threaten the analysis, since such sentences are likely to be later classified as “noise” by the HDBSCAN algorithm (more details below). </w:t>
       </w:r>
     </w:p>
   </w:footnote>

</xml_diff>

<commit_message>
add new alluvial + new version of the paper
</commit_message>
<xml_diff>
--- a/paper/gdoc.docx
+++ b/paper/gdoc.docx
@@ -403,7 +403,7 @@
         <w:rPr>
           <w:rtl w:val="0"/>
         </w:rPr>
-        <w:t xml:space="preserve"> More generally, citation practices have only standardised progressively in the postwar period. Consequently, citation data are most of the time relatively poor before the 1960s. Last, although they provide useful metadata and citation information, these databases generally lack full text, which is subject to copyright and therefore. A large and representative corpus of economics articles cannot be obtained from a single publisher. </w:t>
+        <w:t xml:space="preserve"> More generally, citation practices have only standardised progressively in the postwar period. Consequently, citation data are most of the time relatively poor before the 1960s. Last, although they provide useful metadata and citation information, these databases generally lack full text that is subject to copyright. A large and representative corpus of economics articles cannot be obtained from a single publisher. </w:t>
       </w:r>
     </w:p>
     <w:p>
@@ -498,7 +498,7 @@
         <w:rPr>
           <w:rtl w:val="0"/>
         </w:rPr>
-        <w:t xml:space="preserve">For example, a medium-scale study of the publications of the European Economic Review [@goutsmedtIndependent2023]—a few thousands documents—required combining three heterogeneous databases: Econlit (for JEL codes classification), Web of Science, and Scopus (due to incomplete coverage of the EER in Web of Science).</w:t>
+        <w:t xml:space="preserve">For example, a medium-scale study of the publications of the European Economic Review [@goutsmedtIndependent2023]—a few thousand documents—required combining three heterogeneous databases: Econlit (for JEL codes classification), Web of Science, and Scopus (due to incomplete coverage of the EER in Web of Science).</w:t>
       </w:r>
       <w:r>
         <w:rPr>
@@ -1059,25 +1059,25 @@
         <w:rPr>
           <w:rtl w:val="0"/>
         </w:rPr>
-        <w:t xml:space="preserve">For instance, [@</w:t>
-      </w:r>
-      <w:r>
-        <w:rPr>
-          <w:rtl w:val="0"/>
-        </w:rPr>
-        <w:t xml:space="preserve">fontanaFragmentation2023] restrict their economics corpus to the allegedly most influential economics journals, the “Blue Ribbon Eight”; </w:t>
-      </w:r>
-      <w:r>
-        <w:rPr>
-          <w:rtl w:val="0"/>
-        </w:rPr>
-        <w:t xml:space="preserve">[@goutsmedtIndependent2023] used the JEL codes to select macroeconomic documents; while [@trucForty2022] and </w:t>
-      </w:r>
-      <w:r>
-        <w:rPr>
-          <w:rtl w:val="0"/>
-        </w:rPr>
-        <w:t xml:space="preserve">[@jullienHistory2024] </w:t>
+        <w:t xml:space="preserve">For instance, @</w:t>
+      </w:r>
+      <w:r>
+        <w:rPr>
+          <w:rtl w:val="0"/>
+        </w:rPr>
+        <w:t xml:space="preserve">fontanaFragmentation2023 restrict their economics corpus to the allegedly most influential economics journals, the “Blue Ribbon Eight”; </w:t>
+      </w:r>
+      <w:r>
+        <w:rPr>
+          <w:rtl w:val="0"/>
+        </w:rPr>
+        <w:t xml:space="preserve">@goutsmedtIndependent2023 used the JEL codes to select macroeconomic documents; while @trucForty2022 and </w:t>
+      </w:r>
+      <w:r>
+        <w:rPr>
+          <w:rtl w:val="0"/>
+        </w:rPr>
+        <w:t xml:space="preserve">@jullienHistory2024 </w:t>
       </w:r>
       <w:r>
         <w:rPr>
@@ -1302,7 +1302,7 @@
         <w:rPr>
           <w:rtl w:val="0"/>
         </w:rPr>
-        <w:t xml:space="preserve">LLMs are trained on extremely large collections of text to learn patterns in language. The type of models we use, i.e. bidirectional encoder models such as BERT, learns to predict missing words in a sentence or to determine whether two sentences follow each other. Through this training, the model learns billions of internal parameters that capture regularities in vocabulary, grammar, and meaning.</w:t>
+        <w:t xml:space="preserve">LLMs are trained on extremely large collections of text to learn patterns in language. The type of models we use, i.e., bidirectional encoder models such as BERT, learns to predict missing words in a sentence or to determine whether two sentences follow each other. Through this training, the model learns billions of internal parameters that capture regularities in vocabulary, grammar, and meaning.</w:t>
       </w:r>
       <w:r>
         <w:rPr>
@@ -2112,7 +2112,7 @@
         <w:rPr>
           <w:rtl w:val="0"/>
         </w:rPr>
-        <w:t xml:space="preserve">While our usage of a LLM will shed light on the context surrounding this upward movement, such context can also be approximated with simple measures. Co-occurrence analysis helps recover the different intellectual settings in which rationality is invoked. @fig-co-occurence reports, by decade, the five words most frequently adjacent to “rational” or “rationality,” showing how these associations shift over time. Before the 1930s, the picture was heterogeneous. The notion was tied to the marginalist idea of “calculation,” but it referred not only to individual behavior but also to “system” or “organization.” The discussion was explicitly methodological, as indicated by the prominence of terms such as “method,” “explanation,” “law,” and “foundation.” From the 1940s onward, the rise of choice theory places rationality at the center of economic modeling as a device for describing and formalizing behavior. This is mostly visible with the rise of multiple common bi-grams (i.e., combination of two words) that remain stable from the 1930s through the 1980s such as “economic rationality”, “rational choice”, “rational behavior”. By the 1970s—and especially the 1980s—the framework was both extended and contested. First, the most common bi-gram by far becomes “rational expectations” signalling the emergence of a new predominant concept extending rationality. In the 1980s, “rational expectations” appeared 15 more times than the other most common bi-grams. Second, while the concept “bounded rationality” was developed by Herbert Simon initially in the 1950s, the concept only became prevalent during the 1990s with the bi-gram becoming the fourth most common one. </w:t>
+        <w:t xml:space="preserve">While our usage of a LLM will shed light on the context surrounding this upward movement, such context can also be approximated with simple measures. Co-occurrence analysis helps recover the different intellectual settings in which rationality is invoked. @fig-co-occurrence reports, by decade, the five words most frequently adjacent to “rational” or “rationality,” showing how these associations shift over time. Before the 1930s, the picture was heterogeneous. The notion was tied to the marginalist idea of “calculation,” but it referred not only to individual behavior but also to “system” or “organization.” The discussion was explicitly methodological, as indicated by the prominence of terms such as “method,” “explanation,” “law,” and “foundation.” From the 1940s onward, the rise of choice theory places rationality at the center of economic modeling as a device for describing and formalizing behavior. This is mostly visible with the rise of multiple common bi-grams (i.e., combination of two words) that remain stable from the 1930s through the 1980s such as “economic rationality”, “rational choice”, “rational behavior”. By the 1970s—and especially the 1980s—the framework was both extended and contested. First, the most common bi-gram by far becomes “rational expectations” signalling the emergence of a new predominant concept extending rationality. In the 1980s, “rational expectations” appeared 15 more times than the other most common bi-grams. Second, while the concept “bounded rationality” was developed by Herbert Simon initially in the 1950s, the concept only became prevalent during the 1990s with the bi-gram becoming the fourth most common one. </w:t>
       </w:r>
     </w:p>
     <w:p>
@@ -3241,7 +3241,7 @@
         <w:rPr>
           <w:rtl w:val="0"/>
         </w:rPr>
-        <w:t xml:space="preserve">. In the cluster “Methodological Discussions”, in his review of John Bates Clark’s contribution, @veblenProfessor1908[159-160] argued against the “statical scope and character” of marginal-utility theory, which, in his view, cannot address “questions of genesis, growth, variation, process.” Similarly, in the cluster “Utility Theory”, E. H. @downeyFutility1910[253] claimed that “Marginal-utility economics has nothing to say of the genesis, growth, or current working of economic institutions” [see also @rutherfordInstitutionalist2013, 141]. Its “deliverances,” he argued, were therefore “futile for the problem of social betterment,” since such “betterment” concerned the adjustment of institutions to changing circumstances and ideals. In the early twentieth century, economic behavior, according to institutionalists, had to be understood through the prism of the “pecuniary institutions” that shaped it. For instance, in the cluster “Methodological Discussions”, Charles Cooley [@cooleyProgress1915] underlined that “pecuniary valuation,” or economic valuation, is only possible because of the institutions that make such valuation possible [see also @rutherfordInstitutionalist2013, 58–59]. @fig-co-occurence shows well the importance of “pecuniary” as a neighbor to “rational” and “rationality” in the first twenty years of the twentieth century.</w:t>
+        <w:t xml:space="preserve">. In the cluster “Methodological Discussions”, in his review of John Bates Clark’s contribution, @veblenProfessor1908[159-160] argued against the “statical scope and character” of marginal-utility theory, which, in his view, cannot address “questions of genesis, growth, variation, process.” Similarly, in the cluster “Utility Theory”, E. H. @downeyFutility1910[253] claimed that “Marginal-utility economics has nothing to say of the genesis, growth, or current working of economic institutions” [see also @rutherfordInstitutionalist2013, 141]. Its “deliverances,” he argued, were therefore “futile for the problem of social betterment,” since such “betterment” concerned the adjustment of institutions to changing circumstances and ideals. In the early twentieth century, economic behavior, according to institutionalists, had to be understood through the prism of the “pecuniary institutions” that shaped it. For instance, in the cluster “Methodological Discussions”, Charles Cooley [@cooleyProgress1915] underlined that “pecuniary valuation,” or economic valuation, is only possible because of the institutions that make such valuation possible [see also @rutherfordInstitutionalist2013, 58–59]. @fig-co-occurrence shows well the importance of “pecuniary” as a neighbor to “rational” and “rationality” in the first twenty years of the twentieth century.</w:t>
       </w:r>
     </w:p>
     <w:p>
@@ -4669,7 +4669,7 @@
           <w:szCs w:val="20"/>
           <w:rtl w:val="0"/>
         </w:rPr>
-        <w:t xml:space="preserve">European Economic review</w:t>
+        <w:t xml:space="preserve">European Economic Review</w:t>
       </w:r>
       <w:r>
         <w:rPr>
@@ -4820,7 +4820,7 @@
           <w:szCs w:val="20"/>
           <w:rtl w:val="0"/>
         </w:rPr>
-        <w:t xml:space="preserve"> We don’t use overlapping windows in this case, notably for computational reasons: finding HDBSCAN clusters on a set of tens of thousands of sentences is much more computationally intensive than finding bibliometric communities for at most a few thousands of articles.</w:t>
+        <w:t xml:space="preserve"> We don’t use overlapping windows in this case, notably for computational reasons: finding HDBSCAN clusters on a set of tens of thousands of sentences is much more computationally intensive than finding bibliometric communities for at most a few thousand of articles.</w:t>
       </w:r>
     </w:p>
   </w:footnote>
@@ -4974,7 +4974,7 @@
           <w:szCs w:val="20"/>
           <w:rtl w:val="0"/>
         </w:rPr>
-        <w:t xml:space="preserve"> Some years earlier, @mitchellRationality1910[97] already pushed forward similar claims, regretting that “few economists have regarded the study of psychology as a necessary part of the equipment of their work,” often relying on “tacit preconceptions” rather than than seeking “psychologists to gain a knowledge of the mind and its modes of operation.”</w:t>
+        <w:t xml:space="preserve"> Some years earlier, @mitchellRationality1910[97] already pushed forward similar claims, regretting that “few economists have regarded the study of psychology as a necessary part of the equipment of their work,” often relying on “tacit preconceptions” rather than seeking “psychologists to gain a knowledge of the mind and its modes of operation.”</w:t>
       </w:r>
     </w:p>
   </w:footnote>
@@ -5108,20 +5108,39 @@
           <w:szCs w:val="20"/>
           <w:rtl w:val="0"/>
         </w:rPr>
-        <w:t xml:space="preserve"> The application is available in the GitHub repository: [https://github.com/tdelcey/ejhet_quanti_method_app](https://github.com/tdelcey/ejhet_quanti_method_app)</w:t>
-      </w:r>
-      <w:r>
-        <w:rPr>
-          <w:sz w:val="20"/>
-          <w:szCs w:val="20"/>
-          <w:rtl w:val="0"/>
-        </w:rPr>
-        <w:t xml:space="preserve">. A public version is available at the following url: [https://019adac8-81d4-aa0e-808c-08861c261fd2.share.connect.posit.cloud/](https://019adac8-81d4-aa0e-808c-08861c261fd2.share.connect.posit.cloud/).</w:t>
-      </w:r>
-      <w:r>
-        <w:rPr>
-          <w:rtl w:val="0"/>
-        </w:rPr>
+        <w:t xml:space="preserve"> The application can be downloaded here [</w:t>
+      </w:r>
+      <w:r>
+        <w:rPr>
+          <w:sz w:val="20"/>
+          <w:szCs w:val="20"/>
+          <w:rtl w:val="0"/>
+        </w:rPr>
+        <w:t xml:space="preserve">https://www.doi.org/10.5281/zenodo.20558669](https://www.doi.org/10.5281/zenodo.20558669)</w:t>
+      </w:r>
+      <w:r>
+        <w:rPr>
+          <w:sz w:val="20"/>
+          <w:szCs w:val="20"/>
+          <w:rtl w:val="0"/>
+        </w:rPr>
+        <w:t xml:space="preserve">. A public and online version is available at the following URL: [</w:t>
+      </w:r>
+      <w:r>
+        <w:rPr>
+          <w:sz w:val="20"/>
+          <w:szCs w:val="20"/>
+          <w:rtl w:val="0"/>
+        </w:rPr>
+        <w:t xml:space="preserve">https://019adac8-81d4-aa0e-808c-08861c261fd2.share.connect.posit.cloud/](https://019adac8-81d4-aa0e-808c-08861c261fd2.share.connect.posit.cloud/)</w:t>
+      </w:r>
+      <w:r>
+        <w:rPr>
+          <w:sz w:val="20"/>
+          <w:szCs w:val="20"/>
+          <w:rtl w:val="0"/>
+        </w:rPr>
+        <w:t xml:space="preserve">. If the URL is no longer active, a permanent archived version is available via the Zenodo link above. </w:t>
       </w:r>
     </w:p>
   </w:footnote>
@@ -5677,7 +5696,37 @@
           <w:szCs w:val="20"/>
           <w:rtl w:val="0"/>
         </w:rPr>
-        <w:t xml:space="preserve"> The application is available in the GitHub repository: [https://github.com/tdelcey/ejhet_quanti_method_app](https://github.com/tdelcey/ejhet_quanti_method_app). For non technical-users, a public version is available at the following url: [https://019adac8-81d4-aa0e-808c-08861c261fd2.share.connect.posit.cloud/](https://019adac8-81d4-aa0e-808c-08861c261fd2.share.connect.posit.cloud/).</w:t>
+        <w:t xml:space="preserve"> The application can be downloaded here [https://www.doi.org/10.5281/zenodo.20558669](https://www.doi.org/10.5281/zenodo.20558669). A public and online version is available at the following URL: [</w:t>
+      </w:r>
+      <w:r>
+        <w:rPr>
+          <w:sz w:val="20"/>
+          <w:szCs w:val="20"/>
+          <w:rtl w:val="0"/>
+        </w:rPr>
+        <w:t xml:space="preserve">https://019adac8-81d4-aa0e-808c-08861c261fd2.share.connect.posit.cloud/](https://019adac8-81d4-aa0e-808c-08861c261fd2.share.connect.posit.cloud/)</w:t>
+      </w:r>
+      <w:r>
+        <w:rPr>
+          <w:sz w:val="20"/>
+          <w:szCs w:val="20"/>
+          <w:rtl w:val="0"/>
+        </w:rPr>
+        <w:t xml:space="preserve">. If the URL is no longer active, a permanent archived version is available via the Zenodo link above. </w:t>
+      </w:r>
+    </w:p>
+    <w:p>
+      <w:pPr>
+        <w:spacing w:after="0" w:before="0" w:line="240" w:lineRule="auto"/>
+        <w:rPr>
+          <w:sz w:val="20"/>
+          <w:szCs w:val="20"/>
+        </w:rPr>
+      </w:pPr>
+      <w:r>
+        <w:rPr>
+          <w:rtl w:val="0"/>
+        </w:rPr>
       </w:r>
     </w:p>
   </w:footnote>

</xml_diff>